<commit_message>
Added the Research paper template
</commit_message>
<xml_diff>
--- a/About.docx
+++ b/About.docx
@@ -11,17 +11,6 @@
       </w:r>
     </w:p>
     <w:p>
-      <w:proofErr w:type="spellStart"/>
-      <w:r>
-        <w:t>Xmind</w:t>
-      </w:r>
-      <w:proofErr w:type="spellEnd"/>
-      <w:r>
-        <w:t xml:space="preserve"> for mind map (before lit review)</w:t>
-      </w:r>
-    </w:p>
-    <w:p/>
-    <w:p>
       <w:r>
         <w:t>Comparing_Backend_Architectures_in_a_Full-Stack_Issue_Tracking_Web_Application</w:t>
       </w:r>
@@ -53,23 +42,7 @@
           <w:b/>
           <w:bCs/>
         </w:rPr>
-        <w:t xml:space="preserve">What my </w:t>
-      </w:r>
-      <w:proofErr w:type="gramStart"/>
-      <w:r>
-        <w:rPr>
-          <w:b/>
-          <w:bCs/>
-        </w:rPr>
-        <w:t>mini-dissertation</w:t>
-      </w:r>
-      <w:proofErr w:type="gramEnd"/>
-      <w:r>
-        <w:rPr>
-          <w:b/>
-          <w:bCs/>
-        </w:rPr>
-        <w:t xml:space="preserve"> would be about</w:t>
+        <w:t>What my mini-dissertation would be about</w:t>
       </w:r>
     </w:p>
     <w:p>
@@ -241,7 +214,6 @@
         <w:spacing w:after="160"/>
       </w:pPr>
       <w:r>
-        <w:lastRenderedPageBreak/>
         <w:t>Build the API with minimal separation (routes/controllers contain most logic).</w:t>
       </w:r>
     </w:p>
@@ -266,6 +238,7 @@
         <w:spacing w:after="160"/>
       </w:pPr>
       <w:r>
+        <w:lastRenderedPageBreak/>
         <w:t>Add validation and error handling in the same codebase style.</w:t>
       </w:r>
     </w:p>
@@ -592,7 +565,6 @@
           <w:b/>
           <w:bCs/>
         </w:rPr>
-        <w:lastRenderedPageBreak/>
         <w:t>Hypothesis</w:t>
       </w:r>
       <w:r>
@@ -626,7 +598,11 @@
         <w:t>,</w:t>
       </w:r>
       <w:r>
-        <w:t xml:space="preserve"> demonstrated by lower measured complexity, smaller change impact when implementing a controlled new feature, and stronger automated testing,</w:t>
+        <w:t xml:space="preserve"> demonstrated by lower measured </w:t>
+      </w:r>
+      <w:r>
+        <w:lastRenderedPageBreak/>
+        <w:t>complexity, smaller change impact when implementing a controlled new feature, and stronger automated testing,</w:t>
       </w:r>
       <w:r>
         <w:t xml:space="preserve"> </w:t>
@@ -743,15 +719,7 @@
         <w:t>[2]</w:t>
       </w:r>
       <w:r>
-        <w:t xml:space="preserve"> R. Su and X. Li, “Modular Monolith: Is This the Trend in Software </w:t>
-      </w:r>
-      <w:proofErr w:type="gramStart"/>
-      <w:r>
-        <w:t>Architecture?,</w:t>
-      </w:r>
-      <w:proofErr w:type="gramEnd"/>
-      <w:r>
-        <w:t xml:space="preserve">” in </w:t>
+        <w:t xml:space="preserve"> R. Su and X. Li, “Modular Monolith: Is This the Trend in Software Architecture?,” in </w:t>
       </w:r>
       <w:r>
         <w:rPr>
@@ -949,7 +917,6 @@
         <w:spacing w:after="160"/>
       </w:pPr>
       <w:r>
-        <w:lastRenderedPageBreak/>
         <w:t>[7]</w:t>
       </w:r>
       <w:r>
@@ -987,6 +954,7 @@
         <w:spacing w:after="160"/>
       </w:pPr>
       <w:r>
+        <w:lastRenderedPageBreak/>
         <w:t>[8]</w:t>
       </w:r>
       <w:r>
@@ -3501,6 +3469,7 @@
   <w:style w:type="character" w:default="1" w:styleId="DefaultParagraphFont">
     <w:name w:val="Default Paragraph Font"/>
     <w:uiPriority w:val="1"/>
+    <w:semiHidden/>
     <w:unhideWhenUsed/>
   </w:style>
   <w:style w:type="table" w:default="1" w:styleId="TableNormal">
@@ -5258,115 +5227,15 @@
 </file>
 
 <file path=customXml/item1.xml><?xml version="1.0" encoding="utf-8"?>
-<Rehngruppen10>
-  <Dokumentinfo>
-    <Rubrik>
-		</Rubrik>
-    <Underrubrik>
-		</Underrubrik>
-    <Disclaimer>
-		</Disclaimer>
-    <Version>
-		</Version>
-    <Dokumenttyp>
-		</Dokumenttyp>
-    <Informationsklassificering>
-		</Informationsklassificering>
-    <Datum/>
-  </Dokumentinfo>
-  <KontaktuppgifterForetag>
-    <Foretag>
-		</Foretag>
-    <Orgnr>
-		</Orgnr>
-    <TelefonForetag>
-		</TelefonForetag>
-    <EmailForetag>
-		</EmailForetag>
-    <Besoksadress>
-		</Besoksadress>
-    <PostAdress>
-		</PostAdress>
-    <Gata>
-		</Gata>
-    <Postnummer>
-		</Postnummer>
-    <Ort/>
-    <Personinfo>
-      <Namn>&lt;?xml version="1.0" standalone="yes"?&gt;
-&lt;?mso-application progid="Word.Document"?&gt;
-&lt;pkg:package xmlns:pkg="http://schemas.microsoft.com/office/2006/xmlPackage"&gt;&lt;pkg:part pkg:name="/_rels/.rels" pkg:contentType="application/vnd.openxmlformats-package.relationships+xml" pkg:padding="512"&gt;&lt;pkg:xmlData&gt;&lt;Relationships xmlns="http://schemas.openxmlformats.org/package/2006/relationships"&gt;&lt;Relationship Id="rId1" Type="http://schemas.openxmlformats.org/officeDocument/2006/relationships/officeDocument" Target="word/document.xml"/&gt;&lt;/Relationships&gt;&lt;/pkg:xmlData&gt;&lt;/pkg:part&gt;&lt;pkg:part pkg:name="/word/_rels/document.xml.rels" pkg:contentType="application/vnd.openxmlformats-package.relationships+xml" pkg:padding="256"&gt;&lt;pkg:xmlData&gt;&lt;Relationships xmlns="http://schemas.openxmlformats.org/package/2006/relationships"&gt;&lt;Relationship Id="rId3" Type="http://schemas.openxmlformats.org/officeDocument/2006/relationships/glossaryDocument" Target="glossary/document.xml"/&gt;&lt;Relationship Id="rId2" Type="http://schemas.openxmlformats.org/officeDocument/2006/relationships/styles" Target="styles.xml"/&gt;&lt;Relationship Id="rId1" Type="http://schemas.openxmlformats.org/officeDocument/2006/relationships/numbering" Target="numbering.xml"/&gt;&lt;/Relationships&gt;&lt;/pkg:xmlData&gt;&lt;/pkg:part&gt;&lt;pkg:part pkg:name="/word/document.xml" pkg:contentType="application/vnd.openxmlformats-officedocument.wordprocessingml.document.main+xml"&gt;&lt;pkg:xmlData&gt;&lt;w:document xmlns:wpc="http://schemas.microsoft.com/office/word/2010/wordprocessingCanvas" xmlns:cx="http://schemas.microsoft.com/office/drawing/2014/chartex" xmlns:cx1="http://schemas.microsoft.com/office/drawing/2015/9/8/chartex" xmlns:cx2="http://schemas.microsoft.com/office/drawing/2015/10/21/chartex" xmlns:cx3="http://schemas.microsoft.com/office/drawing/2016/5/9/chartex" xmlns:cx4="http://schemas.microsoft.com/office/drawing/2016/5/10/chartex" xmlns:cx5="http://schemas.microsoft.com/office/drawing/2016/5/11/chartex" xmlns:cx6="http://schemas.microsoft.com/office/drawing/2016/5/12/chartex" xmlns:cx7="http://schemas.microsoft.com/office/drawing/2016/5/13/chartex" xmlns:cx8="http://schemas.microsoft.com/office/drawing/2016/5/14/chartex" xmlns:mc="http://schemas.openxmlformats.org/markup-compatibility/2006" xmlns:o="urn:schemas-microsoft-com:office:office" xmlns:r="http://schemas.openxmlformats.org/officeDocument/2006/relationships" xmlns:m="http://schemas.openxmlformats.org/officeDocument/2006/math" xmlns:v="urn:schemas-microsoft-com:vml" xmlns:wp14="http://schemas.microsoft.com/office/word/2010/wordprocessingDrawing" xmlns:wp="http://schemas.openxmlformats.org/drawingml/2006/wordprocessingDrawing" xmlns:w10="urn:schemas-microsoft-com:office:word" xmlns:w="http://schemas.openxmlformats.org/wordprocessingml/2006/main" xmlns:w14="http://schemas.microsoft.com/office/word/2010/wordml" xmlns:w15="http://schemas.microsoft.com/office/word/2012/wordml" xmlns:w16se="http://schemas.microsoft.com/office/word/2015/wordml/symex" xmlns:wpg="http://schemas.microsoft.com/office/word/2010/wordprocessingGroup" xmlns:wpi="http://schemas.microsoft.com/office/word/2010/wordprocessingInk" xmlns:wne="http://schemas.microsoft.com/office/word/2006/wordml" xmlns:wps="http://schemas.microsoft.com/office/word/2010/wordprocessingShape" mc:Ignorable="w14 w15 w16se wp14"&gt;&lt;w:body&gt;&lt;w:sdt&gt;&lt;w:sdtPr&gt;&lt;w:tag w:val="regName"/&gt;&lt;w:id w:val="-1755663995"/&gt;&lt;w:placeholder&gt;&lt;w:docPart w:val="B7CF53EBD28C4270BBC51AAB20A1C895"/&gt;&lt;/w:placeholder&gt;&lt;/w:sdtPr&gt;&lt;w:sdtContent&gt;&lt;w:p&gt;&lt;w:pPr&gt;&lt;w:pStyle w:val="Name"/&gt;&lt;w:cnfStyle w:val="001000000000" w:firstRow="0" w:lastRow="0" w:firstColumn="1" w:lastColumn="0" w:oddVBand="0" w:evenVBand="0" w:oddHBand="0" w:evenHBand="0" w:firstRowFirstColumn="0" w:firstRowLastColumn="0" w:lastRowFirstColumn="0" w:lastRowLastColumn="0"/&gt;&lt;/w:pPr&gt;&lt;w:r&gt;&lt;w:t&gt;Maria Dahlstrand&lt;/w:t&gt;&lt;/w:r&gt;&lt;/w:p&gt;&lt;/w:sdtContent&gt;&lt;/w:sdt&gt;&lt;w:p/&gt;&lt;w:sectPr&gt;&lt;w:pgSz w:w="12240" w:h="15840"/&gt;&lt;w:pgMar w:top="1417" w:right="1417" w:bottom="1417" w:left="1417" w:header="720" w:footer="720" w:gutter="0"/&gt;&lt;w:cols w:space="720"/&gt;&lt;/w:sectPr&gt;&lt;/w:body&gt;&lt;/w:document&gt;&lt;/pkg:xmlData&gt;&lt;/pkg:part&gt;&lt;pkg:part pkg:name="/word/glossary/settings.xml" pkg:contentType="application/vnd.openxmlformats-officedocument.wordprocessingml.settings+xml"&gt;&lt;pkg:xmlData&gt;&lt;w:settings xmlns:mc="http://schemas.openxmlformats.org/markup-compatibility/2006" xmlns:o="urn:schemas-microsoft-com:office:office" xmlns:r="http://schemas.openxmlformats.org/officeDocument/2006/relationships" xmlns:m="http://schemas.openxmlformats.org/officeDocument/2006/math" xmlns:v="urn:schemas-microsoft-com:vml" xmlns:w10="urn:schemas-microsoft-com:office:word" xmlns:w="http://schemas.openxmlformats.org/wordprocessingml/2006/main" xmlns:w14="http://schemas.microsoft.com/office/word/2010/wordml" xmlns:w15="http://schemas.microsoft.com/office/word/2012/wordml" xmlns:w16se="http://schemas.microsoft.com/office/word/2015/wordml/symex" xmlns:sl="http://schemas.openxmlformats.org/schemaLibrary/2006/main" mc:Ignorable="w14 w15 w16se"&gt;&lt;w:view w:val="normal"/&gt;&lt;w:defaultTabStop w:val="720"/&gt;&lt;w:characterSpacingControl w:val="doNotCompress"/&gt;&lt;w:compat&gt;&lt;w:useFELayout/&gt;&lt;w:compatSetting w:name="compatibilityMode" w:uri="http://schemas.microsoft.com/office/word" w:val="15"/&gt;&lt;w:compatSetting w:name="overrideTableStyleFontSizeAndJustification" w:uri="http://schemas.microsoft.com/office/word" w:val="1"/&gt;&lt;w:compatSetting w:name="enableOpenTypeFeatures" w:uri="http://schemas.microsoft.com/office/word" w:val="1"/&gt;&lt;w:compatSetting w:name="doNotFlipMirrorIndents" w:uri="http://schemas.microsoft.com/office/word" w:val="1"/&gt;&lt;w:compatSetting w:name="differentiateMultirowTableHeaders" w:uri="http://schemas.microsoft.com/office/word" w:val="1"/&gt;&lt;/w:compat&gt;&lt;m:mathPr&gt;&lt;m:mathFont m:val="Cambria Math"/&gt;&lt;m:brkBin m:val="before"/&gt;&lt;m:brkBinSub m:val="--"/&gt;&lt;m:smallFrac m:val="0"/&gt;&lt;m:dispDef/&gt;&lt;m:lMargin m:val="0"/&gt;&lt;m:rMargin m:val="0"/&gt;&lt;m:defJc m:val="centerGroup"/&gt;&lt;m:wrapIndent m:val="1440"/&gt;&lt;m:intLim m:val="subSup"/&gt;&lt;m:naryLim m:val="undOvr"/&gt;&lt;/m:mathPr&gt;&lt;w:themeFontLang w:val="en-GB"/&gt;&lt;w:clrSchemeMapping w:bg1="light1" w:t1="dark1" w:bg2="light2" w:t2="dark2" w:accent1="accent1" w:accent2="accent2" w:accent3="accent3" w:accent4="accent4" w:accent5="accent5" w:accent6="accent6" w:hyperlink="hyperlink" w:followedHyperlink="followedHyperlink"/&gt;&lt;w:decimalSymbol w:val=","/&gt;&lt;w:listSeparator w:val=";"/&gt;&lt;w15:chartTrackingRefBased/&gt;&lt;/w:settings&gt;&lt;/pkg:xmlData&gt;&lt;/pkg:part&gt;&lt;pkg:part pkg:name="/word/glossary/_rels/document.xml.rels" pkg:contentType="application/vnd.openxmlformats-package.relationships+xml"&gt;&lt;pkg:xmlData&gt;&lt;Relationships xmlns="http://schemas.openxmlformats.org/package/2006/relationships"&gt;&lt;Relationship Id="rId3" Type="http://schemas.openxmlformats.org/officeDocument/2006/relationships/webSettings" Target="webSettings.xml"/&gt;&lt;Relationship Id="rId2" Type="http://schemas.openxmlformats.org/officeDocument/2006/relationships/settings" Target="settings.xml"/&gt;&lt;Relationship Id="rId1" Type="http://schemas.openxmlformats.org/officeDocument/2006/relationships/styles" Target="styles.xml"/&gt;&lt;Relationship Id="rId4" Type="http://schemas.openxmlformats.org/officeDocument/2006/relationships/fontTable" Target="fontTable.xml"/&gt;&lt;/Relationships&gt;&lt;/pkg:xmlData&gt;&lt;/pkg:part&gt;&lt;pkg:part pkg:name="/word/glossary/document.xml" pkg:contentType="application/vnd.openxmlformats-officedocument.wordprocessingml.document.glossary+xml"&gt;&lt;pkg:xmlData&gt;&lt;w:glossaryDocument xmlns:wpc="http://schemas.microsoft.com/office/word/2010/wordprocessingCanvas" xmlns:cx="http://schemas.microsoft.com/office/drawing/2014/chartex" xmlns:cx1="http://schemas.microsoft.com/office/drawing/2015/9/8/chartex" xmlns:cx2="http://schemas.microsoft.com/office/drawing/2015/10/21/chartex" xmlns:cx3="http://schemas.microsoft.com/office/drawing/2016/5/9/chartex" xmlns:cx4="http://schemas.microsoft.com/office/drawing/2016/5/10/chartex" xmlns:cx5="http://schemas.microsoft.com/office/drawing/2016/5/11/chartex" xmlns:cx6="http://schemas.microsoft.com/office/drawing/2016/5/12/chartex" xmlns:cx7="http://schemas.microsoft.com/office/drawing/2016/5/13/chartex" xmlns:cx8="http://schemas.microsoft.com/office/drawing/2016/5/14/chartex" xmlns:mc="http://schemas.openxmlformats.org/markup-compatibility/2006" xmlns:o="urn:schemas-microsoft-com:office:office" xmlns:r="http://schemas.openxmlformats.org/officeDocument/2006/relationships" xmlns:m="http://schemas.openxmlformats.org/officeDocument/2006/math" xmlns:v="urn:schemas-microsoft-com:vml" xmlns:wp14="http://schemas.microsoft.com/office/word/2010/wordprocessingDrawing" xmlns:wp="http://schemas.openxmlformats.org/drawingml/2006/wordprocessingDrawing" xmlns:w10="urn:schemas-microsoft-com:office:word" xmlns:w="http://schemas.openxmlformats.org/wordprocessingml/2006/main" xmlns:w14="http://schemas.microsoft.com/office/word/2010/wordml" xmlns:w15="http://schemas.microsoft.com/office/word/2012/wordml" xmlns:w16se="http://schemas.microsoft.com/office/word/2015/wordml/symex" xmlns:wpg="http://schemas.microsoft.com/office/word/2010/wordprocessingGroup" xmlns:wpi="http://schemas.microsoft.com/office/word/2010/wordprocessingInk" xmlns:wne="http://schemas.microsoft.com/office/word/2006/wordml" xmlns:wps="http://schemas.microsoft.com/office/word/2010/wordprocessingShape" mc:Ignorable="w14 w15 w16se wp14"&gt;&lt;w:docParts&gt;&lt;w:docPart&gt;&lt;w:docPartPr&gt;&lt;w:name w:val="B7CF53EBD28C4270BBC51AAB20A1C895"/&gt;&lt;w:category&gt;&lt;w:name w:val="General"/&gt;&lt;w:gallery w:val="placeholder"/&gt;&lt;/w:category&gt;&lt;w:types&gt;&lt;w:type w:val="bbPlcHdr"/&gt;&lt;/w:types&gt;&lt;w:behaviors&gt;&lt;w:behavior w:val="content"/&gt;&lt;/w:behaviors&gt;&lt;w:guid w:val="{F7D69E8F-087E-454A-99F4-5E3C0519DD23}"/&gt;&lt;/w:docPartPr&gt;&lt;w:docPartBody&gt;&lt;w:p&gt;&lt;w:pPr&gt;&lt;w:pStyle w:val="B7CF53EBD28C4270BBC51AAB20A1C895"/&gt;&lt;/w:pPr&gt;&lt;w:r&gt;&lt;w:rPr&gt;&lt;w:rStyle w:val="PlaceholderText"/&gt;&lt;/w:rPr&gt;&lt;w:t&gt;Click or tap here to enter text.&lt;/w:t&gt;&lt;/w:r&gt;&lt;/w:p&gt;&lt;/w:docPartBody&gt;&lt;/w:docPart&gt;&lt;/w:docParts&gt;&lt;/w:glossaryDocument&gt;&lt;/pkg:xmlData&gt;&lt;/pkg:part&gt;&lt;pkg:part pkg:name="/word/glossary/styles.xml" pkg:contentType="application/vnd.openxmlformats-officedocument.wordprocessingml.styles+xml"&gt;&lt;pkg:xmlData&gt;&lt;w:styles xmlns:mc="http://schemas.openxmlformats.org/markup-compatibility/2006" xmlns:r="http://schemas.openxmlformats.org/officeDocument/2006/relationships" xmlns:w="http://schemas.openxmlformats.org/wordprocessingml/2006/main" xmlns:w14="http://schemas.microsoft.com/office/word/2010/wordml" xmlns:w15="http://schemas.microsoft.com/office/word/2012/wordml" xmlns:w16se="http://schemas.microsoft.com/office/word/2015/wordml/symex" mc:Ignorable="w14 w15 w16se"&gt;&lt;w:docDefaults&gt;&lt;w:rPrDefault&gt;&lt;w:rPr&gt;&lt;w:rFonts w:asciiTheme="minorHAnsi" w:eastAsiaTheme="minorEastAsia" w:hAnsiTheme="minorHAnsi" w:cstheme="minorBidi"/&gt;&lt;w:sz w:val="22"/&gt;&lt;w:szCs w:val="22"/&gt;&lt;w:lang w:val="en-GB" w:eastAsia="en-GB" w:bidi="ar-SA"/&gt;&lt;/w:rPr&gt;&lt;/w:rPrDefault&gt;&lt;w:pPrDefault&gt;&lt;w:pPr&gt;&lt;w:spacing w:after="160" w:line="259" w:lineRule="auto"/&gt;&lt;/w:pPr&gt;&lt;/w:pPrDefault&gt;&lt;/w:docDefaults&gt;&lt;w:latentStyles w:defLockedState="0" w:defUIPriority="99" w:defSemiHidden="0" w:defUnhideWhenUsed="0" w:defQFormat="0" w:count="374"&gt;&lt;w:lsdException w:name="Normal" w:uiPriority="0" w:qFormat="1"/&gt;&lt;w:lsdException w:name="heading 1" w:uiPriority="9" w:qFormat="1"/&gt;&lt;w:lsdException w:name="heading 2" w:semiHidden="1" w:uiPriority="9" w:unhideWhenUsed="1" w:qFormat="1"/&gt;&lt;w:lsdException w:name="heading 3" w:semiHidden="1" w:uiPriority="9" w:unhideWhenUsed="1" w:qFormat="1"/&gt;&lt;w:lsdException w:name="heading 4" w:semiHidden="1" w:uiPriority="9" w:unhideWhenUsed="1" w:qFormat="1"/&gt;&lt;w:lsdException w:name="heading 5" w:semiHidden="1" w:uiPriority="9" w:unhideWhenUsed="1" w:qFormat="1"/&gt;&lt;w:lsdException w:name="heading 6" w:semiHidden="1" w:uiPriority="9" w:unhideWhenUsed="1" w:qFormat="1"/&gt;&lt;w:lsdException w:name="heading 7" w:semiHidden="1" w:uiPriority="9" w:unhideWhenUsed="1" w:qFormat="1"/&gt;&lt;w:lsdException w:name="heading 8" w:semiHidden="1" w:uiPriority="9" w:unhideWhenUsed="1" w:qFormat="1"/&gt;&lt;w:lsdException w:name="heading 9" w:semiHidden="1" w:uiPriority="9" w:unhideWhenUsed="1" w:qFormat="1"/&gt;&lt;w:lsdException w:name="index 1" w:semiHidden="1" w:unhideWhenUsed="1"/&gt;&lt;w:lsdException w:name="index 2" w:semiHidden="1" w:unhideWhenUsed="1"/&gt;&lt;w:lsdException w:name="index 3" w:semiHidden="1" w:unhideWhenUsed="1"/&gt;&lt;w:lsdException w:name="index 4" w:semiHidden="1" w:unhideWhenUsed="1"/&gt;&lt;w:lsdException w:name="index 5" w:semiHidden="1" w:unhideWhenUsed="1"/&gt;&lt;w:lsdException w:name="index 6" w:semiHidden="1" w:unhideWhenUsed="1"/&gt;&lt;w:lsdException w:name="index 7" w:semiHidden="1" w:unhideWhenUsed="1"/&gt;&lt;w:lsdException w:name="index 8" w:semiHidden="1" w:unhideWhenUsed="1"/&gt;&lt;w:lsdException w:name="index 9" w:semiHidden="1" w:unhideWhenUsed="1"/&gt;&lt;w:lsdException w:name="toc 1" w:semiHidden="1" w:uiPriority="39" w:unhideWhenUsed="1"/&gt;&lt;w:lsdException w:name="toc 2" w:semiHidden="1" w:uiPriority="39" w:unhideWhenUsed="1"/&gt;&lt;w:lsdException w:name="toc 3" w:semiHidden="1" w:uiPriority="39" w:unhideWhenUsed="1"/&gt;&lt;w:lsdException w:name="toc 4" w:semiHidden="1" w:uiPriority="39" w:unhideWhenUsed="1"/&gt;&lt;w:lsdException w:name="toc 5" w:semiHidden="1" w:uiPriority="39" w:unhideWhenUsed="1"/&gt;&lt;w:lsdException w:name="toc 6" w:semiHidden="1" w:uiPriority="39" w:unhideWhenUsed="1"/&gt;&lt;w:lsdException w:name="toc 7" w:semiHidden="1" w:uiPriority="39" w:unhideWhenUsed="1"/&gt;&lt;w:lsdException w:name="toc 8" w:semiHidden="1" w:uiPriority="39" w:unhideWhenUsed="1"/&gt;&lt;w:lsdException w:name="toc 9" w:semiHidden="1" w:uiPriority="39" w:unhideWhenUsed="1"/&gt;&lt;w:lsdException w:name="Normal Indent" w:semiHidden="1" w:unhideWhenUsed="1"/&gt;&lt;w:lsdException w:name="footnote text" w:semiHidden="1" w:unhideWhenUsed="1"/&gt;&lt;w:lsdException w:name="annotation text" w:semiHidden="1" w:unhideWhenUsed="1"/&gt;&lt;w:lsdException w:name="header" w:semiHidden="1" w:unhideWhenUsed="1"/&gt;&lt;w:lsdException w:name="footer" w:semiHidden="1" w:unhideWhenUsed="1"/&gt;&lt;w:lsdException w:name="index heading" w:semiHidden="1" w:unhideWhenUsed="1"/&gt;&lt;w:lsdException w:name="caption" w:semiHidden="1" w:uiPriority="35" w:unhideWhenUsed="1" w:qFormat="1"/&gt;&lt;w:lsdException w:name="table of figures" w:semiHidden="1" w:unhideWhenUsed="1"/&gt;&lt;w:lsdException w:name="envelope address" w:semiHidden="1" w:unhideWhenUsed="1"/&gt;&lt;w:lsdException w:name="envelope return" w:semiHidden="1" w:unhideWhenUsed="1"/&gt;&lt;w:lsdException w:name="footnote reference" w:semiHidden="1" w:unhideWhenUsed="1"/&gt;&lt;w:lsdException w:name="annotation reference" w:semiHidden="1" w:unhideWhenUsed="1"/&gt;&lt;w:lsdException w:name="line number" w:semiHidden="1" w:unhideWhenUsed="1"/&gt;&lt;w:lsdException w:name="page number" w:semiHidden="1" w:unhideWhenUsed="1"/&gt;&lt;w:lsdException w:name="endnote reference" w:semiHidden="1" w:unhideWhenUsed="1"/&gt;&lt;w:lsdException w:name="endnote text" w:semiHidden="1" w:unhideWhenUsed="1"/&gt;&lt;w:lsdException w:name="table of authorities" w:semiHidden="1" w:unhideWhenUsed="1"/&gt;&lt;w:lsdException w:name="macro" w:semiHidden="1" w:unhideWhenUsed="1"/&gt;&lt;w:lsdException w:name="toa heading" w:semiHidden="1" w:unhideWhenUsed="1"/&gt;&lt;w:lsdException w:name="List" w:semiHidden="1" w:unhideWhenUsed="1"/&gt;&lt;w:lsdException w:name="List Bullet" w:semiHidden="1" w:unhideWhenUsed="1"/&gt;&lt;w:lsdException w:name="List Number" w:semiHidden="1" w:unhideWhenUsed="1"/&gt;&lt;w:lsdException w:name="List 2" w:semiHidden="1" w:unhideWhenUsed="1"/&gt;&lt;w:lsdException w:name="List 3" w:semiHidden="1" w:unhideWhenUsed="1"/&gt;&lt;w:lsdException w:name="List 4" w:semiHidden="1" w:unhideWhenUsed="1"/&gt;&lt;w:lsdException w:name="List 5" w:semiHidden="1" w:unhideWhenUsed="1"/&gt;&lt;w:lsdException w:name="List Bullet 2" w:semiHidden="1" w:unhideWhenUsed="1"/&gt;&lt;w:lsdException w:name="List Bullet 3" w:semiHidden="1" w:unhideWhenUsed="1"/&gt;&lt;w:lsdException w:name="List Bullet 4" w:semiHidden="1" w:unhideWhenUsed="1"/&gt;&lt;w:lsdException w:name="List Bullet 5" w:semiHidden="1" w:unhideWhenUsed="1"/&gt;&lt;w:lsdException w:name="List Number 2" w:semiHidden="1" w:unhideWhenUsed="1"/&gt;&lt;w:lsdException w:name="List Number 3" w:semiHidden="1" w:unhideWhenUsed="1"/&gt;&lt;w:lsdException w:name="List Number 4" w:semiHidden="1" w:unhideWhenUsed="1"/&gt;&lt;w:lsdException w:name="List Number 5" w:semiHidden="1" w:unhideWhenUsed="1"/&gt;&lt;w:lsdException w:name="Title" w:uiPriority="10" w:qFormat="1"/&gt;&lt;w:lsdException w:name="Closing" w:semiHidden="1" w:unhideWhenUsed="1"/&gt;&lt;w:lsdException w:name="Signature" w:semiHidden="1" w:unhideWhenUsed="1"/&gt;&lt;w:lsdException w:name="Default Paragraph Font" w:semiHidden="1" w:uiPriority="1" w:unhideWhenUsed="1"/&gt;&lt;w:lsdException w:name="Body Text" w:semiHidden="1" w:unhideWhenUsed="1"/&gt;&lt;w:lsdException w:name="Body Text Indent" w:semiHidden="1" w:unhideWhenUsed="1"/&gt;&lt;w:lsdException w:name="List Continue" w:semiHidden="1" w:unhideWhenUsed="1"/&gt;&lt;w:lsdException w:name="List Continue 2" w:semiHidden="1" w:unhideWhenUsed="1"/&gt;&lt;w:lsdException w:name="List Continue 3" w:semiHidden="1" w:unhideWhenUsed="1"/&gt;&lt;w:lsdException w:name="List Continue 4" w:semiHidden="1" w:unhideWhenUsed="1"/&gt;&lt;w:lsdException w:name="List Continue 5" w:semiHidden="1" w:unhideWhenUsed="1"/&gt;&lt;w:lsdException w:name="Message Header" w:semiHidden="1" w:unhideWhenUsed="1"/&gt;&lt;w:lsdException w:name="Subtitle" w:uiPriority="11" w:qFormat="1"/&gt;&lt;w:lsdException w:name="Salutation" w:semiHidden="1" w:unhideWhenUsed="1"/&gt;&lt;w:lsdException w:name="Date" w:semiHidden="1" w:unhideWhenUsed="1"/&gt;&lt;w:lsdException w:name="Body Text First Indent" w:semiHidden="1" w:unhideWhenUsed="1"/&gt;&lt;w:lsdException w:name="Body Text First Indent 2" w:semiHidden="1" w:unhideWhenUsed="1"/&gt;&lt;w:lsdException w:name="Note Heading" w:semiHidden="1" w:unhideWhenUsed="1"/&gt;&lt;w:lsdException w:name="Body Text 2" w:semiHidden="1" w:unhideWhenUsed="1"/&gt;&lt;w:lsdException w:name="Body Text 3" w:semiHidden="1" w:unhideWhenUsed="1"/&gt;&lt;w:lsdException w:name="Body Text Indent 2" w:semiHidden="1" w:unhideWhenUsed="1"/&gt;&lt;w:lsdException w:name="Body Text Indent 3" w:semiHidden="1" w:unhideWhenUsed="1"/&gt;&lt;w:lsdException w:name="Block Text" w:semiHidden="1" w:unhideWhenUsed="1"/&gt;&lt;w:lsdException w:name="Hyperlink" w:semiHidden="1" w:unhideWhenUsed="1"/&gt;&lt;w:lsdException w:name="FollowedHyperlink" w:semiHidden="1" w:unhideWhenUsed="1"/&gt;&lt;w:lsdException w:name="Strong" w:uiPriority="22" w:qFormat="1"/&gt;&lt;w:lsdException w:name="Emphasis" w:uiPriority="20" w:qFormat="1"/&gt;&lt;w:lsdException w:name="Document Map" w:semiHidden="1" w:unhideWhenUsed="1"/&gt;&lt;w:lsdException w:name="Plain Text" w:semiHidden="1" w:unhideWhenUsed="1"/&gt;&lt;w:lsdException w:name="E-mail Signature" w:semiHidden="1" w:unhideWhenUsed="1"/&gt;&lt;w:lsdException w:name="HTML Top of Form" w:semiHidden="1" w:unhideWhenUsed="1"/&gt;&lt;w:lsdException w:name="HTML Bottom of Form" w:semiHidden="1" w:unhideWhenUsed="1"/&gt;&lt;w:lsdException w:name="Normal (Web)" w:semiHidden="1" w:unhideWhenUsed="1"/&gt;&lt;w:lsdException w:name="HTML Acronym" w:semiHidden="1" w:unhideWhenUsed="1"/&gt;&lt;w:lsdException w:name="HTML Address" w:semiHidden="1" w:unhideWhenUsed="1"/&gt;&lt;w:lsdException w:name="HTML Cite" w:semiHidden="1" w:unhideWhenUsed="1"/&gt;&lt;w:lsdException w:name="HTML Code" w:semiHidden="1" w:unhideWhenUsed="1"/&gt;&lt;w:lsdException w:name="HTML Definition" w:semiHidden="1" w:unhideWhenUsed="1"/&gt;&lt;w:lsdException w:name="HTML Keyboard" w:semiHidden="1" w:unhideWhenUsed="1"/&gt;&lt;w:lsdException w:name="HTML Preformatted" w:semiHidden="1" w:unhideWhenUsed="1"/&gt;&lt;w:lsdException w:name="HTML Sample" w:semiHidden="1" w:unhideWhenUsed="1"/&gt;&lt;w:lsdException w:name="HTML Typewriter" w:semiHidden="1" w:unhideWhenUsed="1"/&gt;&lt;w:lsdException w:name="HTML Variable" w:semiHidden="1" w:unhideWhenUsed="1"/&gt;&lt;w:lsdException w:name="Normal Table" w:semiHidden="1" w:unhideWhenUsed="1"/&gt;&lt;w:lsdException w:name="annotation subject" w:semiHidden="1" w:unhideWhenUsed="1"/&gt;&lt;w:lsdException w:name="No List" w:semiHidden="1" w:unhideWhenUsed="1"/&gt;&lt;w:lsdException w:name="Outline List 1" w:semiHidden="1" w:unhideWhenUsed="1"/&gt;&lt;w:lsdException w:name="Outline List 2" w:semiHidden="1" w:unhideWhenUsed="1"/&gt;&lt;w:lsdException w:name="Outline List 3" w:semiHidden="1" w:unhideWhenUsed="1"/&gt;&lt;w:lsdException w:name="Table Simple 1" w:semiHidden="1" w:unhideWhenUsed="1"/&gt;&lt;w:lsdException w:name="Table Simple 2" w:semiHidden="1" w:unhideWhenUsed="1"/&gt;&lt;w:lsdException w:name="Table Simple 3" w:semiHidden="1" w:unhideWhenUsed="1"/&gt;&lt;w:lsdException w:name="Table Classic 1" w:semiHidden="1" w:unhideWhenUsed="1"/&gt;&lt;w:lsdException w:name="Table Classic 2" w:semiHidden="1" w:unhideWhenUsed="1"/&gt;&lt;w:lsdException w:name="Table Classic 3" w:semiHidden="1" w:unhideWhenUsed="1"/&gt;&lt;w:lsdException w:name="Table Classic 4" w:semiHidden="1" w:unhideWhenUsed="1"/&gt;&lt;w:lsdException w:name="Table Colorful 1" w:semiHidden="1" w:unhideWhenUsed="1"/&gt;&lt;w:lsdException w:name="Table Colorful 2" w:semiHidden="1" w:unhideWhenUsed="1"/&gt;&lt;w:lsdException w:name="Table Colorful 3" w:semiHidden="1" w:unhideWhenUsed="1"/&gt;&lt;w:lsdException w:name="Table Columns 1" w:semiHidden="1" w:unhideWhenUsed="1"/&gt;&lt;w:lsdException w:name="Table Columns 2" w:semiHidden="1" w:unhideWhenUsed="1"/&gt;&lt;w:lsdException w:name="Table Columns 3" w:semiHidden="1" w:unhideWhenUsed="1"/&gt;&lt;w:lsdException w:name="Table Columns 4" w:semiHidden="1" w:unhideWhenUsed="1"/&gt;&lt;w:lsdException w:name="Table Columns 5" w:semiHidden="1" w:unhideWhenUsed="1"/&gt;&lt;w:lsdException w:name="Table Grid 1" w:semiHidden="1" w:unhideWhenUsed="1"/&gt;&lt;w:lsdException w:name="Table Grid 2" w:semiHidden="1" w:unhideWhenUsed="1"/&gt;&lt;w:lsdException w:name="Table Grid 3" w:semiHidden="1" w:unhideWhenUsed="1"/&gt;&lt;w:lsdException w:name="Table Grid 4" w:semiHidden="1" w:unhideWhenUsed="1"/&gt;&lt;w:lsdException w:name="Table Grid 5" w:semiHidden="1" w:unhideWhenUsed="1"/&gt;&lt;w:lsdException w:name="Table Grid 6" w:semiHidden="1" w:unhideWhenUsed="1"/&gt;&lt;w:lsdException w:name="Table Grid 7" w:semiHidden="1" w:unhideWhenUsed="1"/&gt;&lt;w:lsdException w:name="Table Grid 8" w:semiHidden="1" w:unhideWhenUsed="1"/&gt;&lt;w:lsdException w:name="Table List 1" w:semiHidden="1" w:unhideWhenUsed="1"/&gt;&lt;w:lsdException w:name="Table List 2" w:semiHidden="1" w:unhideWhenUsed="1"/&gt;&lt;w:lsdException w:name="Table List 3" w:semiHidden="1" w:unhideWhenUsed="1"/&gt;&lt;w:lsdException w:name="Table List 4" w:semiHidden="1" w:unhideWhenUsed="1"/&gt;&lt;w:lsdException w:name="Table List 5" w:semiHidden="1" w:unhideWhenUsed="1"/&gt;&lt;w:lsdException w:name="Table List 6" w:semiHidden="1" w:unhideWhenUsed="1"/&gt;&lt;w:lsdException w:name="Table List 7" w:semiHidden="1" w:unhideWhenUsed="1"/&gt;&lt;w:lsdException w:name="Table List 8" w:semiHidden="1" w:unhideWhenUsed="1"/&gt;&lt;w:lsdException w:name="Table 3D effects 1" w:semiHidden="1" w:unhideWhenUsed="1"/&gt;&lt;w:lsdException w:name="Table 3D effects 2" w:semiHidden="1" w:unhideWhenUsed="1"/&gt;&lt;w:lsdException w:name="Table 3D effects 3" w:semiHidden="1" w:unhideWhenUsed="1"/&gt;&lt;w:lsdException w:name="Table Contemporary" w:semiHidden="1" w:unhideWhenUsed="1"/&gt;&lt;w:lsdException w:name="Table Elegant" w:semiHidden="1" w:unhideWhenUsed="1"/&gt;&lt;w:lsdException w:name="Table Professional" w:semiHidden="1" w:unhideWhenUsed="1"/&gt;&lt;w:lsdException w:name="Table Subtle 1" w:semiHidden="1" w:unhideWhenUsed="1"/&gt;&lt;w:lsdException w:name="Table Subtle 2" w:semiHidden="1" w:unhideWhenUsed="1"/&gt;&lt;w:lsdException w:name="Table Web 1" w:semiHidden="1" w:unhideWhenUsed="1"/&gt;&lt;w:lsdException w:name="Table Web 2" w:semiHidden="1" w:unhideWhenUsed="1"/&gt;&lt;w:lsdException w:name="Table Web 3" w:semiHidden="1" w:unhideWhenUsed="1"/&gt;&lt;w:lsdException w:name="Balloon Text" w:semiHidden="1" w:unhideWhenUsed="1"/&gt;&lt;w:lsdException w:name="Table Grid" w:uiPriority="39"/&gt;&lt;w:lsdException w:name="Table Theme" w:semiHidden="1" w:unhideWhenUsed="1"/&gt;&lt;w:lsdException w:name="Placeholder Text" w:semiHidden="1"/&gt;&lt;w:lsdException w:name="No Spacing" w:uiPriority="1" w:qFormat="1"/&gt;&lt;w:lsdException w:name="Light Shading" w:uiPriority="60"/&gt;&lt;w:lsdException w:name="Light List" w:uiPriority="61"/&gt;&lt;w:lsdException w:name="Light Grid" w:uiPriority="62"/&gt;&lt;w:lsdException w:name="Medium Shading 1" w:uiPriority="63"/&gt;&lt;w:lsdException w:name="Medium Shading 2" w:uiPriority="64"/&gt;&lt;w:lsdException w:name="Medium List 1" w:uiPriority="65"/&gt;&lt;w:lsdException w:name="Medium List 2" w:uiPriority="66"/&gt;&lt;w:lsdException w:name="Medium Grid 1" w:uiPriority="67"/&gt;&lt;w:lsdException w:name="Medium Grid 2" w:uiPriority="68"/&gt;&lt;w:lsdException w:name="Medium Grid 3" w:uiPriority="69"/&gt;&lt;w:lsdException w:name="Dark List" w:uiPriority="70"/&gt;&lt;w:lsdException w:name="Colorful Shading" w:uiPriority="71"/&gt;&lt;w:lsdException w:name="Colorful List" w:uiPriority="72"/&gt;&lt;w:lsdException w:name="Colorful Grid" w:uiPriority="73"/&gt;&lt;w:lsdException w:name="Light Shading Accent 1" w:uiPriority="60"/&gt;&lt;w:lsdException w:name="Light List Accent 1" w:uiPriority="61"/&gt;&lt;w:lsdException w:name="Light Grid Accent 1" w:uiPriority="62"/&gt;&lt;w:lsdException w:name="Medium Shading 1 Accent 1" w:uiPriority="63"/&gt;&lt;w:lsdException w:name="Medium Shading 2 Accent 1" w:uiPriority="64"/&gt;&lt;w:lsdException w:name="Medium List 1 Accent 1" w:uiPriority="65"/&gt;&lt;w:lsdException w:name="Revision" w:semiHidden="1"/&gt;&lt;w:lsdException w:name="List Paragraph" w:uiPriority="34" w:qFormat="1"/&gt;&lt;w:lsdException w:name="Quote" w:uiPriority="29" w:qFormat="1"/&gt;&lt;w:lsdException w:name="Intense Quote" w:uiPriority="30" w:qFormat="1"/&gt;&lt;w:lsdException w:name="Medium List 2 Accent 1" w:uiPriority="66"/&gt;&lt;w:lsdException w:name="Medium Grid 1 Accent 1" w:uiPriority="67"/&gt;&lt;w:lsdException w:name="Medium Grid 2 Accent 1" w:uiPriority="68"/&gt;&lt;w:lsdException w:name="Medium Grid 3 Accent 1" w:uiPriority="69"/&gt;&lt;w:lsdException w:name="Dark List Accent 1" w:uiPriority="70"/&gt;&lt;w:lsdException w:name="Colorful Shading Accent 1" w:uiPriority="71"/&gt;&lt;w:lsdException w:name="Colorful List Accent 1" w:uiPriority="72"/&gt;&lt;w:lsdException w:name="Colorful Grid Accent 1" w:uiPriority="73"/&gt;&lt;w:lsdException w:name="Light Shading Accent 2" w:uiPriority="60"/&gt;&lt;w:lsdException w:name="Light List Accent 2" w:uiPriority="61"/&gt;&lt;w:lsdException w:name="Light Grid Accent 2" w:uiPriority="62"/&gt;&lt;w:lsdException w:name="Medium Shading 1 Accent 2" w:uiPriority="63"/&gt;&lt;w:lsdException w:name="Medium Shading 2 Accent 2" w:uiPriority="64"/&gt;&lt;w:lsdException w:name="Medium List 1 Accent 2" w:uiPriority="65"/&gt;&lt;w:lsdException w:name="Medium List 2 Accent 2" w:uiPriority="66"/&gt;&lt;w:lsdException w:name="Medium Grid 1 Accent 2" w:uiPriority="67"/&gt;&lt;w:lsdException w:name="Medium Grid 2 Accent 2" w:uiPriority="68"/&gt;&lt;w:lsdException w:name="Medium Grid 3 Accent 2" w:uiPriority="69"/&gt;&lt;w:lsdException w:name="Dark List Accent 2" w:uiPriority="70"/&gt;&lt;w:lsdException w:name="Colorful Shading Accent 2" w:uiPriority="71"/&gt;&lt;w:lsdException w:name="Colorful List Accent 2" w:uiPriority="72"/&gt;&lt;w:lsdException w:name="Colorful Grid Accent 2" w:uiPriority="73"/&gt;&lt;w:lsdException w:name="Light Shading Accent 3" w:uiPriority="60"/&gt;&lt;w:lsdException w:name="Light List Accent 3" w:uiPriority="61"/&gt;&lt;w:lsdException w:name="Light Grid Accent 3" w:uiPriority="62"/&gt;&lt;w:lsdException w:name="Medium Shading 1 Accent 3" w:uiPriority="63"/&gt;&lt;w:lsdException w:name="Medium Shading 2 Accent 3" w:uiPriority="64"/&gt;&lt;w:lsdException w:name="Medium List 1 Accent 3" w:uiPriority="65"/&gt;&lt;w:lsdException w:name="Medium List 2 Accent 3" w:uiPriority="66"/&gt;&lt;w:lsdException w:name="Medium Grid 1 Accent 3" w:uiPriority="67"/&gt;&lt;w:lsdException w:name="Medium Grid 2 Accent 3" w:uiPriority="68"/&gt;&lt;w:lsdException w:name="Medium Grid 3 Accent 3" w:uiPriority="69"/&gt;&lt;w:lsdException w:name="Dark List Accent 3" w:uiPriority="70"/&gt;&lt;w:lsdException w:name="Colorful Shading Accent 3" w:uiPriority="71"/&gt;&lt;w:lsdException w:name="Colorful List Accent 3" w:uiPriority="72"/&gt;&lt;w:lsdException w:name="Colorful Grid Accent 3" w:uiPriority="73"/&gt;&lt;w:lsdException w:name="Light Shading Accent 4" w:uiPriority="60"/&gt;&lt;w:lsdException w:name="Light List Accent 4" w:uiPriority="61"/&gt;&lt;w:lsdException w:name="Light Grid Accent 4" w:uiPriority="62"/&gt;&lt;w:lsdException w:name="Medium Shading 1 Accent 4" w:uiPriority="63"/&gt;&lt;w:lsdException w:name="Medium Shading 2 Accent 4" w:uiPriority="64"/&gt;&lt;w:lsdException w:name="Medium List 1 Accent 4" w:uiPriority="65"/&gt;&lt;w:lsdException w:name="Medium List 2 Accent 4" w:uiPriority="66"/&gt;&lt;w:lsdException w:name="Medium Grid 1 Accent 4" w:uiPriority="67"/&gt;&lt;w:lsdException w:name="Medium Grid 2 Accent 4" w:uiPriority="68"/&gt;&lt;w:lsdException w:name="Medium Grid 3 Accent 4" w:uiPriority="69"/&gt;&lt;w:lsdException w:name="Dark List Accent 4" w:uiPriority="70"/&gt;&lt;w:lsdException w:name="Colorful Shading Accent 4" w:uiPriority="71"/&gt;&lt;w:lsdException w:name="Colorful List Accent 4" w:uiPriority="72"/&gt;&lt;w:lsdException w:name="Colorful Grid Accent 4" w:uiPriority="73"/&gt;&lt;w:lsdException w:name="Light Shading Accent 5" w:uiPriority="60"/&gt;&lt;w:lsdException w:name="Light List Accent 5" w:uiPriority="61"/&gt;&lt;w:lsdException w:name="Light Grid Accent 5" w:uiPriority="62"/&gt;&lt;w:lsdException w:name="Medium Shading 1 Accent 5" w:uiPriority="63"/&gt;&lt;w:lsdException w:name="Medium Shading 2 Accent 5" w:uiPriority="64"/&gt;&lt;w:lsdException w:name="Medium List 1 Accent 5" w:uiPriority="65"/&gt;&lt;w:lsdException w:name="Medium List 2 Accent 5" w:uiPriority="66"/&gt;&lt;w:lsdException w:name="Medium Grid 1 Accent 5" w:uiPriority="67"/&gt;&lt;w:lsdException w:name="Medium Grid 2 Accent 5" w:uiPriority="68"/&gt;&lt;w:lsdException w:name="Medium Grid 3 Accent 5" w:uiPriority="69"/&gt;&lt;w:lsdException w:name="Dark List Accent 5" w:uiPriority="70"/&gt;&lt;w:lsdException w:name="Colorful Shading Accent 5" w:uiPriority="71"/&gt;&lt;w:lsdException w:name="Colorful List Accent 5" w:uiPriority="72"/&gt;&lt;w:lsdException w:name="Colorful Grid Accent 5" w:uiPriority="73"/&gt;&lt;w:lsdException w:name="Light Shading Accent 6" w:uiPriority="60"/&gt;&lt;w:lsdException w:name="Light List Accent 6" w:uiPriority="61"/&gt;&lt;w:lsdException w:name="Light Grid Accent 6" w:uiPriority="62"/&gt;&lt;w:lsdException w:name="Medium Shading 1 Accent 6" w:uiPriority="63"/&gt;&lt;w:lsdException w:name="Medium Shading 2 Accent 6" w:uiPriority="64"/&gt;&lt;w:lsdException w:name="Medium List 1 Accent 6" w:uiPriority="65"/&gt;&lt;w:lsdException w:name="Medium List 2 Accent 6" w:uiPriority="66"/&gt;&lt;w:lsdException w:name="Medium Grid 1 Accent 6" w:uiPriority="67"/&gt;&lt;w:lsdException w:name="Medium Grid 2 Accent 6" w:uiPriority="68"/&gt;&lt;w:lsdException w:name="Medium Grid 3 Accent 6" w:uiPriority="69"/&gt;&lt;w:lsdException w:name="Dark List Accent 6" w:uiPriority="70"/&gt;&lt;w:lsdException w:name="Colorful Shading Accent 6" w:uiPriority="71"/&gt;&lt;w:lsdException w:name="Colorful List Accent 6" w:uiPriority="72"/&gt;&lt;w:lsdException w:name="Colorful Grid Accent 6" w:uiPriority="73"/&gt;&lt;w:lsdException w:name="Subtle Emphasis" w:uiPriority="19" w:qFormat="1"/&gt;&lt;w:lsdException w:name="Intense Emphasis" w:uiPriority="21" w:qFormat="1"/&gt;&lt;w:lsdException w:name="Subtle Reference" w:uiPriority="31" w:qFormat="1"/&gt;&lt;w:lsdException w:name="Intense Reference" w:uiPriority="32" w:qFormat="1"/&gt;&lt;w:lsdException w:name="Book Title" w:uiPriority="33" w:qFormat="1"/&gt;&lt;w:lsdException w:name="Bibliography" w:semiHidden="1" w:uiPriority="37" w:unhideWhenUsed="1"/&gt;&lt;w:lsdException w:name="TOC Heading" w:semiHidden="1" w:uiPriority="39" w:unhideWhenUsed="1" w:qFormat="1"/&gt;&lt;w:lsdException w:name="Plain Table 1" w:uiPriority="41"/&gt;&lt;w:lsdException w:name="Plain Table 2" w:uiPriority="42"/&gt;&lt;w:lsdException w:name="Plain Table 3" w:uiPriority="43"/&gt;&lt;w:lsdException w:name="Plain Table 4" w:uiPriority="44"/&gt;&lt;w:lsdException w:name="Plain Table 5" w:uiPriority="45"/&gt;&lt;w:lsdException w:name="Grid Table Light" w:uiPriority="40"/&gt;&lt;w:lsdException w:name="Grid Table 1 Light" w:uiPriority="46"/&gt;&lt;w:lsdException w:name="Grid Table 2" w:uiPriority="47"/&gt;&lt;w:lsdException w:name="Grid Table 3" w:uiPriority="48"/&gt;&lt;w:lsdException w:name="Grid Table 4" w:uiPriority="49"/&gt;&lt;w:lsdException w:name="Grid Table 5 Dark" w:uiPriority="50"/&gt;&lt;w:lsdException w:name="Grid Table 6 Colorful" w:uiPriority="51"/&gt;&lt;w:lsdException w:name="Grid Table 7 Colorful" w:uiPriority="52"/&gt;&lt;w:lsdException w:name="Grid Table 1 Light Accent 1" w:uiPriority="46"/&gt;&lt;w:lsdException w:name="Grid Table 2 Accent 1" w:uiPriority="47"/&gt;&lt;w:lsdException w:name="Grid Table 3 Accent 1" w:uiPriority="48"/&gt;&lt;w:lsdException w:name="Grid Table 4 Accent 1" w:uiPriority="49"/&gt;&lt;w:lsdException w:name="Grid Table 5 Dark Accent 1" w:uiPriority="50"/&gt;&lt;w:lsdException w:name="Grid Table 6 Colorful Accent 1" w:uiPriority="51"/&gt;&lt;w:lsdException w:name="Grid Table 7 Colorful Accent 1" w:uiPriority="52"/&gt;&lt;w:lsdException w:name="Grid Table 1 Light Accent 2" w:uiPriority="46"/&gt;&lt;w:lsdException w:name="Grid Table 2 Accent 2" w:uiPriority="47"/&gt;&lt;w:lsdException w:name="Grid Table 3 Accent 2" w:uiPriority="48"/&gt;&lt;w:lsdException w:name="Grid Table 4 Accent 2" w:uiPriority="49"/&gt;&lt;w:lsdException w:name="Grid Table 5 Dark Accent 2" w:uiPriority="50"/&gt;&lt;w:lsdException w:name="Grid Table 6 Colorful Accent 2" w:uiPriority="51"/&gt;&lt;w:lsdException w:name="Grid Table 7 Colorful Accent 2" w:uiPriority="52"/&gt;&lt;w:lsdException w:name="Grid Table 1 Light Accent 3" w:uiPriority="46"/&gt;&lt;w:lsdException w:name="Grid Table 2 Accent 3" w:uiPriority="47"/&gt;&lt;w:lsdException w:name="Grid Table 3 Accent 3" w:uiPriority="48"/&gt;&lt;w:lsdException w:name="Grid Table 4 Accent 3" w:uiPriority="49"/&gt;&lt;w:lsdException w:name="Grid Table 5 Dark Accent 3" w:uiPriority="50"/&gt;&lt;w:lsdException w:name="Grid Table 6 Colorful Accent 3" w:uiPriority="51"/&gt;&lt;w:lsdException w:name="Grid Table 7 Colorful Accent 3" w:uiPriority="52"/&gt;&lt;w:lsdException w:name="Grid Table 1 Light Accent 4" w:uiPriority="46"/&gt;&lt;w:lsdException w:name="Grid Table 2 Accent 4" w:uiPriority="47"/&gt;&lt;w:lsdException w:name="Grid Table 3 Accent 4" w:uiPriority="48"/&gt;&lt;w:lsdException w:name="Grid Table 4 Accent 4" w:uiPriority="49"/&gt;&lt;w:lsdException w:name="Grid Table 5 Dark Accent 4" w:uiPriority="50"/&gt;&lt;w:lsdException w:name="Grid Table 6 Colorful Accent 4" w:uiPriority="51"/&gt;&lt;w:lsdException w:name="Grid Table 7 Colorful Accent 4" w:uiPriority="52"/&gt;&lt;w:lsdException w:name="Grid Table 1 Light Accent 5" w:uiPriority="46"/&gt;&lt;w:lsdException w:name="Grid Table 2 Accent 5" w:uiPriority="47"/&gt;&lt;w:lsdException w:name="Grid Table 3 Accent 5" w:uiPriority="48"/&gt;&lt;w:lsdException w:name="Grid Table 4 Accent 5" w:uiPriority="49"/&gt;&lt;w:lsdException w:name="Grid Table 5 Dark Accent 5" w:uiPriority="50"/&gt;&lt;w:lsdException w:name="Grid Table 6 Colorful Accent 5" w:uiPriority="51"/&gt;&lt;w:lsdException w:name="Grid Table 7 Colorful Accent 5" w:uiPriority="52"/&gt;&lt;w:lsdException w:name="Grid Table 1 Light Accent 6" w:uiPriority="46"/&gt;&lt;w:lsdException w:name="Grid Table 2 Accent 6" w:uiPriority="47"/&gt;&lt;w:lsdException w:name="Grid Table 3 Accent 6" w:uiPriority="48"/&gt;&lt;w:lsdException w:name="Grid Table 4 Accent 6" w:uiPriority="49"/&gt;&lt;w:lsdException w:name="Grid Table 5 Dark Accent 6" w:uiPriority="50"/&gt;&lt;w:lsdException w:name="Grid Table 6 Colorful Accent 6" w:uiPriority="51"/&gt;&lt;w:lsdException w:name="Grid Table 7 Colorful Accent 6" w:uiPriority="52"/&gt;&lt;w:lsdException w:name="List Table 1 Light" w:uiPriority="46"/&gt;&lt;w:lsdException w:name="List Table 2" w:uiPriority="47"/&gt;&lt;w:lsdException w:name="List Table 3" w:uiPriority="48"/&gt;&lt;w:lsdException w:name="List Table 4" w:uiPriority="49"/&gt;&lt;w:lsdException w:name="List Table 5 Dark" w:uiPriority="50"/&gt;&lt;w:lsdException w:name="List Table 6 Colorful" w:uiPriority="51"/&gt;&lt;w:lsdException w:name="List Table 7 Colorful" w:uiPriority="52"/&gt;&lt;w:lsdException w:name="List Table 1 Light Accent 1" w:uiPriority="46"/&gt;&lt;w:lsdException w:name="List Table 2 Accent 1" w:uiPriority="47"/&gt;&lt;w:lsdException w:name="List Table 3 Accent 1" w:uiPriority="48"/&gt;&lt;w:lsdException w:name="List Table 4 Accent 1" w:uiPriority="49"/&gt;&lt;w:lsdException w:name="List Table 5 Dark Accent 1" w:uiPriority="50"/&gt;&lt;w:lsdException w:name="List Table 6 Colorful Accent 1" w:uiPriority="51"/&gt;&lt;w:lsdException w:name="List Table 7 Colorful Accent 1" w:uiPriority="52"/&gt;&lt;w:lsdException w:name="List Table 1 Light Accent 2" w:uiPriority="46"/&gt;&lt;w:lsdException w:name="List Table 2 Accent 2" w:uiPriority="47"/&gt;&lt;w:lsdException w:name="List Table 3 Accent 2" w:uiPriority="48"/&gt;&lt;w:lsdException w:name="List Table 4 Accent 2" w:uiPriority="49"/&gt;&lt;w:lsdException w:name="List Table 5 Dark Accent 2" w:uiPriority="50"/&gt;&lt;w:lsdException w:name="List Table 6 Colorful Accent 2" w:uiPriority="51"/&gt;&lt;w:lsdException w:name="List Table 7 Colorful Accent 2" w:uiPriority="52"/&gt;&lt;w:lsdException w:name="List Table 1 Light Accent 3" w:uiPriority="46"/&gt;&lt;w:lsdException w:name="List Table 2 Accent 3" w:uiPriority="47"/&gt;&lt;w:lsdException w:name="List Table 3 Accent 3" w:uiPriority="48"/&gt;&lt;w:lsdException w:name="List Table 4 Accent 3" w:uiPriority="49"/&gt;&lt;w:lsdException w:name="List Table 5 Dark Accent 3" w:uiPriority="50"/&gt;&lt;w:lsdException w:name="List Table 6 Colorful Accent 3" w:uiPriority="51"/&gt;&lt;w:lsdException w:name="List Table 7 Colorful Accent 3" w:uiPriority="52"/&gt;&lt;w:lsdException w:name="List Table 1 Light Accent 4" w:uiPriority="46"/&gt;&lt;w:lsdException w:name="List Table 2 Accent 4" w:uiPriority="47"/&gt;&lt;w:lsdException w:name="List Table 3 Accent 4" w:uiPriority="48"/&gt;&lt;w:lsdException w:name="List Table 4 Accent 4" w:uiPriority="49"/&gt;&lt;w:lsdException w:name="List Table 5 Dark Accent 4" w:uiPriority="50"/&gt;&lt;w:lsdException w:name="List Table 6 Colorful Accent 4" w:uiPriority="51"/&gt;&lt;w:lsdException w:name="List Table 7 Colorful Accent 4" w:uiPriority="52"/&gt;&lt;w:lsdException w:name="List Table 1 Light Accent 5" w:uiPriority="46"/&gt;&lt;w:lsdException w:name="List Table 2 Accent 5" w:uiPriority="47"/&gt;&lt;w:lsdException w:name="List Table 3 Accent 5" w:uiPriority="48"/&gt;&lt;w:lsdException w:name="List Table 4 Accent 5" w:uiPriority="49"/&gt;&lt;w:lsdException w:name="List Table 5 Dark Accent 5" w:uiPriority="50"/&gt;&lt;w:lsdException w:name="List Table 6 Colorful Accent 5" w:uiPriority="51"/&gt;&lt;w:lsdException w:name="List Table 7 Colorful Accent 5" w:uiPriority="52"/&gt;&lt;w:lsdException w:name="List Table 1 Light Accent 6" w:uiPriority="46"/&gt;&lt;w:lsdException w:name="List Table 2 Accent 6" w:uiPriority="47"/&gt;&lt;w:lsdException w:name="List Table 3 Accent 6" w:uiPriority="48"/&gt;&lt;w:lsdException w:name="List Table 4 Accent 6" w:uiPriority="49"/&gt;&lt;w:lsdException w:name="List Table 5 Dark Accent 6" w:uiPriority="50"/&gt;&lt;w:lsdException w:name="List Table 6 Colorful Accent 6" w:uiPriority="51"/&gt;&lt;w:lsdException w:name="List Table 7 Colorful Accent 6" w:uiPriority="52"/&gt;&lt;w:lsdException w:name="Mention" w:semiHidden="1" w:unhideWhenUsed="1"/&gt;&lt;w:lsdException w:name="Smart Hyperlink" w:semiHidden="1" w:unhideWhenUsed="1"/&gt;&lt;w:lsdException w:name="Hashtag" w:semiHidden="1" w:unhideWhenUsed="1"/&gt;&lt;/w:latentStyles&gt;&lt;w:style w:type="paragraph" w:default="1" w:styleId="Normal"&gt;&lt;w:name w:val="Normal"/&gt;&lt;w:qFormat/&gt;&lt;/w:style&gt;&lt;w:style w:type="character" w:default="1" w:styleId="DefaultParagraphFont"&gt;&lt;w:name w:val="Default Paragraph Font"/&gt;&lt;w:uiPriority w:val="1"/&gt;&lt;w:semiHidden/&gt;&lt;w:unhideWhenUsed/&gt;&lt;/w:style&gt;&lt;w:style w:type="table" w:default="1" w:styleId="TableNormal"&gt;&lt;w:name w:val="Normal Table"/&gt;&lt;w:uiPriority w:val="99"/&gt;&lt;w:semiHidden/&gt;&lt;w:unhideWhenUsed/&gt;&lt;w:tblPr&gt;&lt;w:tblInd w:w="0" w:type="dxa"/&gt;&lt;w:tblCellMar&gt;&lt;w:top w:w="0" w:type="dxa"/&gt;&lt;w:left w:w="108" w:type="dxa"/&gt;&lt;w:bottom w:w="0" w:type="dxa"/&gt;&lt;w:right w:w="108" w:type="dxa"/&gt;&lt;/w:tblCellMar&gt;&lt;/w:tblPr&gt;&lt;/w:style&gt;&lt;w:style w:type="numbering" w:default="1" w:styleId="NoList"&gt;&lt;w:name w:val="No List"/&gt;&lt;w:uiPriority w:val="99"/&gt;&lt;w:semiHidden/&gt;&lt;w:unhideWhenUsed/&gt;&lt;/w:style&gt;&lt;w:style w:type="character" w:styleId="PlaceholderText"&gt;&lt;w:name w:val="Placeholder Text"/&gt;&lt;w:basedOn w:val="DefaultParagraphFont"/&gt;&lt;w:uiPriority w:val="99"/&gt;&lt;w:rPr&gt;&lt;w:color w:val="7F7F7F" w:themeColor="text1" w:themeTint="80"/&gt;&lt;w:bdr w:val="none" w:sz="0" w:space="0" w:color="auto"/&gt;&lt;w:shd w:val="clear" w:color="auto" w:fill="F0F0F0"/&gt;&lt;/w:rPr&gt;&lt;/w:style&gt;&lt;w:style w:type="paragraph" w:customStyle="1" w:styleId="B7CF53EBD28C4270BBC51AAB20A1C895"&gt;&lt;w:name w:val="B7CF53EBD28C4270BBC51AAB20A1C895"/&gt;&lt;/w:style&gt;&lt;/w:styles&gt;&lt;/pkg:xmlData&gt;&lt;/pkg:part&gt;&lt;pkg:part pkg:name="/word/styles.xml" pkg:contentType="application/vnd.openxmlformats-officedocument.wordprocessingml.styles+xml"&gt;&lt;pkg:xmlData&gt;&lt;w:styles xmlns:mc="http://schemas.openxmlformats.org/markup-compatibility/2006" xmlns:r="http://schemas.openxmlformats.org/officeDocument/2006/relationships" xmlns:w="http://schemas.openxmlformats.org/wordprocessingml/2006/main" xmlns:w14="http://schemas.microsoft.com/office/word/2010/wordml" xmlns:w15="http://schemas.microsoft.com/office/word/2012/wordml" xmlns:w16se="http://schemas.microsoft.com/office/word/2015/wordml/symex" mc:Ignorable="w14 w15 w16se"&gt;&lt;w:docDefaults&gt;&lt;w:rPrDefault&gt;&lt;w:rPr&gt;&lt;w:rFonts w:asciiTheme="minorHAnsi" w:eastAsiaTheme="minorEastAsia" w:hAnsiTheme="minorHAnsi" w:cstheme="minorBidi"/&gt;&lt;w:sz w:val="19"/&gt;&lt;w:szCs w:val="19"/&gt;&lt;w:lang w:val="sv-SE" w:eastAsia="en-US" w:bidi="ar-SA"/&gt;&lt;/w:rPr&gt;&lt;/w:rPrDefault&gt;&lt;w:pPrDefault&gt;&lt;w:pPr&gt;&lt;w:spacing w:after="160" w:line="288" w:lineRule="auto"/&gt;&lt;/w:pPr&gt;&lt;/w:pPrDefault&gt;&lt;/w:docDefaults&gt;&lt;w:style w:type="paragraph" w:default="1" w:styleId="Normal"&gt;&lt;w:name w:val="Normal"/&gt;&lt;w:qFormat/&gt;&lt;w:rsid w:val="005F186C"/&gt;&lt;w:pPr&gt;&lt;w:spacing w:after="200"/&gt;&lt;/w:pPr&gt;&lt;w:rPr&gt;&lt;w:sz w:val="20"/&gt;&lt;w:lang w:val="en-GB"/&gt;&lt;/w:rPr&gt;&lt;/w:style&gt;&lt;w:style w:type="paragraph" w:styleId="Heading1"&gt;&lt;w:name w:val="heading 1"/&gt;&lt;w:basedOn w:val="Normal"/&gt;&lt;w:next w:val="Normal"/&gt;&lt;w:link w:val="Heading1Char"/&gt;&lt;w:uiPriority w:val="9"/&gt;&lt;w:qFormat/&gt;&lt;w:rsid w:val="000C3604"/&gt;&lt;w:pPr&gt;&lt;w:keepNext/&gt;&lt;w:keepLines/&gt;&lt;w:spacing w:before="240"/&gt;&lt;w:outlineLvl w:val="0"/&gt;&lt;/w:pPr&gt;&lt;w:rPr&gt;&lt;w:rFonts w:asciiTheme="majorHAnsi" w:eastAsiaTheme="majorEastAsia" w:hAnsiTheme="majorHAnsi" w:cstheme="majorBidi"/&gt;&lt;w:bCs/&gt;&lt;w:sz w:val="28"/&gt;&lt;w:szCs w:val="28"/&gt;&lt;/w:rPr&gt;&lt;/w:style&gt;&lt;w:style w:type="paragraph" w:styleId="Heading2"&gt;&lt;w:name w:val="heading 2"/&gt;&lt;w:basedOn w:val="Normal"/&gt;&lt;w:next w:val="Normal"/&gt;&lt;w:link w:val="Heading2Char"/&gt;&lt;w:uiPriority w:val="9"/&gt;&lt;w:qFormat/&gt;&lt;w:rsid w:val="000C3604"/&gt;&lt;w:pPr&gt;&lt;w:keepNext/&gt;&lt;w:keepLines/&gt;&lt;w:spacing w:before="240" w:after="80"/&gt;&lt;w:outlineLvl w:val="1"/&gt;&lt;/w:pPr&gt;&lt;w:rPr&gt;&lt;w:rFonts w:ascii="GothamMedium" w:eastAsiaTheme="majorEastAsia" w:hAnsi="GothamMedium" w:cstheme="majorBidi"/&gt;&lt;w:bCs/&gt;&lt;w:sz w:val="24"/&gt;&lt;w:szCs w:val="28"/&gt;&lt;/w:rPr&gt;&lt;/w:style&gt;&lt;w:style w:type="paragraph" w:styleId="Heading3"&gt;&lt;w:name w:val="heading 3"/&gt;&lt;w:basedOn w:val="Normal"/&gt;&lt;w:next w:val="Normal"/&gt;&lt;w:link w:val="Heading3Char"/&gt;&lt;w:uiPriority w:val="9"/&gt;&lt;w:qFormat/&gt;&lt;w:rsid w:val="00872413"/&gt;&lt;w:pPr&gt;&lt;w:keepNext/&gt;&lt;w:keepLines/&gt;&lt;w:spacing w:before="120" w:after="40"/&gt;&lt;w:outlineLvl w:val="2"/&gt;&lt;/w:pPr&gt;&lt;w:rPr&gt;&lt;w:rFonts w:ascii="GothamMedium" w:eastAsiaTheme="majorEastAsia" w:hAnsi="GothamMedium" w:cstheme="majorBidi"/&gt;&lt;w:sz w:val="22"/&gt;&lt;w:szCs w:val="24"/&gt;&lt;/w:rPr&gt;&lt;/w:style&gt;&lt;w:style w:type="paragraph" w:styleId="Heading4"&gt;&lt;w:name w:val="heading 4"/&gt;&lt;w:basedOn w:val="Normal"/&gt;&lt;w:next w:val="Normal"/&gt;&lt;w:link w:val="Heading4Char"/&gt;&lt;w:uiPriority w:val="9"/&gt;&lt;w:semiHidden/&gt;&lt;w:qFormat/&gt;&lt;w:rsid w:val="00872413"/&gt;&lt;w:pPr&gt;&lt;w:keepNext/&gt;&lt;w:keepLines/&gt;&lt;w:spacing w:before="120" w:after="40"/&gt;&lt;w:outlineLvl w:val="3"/&gt;&lt;/w:pPr&gt;&lt;w:rPr&gt;&lt;w:rFonts w:ascii="GothamMedium" w:eastAsiaTheme="majorEastAsia" w:hAnsi="GothamMedium" w:cstheme="majorBidi"/&gt;&lt;w:iCs/&gt;&lt;w:szCs w:val="24"/&gt;&lt;/w:rPr&gt;&lt;/w:style&gt;&lt;w:style w:type="paragraph" w:styleId="Heading5"&gt;&lt;w:name w:val="heading 5"/&gt;&lt;w:basedOn w:val="Normal"/&gt;&lt;w:next w:val="Normal"/&gt;&lt;w:link w:val="Heading5Char"/&gt;&lt;w:uiPriority w:val="9"/&gt;&lt;w:semiHidden/&gt;&lt;w:qFormat/&gt;&lt;w:rsid w:val="009B1B65"/&gt;&lt;w:pPr&gt;&lt;w:keepNext/&gt;&lt;w:keepLines/&gt;&lt;w:numPr&gt;&lt;w:ilvl w:val="4"/&gt;&lt;w:numId w:val="15"/&gt;&lt;/w:numPr&gt;&lt;w:spacing w:before="120" w:after="0"/&gt;&lt;w:outlineLvl w:val="4"/&gt;&lt;/w:pPr&gt;&lt;w:rPr&gt;&lt;w:rFonts w:asciiTheme="majorHAnsi" w:eastAsiaTheme="majorEastAsia" w:hAnsiTheme="majorHAnsi" w:cstheme="majorBidi"/&gt;&lt;w:b/&gt;&lt;w:bCs/&gt;&lt;/w:rPr&gt;&lt;/w:style&gt;&lt;w:style w:type="paragraph" w:styleId="Heading6"&gt;&lt;w:name w:val="heading 6"/&gt;&lt;w:basedOn w:val="Normal"/&gt;&lt;w:next w:val="Normal"/&gt;&lt;w:link w:val="Heading6Char"/&gt;&lt;w:uiPriority w:val="9"/&gt;&lt;w:semiHidden/&gt;&lt;w:rsid w:val="009B1B65"/&gt;&lt;w:pPr&gt;&lt;w:keepNext/&gt;&lt;w:keepLines/&gt;&lt;w:numPr&gt;&lt;w:ilvl w:val="5"/&gt;&lt;w:numId w:val="15"/&gt;&lt;/w:numPr&gt;&lt;w:spacing w:before="120" w:after="0"/&gt;&lt;w:outlineLvl w:val="5"/&gt;&lt;/w:pPr&gt;&lt;w:rPr&gt;&lt;w:rFonts w:asciiTheme="majorHAnsi" w:eastAsiaTheme="majorEastAsia" w:hAnsiTheme="majorHAnsi" w:cstheme="majorBidi"/&gt;&lt;w:b/&gt;&lt;w:bCs/&gt;&lt;w:i/&gt;&lt;w:iCs/&gt;&lt;/w:rPr&gt;&lt;/w:style&gt;&lt;w:style w:type="paragraph" w:styleId="Heading7"&gt;&lt;w:name w:val="heading 7"/&gt;&lt;w:basedOn w:val="Normal"/&gt;&lt;w:next w:val="Normal"/&gt;&lt;w:link w:val="Heading7Char"/&gt;&lt;w:uiPriority w:val="9"/&gt;&lt;w:semiHidden/&gt;&lt;w:rsid w:val="009B1B65"/&gt;&lt;w:pPr&gt;&lt;w:keepNext/&gt;&lt;w:keepLines/&gt;&lt;w:numPr&gt;&lt;w:ilvl w:val="6"/&gt;&lt;w:numId w:val="15"/&gt;&lt;/w:numPr&gt;&lt;w:spacing w:before="120" w:after="0"/&gt;&lt;w:outlineLvl w:val="6"/&gt;&lt;/w:pPr&gt;&lt;w:rPr&gt;&lt;w:i/&gt;&lt;w:iCs/&gt;&lt;/w:rPr&gt;&lt;/w:style&gt;&lt;w:style w:type="paragraph" w:styleId="Heading8"&gt;&lt;w:name w:val="heading 8"/&gt;&lt;w:basedOn w:val="Normal"/&gt;&lt;w:next w:val="Normal"/&gt;&lt;w:link w:val="Heading8Char"/&gt;&lt;w:uiPriority w:val="9"/&gt;&lt;w:semiHidden/&gt;&lt;w:rsid w:val="009B1B65"/&gt;&lt;w:pPr&gt;&lt;w:keepNext/&gt;&lt;w:keepLines/&gt;&lt;w:numPr&gt;&lt;w:ilvl w:val="7"/&gt;&lt;w:numId w:val="15"/&gt;&lt;/w:numPr&gt;&lt;w:spacing w:before="120" w:after="0"/&gt;&lt;w:outlineLvl w:val="7"/&gt;&lt;/w:pPr&gt;&lt;w:rPr&gt;&lt;w:b/&gt;&lt;w:bCs/&gt;&lt;/w:rPr&gt;&lt;/w:style&gt;&lt;w:style w:type="paragraph" w:styleId="Heading9"&gt;&lt;w:name w:val="heading 9"/&gt;&lt;w:basedOn w:val="Normal"/&gt;&lt;w:next w:val="Normal"/&gt;&lt;w:link w:val="Heading9Char"/&gt;&lt;w:uiPriority w:val="9"/&gt;&lt;w:semiHidden/&gt;&lt;w:rsid w:val="009B1B65"/&gt;&lt;w:pPr&gt;&lt;w:keepNext/&gt;&lt;w:keepLines/&gt;&lt;w:numPr&gt;&lt;w:ilvl w:val="8"/&gt;&lt;w:numId w:val="15"/&gt;&lt;/w:numPr&gt;&lt;w:spacing w:before="120" w:after="0"/&gt;&lt;w:outlineLvl w:val="8"/&gt;&lt;/w:pPr&gt;&lt;w:rPr&gt;&lt;w:i/&gt;&lt;w:iCs/&gt;&lt;/w:rPr&gt;&lt;/w:style&gt;&lt;w:style w:type="character" w:default="1" w:styleId="DefaultParagraphFont"&gt;&lt;w:name w:val="Default Paragraph Font"/&gt;&lt;w:uiPriority w:val="1"/&gt;&lt;w:semiHidden/&gt;&lt;w:unhideWhenUsed/&gt;&lt;/w:style&gt;&lt;w:style w:type="table" w:default="1" w:styleId="TableNormal"&gt;&lt;w:name w:val="Normal Table"/&gt;&lt;w:uiPriority w:val="99"/&gt;&lt;w:semiHidden/&gt;&lt;w:unhideWhenUsed/&gt;&lt;w:tblPr&gt;&lt;w:tblInd w:w="0" w:type="dxa"/&gt;&lt;w:tblCellMar&gt;&lt;w:top w:w="0" w:type="dxa"/&gt;&lt;w:left w:w="108" w:type="dxa"/&gt;&lt;w:bottom w:w="0" w:type="dxa"/&gt;&lt;w:right w:w="108" w:type="dxa"/&gt;&lt;/w:tblCellMar&gt;&lt;/w:tblPr&gt;&lt;/w:style&gt;&lt;w:style w:type="numbering" w:default="1" w:styleId="NoList"&gt;&lt;w:name w:val="No List"/&gt;&lt;w:uiPriority w:val="99"/&gt;&lt;w:semiHidden/&gt;&lt;w:unhideWhenUsed/&gt;&lt;/w:style&gt;&lt;w:style w:type="character" w:customStyle="1" w:styleId="Heading1Char"&gt;&lt;w:name w:val="Heading 1 Char"/&gt;&lt;w:basedOn w:val="DefaultParagraphFont"/&gt;&lt;w:link w:val="Heading1"/&gt;&lt;w:uiPriority w:val="9"/&gt;&lt;w:rsid w:val="000C3604"/&gt;&lt;w:rPr&gt;&lt;w:rFonts w:asciiTheme="majorHAnsi" w:eastAsiaTheme="majorEastAsia" w:hAnsiTheme="majorHAnsi" w:cstheme="majorBidi"/&gt;&lt;w:bCs/&gt;&lt;w:sz w:val="28"/&gt;&lt;w:szCs w:val="28"/&gt;&lt;w:lang w:val="en-GB"/&gt;&lt;/w:rPr&gt;&lt;/w:style&gt;&lt;w:style w:type="character" w:customStyle="1" w:styleId="Heading2Char"&gt;&lt;w:name w:val="Heading 2 Char"/&gt;&lt;w:basedOn w:val="DefaultParagraphFont"/&gt;&lt;w:link w:val="Heading2"/&gt;&lt;w:uiPriority w:val="9"/&gt;&lt;w:rsid w:val="000C3604"/&gt;&lt;w:rPr&gt;&lt;w:rFonts w:ascii="GothamMedium" w:eastAsiaTheme="majorEastAsia" w:hAnsi="GothamMedium" w:cstheme="majorBidi"/&gt;&lt;w:bCs/&gt;&lt;w:sz w:val="24"/&gt;&lt;w:szCs w:val="28"/&gt;&lt;w:lang w:val="en-GB"/&gt;&lt;/w:rPr&gt;&lt;/w:style&gt;&lt;w:style w:type="character" w:customStyle="1" w:styleId="Heading3Char"&gt;&lt;w:name w:val="Heading 3 Char"/&gt;&lt;w:basedOn w:val="DefaultParagraphFont"/&gt;&lt;w:link w:val="Heading3"/&gt;&lt;w:uiPriority w:val="9"/&gt;&lt;w:rsid w:val="00872413"/&gt;&lt;w:rPr&gt;&lt;w:rFonts w:ascii="GothamMedium" w:eastAsiaTheme="majorEastAsia" w:hAnsi="GothamMedium" w:cstheme="majorBidi"/&gt;&lt;w:sz w:val="22"/&gt;&lt;w:szCs w:val="24"/&gt;&lt;w:lang w:val="en-GB"/&gt;&lt;/w:rPr&gt;&lt;/w:style&gt;&lt;w:style w:type="character" w:customStyle="1" w:styleId="Heading4Char"&gt;&lt;w:name w:val="Heading 4 Char"/&gt;&lt;w:basedOn w:val="DefaultParagraphFont"/&gt;&lt;w:link w:val="Heading4"/&gt;&lt;w:uiPriority w:val="9"/&gt;&lt;w:semiHidden/&gt;&lt;w:rsid w:val="005F186C"/&gt;&lt;w:rPr&gt;&lt;w:rFonts w:ascii="GothamMedium" w:eastAsiaTheme="majorEastAsia" w:hAnsi="GothamMedium" w:cstheme="majorBidi"/&gt;&lt;w:iCs/&gt;&lt;w:sz w:val="20"/&gt;&lt;w:szCs w:val="24"/&gt;&lt;w:lang w:val="en-GB"/&gt;&lt;/w:rPr&gt;&lt;/w:style&gt;&lt;w:style w:type="character" w:customStyle="1" w:styleId="Heading5Char"&gt;&lt;w:name w:val="Heading 5 Char"/&gt;&lt;w:basedOn w:val="DefaultParagraphFont"/&gt;&lt;w:link w:val="Heading5"/&gt;&lt;w:uiPriority w:val="9"/&gt;&lt;w:semiHidden/&gt;&lt;w:rsid w:val="008E716E"/&gt;&lt;w:rPr&gt;&lt;w:rFonts w:asciiTheme="majorHAnsi" w:eastAsiaTheme="majorEastAsia" w:hAnsiTheme="majorHAnsi" w:cstheme="majorBidi"/&gt;&lt;w:b/&gt;&lt;w:bCs/&gt;&lt;w:lang w:val="en-GB"/&gt;&lt;/w:rPr&gt;&lt;/w:style&gt;&lt;w:style w:type="character" w:customStyle="1" w:styleId="Heading6Char"&gt;&lt;w:name w:val="Heading 6 Char"/&gt;&lt;w:basedOn w:val="DefaultParagraphFont"/&gt;&lt;w:link w:val="Heading6"/&gt;&lt;w:uiPriority w:val="9"/&gt;&lt;w:semiHidden/&gt;&lt;w:rsid w:val="008E716E"/&gt;&lt;w:rPr&gt;&lt;w:rFonts w:asciiTheme="majorHAnsi" w:eastAsiaTheme="majorEastAsia" w:hAnsiTheme="majorHAnsi" w:cstheme="majorBidi"/&gt;&lt;w:b/&gt;&lt;w:bCs/&gt;&lt;w:i/&gt;&lt;w:iCs/&gt;&lt;w:lang w:val="en-GB"/&gt;&lt;/w:rPr&gt;&lt;/w:style&gt;&lt;w:style w:type="character" w:customStyle="1" w:styleId="Heading7Char"&gt;&lt;w:name w:val="Heading 7 Char"/&gt;&lt;w:basedOn w:val="DefaultParagraphFont"/&gt;&lt;w:link w:val="Heading7"/&gt;&lt;w:uiPriority w:val="9"/&gt;&lt;w:semiHidden/&gt;&lt;w:rsid w:val="008E716E"/&gt;&lt;w:rPr&gt;&lt;w:i/&gt;&lt;w:iCs/&gt;&lt;w:lang w:val="en-GB"/&gt;&lt;/w:rPr&gt;&lt;/w:style&gt;&lt;w:style w:type="character" w:customStyle="1" w:styleId="Heading8Char"&gt;&lt;w:name w:val="Heading 8 Char"/&gt;&lt;w:basedOn w:val="DefaultParagraphFont"/&gt;&lt;w:link w:val="Heading8"/&gt;&lt;w:uiPriority w:val="9"/&gt;&lt;w:semiHidden/&gt;&lt;w:rsid w:val="008E716E"/&gt;&lt;w:rPr&gt;&lt;w:b/&gt;&lt;w:bCs/&gt;&lt;w:lang w:val="en-GB"/&gt;&lt;/w:rPr&gt;&lt;/w:style&gt;&lt;w:style w:type="character" w:customStyle="1" w:styleId="Heading9Char"&gt;&lt;w:name w:val="Heading 9 Char"/&gt;&lt;w:basedOn w:val="DefaultParagraphFont"/&gt;&lt;w:link w:val="Heading9"/&gt;&lt;w:uiPriority w:val="9"/&gt;&lt;w:semiHidden/&gt;&lt;w:rsid w:val="008E716E"/&gt;&lt;w:rPr&gt;&lt;w:i/&gt;&lt;w:iCs/&gt;&lt;w:lang w:val="en-GB"/&gt;&lt;/w:rPr&gt;&lt;/w:style&gt;&lt;w:style w:type="paragraph" w:styleId="Caption"&gt;&lt;w:name w:val="caption"/&gt;&lt;w:basedOn w:val="Normal"/&gt;&lt;w:next w:val="Normal"/&gt;&lt;w:uiPriority w:val="35"/&gt;&lt;w:semiHidden/&gt;&lt;w:rsid w:val="009B1B65"/&gt;&lt;w:rPr&gt;&lt;w:b/&gt;&lt;w:bCs/&gt;&lt;w:sz w:val="18"/&gt;&lt;w:szCs w:val="18"/&gt;&lt;/w:rPr&gt;&lt;/w:style&gt;&lt;w:style w:type="paragraph" w:styleId="Title"&gt;&lt;w:name w:val="Title"/&gt;&lt;w:basedOn w:val="Normal"/&gt;&lt;w:next w:val="Normal"/&gt;&lt;w:link w:val="TitleChar"/&gt;&lt;w:uiPriority w:val="10"/&gt;&lt;w:semiHidden/&gt;&lt;w:qFormat/&gt;&lt;w:rsid w:val="00872413"/&gt;&lt;w:pPr&gt;&lt;w:spacing w:after="0"/&gt;&lt;w:contextualSpacing/&gt;&lt;/w:pPr&gt;&lt;w:rPr&gt;&lt;w:rFonts w:asciiTheme="majorHAnsi" w:eastAsiaTheme="majorEastAsia" w:hAnsiTheme="majorHAnsi" w:cstheme="majorBidi"/&gt;&lt;w:bCs/&gt;&lt;w:color w:val="407077" w:themeColor="accent1"/&gt;&lt;w:sz w:val="72"/&gt;&lt;w:szCs w:val="48"/&gt;&lt;/w:rPr&gt;&lt;/w:style&gt;&lt;w:style w:type="character" w:customStyle="1" w:styleId="TitleChar"&gt;&lt;w:name w:val="Title Char"/&gt;&lt;w:basedOn w:val="DefaultParagraphFont"/&gt;&lt;w:link w:val="Title"/&gt;&lt;w:uiPriority w:val="10"/&gt;&lt;w:semiHidden/&gt;&lt;w:rsid w:val="005F186C"/&gt;&lt;w:rPr&gt;&lt;w:rFonts w:asciiTheme="majorHAnsi" w:eastAsiaTheme="majorEastAsia" w:hAnsiTheme="majorHAnsi" w:cstheme="majorBidi"/&gt;&lt;w:bCs/&gt;&lt;w:color w:val="407077" w:themeColor="accent1"/&gt;&lt;w:sz w:val="72"/&gt;&lt;w:szCs w:val="48"/&gt;&lt;w:lang w:val="en-GB"/&gt;&lt;/w:rPr&gt;&lt;/w:style&gt;&lt;w:style w:type="paragraph" w:styleId="Subtitle"&gt;&lt;w:name w:val="Subtitle"/&gt;&lt;w:basedOn w:val="Normal"/&gt;&lt;w:next w:val="Normal"/&gt;&lt;w:link w:val="SubtitleChar"/&gt;&lt;w:uiPriority w:val="11"/&gt;&lt;w:semiHidden/&gt;&lt;w:qFormat/&gt;&lt;w:rsid w:val="00872413"/&gt;&lt;w:pPr&gt;&lt;w:numPr&gt;&lt;w:ilvl w:val="1"/&gt;&lt;/w:numPr&gt;&lt;w:spacing w:before="120" w:after="240"/&gt;&lt;/w:pPr&gt;&lt;w:rPr&gt;&lt;w:rFonts w:ascii="GothamMedium" w:eastAsiaTheme="majorEastAsia" w:hAnsi="GothamMedium" w:cstheme="majorBidi"/&gt;&lt;w:color w:val="343436" w:themeColor="text2"/&gt;&lt;w:sz w:val="24"/&gt;&lt;w:szCs w:val="24"/&gt;&lt;/w:rPr&gt;&lt;/w:style&gt;&lt;w:style w:type="character" w:customStyle="1" w:styleId="SubtitleChar"&gt;&lt;w:name w:val="Subtitle Char"/&gt;&lt;w:basedOn w:val="DefaultParagraphFont"/&gt;&lt;w:link w:val="Subtitle"/&gt;&lt;w:uiPriority w:val="11"/&gt;&lt;w:semiHidden/&gt;&lt;w:rsid w:val="005F186C"/&gt;&lt;w:rPr&gt;&lt;w:rFonts w:ascii="GothamMedium" w:eastAsiaTheme="majorEastAsia" w:hAnsi="GothamMedium" w:cstheme="majorBidi"/&gt;&lt;w:color w:val="343436" w:themeColor="text2"/&gt;&lt;w:sz w:val="24"/&gt;&lt;w:szCs w:val="24"/&gt;&lt;w:lang w:val="en-GB"/&gt;&lt;/w:rPr&gt;&lt;/w:style&gt;&lt;w:style w:type="character" w:styleId="Strong"&gt;&lt;w:name w:val="Strong"/&gt;&lt;w:basedOn w:val="DefaultParagraphFont"/&gt;&lt;w:uiPriority w:val="22"/&gt;&lt;w:semiHidden/&gt;&lt;w:rsid w:val="009B1B65"/&gt;&lt;w:rPr&gt;&lt;w:b/&gt;&lt;w:bCs/&gt;&lt;w:color w:val="auto"/&gt;&lt;/w:rPr&gt;&lt;/w:style&gt;&lt;w:style w:type="character" w:styleId="Emphasis"&gt;&lt;w:name w:val="Emphasis"/&gt;&lt;w:basedOn w:val="DefaultParagraphFont"/&gt;&lt;w:uiPriority w:val="20"/&gt;&lt;w:semiHidden/&gt;&lt;w:rsid w:val="009B1B65"/&gt;&lt;w:rPr&gt;&lt;w:i/&gt;&lt;w:iCs/&gt;&lt;w:color w:val="auto"/&gt;&lt;/w:rPr&gt;&lt;/w:style&gt;&lt;w:style w:type="paragraph" w:styleId="NoSpacing"&gt;&lt;w:name w:val="No Spacing"/&gt;&lt;w:link w:val="NoSpacingChar"/&gt;&lt;w:uiPriority w:val="1"/&gt;&lt;w:qFormat/&gt;&lt;w:rsid w:val="00EA5662"/&gt;&lt;w:pPr&gt;&lt;w:spacing w:after="0"/&gt;&lt;/w:pPr&gt;&lt;/w:style&gt;&lt;w:style w:type="paragraph" w:styleId="Quote"&gt;&lt;w:name w:val="Quote"/&gt;&lt;w:basedOn w:val="Normal"/&gt;&lt;w:next w:val="Normal"/&gt;&lt;w:link w:val="QuoteChar"/&gt;&lt;w:uiPriority w:val="29"/&gt;&lt;w:semiHidden/&gt;&lt;w:rsid w:val="009B1B65"/&gt;&lt;w:pPr&gt;&lt;w:spacing w:before="200" w:line="264" w:lineRule="auto"/&gt;&lt;w:ind w:left="864" w:right="864"/&gt;&lt;w:jc w:val="center"/&gt;&lt;/w:pPr&gt;&lt;w:rPr&gt;&lt;w:rFonts w:asciiTheme="majorHAnsi" w:eastAsiaTheme="majorEastAsia" w:hAnsiTheme="majorHAnsi" w:cstheme="majorBidi"/&gt;&lt;w:i/&gt;&lt;w:iCs/&gt;&lt;w:sz w:val="24"/&gt;&lt;w:szCs w:val="24"/&gt;&lt;/w:rPr&gt;&lt;/w:style&gt;&lt;w:style w:type="character" w:customStyle="1" w:styleId="QuoteChar"&gt;&lt;w:name w:val="Quote Char"/&gt;&lt;w:basedOn w:val="DefaultParagraphFont"/&gt;&lt;w:link w:val="Quote"/&gt;&lt;w:uiPriority w:val="29"/&gt;&lt;w:semiHidden/&gt;&lt;w:rsid w:val="009B1B65"/&gt;&lt;w:rPr&gt;&lt;w:rFonts w:asciiTheme="majorHAnsi" w:eastAsiaTheme="majorEastAsia" w:hAnsiTheme="majorHAnsi" w:cstheme="majorBidi"/&gt;&lt;w:i/&gt;&lt;w:iCs/&gt;&lt;w:sz w:val="24"/&gt;&lt;w:szCs w:val="24"/&gt;&lt;/w:rPr&gt;&lt;/w:style&gt;&lt;w:style w:type="paragraph" w:styleId="IntenseQuote"&gt;&lt;w:name w:val="Intense Quote"/&gt;&lt;w:basedOn w:val="Normal"/&gt;&lt;w:next w:val="Normal"/&gt;&lt;w:link w:val="IntenseQuoteChar"/&gt;&lt;w:uiPriority w:val="30"/&gt;&lt;w:semiHidden/&gt;&lt;w:rsid w:val="009B1B65"/&gt;&lt;w:pPr&gt;&lt;w:spacing w:before="100" w:beforeAutospacing="1" w:after="240"/&gt;&lt;w:ind w:left="936" w:right="936"/&gt;&lt;w:jc w:val="center"/&gt;&lt;/w:pPr&gt;&lt;w:rPr&gt;&lt;w:rFonts w:asciiTheme="majorHAnsi" w:eastAsiaTheme="majorEastAsia" w:hAnsiTheme="majorHAnsi" w:cstheme="majorBidi"/&gt;&lt;w:sz w:val="26"/&gt;&lt;w:szCs w:val="26"/&gt;&lt;/w:rPr&gt;&lt;/w:style&gt;&lt;w:style w:type="character" w:customStyle="1" w:styleId="IntenseQuoteChar"&gt;&lt;w:name w:val="Intense Quote Char"/&gt;&lt;w:basedOn w:val="DefaultParagraphFont"/&gt;&lt;w:link w:val="IntenseQuote"/&gt;&lt;w:uiPriority w:val="30"/&gt;&lt;w:semiHidden/&gt;&lt;w:rsid w:val="009B1B65"/&gt;&lt;w:rPr&gt;&lt;w:rFonts w:asciiTheme="majorHAnsi" w:eastAsiaTheme="majorEastAsia" w:hAnsiTheme="majorHAnsi" w:cstheme="majorBidi"/&gt;&lt;w:sz w:val="26"/&gt;&lt;w:szCs w:val="26"/&gt;&lt;/w:rPr&gt;&lt;/w:style&gt;&lt;w:style w:type="character" w:styleId="SubtleEmphasis"&gt;&lt;w:name w:val="Subtle Emphasis"/&gt;&lt;w:basedOn w:val="DefaultParagraphFont"/&gt;&lt;w:uiPriority w:val="19"/&gt;&lt;w:semiHidden/&gt;&lt;w:rsid w:val="009B1B65"/&gt;&lt;w:rPr&gt;&lt;w:i/&gt;&lt;w:iCs/&gt;&lt;w:color w:val="auto"/&gt;&lt;/w:rPr&gt;&lt;/w:style&gt;&lt;w:style w:type="character" w:styleId="IntenseEmphasis"&gt;&lt;w:name w:val="Intense Emphasis"/&gt;&lt;w:basedOn w:val="DefaultParagraphFont"/&gt;&lt;w:uiPriority w:val="21"/&gt;&lt;w:semiHidden/&gt;&lt;w:rsid w:val="009B1B65"/&gt;&lt;w:rPr&gt;&lt;w:b/&gt;&lt;w:bCs/&gt;&lt;w:i/&gt;&lt;w:iCs/&gt;&lt;w:color w:val="auto"/&gt;&lt;/w:rPr&gt;&lt;/w:style&gt;&lt;w:style w:type="character" w:styleId="SubtleReference"&gt;&lt;w:name w:val="Subtle Reference"/&gt;&lt;w:basedOn w:val="DefaultParagraphFont"/&gt;&lt;w:uiPriority w:val="31"/&gt;&lt;w:semiHidden/&gt;&lt;w:rsid w:val="009B1B65"/&gt;&lt;w:rPr&gt;&lt;w:smallCaps/&gt;&lt;w:color w:val="auto"/&gt;&lt;w:u w:val="single" w:color="7F7F7F" w:themeColor="text1" w:themeTint="80"/&gt;&lt;/w:rPr&gt;&lt;/w:style&gt;&lt;w:style w:type="character" w:styleId="IntenseReference"&gt;&lt;w:name w:val="Intense Reference"/&gt;&lt;w:basedOn w:val="DefaultParagraphFont"/&gt;&lt;w:uiPriority w:val="32"/&gt;&lt;w:semiHidden/&gt;&lt;w:rsid w:val="009B1B65"/&gt;&lt;w:rPr&gt;&lt;w:b/&gt;&lt;w:bCs/&gt;&lt;w:smallCaps/&gt;&lt;w:color w:val="auto"/&gt;&lt;w:u w:val="single"/&gt;&lt;/w:rPr&gt;&lt;/w:style&gt;&lt;w:style w:type="character" w:styleId="BookTitle"&gt;&lt;w:name w:val="Book Title"/&gt;&lt;w:basedOn w:val="DefaultParagraphFont"/&gt;&lt;w:uiPriority w:val="33"/&gt;&lt;w:semiHidden/&gt;&lt;w:rsid w:val="009B1B65"/&gt;&lt;w:rPr&gt;&lt;w:b/&gt;&lt;w:bCs/&gt;&lt;w:smallCaps/&gt;&lt;w:color w:val="auto"/&gt;&lt;/w:rPr&gt;&lt;/w:style&gt;&lt;w:style w:type="paragraph" w:styleId="TOCHeading"&gt;&lt;w:name w:val="TOC Heading"/&gt;&lt;w:basedOn w:val="Normal"/&gt;&lt;w:next w:val="Normal"/&gt;&lt;w:uiPriority w:val="39"/&gt;&lt;w:semiHidden/&gt;&lt;w:rsid w:val="009F4214"/&gt;&lt;w:pPr&gt;&lt;w:keepNext/&gt;&lt;w:keepLines/&gt;&lt;w:pageBreakBefore/&gt;&lt;/w:pPr&gt;&lt;w:rPr&gt;&lt;w:rFonts w:asciiTheme="majorHAnsi" w:hAnsiTheme="majorHAnsi"/&gt;&lt;w:b/&gt;&lt;w:sz w:val="32"/&gt;&lt;/w:rPr&gt;&lt;/w:style&gt;&lt;w:style w:type="paragraph" w:styleId="ListBullet"&gt;&lt;w:name w:val="List Bullet"/&gt;&lt;w:basedOn w:val="Normal"/&gt;&lt;w:uiPriority w:val="14"/&gt;&lt;w:qFormat/&gt;&lt;w:rsid w:val="001D4B24"/&gt;&lt;w:pPr&gt;&lt;w:numPr&gt;&lt;w:numId w:val="1"/&gt;&lt;/w:numPr&gt;&lt;w:spacing w:after="80"/&gt;&lt;w:contextualSpacing/&gt;&lt;/w:pPr&gt;&lt;/w:style&gt;&lt;w:style w:type="paragraph" w:styleId="ListNumber"&gt;&lt;w:name w:val="List Number"/&gt;&lt;w:basedOn w:val="Normal"/&gt;&lt;w:uiPriority w:val="14"/&gt;&lt;w:qFormat/&gt;&lt;w:rsid w:val="00223177"/&gt;&lt;w:pPr&gt;&lt;w:numPr&gt;&lt;w:numId w:val="6"/&gt;&lt;/w:numPr&gt;&lt;w:spacing w:after="80"/&gt;&lt;w:ind w:left="357" w:hanging="357"/&gt;&lt;w:contextualSpacing/&gt;&lt;/w:pPr&gt;&lt;/w:style&gt;&lt;w:style w:type="table" w:styleId="TableGrid"&gt;&lt;w:name w:val="Table Grid"/&gt;&lt;w:basedOn w:val="TableNormal"/&gt;&lt;w:uiPriority w:val="39"/&gt;&lt;w:rsid w:val="00572408"/&gt;&lt;w:pPr&gt;&lt;w:spacing w:after="0" w:line="240" w:lineRule="auto"/&gt;&lt;/w:pPr&gt;&lt;w:tblPr/&gt;&lt;/w:style&gt;&lt;w:style w:type="paragraph" w:styleId="FootnoteText"&gt;&lt;w:name w:val="footnote text"/&gt;&lt;w:basedOn w:val="Normal"/&gt;&lt;w:link w:val="FootnoteTextChar"/&gt;&lt;w:uiPriority w:val="99"/&gt;&lt;w:semiHidden/&gt;&lt;w:rsid w:val="00872413"/&gt;&lt;w:pPr&gt;&lt;w:spacing w:after="0"/&gt;&lt;/w:pPr&gt;&lt;w:rPr&gt;&lt;w:sz w:val="14"/&gt;&lt;w:szCs w:val="20"/&gt;&lt;/w:rPr&gt;&lt;/w:style&gt;&lt;w:style w:type="character" w:customStyle="1" w:styleId="FootnoteTextChar"&gt;&lt;w:name w:val="Footnote Text Char"/&gt;&lt;w:basedOn w:val="DefaultParagraphFont"/&gt;&lt;w:link w:val="FootnoteText"/&gt;&lt;w:uiPriority w:val="99"/&gt;&lt;w:semiHidden/&gt;&lt;w:rsid w:val="005F186C"/&gt;&lt;w:rPr&gt;&lt;w:sz w:val="14"/&gt;&lt;w:szCs w:val="20"/&gt;&lt;w:lang w:val="en-GB"/&gt;&lt;/w:rPr&gt;&lt;/w:style&gt;&lt;w:style w:type="character" w:styleId="FootnoteReference"&gt;&lt;w:name w:val="footnote reference"/&gt;&lt;w:basedOn w:val="DefaultParagraphFont"/&gt;&lt;w:uiPriority w:val="99"/&gt;&lt;w:semiHidden/&gt;&lt;w:rsid w:val="00884E47"/&gt;&lt;w:rPr&gt;&lt;w:vertAlign w:val="superscript"/&gt;&lt;/w:rPr&gt;&lt;/w:style&gt;&lt;w:style w:type="paragraph" w:styleId="Header"&gt;&lt;w:name w:val="header"/&gt;&lt;w:basedOn w:val="Normal"/&gt;&lt;w:link w:val="HeaderChar"/&gt;&lt;w:uiPriority w:val="99"/&gt;&lt;w:semiHidden/&gt;&lt;w:rsid w:val="005F186C"/&gt;&lt;w:pPr&gt;&lt;w:tabs&gt;&lt;w:tab w:val="center" w:pos="4536"/&gt;&lt;w:tab w:val="right" w:pos="9072"/&gt;&lt;/w:tabs&gt;&lt;w:spacing w:after="0" w:line="240" w:lineRule="auto"/&gt;&lt;/w:pPr&gt;&lt;w:rPr&gt;&lt;w:color w:val="858585" w:themeColor="accent5"/&gt;&lt;w:sz w:val="16"/&gt;&lt;/w:rPr&gt;&lt;/w:style&gt;&lt;w:style w:type="character" w:customStyle="1" w:styleId="HeaderChar"&gt;&lt;w:name w:val="Header Char"/&gt;&lt;w:basedOn w:val="DefaultParagraphFont"/&gt;&lt;w:link w:val="Header"/&gt;&lt;w:uiPriority w:val="99"/&gt;&lt;w:semiHidden/&gt;&lt;w:rsid w:val="005F186C"/&gt;&lt;w:rPr&gt;&lt;w:color w:val="858585" w:themeColor="accent5"/&gt;&lt;w:sz w:val="16"/&gt;&lt;w:lang w:val="en-GB"/&gt;&lt;/w:rPr&gt;&lt;/w:style&gt;&lt;w:style w:type="paragraph" w:styleId="Footer"&gt;&lt;w:name w:val="footer"/&gt;&lt;w:basedOn w:val="Normal"/&gt;&lt;w:link w:val="FooterChar"/&gt;&lt;w:uiPriority w:val="99"/&gt;&lt;w:semiHidden/&gt;&lt;w:rsid w:val="005F186C"/&gt;&lt;w:pPr&gt;&lt;w:tabs&gt;&lt;w:tab w:val="center" w:pos="4536"/&gt;&lt;w:tab w:val="right" w:pos="9072"/&gt;&lt;/w:tabs&gt;&lt;w:spacing w:after="0" w:line="240" w:lineRule="auto"/&gt;&lt;/w:pPr&gt;&lt;w:rPr&gt;&lt;w:color w:val="858585" w:themeColor="accent5"/&gt;&lt;w:sz w:val="16"/&gt;&lt;/w:rPr&gt;&lt;/w:style&gt;&lt;w:style w:type="character" w:customStyle="1" w:styleId="FooterChar"&gt;&lt;w:name w:val="Footer Char"/&gt;&lt;w:basedOn w:val="DefaultParagraphFont"/&gt;&lt;w:link w:val="Footer"/&gt;&lt;w:uiPriority w:val="99"/&gt;&lt;w:semiHidden/&gt;&lt;w:rsid w:val="005F186C"/&gt;&lt;w:rPr&gt;&lt;w:color w:val="858585" w:themeColor="accent5"/&gt;&lt;w:sz w:val="16"/&gt;&lt;w:lang w:val="en-GB"/&gt;&lt;/w:rPr&gt;&lt;/w:style&gt;&lt;w:style w:type="paragraph" w:styleId="TOC1"&gt;&lt;w:name w:val="toc 1"/&gt;&lt;w:basedOn w:val="Normal"/&gt;&lt;w:next w:val="Normal"/&gt;&lt;w:uiPriority w:val="39"/&gt;&lt;w:semiHidden/&gt;&lt;w:rsid w:val="00421476"/&gt;&lt;w:pPr&gt;&lt;w:tabs&gt;&lt;w:tab w:val="right" w:leader="dot" w:pos="8210"/&gt;&lt;/w:tabs&gt;&lt;w:spacing w:after="100"/&gt;&lt;w:ind w:left="426" w:hanging="426"/&gt;&lt;/w:pPr&gt;&lt;/w:style&gt;&lt;w:style w:type="paragraph" w:styleId="TOC2"&gt;&lt;w:name w:val="toc 2"/&gt;&lt;w:basedOn w:val="Normal"/&gt;&lt;w:next w:val="Normal"/&gt;&lt;w:uiPriority w:val="39"/&gt;&lt;w:semiHidden/&gt;&lt;w:rsid w:val="00EE62A8"/&gt;&lt;w:pPr&gt;&lt;w:tabs&gt;&lt;w:tab w:val="right" w:leader="dot" w:pos="8210"/&gt;&lt;/w:tabs&gt;&lt;w:spacing w:after="100"/&gt;&lt;w:ind w:left="1134" w:hanging="708"/&gt;&lt;/w:pPr&gt;&lt;w:rPr&gt;&lt;w:noProof/&gt;&lt;/w:rPr&gt;&lt;/w:style&gt;&lt;w:style w:type="paragraph" w:styleId="TOC3"&gt;&lt;w:name w:val="toc 3"/&gt;&lt;w:basedOn w:val="Normal"/&gt;&lt;w:next w:val="Normal"/&gt;&lt;w:uiPriority w:val="39"/&gt;&lt;w:semiHidden/&gt;&lt;w:rsid w:val="00EE62A8"/&gt;&lt;w:pPr&gt;&lt;w:tabs&gt;&lt;w:tab w:val="right" w:leader="dot" w:pos="8210"/&gt;&lt;/w:tabs&gt;&lt;w:spacing w:after="100"/&gt;&lt;w:ind w:left="1134" w:hanging="694"/&gt;&lt;/w:pPr&gt;&lt;w:rPr&gt;&lt;w:noProof/&gt;&lt;/w:rPr&gt;&lt;/w:style&gt;&lt;w:style w:type="character" w:styleId="Hyperlink"&gt;&lt;w:name w:val="Hyperlink"/&gt;&lt;w:basedOn w:val="DefaultParagraphFont"/&gt;&lt;w:uiPriority w:val="99"/&gt;&lt;w:semiHidden/&gt;&lt;w:rsid w:val="008555A7"/&gt;&lt;w:rPr&gt;&lt;w:color w:val="A1BF35" w:themeColor="hyperlink"/&gt;&lt;w:u w:val="single"/&gt;&lt;/w:rPr&gt;&lt;/w:style&gt;&lt;w:style w:type="paragraph" w:styleId="TOC4"&gt;&lt;w:name w:val="toc 4"/&gt;&lt;w:basedOn w:val="Normal"/&gt;&lt;w:next w:val="Normal"/&gt;&lt;w:uiPriority w:val="39"/&gt;&lt;w:semiHidden/&gt;&lt;w:rsid w:val="00FF2698"/&gt;&lt;w:pPr&gt;&lt;w:spacing w:after="100"/&gt;&lt;w:ind w:left="660"/&gt;&lt;/w:pPr&gt;&lt;/w:style&gt;&lt;w:style w:type="paragraph" w:styleId="TOC5"&gt;&lt;w:name w:val="toc 5"/&gt;&lt;w:basedOn w:val="Normal"/&gt;&lt;w:next w:val="Normal"/&gt;&lt;w:uiPriority w:val="39"/&gt;&lt;w:semiHidden/&gt;&lt;w:rsid w:val="00FF2698"/&gt;&lt;w:pPr&gt;&lt;w:spacing w:after="100"/&gt;&lt;w:ind w:left="880"/&gt;&lt;/w:pPr&gt;&lt;/w:style&gt;&lt;w:style w:type="paragraph" w:styleId="TOC6"&gt;&lt;w:name w:val="toc 6"/&gt;&lt;w:basedOn w:val="Normal"/&gt;&lt;w:next w:val="Normal"/&gt;&lt;w:uiPriority w:val="39"/&gt;&lt;w:semiHidden/&gt;&lt;w:rsid w:val="00FF2698"/&gt;&lt;w:pPr&gt;&lt;w:spacing w:after="100"/&gt;&lt;w:ind w:left="1100"/&gt;&lt;/w:pPr&gt;&lt;/w:style&gt;&lt;w:style w:type="paragraph" w:styleId="TOC7"&gt;&lt;w:name w:val="toc 7"/&gt;&lt;w:basedOn w:val="Normal"/&gt;&lt;w:next w:val="Normal"/&gt;&lt;w:uiPriority w:val="39"/&gt;&lt;w:semiHidden/&gt;&lt;w:rsid w:val="00FF2698"/&gt;&lt;w:pPr&gt;&lt;w:spacing w:after="100"/&gt;&lt;w:ind w:left="1320"/&gt;&lt;/w:pPr&gt;&lt;/w:style&gt;&lt;w:style w:type="paragraph" w:styleId="TOC8"&gt;&lt;w:name w:val="toc 8"/&gt;&lt;w:basedOn w:val="Normal"/&gt;&lt;w:next w:val="Normal"/&gt;&lt;w:uiPriority w:val="39"/&gt;&lt;w:semiHidden/&gt;&lt;w:rsid w:val="00FF2698"/&gt;&lt;w:pPr&gt;&lt;w:spacing w:after="100"/&gt;&lt;w:ind w:left="1540"/&gt;&lt;/w:pPr&gt;&lt;/w:style&gt;&lt;w:style w:type="paragraph" w:styleId="TOC9"&gt;&lt;w:name w:val="toc 9"/&gt;&lt;w:basedOn w:val="Normal"/&gt;&lt;w:next w:val="Normal"/&gt;&lt;w:uiPriority w:val="39"/&gt;&lt;w:semiHidden/&gt;&lt;w:rsid w:val="00FF2698"/&gt;&lt;w:pPr&gt;&lt;w:spacing w:after="100"/&gt;&lt;w:ind w:left="1760"/&gt;&lt;/w:pPr&gt;&lt;/w:style&gt;&lt;w:style w:type="paragraph" w:styleId="ListNumber2"&gt;&lt;w:name w:val="List Number 2"/&gt;&lt;w:basedOn w:val="ListNumber"/&gt;&lt;w:uiPriority w:val="14"/&gt;&lt;w:rsid w:val="00130001"/&gt;&lt;w:pPr&gt;&lt;w:numPr&gt;&lt;w:ilvl w:val="1"/&gt;&lt;/w:numPr&gt;&lt;/w:pPr&gt;&lt;/w:style&gt;&lt;w:style w:type="paragraph" w:styleId="ListNumber3"&gt;&lt;w:name w:val="List Number 3"/&gt;&lt;w:basedOn w:val="ListNumber2"/&gt;&lt;w:uiPriority w:val="14"/&gt;&lt;w:rsid w:val="00130001"/&gt;&lt;w:pPr&gt;&lt;w:numPr&gt;&lt;w:ilvl w:val="2"/&gt;&lt;/w:numPr&gt;&lt;/w:pPr&gt;&lt;/w:style&gt;&lt;w:style w:type="paragraph" w:styleId="ListNumber4"&gt;&lt;w:name w:val="List Number 4"/&gt;&lt;w:basedOn w:val="ListNumber3"/&gt;&lt;w:uiPriority w:val="14"/&gt;&lt;w:semiHidden/&gt;&lt;w:rsid w:val="00130001"/&gt;&lt;w:pPr&gt;&lt;w:numPr&gt;&lt;w:ilvl w:val="3"/&gt;&lt;/w:numPr&gt;&lt;/w:pPr&gt;&lt;/w:style&gt;&lt;w:style w:type="paragraph" w:styleId="ListNumber5"&gt;&lt;w:name w:val="List Number 5"/&gt;&lt;w:basedOn w:val="ListNumber4"/&gt;&lt;w:uiPriority w:val="14"/&gt;&lt;w:semiHidden/&gt;&lt;w:rsid w:val="00130001"/&gt;&lt;w:pPr&gt;&lt;w:numPr&gt;&lt;w:ilvl w:val="4"/&gt;&lt;/w:numPr&gt;&lt;/w:pPr&gt;&lt;/w:style&gt;&lt;w:style w:type="paragraph" w:styleId="ListBullet2"&gt;&lt;w:name w:val="List Bullet 2"/&gt;&lt;w:basedOn w:val="ListBullet"/&gt;&lt;w:uiPriority w:val="14"/&gt;&lt;w:rsid w:val="00FE2BED"/&gt;&lt;w:pPr&gt;&lt;w:numPr&gt;&lt;w:ilvl w:val="1"/&gt;&lt;/w:numPr&gt;&lt;/w:pPr&gt;&lt;/w:style&gt;&lt;w:style w:type="paragraph" w:styleId="ListBullet3"&gt;&lt;w:name w:val="List Bullet 3"/&gt;&lt;w:basedOn w:val="ListBullet2"/&gt;&lt;w:uiPriority w:val="14"/&gt;&lt;w:rsid w:val="00FE2BED"/&gt;&lt;w:pPr&gt;&lt;w:numPr&gt;&lt;w:ilvl w:val="2"/&gt;&lt;/w:numPr&gt;&lt;/w:pPr&gt;&lt;/w:style&gt;&lt;w:style w:type="paragraph" w:styleId="ListBullet4"&gt;&lt;w:name w:val="List Bullet 4"/&gt;&lt;w:basedOn w:val="ListBullet3"/&gt;&lt;w:uiPriority w:val="14"/&gt;&lt;w:semiHidden/&gt;&lt;w:rsid w:val="00FE2BED"/&gt;&lt;w:pPr&gt;&lt;w:numPr&gt;&lt;w:ilvl w:val="3"/&gt;&lt;/w:numPr&gt;&lt;/w:pPr&gt;&lt;/w:style&gt;&lt;w:style w:type="paragraph" w:styleId="ListBullet5"&gt;&lt;w:name w:val="List Bullet 5"/&gt;&lt;w:basedOn w:val="ListBullet4"/&gt;&lt;w:uiPriority w:val="14"/&gt;&lt;w:semiHidden/&gt;&lt;w:rsid w:val="00FE2BED"/&gt;&lt;w:pPr&gt;&lt;w:numPr&gt;&lt;w:ilvl w:val="4"/&gt;&lt;/w:numPr&gt;&lt;/w:pPr&gt;&lt;/w:style&gt;&lt;w:style w:type="character" w:styleId="PlaceholderText"&gt;&lt;w:name w:val="Placeholder Text"/&gt;&lt;w:basedOn w:val="DefaultParagraphFont"/&gt;&lt;w:uiPriority w:val="99"/&gt;&lt;w:rsid w:val="009C6FDB"/&gt;&lt;w:rPr&gt;&lt;w:color w:val="7F7F7F" w:themeColor="text1" w:themeTint="80"/&gt;&lt;w:bdr w:val="none" w:sz="0" w:space="0" w:color="auto"/&gt;&lt;w:shd w:val="clear" w:color="auto" w:fill="F0F0F0"/&gt;&lt;/w:rPr&gt;&lt;/w:style&gt;&lt;w:style w:type="paragraph" w:customStyle="1" w:styleId="Hiddentext"&gt;&lt;w:name w:val="Hidden text"/&gt;&lt;w:basedOn w:val="Normal"/&gt;&lt;w:next w:val="Normal"/&gt;&lt;w:uiPriority w:val="24"/&gt;&lt;w:semiHidden/&gt;&lt;w:qFormat/&gt;&lt;w:rsid w:val="00D86E66"/&gt;&lt;w:rPr&gt;&lt;w:vanish/&gt;&lt;w:color w:val="C00000"/&gt;&lt;/w:rPr&gt;&lt;/w:style&gt;&lt;w:style w:type="paragraph" w:customStyle="1" w:styleId="NumberedHeading1"&gt;&lt;w:name w:val="Numbered Heading 1"/&gt;&lt;w:basedOn w:val="Heading1"/&gt;&lt;w:next w:val="Normal"/&gt;&lt;w:uiPriority w:val="10"/&gt;&lt;w:semiHidden/&gt;&lt;w:qFormat/&gt;&lt;w:rsid w:val="00494FFB"/&gt;&lt;w:pPr&gt;&lt;w:numPr&gt;&lt;w:numId w:val="12"/&gt;&lt;/w:numPr&gt;&lt;/w:pPr&gt;&lt;/w:style&gt;&lt;w:style w:type="paragraph" w:customStyle="1" w:styleId="NumberedHeading2"&gt;&lt;w:name w:val="Numbered Heading 2"/&gt;&lt;w:basedOn w:val="Heading2"/&gt;&lt;w:next w:val="Normal"/&gt;&lt;w:uiPriority w:val="10"/&gt;&lt;w:semiHidden/&gt;&lt;w:qFormat/&gt;&lt;w:rsid w:val="00DA7B63"/&gt;&lt;w:pPr&gt;&lt;w:numPr&gt;&lt;w:ilvl w:val="1"/&gt;&lt;w:numId w:val="12"/&gt;&lt;/w:numPr&gt;&lt;/w:pPr&gt;&lt;/w:style&gt;&lt;w:style w:type="paragraph" w:customStyle="1" w:styleId="NumberedHeading3"&gt;&lt;w:name w:val="Numbered Heading 3"/&gt;&lt;w:basedOn w:val="Heading3"/&gt;&lt;w:next w:val="Normal"/&gt;&lt;w:uiPriority w:val="10"/&gt;&lt;w:semiHidden/&gt;&lt;w:qFormat/&gt;&lt;w:rsid w:val="00DA7B63"/&gt;&lt;w:pPr&gt;&lt;w:numPr&gt;&lt;w:ilvl w:val="2"/&gt;&lt;w:numId w:val="12"/&gt;&lt;/w:numPr&gt;&lt;/w:pPr&gt;&lt;/w:style&gt;&lt;w:style w:type="paragraph" w:customStyle="1" w:styleId="NumberedHeading4"&gt;&lt;w:name w:val="Numbered Heading 4"/&gt;&lt;w:basedOn w:val="Heading4"/&gt;&lt;w:next w:val="Normal"/&gt;&lt;w:uiPriority w:val="10"/&gt;&lt;w:semiHidden/&gt;&lt;w:qFormat/&gt;&lt;w:rsid w:val="00DA7B63"/&gt;&lt;w:pPr&gt;&lt;w:numPr&gt;&lt;w:ilvl w:val="3"/&gt;&lt;w:numId w:val="12"/&gt;&lt;/w:numPr&gt;&lt;/w:pPr&gt;&lt;/w:style&gt;&lt;w:style w:type="character" w:customStyle="1" w:styleId="NoSpacingChar"&gt;&lt;w:name w:val="No Spacing Char"/&gt;&lt;w:basedOn w:val="DefaultParagraphFont"/&gt;&lt;w:link w:val="NoSpacing"/&gt;&lt;w:uiPriority w:val="1"/&gt;&lt;w:rsid w:val="00EE7F0A"/&gt;&lt;/w:style&gt;&lt;w:style w:type="paragraph" w:styleId="BalloonText"&gt;&lt;w:name w:val="Balloon Text"/&gt;&lt;w:basedOn w:val="Normal"/&gt;&lt;w:link w:val="BalloonTextChar"/&gt;&lt;w:uiPriority w:val="99"/&gt;&lt;w:semiHidden/&gt;&lt;w:unhideWhenUsed/&gt;&lt;w:rsid w:val="00421476"/&gt;&lt;w:pPr&gt;&lt;w:spacing w:after="0"/&gt;&lt;/w:pPr&gt;&lt;w:rPr&gt;&lt;w:rFonts w:cs="Segoe UI"/&gt;&lt;w:sz w:val="18"/&gt;&lt;w:szCs w:val="18"/&gt;&lt;/w:rPr&gt;&lt;/w:style&gt;&lt;w:style w:type="character" w:customStyle="1" w:styleId="BalloonTextChar"&gt;&lt;w:name w:val="Balloon Text Char"/&gt;&lt;w:basedOn w:val="DefaultParagraphFont"/&gt;&lt;w:link w:val="BalloonText"/&gt;&lt;w:uiPriority w:val="99"/&gt;&lt;w:semiHidden/&gt;&lt;w:rsid w:val="00421476"/&gt;&lt;w:rPr&gt;&lt;w:rFonts w:cs="Segoe UI"/&gt;&lt;w:sz w:val="18"/&gt;&lt;w:szCs w:val="18"/&gt;&lt;w:lang w:val="en-GB"/&gt;&lt;/w:rPr&gt;&lt;/w:style&gt;&lt;w:style w:type="paragraph" w:customStyle="1" w:styleId="Footertext"&gt;&lt;w:name w:val="Footer text"/&gt;&lt;w:basedOn w:val="Normal"/&gt;&lt;w:uiPriority w:val="10"/&gt;&lt;w:semiHidden/&gt;&lt;w:qFormat/&gt;&lt;w:rsid w:val="001407DF"/&gt;&lt;w:pPr&gt;&lt;w:framePr w:wrap="around" w:vAnchor="page" w:hAnchor="page" w:x="852" w:y="14176"/&gt;&lt;w:spacing w:before="40" w:after="40"/&gt;&lt;/w:pPr&gt;&lt;w:rPr&gt;&lt;w:color w:val="858585" w:themeColor="accent5"/&gt;&lt;w:sz w:val="16"/&gt;&lt;/w:rPr&gt;&lt;/w:style&gt;&lt;w:style w:type="paragraph" w:customStyle="1" w:styleId="Footertitle"&gt;&lt;w:name w:val="Footer title"/&gt;&lt;w:basedOn w:val="Footertext"/&gt;&lt;w:uiPriority w:val="10"/&gt;&lt;w:semiHidden/&gt;&lt;w:qFormat/&gt;&lt;w:rsid w:val="00E4504C"/&gt;&lt;w:pPr&gt;&lt;w:framePr w:wrap="around"/&gt;&lt;/w:pPr&gt;&lt;w:rPr&gt;&lt;w:b/&gt;&lt;w:color w:val="407077" w:themeColor="accent1"/&gt;&lt;/w:rPr&gt;&lt;/w:style&gt;&lt;w:style w:type="table" w:customStyle="1" w:styleId="BetssonTable01"&gt;&lt;w:name w:val="Betsson Table 01"/&gt;&lt;w:basedOn w:val="TableNormal"/&gt;&lt;w:uiPriority w:val="99"/&gt;&lt;w:rsid w:val="00036B11"/&gt;&lt;w:pPr&gt;&lt;w:spacing w:after="0" w:line="240" w:lineRule="auto"/&gt;&lt;w:jc w:val="right"/&gt;&lt;/w:pPr&gt;&lt;w:tblPr&gt;&lt;w:tblBorders&gt;&lt;w:bottom w:val="single" w:sz="4" w:space="0" w:color="407077" w:themeColor="accent1"/&gt;&lt;w:insideH w:val="single" w:sz="4" w:space="0" w:color="407077" w:themeColor="accent1"/&gt;&lt;/w:tblBorders&gt;&lt;w:tblCellMar&gt;&lt;w:top w:w="57" w:type="dxa"/&gt;&lt;w:left w:w="57" w:type="dxa"/&gt;&lt;w:bottom w:w="57" w:type="dxa"/&gt;&lt;w:right w:w="57" w:type="dxa"/&gt;&lt;/w:tblCellMar&gt;&lt;/w:tblPr&gt;&lt;w:tblStylePr w:type="firstRow"&gt;&lt;w:pPr&gt;&lt;w:jc w:val="right"/&gt;&lt;/w:pPr&gt;&lt;w:rPr&gt;&lt;w:rFonts w:asciiTheme="majorHAnsi" w:hAnsiTheme="majorHAnsi"/&gt;&lt;w:b/&gt;&lt;w:color w:val="407077" w:themeColor="accent1"/&gt;&lt;/w:rPr&gt;&lt;w:tblPr/&gt;&lt;w:tcPr&gt;&lt;w:tcBorders&gt;&lt;w:bottom w:val="single" w:sz="12" w:space="0" w:color="407077" w:themeColor="accent1"/&gt;&lt;/w:tcBorders&gt;&lt;w:vAlign w:val="bottom"/&gt;&lt;/w:tcPr&gt;&lt;/w:tblStylePr&gt;&lt;w:tblStylePr w:type="lastRow"&gt;&lt;w:rPr&gt;&lt;w:rFonts w:asciiTheme="majorHAnsi" w:hAnsiTheme="majorHAnsi"/&gt;&lt;w:b/&gt;&lt;/w:rPr&gt;&lt;w:tblPr/&gt;&lt;w:tcPr&gt;&lt;w:tcBorders&gt;&lt;w:top w:val="double" w:sz="4" w:space="0" w:color="407077" w:themeColor="accent1"/&gt;&lt;w:left w:val="nil"/&gt;&lt;w:bottom w:val="nil"/&gt;&lt;w:right w:val="nil"/&gt;&lt;w:insideH w:val="nil"/&gt;&lt;w:insideV w:val="nil"/&gt;&lt;w:tl2br w:val="nil"/&gt;&lt;w:tr2bl w:val="nil"/&gt;&lt;/w:tcBorders&gt;&lt;/w:tcPr&gt;&lt;/w:tblStylePr&gt;&lt;w:tblStylePr w:type="firstCol"&gt;&lt;w:pPr&gt;&lt;w:jc w:val="left"/&gt;&lt;/w:pPr&gt;&lt;/w:tblStylePr&gt;&lt;w:tblStylePr w:type="lastCol"&gt;&lt;w:rPr&gt;&lt;w:rFonts w:asciiTheme="majorHAnsi" w:hAnsiTheme="majorHAnsi"/&gt;&lt;w:b/&gt;&lt;/w:rPr&gt;&lt;/w:tblStylePr&gt;&lt;w:tblStylePr w:type="nwCell"&gt;&lt;w:pPr&gt;&lt;w:jc w:val="left"/&gt;&lt;/w:pPr&gt;&lt;w:tblPr/&gt;&lt;w:tcPr&gt;&lt;w:vAlign w:val="bottom"/&gt;&lt;/w:tcPr&gt;&lt;/w:tblStylePr&gt;&lt;/w:style&gt;&lt;w:style w:type="table" w:styleId="TableGridLight"&gt;&lt;w:name w:val="Grid Table Light"/&gt;&lt;w:aliases w:val="Betsson Table 02"/&gt;&lt;w:basedOn w:val="TableNormal"/&gt;&lt;w:uiPriority w:val="40"/&gt;&lt;w:rsid w:val="00036B11"/&gt;&lt;w:pPr&gt;&lt;w:spacing w:after="0" w:line="240" w:lineRule="auto"/&gt;&lt;w:jc w:val="right"/&gt;&lt;/w:pPr&gt;&lt;w:tblPr&gt;&lt;w:tblStyleRowBandSize w:val="1"/&gt;&lt;w:tblBorders&gt;&lt;w:insideH w:val="single" w:sz="4" w:space="0" w:color="407077" w:themeColor="accent1"/&gt;&lt;/w:tblBorders&gt;&lt;w:tblCellMar&gt;&lt;w:top w:w="57" w:type="dxa"/&gt;&lt;w:left w:w="57" w:type="dxa"/&gt;&lt;w:bottom w:w="57" w:type="dxa"/&gt;&lt;w:right w:w="57" w:type="dxa"/&gt;&lt;/w:tblCellMar&gt;&lt;/w:tblPr&gt;&lt;w:tcPr&gt;&lt;w:shd w:val="clear" w:color="auto" w:fill="auto"/&gt;&lt;/w:tcPr&gt;&lt;w:tblStylePr w:type="firstRow"&gt;&lt;w:pPr&gt;&lt;w:wordWrap/&gt;&lt;w:spacing w:beforeLines="0" w:before="80" w:beforeAutospacing="0" w:afterLines="0" w:after="0" w:afterAutospacing="0"/&gt;&lt;w:jc w:val="right"/&gt;&lt;/w:pPr&gt;&lt;w:rPr&gt;&lt;w:rFonts w:asciiTheme="majorHAnsi" w:hAnsiTheme="majorHAnsi"/&gt;&lt;w:b/&gt;&lt;w:color w:val="FFFFFF" w:themeColor="background1"/&gt;&lt;/w:rPr&gt;&lt;w:tblPr/&gt;&lt;w:tcPr&gt;&lt;w:shd w:val="clear" w:color="auto" w:fill="407077" w:themeFill="accent1"/&gt;&lt;w:vAlign w:val="bottom"/&gt;&lt;/w:tcPr&gt;&lt;/w:tblStylePr&gt;&lt;w:tblStylePr w:type="lastRow"&gt;&lt;w:rPr&gt;&lt;w:rFonts w:asciiTheme="majorHAnsi" w:hAnsiTheme="majorHAnsi"/&gt;&lt;w:b/&gt;&lt;/w:rPr&gt;&lt;w:tblPr/&gt;&lt;w:tcPr&gt;&lt;w:tcBorders&gt;&lt;w:top w:val="double" w:sz="4" w:space="0" w:color="407077" w:themeColor="accent1"/&gt;&lt;/w:tcBorders&gt;&lt;w:shd w:val="clear" w:color="auto" w:fill="auto"/&gt;&lt;/w:tcPr&gt;&lt;/w:tblStylePr&gt;&lt;w:tblStylePr w:type="firstCol"&gt;&lt;w:pPr&gt;&lt;w:jc w:val="left"/&gt;&lt;/w:pPr&gt;&lt;/w:tblStylePr&gt;&lt;w:tblStylePr w:type="lastCol"&gt;&lt;w:pPr&gt;&lt;w:jc w:val="right"/&gt;&lt;/w:pPr&gt;&lt;w:rPr&gt;&lt;w:rFonts w:asciiTheme="majorHAnsi" w:hAnsiTheme="majorHAnsi"/&gt;&lt;w:b/&gt;&lt;/w:rPr&gt;&lt;/w:tblStylePr&gt;&lt;w:tblStylePr w:type="nwCell"&gt;&lt;w:pPr&gt;&lt;w:jc w:val="left"/&gt;&lt;/w:pPr&gt;&lt;w:tblPr/&gt;&lt;w:tcPr&gt;&lt;w:vAlign w:val="bottom"/&gt;&lt;/w:tcPr&gt;&lt;/w:tblStylePr&gt;&lt;/w:style&gt;&lt;w:style w:type="paragraph" w:customStyle="1" w:styleId="Tabletext"&gt;&lt;w:name w:val="Table text"/&gt;&lt;w:basedOn w:val="Normal"/&gt;&lt;w:uiPriority w:val="15"/&gt;&lt;w:rsid w:val="005F186C"/&gt;&lt;w:pPr&gt;&lt;w:spacing w:after="0" w:line="240" w:lineRule="auto"/&gt;&lt;/w:pPr&gt;&lt;w:rPr&gt;&lt;w:sz w:val="16"/&gt;&lt;/w:rPr&gt;&lt;/w:style&gt;&lt;w:style w:type="paragraph" w:customStyle="1" w:styleId="Tabletitle"&gt;&lt;w:name w:val="Table title"/&gt;&lt;w:basedOn w:val="Tabletext"/&gt;&lt;w:uiPriority w:val="15"/&gt;&lt;w:rsid w:val="00C5110E"/&gt;&lt;w:pPr&gt;&lt;w:framePr w:wrap="around" w:vAnchor="page" w:hAnchor="page" w:x="852" w:y="14176"/&gt;&lt;w:spacing w:before="40" w:after="40"/&gt;&lt;/w:pPr&gt;&lt;w:rPr&gt;&lt;w:b/&gt;&lt;w:color w:val="407077" w:themeColor="accent1"/&gt;&lt;/w:rPr&gt;&lt;/w:style&gt;&lt;w:style w:type="paragraph" w:customStyle="1" w:styleId="FootertitleWhite"&gt;&lt;w:name w:val="Footer title White"/&gt;&lt;w:basedOn w:val="Footertitle"/&gt;&lt;w:semiHidden/&gt;&lt;w:rsid w:val="000049A5"/&gt;&lt;w:pPr&gt;&lt;w:framePr w:wrap="around"/&gt;&lt;/w:pPr&gt;&lt;w:rPr&gt;&lt;w:bCs/&gt;&lt;w:color w:val="FFFFFF" w:themeColor="background1"/&gt;&lt;/w:rPr&gt;&lt;/w:style&gt;&lt;w:style w:type="paragraph" w:styleId="DocumentMap"&gt;&lt;w:name w:val="Document Map"/&gt;&lt;w:basedOn w:val="Normal"/&gt;&lt;w:link w:val="DocumentMapChar"/&gt;&lt;w:uiPriority w:val="99"/&gt;&lt;w:semiHidden/&gt;&lt;w:rsid w:val="00421476"/&gt;&lt;w:pPr&gt;&lt;w:spacing w:after="0"/&gt;&lt;/w:pPr&gt;&lt;w:rPr&gt;&lt;w:rFonts w:cs="Segoe UI"/&gt;&lt;w:sz w:val="16"/&gt;&lt;w:szCs w:val="16"/&gt;&lt;/w:rPr&gt;&lt;/w:style&gt;&lt;w:style w:type="character" w:customStyle="1" w:styleId="DocumentMapChar"&gt;&lt;w:name w:val="Document Map Char"/&gt;&lt;w:basedOn w:val="DefaultParagraphFont"/&gt;&lt;w:link w:val="DocumentMap"/&gt;&lt;w:uiPriority w:val="99"/&gt;&lt;w:semiHidden/&gt;&lt;w:rsid w:val="00421476"/&gt;&lt;w:rPr&gt;&lt;w:rFonts w:cs="Segoe UI"/&gt;&lt;w:sz w:val="16"/&gt;&lt;w:szCs w:val="16"/&gt;&lt;w:lang w:val="en-GB"/&gt;&lt;/w:rPr&gt;&lt;/w:style&gt;&lt;w:style w:type="character" w:styleId="HTMLSample"&gt;&lt;w:name w:val="HTML Sample"/&gt;&lt;w:basedOn w:val="DefaultParagraphFont"/&gt;&lt;w:uiPriority w:val="99"/&gt;&lt;w:semiHidden/&gt;&lt;w:unhideWhenUsed/&gt;&lt;w:rsid w:val="00421476"/&gt;&lt;w:rPr&gt;&lt;w:rFonts w:asciiTheme="minorHAnsi" w:hAnsiTheme="minorHAnsi"/&gt;&lt;w:sz w:val="24"/&gt;&lt;w:szCs w:val="24"/&gt;&lt;/w:rPr&gt;&lt;/w:style&gt;&lt;w:style w:type="paragraph" w:styleId="HTMLPreformatted"&gt;&lt;w:name w:val="HTML Preformatted"/&gt;&lt;w:basedOn w:val="Normal"/&gt;&lt;w:link w:val="HTMLPreformattedChar"/&gt;&lt;w:uiPriority w:val="99"/&gt;&lt;w:semiHidden/&gt;&lt;w:rsid w:val="00421476"/&gt;&lt;w:pPr&gt;&lt;w:spacing w:after="0"/&gt;&lt;/w:pPr&gt;&lt;w:rPr&gt;&lt;w:szCs w:val="20"/&gt;&lt;/w:rPr&gt;&lt;/w:style&gt;&lt;w:style w:type="character" w:customStyle="1" w:styleId="HTMLPreformattedChar"&gt;&lt;w:name w:val="HTML Preformatted Char"/&gt;&lt;w:basedOn w:val="DefaultParagraphFont"/&gt;&lt;w:link w:val="HTMLPreformatted"/&gt;&lt;w:uiPriority w:val="99"/&gt;&lt;w:semiHidden/&gt;&lt;w:rsid w:val="00421476"/&gt;&lt;w:rPr&gt;&lt;w:sz w:val="20"/&gt;&lt;w:szCs w:val="20"/&gt;&lt;w:lang w:val="en-GB"/&gt;&lt;/w:rPr&gt;&lt;/w:style&gt;&lt;w:style w:type="character" w:styleId="HTMLCode"&gt;&lt;w:name w:val="HTML Code"/&gt;&lt;w:basedOn w:val="DefaultParagraphFont"/&gt;&lt;w:uiPriority w:val="99"/&gt;&lt;w:semiHidden/&gt;&lt;w:rsid w:val="00421476"/&gt;&lt;w:rPr&gt;&lt;w:rFonts w:asciiTheme="minorHAnsi" w:hAnsiTheme="minorHAnsi"/&gt;&lt;w:sz w:val="20"/&gt;&lt;w:szCs w:val="20"/&gt;&lt;/w:rPr&gt;&lt;/w:style&gt;&lt;w:style w:type="character" w:styleId="HTMLTypewriter"&gt;&lt;w:name w:val="HTML Typewriter"/&gt;&lt;w:basedOn w:val="DefaultParagraphFont"/&gt;&lt;w:uiPriority w:val="99"/&gt;&lt;w:semiHidden/&gt;&lt;w:rsid w:val="00421476"/&gt;&lt;w:rPr&gt;&lt;w:rFonts w:asciiTheme="minorHAnsi" w:hAnsiTheme="minorHAnsi"/&gt;&lt;w:sz w:val="20"/&gt;&lt;w:szCs w:val="20"/&gt;&lt;/w:rPr&gt;&lt;/w:style&gt;&lt;w:style w:type="character" w:styleId="HTMLKeyboard"&gt;&lt;w:name w:val="HTML Keyboard"/&gt;&lt;w:basedOn w:val="DefaultParagraphFont"/&gt;&lt;w:uiPriority w:val="99"/&gt;&lt;w:semiHidden/&gt;&lt;w:rsid w:val="00421476"/&gt;&lt;w:rPr&gt;&lt;w:rFonts w:asciiTheme="minorHAnsi" w:hAnsiTheme="minorHAnsi"/&gt;&lt;w:sz w:val="20"/&gt;&lt;w:szCs w:val="20"/&gt;&lt;/w:rPr&gt;&lt;/w:style&gt;&lt;w:style w:type="paragraph" w:styleId="MacroText"&gt;&lt;w:name w:val="macro"/&gt;&lt;w:link w:val="MacroTextChar"/&gt;&lt;w:uiPriority w:val="99"/&gt;&lt;w:semiHidden/&gt;&lt;w:rsid w:val="00421476"/&gt;&lt;w:pPr&gt;&lt;w:tabs&gt;&lt;w:tab w:val="left" w:pos="480"/&gt;&lt;w:tab w:val="left" w:pos="960"/&gt;&lt;w:tab w:val="left" w:pos="1440"/&gt;&lt;w:tab w:val="left" w:pos="1920"/&gt;&lt;w:tab w:val="left" w:pos="2400"/&gt;&lt;w:tab w:val="left" w:pos="2880"/&gt;&lt;w:tab w:val="left" w:pos="3360"/&gt;&lt;w:tab w:val="left" w:pos="3840"/&gt;&lt;w:tab w:val="left" w:pos="4320"/&gt;&lt;/w:tabs&gt;&lt;w:spacing w:after="0" w:line="240" w:lineRule="auto"/&gt;&lt;/w:pPr&gt;&lt;w:rPr&gt;&lt;w:sz w:val="20"/&gt;&lt;w:szCs w:val="20"/&gt;&lt;w:lang w:val="en-GB"/&gt;&lt;/w:rPr&gt;&lt;/w:style&gt;&lt;w:style w:type="character" w:customStyle="1" w:styleId="MacroTextChar"&gt;&lt;w:name w:val="Macro Text Char"/&gt;&lt;w:basedOn w:val="DefaultParagraphFont"/&gt;&lt;w:link w:val="MacroText"/&gt;&lt;w:uiPriority w:val="99"/&gt;&lt;w:semiHidden/&gt;&lt;w:rsid w:val="00421476"/&gt;&lt;w:rPr&gt;&lt;w:sz w:val="20"/&gt;&lt;w:szCs w:val="20"/&gt;&lt;w:lang w:val="en-GB"/&gt;&lt;/w:rPr&gt;&lt;/w:style&gt;&lt;w:style w:type="paragraph" w:styleId="NormalWeb"&gt;&lt;w:name w:val="Normal (Web)"/&gt;&lt;w:basedOn w:val="Normal"/&gt;&lt;w:uiPriority w:val="99"/&gt;&lt;w:semiHidden/&gt;&lt;w:rsid w:val="00421476"/&gt;&lt;w:rPr&gt;&lt;w:rFonts w:cs="Times New Roman"/&gt;&lt;w:sz w:val="24"/&gt;&lt;w:szCs w:val="24"/&gt;&lt;/w:rPr&gt;&lt;/w:style&gt;&lt;w:style w:type="paragraph" w:styleId="PlainText"&gt;&lt;w:name w:val="Plain Text"/&gt;&lt;w:basedOn w:val="Normal"/&gt;&lt;w:link w:val="PlainTextChar"/&gt;&lt;w:uiPriority w:val="99"/&gt;&lt;w:semiHidden/&gt;&lt;w:rsid w:val="00421476"/&gt;&lt;w:pPr&gt;&lt;w:spacing w:after="0"/&gt;&lt;/w:pPr&gt;&lt;w:rPr&gt;&lt;w:sz w:val="21"/&gt;&lt;w:szCs w:val="21"/&gt;&lt;/w:rPr&gt;&lt;/w:style&gt;&lt;w:style w:type="character" w:customStyle="1" w:styleId="PlainTextChar"&gt;&lt;w:name w:val="Plain Text Char"/&gt;&lt;w:basedOn w:val="DefaultParagraphFont"/&gt;&lt;w:link w:val="PlainText"/&gt;&lt;w:uiPriority w:val="99"/&gt;&lt;w:semiHidden/&gt;&lt;w:rsid w:val="00421476"/&gt;&lt;w:rPr&gt;&lt;w:sz w:val="21"/&gt;&lt;w:szCs w:val="21"/&gt;&lt;w:lang w:val="en-GB"/&gt;&lt;/w:rPr&gt;&lt;/w:style&gt;&lt;w:style w:type="paragraph" w:customStyle="1" w:styleId="Name"&gt;&lt;w:name w:val="Name"/&gt;&lt;w:basedOn w:val="Normal"/&gt;&lt;w:next w:val="Normal"/&gt;&lt;w:uiPriority w:val="10"/&gt;&lt;w:rsid w:val="00C17BB4"/&gt;&lt;w:pPr&gt;&lt;w:spacing w:after="0" w:line="240" w:lineRule="auto"/&gt;&lt;/w:pPr&gt;&lt;w:rPr&gt;&lt;w:rFonts w:asciiTheme="majorHAnsi" w:hAnsiTheme="majorHAnsi"/&gt;&lt;/w:rPr&gt;&lt;/w:style&gt;&lt;w:style w:type="paragraph" w:customStyle="1" w:styleId="Info"&gt;&lt;w:name w:val="Info"/&gt;&lt;w:basedOn w:val="Normal"/&gt;&lt;w:uiPriority w:val="10"/&gt;&lt;w:rsid w:val="008B734D"/&gt;&lt;w:pPr&gt;&lt;w:spacing w:after="0" w:line="240" w:lineRule="auto"/&gt;&lt;/w:pPr&gt;&lt;/w:style&gt;&lt;/w:styles&gt;&lt;/pkg:xmlData&gt;&lt;/pkg:part&gt;&lt;pkg:part pkg:name="/word/glossary/fontTable.xml" pkg:contentType="application/vnd.openxmlformats-officedocument.wordprocessingml.fontTable+xml"&gt;&lt;pkg:xmlData&gt;&lt;w:fonts xmlns:mc="http://schemas.openxmlformats.org/markup-compatibility/2006" xmlns:r="http://schemas.openxmlformats.org/officeDocument/2006/relationships" xmlns:w="http://schemas.openxmlformats.org/wordprocessingml/2006/main" xmlns:w14="http://schemas.microsoft.com/office/word/2010/wordml" xmlns:w15="http://schemas.microsoft.com/office/word/2012/wordml" xmlns:w16se="http://schemas.microsoft.com/office/word/2015/wordml/symex" mc:Ignorable="w14 w15 w16se"/&gt;&lt;/pkg:xmlData&gt;&lt;/pkg:part&gt;&lt;pkg:part pkg:name="/word/glossary/webSettings.xml" pkg:contentType="application/vnd.openxmlformats-officedocument.wordprocessingml.webSettings+xml"&gt;&lt;pkg:xmlData&gt;&lt;w:webSettings xmlns:mc="http://schemas.openxmlformats.org/markup-compatibility/2006" xmlns:r="http://schemas.openxmlformats.org/officeDocument/2006/relationships" xmlns:w="http://schemas.openxmlformats.org/wordprocessingml/2006/main" xmlns:w14="http://schemas.microsoft.com/office/word/2010/wordml" xmlns:w15="http://schemas.microsoft.com/office/word/2012/wordml" xmlns:w16se="http://schemas.microsoft.com/office/word/2015/wordml/symex" mc:Ignorable="w14 w15 w16se"&gt;&lt;w:optimizeForBrowser/&gt;&lt;w:allowPNG/&gt;&lt;/w:webSettings&gt;&lt;/pkg:xmlData&gt;&lt;/pkg:part&gt;&lt;pkg:part pkg:name="/word/numbering.xml" pkg:contentType="application/vnd.openxmlformats-officedocument.wordprocessingml.numbering+xml"&gt;&lt;pkg:xmlData&gt;&lt;w:numbering xmlns:wpc="http://schemas.microsoft.com/office/word/2010/wordprocessingCanvas" xmlns:cx="http://schemas.microsoft.com/office/drawing/2014/chartex" xmlns:cx1="http://schemas.microsoft.com/office/drawing/2015/9/8/chartex" xmlns:cx2="http://schemas.microsoft.com/office/drawing/2015/10/21/chartex" xmlns:cx3="http://schemas.microsoft.com/office/drawing/2016/5/9/chartex" xmlns:cx4="http://schemas.microsoft.com/office/drawing/2016/5/10/chartex" xmlns:cx5="http://schemas.microsoft.com/office/drawing/2016/5/11/chartex" xmlns:cx6="http://schemas.microsoft.com/office/drawing/2016/5/12/chartex" xmlns:cx7="http://schemas.microsoft.com/office/drawing/2016/5/13/chartex" xmlns:cx8="http://schemas.microsoft.com/office/drawing/2016/5/14/chartex" xmlns:mc="http://schemas.openxmlformats.org/markup-compatibility/2006" xmlns:o="urn:schemas-microsoft-com:office:office" xmlns:r="http://schemas.openxmlformats.org/officeDocument/2006/relationships" xmlns:m="http://schemas.openxmlformats.org/officeDocument/2006/math" xmlns:v="urn:schemas-microsoft-com:vml" xmlns:wp14="http://schemas.microsoft.com/office/word/2010/wordprocessingDrawing" xmlns:wp="http://schemas.openxmlformats.org/drawingml/2006/wordprocessingDrawing" xmlns:w10="urn:schemas-microsoft-com:office:word" xmlns:w="http://schemas.openxmlformats.org/wordprocessingml/2006/main" xmlns:w14="http://schemas.microsoft.com/office/word/2010/wordml" xmlns:w15="http://schemas.microsoft.com/office/word/2012/wordml" xmlns:w16se="http://schemas.microsoft.com/office/word/2015/wordml/symex" xmlns:wpg="http://schemas.microsoft.com/office/word/2010/wordprocessingGroup" xmlns:wpi="http://schemas.microsoft.com/office/word/2010/wordprocessingInk" xmlns:wne="http://schemas.microsoft.com/office/word/2006/wordml" xmlns:wps="http://schemas.microsoft.com/office/word/2010/wordprocessingShape" mc:Ignorable="w14 w15 w16se wp14"&gt;&lt;w:abstractNum w:abstractNumId="0" w15:restartNumberingAfterBreak="0"&gt;&lt;w:nsid w:val="FFFFFF7C"/&gt;&lt;w:multiLevelType w:val="singleLevel"/&gt;&lt;w:tmpl w:val="1D6AD0EC"/&gt;&lt;w:lvl w:ilvl="0"&gt;&lt;w:start w:val="1"/&gt;&lt;w:numFmt w:val="decimal"/&gt;&lt;w:lvlText w:val="%1."/&gt;&lt;w:lvlJc w:val="left"/&gt;&lt;w:pPr&gt;&lt;w:tabs&gt;&lt;w:tab w:val="num" w:pos="1492"/&gt;&lt;/w:tabs&gt;&lt;w:ind w:left="1492" w:hanging="360"/&gt;&lt;/w:pPr&gt;&lt;/w:lvl&gt;&lt;/w:abstractNum&gt;&lt;w:abstractNum w:abstractNumId="1" w15:restartNumberingAfterBreak="0"&gt;&lt;w:nsid w:val="FFFFFF7D"/&gt;&lt;w:multiLevelType w:val="singleLevel"/&gt;&lt;w:tmpl w:val="6C44DE1A"/&gt;&lt;w:lvl w:ilvl="0"&gt;&lt;w:start w:val="1"/&gt;&lt;w:numFmt w:val="decimal"/&gt;&lt;w:lvlText w:val="%1."/&gt;&lt;w:lvlJc w:val="left"/&gt;&lt;w:pPr&gt;&lt;w:tabs&gt;&lt;w:tab w:val="num" w:pos="1209"/&gt;&lt;/w:tabs&gt;&lt;w:ind w:left="1209" w:hanging="360"/&gt;&lt;/w:pPr&gt;&lt;/w:lvl&gt;&lt;/w:abstractNum&gt;&lt;w:abstractNum w:abstractNumId="2" w15:restartNumberingAfterBreak="0"&gt;&lt;w:nsid w:val="FFFFFF7E"/&gt;&lt;w:multiLevelType w:val="singleLevel"/&gt;&lt;w:tmpl w:val="83748C94"/&gt;&lt;w:lvl w:ilvl="0"&gt;&lt;w:start w:val="1"/&gt;&lt;w:numFmt w:val="decimal"/&gt;&lt;w:lvlText w:val="%1."/&gt;&lt;w:lvlJc w:val="left"/&gt;&lt;w:pPr&gt;&lt;w:tabs&gt;&lt;w:tab w:val="num" w:pos="926"/&gt;&lt;/w:tabs&gt;&lt;w:ind w:left="926" w:hanging="360"/&gt;&lt;/w:pPr&gt;&lt;/w:lvl&gt;&lt;/w:abstractNum&gt;&lt;w:abstractNum w:abstractNumId="3" w15:restartNumberingAfterBreak="0"&gt;&lt;w:nsid w:val="FFFFFF7F"/&gt;&lt;w:multiLevelType w:val="singleLevel"/&gt;&lt;w:tmpl w:val="871A6F0C"/&gt;&lt;w:lvl w:ilvl="0"&gt;&lt;w:start w:val="1"/&gt;&lt;w:numFmt w:val="decimal"/&gt;&lt;w:lvlText w:val="%1."/&gt;&lt;w:lvlJc w:val="left"/&gt;&lt;w:pPr&gt;&lt;w:tabs&gt;&lt;w:tab w:val="num" w:pos="643"/&gt;&lt;/w:tabs&gt;&lt;w:ind w:left="643" w:hanging="360"/&gt;&lt;/w:pPr&gt;&lt;/w:lvl&gt;&lt;/w:abstractNum&gt;&lt;w:abstractNum w:abstractNumId="4" w15:restartNumberingAfterBreak="0"&gt;&lt;w:nsid w:val="FFFFFF80"/&gt;&lt;w:multiLevelType w:val="singleLevel"/&gt;&lt;w:tmpl w:val="ED1CE676"/&gt;&lt;w:lvl w:ilvl="0"&gt;&lt;w:start w:val="1"/&gt;&lt;w:numFmt w:val="bullet"/&gt;&lt;w:lvlText w:val=""/&gt;&lt;w:lvlJc w:val="left"/&gt;&lt;w:pPr&gt;&lt;w:tabs&gt;&lt;w:tab w:val="num" w:pos="1492"/&gt;&lt;/w:tabs&gt;&lt;w:ind w:left="1492" w:hanging="360"/&gt;&lt;/w:pPr&gt;&lt;w:rPr&gt;&lt;w:rFonts w:ascii="Symbol" w:hAnsi="Symbol" w:hint="default"/&gt;&lt;/w:rPr&gt;&lt;/w:lvl&gt;&lt;/w:abstractNum&gt;&lt;w:abstractNum w:abstractNumId="5" w15:restartNumberingAfterBreak="0"&gt;&lt;w:nsid w:val="FFFFFF81"/&gt;&lt;w:multiLevelType w:val="singleLevel"/&gt;&lt;w:tmpl w:val="DEF60714"/&gt;&lt;w:lvl w:ilvl="0"&gt;&lt;w:start w:val="1"/&gt;&lt;w:numFmt w:val="bullet"/&gt;&lt;w:lvlText w:val=""/&gt;&lt;w:lvlJc w:val="left"/&gt;&lt;w:pPr&gt;&lt;w:tabs&gt;&lt;w:tab w:val="num" w:pos="1209"/&gt;&lt;/w:tabs&gt;&lt;w:ind w:left="1209" w:hanging="360"/&gt;&lt;/w:pPr&gt;&lt;w:rPr&gt;&lt;w:rFonts w:ascii="Symbol" w:hAnsi="Symbol" w:hint="default"/&gt;&lt;/w:rPr&gt;&lt;/w:lvl&gt;&lt;/w:abstractNum&gt;&lt;w:abstractNum w:abstractNumId="6" w15:restartNumberingAfterBreak="0"&gt;&lt;w:nsid w:val="FFFFFF82"/&gt;&lt;w:multiLevelType w:val="singleLevel"/&gt;&lt;w:tmpl w:val="91EA47E8"/&gt;&lt;w:lvl w:ilvl="0"&gt;&lt;w:start w:val="1"/&gt;&lt;w:numFmt w:val="bullet"/&gt;&lt;w:lvlText w:val=""/&gt;&lt;w:lvlJc w:val="left"/&gt;&lt;w:pPr&gt;&lt;w:tabs&gt;&lt;w:tab w:val="num" w:pos="926"/&gt;&lt;/w:tabs&gt;&lt;w:ind w:left="926" w:hanging="360"/&gt;&lt;/w:pPr&gt;&lt;w:rPr&gt;&lt;w:rFonts w:ascii="Symbol" w:hAnsi="Symbol" w:hint="default"/&gt;&lt;/w:rPr&gt;&lt;/w:lvl&gt;&lt;/w:abstractNum&gt;&lt;w:abstractNum w:abstractNumId="7" w15:restartNumberingAfterBreak="0"&gt;&lt;w:nsid w:val="FFFFFF83"/&gt;&lt;w:multiLevelType w:val="singleLevel"/&gt;&lt;w:tmpl w:val="9278B09A"/&gt;&lt;w:lvl w:ilvl="0"&gt;&lt;w:start w:val="1"/&gt;&lt;w:numFmt w:val="bullet"/&gt;&lt;w:lvlText w:val=""/&gt;&lt;w:lvlJc w:val="left"/&gt;&lt;w:pPr&gt;&lt;w:tabs&gt;&lt;w:tab w:val="num" w:pos="643"/&gt;&lt;/w:tabs&gt;&lt;w:ind w:left="643" w:hanging="360"/&gt;&lt;/w:pPr&gt;&lt;w:rPr&gt;&lt;w:rFonts w:ascii="Symbol" w:hAnsi="Symbol" w:hint="default"/&gt;&lt;/w:rPr&gt;&lt;/w:lvl&gt;&lt;/w:abstractNum&gt;&lt;w:abstractNum w:abstractNumId="8" w15:restartNumberingAfterBreak="0"&gt;&lt;w:nsid w:val="17071BBC"/&gt;&lt;w:multiLevelType w:val="multilevel"/&gt;&lt;w:tmpl w:val="B512299C"/&gt;&lt;w:lvl w:ilvl="0"&gt;&lt;w:start w:val="1"/&gt;&lt;w:numFmt w:val="decimal"/&gt;&lt;w:pStyle w:val="ListNumber"/&gt;&lt;w:lvlText w:val="%1."/&gt;&lt;w:lvlJc w:val="left"/&gt;&lt;w:pPr&gt;&lt;w:ind w:left="360" w:hanging="360"/&gt;&lt;/w:pPr&gt;&lt;w:rPr&gt;&lt;w:rFonts w:hint="default"/&gt;&lt;/w:rPr&gt;&lt;/w:lvl&gt;&lt;w:lvl w:ilvl="1"&gt;&lt;w:start w:val="1"/&gt;&lt;w:numFmt w:val="lowerLetter"/&gt;&lt;w:pStyle w:val="ListNumber2"/&gt;&lt;w:lvlText w:val="%2."/&gt;&lt;w:lvlJc w:val="left"/&gt;&lt;w:pPr&gt;&lt;w:ind w:left="720" w:hanging="360"/&gt;&lt;/w:pPr&gt;&lt;w:rPr&gt;&lt;w:rFonts w:hint="default"/&gt;&lt;/w:rPr&gt;&lt;/w:lvl&gt;&lt;w:lvl w:ilvl="2"&gt;&lt;w:start w:val="1"/&gt;&lt;w:numFmt w:val="lowerRoman"/&gt;&lt;w:pStyle w:val="ListNumber3"/&gt;&lt;w:lvlText w:val="%3)"/&gt;&lt;w:lvlJc w:val="left"/&gt;&lt;w:pPr&gt;&lt;w:ind w:left="1080" w:hanging="360"/&gt;&lt;/w:pPr&gt;&lt;w:rPr&gt;&lt;w:rFonts w:hint="default"/&gt;&lt;/w:rPr&gt;&lt;/w:lvl&gt;&lt;w:lvl w:ilvl="3"&gt;&lt;w:start w:val="1"/&gt;&lt;w:numFmt w:val="decimal"/&gt;&lt;w:pStyle w:val="ListNumber4"/&gt;&lt;w:lvlText w:val="%4)"/&gt;&lt;w:lvlJc w:val="left"/&gt;&lt;w:pPr&gt;&lt;w:ind w:left="1440" w:hanging="360"/&gt;&lt;/w:pPr&gt;&lt;w:rPr&gt;&lt;w:rFonts w:hint="default"/&gt;&lt;/w:rPr&gt;&lt;/w:lvl&gt;&lt;w:lvl w:ilvl="4"&gt;&lt;w:start w:val="1"/&gt;&lt;w:numFmt w:val="lowerLetter"/&gt;&lt;w:pStyle w:val="ListNumber5"/&gt;&lt;w:lvlText w:val="%5)"/&gt;&lt;w:lvlJc w:val="left"/&gt;&lt;w:pPr&gt;&lt;w:ind w:left="1800" w:hanging="360"/&gt;&lt;/w:pPr&gt;&lt;w:rPr&gt;&lt;w:rFonts w:hint="default"/&gt;&lt;/w:rPr&gt;&lt;/w:lvl&gt;&lt;w:lvl w:ilvl="5"&gt;&lt;w:start w:val="1"/&gt;&lt;w:numFmt w:val="lowerRoman"/&gt;&lt;w:lvlText w:val="%6)"/&gt;&lt;w:lvlJc w:val="left"/&gt;&lt;w:pPr&gt;&lt;w:ind w:left="2160" w:hanging="360"/&gt;&lt;/w:pPr&gt;&lt;w:rPr&gt;&lt;w:rFonts w:hint="default"/&gt;&lt;/w:rPr&gt;&lt;/w:lvl&gt;&lt;w:lvl w:ilvl="6"&gt;&lt;w:start w:val="1"/&gt;&lt;w:numFmt w:val="decimal"/&gt;&lt;w:lvlText w:val="(%7)"/&gt;&lt;w:lvlJc w:val="left"/&gt;&lt;w:pPr&gt;&lt;w:ind w:left="2520" w:hanging="360"/&gt;&lt;/w:pPr&gt;&lt;w:rPr&gt;&lt;w:rFonts w:hint="default"/&gt;&lt;/w:rPr&gt;&lt;/w:lvl&gt;&lt;w:lvl w:ilvl="7"&gt;&lt;w:start w:val="1"/&gt;&lt;w:numFmt w:val="lowerLetter"/&gt;&lt;w:lvlText w:val="(%8)"/&gt;&lt;w:lvlJc w:val="left"/&gt;&lt;w:pPr&gt;&lt;w:ind w:left="2880" w:hanging="360"/&gt;&lt;/w:pPr&gt;&lt;w:rPr&gt;&lt;w:rFonts w:hint="default"/&gt;&lt;/w:rPr&gt;&lt;/w:lvl&gt;&lt;w:lvl w:ilvl="8"&gt;&lt;w:start w:val="1"/&gt;&lt;w:numFmt w:val="lowerRoman"/&gt;&lt;w:lvlText w:val="(%9)"/&gt;&lt;w:lvlJc w:val="left"/&gt;&lt;w:pPr&gt;&lt;w:ind w:left="3240" w:hanging="360"/&gt;&lt;/w:pPr&gt;&lt;w:rPr&gt;&lt;w:rFonts w:hint="default"/&gt;&lt;/w:rPr&gt;&lt;/w:lvl&gt;&lt;/w:abstractNum&gt;&lt;w:abstractNum w:abstractNumId="9" w15:restartNumberingAfterBreak="0"&gt;&lt;w:nsid w:val="3CE155D5"/&gt;&lt;w:multiLevelType w:val="multilevel"/&gt;&lt;w:tmpl w:val="041D001D"/&gt;&lt;w:lvl w:ilvl="0"&gt;&lt;w:start w:val="1"/&gt;&lt;w:numFmt w:val="decimal"/&gt;&lt;w:lvlText w:val="%1)"/&gt;&lt;w:lvlJc w:val="left"/&gt;&lt;w:pPr&gt;&lt;w:ind w:left="360" w:hanging="360"/&gt;&lt;/w:pPr&gt;&lt;/w:lvl&gt;&lt;w:lvl w:ilvl="1"&gt;&lt;w:start w:val="1"/&gt;&lt;w:numFmt w:val="lowerLetter"/&gt;&lt;w:lvlText w:val="%2)"/&gt;&lt;w:lvlJc w:val="left"/&gt;&lt;w:pPr&gt;&lt;w:ind w:left="720" w:hanging="360"/&gt;&lt;/w:pPr&gt;&lt;/w:lvl&gt;&lt;w:lvl w:ilvl="2"&gt;&lt;w:start w:val="1"/&gt;&lt;w:numFmt w:val="lowerRoman"/&gt;&lt;w:lvlText w:val="%3)"/&gt;&lt;w:lvlJc w:val="left"/&gt;&lt;w:pPr&gt;&lt;w:ind w:left="1080" w:hanging="360"/&gt;&lt;/w:pPr&gt;&lt;/w:lvl&gt;&lt;w:lvl w:ilvl="3"&gt;&lt;w:start w:val="1"/&gt;&lt;w:numFmt w:val="decimal"/&gt;&lt;w:lvlText w:val="(%4)"/&gt;&lt;w:lvlJc w:val="left"/&gt;&lt;w:pPr&gt;&lt;w:ind w:left="1440" w:hanging="360"/&gt;&lt;/w:pPr&gt;&lt;/w:lvl&gt;&lt;w:lvl w:ilvl="4"&gt;&lt;w:start w:val="1"/&gt;&lt;w:numFmt w:val="lowerLetter"/&gt;&lt;w:lvlText w:val="(%5)"/&gt;&lt;w:lvlJc w:val="left"/&gt;&lt;w:pPr&gt;&lt;w:ind w:left="1800" w:hanging="360"/&gt;&lt;/w:pPr&gt;&lt;/w:lvl&gt;&lt;w:lvl w:ilvl="5"&gt;&lt;w:start w:val="1"/&gt;&lt;w:numFmt w:val="lowerRoman"/&gt;&lt;w:lvlText w:val="(%6)"/&gt;&lt;w:lvlJc w:val="left"/&gt;&lt;w:pPr&gt;&lt;w:ind w:left="2160" w:hanging="360"/&gt;&lt;/w:pPr&gt;&lt;/w:lvl&gt;&lt;w:lvl w:ilvl="6"&gt;&lt;w:start w:val="1"/&gt;&lt;w:numFmt w:val="decimal"/&gt;&lt;w:lvlText w:val="%7."/&gt;&lt;w:lvlJc w:val="left"/&gt;&lt;w:pPr&gt;&lt;w:ind w:left="2520" w:hanging="360"/&gt;&lt;/w:pPr&gt;&lt;/w:lvl&gt;&lt;w:lvl w:ilvl="7"&gt;&lt;w:start w:val="1"/&gt;&lt;w:numFmt w:val="lowerLetter"/&gt;&lt;w:lvlText w:val="%8."/&gt;&lt;w:lvlJc w:val="left"/&gt;&lt;w:pPr&gt;&lt;w:ind w:left="2880" w:hanging="360"/&gt;&lt;/w:pPr&gt;&lt;/w:lvl&gt;&lt;w:lvl w:ilvl="8"&gt;&lt;w:start w:val="1"/&gt;&lt;w:numFmt w:val="lowerRoman"/&gt;&lt;w:lvlText w:val="%9."/&gt;&lt;w:lvlJc w:val="left"/&gt;&lt;w:pPr&gt;&lt;w:ind w:left="3240" w:hanging="360"/&gt;&lt;/w:pPr&gt;&lt;/w:lvl&gt;&lt;/w:abstractNum&gt;&lt;w:abstractNum w:abstractNumId="10" w15:restartNumberingAfterBreak="0"&gt;&lt;w:nsid w:val="3D727479"/&gt;&lt;w:multiLevelType w:val="multilevel"/&gt;&lt;w:tmpl w:val="041D0023"/&gt;&lt;w:lvl w:ilvl="0"&gt;&lt;w:start w:val="1"/&gt;&lt;w:numFmt w:val="upperRoman"/&gt;&lt;w:lvlText w:val="Artikel %1."/&gt;&lt;w:lvlJc w:val="left"/&gt;&lt;w:pPr&gt;&lt;w:ind w:left="0" w:firstLine="0"/&gt;&lt;/w:pPr&gt;&lt;/w:lvl&gt;&lt;w:lvl w:ilvl="1"&gt;&lt;w:start w:val="1"/&gt;&lt;w:numFmt w:val="decimalZero"/&gt;&lt;w:isLgl/&gt;&lt;w:lvlText w:val="Avsnitt %1.%2"/&gt;&lt;w:lvlJc w:val="left"/&gt;&lt;w:pPr&gt;&lt;w:ind w:left="0" w:firstLine="0"/&gt;&lt;/w:pPr&gt;&lt;/w:lvl&gt;&lt;w:lvl w:ilvl="2"&gt;&lt;w:start w:val="1"/&gt;&lt;w:numFmt w:val="lowerLetter"/&gt;&lt;w:lvlText w:val="(%3)"/&gt;&lt;w:lvlJc w:val="left"/&gt;&lt;w:pPr&gt;&lt;w:ind w:left="720" w:hanging="432"/&gt;&lt;/w:pPr&gt;&lt;/w:lvl&gt;&lt;w:lvl w:ilvl="3"&gt;&lt;w:start w:val="1"/&gt;&lt;w:numFmt w:val="lowerRoman"/&gt;&lt;w:lvlText w:val="(%4)"/&gt;&lt;w:lvlJc w:val="right"/&gt;&lt;w:pPr&gt;&lt;w:ind w:left="864" w:hanging="144"/&gt;&lt;/w:pPr&gt;&lt;/w:lvl&gt;&lt;w:lvl w:ilvl="4"&gt;&lt;w:start w:val="1"/&gt;&lt;w:numFmt w:val="decimal"/&gt;&lt;w:pStyle w:val="Heading5"/&gt;&lt;w:lvlText w:val="%5)"/&gt;&lt;w:lvlJc w:val="left"/&gt;&lt;w:pPr&gt;&lt;w:ind w:left="1008" w:hanging="432"/&gt;&lt;/w:pPr&gt;&lt;/w:lvl&gt;&lt;w:lvl w:ilvl="5"&gt;&lt;w:start w:val="1"/&gt;&lt;w:numFmt w:val="lowerLetter"/&gt;&lt;w:pStyle w:val="Heading6"/&gt;&lt;w:lvlText w:val="%6)"/&gt;&lt;w:lvlJc w:val="left"/&gt;&lt;w:pPr&gt;&lt;w:ind w:left="1152" w:hanging="432"/&gt;&lt;/w:pPr&gt;&lt;/w:lvl&gt;&lt;w:lvl w:ilvl="6"&gt;&lt;w:start w:val="1"/&gt;&lt;w:numFmt w:val="lowerRoman"/&gt;&lt;w:pStyle w:val="Heading7"/&gt;&lt;w:lvlText w:val="%7)"/&gt;&lt;w:lvlJc w:val="right"/&gt;&lt;w:pPr&gt;&lt;w:ind w:left="1296" w:hanging="288"/&gt;&lt;/w:pPr&gt;&lt;/w:lvl&gt;&lt;w:lvl w:ilvl="7"&gt;&lt;w:start w:val="1"/&gt;&lt;w:numFmt w:val="lowerLetter"/&gt;&lt;w:pStyle w:val="Heading8"/&gt;&lt;w:lvlText w:val="%8."/&gt;&lt;w:lvlJc w:val="left"/&gt;&lt;w:pPr&gt;&lt;w:ind w:left="1440" w:hanging="432"/&gt;&lt;/w:pPr&gt;&lt;/w:lvl&gt;&lt;w:lvl w:ilvl="8"&gt;&lt;w:start w:val="1"/&gt;&lt;w:numFmt w:val="lowerRoman"/&gt;&lt;w:pStyle w:val="Heading9"/&gt;&lt;w:lvlText w:val="%9."/&gt;&lt;w:lvlJc w:val="right"/&gt;&lt;w:pPr&gt;&lt;w:ind w:left="1584" w:hanging="144"/&gt;&lt;/w:pPr&gt;&lt;/w:lvl&gt;&lt;/w:abstractNum&gt;&lt;w:abstractNum w:abstractNumId="11" w15:restartNumberingAfterBreak="0"&gt;&lt;w:nsid w:val="43F95E9C"/&gt;&lt;w:multiLevelType w:val="multilevel"/&gt;&lt;w:tmpl w:val="5FAE225A"/&gt;&lt;w:lvl w:ilvl="0"&gt;&lt;w:start w:val="1"/&gt;&lt;w:numFmt w:val="decimal"/&gt;&lt;w:pStyle w:val="NumberedHeading1"/&gt;&lt;w:lvlText w:val="%1."/&gt;&lt;w:lvlJc w:val="left"/&gt;&lt;w:pPr&gt;&lt;w:ind w:left="907" w:hanging="907"/&gt;&lt;/w:pPr&gt;&lt;w:rPr&gt;&lt;w:rFonts w:hint="default"/&gt;&lt;/w:rPr&gt;&lt;/w:lvl&gt;&lt;w:lvl w:ilvl="1"&gt;&lt;w:start w:val="1"/&gt;&lt;w:numFmt w:val="decimal"/&gt;&lt;w:pStyle w:val="NumberedHeading2"/&gt;&lt;w:lvlText w:val="%1.%2"/&gt;&lt;w:lvlJc w:val="left"/&gt;&lt;w:pPr&gt;&lt;w:ind w:left="907" w:hanging="907"/&gt;&lt;/w:pPr&gt;&lt;w:rPr&gt;&lt;w:rFonts w:hint="default"/&gt;&lt;/w:rPr&gt;&lt;/w:lvl&gt;&lt;w:lvl w:ilvl="2"&gt;&lt;w:start w:val="1"/&gt;&lt;w:numFmt w:val="decimal"/&gt;&lt;w:pStyle w:val="NumberedHeading3"/&gt;&lt;w:lvlText w:val="%1.%2.%3"/&gt;&lt;w:lvlJc w:val="left"/&gt;&lt;w:pPr&gt;&lt;w:ind w:left="907" w:hanging="907"/&gt;&lt;/w:pPr&gt;&lt;w:rPr&gt;&lt;w:rFonts w:hint="default"/&gt;&lt;/w:rPr&gt;&lt;/w:lvl&gt;&lt;w:lvl w:ilvl="3"&gt;&lt;w:start w:val="1"/&gt;&lt;w:numFmt w:val="decimal"/&gt;&lt;w:pStyle w:val="NumberedHeading4"/&gt;&lt;w:lvlText w:val="%1.%2.%3.%4"/&gt;&lt;w:lvlJc w:val="left"/&gt;&lt;w:pPr&gt;&lt;w:ind w:left="907" w:hanging="907"/&gt;&lt;/w:pPr&gt;&lt;w:rPr&gt;&lt;w:rFonts w:hint="default"/&gt;&lt;/w:rPr&gt;&lt;/w:lvl&gt;&lt;w:lvl w:ilvl="4"&gt;&lt;w:start w:val="1"/&gt;&lt;w:numFmt w:val="lowerLetter"/&gt;&lt;w:lvlText w:val="(%5)"/&gt;&lt;w:lvlJc w:val="left"/&gt;&lt;w:pPr&gt;&lt;w:ind w:left="907" w:hanging="907"/&gt;&lt;/w:pPr&gt;&lt;w:rPr&gt;&lt;w:rFonts w:hint="default"/&gt;&lt;/w:rPr&gt;&lt;/w:lvl&gt;&lt;w:lvl w:ilvl="5"&gt;&lt;w:start w:val="1"/&gt;&lt;w:numFmt w:val="lowerRoman"/&gt;&lt;w:lvlText w:val="(%6)"/&gt;&lt;w:lvlJc w:val="left"/&gt;&lt;w:pPr&gt;&lt;w:ind w:left="907" w:hanging="907"/&gt;&lt;/w:pPr&gt;&lt;w:rPr&gt;&lt;w:rFonts w:hint="default"/&gt;&lt;/w:rPr&gt;&lt;/w:lvl&gt;&lt;w:lvl w:ilvl="6"&gt;&lt;w:start w:val="1"/&gt;&lt;w:numFmt w:val="decimal"/&gt;&lt;w:lvlText w:val="%7."/&gt;&lt;w:lvlJc w:val="left"/&gt;&lt;w:pPr&gt;&lt;w:ind w:left="907" w:hanging="907"/&gt;&lt;/w:pPr&gt;&lt;w:rPr&gt;&lt;w:rFonts w:hint="default"/&gt;&lt;/w:rPr&gt;&lt;/w:lvl&gt;&lt;w:lvl w:ilvl="7"&gt;&lt;w:start w:val="1"/&gt;&lt;w:numFmt w:val="lowerLetter"/&gt;&lt;w:lvlText w:val="%8."/&gt;&lt;w:lvlJc w:val="left"/&gt;&lt;w:pPr&gt;&lt;w:ind w:left="907" w:hanging="907"/&gt;&lt;/w:pPr&gt;&lt;w:rPr&gt;&lt;w:rFonts w:hint="default"/&gt;&lt;/w:rPr&gt;&lt;/w:lvl&gt;&lt;w:lvl w:ilvl="8"&gt;&lt;w:start w:val="1"/&gt;&lt;w:numFmt w:val="lowerRoman"/&gt;&lt;w:lvlText w:val="%9."/&gt;&lt;w:lvlJc w:val="left"/&gt;&lt;w:pPr&gt;&lt;w:ind w:left="907" w:hanging="907"/&gt;&lt;/w:pPr&gt;&lt;w:rPr&gt;&lt;w:rFonts w:hint="default"/&gt;&lt;/w:rPr&gt;&lt;/w:lvl&gt;&lt;/w:abstractNum&gt;&lt;w:abstractNum w:abstractNumId="12" w15:restartNumberingAfterBreak="0"&gt;&lt;w:nsid w:val="4CEF34F7"/&gt;&lt;w:multiLevelType w:val="multilevel"/&gt;&lt;w:tmpl w:val="041D001F"/&gt;&lt;w:lvl w:ilvl="0"&gt;&lt;w:start w:val="1"/&gt;&lt;w:numFmt w:val="decimal"/&gt;&lt;w:lvlText w:val="%1."/&gt;&lt;w:lvlJc w:val="left"/&gt;&lt;w:pPr&gt;&lt;w:ind w:left="360" w:hanging="360"/&gt;&lt;/w:pPr&gt;&lt;/w:lvl&gt;&lt;w:lvl w:ilvl="1"&gt;&lt;w:start w:val="1"/&gt;&lt;w:numFmt w:val="decimal"/&gt;&lt;w:lvlText w:val="%1.%2."/&gt;&lt;w:lvlJc w:val="left"/&gt;&lt;w:pPr&gt;&lt;w:ind w:left="792" w:hanging="432"/&gt;&lt;/w:pPr&gt;&lt;/w:lvl&gt;&lt;w:lvl w:ilvl="2"&gt;&lt;w:start w:val="1"/&gt;&lt;w:numFmt w:val="decimal"/&gt;&lt;w:lvlText w:val="%1.%2.%3."/&gt;&lt;w:lvlJc w:val="left"/&gt;&lt;w:pPr&gt;&lt;w:ind w:left="1224" w:hanging="504"/&gt;&lt;/w:pPr&gt;&lt;/w:lvl&gt;&lt;w:lvl w:ilvl="3"&gt;&lt;w:start w:val="1"/&gt;&lt;w:numFmt w:val="decimal"/&gt;&lt;w:lvlText w:val="%1.%2.%3.%4."/&gt;&lt;w:lvlJc w:val="left"/&gt;&lt;w:pPr&gt;&lt;w:ind w:left="1728" w:hanging="648"/&gt;&lt;/w:pPr&gt;&lt;/w:lvl&gt;&lt;w:lvl w:ilvl="4"&gt;&lt;w:start w:val="1"/&gt;&lt;w:numFmt w:val="decimal"/&gt;&lt;w:lvlText w:val="%1.%2.%3.%4.%5."/&gt;&lt;w:lvlJc w:val="left"/&gt;&lt;w:pPr&gt;&lt;w:ind w:left="2232" w:hanging="792"/&gt;&lt;/w:pPr&gt;&lt;/w:lvl&gt;&lt;w:lvl w:ilvl="5"&gt;&lt;w:start w:val="1"/&gt;&lt;w:numFmt w:val="decimal"/&gt;&lt;w:lvlText w:val="%1.%2.%3.%4.%5.%6."/&gt;&lt;w:lvlJc w:val="left"/&gt;&lt;w:pPr&gt;&lt;w:ind w:left="2736" w:hanging="936"/&gt;&lt;/w:pPr&gt;&lt;/w:lvl&gt;&lt;w:lvl w:ilvl="6"&gt;&lt;w:start w:val="1"/&gt;&lt;w:numFmt w:val="decimal"/&gt;&lt;w:lvlText w:val="%1.%2.%3.%4.%5.%6.%7."/&gt;&lt;w:lvlJc w:val="left"/&gt;&lt;w:pPr&gt;&lt;w:ind w:left="3240" w:hanging="1080"/&gt;&lt;/w:pPr&gt;&lt;/w:lvl&gt;&lt;w:lvl w:ilvl="7"&gt;&lt;w:start w:val="1"/&gt;&lt;w:numFmt w:val="decimal"/&gt;&lt;w:lvlText w:val="%1.%2.%3.%4.%5.%6.%7.%8."/&gt;&lt;w:lvlJc w:val="left"/&gt;&lt;w:pPr&gt;&lt;w:ind w:left="3744" w:hanging="1224"/&gt;&lt;/w:pPr&gt;&lt;/w:lvl&gt;&lt;w:lvl w:ilvl="8"&gt;&lt;w:start w:val="1"/&gt;&lt;w:numFmt w:val="decimal"/&gt;&lt;w:lvlText w:val="%1.%2.%3.%4.%5.%6.%7.%8.%9."/&gt;&lt;w:lvlJc w:val="left"/&gt;&lt;w:pPr&gt;&lt;w:ind w:left="4320" w:hanging="1440"/&gt;&lt;/w:pPr&gt;&lt;/w:lvl&gt;&lt;/w:abstractNum&gt;&lt;w:abstractNum w:abstractNumId="13" w15:restartNumberingAfterBreak="0"&gt;&lt;w:nsid w:val="566F2E6D"/&gt;&lt;w:multiLevelType w:val="multilevel"/&gt;&lt;w:tmpl w:val="6FD4AAFC"/&gt;&lt;w:lvl w:ilvl="0"&gt;&lt;w:start w:val="1"/&gt;&lt;w:numFmt w:val="bullet"/&gt;&lt;w:pStyle w:val="ListBullet"/&gt;&lt;w:lvlText w:val="—"/&gt;&lt;w:lvlJc w:val="left"/&gt;&lt;w:pPr&gt;&lt;w:ind w:left="360" w:hanging="360"/&gt;&lt;/w:pPr&gt;&lt;w:rPr&gt;&lt;w:rFonts w:ascii="Calibri" w:hAnsi="Calibri" w:hint="default"/&gt;&lt;w:color w:val="auto"/&gt;&lt;/w:rPr&gt;&lt;/w:lvl&gt;&lt;w:lvl w:ilvl="1"&gt;&lt;w:start w:val="1"/&gt;&lt;w:numFmt w:val="bullet"/&gt;&lt;w:pStyle w:val="ListBullet2"/&gt;&lt;w:lvlText w:val="—"/&gt;&lt;w:lvlJc w:val="left"/&gt;&lt;w:pPr&gt;&lt;w:ind w:left="720" w:hanging="360"/&gt;&lt;/w:pPr&gt;&lt;w:rPr&gt;&lt;w:rFonts w:ascii="Calibri" w:hAnsi="Calibri" w:hint="default"/&gt;&lt;w:color w:val="auto"/&gt;&lt;/w:rPr&gt;&lt;/w:lvl&gt;&lt;w:lvl w:ilvl="2"&gt;&lt;w:start w:val="1"/&gt;&lt;w:numFmt w:val="bullet"/&gt;&lt;w:pStyle w:val="ListBullet3"/&gt;&lt;w:lvlText w:val="—"/&gt;&lt;w:lvlJc w:val="left"/&gt;&lt;w:pPr&gt;&lt;w:ind w:left="1080" w:hanging="360"/&gt;&lt;/w:pPr&gt;&lt;w:rPr&gt;&lt;w:rFonts w:ascii="Calibri" w:hAnsi="Calibri" w:hint="default"/&gt;&lt;w:color w:val="auto"/&gt;&lt;/w:rPr&gt;&lt;/w:lvl&gt;&lt;w:lvl w:ilvl="3"&gt;&lt;w:start w:val="1"/&gt;&lt;w:numFmt w:val="bullet"/&gt;&lt;w:pStyle w:val="ListBullet4"/&gt;&lt;w:lvlText w:val="—"/&gt;&lt;w:lvlJc w:val="left"/&gt;&lt;w:pPr&gt;&lt;w:ind w:left="1440" w:hanging="360"/&gt;&lt;/w:pPr&gt;&lt;w:rPr&gt;&lt;w:rFonts w:ascii="Calibri" w:hAnsi="Calibri" w:hint="default"/&gt;&lt;w:color w:val="auto"/&gt;&lt;/w:rPr&gt;&lt;/w:lvl&gt;&lt;w:lvl w:ilvl="4"&gt;&lt;w:start w:val="1"/&gt;&lt;w:numFmt w:val="bullet"/&gt;&lt;w:pStyle w:val="ListBullet5"/&gt;&lt;w:lvlText w:val="—"/&gt;&lt;w:lvlJc w:val="left"/&gt;&lt;w:pPr&gt;&lt;w:ind w:left="1800" w:hanging="360"/&gt;&lt;/w:pPr&gt;&lt;w:rPr&gt;&lt;w:rFonts w:ascii="Calibri" w:hAnsi="Calibri" w:hint="default"/&gt;&lt;w:color w:val="auto"/&gt;&lt;/w:rPr&gt;&lt;/w:lvl&gt;&lt;w:lvl w:ilvl="5"&gt;&lt;w:start w:val="1"/&gt;&lt;w:numFmt w:val="bullet"/&gt;&lt;w:lvlText w:val="»"/&gt;&lt;w:lvlJc w:val="left"/&gt;&lt;w:pPr&gt;&lt;w:ind w:left="2160" w:hanging="360"/&gt;&lt;/w:pPr&gt;&lt;w:rPr&gt;&lt;w:rFonts w:ascii="Calibri" w:hAnsi="Calibri" w:hint="default"/&gt;&lt;w:color w:val="auto"/&gt;&lt;/w:rPr&gt;&lt;/w:lvl&gt;&lt;w:lvl w:ilvl="6"&gt;&lt;w:start w:val="1"/&gt;&lt;w:numFmt w:val="bullet"/&gt;&lt;w:lvlText w:val="•"/&gt;&lt;w:lvlJc w:val="left"/&gt;&lt;w:pPr&gt;&lt;w:ind w:left="2520" w:hanging="360"/&gt;&lt;/w:pPr&gt;&lt;w:rPr&gt;&lt;w:rFonts w:ascii="Calibri" w:hAnsi="Calibri" w:hint="default"/&gt;&lt;w:color w:val="auto"/&gt;&lt;/w:rPr&gt;&lt;/w:lvl&gt;&lt;w:lvl w:ilvl="7"&gt;&lt;w:start w:val="1"/&gt;&lt;w:numFmt w:val="bullet"/&gt;&lt;w:lvlText w:val="–"/&gt;&lt;w:lvlJc w:val="left"/&gt;&lt;w:pPr&gt;&lt;w:ind w:left="2880" w:hanging="360"/&gt;&lt;/w:pPr&gt;&lt;w:rPr&gt;&lt;w:rFonts w:ascii="Calibri" w:hAnsi="Calibri" w:hint="default"/&gt;&lt;w:color w:val="auto"/&gt;&lt;/w:rPr&gt;&lt;/w:lvl&gt;&lt;w:lvl w:ilvl="8"&gt;&lt;w:start w:val="1"/&gt;&lt;w:numFmt w:val="bullet"/&gt;&lt;w:lvlText w:val="»"/&gt;&lt;w:lvlJc w:val="left"/&gt;&lt;w:pPr&gt;&lt;w:ind w:left="3240" w:hanging="360"/&gt;&lt;/w:pPr&gt;&lt;w:rPr&gt;&lt;w:rFonts w:ascii="Calibri" w:hAnsi="Calibri" w:hint="default"/&gt;&lt;w:color w:val="auto"/&gt;&lt;/w:rPr&gt;&lt;/w:lvl&gt;&lt;/w:abstractNum&gt;&lt;w:num w:numId="1"&gt;&lt;w:abstractNumId w:val="13"/&gt;&lt;/w:num&gt;&lt;w:num w:numId="2"&gt;&lt;w:abstractNumId w:val="7"/&gt;&lt;/w:num&gt;&lt;w:num w:numId="3"&gt;&lt;w:abstractNumId w:val="6"/&gt;&lt;/w:num&gt;&lt;w:num w:numId="4"&gt;&lt;w:abstractNumId w:val="5"/&gt;&lt;/w:num&gt;&lt;w:num w:numId="5"&gt;&lt;w:abstractNumId w:val="4"/&gt;&lt;/w:num&gt;&lt;w:num w:numId="6"&gt;&lt;w:abstractNumId w:val="8"/&gt;&lt;/w:num&gt;&lt;w:num w:numId="7"&gt;&lt;w:abstractNumId w:val="3"/&gt;&lt;/w:num&gt;&lt;w:num w:numId="8"&gt;&lt;w:abstractNumId w:val="2"/&gt;&lt;/w:num&gt;&lt;w:num w:numId="9"&gt;&lt;w:abstractNumId w:val="1"/&gt;&lt;/w:num&gt;&lt;w:num w:numId="10"&gt;&lt;w:abstractNumId w:val="0"/&gt;&lt;/w:num&gt;&lt;w:num w:numId="11"&gt;&lt;w:abstractNumId w:val="13"/&gt;&lt;w:lvlOverride w:ilvl="0"&gt;&lt;w:startOverride w:val="1"/&gt;&lt;/w:lvlOverride&gt;&lt;w:lvlOverride w:ilvl="1"&gt;&lt;w:startOverride w:val="1"/&gt;&lt;/w:lvlOverride&gt;&lt;w:lvlOverride w:ilvl="2"&gt;&lt;w:startOverride w:val="1"/&gt;&lt;/w:lvlOverride&gt;&lt;w:lvlOverride w:ilvl="3"&gt;&lt;w:startOverride w:val="1"/&gt;&lt;/w:lvlOverride&gt;&lt;w:lvlOverride w:ilvl="4"&gt;&lt;w:startOverride w:val="1"/&gt;&lt;/w:lvlOverride&gt;&lt;w:lvlOverride w:ilvl="5"&gt;&lt;w:startOverride w:val="1"/&gt;&lt;/w:lvlOverride&gt;&lt;w:lvlOverride w:ilvl="6"&gt;&lt;w:startOverride w:val="1"/&gt;&lt;/w:lvlOverride&gt;&lt;w:lvlOverride w:ilvl="7"&gt;&lt;w:startOverride w:val="1"/&gt;&lt;/w:lvlOverride&gt;&lt;w:lvlOverride w:ilvl="8"&gt;&lt;w:startOverride w:val="1"/&gt;&lt;/w:lvlOverride&gt;&lt;/w:num&gt;&lt;w:num w:numId="12"&gt;&lt;w:abstractNumId w:val="11"/&gt;&lt;/w:num&gt;&lt;w:num w:numId="13"&gt;&lt;w:abstractNumId w:val="12"/&gt;&lt;/w:num&gt;&lt;w:num w:numId="14"&gt;&lt;w:abstractNumId w:val="9"/&gt;&lt;/w:num&gt;&lt;w:num w:numId="15"&gt;&lt;w:abstractNumId w:val="10"/&gt;&lt;/w:num&gt;&lt;/w:numbering&gt;&lt;/pkg:xmlData&gt;&lt;/pkg:part&gt;&lt;/pkg:package&gt;
-</Namn>
-      <Titel>&lt;?xml version="1.0" standalone="yes"?&gt;
-&lt;?mso-application progid="Word.Document"?&gt;
-&lt;pkg:package xmlns:pkg="http://schemas.microsoft.com/office/2006/xmlPackage"&gt;&lt;pkg:part pkg:name="/_rels/.rels" pkg:contentType="application/vnd.openxmlformats-package.relationships+xml" pkg:padding="512"&gt;&lt;pkg:xmlData&gt;&lt;Relationships xmlns="http://schemas.openxmlformats.org/package/2006/relationships"&gt;&lt;Relationship Id="rId1" Type="http://schemas.openxmlformats.org/officeDocument/2006/relationships/officeDocument" Target="word/document.xml"/&gt;&lt;/Relationships&gt;&lt;/pkg:xmlData&gt;&lt;/pkg:part&gt;&lt;pkg:part pkg:name="/word/_rels/document.xml.rels" pkg:contentType="application/vnd.openxmlformats-package.relationships+xml" pkg:padding="256"&gt;&lt;pkg:xmlData&gt;&lt;Relationships xmlns="http://schemas.openxmlformats.org/package/2006/relationships"&gt;&lt;Relationship Id="rId3" Type="http://schemas.openxmlformats.org/officeDocument/2006/relationships/glossaryDocument" Target="glossary/document.xml"/&gt;&lt;Relationship Id="rId2" Type="http://schemas.openxmlformats.org/officeDocument/2006/relationships/styles" Target="styles.xml"/&gt;&lt;Relationship Id="rId1" Type="http://schemas.openxmlformats.org/officeDocument/2006/relationships/numbering" Target="numbering.xml"/&gt;&lt;/Relationships&gt;&lt;/pkg:xmlData&gt;&lt;/pkg:part&gt;&lt;pkg:part pkg:name="/word/document.xml" pkg:contentType="application/vnd.openxmlformats-officedocument.wordprocessingml.document.main+xml"&gt;&lt;pkg:xmlData&gt;&lt;w:document xmlns:wpc="http://schemas.microsoft.com/office/word/2010/wordprocessingCanvas" xmlns:cx="http://schemas.microsoft.com/office/drawing/2014/chartex" xmlns:cx1="http://schemas.microsoft.com/office/drawing/2015/9/8/chartex" xmlns:cx2="http://schemas.microsoft.com/office/drawing/2015/10/21/chartex" xmlns:cx3="http://schemas.microsoft.com/office/drawing/2016/5/9/chartex" xmlns:cx4="http://schemas.microsoft.com/office/drawing/2016/5/10/chartex" xmlns:cx5="http://schemas.microsoft.com/office/drawing/2016/5/11/chartex" xmlns:cx6="http://schemas.microsoft.com/office/drawing/2016/5/12/chartex" xmlns:cx7="http://schemas.microsoft.com/office/drawing/2016/5/13/chartex" xmlns:cx8="http://schemas.microsoft.com/office/drawing/2016/5/14/chartex" xmlns:mc="http://schemas.openxmlformats.org/markup-compatibility/2006" xmlns:o="urn:schemas-microsoft-com:office:office" xmlns:r="http://schemas.openxmlformats.org/officeDocument/2006/relationships" xmlns:m="http://schemas.openxmlformats.org/officeDocument/2006/math" xmlns:v="urn:schemas-microsoft-com:vml" xmlns:wp14="http://schemas.microsoft.com/office/word/2010/wordprocessingDrawing" xmlns:wp="http://schemas.openxmlformats.org/drawingml/2006/wordprocessingDrawing" xmlns:w10="urn:schemas-microsoft-com:office:word" xmlns:w="http://schemas.openxmlformats.org/wordprocessingml/2006/main" xmlns:w14="http://schemas.microsoft.com/office/word/2010/wordml" xmlns:w15="http://schemas.microsoft.com/office/word/2012/wordml" xmlns:w16se="http://schemas.microsoft.com/office/word/2015/wordml/symex" xmlns:wpg="http://schemas.microsoft.com/office/word/2010/wordprocessingGroup" xmlns:wpi="http://schemas.microsoft.com/office/word/2010/wordprocessingInk" xmlns:wne="http://schemas.microsoft.com/office/word/2006/wordml" xmlns:wps="http://schemas.microsoft.com/office/word/2010/wordprocessingShape" mc:Ignorable="w14 w15 w16se wp14"&gt;&lt;w:body&gt;&lt;w:sdt&gt;&lt;w:sdtPr&gt;&lt;w:tag w:val="regTitle"/&gt;&lt;w:id w:val="2084647071"/&gt;&lt;w:placeholder&gt;&lt;w:docPart w:val="F25D791C5B2F4E19930DB86356413466"/&gt;&lt;/w:placeholder&gt;&lt;/w:sdtPr&gt;&lt;w:sdtContent&gt;&lt;w:p&gt;&lt;w:r&gt;&lt;w:t&gt;Consultant&lt;/w:t&gt;&lt;/w:r&gt;&lt;/w:p&gt;&lt;/w:sdtContent&gt;&lt;/w:sdt&gt;&lt;w:sectPr&gt;&lt;w:pgSz w:w="12240" w:h="15840"/&gt;&lt;w:pgMar w:top="1417" w:right="1417" w:bottom="1417" w:left="1417" w:header="720" w:footer="720" w:gutter="0"/&gt;&lt;w:cols w:space="720"/&gt;&lt;/w:sectPr&gt;&lt;/w:body&gt;&lt;/w:document&gt;&lt;/pkg:xmlData&gt;&lt;/pkg:part&gt;&lt;pkg:part pkg:name="/word/glossary/settings.xml" pkg:contentType="application/vnd.openxmlformats-officedocument.wordprocessingml.settings+xml"&gt;&lt;pkg:xmlData&gt;&lt;w:settings xmlns:mc="http://schemas.openxmlformats.org/markup-compatibility/2006" xmlns:o="urn:schemas-microsoft-com:office:office" xmlns:r="http://schemas.openxmlformats.org/officeDocument/2006/relationships" xmlns:m="http://schemas.openxmlformats.org/officeDocument/2006/math" xmlns:v="urn:schemas-microsoft-com:vml" xmlns:w10="urn:schemas-microsoft-com:office:word" xmlns:w="http://schemas.openxmlformats.org/wordprocessingml/2006/main" xmlns:w14="http://schemas.microsoft.com/office/word/2010/wordml" xmlns:w15="http://schemas.microsoft.com/office/word/2012/wordml" xmlns:w16se="http://schemas.microsoft.com/office/word/2015/wordml/symex" xmlns:sl="http://schemas.openxmlformats.org/schemaLibrary/2006/main" mc:Ignorable="w14 w15 w16se"&gt;&lt;w:view w:val="normal"/&gt;&lt;w:defaultTabStop w:val="720"/&gt;&lt;w:characterSpacingControl w:val="doNotCompress"/&gt;&lt;w:compat&gt;&lt;w:useFELayout/&gt;&lt;w:compatSetting w:name="compatibilityMode" w:uri="http://schemas.microsoft.com/office/word" w:val="15"/&gt;&lt;w:compatSetting w:name="overrideTableStyleFontSizeAndJustification" w:uri="http://schemas.microsoft.com/office/word" w:val="1"/&gt;&lt;w:compatSetting w:name="enableOpenTypeFeatures" w:uri="http://schemas.microsoft.com/office/word" w:val="1"/&gt;&lt;w:compatSetting w:name="doNotFlipMirrorIndents" w:uri="http://schemas.microsoft.com/office/word" w:val="1"/&gt;&lt;w:compatSetting w:name="differentiateMultirowTableHeaders" w:uri="http://schemas.microsoft.com/office/word" w:val="1"/&gt;&lt;/w:compat&gt;&lt;m:mathPr&gt;&lt;m:mathFont m:val="Cambria Math"/&gt;&lt;m:brkBin m:val="before"/&gt;&lt;m:brkBinSub m:val="--"/&gt;&lt;m:smallFrac m:val="0"/&gt;&lt;m:dispDef/&gt;&lt;m:lMargin m:val="0"/&gt;&lt;m:rMargin m:val="0"/&gt;&lt;m:defJc m:val="centerGroup"/&gt;&lt;m:wrapIndent m:val="1440"/&gt;&lt;m:intLim m:val="subSup"/&gt;&lt;m:naryLim m:val="undOvr"/&gt;&lt;/m:mathPr&gt;&lt;w:themeFontLang w:val="en-GB"/&gt;&lt;w:clrSchemeMapping w:bg1="light1" w:t1="dark1" w:bg2="light2" w:t2="dark2" w:accent1="accent1" w:accent2="accent2" w:accent3="accent3" w:accent4="accent4" w:accent5="accent5" w:accent6="accent6" w:hyperlink="hyperlink" w:followedHyperlink="followedHyperlink"/&gt;&lt;w:decimalSymbol w:val=","/&gt;&lt;w:listSeparator w:val=";"/&gt;&lt;w15:chartTrackingRefBased/&gt;&lt;/w:settings&gt;&lt;/pkg:xmlData&gt;&lt;/pkg:part&gt;&lt;pkg:part pkg:name="/word/glossary/_rels/document.xml.rels" pkg:contentType="application/vnd.openxmlformats-package.relationships+xml"&gt;&lt;pkg:xmlData&gt;&lt;Relationships xmlns="http://schemas.openxmlformats.org/package/2006/relationships"&gt;&lt;Relationship Id="rId3" Type="http://schemas.openxmlformats.org/officeDocument/2006/relationships/webSettings" Target="webSettings.xml"/&gt;&lt;Relationship Id="rId2" Type="http://schemas.openxmlformats.org/officeDocument/2006/relationships/settings" Target="settings.xml"/&gt;&lt;Relationship Id="rId1" Type="http://schemas.openxmlformats.org/officeDocument/2006/relationships/styles" Target="styles.xml"/&gt;&lt;Relationship Id="rId4" Type="http://schemas.openxmlformats.org/officeDocument/2006/relationships/fontTable" Target="fontTable.xml"/&gt;&lt;/Relationships&gt;&lt;/pkg:xmlData&gt;&lt;/pkg:part&gt;&lt;pkg:part pkg:name="/word/glossary/document.xml" pkg:contentType="application/vnd.openxmlformats-officedocument.wordprocessingml.document.glossary+xml"&gt;&lt;pkg:xmlData&gt;&lt;w:glossaryDocument xmlns:wpc="http://schemas.microsoft.com/office/word/2010/wordprocessingCanvas" xmlns:cx="http://schemas.microsoft.com/office/drawing/2014/chartex" xmlns:cx1="http://schemas.microsoft.com/office/drawing/2015/9/8/chartex" xmlns:cx2="http://schemas.microsoft.com/office/drawing/2015/10/21/chartex" xmlns:cx3="http://schemas.microsoft.com/office/drawing/2016/5/9/chartex" xmlns:cx4="http://schemas.microsoft.com/office/drawing/2016/5/10/chartex" xmlns:cx5="http://schemas.microsoft.com/office/drawing/2016/5/11/chartex" xmlns:cx6="http://schemas.microsoft.com/office/drawing/2016/5/12/chartex" xmlns:cx7="http://schemas.microsoft.com/office/drawing/2016/5/13/chartex" xmlns:cx8="http://schemas.microsoft.com/office/drawing/2016/5/14/chartex" xmlns:mc="http://schemas.openxmlformats.org/markup-compatibility/2006" xmlns:o="urn:schemas-microsoft-com:office:office" xmlns:r="http://schemas.openxmlformats.org/officeDocument/2006/relationships" xmlns:m="http://schemas.openxmlformats.org/officeDocument/2006/math" xmlns:v="urn:schemas-microsoft-com:vml" xmlns:wp14="http://schemas.microsoft.com/office/word/2010/wordprocessingDrawing" xmlns:wp="http://schemas.openxmlformats.org/drawingml/2006/wordprocessingDrawing" xmlns:w10="urn:schemas-microsoft-com:office:word" xmlns:w="http://schemas.openxmlformats.org/wordprocessingml/2006/main" xmlns:w14="http://schemas.microsoft.com/office/word/2010/wordml" xmlns:w15="http://schemas.microsoft.com/office/word/2012/wordml" xmlns:w16se="http://schemas.microsoft.com/office/word/2015/wordml/symex" xmlns:wpg="http://schemas.microsoft.com/office/word/2010/wordprocessingGroup" xmlns:wpi="http://schemas.microsoft.com/office/word/2010/wordprocessingInk" xmlns:wne="http://schemas.microsoft.com/office/word/2006/wordml" xmlns:wps="http://schemas.microsoft.com/office/word/2010/wordprocessingShape" mc:Ignorable="w14 w15 w16se wp14"&gt;&lt;w:docParts&gt;&lt;w:docPart&gt;&lt;w:docPartPr&gt;&lt;w:name w:val="F25D791C5B2F4E19930DB86356413466"/&gt;&lt;w:category&gt;&lt;w:name w:val="General"/&gt;&lt;w:gallery w:val="placeholder"/&gt;&lt;/w:category&gt;&lt;w:types&gt;&lt;w:type w:val="bbPlcHdr"/&gt;&lt;/w:types&gt;&lt;w:behaviors&gt;&lt;w:behavior w:val="content"/&gt;&lt;/w:behaviors&gt;&lt;w:guid w:val="{D7CC999A-6FA2-4301-AF13-D17E1333918F}"/&gt;&lt;/w:docPartPr&gt;&lt;w:docPartBody&gt;&lt;w:p&gt;&lt;w:pPr&gt;&lt;w:pStyle w:val="F25D791C5B2F4E19930DB86356413466"/&gt;&lt;/w:pPr&gt;&lt;w:r&gt;&lt;w:rPr&gt;&lt;w:rStyle w:val="PlaceholderText"/&gt;&lt;/w:rPr&gt;&lt;w:t&gt;Click or tap here to enter text.&lt;/w:t&gt;&lt;/w:r&gt;&lt;/w:p&gt;&lt;/w:docPartBody&gt;&lt;/w:docPart&gt;&lt;/w:docParts&gt;&lt;/w:glossaryDocument&gt;&lt;/pkg:xmlData&gt;&lt;/pkg:part&gt;&lt;pkg:part pkg:name="/word/glossary/styles.xml" pkg:contentType="application/vnd.openxmlformats-officedocument.wordprocessingml.styles+xml"&gt;&lt;pkg:xmlData&gt;&lt;w:styles xmlns:mc="http://schemas.openxmlformats.org/markup-compatibility/2006" xmlns:r="http://schemas.openxmlformats.org/officeDocument/2006/relationships" xmlns:w="http://schemas.openxmlformats.org/wordprocessingml/2006/main" xmlns:w14="http://schemas.microsoft.com/office/word/2010/wordml" xmlns:w15="http://schemas.microsoft.com/office/word/2012/wordml" xmlns:w16se="http://schemas.microsoft.com/office/word/2015/wordml/symex" mc:Ignorable="w14 w15 w16se"&gt;&lt;w:docDefaults&gt;&lt;w:rPrDefault&gt;&lt;w:rPr&gt;&lt;w:rFonts w:asciiTheme="minorHAnsi" w:eastAsiaTheme="minorEastAsia" w:hAnsiTheme="minorHAnsi" w:cstheme="minorBidi"/&gt;&lt;w:sz w:val="22"/&gt;&lt;w:szCs w:val="22"/&gt;&lt;w:lang w:val="en-GB" w:eastAsia="en-GB" w:bidi="ar-SA"/&gt;&lt;/w:rPr&gt;&lt;/w:rPrDefault&gt;&lt;w:pPrDefault&gt;&lt;w:pPr&gt;&lt;w:spacing w:after="160" w:line="259" w:lineRule="auto"/&gt;&lt;/w:pPr&gt;&lt;/w:pPrDefault&gt;&lt;/w:docDefaults&gt;&lt;w:latentStyles w:defLockedState="0" w:defUIPriority="99" w:defSemiHidden="0" w:defUnhideWhenUsed="0" w:defQFormat="0" w:count="374"&gt;&lt;w:lsdException w:name="Normal" w:uiPriority="0" w:qFormat="1"/&gt;&lt;w:lsdException w:name="heading 1" w:uiPriority="9" w:qFormat="1"/&gt;&lt;w:lsdException w:name="heading 2" w:semiHidden="1" w:uiPriority="9" w:unhideWhenUsed="1" w:qFormat="1"/&gt;&lt;w:lsdException w:name="heading 3" w:semiHidden="1" w:uiPriority="9" w:unhideWhenUsed="1" w:qFormat="1"/&gt;&lt;w:lsdException w:name="heading 4" w:semiHidden="1" w:uiPriority="9" w:unhideWhenUsed="1" w:qFormat="1"/&gt;&lt;w:lsdException w:name="heading 5" w:semiHidden="1" w:uiPriority="9" w:unhideWhenUsed="1" w:qFormat="1"/&gt;&lt;w:lsdException w:name="heading 6" w:semiHidden="1" w:uiPriority="9" w:unhideWhenUsed="1" w:qFormat="1"/&gt;&lt;w:lsdException w:name="heading 7" w:semiHidden="1" w:uiPriority="9" w:unhideWhenUsed="1" w:qFormat="1"/&gt;&lt;w:lsdException w:name="heading 8" w:semiHidden="1" w:uiPriority="9" w:unhideWhenUsed="1" w:qFormat="1"/&gt;&lt;w:lsdException w:name="heading 9" w:semiHidden="1" w:uiPriority="9" w:unhideWhenUsed="1" w:qFormat="1"/&gt;&lt;w:lsdException w:name="index 1" w:semiHidden="1" w:unhideWhenUsed="1"/&gt;&lt;w:lsdException w:name="index 2" w:semiHidden="1" w:unhideWhenUsed="1"/&gt;&lt;w:lsdException w:name="index 3" w:semiHidden="1" w:unhideWhenUsed="1"/&gt;&lt;w:lsdException w:name="index 4" w:semiHidden="1" w:unhideWhenUsed="1"/&gt;&lt;w:lsdException w:name="index 5" w:semiHidden="1" w:unhideWhenUsed="1"/&gt;&lt;w:lsdException w:name="index 6" w:semiHidden="1" w:unhideWhenUsed="1"/&gt;&lt;w:lsdException w:name="index 7" w:semiHidden="1" w:unhideWhenUsed="1"/&gt;&lt;w:lsdException w:name="index 8" w:semiHidden="1" w:unhideWhenUsed="1"/&gt;&lt;w:lsdException w:name="index 9" w:semiHidden="1" w:unhideWhenUsed="1"/&gt;&lt;w:lsdException w:name="toc 1" w:semiHidden="1" w:uiPriority="39" w:unhideWhenUsed="1"/&gt;&lt;w:lsdException w:name="toc 2" w:semiHidden="1" w:uiPriority="39" w:unhideWhenUsed="1"/&gt;&lt;w:lsdException w:name="toc 3" w:semiHidden="1" w:uiPriority="39" w:unhideWhenUsed="1"/&gt;&lt;w:lsdException w:name="toc 4" w:semiHidden="1" w:uiPriority="39" w:unhideWhenUsed="1"/&gt;&lt;w:lsdException w:name="toc 5" w:semiHidden="1" w:uiPriority="39" w:unhideWhenUsed="1"/&gt;&lt;w:lsdException w:name="toc 6" w:semiHidden="1" w:uiPriority="39" w:unhideWhenUsed="1"/&gt;&lt;w:lsdException w:name="toc 7" w:semiHidden="1" w:uiPriority="39" w:unhideWhenUsed="1"/&gt;&lt;w:lsdException w:name="toc 8" w:semiHidden="1" w:uiPriority="39" w:unhideWhenUsed="1"/&gt;&lt;w:lsdException w:name="toc 9" w:semiHidden="1" w:uiPriority="39" w:unhideWhenUsed="1"/&gt;&lt;w:lsdException w:name="Normal Indent" w:semiHidden="1" w:unhideWhenUsed="1"/&gt;&lt;w:lsdException w:name="footnote text" w:semiHidden="1" w:unhideWhenUsed="1"/&gt;&lt;w:lsdException w:name="annotation text" w:semiHidden="1" w:unhideWhenUsed="1"/&gt;&lt;w:lsdException w:name="header" w:semiHidden="1" w:unhideWhenUsed="1"/&gt;&lt;w:lsdException w:name="footer" w:semiHidden="1" w:unhideWhenUsed="1"/&gt;&lt;w:lsdException w:name="index heading" w:semiHidden="1" w:unhideWhenUsed="1"/&gt;&lt;w:lsdException w:name="caption" w:semiHidden="1" w:uiPriority="35" w:unhideWhenUsed="1" w:qFormat="1"/&gt;&lt;w:lsdException w:name="table of figures" w:semiHidden="1" w:unhideWhenUsed="1"/&gt;&lt;w:lsdException w:name="envelope address" w:semiHidden="1" w:unhideWhenUsed="1"/&gt;&lt;w:lsdException w:name="envelope return" w:semiHidden="1" w:unhideWhenUsed="1"/&gt;&lt;w:lsdException w:name="footnote reference" w:semiHidden="1" w:unhideWhenUsed="1"/&gt;&lt;w:lsdException w:name="annotation reference" w:semiHidden="1" w:unhideWhenUsed="1"/&gt;&lt;w:lsdException w:name="line number" w:semiHidden="1" w:unhideWhenUsed="1"/&gt;&lt;w:lsdException w:name="page number" w:semiHidden="1" w:unhideWhenUsed="1"/&gt;&lt;w:lsdException w:name="endnote reference" w:semiHidden="1" w:unhideWhenUsed="1"/&gt;&lt;w:lsdException w:name="endnote text" w:semiHidden="1" w:unhideWhenUsed="1"/&gt;&lt;w:lsdException w:name="table of authorities" w:semiHidden="1" w:unhideWhenUsed="1"/&gt;&lt;w:lsdException w:name="macro" w:semiHidden="1" w:unhideWhenUsed="1"/&gt;&lt;w:lsdException w:name="toa heading" w:semiHidden="1" w:unhideWhenUsed="1"/&gt;&lt;w:lsdException w:name="List" w:semiHidden="1" w:unhideWhenUsed="1"/&gt;&lt;w:lsdException w:name="List Bullet" w:semiHidden="1" w:unhideWhenUsed="1"/&gt;&lt;w:lsdException w:name="List Number" w:semiHidden="1" w:unhideWhenUsed="1"/&gt;&lt;w:lsdException w:name="List 2" w:semiHidden="1" w:unhideWhenUsed="1"/&gt;&lt;w:lsdException w:name="List 3" w:semiHidden="1" w:unhideWhenUsed="1"/&gt;&lt;w:lsdException w:name="List 4" w:semiHidden="1" w:unhideWhenUsed="1"/&gt;&lt;w:lsdException w:name="List 5" w:semiHidden="1" w:unhideWhenUsed="1"/&gt;&lt;w:lsdException w:name="List Bullet 2" w:semiHidden="1" w:unhideWhenUsed="1"/&gt;&lt;w:lsdException w:name="List Bullet 3" w:semiHidden="1" w:unhideWhenUsed="1"/&gt;&lt;w:lsdException w:name="List Bullet 4" w:semiHidden="1" w:unhideWhenUsed="1"/&gt;&lt;w:lsdException w:name="List Bullet 5" w:semiHidden="1" w:unhideWhenUsed="1"/&gt;&lt;w:lsdException w:name="List Number 2" w:semiHidden="1" w:unhideWhenUsed="1"/&gt;&lt;w:lsdException w:name="List Number 3" w:semiHidden="1" w:unhideWhenUsed="1"/&gt;&lt;w:lsdException w:name="List Number 4" w:semiHidden="1" w:unhideWhenUsed="1"/&gt;&lt;w:lsdException w:name="List Number 5" w:semiHidden="1" w:unhideWhenUsed="1"/&gt;&lt;w:lsdException w:name="Title" w:uiPriority="10" w:qFormat="1"/&gt;&lt;w:lsdException w:name="Closing" w:semiHidden="1" w:unhideWhenUsed="1"/&gt;&lt;w:lsdException w:name="Signature" w:semiHidden="1" w:unhideWhenUsed="1"/&gt;&lt;w:lsdException w:name="Default Paragraph Font" w:semiHidden="1" w:uiPriority="1" w:unhideWhenUsed="1"/&gt;&lt;w:lsdException w:name="Body Text" w:semiHidden="1" w:unhideWhenUsed="1"/&gt;&lt;w:lsdException w:name="Body Text Indent" w:semiHidden="1" w:unhideWhenUsed="1"/&gt;&lt;w:lsdException w:name="List Continue" w:semiHidden="1" w:unhideWhenUsed="1"/&gt;&lt;w:lsdException w:name="List Continue 2" w:semiHidden="1" w:unhideWhenUsed="1"/&gt;&lt;w:lsdException w:name="List Continue 3" w:semiHidden="1" w:unhideWhenUsed="1"/&gt;&lt;w:lsdException w:name="List Continue 4" w:semiHidden="1" w:unhideWhenUsed="1"/&gt;&lt;w:lsdException w:name="List Continue 5" w:semiHidden="1" w:unhideWhenUsed="1"/&gt;&lt;w:lsdException w:name="Message Header" w:semiHidden="1" w:unhideWhenUsed="1"/&gt;&lt;w:lsdException w:name="Subtitle" w:uiPriority="11" w:qFormat="1"/&gt;&lt;w:lsdException w:name="Salutation" w:semiHidden="1" w:unhideWhenUsed="1"/&gt;&lt;w:lsdException w:name="Date" w:semiHidden="1" w:unhideWhenUsed="1"/&gt;&lt;w:lsdException w:name="Body Text First Indent" w:semiHidden="1" w:unhideWhenUsed="1"/&gt;&lt;w:lsdException w:name="Body Text First Indent 2" w:semiHidden="1" w:unhideWhenUsed="1"/&gt;&lt;w:lsdException w:name="Note Heading" w:semiHidden="1" w:unhideWhenUsed="1"/&gt;&lt;w:lsdException w:name="Body Text 2" w:semiHidden="1" w:unhideWhenUsed="1"/&gt;&lt;w:lsdException w:name="Body Text 3" w:semiHidden="1" w:unhideWhenUsed="1"/&gt;&lt;w:lsdException w:name="Body Text Indent 2" w:semiHidden="1" w:unhideWhenUsed="1"/&gt;&lt;w:lsdException w:name="Body Text Indent 3" w:semiHidden="1" w:unhideWhenUsed="1"/&gt;&lt;w:lsdException w:name="Block Text" w:semiHidden="1" w:unhideWhenUsed="1"/&gt;&lt;w:lsdException w:name="Hyperlink" w:semiHidden="1" w:unhideWhenUsed="1"/&gt;&lt;w:lsdException w:name="FollowedHyperlink" w:semiHidden="1" w:unhideWhenUsed="1"/&gt;&lt;w:lsdException w:name="Strong" w:uiPriority="22" w:qFormat="1"/&gt;&lt;w:lsdException w:name="Emphasis" w:uiPriority="20" w:qFormat="1"/&gt;&lt;w:lsdException w:name="Document Map" w:semiHidden="1" w:unhideWhenUsed="1"/&gt;&lt;w:lsdException w:name="Plain Text" w:semiHidden="1" w:unhideWhenUsed="1"/&gt;&lt;w:lsdException w:name="E-mail Signature" w:semiHidden="1" w:unhideWhenUsed="1"/&gt;&lt;w:lsdException w:name="HTML Top of Form" w:semiHidden="1" w:unhideWhenUsed="1"/&gt;&lt;w:lsdException w:name="HTML Bottom of Form" w:semiHidden="1" w:unhideWhenUsed="1"/&gt;&lt;w:lsdException w:name="Normal (Web)" w:semiHidden="1" w:unhideWhenUsed="1"/&gt;&lt;w:lsdException w:name="HTML Acronym" w:semiHidden="1" w:unhideWhenUsed="1"/&gt;&lt;w:lsdException w:name="HTML Address" w:semiHidden="1" w:unhideWhenUsed="1"/&gt;&lt;w:lsdException w:name="HTML Cite" w:semiHidden="1" w:unhideWhenUsed="1"/&gt;&lt;w:lsdException w:name="HTML Code" w:semiHidden="1" w:unhideWhenUsed="1"/&gt;&lt;w:lsdException w:name="HTML Definition" w:semiHidden="1" w:unhideWhenUsed="1"/&gt;&lt;w:lsdException w:name="HTML Keyboard" w:semiHidden="1" w:unhideWhenUsed="1"/&gt;&lt;w:lsdException w:name="HTML Preformatted" w:semiHidden="1" w:unhideWhenUsed="1"/&gt;&lt;w:lsdException w:name="HTML Sample" w:semiHidden="1" w:unhideWhenUsed="1"/&gt;&lt;w:lsdException w:name="HTML Typewriter" w:semiHidden="1" w:unhideWhenUsed="1"/&gt;&lt;w:lsdException w:name="HTML Variable" w:semiHidden="1" w:unhideWhenUsed="1"/&gt;&lt;w:lsdException w:name="Normal Table" w:semiHidden="1" w:unhideWhenUsed="1"/&gt;&lt;w:lsdException w:name="annotation subject" w:semiHidden="1" w:unhideWhenUsed="1"/&gt;&lt;w:lsdException w:name="No List" w:semiHidden="1" w:unhideWhenUsed="1"/&gt;&lt;w:lsdException w:name="Outline List 1" w:semiHidden="1" w:unhideWhenUsed="1"/&gt;&lt;w:lsdException w:name="Outline List 2" w:semiHidden="1" w:unhideWhenUsed="1"/&gt;&lt;w:lsdException w:name="Outline List 3" w:semiHidden="1" w:unhideWhenUsed="1"/&gt;&lt;w:lsdException w:name="Table Simple 1" w:semiHidden="1" w:unhideWhenUsed="1"/&gt;&lt;w:lsdException w:name="Table Simple 2" w:semiHidden="1" w:unhideWhenUsed="1"/&gt;&lt;w:lsdException w:name="Table Simple 3" w:semiHidden="1" w:unhideWhenUsed="1"/&gt;&lt;w:lsdException w:name="Table Classic 1" w:semiHidden="1" w:unhideWhenUsed="1"/&gt;&lt;w:lsdException w:name="Table Classic 2" w:semiHidden="1" w:unhideWhenUsed="1"/&gt;&lt;w:lsdException w:name="Table Classic 3" w:semiHidden="1" w:unhideWhenUsed="1"/&gt;&lt;w:lsdException w:name="Table Classic 4" w:semiHidden="1" w:unhideWhenUsed="1"/&gt;&lt;w:lsdException w:name="Table Colorful 1" w:semiHidden="1" w:unhideWhenUsed="1"/&gt;&lt;w:lsdException w:name="Table Colorful 2" w:semiHidden="1" w:unhideWhenUsed="1"/&gt;&lt;w:lsdException w:name="Table Colorful 3" w:semiHidden="1" w:unhideWhenUsed="1"/&gt;&lt;w:lsdException w:name="Table Columns 1" w:semiHidden="1" w:unhideWhenUsed="1"/&gt;&lt;w:lsdException w:name="Table Columns 2" w:semiHidden="1" w:unhideWhenUsed="1"/&gt;&lt;w:lsdException w:name="Table Columns 3" w:semiHidden="1" w:unhideWhenUsed="1"/&gt;&lt;w:lsdException w:name="Table Columns 4" w:semiHidden="1" w:unhideWhenUsed="1"/&gt;&lt;w:lsdException w:name="Table Columns 5" w:semiHidden="1" w:unhideWhenUsed="1"/&gt;&lt;w:lsdException w:name="Table Grid 1" w:semiHidden="1" w:unhideWhenUsed="1"/&gt;&lt;w:lsdException w:name="Table Grid 2" w:semiHidden="1" w:unhideWhenUsed="1"/&gt;&lt;w:lsdException w:name="Table Grid 3" w:semiHidden="1" w:unhideWhenUsed="1"/&gt;&lt;w:lsdException w:name="Table Grid 4" w:semiHidden="1" w:unhideWhenUsed="1"/&gt;&lt;w:lsdException w:name="Table Grid 5" w:semiHidden="1" w:unhideWhenUsed="1"/&gt;&lt;w:lsdException w:name="Table Grid 6" w:semiHidden="1" w:unhideWhenUsed="1"/&gt;&lt;w:lsdException w:name="Table Grid 7" w:semiHidden="1" w:unhideWhenUsed="1"/&gt;&lt;w:lsdException w:name="Table Grid 8" w:semiHidden="1" w:unhideWhenUsed="1"/&gt;&lt;w:lsdException w:name="Table List 1" w:semiHidden="1" w:unhideWhenUsed="1"/&gt;&lt;w:lsdException w:name="Table List 2" w:semiHidden="1" w:unhideWhenUsed="1"/&gt;&lt;w:lsdException w:name="Table List 3" w:semiHidden="1" w:unhideWhenUsed="1"/&gt;&lt;w:lsdException w:name="Table List 4" w:semiHidden="1" w:unhideWhenUsed="1"/&gt;&lt;w:lsdException w:name="Table List 5" w:semiHidden="1" w:unhideWhenUsed="1"/&gt;&lt;w:lsdException w:name="Table List 6" w:semiHidden="1" w:unhideWhenUsed="1"/&gt;&lt;w:lsdException w:name="Table List 7" w:semiHidden="1" w:unhideWhenUsed="1"/&gt;&lt;w:lsdException w:name="Table List 8" w:semiHidden="1" w:unhideWhenUsed="1"/&gt;&lt;w:lsdException w:name="Table 3D effects 1" w:semiHidden="1" w:unhideWhenUsed="1"/&gt;&lt;w:lsdException w:name="Table 3D effects 2" w:semiHidden="1" w:unhideWhenUsed="1"/&gt;&lt;w:lsdException w:name="Table 3D effects 3" w:semiHidden="1" w:unhideWhenUsed="1"/&gt;&lt;w:lsdException w:name="Table Contemporary" w:semiHidden="1" w:unhideWhenUsed="1"/&gt;&lt;w:lsdException w:name="Table Elegant" w:semiHidden="1" w:unhideWhenUsed="1"/&gt;&lt;w:lsdException w:name="Table Professional" w:semiHidden="1" w:unhideWhenUsed="1"/&gt;&lt;w:lsdException w:name="Table Subtle 1" w:semiHidden="1" w:unhideWhenUsed="1"/&gt;&lt;w:lsdException w:name="Table Subtle 2" w:semiHidden="1" w:unhideWhenUsed="1"/&gt;&lt;w:lsdException w:name="Table Web 1" w:semiHidden="1" w:unhideWhenUsed="1"/&gt;&lt;w:lsdException w:name="Table Web 2" w:semiHidden="1" w:unhideWhenUsed="1"/&gt;&lt;w:lsdException w:name="Table Web 3" w:semiHidden="1" w:unhideWhenUsed="1"/&gt;&lt;w:lsdException w:name="Balloon Text" w:semiHidden="1" w:unhideWhenUsed="1"/&gt;&lt;w:lsdException w:name="Table Grid" w:uiPriority="39"/&gt;&lt;w:lsdException w:name="Table Theme" w:semiHidden="1" w:unhideWhenUsed="1"/&gt;&lt;w:lsdException w:name="Placeholder Text" w:semiHidden="1"/&gt;&lt;w:lsdException w:name="No Spacing" w:uiPriority="1" w:qFormat="1"/&gt;&lt;w:lsdException w:name="Light Shading" w:uiPriority="60"/&gt;&lt;w:lsdException w:name="Light List" w:uiPriority="61"/&gt;&lt;w:lsdException w:name="Light Grid" w:uiPriority="62"/&gt;&lt;w:lsdException w:name="Medium Shading 1" w:uiPriority="63"/&gt;&lt;w:lsdException w:name="Medium Shading 2" w:uiPriority="64"/&gt;&lt;w:lsdException w:name="Medium List 1" w:uiPriority="65"/&gt;&lt;w:lsdException w:name="Medium List 2" w:uiPriority="66"/&gt;&lt;w:lsdException w:name="Medium Grid 1" w:uiPriority="67"/&gt;&lt;w:lsdException w:name="Medium Grid 2" w:uiPriority="68"/&gt;&lt;w:lsdException w:name="Medium Grid 3" w:uiPriority="69"/&gt;&lt;w:lsdException w:name="Dark List" w:uiPriority="70"/&gt;&lt;w:lsdException w:name="Colorful Shading" w:uiPriority="71"/&gt;&lt;w:lsdException w:name="Colorful List" w:uiPriority="72"/&gt;&lt;w:lsdException w:name="Colorful Grid" w:uiPriority="73"/&gt;&lt;w:lsdException w:name="Light Shading Accent 1" w:uiPriority="60"/&gt;&lt;w:lsdException w:name="Light List Accent 1" w:uiPriority="61"/&gt;&lt;w:lsdException w:name="Light Grid Accent 1" w:uiPriority="62"/&gt;&lt;w:lsdException w:name="Medium Shading 1 Accent 1" w:uiPriority="63"/&gt;&lt;w:lsdException w:name="Medium Shading 2 Accent 1" w:uiPriority="64"/&gt;&lt;w:lsdException w:name="Medium List 1 Accent 1" w:uiPriority="65"/&gt;&lt;w:lsdException w:name="Revision" w:semiHidden="1"/&gt;&lt;w:lsdException w:name="List Paragraph" w:uiPriority="34" w:qFormat="1"/&gt;&lt;w:lsdException w:name="Quote" w:uiPriority="29" w:qFormat="1"/&gt;&lt;w:lsdException w:name="Intense Quote" w:uiPriority="30" w:qFormat="1"/&gt;&lt;w:lsdException w:name="Medium List 2 Accent 1" w:uiPriority="66"/&gt;&lt;w:lsdException w:name="Medium Grid 1 Accent 1" w:uiPriority="67"/&gt;&lt;w:lsdException w:name="Medium Grid 2 Accent 1" w:uiPriority="68"/&gt;&lt;w:lsdException w:name="Medium Grid 3 Accent 1" w:uiPriority="69"/&gt;&lt;w:lsdException w:name="Dark List Accent 1" w:uiPriority="70"/&gt;&lt;w:lsdException w:name="Colorful Shading Accent 1" w:uiPriority="71"/&gt;&lt;w:lsdException w:name="Colorful List Accent 1" w:uiPriority="72"/&gt;&lt;w:lsdException w:name="Colorful Grid Accent 1" w:uiPriority="73"/&gt;&lt;w:lsdException w:name="Light Shading Accent 2" w:uiPriority="60"/&gt;&lt;w:lsdException w:name="Light List Accent 2" w:uiPriority="61"/&gt;&lt;w:lsdException w:name="Light Grid Accent 2" w:uiPriority="62"/&gt;&lt;w:lsdException w:name="Medium Shading 1 Accent 2" w:uiPriority="63"/&gt;&lt;w:lsdException w:name="Medium Shading 2 Accent 2" w:uiPriority="64"/&gt;&lt;w:lsdException w:name="Medium List 1 Accent 2" w:uiPriority="65"/&gt;&lt;w:lsdException w:name="Medium List 2 Accent 2" w:uiPriority="66"/&gt;&lt;w:lsdException w:name="Medium Grid 1 Accent 2" w:uiPriority="67"/&gt;&lt;w:lsdException w:name="Medium Grid 2 Accent 2" w:uiPriority="68"/&gt;&lt;w:lsdException w:name="Medium Grid 3 Accent 2" w:uiPriority="69"/&gt;&lt;w:lsdException w:name="Dark List Accent 2" w:uiPriority="70"/&gt;&lt;w:lsdException w:name="Colorful Shading Accent 2" w:uiPriority="71"/&gt;&lt;w:lsdException w:name="Colorful List Accent 2" w:uiPriority="72"/&gt;&lt;w:lsdException w:name="Colorful Grid Accent 2" w:uiPriority="73"/&gt;&lt;w:lsdException w:name="Light Shading Accent 3" w:uiPriority="60"/&gt;&lt;w:lsdException w:name="Light List Accent 3" w:uiPriority="61"/&gt;&lt;w:lsdException w:name="Light Grid Accent 3" w:uiPriority="62"/&gt;&lt;w:lsdException w:name="Medium Shading 1 Accent 3" w:uiPriority="63"/&gt;&lt;w:lsdException w:name="Medium Shading 2 Accent 3" w:uiPriority="64"/&gt;&lt;w:lsdException w:name="Medium List 1 Accent 3" w:uiPriority="65"/&gt;&lt;w:lsdException w:name="Medium List 2 Accent 3" w:uiPriority="66"/&gt;&lt;w:lsdException w:name="Medium Grid 1 Accent 3" w:uiPriority="67"/&gt;&lt;w:lsdException w:name="Medium Grid 2 Accent 3" w:uiPriority="68"/&gt;&lt;w:lsdException w:name="Medium Grid 3 Accent 3" w:uiPriority="69"/&gt;&lt;w:lsdException w:name="Dark List Accent 3" w:uiPriority="70"/&gt;&lt;w:lsdException w:name="Colorful Shading Accent 3" w:uiPriority="71"/&gt;&lt;w:lsdException w:name="Colorful List Accent 3" w:uiPriority="72"/&gt;&lt;w:lsdException w:name="Colorful Grid Accent 3" w:uiPriority="73"/&gt;&lt;w:lsdException w:name="Light Shading Accent 4" w:uiPriority="60"/&gt;&lt;w:lsdException w:name="Light List Accent 4" w:uiPriority="61"/&gt;&lt;w:lsdException w:name="Light Grid Accent 4" w:uiPriority="62"/&gt;&lt;w:lsdException w:name="Medium Shading 1 Accent 4" w:uiPriority="63"/&gt;&lt;w:lsdException w:name="Medium Shading 2 Accent 4" w:uiPriority="64"/&gt;&lt;w:lsdException w:name="Medium List 1 Accent 4" w:uiPriority="65"/&gt;&lt;w:lsdException w:name="Medium List 2 Accent 4" w:uiPriority="66"/&gt;&lt;w:lsdException w:name="Medium Grid 1 Accent 4" w:uiPriority="67"/&gt;&lt;w:lsdException w:name="Medium Grid 2 Accent 4" w:uiPriority="68"/&gt;&lt;w:lsdException w:name="Medium Grid 3 Accent 4" w:uiPriority="69"/&gt;&lt;w:lsdException w:name="Dark List Accent 4" w:uiPriority="70"/&gt;&lt;w:lsdException w:name="Colorful Shading Accent 4" w:uiPriority="71"/&gt;&lt;w:lsdException w:name="Colorful List Accent 4" w:uiPriority="72"/&gt;&lt;w:lsdException w:name="Colorful Grid Accent 4" w:uiPriority="73"/&gt;&lt;w:lsdException w:name="Light Shading Accent 5" w:uiPriority="60"/&gt;&lt;w:lsdException w:name="Light List Accent 5" w:uiPriority="61"/&gt;&lt;w:lsdException w:name="Light Grid Accent 5" w:uiPriority="62"/&gt;&lt;w:lsdException w:name="Medium Shading 1 Accent 5" w:uiPriority="63"/&gt;&lt;w:lsdException w:name="Medium Shading 2 Accent 5" w:uiPriority="64"/&gt;&lt;w:lsdException w:name="Medium List 1 Accent 5" w:uiPriority="65"/&gt;&lt;w:lsdException w:name="Medium List 2 Accent 5" w:uiPriority="66"/&gt;&lt;w:lsdException w:name="Medium Grid 1 Accent 5" w:uiPriority="67"/&gt;&lt;w:lsdException w:name="Medium Grid 2 Accent 5" w:uiPriority="68"/&gt;&lt;w:lsdException w:name="Medium Grid 3 Accent 5" w:uiPriority="69"/&gt;&lt;w:lsdException w:name="Dark List Accent 5" w:uiPriority="70"/&gt;&lt;w:lsdException w:name="Colorful Shading Accent 5" w:uiPriority="71"/&gt;&lt;w:lsdException w:name="Colorful List Accent 5" w:uiPriority="72"/&gt;&lt;w:lsdException w:name="Colorful Grid Accent 5" w:uiPriority="73"/&gt;&lt;w:lsdException w:name="Light Shading Accent 6" w:uiPriority="60"/&gt;&lt;w:lsdException w:name="Light List Accent 6" w:uiPriority="61"/&gt;&lt;w:lsdException w:name="Light Grid Accent 6" w:uiPriority="62"/&gt;&lt;w:lsdException w:name="Medium Shading 1 Accent 6" w:uiPriority="63"/&gt;&lt;w:lsdException w:name="Medium Shading 2 Accent 6" w:uiPriority="64"/&gt;&lt;w:lsdException w:name="Medium List 1 Accent 6" w:uiPriority="65"/&gt;&lt;w:lsdException w:name="Medium List 2 Accent 6" w:uiPriority="66"/&gt;&lt;w:lsdException w:name="Medium Grid 1 Accent 6" w:uiPriority="67"/&gt;&lt;w:lsdException w:name="Medium Grid 2 Accent 6" w:uiPriority="68"/&gt;&lt;w:lsdException w:name="Medium Grid 3 Accent 6" w:uiPriority="69"/&gt;&lt;w:lsdException w:name="Dark List Accent 6" w:uiPriority="70"/&gt;&lt;w:lsdException w:name="Colorful Shading Accent 6" w:uiPriority="71"/&gt;&lt;w:lsdException w:name="Colorful List Accent 6" w:uiPriority="72"/&gt;&lt;w:lsdException w:name="Colorful Grid Accent 6" w:uiPriority="73"/&gt;&lt;w:lsdException w:name="Subtle Emphasis" w:uiPriority="19" w:qFormat="1"/&gt;&lt;w:lsdException w:name="Intense Emphasis" w:uiPriority="21" w:qFormat="1"/&gt;&lt;w:lsdException w:name="Subtle Reference" w:uiPriority="31" w:qFormat="1"/&gt;&lt;w:lsdException w:name="Intense Reference" w:uiPriority="32" w:qFormat="1"/&gt;&lt;w:lsdException w:name="Book Title" w:uiPriority="33" w:qFormat="1"/&gt;&lt;w:lsdException w:name="Bibliography" w:semiHidden="1" w:uiPriority="37" w:unhideWhenUsed="1"/&gt;&lt;w:lsdException w:name="TOC Heading" w:semiHidden="1" w:uiPriority="39" w:unhideWhenUsed="1" w:qFormat="1"/&gt;&lt;w:lsdException w:name="Plain Table 1" w:uiPriority="41"/&gt;&lt;w:lsdException w:name="Plain Table 2" w:uiPriority="42"/&gt;&lt;w:lsdException w:name="Plain Table 3" w:uiPriority="43"/&gt;&lt;w:lsdException w:name="Plain Table 4" w:uiPriority="44"/&gt;&lt;w:lsdException w:name="Plain Table 5" w:uiPriority="45"/&gt;&lt;w:lsdException w:name="Grid Table Light" w:uiPriority="40"/&gt;&lt;w:lsdException w:name="Grid Table 1 Light" w:uiPriority="46"/&gt;&lt;w:lsdException w:name="Grid Table 2" w:uiPriority="47"/&gt;&lt;w:lsdException w:name="Grid Table 3" w:uiPriority="48"/&gt;&lt;w:lsdException w:name="Grid Table 4" w:uiPriority="49"/&gt;&lt;w:lsdException w:name="Grid Table 5 Dark" w:uiPriority="50"/&gt;&lt;w:lsdException w:name="Grid Table 6 Colorful" w:uiPriority="51"/&gt;&lt;w:lsdException w:name="Grid Table 7 Colorful" w:uiPriority="52"/&gt;&lt;w:lsdException w:name="Grid Table 1 Light Accent 1" w:uiPriority="46"/&gt;&lt;w:lsdException w:name="Grid Table 2 Accent 1" w:uiPriority="47"/&gt;&lt;w:lsdException w:name="Grid Table 3 Accent 1" w:uiPriority="48"/&gt;&lt;w:lsdException w:name="Grid Table 4 Accent 1" w:uiPriority="49"/&gt;&lt;w:lsdException w:name="Grid Table 5 Dark Accent 1" w:uiPriority="50"/&gt;&lt;w:lsdException w:name="Grid Table 6 Colorful Accent 1" w:uiPriority="51"/&gt;&lt;w:lsdException w:name="Grid Table 7 Colorful Accent 1" w:uiPriority="52"/&gt;&lt;w:lsdException w:name="Grid Table 1 Light Accent 2" w:uiPriority="46"/&gt;&lt;w:lsdException w:name="Grid Table 2 Accent 2" w:uiPriority="47"/&gt;&lt;w:lsdException w:name="Grid Table 3 Accent 2" w:uiPriority="48"/&gt;&lt;w:lsdException w:name="Grid Table 4 Accent 2" w:uiPriority="49"/&gt;&lt;w:lsdException w:name="Grid Table 5 Dark Accent 2" w:uiPriority="50"/&gt;&lt;w:lsdException w:name="Grid Table 6 Colorful Accent 2" w:uiPriority="51"/&gt;&lt;w:lsdException w:name="Grid Table 7 Colorful Accent 2" w:uiPriority="52"/&gt;&lt;w:lsdException w:name="Grid Table 1 Light Accent 3" w:uiPriority="46"/&gt;&lt;w:lsdException w:name="Grid Table 2 Accent 3" w:uiPriority="47"/&gt;&lt;w:lsdException w:name="Grid Table 3 Accent 3" w:uiPriority="48"/&gt;&lt;w:lsdException w:name="Grid Table 4 Accent 3" w:uiPriority="49"/&gt;&lt;w:lsdException w:name="Grid Table 5 Dark Accent 3" w:uiPriority="50"/&gt;&lt;w:lsdException w:name="Grid Table 6 Colorful Accent 3" w:uiPriority="51"/&gt;&lt;w:lsdException w:name="Grid Table 7 Colorful Accent 3" w:uiPriority="52"/&gt;&lt;w:lsdException w:name="Grid Table 1 Light Accent 4" w:uiPriority="46"/&gt;&lt;w:lsdException w:name="Grid Table 2 Accent 4" w:uiPriority="47"/&gt;&lt;w:lsdException w:name="Grid Table 3 Accent 4" w:uiPriority="48"/&gt;&lt;w:lsdException w:name="Grid Table 4 Accent 4" w:uiPriority="49"/&gt;&lt;w:lsdException w:name="Grid Table 5 Dark Accent 4" w:uiPriority="50"/&gt;&lt;w:lsdException w:name="Grid Table 6 Colorful Accent 4" w:uiPriority="51"/&gt;&lt;w:lsdException w:name="Grid Table 7 Colorful Accent 4" w:uiPriority="52"/&gt;&lt;w:lsdException w:name="Grid Table 1 Light Accent 5" w:uiPriority="46"/&gt;&lt;w:lsdException w:name="Grid Table 2 Accent 5" w:uiPriority="47"/&gt;&lt;w:lsdException w:name="Grid Table 3 Accent 5" w:uiPriority="48"/&gt;&lt;w:lsdException w:name="Grid Table 4 Accent 5" w:uiPriority="49"/&gt;&lt;w:lsdException w:name="Grid Table 5 Dark Accent 5" w:uiPriority="50"/&gt;&lt;w:lsdException w:name="Grid Table 6 Colorful Accent 5" w:uiPriority="51"/&gt;&lt;w:lsdException w:name="Grid Table 7 Colorful Accent 5" w:uiPriority="52"/&gt;&lt;w:lsdException w:name="Grid Table 1 Light Accent 6" w:uiPriority="46"/&gt;&lt;w:lsdException w:name="Grid Table 2 Accent 6" w:uiPriority="47"/&gt;&lt;w:lsdException w:name="Grid Table 3 Accent 6" w:uiPriority="48"/&gt;&lt;w:lsdException w:name="Grid Table 4 Accent 6" w:uiPriority="49"/&gt;&lt;w:lsdException w:name="Grid Table 5 Dark Accent 6" w:uiPriority="50"/&gt;&lt;w:lsdException w:name="Grid Table 6 Colorful Accent 6" w:uiPriority="51"/&gt;&lt;w:lsdException w:name="Grid Table 7 Colorful Accent 6" w:uiPriority="52"/&gt;&lt;w:lsdException w:name="List Table 1 Light" w:uiPriority="46"/&gt;&lt;w:lsdException w:name="List Table 2" w:uiPriority="47"/&gt;&lt;w:lsdException w:name="List Table 3" w:uiPriority="48"/&gt;&lt;w:lsdException w:name="List Table 4" w:uiPriority="49"/&gt;&lt;w:lsdException w:name="List Table 5 Dark" w:uiPriority="50"/&gt;&lt;w:lsdException w:name="List Table 6 Colorful" w:uiPriority="51"/&gt;&lt;w:lsdException w:name="List Table 7 Colorful" w:uiPriority="52"/&gt;&lt;w:lsdException w:name="List Table 1 Light Accent 1" w:uiPriority="46"/&gt;&lt;w:lsdException w:name="List Table 2 Accent 1" w:uiPriority="47"/&gt;&lt;w:lsdException w:name="List Table 3 Accent 1" w:uiPriority="48"/&gt;&lt;w:lsdException w:name="List Table 4 Accent 1" w:uiPriority="49"/&gt;&lt;w:lsdException w:name="List Table 5 Dark Accent 1" w:uiPriority="50"/&gt;&lt;w:lsdException w:name="List Table 6 Colorful Accent 1" w:uiPriority="51"/&gt;&lt;w:lsdException w:name="List Table 7 Colorful Accent 1" w:uiPriority="52"/&gt;&lt;w:lsdException w:name="List Table 1 Light Accent 2" w:uiPriority="46"/&gt;&lt;w:lsdException w:name="List Table 2 Accent 2" w:uiPriority="47"/&gt;&lt;w:lsdException w:name="List Table 3 Accent 2" w:uiPriority="48"/&gt;&lt;w:lsdException w:name="List Table 4 Accent 2" w:uiPriority="49"/&gt;&lt;w:lsdException w:name="List Table 5 Dark Accent 2" w:uiPriority="50"/&gt;&lt;w:lsdException w:name="List Table 6 Colorful Accent 2" w:uiPriority="51"/&gt;&lt;w:lsdException w:name="List Table 7 Colorful Accent 2" w:uiPriority="52"/&gt;&lt;w:lsdException w:name="List Table 1 Light Accent 3" w:uiPriority="46"/&gt;&lt;w:lsdException w:name="List Table 2 Accent 3" w:uiPriority="47"/&gt;&lt;w:lsdException w:name="List Table 3 Accent 3" w:uiPriority="48"/&gt;&lt;w:lsdException w:name="List Table 4 Accent 3" w:uiPriority="49"/&gt;&lt;w:lsdException w:name="List Table 5 Dark Accent 3" w:uiPriority="50"/&gt;&lt;w:lsdException w:name="List Table 6 Colorful Accent 3" w:uiPriority="51"/&gt;&lt;w:lsdException w:name="List Table 7 Colorful Accent 3" w:uiPriority="52"/&gt;&lt;w:lsdException w:name="List Table 1 Light Accent 4" w:uiPriority="46"/&gt;&lt;w:lsdException w:name="List Table 2 Accent 4" w:uiPriority="47"/&gt;&lt;w:lsdException w:name="List Table 3 Accent 4" w:uiPriority="48"/&gt;&lt;w:lsdException w:name="List Table 4 Accent 4" w:uiPriority="49"/&gt;&lt;w:lsdException w:name="List Table 5 Dark Accent 4" w:uiPriority="50"/&gt;&lt;w:lsdException w:name="List Table 6 Colorful Accent 4" w:uiPriority="51"/&gt;&lt;w:lsdException w:name="List Table 7 Colorful Accent 4" w:uiPriority="52"/&gt;&lt;w:lsdException w:name="List Table 1 Light Accent 5" w:uiPriority="46"/&gt;&lt;w:lsdException w:name="List Table 2 Accent 5" w:uiPriority="47"/&gt;&lt;w:lsdException w:name="List Table 3 Accent 5" w:uiPriority="48"/&gt;&lt;w:lsdException w:name="List Table 4 Accent 5" w:uiPriority="49"/&gt;&lt;w:lsdException w:name="List Table 5 Dark Accent 5" w:uiPriority="50"/&gt;&lt;w:lsdException w:name="List Table 6 Colorful Accent 5" w:uiPriority="51"/&gt;&lt;w:lsdException w:name="List Table 7 Colorful Accent 5" w:uiPriority="52"/&gt;&lt;w:lsdException w:name="List Table 1 Light Accent 6" w:uiPriority="46"/&gt;&lt;w:lsdException w:name="List Table 2 Accent 6" w:uiPriority="47"/&gt;&lt;w:lsdException w:name="List Table 3 Accent 6" w:uiPriority="48"/&gt;&lt;w:lsdException w:name="List Table 4 Accent 6" w:uiPriority="49"/&gt;&lt;w:lsdException w:name="List Table 5 Dark Accent 6" w:uiPriority="50"/&gt;&lt;w:lsdException w:name="List Table 6 Colorful Accent 6" w:uiPriority="51"/&gt;&lt;w:lsdException w:name="List Table 7 Colorful Accent 6" w:uiPriority="52"/&gt;&lt;w:lsdException w:name="Mention" w:semiHidden="1" w:unhideWhenUsed="1"/&gt;&lt;w:lsdException w:name="Smart Hyperlink" w:semiHidden="1" w:unhideWhenUsed="1"/&gt;&lt;w:lsdException w:name="Hashtag" w:semiHidden="1" w:unhideWhenUsed="1"/&gt;&lt;/w:latentStyles&gt;&lt;w:style w:type="paragraph" w:default="1" w:styleId="Normal"&gt;&lt;w:name w:val="Normal"/&gt;&lt;w:qFormat/&gt;&lt;/w:style&gt;&lt;w:style w:type="character" w:default="1" w:styleId="DefaultParagraphFont"&gt;&lt;w:name w:val="Default Paragraph Font"/&gt;&lt;w:uiPriority w:val="1"/&gt;&lt;w:semiHidden/&gt;&lt;w:unhideWhenUsed/&gt;&lt;/w:style&gt;&lt;w:style w:type="table" w:default="1" w:styleId="TableNormal"&gt;&lt;w:name w:val="Normal Table"/&gt;&lt;w:uiPriority w:val="99"/&gt;&lt;w:semiHidden/&gt;&lt;w:unhideWhenUsed/&gt;&lt;w:tblPr&gt;&lt;w:tblInd w:w="0" w:type="dxa"/&gt;&lt;w:tblCellMar&gt;&lt;w:top w:w="0" w:type="dxa"/&gt;&lt;w:left w:w="108" w:type="dxa"/&gt;&lt;w:bottom w:w="0" w:type="dxa"/&gt;&lt;w:right w:w="108" w:type="dxa"/&gt;&lt;/w:tblCellMar&gt;&lt;/w:tblPr&gt;&lt;/w:style&gt;&lt;w:style w:type="numbering" w:default="1" w:styleId="NoList"&gt;&lt;w:name w:val="No List"/&gt;&lt;w:uiPriority w:val="99"/&gt;&lt;w:semiHidden/&gt;&lt;w:unhideWhenUsed/&gt;&lt;/w:style&gt;&lt;w:style w:type="character" w:styleId="PlaceholderText"&gt;&lt;w:name w:val="Placeholder Text"/&gt;&lt;w:basedOn w:val="DefaultParagraphFont"/&gt;&lt;w:uiPriority w:val="99"/&gt;&lt;w:rPr&gt;&lt;w:color w:val="7F7F7F" w:themeColor="text1" w:themeTint="80"/&gt;&lt;w:bdr w:val="none" w:sz="0" w:space="0" w:color="auto"/&gt;&lt;w:shd w:val="clear" w:color="auto" w:fill="F0F0F0"/&gt;&lt;/w:rPr&gt;&lt;/w:style&gt;&lt;w:style w:type="paragraph" w:customStyle="1" w:styleId="F25D791C5B2F4E19930DB86356413466"&gt;&lt;w:name w:val="F25D791C5B2F4E19930DB86356413466"/&gt;&lt;/w:style&gt;&lt;/w:styles&gt;&lt;/pkg:xmlData&gt;&lt;/pkg:part&gt;&lt;pkg:part pkg:name="/word/styles.xml" pkg:contentType="application/vnd.openxmlformats-officedocument.wordprocessingml.styles+xml"&gt;&lt;pkg:xmlData&gt;&lt;w:styles xmlns:mc="http://schemas.openxmlformats.org/markup-compatibility/2006" xmlns:r="http://schemas.openxmlformats.org/officeDocument/2006/relationships" xmlns:w="http://schemas.openxmlformats.org/wordprocessingml/2006/main" xmlns:w14="http://schemas.microsoft.com/office/word/2010/wordml" xmlns:w15="http://schemas.microsoft.com/office/word/2012/wordml" xmlns:w16se="http://schemas.microsoft.com/office/word/2015/wordml/symex" mc:Ignorable="w14 w15 w16se"&gt;&lt;w:docDefaults&gt;&lt;w:rPrDefault&gt;&lt;w:rPr&gt;&lt;w:rFonts w:asciiTheme="minorHAnsi" w:eastAsiaTheme="minorEastAsia" w:hAnsiTheme="minorHAnsi" w:cstheme="minorBidi"/&gt;&lt;w:sz w:val="19"/&gt;&lt;w:szCs w:val="19"/&gt;&lt;w:lang w:val="sv-SE" w:eastAsia="en-US" w:bidi="ar-SA"/&gt;&lt;/w:rPr&gt;&lt;/w:rPrDefault&gt;&lt;w:pPrDefault&gt;&lt;w:pPr&gt;&lt;w:spacing w:after="160" w:line="288" w:lineRule="auto"/&gt;&lt;/w:pPr&gt;&lt;/w:pPrDefault&gt;&lt;/w:docDefaults&gt;&lt;w:style w:type="paragraph" w:default="1" w:styleId="Normal"&gt;&lt;w:name w:val="Normal"/&gt;&lt;w:qFormat/&gt;&lt;w:rsid w:val="005F186C"/&gt;&lt;w:pPr&gt;&lt;w:spacing w:after="200"/&gt;&lt;/w:pPr&gt;&lt;w:rPr&gt;&lt;w:sz w:val="20"/&gt;&lt;w:lang w:val="en-GB"/&gt;&lt;/w:rPr&gt;&lt;/w:style&gt;&lt;w:style w:type="paragraph" w:styleId="Heading1"&gt;&lt;w:name w:val="heading 1"/&gt;&lt;w:basedOn w:val="Normal"/&gt;&lt;w:next w:val="Normal"/&gt;&lt;w:link w:val="Heading1Char"/&gt;&lt;w:uiPriority w:val="9"/&gt;&lt;w:qFormat/&gt;&lt;w:rsid w:val="000C3604"/&gt;&lt;w:pPr&gt;&lt;w:keepNext/&gt;&lt;w:keepLines/&gt;&lt;w:spacing w:before="240"/&gt;&lt;w:outlineLvl w:val="0"/&gt;&lt;/w:pPr&gt;&lt;w:rPr&gt;&lt;w:rFonts w:asciiTheme="majorHAnsi" w:eastAsiaTheme="majorEastAsia" w:hAnsiTheme="majorHAnsi" w:cstheme="majorBidi"/&gt;&lt;w:bCs/&gt;&lt;w:sz w:val="28"/&gt;&lt;w:szCs w:val="28"/&gt;&lt;/w:rPr&gt;&lt;/w:style&gt;&lt;w:style w:type="paragraph" w:styleId="Heading2"&gt;&lt;w:name w:val="heading 2"/&gt;&lt;w:basedOn w:val="Normal"/&gt;&lt;w:next w:val="Normal"/&gt;&lt;w:link w:val="Heading2Char"/&gt;&lt;w:uiPriority w:val="9"/&gt;&lt;w:qFormat/&gt;&lt;w:rsid w:val="000C3604"/&gt;&lt;w:pPr&gt;&lt;w:keepNext/&gt;&lt;w:keepLines/&gt;&lt;w:spacing w:before="240" w:after="80"/&gt;&lt;w:outlineLvl w:val="1"/&gt;&lt;/w:pPr&gt;&lt;w:rPr&gt;&lt;w:rFonts w:ascii="GothamMedium" w:eastAsiaTheme="majorEastAsia" w:hAnsi="GothamMedium" w:cstheme="majorBidi"/&gt;&lt;w:bCs/&gt;&lt;w:sz w:val="24"/&gt;&lt;w:szCs w:val="28"/&gt;&lt;/w:rPr&gt;&lt;/w:style&gt;&lt;w:style w:type="paragraph" w:styleId="Heading3"&gt;&lt;w:name w:val="heading 3"/&gt;&lt;w:basedOn w:val="Normal"/&gt;&lt;w:next w:val="Normal"/&gt;&lt;w:link w:val="Heading3Char"/&gt;&lt;w:uiPriority w:val="9"/&gt;&lt;w:qFormat/&gt;&lt;w:rsid w:val="00872413"/&gt;&lt;w:pPr&gt;&lt;w:keepNext/&gt;&lt;w:keepLines/&gt;&lt;w:spacing w:before="120" w:after="40"/&gt;&lt;w:outlineLvl w:val="2"/&gt;&lt;/w:pPr&gt;&lt;w:rPr&gt;&lt;w:rFonts w:ascii="GothamMedium" w:eastAsiaTheme="majorEastAsia" w:hAnsi="GothamMedium" w:cstheme="majorBidi"/&gt;&lt;w:sz w:val="22"/&gt;&lt;w:szCs w:val="24"/&gt;&lt;/w:rPr&gt;&lt;/w:style&gt;&lt;w:style w:type="paragraph" w:styleId="Heading4"&gt;&lt;w:name w:val="heading 4"/&gt;&lt;w:basedOn w:val="Normal"/&gt;&lt;w:next w:val="Normal"/&gt;&lt;w:link w:val="Heading4Char"/&gt;&lt;w:uiPriority w:val="9"/&gt;&lt;w:semiHidden/&gt;&lt;w:qFormat/&gt;&lt;w:rsid w:val="00872413"/&gt;&lt;w:pPr&gt;&lt;w:keepNext/&gt;&lt;w:keepLines/&gt;&lt;w:spacing w:before="120" w:after="40"/&gt;&lt;w:outlineLvl w:val="3"/&gt;&lt;/w:pPr&gt;&lt;w:rPr&gt;&lt;w:rFonts w:ascii="GothamMedium" w:eastAsiaTheme="majorEastAsia" w:hAnsi="GothamMedium" w:cstheme="majorBidi"/&gt;&lt;w:iCs/&gt;&lt;w:szCs w:val="24"/&gt;&lt;/w:rPr&gt;&lt;/w:style&gt;&lt;w:style w:type="paragraph" w:styleId="Heading5"&gt;&lt;w:name w:val="heading 5"/&gt;&lt;w:basedOn w:val="Normal"/&gt;&lt;w:next w:val="Normal"/&gt;&lt;w:link w:val="Heading5Char"/&gt;&lt;w:uiPriority w:val="9"/&gt;&lt;w:semiHidden/&gt;&lt;w:qFormat/&gt;&lt;w:rsid w:val="009B1B65"/&gt;&lt;w:pPr&gt;&lt;w:keepNext/&gt;&lt;w:keepLines/&gt;&lt;w:numPr&gt;&lt;w:ilvl w:val="4"/&gt;&lt;w:numId w:val="15"/&gt;&lt;/w:numPr&gt;&lt;w:spacing w:before="120" w:after="0"/&gt;&lt;w:outlineLvl w:val="4"/&gt;&lt;/w:pPr&gt;&lt;w:rPr&gt;&lt;w:rFonts w:asciiTheme="majorHAnsi" w:eastAsiaTheme="majorEastAsia" w:hAnsiTheme="majorHAnsi" w:cstheme="majorBidi"/&gt;&lt;w:b/&gt;&lt;w:bCs/&gt;&lt;/w:rPr&gt;&lt;/w:style&gt;&lt;w:style w:type="paragraph" w:styleId="Heading6"&gt;&lt;w:name w:val="heading 6"/&gt;&lt;w:basedOn w:val="Normal"/&gt;&lt;w:next w:val="Normal"/&gt;&lt;w:link w:val="Heading6Char"/&gt;&lt;w:uiPriority w:val="9"/&gt;&lt;w:semiHidden/&gt;&lt;w:rsid w:val="009B1B65"/&gt;&lt;w:pPr&gt;&lt;w:keepNext/&gt;&lt;w:keepLines/&gt;&lt;w:numPr&gt;&lt;w:ilvl w:val="5"/&gt;&lt;w:numId w:val="15"/&gt;&lt;/w:numPr&gt;&lt;w:spacing w:before="120" w:after="0"/&gt;&lt;w:outlineLvl w:val="5"/&gt;&lt;/w:pPr&gt;&lt;w:rPr&gt;&lt;w:rFonts w:asciiTheme="majorHAnsi" w:eastAsiaTheme="majorEastAsia" w:hAnsiTheme="majorHAnsi" w:cstheme="majorBidi"/&gt;&lt;w:b/&gt;&lt;w:bCs/&gt;&lt;w:i/&gt;&lt;w:iCs/&gt;&lt;/w:rPr&gt;&lt;/w:style&gt;&lt;w:style w:type="paragraph" w:styleId="Heading7"&gt;&lt;w:name w:val="heading 7"/&gt;&lt;w:basedOn w:val="Normal"/&gt;&lt;w:next w:val="Normal"/&gt;&lt;w:link w:val="Heading7Char"/&gt;&lt;w:uiPriority w:val="9"/&gt;&lt;w:semiHidden/&gt;&lt;w:rsid w:val="009B1B65"/&gt;&lt;w:pPr&gt;&lt;w:keepNext/&gt;&lt;w:keepLines/&gt;&lt;w:numPr&gt;&lt;w:ilvl w:val="6"/&gt;&lt;w:numId w:val="15"/&gt;&lt;/w:numPr&gt;&lt;w:spacing w:before="120" w:after="0"/&gt;&lt;w:outlineLvl w:val="6"/&gt;&lt;/w:pPr&gt;&lt;w:rPr&gt;&lt;w:i/&gt;&lt;w:iCs/&gt;&lt;/w:rPr&gt;&lt;/w:style&gt;&lt;w:style w:type="paragraph" w:styleId="Heading8"&gt;&lt;w:name w:val="heading 8"/&gt;&lt;w:basedOn w:val="Normal"/&gt;&lt;w:next w:val="Normal"/&gt;&lt;w:link w:val="Heading8Char"/&gt;&lt;w:uiPriority w:val="9"/&gt;&lt;w:semiHidden/&gt;&lt;w:rsid w:val="009B1B65"/&gt;&lt;w:pPr&gt;&lt;w:keepNext/&gt;&lt;w:keepLines/&gt;&lt;w:numPr&gt;&lt;w:ilvl w:val="7"/&gt;&lt;w:numId w:val="15"/&gt;&lt;/w:numPr&gt;&lt;w:spacing w:before="120" w:after="0"/&gt;&lt;w:outlineLvl w:val="7"/&gt;&lt;/w:pPr&gt;&lt;w:rPr&gt;&lt;w:b/&gt;&lt;w:bCs/&gt;&lt;/w:rPr&gt;&lt;/w:style&gt;&lt;w:style w:type="paragraph" w:styleId="Heading9"&gt;&lt;w:name w:val="heading 9"/&gt;&lt;w:basedOn w:val="Normal"/&gt;&lt;w:next w:val="Normal"/&gt;&lt;w:link w:val="Heading9Char"/&gt;&lt;w:uiPriority w:val="9"/&gt;&lt;w:semiHidden/&gt;&lt;w:rsid w:val="009B1B65"/&gt;&lt;w:pPr&gt;&lt;w:keepNext/&gt;&lt;w:keepLines/&gt;&lt;w:numPr&gt;&lt;w:ilvl w:val="8"/&gt;&lt;w:numId w:val="15"/&gt;&lt;/w:numPr&gt;&lt;w:spacing w:before="120" w:after="0"/&gt;&lt;w:outlineLvl w:val="8"/&gt;&lt;/w:pPr&gt;&lt;w:rPr&gt;&lt;w:i/&gt;&lt;w:iCs/&gt;&lt;/w:rPr&gt;&lt;/w:style&gt;&lt;w:style w:type="character" w:default="1" w:styleId="DefaultParagraphFont"&gt;&lt;w:name w:val="Default Paragraph Font"/&gt;&lt;w:uiPriority w:val="1"/&gt;&lt;w:semiHidden/&gt;&lt;w:unhideWhenUsed/&gt;&lt;/w:style&gt;&lt;w:style w:type="table" w:default="1" w:styleId="TableNormal"&gt;&lt;w:name w:val="Normal Table"/&gt;&lt;w:uiPriority w:val="99"/&gt;&lt;w:semiHidden/&gt;&lt;w:unhideWhenUsed/&gt;&lt;w:tblPr&gt;&lt;w:tblInd w:w="0" w:type="dxa"/&gt;&lt;w:tblCellMar&gt;&lt;w:top w:w="0" w:type="dxa"/&gt;&lt;w:left w:w="108" w:type="dxa"/&gt;&lt;w:bottom w:w="0" w:type="dxa"/&gt;&lt;w:right w:w="108" w:type="dxa"/&gt;&lt;/w:tblCellMar&gt;&lt;/w:tblPr&gt;&lt;/w:style&gt;&lt;w:style w:type="numbering" w:default="1" w:styleId="NoList"&gt;&lt;w:name w:val="No List"/&gt;&lt;w:uiPriority w:val="99"/&gt;&lt;w:semiHidden/&gt;&lt;w:unhideWhenUsed/&gt;&lt;/w:style&gt;&lt;w:style w:type="character" w:customStyle="1" w:styleId="Heading1Char"&gt;&lt;w:name w:val="Heading 1 Char"/&gt;&lt;w:basedOn w:val="DefaultParagraphFont"/&gt;&lt;w:link w:val="Heading1"/&gt;&lt;w:uiPriority w:val="9"/&gt;&lt;w:rsid w:val="000C3604"/&gt;&lt;w:rPr&gt;&lt;w:rFonts w:asciiTheme="majorHAnsi" w:eastAsiaTheme="majorEastAsia" w:hAnsiTheme="majorHAnsi" w:cstheme="majorBidi"/&gt;&lt;w:bCs/&gt;&lt;w:sz w:val="28"/&gt;&lt;w:szCs w:val="28"/&gt;&lt;w:lang w:val="en-GB"/&gt;&lt;/w:rPr&gt;&lt;/w:style&gt;&lt;w:style w:type="character" w:customStyle="1" w:styleId="Heading2Char"&gt;&lt;w:name w:val="Heading 2 Char"/&gt;&lt;w:basedOn w:val="DefaultParagraphFont"/&gt;&lt;w:link w:val="Heading2"/&gt;&lt;w:uiPriority w:val="9"/&gt;&lt;w:rsid w:val="000C3604"/&gt;&lt;w:rPr&gt;&lt;w:rFonts w:ascii="GothamMedium" w:eastAsiaTheme="majorEastAsia" w:hAnsi="GothamMedium" w:cstheme="majorBidi"/&gt;&lt;w:bCs/&gt;&lt;w:sz w:val="24"/&gt;&lt;w:szCs w:val="28"/&gt;&lt;w:lang w:val="en-GB"/&gt;&lt;/w:rPr&gt;&lt;/w:style&gt;&lt;w:style w:type="character" w:customStyle="1" w:styleId="Heading3Char"&gt;&lt;w:name w:val="Heading 3 Char"/&gt;&lt;w:basedOn w:val="DefaultParagraphFont"/&gt;&lt;w:link w:val="Heading3"/&gt;&lt;w:uiPriority w:val="9"/&gt;&lt;w:rsid w:val="00872413"/&gt;&lt;w:rPr&gt;&lt;w:rFonts w:ascii="GothamMedium" w:eastAsiaTheme="majorEastAsia" w:hAnsi="GothamMedium" w:cstheme="majorBidi"/&gt;&lt;w:sz w:val="22"/&gt;&lt;w:szCs w:val="24"/&gt;&lt;w:lang w:val="en-GB"/&gt;&lt;/w:rPr&gt;&lt;/w:style&gt;&lt;w:style w:type="character" w:customStyle="1" w:styleId="Heading4Char"&gt;&lt;w:name w:val="Heading 4 Char"/&gt;&lt;w:basedOn w:val="DefaultParagraphFont"/&gt;&lt;w:link w:val="Heading4"/&gt;&lt;w:uiPriority w:val="9"/&gt;&lt;w:semiHidden/&gt;&lt;w:rsid w:val="005F186C"/&gt;&lt;w:rPr&gt;&lt;w:rFonts w:ascii="GothamMedium" w:eastAsiaTheme="majorEastAsia" w:hAnsi="GothamMedium" w:cstheme="majorBidi"/&gt;&lt;w:iCs/&gt;&lt;w:sz w:val="20"/&gt;&lt;w:szCs w:val="24"/&gt;&lt;w:lang w:val="en-GB"/&gt;&lt;/w:rPr&gt;&lt;/w:style&gt;&lt;w:style w:type="character" w:customStyle="1" w:styleId="Heading5Char"&gt;&lt;w:name w:val="Heading 5 Char"/&gt;&lt;w:basedOn w:val="DefaultParagraphFont"/&gt;&lt;w:link w:val="Heading5"/&gt;&lt;w:uiPriority w:val="9"/&gt;&lt;w:semiHidden/&gt;&lt;w:rsid w:val="008E716E"/&gt;&lt;w:rPr&gt;&lt;w:rFonts w:asciiTheme="majorHAnsi" w:eastAsiaTheme="majorEastAsia" w:hAnsiTheme="majorHAnsi" w:cstheme="majorBidi"/&gt;&lt;w:b/&gt;&lt;w:bCs/&gt;&lt;w:lang w:val="en-GB"/&gt;&lt;/w:rPr&gt;&lt;/w:style&gt;&lt;w:style w:type="character" w:customStyle="1" w:styleId="Heading6Char"&gt;&lt;w:name w:val="Heading 6 Char"/&gt;&lt;w:basedOn w:val="DefaultParagraphFont"/&gt;&lt;w:link w:val="Heading6"/&gt;&lt;w:uiPriority w:val="9"/&gt;&lt;w:semiHidden/&gt;&lt;w:rsid w:val="008E716E"/&gt;&lt;w:rPr&gt;&lt;w:rFonts w:asciiTheme="majorHAnsi" w:eastAsiaTheme="majorEastAsia" w:hAnsiTheme="majorHAnsi" w:cstheme="majorBidi"/&gt;&lt;w:b/&gt;&lt;w:bCs/&gt;&lt;w:i/&gt;&lt;w:iCs/&gt;&lt;w:lang w:val="en-GB"/&gt;&lt;/w:rPr&gt;&lt;/w:style&gt;&lt;w:style w:type="character" w:customStyle="1" w:styleId="Heading7Char"&gt;&lt;w:name w:val="Heading 7 Char"/&gt;&lt;w:basedOn w:val="DefaultParagraphFont"/&gt;&lt;w:link w:val="Heading7"/&gt;&lt;w:uiPriority w:val="9"/&gt;&lt;w:semiHidden/&gt;&lt;w:rsid w:val="008E716E"/&gt;&lt;w:rPr&gt;&lt;w:i/&gt;&lt;w:iCs/&gt;&lt;w:lang w:val="en-GB"/&gt;&lt;/w:rPr&gt;&lt;/w:style&gt;&lt;w:style w:type="character" w:customStyle="1" w:styleId="Heading8Char"&gt;&lt;w:name w:val="Heading 8 Char"/&gt;&lt;w:basedOn w:val="DefaultParagraphFont"/&gt;&lt;w:link w:val="Heading8"/&gt;&lt;w:uiPriority w:val="9"/&gt;&lt;w:semiHidden/&gt;&lt;w:rsid w:val="008E716E"/&gt;&lt;w:rPr&gt;&lt;w:b/&gt;&lt;w:bCs/&gt;&lt;w:lang w:val="en-GB"/&gt;&lt;/w:rPr&gt;&lt;/w:style&gt;&lt;w:style w:type="character" w:customStyle="1" w:styleId="Heading9Char"&gt;&lt;w:name w:val="Heading 9 Char"/&gt;&lt;w:basedOn w:val="DefaultParagraphFont"/&gt;&lt;w:link w:val="Heading9"/&gt;&lt;w:uiPriority w:val="9"/&gt;&lt;w:semiHidden/&gt;&lt;w:rsid w:val="008E716E"/&gt;&lt;w:rPr&gt;&lt;w:i/&gt;&lt;w:iCs/&gt;&lt;w:lang w:val="en-GB"/&gt;&lt;/w:rPr&gt;&lt;/w:style&gt;&lt;w:style w:type="paragraph" w:styleId="Caption"&gt;&lt;w:name w:val="caption"/&gt;&lt;w:basedOn w:val="Normal"/&gt;&lt;w:next w:val="Normal"/&gt;&lt;w:uiPriority w:val="35"/&gt;&lt;w:semiHidden/&gt;&lt;w:rsid w:val="009B1B65"/&gt;&lt;w:rPr&gt;&lt;w:b/&gt;&lt;w:bCs/&gt;&lt;w:sz w:val="18"/&gt;&lt;w:szCs w:val="18"/&gt;&lt;/w:rPr&gt;&lt;/w:style&gt;&lt;w:style w:type="paragraph" w:styleId="Title"&gt;&lt;w:name w:val="Title"/&gt;&lt;w:basedOn w:val="Normal"/&gt;&lt;w:next w:val="Normal"/&gt;&lt;w:link w:val="TitleChar"/&gt;&lt;w:uiPriority w:val="10"/&gt;&lt;w:semiHidden/&gt;&lt;w:qFormat/&gt;&lt;w:rsid w:val="00872413"/&gt;&lt;w:pPr&gt;&lt;w:spacing w:after="0"/&gt;&lt;w:contextualSpacing/&gt;&lt;/w:pPr&gt;&lt;w:rPr&gt;&lt;w:rFonts w:asciiTheme="majorHAnsi" w:eastAsiaTheme="majorEastAsia" w:hAnsiTheme="majorHAnsi" w:cstheme="majorBidi"/&gt;&lt;w:bCs/&gt;&lt;w:color w:val="407077" w:themeColor="accent1"/&gt;&lt;w:sz w:val="72"/&gt;&lt;w:szCs w:val="48"/&gt;&lt;/w:rPr&gt;&lt;/w:style&gt;&lt;w:style w:type="character" w:customStyle="1" w:styleId="TitleChar"&gt;&lt;w:name w:val="Title Char"/&gt;&lt;w:basedOn w:val="DefaultParagraphFont"/&gt;&lt;w:link w:val="Title"/&gt;&lt;w:uiPriority w:val="10"/&gt;&lt;w:semiHidden/&gt;&lt;w:rsid w:val="005F186C"/&gt;&lt;w:rPr&gt;&lt;w:rFonts w:asciiTheme="majorHAnsi" w:eastAsiaTheme="majorEastAsia" w:hAnsiTheme="majorHAnsi" w:cstheme="majorBidi"/&gt;&lt;w:bCs/&gt;&lt;w:color w:val="407077" w:themeColor="accent1"/&gt;&lt;w:sz w:val="72"/&gt;&lt;w:szCs w:val="48"/&gt;&lt;w:lang w:val="en-GB"/&gt;&lt;/w:rPr&gt;&lt;/w:style&gt;&lt;w:style w:type="paragraph" w:styleId="Subtitle"&gt;&lt;w:name w:val="Subtitle"/&gt;&lt;w:basedOn w:val="Normal"/&gt;&lt;w:next w:val="Normal"/&gt;&lt;w:link w:val="SubtitleChar"/&gt;&lt;w:uiPriority w:val="11"/&gt;&lt;w:semiHidden/&gt;&lt;w:qFormat/&gt;&lt;w:rsid w:val="00872413"/&gt;&lt;w:pPr&gt;&lt;w:numPr&gt;&lt;w:ilvl w:val="1"/&gt;&lt;/w:numPr&gt;&lt;w:spacing w:before="120" w:after="240"/&gt;&lt;/w:pPr&gt;&lt;w:rPr&gt;&lt;w:rFonts w:ascii="GothamMedium" w:eastAsiaTheme="majorEastAsia" w:hAnsi="GothamMedium" w:cstheme="majorBidi"/&gt;&lt;w:color w:val="343436" w:themeColor="text2"/&gt;&lt;w:sz w:val="24"/&gt;&lt;w:szCs w:val="24"/&gt;&lt;/w:rPr&gt;&lt;/w:style&gt;&lt;w:style w:type="character" w:customStyle="1" w:styleId="SubtitleChar"&gt;&lt;w:name w:val="Subtitle Char"/&gt;&lt;w:basedOn w:val="DefaultParagraphFont"/&gt;&lt;w:link w:val="Subtitle"/&gt;&lt;w:uiPriority w:val="11"/&gt;&lt;w:semiHidden/&gt;&lt;w:rsid w:val="005F186C"/&gt;&lt;w:rPr&gt;&lt;w:rFonts w:ascii="GothamMedium" w:eastAsiaTheme="majorEastAsia" w:hAnsi="GothamMedium" w:cstheme="majorBidi"/&gt;&lt;w:color w:val="343436" w:themeColor="text2"/&gt;&lt;w:sz w:val="24"/&gt;&lt;w:szCs w:val="24"/&gt;&lt;w:lang w:val="en-GB"/&gt;&lt;/w:rPr&gt;&lt;/w:style&gt;&lt;w:style w:type="character" w:styleId="Strong"&gt;&lt;w:name w:val="Strong"/&gt;&lt;w:basedOn w:val="DefaultParagraphFont"/&gt;&lt;w:uiPriority w:val="22"/&gt;&lt;w:semiHidden/&gt;&lt;w:rsid w:val="009B1B65"/&gt;&lt;w:rPr&gt;&lt;w:b/&gt;&lt;w:bCs/&gt;&lt;w:color w:val="auto"/&gt;&lt;/w:rPr&gt;&lt;/w:style&gt;&lt;w:style w:type="character" w:styleId="Emphasis"&gt;&lt;w:name w:val="Emphasis"/&gt;&lt;w:basedOn w:val="DefaultParagraphFont"/&gt;&lt;w:uiPriority w:val="20"/&gt;&lt;w:semiHidden/&gt;&lt;w:rsid w:val="009B1B65"/&gt;&lt;w:rPr&gt;&lt;w:i/&gt;&lt;w:iCs/&gt;&lt;w:color w:val="auto"/&gt;&lt;/w:rPr&gt;&lt;/w:style&gt;&lt;w:style w:type="paragraph" w:styleId="NoSpacing"&gt;&lt;w:name w:val="No Spacing"/&gt;&lt;w:link w:val="NoSpacingChar"/&gt;&lt;w:uiPriority w:val="1"/&gt;&lt;w:qFormat/&gt;&lt;w:rsid w:val="00EA5662"/&gt;&lt;w:pPr&gt;&lt;w:spacing w:after="0"/&gt;&lt;/w:pPr&gt;&lt;/w:style&gt;&lt;w:style w:type="paragraph" w:styleId="Quote"&gt;&lt;w:name w:val="Quote"/&gt;&lt;w:basedOn w:val="Normal"/&gt;&lt;w:next w:val="Normal"/&gt;&lt;w:link w:val="QuoteChar"/&gt;&lt;w:uiPriority w:val="29"/&gt;&lt;w:semiHidden/&gt;&lt;w:rsid w:val="009B1B65"/&gt;&lt;w:pPr&gt;&lt;w:spacing w:before="200" w:line="264" w:lineRule="auto"/&gt;&lt;w:ind w:left="864" w:right="864"/&gt;&lt;w:jc w:val="center"/&gt;&lt;/w:pPr&gt;&lt;w:rPr&gt;&lt;w:rFonts w:asciiTheme="majorHAnsi" w:eastAsiaTheme="majorEastAsia" w:hAnsiTheme="majorHAnsi" w:cstheme="majorBidi"/&gt;&lt;w:i/&gt;&lt;w:iCs/&gt;&lt;w:sz w:val="24"/&gt;&lt;w:szCs w:val="24"/&gt;&lt;/w:rPr&gt;&lt;/w:style&gt;&lt;w:style w:type="character" w:customStyle="1" w:styleId="QuoteChar"&gt;&lt;w:name w:val="Quote Char"/&gt;&lt;w:basedOn w:val="DefaultParagraphFont"/&gt;&lt;w:link w:val="Quote"/&gt;&lt;w:uiPriority w:val="29"/&gt;&lt;w:semiHidden/&gt;&lt;w:rsid w:val="009B1B65"/&gt;&lt;w:rPr&gt;&lt;w:rFonts w:asciiTheme="majorHAnsi" w:eastAsiaTheme="majorEastAsia" w:hAnsiTheme="majorHAnsi" w:cstheme="majorBidi"/&gt;&lt;w:i/&gt;&lt;w:iCs/&gt;&lt;w:sz w:val="24"/&gt;&lt;w:szCs w:val="24"/&gt;&lt;/w:rPr&gt;&lt;/w:style&gt;&lt;w:style w:type="paragraph" w:styleId="IntenseQuote"&gt;&lt;w:name w:val="Intense Quote"/&gt;&lt;w:basedOn w:val="Normal"/&gt;&lt;w:next w:val="Normal"/&gt;&lt;w:link w:val="IntenseQuoteChar"/&gt;&lt;w:uiPriority w:val="30"/&gt;&lt;w:semiHidden/&gt;&lt;w:rsid w:val="009B1B65"/&gt;&lt;w:pPr&gt;&lt;w:spacing w:before="100" w:beforeAutospacing="1" w:after="240"/&gt;&lt;w:ind w:left="936" w:right="936"/&gt;&lt;w:jc w:val="center"/&gt;&lt;/w:pPr&gt;&lt;w:rPr&gt;&lt;w:rFonts w:asciiTheme="majorHAnsi" w:eastAsiaTheme="majorEastAsia" w:hAnsiTheme="majorHAnsi" w:cstheme="majorBidi"/&gt;&lt;w:sz w:val="26"/&gt;&lt;w:szCs w:val="26"/&gt;&lt;/w:rPr&gt;&lt;/w:style&gt;&lt;w:style w:type="character" w:customStyle="1" w:styleId="IntenseQuoteChar"&gt;&lt;w:name w:val="Intense Quote Char"/&gt;&lt;w:basedOn w:val="DefaultParagraphFont"/&gt;&lt;w:link w:val="IntenseQuote"/&gt;&lt;w:uiPriority w:val="30"/&gt;&lt;w:semiHidden/&gt;&lt;w:rsid w:val="009B1B65"/&gt;&lt;w:rPr&gt;&lt;w:rFonts w:asciiTheme="majorHAnsi" w:eastAsiaTheme="majorEastAsia" w:hAnsiTheme="majorHAnsi" w:cstheme="majorBidi"/&gt;&lt;w:sz w:val="26"/&gt;&lt;w:szCs w:val="26"/&gt;&lt;/w:rPr&gt;&lt;/w:style&gt;&lt;w:style w:type="character" w:styleId="SubtleEmphasis"&gt;&lt;w:name w:val="Subtle Emphasis"/&gt;&lt;w:basedOn w:val="DefaultParagraphFont"/&gt;&lt;w:uiPriority w:val="19"/&gt;&lt;w:semiHidden/&gt;&lt;w:rsid w:val="009B1B65"/&gt;&lt;w:rPr&gt;&lt;w:i/&gt;&lt;w:iCs/&gt;&lt;w:color w:val="auto"/&gt;&lt;/w:rPr&gt;&lt;/w:style&gt;&lt;w:style w:type="character" w:styleId="IntenseEmphasis"&gt;&lt;w:name w:val="Intense Emphasis"/&gt;&lt;w:basedOn w:val="DefaultParagraphFont"/&gt;&lt;w:uiPriority w:val="21"/&gt;&lt;w:semiHidden/&gt;&lt;w:rsid w:val="009B1B65"/&gt;&lt;w:rPr&gt;&lt;w:b/&gt;&lt;w:bCs/&gt;&lt;w:i/&gt;&lt;w:iCs/&gt;&lt;w:color w:val="auto"/&gt;&lt;/w:rPr&gt;&lt;/w:style&gt;&lt;w:style w:type="character" w:styleId="SubtleReference"&gt;&lt;w:name w:val="Subtle Reference"/&gt;&lt;w:basedOn w:val="DefaultParagraphFont"/&gt;&lt;w:uiPriority w:val="31"/&gt;&lt;w:semiHidden/&gt;&lt;w:rsid w:val="009B1B65"/&gt;&lt;w:rPr&gt;&lt;w:smallCaps/&gt;&lt;w:color w:val="auto"/&gt;&lt;w:u w:val="single" w:color="7F7F7F" w:themeColor="text1" w:themeTint="80"/&gt;&lt;/w:rPr&gt;&lt;/w:style&gt;&lt;w:style w:type="character" w:styleId="IntenseReference"&gt;&lt;w:name w:val="Intense Reference"/&gt;&lt;w:basedOn w:val="DefaultParagraphFont"/&gt;&lt;w:uiPriority w:val="32"/&gt;&lt;w:semiHidden/&gt;&lt;w:rsid w:val="009B1B65"/&gt;&lt;w:rPr&gt;&lt;w:b/&gt;&lt;w:bCs/&gt;&lt;w:smallCaps/&gt;&lt;w:color w:val="auto"/&gt;&lt;w:u w:val="single"/&gt;&lt;/w:rPr&gt;&lt;/w:style&gt;&lt;w:style w:type="character" w:styleId="BookTitle"&gt;&lt;w:name w:val="Book Title"/&gt;&lt;w:basedOn w:val="DefaultParagraphFont"/&gt;&lt;w:uiPriority w:val="33"/&gt;&lt;w:semiHidden/&gt;&lt;w:rsid w:val="009B1B65"/&gt;&lt;w:rPr&gt;&lt;w:b/&gt;&lt;w:bCs/&gt;&lt;w:smallCaps/&gt;&lt;w:color w:val="auto"/&gt;&lt;/w:rPr&gt;&lt;/w:style&gt;&lt;w:style w:type="paragraph" w:styleId="TOCHeading"&gt;&lt;w:name w:val="TOC Heading"/&gt;&lt;w:basedOn w:val="Normal"/&gt;&lt;w:next w:val="Normal"/&gt;&lt;w:uiPriority w:val="39"/&gt;&lt;w:semiHidden/&gt;&lt;w:rsid w:val="009F4214"/&gt;&lt;w:pPr&gt;&lt;w:keepNext/&gt;&lt;w:keepLines/&gt;&lt;w:pageBreakBefore/&gt;&lt;/w:pPr&gt;&lt;w:rPr&gt;&lt;w:rFonts w:asciiTheme="majorHAnsi" w:hAnsiTheme="majorHAnsi"/&gt;&lt;w:b/&gt;&lt;w:sz w:val="32"/&gt;&lt;/w:rPr&gt;&lt;/w:style&gt;&lt;w:style w:type="paragraph" w:styleId="ListBullet"&gt;&lt;w:name w:val="List Bullet"/&gt;&lt;w:basedOn w:val="Normal"/&gt;&lt;w:uiPriority w:val="14"/&gt;&lt;w:qFormat/&gt;&lt;w:rsid w:val="001D4B24"/&gt;&lt;w:pPr&gt;&lt;w:numPr&gt;&lt;w:numId w:val="1"/&gt;&lt;/w:numPr&gt;&lt;w:spacing w:after="80"/&gt;&lt;w:contextualSpacing/&gt;&lt;/w:pPr&gt;&lt;/w:style&gt;&lt;w:style w:type="paragraph" w:styleId="ListNumber"&gt;&lt;w:name w:val="List Number"/&gt;&lt;w:basedOn w:val="Normal"/&gt;&lt;w:uiPriority w:val="14"/&gt;&lt;w:qFormat/&gt;&lt;w:rsid w:val="00223177"/&gt;&lt;w:pPr&gt;&lt;w:numPr&gt;&lt;w:numId w:val="6"/&gt;&lt;/w:numPr&gt;&lt;w:spacing w:after="80"/&gt;&lt;w:ind w:left="357" w:hanging="357"/&gt;&lt;w:contextualSpacing/&gt;&lt;/w:pPr&gt;&lt;/w:style&gt;&lt;w:style w:type="table" w:styleId="TableGrid"&gt;&lt;w:name w:val="Table Grid"/&gt;&lt;w:basedOn w:val="TableNormal"/&gt;&lt;w:uiPriority w:val="39"/&gt;&lt;w:rsid w:val="00572408"/&gt;&lt;w:pPr&gt;&lt;w:spacing w:after="0" w:line="240" w:lineRule="auto"/&gt;&lt;/w:pPr&gt;&lt;w:tblPr/&gt;&lt;/w:style&gt;&lt;w:style w:type="paragraph" w:styleId="FootnoteText"&gt;&lt;w:name w:val="footnote text"/&gt;&lt;w:basedOn w:val="Normal"/&gt;&lt;w:link w:val="FootnoteTextChar"/&gt;&lt;w:uiPriority w:val="99"/&gt;&lt;w:semiHidden/&gt;&lt;w:rsid w:val="00872413"/&gt;&lt;w:pPr&gt;&lt;w:spacing w:after="0"/&gt;&lt;/w:pPr&gt;&lt;w:rPr&gt;&lt;w:sz w:val="14"/&gt;&lt;w:szCs w:val="20"/&gt;&lt;/w:rPr&gt;&lt;/w:style&gt;&lt;w:style w:type="character" w:customStyle="1" w:styleId="FootnoteTextChar"&gt;&lt;w:name w:val="Footnote Text Char"/&gt;&lt;w:basedOn w:val="DefaultParagraphFont"/&gt;&lt;w:link w:val="FootnoteText"/&gt;&lt;w:uiPriority w:val="99"/&gt;&lt;w:semiHidden/&gt;&lt;w:rsid w:val="005F186C"/&gt;&lt;w:rPr&gt;&lt;w:sz w:val="14"/&gt;&lt;w:szCs w:val="20"/&gt;&lt;w:lang w:val="en-GB"/&gt;&lt;/w:rPr&gt;&lt;/w:style&gt;&lt;w:style w:type="character" w:styleId="FootnoteReference"&gt;&lt;w:name w:val="footnote reference"/&gt;&lt;w:basedOn w:val="DefaultParagraphFont"/&gt;&lt;w:uiPriority w:val="99"/&gt;&lt;w:semiHidden/&gt;&lt;w:rsid w:val="00884E47"/&gt;&lt;w:rPr&gt;&lt;w:vertAlign w:val="superscript"/&gt;&lt;/w:rPr&gt;&lt;/w:style&gt;&lt;w:style w:type="paragraph" w:styleId="Header"&gt;&lt;w:name w:val="header"/&gt;&lt;w:basedOn w:val="Normal"/&gt;&lt;w:link w:val="HeaderChar"/&gt;&lt;w:uiPriority w:val="99"/&gt;&lt;w:semiHidden/&gt;&lt;w:rsid w:val="005F186C"/&gt;&lt;w:pPr&gt;&lt;w:tabs&gt;&lt;w:tab w:val="center" w:pos="4536"/&gt;&lt;w:tab w:val="right" w:pos="9072"/&gt;&lt;/w:tabs&gt;&lt;w:spacing w:after="0" w:line="240" w:lineRule="auto"/&gt;&lt;/w:pPr&gt;&lt;w:rPr&gt;&lt;w:color w:val="858585" w:themeColor="accent5"/&gt;&lt;w:sz w:val="16"/&gt;&lt;/w:rPr&gt;&lt;/w:style&gt;&lt;w:style w:type="character" w:customStyle="1" w:styleId="HeaderChar"&gt;&lt;w:name w:val="Header Char"/&gt;&lt;w:basedOn w:val="DefaultParagraphFont"/&gt;&lt;w:link w:val="Header"/&gt;&lt;w:uiPriority w:val="99"/&gt;&lt;w:semiHidden/&gt;&lt;w:rsid w:val="005F186C"/&gt;&lt;w:rPr&gt;&lt;w:color w:val="858585" w:themeColor="accent5"/&gt;&lt;w:sz w:val="16"/&gt;&lt;w:lang w:val="en-GB"/&gt;&lt;/w:rPr&gt;&lt;/w:style&gt;&lt;w:style w:type="paragraph" w:styleId="Footer"&gt;&lt;w:name w:val="footer"/&gt;&lt;w:basedOn w:val="Normal"/&gt;&lt;w:link w:val="FooterChar"/&gt;&lt;w:uiPriority w:val="99"/&gt;&lt;w:semiHidden/&gt;&lt;w:rsid w:val="005F186C"/&gt;&lt;w:pPr&gt;&lt;w:tabs&gt;&lt;w:tab w:val="center" w:pos="4536"/&gt;&lt;w:tab w:val="right" w:pos="9072"/&gt;&lt;/w:tabs&gt;&lt;w:spacing w:after="0" w:line="240" w:lineRule="auto"/&gt;&lt;/w:pPr&gt;&lt;w:rPr&gt;&lt;w:color w:val="858585" w:themeColor="accent5"/&gt;&lt;w:sz w:val="16"/&gt;&lt;/w:rPr&gt;&lt;/w:style&gt;&lt;w:style w:type="character" w:customStyle="1" w:styleId="FooterChar"&gt;&lt;w:name w:val="Footer Char"/&gt;&lt;w:basedOn w:val="DefaultParagraphFont"/&gt;&lt;w:link w:val="Footer"/&gt;&lt;w:uiPriority w:val="99"/&gt;&lt;w:semiHidden/&gt;&lt;w:rsid w:val="005F186C"/&gt;&lt;w:rPr&gt;&lt;w:color w:val="858585" w:themeColor="accent5"/&gt;&lt;w:sz w:val="16"/&gt;&lt;w:lang w:val="en-GB"/&gt;&lt;/w:rPr&gt;&lt;/w:style&gt;&lt;w:style w:type="paragraph" w:styleId="TOC1"&gt;&lt;w:name w:val="toc 1"/&gt;&lt;w:basedOn w:val="Normal"/&gt;&lt;w:next w:val="Normal"/&gt;&lt;w:uiPriority w:val="39"/&gt;&lt;w:semiHidden/&gt;&lt;w:rsid w:val="00421476"/&gt;&lt;w:pPr&gt;&lt;w:tabs&gt;&lt;w:tab w:val="right" w:leader="dot" w:pos="8210"/&gt;&lt;/w:tabs&gt;&lt;w:spacing w:after="100"/&gt;&lt;w:ind w:left="426" w:hanging="426"/&gt;&lt;/w:pPr&gt;&lt;/w:style&gt;&lt;w:style w:type="paragraph" w:styleId="TOC2"&gt;&lt;w:name w:val="toc 2"/&gt;&lt;w:basedOn w:val="Normal"/&gt;&lt;w:next w:val="Normal"/&gt;&lt;w:uiPriority w:val="39"/&gt;&lt;w:semiHidden/&gt;&lt;w:rsid w:val="00EE62A8"/&gt;&lt;w:pPr&gt;&lt;w:tabs&gt;&lt;w:tab w:val="right" w:leader="dot" w:pos="8210"/&gt;&lt;/w:tabs&gt;&lt;w:spacing w:after="100"/&gt;&lt;w:ind w:left="1134" w:hanging="708"/&gt;&lt;/w:pPr&gt;&lt;w:rPr&gt;&lt;w:noProof/&gt;&lt;/w:rPr&gt;&lt;/w:style&gt;&lt;w:style w:type="paragraph" w:styleId="TOC3"&gt;&lt;w:name w:val="toc 3"/&gt;&lt;w:basedOn w:val="Normal"/&gt;&lt;w:next w:val="Normal"/&gt;&lt;w:uiPriority w:val="39"/&gt;&lt;w:semiHidden/&gt;&lt;w:rsid w:val="00EE62A8"/&gt;&lt;w:pPr&gt;&lt;w:tabs&gt;&lt;w:tab w:val="right" w:leader="dot" w:pos="8210"/&gt;&lt;/w:tabs&gt;&lt;w:spacing w:after="100"/&gt;&lt;w:ind w:left="1134" w:hanging="694"/&gt;&lt;/w:pPr&gt;&lt;w:rPr&gt;&lt;w:noProof/&gt;&lt;/w:rPr&gt;&lt;/w:style&gt;&lt;w:style w:type="character" w:styleId="Hyperlink"&gt;&lt;w:name w:val="Hyperlink"/&gt;&lt;w:basedOn w:val="DefaultParagraphFont"/&gt;&lt;w:uiPriority w:val="99"/&gt;&lt;w:semiHidden/&gt;&lt;w:rsid w:val="008555A7"/&gt;&lt;w:rPr&gt;&lt;w:color w:val="A1BF35" w:themeColor="hyperlink"/&gt;&lt;w:u w:val="single"/&gt;&lt;/w:rPr&gt;&lt;/w:style&gt;&lt;w:style w:type="paragraph" w:styleId="TOC4"&gt;&lt;w:name w:val="toc 4"/&gt;&lt;w:basedOn w:val="Normal"/&gt;&lt;w:next w:val="Normal"/&gt;&lt;w:uiPriority w:val="39"/&gt;&lt;w:semiHidden/&gt;&lt;w:rsid w:val="00FF2698"/&gt;&lt;w:pPr&gt;&lt;w:spacing w:after="100"/&gt;&lt;w:ind w:left="660"/&gt;&lt;/w:pPr&gt;&lt;/w:style&gt;&lt;w:style w:type="paragraph" w:styleId="TOC5"&gt;&lt;w:name w:val="toc 5"/&gt;&lt;w:basedOn w:val="Normal"/&gt;&lt;w:next w:val="Normal"/&gt;&lt;w:uiPriority w:val="39"/&gt;&lt;w:semiHidden/&gt;&lt;w:rsid w:val="00FF2698"/&gt;&lt;w:pPr&gt;&lt;w:spacing w:after="100"/&gt;&lt;w:ind w:left="880"/&gt;&lt;/w:pPr&gt;&lt;/w:style&gt;&lt;w:style w:type="paragraph" w:styleId="TOC6"&gt;&lt;w:name w:val="toc 6"/&gt;&lt;w:basedOn w:val="Normal"/&gt;&lt;w:next w:val="Normal"/&gt;&lt;w:uiPriority w:val="39"/&gt;&lt;w:semiHidden/&gt;&lt;w:rsid w:val="00FF2698"/&gt;&lt;w:pPr&gt;&lt;w:spacing w:after="100"/&gt;&lt;w:ind w:left="1100"/&gt;&lt;/w:pPr&gt;&lt;/w:style&gt;&lt;w:style w:type="paragraph" w:styleId="TOC7"&gt;&lt;w:name w:val="toc 7"/&gt;&lt;w:basedOn w:val="Normal"/&gt;&lt;w:next w:val="Normal"/&gt;&lt;w:uiPriority w:val="39"/&gt;&lt;w:semiHidden/&gt;&lt;w:rsid w:val="00FF2698"/&gt;&lt;w:pPr&gt;&lt;w:spacing w:after="100"/&gt;&lt;w:ind w:left="1320"/&gt;&lt;/w:pPr&gt;&lt;/w:style&gt;&lt;w:style w:type="paragraph" w:styleId="TOC8"&gt;&lt;w:name w:val="toc 8"/&gt;&lt;w:basedOn w:val="Normal"/&gt;&lt;w:next w:val="Normal"/&gt;&lt;w:uiPriority w:val="39"/&gt;&lt;w:semiHidden/&gt;&lt;w:rsid w:val="00FF2698"/&gt;&lt;w:pPr&gt;&lt;w:spacing w:after="100"/&gt;&lt;w:ind w:left="1540"/&gt;&lt;/w:pPr&gt;&lt;/w:style&gt;&lt;w:style w:type="paragraph" w:styleId="TOC9"&gt;&lt;w:name w:val="toc 9"/&gt;&lt;w:basedOn w:val="Normal"/&gt;&lt;w:next w:val="Normal"/&gt;&lt;w:uiPriority w:val="39"/&gt;&lt;w:semiHidden/&gt;&lt;w:rsid w:val="00FF2698"/&gt;&lt;w:pPr&gt;&lt;w:spacing w:after="100"/&gt;&lt;w:ind w:left="1760"/&gt;&lt;/w:pPr&gt;&lt;/w:style&gt;&lt;w:style w:type="paragraph" w:styleId="ListNumber2"&gt;&lt;w:name w:val="List Number 2"/&gt;&lt;w:basedOn w:val="ListNumber"/&gt;&lt;w:uiPriority w:val="14"/&gt;&lt;w:rsid w:val="00130001"/&gt;&lt;w:pPr&gt;&lt;w:numPr&gt;&lt;w:ilvl w:val="1"/&gt;&lt;/w:numPr&gt;&lt;/w:pPr&gt;&lt;/w:style&gt;&lt;w:style w:type="paragraph" w:styleId="ListNumber3"&gt;&lt;w:name w:val="List Number 3"/&gt;&lt;w:basedOn w:val="ListNumber2"/&gt;&lt;w:uiPriority w:val="14"/&gt;&lt;w:rsid w:val="00130001"/&gt;&lt;w:pPr&gt;&lt;w:numPr&gt;&lt;w:ilvl w:val="2"/&gt;&lt;/w:numPr&gt;&lt;/w:pPr&gt;&lt;/w:style&gt;&lt;w:style w:type="paragraph" w:styleId="ListNumber4"&gt;&lt;w:name w:val="List Number 4"/&gt;&lt;w:basedOn w:val="ListNumber3"/&gt;&lt;w:uiPriority w:val="14"/&gt;&lt;w:semiHidden/&gt;&lt;w:rsid w:val="00130001"/&gt;&lt;w:pPr&gt;&lt;w:numPr&gt;&lt;w:ilvl w:val="3"/&gt;&lt;/w:numPr&gt;&lt;/w:pPr&gt;&lt;/w:style&gt;&lt;w:style w:type="paragraph" w:styleId="ListNumber5"&gt;&lt;w:name w:val="List Number 5"/&gt;&lt;w:basedOn w:val="ListNumber4"/&gt;&lt;w:uiPriority w:val="14"/&gt;&lt;w:semiHidden/&gt;&lt;w:rsid w:val="00130001"/&gt;&lt;w:pPr&gt;&lt;w:numPr&gt;&lt;w:ilvl w:val="4"/&gt;&lt;/w:numPr&gt;&lt;/w:pPr&gt;&lt;/w:style&gt;&lt;w:style w:type="paragraph" w:styleId="ListBullet2"&gt;&lt;w:name w:val="List Bullet 2"/&gt;&lt;w:basedOn w:val="ListBullet"/&gt;&lt;w:uiPriority w:val="14"/&gt;&lt;w:rsid w:val="00FE2BED"/&gt;&lt;w:pPr&gt;&lt;w:numPr&gt;&lt;w:ilvl w:val="1"/&gt;&lt;/w:numPr&gt;&lt;/w:pPr&gt;&lt;/w:style&gt;&lt;w:style w:type="paragraph" w:styleId="ListBullet3"&gt;&lt;w:name w:val="List Bullet 3"/&gt;&lt;w:basedOn w:val="ListBullet2"/&gt;&lt;w:uiPriority w:val="14"/&gt;&lt;w:rsid w:val="00FE2BED"/&gt;&lt;w:pPr&gt;&lt;w:numPr&gt;&lt;w:ilvl w:val="2"/&gt;&lt;/w:numPr&gt;&lt;/w:pPr&gt;&lt;/w:style&gt;&lt;w:style w:type="paragraph" w:styleId="ListBullet4"&gt;&lt;w:name w:val="List Bullet 4"/&gt;&lt;w:basedOn w:val="ListBullet3"/&gt;&lt;w:uiPriority w:val="14"/&gt;&lt;w:semiHidden/&gt;&lt;w:rsid w:val="00FE2BED"/&gt;&lt;w:pPr&gt;&lt;w:numPr&gt;&lt;w:ilvl w:val="3"/&gt;&lt;/w:numPr&gt;&lt;/w:pPr&gt;&lt;/w:style&gt;&lt;w:style w:type="paragraph" w:styleId="ListBullet5"&gt;&lt;w:name w:val="List Bullet 5"/&gt;&lt;w:basedOn w:val="ListBullet4"/&gt;&lt;w:uiPriority w:val="14"/&gt;&lt;w:semiHidden/&gt;&lt;w:rsid w:val="00FE2BED"/&gt;&lt;w:pPr&gt;&lt;w:numPr&gt;&lt;w:ilvl w:val="4"/&gt;&lt;/w:numPr&gt;&lt;/w:pPr&gt;&lt;/w:style&gt;&lt;w:style w:type="character" w:styleId="PlaceholderText"&gt;&lt;w:name w:val="Placeholder Text"/&gt;&lt;w:basedOn w:val="DefaultParagraphFont"/&gt;&lt;w:uiPriority w:val="99"/&gt;&lt;w:rsid w:val="009C6FDB"/&gt;&lt;w:rPr&gt;&lt;w:color w:val="7F7F7F" w:themeColor="text1" w:themeTint="80"/&gt;&lt;w:bdr w:val="none" w:sz="0" w:space="0" w:color="auto"/&gt;&lt;w:shd w:val="clear" w:color="auto" w:fill="F0F0F0"/&gt;&lt;/w:rPr&gt;&lt;/w:style&gt;&lt;w:style w:type="paragraph" w:customStyle="1" w:styleId="Hiddentext"&gt;&lt;w:name w:val="Hidden text"/&gt;&lt;w:basedOn w:val="Normal"/&gt;&lt;w:next w:val="Normal"/&gt;&lt;w:uiPriority w:val="24"/&gt;&lt;w:semiHidden/&gt;&lt;w:qFormat/&gt;&lt;w:rsid w:val="00D86E66"/&gt;&lt;w:rPr&gt;&lt;w:vanish/&gt;&lt;w:color w:val="C00000"/&gt;&lt;/w:rPr&gt;&lt;/w:style&gt;&lt;w:style w:type="paragraph" w:customStyle="1" w:styleId="NumberedHeading1"&gt;&lt;w:name w:val="Numbered Heading 1"/&gt;&lt;w:basedOn w:val="Heading1"/&gt;&lt;w:next w:val="Normal"/&gt;&lt;w:uiPriority w:val="10"/&gt;&lt;w:semiHidden/&gt;&lt;w:qFormat/&gt;&lt;w:rsid w:val="00494FFB"/&gt;&lt;w:pPr&gt;&lt;w:numPr&gt;&lt;w:numId w:val="12"/&gt;&lt;/w:numPr&gt;&lt;/w:pPr&gt;&lt;/w:style&gt;&lt;w:style w:type="paragraph" w:customStyle="1" w:styleId="NumberedHeading2"&gt;&lt;w:name w:val="Numbered Heading 2"/&gt;&lt;w:basedOn w:val="Heading2"/&gt;&lt;w:next w:val="Normal"/&gt;&lt;w:uiPriority w:val="10"/&gt;&lt;w:semiHidden/&gt;&lt;w:qFormat/&gt;&lt;w:rsid w:val="00DA7B63"/&gt;&lt;w:pPr&gt;&lt;w:numPr&gt;&lt;w:ilvl w:val="1"/&gt;&lt;w:numId w:val="12"/&gt;&lt;/w:numPr&gt;&lt;/w:pPr&gt;&lt;/w:style&gt;&lt;w:style w:type="paragraph" w:customStyle="1" w:styleId="NumberedHeading3"&gt;&lt;w:name w:val="Numbered Heading 3"/&gt;&lt;w:basedOn w:val="Heading3"/&gt;&lt;w:next w:val="Normal"/&gt;&lt;w:uiPriority w:val="10"/&gt;&lt;w:semiHidden/&gt;&lt;w:qFormat/&gt;&lt;w:rsid w:val="00DA7B63"/&gt;&lt;w:pPr&gt;&lt;w:numPr&gt;&lt;w:ilvl w:val="2"/&gt;&lt;w:numId w:val="12"/&gt;&lt;/w:numPr&gt;&lt;/w:pPr&gt;&lt;/w:style&gt;&lt;w:style w:type="paragraph" w:customStyle="1" w:styleId="NumberedHeading4"&gt;&lt;w:name w:val="Numbered Heading 4"/&gt;&lt;w:basedOn w:val="Heading4"/&gt;&lt;w:next w:val="Normal"/&gt;&lt;w:uiPriority w:val="10"/&gt;&lt;w:semiHidden/&gt;&lt;w:qFormat/&gt;&lt;w:rsid w:val="00DA7B63"/&gt;&lt;w:pPr&gt;&lt;w:numPr&gt;&lt;w:ilvl w:val="3"/&gt;&lt;w:numId w:val="12"/&gt;&lt;/w:numPr&gt;&lt;/w:pPr&gt;&lt;/w:style&gt;&lt;w:style w:type="character" w:customStyle="1" w:styleId="NoSpacingChar"&gt;&lt;w:name w:val="No Spacing Char"/&gt;&lt;w:basedOn w:val="DefaultParagraphFont"/&gt;&lt;w:link w:val="NoSpacing"/&gt;&lt;w:uiPriority w:val="1"/&gt;&lt;w:rsid w:val="00EE7F0A"/&gt;&lt;/w:style&gt;&lt;w:style w:type="paragraph" w:styleId="BalloonText"&gt;&lt;w:name w:val="Balloon Text"/&gt;&lt;w:basedOn w:val="Normal"/&gt;&lt;w:link w:val="BalloonTextChar"/&gt;&lt;w:uiPriority w:val="99"/&gt;&lt;w:semiHidden/&gt;&lt;w:unhideWhenUsed/&gt;&lt;w:rsid w:val="00421476"/&gt;&lt;w:pPr&gt;&lt;w:spacing w:after="0"/&gt;&lt;/w:pPr&gt;&lt;w:rPr&gt;&lt;w:rFonts w:cs="Segoe UI"/&gt;&lt;w:sz w:val="18"/&gt;&lt;w:szCs w:val="18"/&gt;&lt;/w:rPr&gt;&lt;/w:style&gt;&lt;w:style w:type="character" w:customStyle="1" w:styleId="BalloonTextChar"&gt;&lt;w:name w:val="Balloon Text Char"/&gt;&lt;w:basedOn w:val="DefaultParagraphFont"/&gt;&lt;w:link w:val="BalloonText"/&gt;&lt;w:uiPriority w:val="99"/&gt;&lt;w:semiHidden/&gt;&lt;w:rsid w:val="00421476"/&gt;&lt;w:rPr&gt;&lt;w:rFonts w:cs="Segoe UI"/&gt;&lt;w:sz w:val="18"/&gt;&lt;w:szCs w:val="18"/&gt;&lt;w:lang w:val="en-GB"/&gt;&lt;/w:rPr&gt;&lt;/w:style&gt;&lt;w:style w:type="paragraph" w:customStyle="1" w:styleId="Footertext"&gt;&lt;w:name w:val="Footer text"/&gt;&lt;w:basedOn w:val="Normal"/&gt;&lt;w:uiPriority w:val="10"/&gt;&lt;w:semiHidden/&gt;&lt;w:qFormat/&gt;&lt;w:rsid w:val="001407DF"/&gt;&lt;w:pPr&gt;&lt;w:framePr w:wrap="around" w:vAnchor="page" w:hAnchor="page" w:x="852" w:y="14176"/&gt;&lt;w:spacing w:before="40" w:after="40"/&gt;&lt;/w:pPr&gt;&lt;w:rPr&gt;&lt;w:color w:val="858585" w:themeColor="accent5"/&gt;&lt;w:sz w:val="16"/&gt;&lt;/w:rPr&gt;&lt;/w:style&gt;&lt;w:style w:type="paragraph" w:customStyle="1" w:styleId="Footertitle"&gt;&lt;w:name w:val="Footer title"/&gt;&lt;w:basedOn w:val="Footertext"/&gt;&lt;w:uiPriority w:val="10"/&gt;&lt;w:semiHidden/&gt;&lt;w:qFormat/&gt;&lt;w:rsid w:val="00E4504C"/&gt;&lt;w:pPr&gt;&lt;w:framePr w:wrap="around"/&gt;&lt;/w:pPr&gt;&lt;w:rPr&gt;&lt;w:b/&gt;&lt;w:color w:val="407077" w:themeColor="accent1"/&gt;&lt;/w:rPr&gt;&lt;/w:style&gt;&lt;w:style w:type="table" w:customStyle="1" w:styleId="BetssonTable01"&gt;&lt;w:name w:val="Betsson Table 01"/&gt;&lt;w:basedOn w:val="TableNormal"/&gt;&lt;w:uiPriority w:val="99"/&gt;&lt;w:rsid w:val="00036B11"/&gt;&lt;w:pPr&gt;&lt;w:spacing w:after="0" w:line="240" w:lineRule="auto"/&gt;&lt;w:jc w:val="right"/&gt;&lt;/w:pPr&gt;&lt;w:tblPr&gt;&lt;w:tblBorders&gt;&lt;w:bottom w:val="single" w:sz="4" w:space="0" w:color="407077" w:themeColor="accent1"/&gt;&lt;w:insideH w:val="single" w:sz="4" w:space="0" w:color="407077" w:themeColor="accent1"/&gt;&lt;/w:tblBorders&gt;&lt;w:tblCellMar&gt;&lt;w:top w:w="57" w:type="dxa"/&gt;&lt;w:left w:w="57" w:type="dxa"/&gt;&lt;w:bottom w:w="57" w:type="dxa"/&gt;&lt;w:right w:w="57" w:type="dxa"/&gt;&lt;/w:tblCellMar&gt;&lt;/w:tblPr&gt;&lt;w:tblStylePr w:type="firstRow"&gt;&lt;w:pPr&gt;&lt;w:jc w:val="right"/&gt;&lt;/w:pPr&gt;&lt;w:rPr&gt;&lt;w:rFonts w:asciiTheme="majorHAnsi" w:hAnsiTheme="majorHAnsi"/&gt;&lt;w:b/&gt;&lt;w:color w:val="407077" w:themeColor="accent1"/&gt;&lt;/w:rPr&gt;&lt;w:tblPr/&gt;&lt;w:tcPr&gt;&lt;w:tcBorders&gt;&lt;w:bottom w:val="single" w:sz="12" w:space="0" w:color="407077" w:themeColor="accent1"/&gt;&lt;/w:tcBorders&gt;&lt;w:vAlign w:val="bottom"/&gt;&lt;/w:tcPr&gt;&lt;/w:tblStylePr&gt;&lt;w:tblStylePr w:type="lastRow"&gt;&lt;w:rPr&gt;&lt;w:rFonts w:asciiTheme="majorHAnsi" w:hAnsiTheme="majorHAnsi"/&gt;&lt;w:b/&gt;&lt;/w:rPr&gt;&lt;w:tblPr/&gt;&lt;w:tcPr&gt;&lt;w:tcBorders&gt;&lt;w:top w:val="double" w:sz="4" w:space="0" w:color="407077" w:themeColor="accent1"/&gt;&lt;w:left w:val="nil"/&gt;&lt;w:bottom w:val="nil"/&gt;&lt;w:right w:val="nil"/&gt;&lt;w:insideH w:val="nil"/&gt;&lt;w:insideV w:val="nil"/&gt;&lt;w:tl2br w:val="nil"/&gt;&lt;w:tr2bl w:val="nil"/&gt;&lt;/w:tcBorders&gt;&lt;/w:tcPr&gt;&lt;/w:tblStylePr&gt;&lt;w:tblStylePr w:type="firstCol"&gt;&lt;w:pPr&gt;&lt;w:jc w:val="left"/&gt;&lt;/w:pPr&gt;&lt;/w:tblStylePr&gt;&lt;w:tblStylePr w:type="lastCol"&gt;&lt;w:rPr&gt;&lt;w:rFonts w:asciiTheme="majorHAnsi" w:hAnsiTheme="majorHAnsi"/&gt;&lt;w:b/&gt;&lt;/w:rPr&gt;&lt;/w:tblStylePr&gt;&lt;w:tblStylePr w:type="nwCell"&gt;&lt;w:pPr&gt;&lt;w:jc w:val="left"/&gt;&lt;/w:pPr&gt;&lt;w:tblPr/&gt;&lt;w:tcPr&gt;&lt;w:vAlign w:val="bottom"/&gt;&lt;/w:tcPr&gt;&lt;/w:tblStylePr&gt;&lt;/w:style&gt;&lt;w:style w:type="table" w:styleId="TableGridLight"&gt;&lt;w:name w:val="Grid Table Light"/&gt;&lt;w:aliases w:val="Betsson Table 02"/&gt;&lt;w:basedOn w:val="TableNormal"/&gt;&lt;w:uiPriority w:val="40"/&gt;&lt;w:rsid w:val="00036B11"/&gt;&lt;w:pPr&gt;&lt;w:spacing w:after="0" w:line="240" w:lineRule="auto"/&gt;&lt;w:jc w:val="right"/&gt;&lt;/w:pPr&gt;&lt;w:tblPr&gt;&lt;w:tblStyleRowBandSize w:val="1"/&gt;&lt;w:tblBorders&gt;&lt;w:insideH w:val="single" w:sz="4" w:space="0" w:color="407077" w:themeColor="accent1"/&gt;&lt;/w:tblBorders&gt;&lt;w:tblCellMar&gt;&lt;w:top w:w="57" w:type="dxa"/&gt;&lt;w:left w:w="57" w:type="dxa"/&gt;&lt;w:bottom w:w="57" w:type="dxa"/&gt;&lt;w:right w:w="57" w:type="dxa"/&gt;&lt;/w:tblCellMar&gt;&lt;/w:tblPr&gt;&lt;w:tcPr&gt;&lt;w:shd w:val="clear" w:color="auto" w:fill="auto"/&gt;&lt;/w:tcPr&gt;&lt;w:tblStylePr w:type="firstRow"&gt;&lt;w:pPr&gt;&lt;w:wordWrap/&gt;&lt;w:spacing w:beforeLines="0" w:before="80" w:beforeAutospacing="0" w:afterLines="0" w:after="0" w:afterAutospacing="0"/&gt;&lt;w:jc w:val="right"/&gt;&lt;/w:pPr&gt;&lt;w:rPr&gt;&lt;w:rFonts w:asciiTheme="majorHAnsi" w:hAnsiTheme="majorHAnsi"/&gt;&lt;w:b/&gt;&lt;w:color w:val="FFFFFF" w:themeColor="background1"/&gt;&lt;/w:rPr&gt;&lt;w:tblPr/&gt;&lt;w:tcPr&gt;&lt;w:shd w:val="clear" w:color="auto" w:fill="407077" w:themeFill="accent1"/&gt;&lt;w:vAlign w:val="bottom"/&gt;&lt;/w:tcPr&gt;&lt;/w:tblStylePr&gt;&lt;w:tblStylePr w:type="lastRow"&gt;&lt;w:rPr&gt;&lt;w:rFonts w:asciiTheme="majorHAnsi" w:hAnsiTheme="majorHAnsi"/&gt;&lt;w:b/&gt;&lt;/w:rPr&gt;&lt;w:tblPr/&gt;&lt;w:tcPr&gt;&lt;w:tcBorders&gt;&lt;w:top w:val="double" w:sz="4" w:space="0" w:color="407077" w:themeColor="accent1"/&gt;&lt;/w:tcBorders&gt;&lt;w:shd w:val="clear" w:color="auto" w:fill="auto"/&gt;&lt;/w:tcPr&gt;&lt;/w:tblStylePr&gt;&lt;w:tblStylePr w:type="firstCol"&gt;&lt;w:pPr&gt;&lt;w:jc w:val="left"/&gt;&lt;/w:pPr&gt;&lt;/w:tblStylePr&gt;&lt;w:tblStylePr w:type="lastCol"&gt;&lt;w:pPr&gt;&lt;w:jc w:val="right"/&gt;&lt;/w:pPr&gt;&lt;w:rPr&gt;&lt;w:rFonts w:asciiTheme="majorHAnsi" w:hAnsiTheme="majorHAnsi"/&gt;&lt;w:b/&gt;&lt;/w:rPr&gt;&lt;/w:tblStylePr&gt;&lt;w:tblStylePr w:type="nwCell"&gt;&lt;w:pPr&gt;&lt;w:jc w:val="left"/&gt;&lt;/w:pPr&gt;&lt;w:tblPr/&gt;&lt;w:tcPr&gt;&lt;w:vAlign w:val="bottom"/&gt;&lt;/w:tcPr&gt;&lt;/w:tblStylePr&gt;&lt;/w:style&gt;&lt;w:style w:type="paragraph" w:customStyle="1" w:styleId="Tabletext"&gt;&lt;w:name w:val="Table text"/&gt;&lt;w:basedOn w:val="Normal"/&gt;&lt;w:uiPriority w:val="15"/&gt;&lt;w:rsid w:val="005F186C"/&gt;&lt;w:pPr&gt;&lt;w:spacing w:after="0" w:line="240" w:lineRule="auto"/&gt;&lt;/w:pPr&gt;&lt;w:rPr&gt;&lt;w:sz w:val="16"/&gt;&lt;/w:rPr&gt;&lt;/w:style&gt;&lt;w:style w:type="paragraph" w:customStyle="1" w:styleId="Tabletitle"&gt;&lt;w:name w:val="Table title"/&gt;&lt;w:basedOn w:val="Tabletext"/&gt;&lt;w:uiPriority w:val="15"/&gt;&lt;w:rsid w:val="00C5110E"/&gt;&lt;w:pPr&gt;&lt;w:framePr w:wrap="around" w:vAnchor="page" w:hAnchor="page" w:x="852" w:y="14176"/&gt;&lt;w:spacing w:before="40" w:after="40"/&gt;&lt;/w:pPr&gt;&lt;w:rPr&gt;&lt;w:b/&gt;&lt;w:color w:val="407077" w:themeColor="accent1"/&gt;&lt;/w:rPr&gt;&lt;/w:style&gt;&lt;w:style w:type="paragraph" w:customStyle="1" w:styleId="FootertitleWhite"&gt;&lt;w:name w:val="Footer title White"/&gt;&lt;w:basedOn w:val="Footertitle"/&gt;&lt;w:semiHidden/&gt;&lt;w:rsid w:val="000049A5"/&gt;&lt;w:pPr&gt;&lt;w:framePr w:wrap="around"/&gt;&lt;/w:pPr&gt;&lt;w:rPr&gt;&lt;w:bCs/&gt;&lt;w:color w:val="FFFFFF" w:themeColor="background1"/&gt;&lt;/w:rPr&gt;&lt;/w:style&gt;&lt;w:style w:type="paragraph" w:styleId="DocumentMap"&gt;&lt;w:name w:val="Document Map"/&gt;&lt;w:basedOn w:val="Normal"/&gt;&lt;w:link w:val="DocumentMapChar"/&gt;&lt;w:uiPriority w:val="99"/&gt;&lt;w:semiHidden/&gt;&lt;w:rsid w:val="00421476"/&gt;&lt;w:pPr&gt;&lt;w:spacing w:after="0"/&gt;&lt;/w:pPr&gt;&lt;w:rPr&gt;&lt;w:rFonts w:cs="Segoe UI"/&gt;&lt;w:sz w:val="16"/&gt;&lt;w:szCs w:val="16"/&gt;&lt;/w:rPr&gt;&lt;/w:style&gt;&lt;w:style w:type="character" w:customStyle="1" w:styleId="DocumentMapChar"&gt;&lt;w:name w:val="Document Map Char"/&gt;&lt;w:basedOn w:val="DefaultParagraphFont"/&gt;&lt;w:link w:val="DocumentMap"/&gt;&lt;w:uiPriority w:val="99"/&gt;&lt;w:semiHidden/&gt;&lt;w:rsid w:val="00421476"/&gt;&lt;w:rPr&gt;&lt;w:rFonts w:cs="Segoe UI"/&gt;&lt;w:sz w:val="16"/&gt;&lt;w:szCs w:val="16"/&gt;&lt;w:lang w:val="en-GB"/&gt;&lt;/w:rPr&gt;&lt;/w:style&gt;&lt;w:style w:type="character" w:styleId="HTMLSample"&gt;&lt;w:name w:val="HTML Sample"/&gt;&lt;w:basedOn w:val="DefaultParagraphFont"/&gt;&lt;w:uiPriority w:val="99"/&gt;&lt;w:semiHidden/&gt;&lt;w:unhideWhenUsed/&gt;&lt;w:rsid w:val="00421476"/&gt;&lt;w:rPr&gt;&lt;w:rFonts w:asciiTheme="minorHAnsi" w:hAnsiTheme="minorHAnsi"/&gt;&lt;w:sz w:val="24"/&gt;&lt;w:szCs w:val="24"/&gt;&lt;/w:rPr&gt;&lt;/w:style&gt;&lt;w:style w:type="paragraph" w:styleId="HTMLPreformatted"&gt;&lt;w:name w:val="HTML Preformatted"/&gt;&lt;w:basedOn w:val="Normal"/&gt;&lt;w:link w:val="HTMLPreformattedChar"/&gt;&lt;w:uiPriority w:val="99"/&gt;&lt;w:semiHidden/&gt;&lt;w:rsid w:val="00421476"/&gt;&lt;w:pPr&gt;&lt;w:spacing w:after="0"/&gt;&lt;/w:pPr&gt;&lt;w:rPr&gt;&lt;w:szCs w:val="20"/&gt;&lt;/w:rPr&gt;&lt;/w:style&gt;&lt;w:style w:type="character" w:customStyle="1" w:styleId="HTMLPreformattedChar"&gt;&lt;w:name w:val="HTML Preformatted Char"/&gt;&lt;w:basedOn w:val="DefaultParagraphFont"/&gt;&lt;w:link w:val="HTMLPreformatted"/&gt;&lt;w:uiPriority w:val="99"/&gt;&lt;w:semiHidden/&gt;&lt;w:rsid w:val="00421476"/&gt;&lt;w:rPr&gt;&lt;w:sz w:val="20"/&gt;&lt;w:szCs w:val="20"/&gt;&lt;w:lang w:val="en-GB"/&gt;&lt;/w:rPr&gt;&lt;/w:style&gt;&lt;w:style w:type="character" w:styleId="HTMLCode"&gt;&lt;w:name w:val="HTML Code"/&gt;&lt;w:basedOn w:val="DefaultParagraphFont"/&gt;&lt;w:uiPriority w:val="99"/&gt;&lt;w:semiHidden/&gt;&lt;w:rsid w:val="00421476"/&gt;&lt;w:rPr&gt;&lt;w:rFonts w:asciiTheme="minorHAnsi" w:hAnsiTheme="minorHAnsi"/&gt;&lt;w:sz w:val="20"/&gt;&lt;w:szCs w:val="20"/&gt;&lt;/w:rPr&gt;&lt;/w:style&gt;&lt;w:style w:type="character" w:styleId="HTMLTypewriter"&gt;&lt;w:name w:val="HTML Typewriter"/&gt;&lt;w:basedOn w:val="DefaultParagraphFont"/&gt;&lt;w:uiPriority w:val="99"/&gt;&lt;w:semiHidden/&gt;&lt;w:rsid w:val="00421476"/&gt;&lt;w:rPr&gt;&lt;w:rFonts w:asciiTheme="minorHAnsi" w:hAnsiTheme="minorHAnsi"/&gt;&lt;w:sz w:val="20"/&gt;&lt;w:szCs w:val="20"/&gt;&lt;/w:rPr&gt;&lt;/w:style&gt;&lt;w:style w:type="character" w:styleId="HTMLKeyboard"&gt;&lt;w:name w:val="HTML Keyboard"/&gt;&lt;w:basedOn w:val="DefaultParagraphFont"/&gt;&lt;w:uiPriority w:val="99"/&gt;&lt;w:semiHidden/&gt;&lt;w:rsid w:val="00421476"/&gt;&lt;w:rPr&gt;&lt;w:rFonts w:asciiTheme="minorHAnsi" w:hAnsiTheme="minorHAnsi"/&gt;&lt;w:sz w:val="20"/&gt;&lt;w:szCs w:val="20"/&gt;&lt;/w:rPr&gt;&lt;/w:style&gt;&lt;w:style w:type="paragraph" w:styleId="MacroText"&gt;&lt;w:name w:val="macro"/&gt;&lt;w:link w:val="MacroTextChar"/&gt;&lt;w:uiPriority w:val="99"/&gt;&lt;w:semiHidden/&gt;&lt;w:rsid w:val="00421476"/&gt;&lt;w:pPr&gt;&lt;w:tabs&gt;&lt;w:tab w:val="left" w:pos="480"/&gt;&lt;w:tab w:val="left" w:pos="960"/&gt;&lt;w:tab w:val="left" w:pos="1440"/&gt;&lt;w:tab w:val="left" w:pos="1920"/&gt;&lt;w:tab w:val="left" w:pos="2400"/&gt;&lt;w:tab w:val="left" w:pos="2880"/&gt;&lt;w:tab w:val="left" w:pos="3360"/&gt;&lt;w:tab w:val="left" w:pos="3840"/&gt;&lt;w:tab w:val="left" w:pos="4320"/&gt;&lt;/w:tabs&gt;&lt;w:spacing w:after="0" w:line="240" w:lineRule="auto"/&gt;&lt;/w:pPr&gt;&lt;w:rPr&gt;&lt;w:sz w:val="20"/&gt;&lt;w:szCs w:val="20"/&gt;&lt;w:lang w:val="en-GB"/&gt;&lt;/w:rPr&gt;&lt;/w:style&gt;&lt;w:style w:type="character" w:customStyle="1" w:styleId="MacroTextChar"&gt;&lt;w:name w:val="Macro Text Char"/&gt;&lt;w:basedOn w:val="DefaultParagraphFont"/&gt;&lt;w:link w:val="MacroText"/&gt;&lt;w:uiPriority w:val="99"/&gt;&lt;w:semiHidden/&gt;&lt;w:rsid w:val="00421476"/&gt;&lt;w:rPr&gt;&lt;w:sz w:val="20"/&gt;&lt;w:szCs w:val="20"/&gt;&lt;w:lang w:val="en-GB"/&gt;&lt;/w:rPr&gt;&lt;/w:style&gt;&lt;w:style w:type="paragraph" w:styleId="NormalWeb"&gt;&lt;w:name w:val="Normal (Web)"/&gt;&lt;w:basedOn w:val="Normal"/&gt;&lt;w:uiPriority w:val="99"/&gt;&lt;w:semiHidden/&gt;&lt;w:rsid w:val="00421476"/&gt;&lt;w:rPr&gt;&lt;w:rFonts w:cs="Times New Roman"/&gt;&lt;w:sz w:val="24"/&gt;&lt;w:szCs w:val="24"/&gt;&lt;/w:rPr&gt;&lt;/w:style&gt;&lt;w:style w:type="paragraph" w:styleId="PlainText"&gt;&lt;w:name w:val="Plain Text"/&gt;&lt;w:basedOn w:val="Normal"/&gt;&lt;w:link w:val="PlainTextChar"/&gt;&lt;w:uiPriority w:val="99"/&gt;&lt;w:semiHidden/&gt;&lt;w:rsid w:val="00421476"/&gt;&lt;w:pPr&gt;&lt;w:spacing w:after="0"/&gt;&lt;/w:pPr&gt;&lt;w:rPr&gt;&lt;w:sz w:val="21"/&gt;&lt;w:szCs w:val="21"/&gt;&lt;/w:rPr&gt;&lt;/w:style&gt;&lt;w:style w:type="character" w:customStyle="1" w:styleId="PlainTextChar"&gt;&lt;w:name w:val="Plain Text Char"/&gt;&lt;w:basedOn w:val="DefaultParagraphFont"/&gt;&lt;w:link w:val="PlainText"/&gt;&lt;w:uiPriority w:val="99"/&gt;&lt;w:semiHidden/&gt;&lt;w:rsid w:val="00421476"/&gt;&lt;w:rPr&gt;&lt;w:sz w:val="21"/&gt;&lt;w:szCs w:val="21"/&gt;&lt;w:lang w:val="en-GB"/&gt;&lt;/w:rPr&gt;&lt;/w:style&gt;&lt;w:style w:type="paragraph" w:customStyle="1" w:styleId="Name"&gt;&lt;w:name w:val="Name"/&gt;&lt;w:basedOn w:val="Normal"/&gt;&lt;w:next w:val="Normal"/&gt;&lt;w:uiPriority w:val="10"/&gt;&lt;w:rsid w:val="00C17BB4"/&gt;&lt;w:pPr&gt;&lt;w:spacing w:after="0" w:line="240" w:lineRule="auto"/&gt;&lt;/w:pPr&gt;&lt;w:rPr&gt;&lt;w:rFonts w:asciiTheme="majorHAnsi" w:hAnsiTheme="majorHAnsi"/&gt;&lt;/w:rPr&gt;&lt;/w:style&gt;&lt;w:style w:type="paragraph" w:customStyle="1" w:styleId="Info"&gt;&lt;w:name w:val="Info"/&gt;&lt;w:basedOn w:val="Normal"/&gt;&lt;w:uiPriority w:val="10"/&gt;&lt;w:rsid w:val="008B734D"/&gt;&lt;w:pPr&gt;&lt;w:spacing w:after="0" w:line="240" w:lineRule="auto"/&gt;&lt;/w:pPr&gt;&lt;/w:style&gt;&lt;/w:styles&gt;&lt;/pkg:xmlData&gt;&lt;/pkg:part&gt;&lt;pkg:part pkg:name="/word/glossary/fontTable.xml" pkg:contentType="application/vnd.openxmlformats-officedocument.wordprocessingml.fontTable+xml"&gt;&lt;pkg:xmlData&gt;&lt;w:fonts xmlns:mc="http://schemas.openxmlformats.org/markup-compatibility/2006" xmlns:r="http://schemas.openxmlformats.org/officeDocument/2006/relationships" xmlns:w="http://schemas.openxmlformats.org/wordprocessingml/2006/main" xmlns:w14="http://schemas.microsoft.com/office/word/2010/wordml" xmlns:w15="http://schemas.microsoft.com/office/word/2012/wordml" xmlns:w16se="http://schemas.microsoft.com/office/word/2015/wordml/symex" mc:Ignorable="w14 w15 w16se"/&gt;&lt;/pkg:xmlData&gt;&lt;/pkg:part&gt;&lt;pkg:part pkg:name="/word/glossary/webSettings.xml" pkg:contentType="application/vnd.openxmlformats-officedocument.wordprocessingml.webSettings+xml"&gt;&lt;pkg:xmlData&gt;&lt;w:webSettings xmlns:mc="http://schemas.openxmlformats.org/markup-compatibility/2006" xmlns:r="http://schemas.openxmlformats.org/officeDocument/2006/relationships" xmlns:w="http://schemas.openxmlformats.org/wordprocessingml/2006/main" xmlns:w14="http://schemas.microsoft.com/office/word/2010/wordml" xmlns:w15="http://schemas.microsoft.com/office/word/2012/wordml" xmlns:w16se="http://schemas.microsoft.com/office/word/2015/wordml/symex" mc:Ignorable="w14 w15 w16se"&gt;&lt;w:optimizeForBrowser/&gt;&lt;w:allowPNG/&gt;&lt;/w:webSettings&gt;&lt;/pkg:xmlData&gt;&lt;/pkg:part&gt;&lt;pkg:part pkg:name="/word/numbering.xml" pkg:contentType="application/vnd.openxmlformats-officedocument.wordprocessingml.numbering+xml"&gt;&lt;pkg:xmlData&gt;&lt;w:numbering xmlns:wpc="http://schemas.microsoft.com/office/word/2010/wordprocessingCanvas" xmlns:cx="http://schemas.microsoft.com/office/drawing/2014/chartex" xmlns:cx1="http://schemas.microsoft.com/office/drawing/2015/9/8/chartex" xmlns:cx2="http://schemas.microsoft.com/office/drawing/2015/10/21/chartex" xmlns:cx3="http://schemas.microsoft.com/office/drawing/2016/5/9/chartex" xmlns:cx4="http://schemas.microsoft.com/office/drawing/2016/5/10/chartex" xmlns:cx5="http://schemas.microsoft.com/office/drawing/2016/5/11/chartex" xmlns:cx6="http://schemas.microsoft.com/office/drawing/2016/5/12/chartex" xmlns:cx7="http://schemas.microsoft.com/office/drawing/2016/5/13/chartex" xmlns:cx8="http://schemas.microsoft.com/office/drawing/2016/5/14/chartex" xmlns:mc="http://schemas.openxmlformats.org/markup-compatibility/2006" xmlns:o="urn:schemas-microsoft-com:office:office" xmlns:r="http://schemas.openxmlformats.org/officeDocument/2006/relationships" xmlns:m="http://schemas.openxmlformats.org/officeDocument/2006/math" xmlns:v="urn:schemas-microsoft-com:vml" xmlns:wp14="http://schemas.microsoft.com/office/word/2010/wordprocessingDrawing" xmlns:wp="http://schemas.openxmlformats.org/drawingml/2006/wordprocessingDrawing" xmlns:w10="urn:schemas-microsoft-com:office:word" xmlns:w="http://schemas.openxmlformats.org/wordprocessingml/2006/main" xmlns:w14="http://schemas.microsoft.com/office/word/2010/wordml" xmlns:w15="http://schemas.microsoft.com/office/word/2012/wordml" xmlns:w16se="http://schemas.microsoft.com/office/word/2015/wordml/symex" xmlns:wpg="http://schemas.microsoft.com/office/word/2010/wordprocessingGroup" xmlns:wpi="http://schemas.microsoft.com/office/word/2010/wordprocessingInk" xmlns:wne="http://schemas.microsoft.com/office/word/2006/wordml" xmlns:wps="http://schemas.microsoft.com/office/word/2010/wordprocessingShape" mc:Ignorable="w14 w15 w16se wp14"&gt;&lt;w:abstractNum w:abstractNumId="0" w15:restartNumberingAfterBreak="0"&gt;&lt;w:nsid w:val="FFFFFF7C"/&gt;&lt;w:multiLevelType w:val="singleLevel"/&gt;&lt;w:tmpl w:val="1D6AD0EC"/&gt;&lt;w:lvl w:ilvl="0"&gt;&lt;w:start w:val="1"/&gt;&lt;w:numFmt w:val="decimal"/&gt;&lt;w:lvlText w:val="%1."/&gt;&lt;w:lvlJc w:val="left"/&gt;&lt;w:pPr&gt;&lt;w:tabs&gt;&lt;w:tab w:val="num" w:pos="1492"/&gt;&lt;/w:tabs&gt;&lt;w:ind w:left="1492" w:hanging="360"/&gt;&lt;/w:pPr&gt;&lt;/w:lvl&gt;&lt;/w:abstractNum&gt;&lt;w:abstractNum w:abstractNumId="1" w15:restartNumberingAfterBreak="0"&gt;&lt;w:nsid w:val="FFFFFF7D"/&gt;&lt;w:multiLevelType w:val="singleLevel"/&gt;&lt;w:tmpl w:val="6C44DE1A"/&gt;&lt;w:lvl w:ilvl="0"&gt;&lt;w:start w:val="1"/&gt;&lt;w:numFmt w:val="decimal"/&gt;&lt;w:lvlText w:val="%1."/&gt;&lt;w:lvlJc w:val="left"/&gt;&lt;w:pPr&gt;&lt;w:tabs&gt;&lt;w:tab w:val="num" w:pos="1209"/&gt;&lt;/w:tabs&gt;&lt;w:ind w:left="1209" w:hanging="360"/&gt;&lt;/w:pPr&gt;&lt;/w:lvl&gt;&lt;/w:abstractNum&gt;&lt;w:abstractNum w:abstractNumId="2" w15:restartNumberingAfterBreak="0"&gt;&lt;w:nsid w:val="FFFFFF7E"/&gt;&lt;w:multiLevelType w:val="singleLevel"/&gt;&lt;w:tmpl w:val="83748C94"/&gt;&lt;w:lvl w:ilvl="0"&gt;&lt;w:start w:val="1"/&gt;&lt;w:numFmt w:val="decimal"/&gt;&lt;w:lvlText w:val="%1."/&gt;&lt;w:lvlJc w:val="left"/&gt;&lt;w:pPr&gt;&lt;w:tabs&gt;&lt;w:tab w:val="num" w:pos="926"/&gt;&lt;/w:tabs&gt;&lt;w:ind w:left="926" w:hanging="360"/&gt;&lt;/w:pPr&gt;&lt;/w:lvl&gt;&lt;/w:abstractNum&gt;&lt;w:abstractNum w:abstractNumId="3" w15:restartNumberingAfterBreak="0"&gt;&lt;w:nsid w:val="FFFFFF7F"/&gt;&lt;w:multiLevelType w:val="singleLevel"/&gt;&lt;w:tmpl w:val="871A6F0C"/&gt;&lt;w:lvl w:ilvl="0"&gt;&lt;w:start w:val="1"/&gt;&lt;w:numFmt w:val="decimal"/&gt;&lt;w:lvlText w:val="%1."/&gt;&lt;w:lvlJc w:val="left"/&gt;&lt;w:pPr&gt;&lt;w:tabs&gt;&lt;w:tab w:val="num" w:pos="643"/&gt;&lt;/w:tabs&gt;&lt;w:ind w:left="643" w:hanging="360"/&gt;&lt;/w:pPr&gt;&lt;/w:lvl&gt;&lt;/w:abstractNum&gt;&lt;w:abstractNum w:abstractNumId="4" w15:restartNumberingAfterBreak="0"&gt;&lt;w:nsid w:val="FFFFFF80"/&gt;&lt;w:multiLevelType w:val="singleLevel"/&gt;&lt;w:tmpl w:val="ED1CE676"/&gt;&lt;w:lvl w:ilvl="0"&gt;&lt;w:start w:val="1"/&gt;&lt;w:numFmt w:val="bullet"/&gt;&lt;w:lvlText w:val=""/&gt;&lt;w:lvlJc w:val="left"/&gt;&lt;w:pPr&gt;&lt;w:tabs&gt;&lt;w:tab w:val="num" w:pos="1492"/&gt;&lt;/w:tabs&gt;&lt;w:ind w:left="1492" w:hanging="360"/&gt;&lt;/w:pPr&gt;&lt;w:rPr&gt;&lt;w:rFonts w:ascii="Symbol" w:hAnsi="Symbol" w:hint="default"/&gt;&lt;/w:rPr&gt;&lt;/w:lvl&gt;&lt;/w:abstractNum&gt;&lt;w:abstractNum w:abstractNumId="5" w15:restartNumberingAfterBreak="0"&gt;&lt;w:nsid w:val="FFFFFF81"/&gt;&lt;w:multiLevelType w:val="singleLevel"/&gt;&lt;w:tmpl w:val="DEF60714"/&gt;&lt;w:lvl w:ilvl="0"&gt;&lt;w:start w:val="1"/&gt;&lt;w:numFmt w:val="bullet"/&gt;&lt;w:lvlText w:val=""/&gt;&lt;w:lvlJc w:val="left"/&gt;&lt;w:pPr&gt;&lt;w:tabs&gt;&lt;w:tab w:val="num" w:pos="1209"/&gt;&lt;/w:tabs&gt;&lt;w:ind w:left="1209" w:hanging="360"/&gt;&lt;/w:pPr&gt;&lt;w:rPr&gt;&lt;w:rFonts w:ascii="Symbol" w:hAnsi="Symbol" w:hint="default"/&gt;&lt;/w:rPr&gt;&lt;/w:lvl&gt;&lt;/w:abstractNum&gt;&lt;w:abstractNum w:abstractNumId="6" w15:restartNumberingAfterBreak="0"&gt;&lt;w:nsid w:val="FFFFFF82"/&gt;&lt;w:multiLevelType w:val="singleLevel"/&gt;&lt;w:tmpl w:val="91EA47E8"/&gt;&lt;w:lvl w:ilvl="0"&gt;&lt;w:start w:val="1"/&gt;&lt;w:numFmt w:val="bullet"/&gt;&lt;w:lvlText w:val=""/&gt;&lt;w:lvlJc w:val="left"/&gt;&lt;w:pPr&gt;&lt;w:tabs&gt;&lt;w:tab w:val="num" w:pos="926"/&gt;&lt;/w:tabs&gt;&lt;w:ind w:left="926" w:hanging="360"/&gt;&lt;/w:pPr&gt;&lt;w:rPr&gt;&lt;w:rFonts w:ascii="Symbol" w:hAnsi="Symbol" w:hint="default"/&gt;&lt;/w:rPr&gt;&lt;/w:lvl&gt;&lt;/w:abstractNum&gt;&lt;w:abstractNum w:abstractNumId="7" w15:restartNumberingAfterBreak="0"&gt;&lt;w:nsid w:val="FFFFFF83"/&gt;&lt;w:multiLevelType w:val="singleLevel"/&gt;&lt;w:tmpl w:val="9278B09A"/&gt;&lt;w:lvl w:ilvl="0"&gt;&lt;w:start w:val="1"/&gt;&lt;w:numFmt w:val="bullet"/&gt;&lt;w:lvlText w:val=""/&gt;&lt;w:lvlJc w:val="left"/&gt;&lt;w:pPr&gt;&lt;w:tabs&gt;&lt;w:tab w:val="num" w:pos="643"/&gt;&lt;/w:tabs&gt;&lt;w:ind w:left="643" w:hanging="360"/&gt;&lt;/w:pPr&gt;&lt;w:rPr&gt;&lt;w:rFonts w:ascii="Symbol" w:hAnsi="Symbol" w:hint="default"/&gt;&lt;/w:rPr&gt;&lt;/w:lvl&gt;&lt;/w:abstractNum&gt;&lt;w:abstractNum w:abstractNumId="8" w15:restartNumberingAfterBreak="0"&gt;&lt;w:nsid w:val="17071BBC"/&gt;&lt;w:multiLevelType w:val="multilevel"/&gt;&lt;w:tmpl w:val="B512299C"/&gt;&lt;w:lvl w:ilvl="0"&gt;&lt;w:start w:val="1"/&gt;&lt;w:numFmt w:val="decimal"/&gt;&lt;w:pStyle w:val="ListNumber"/&gt;&lt;w:lvlText w:val="%1."/&gt;&lt;w:lvlJc w:val="left"/&gt;&lt;w:pPr&gt;&lt;w:ind w:left="360" w:hanging="360"/&gt;&lt;/w:pPr&gt;&lt;w:rPr&gt;&lt;w:rFonts w:hint="default"/&gt;&lt;/w:rPr&gt;&lt;/w:lvl&gt;&lt;w:lvl w:ilvl="1"&gt;&lt;w:start w:val="1"/&gt;&lt;w:numFmt w:val="lowerLetter"/&gt;&lt;w:pStyle w:val="ListNumber2"/&gt;&lt;w:lvlText w:val="%2."/&gt;&lt;w:lvlJc w:val="left"/&gt;&lt;w:pPr&gt;&lt;w:ind w:left="720" w:hanging="360"/&gt;&lt;/w:pPr&gt;&lt;w:rPr&gt;&lt;w:rFonts w:hint="default"/&gt;&lt;/w:rPr&gt;&lt;/w:lvl&gt;&lt;w:lvl w:ilvl="2"&gt;&lt;w:start w:val="1"/&gt;&lt;w:numFmt w:val="lowerRoman"/&gt;&lt;w:pStyle w:val="ListNumber3"/&gt;&lt;w:lvlText w:val="%3)"/&gt;&lt;w:lvlJc w:val="left"/&gt;&lt;w:pPr&gt;&lt;w:ind w:left="1080" w:hanging="360"/&gt;&lt;/w:pPr&gt;&lt;w:rPr&gt;&lt;w:rFonts w:hint="default"/&gt;&lt;/w:rPr&gt;&lt;/w:lvl&gt;&lt;w:lvl w:ilvl="3"&gt;&lt;w:start w:val="1"/&gt;&lt;w:numFmt w:val="decimal"/&gt;&lt;w:pStyle w:val="ListNumber4"/&gt;&lt;w:lvlText w:val="%4)"/&gt;&lt;w:lvlJc w:val="left"/&gt;&lt;w:pPr&gt;&lt;w:ind w:left="1440" w:hanging="360"/&gt;&lt;/w:pPr&gt;&lt;w:rPr&gt;&lt;w:rFonts w:hint="default"/&gt;&lt;/w:rPr&gt;&lt;/w:lvl&gt;&lt;w:lvl w:ilvl="4"&gt;&lt;w:start w:val="1"/&gt;&lt;w:numFmt w:val="lowerLetter"/&gt;&lt;w:pStyle w:val="ListNumber5"/&gt;&lt;w:lvlText w:val="%5)"/&gt;&lt;w:lvlJc w:val="left"/&gt;&lt;w:pPr&gt;&lt;w:ind w:left="1800" w:hanging="360"/&gt;&lt;/w:pPr&gt;&lt;w:rPr&gt;&lt;w:rFonts w:hint="default"/&gt;&lt;/w:rPr&gt;&lt;/w:lvl&gt;&lt;w:lvl w:ilvl="5"&gt;&lt;w:start w:val="1"/&gt;&lt;w:numFmt w:val="lowerRoman"/&gt;&lt;w:lvlText w:val="%6)"/&gt;&lt;w:lvlJc w:val="left"/&gt;&lt;w:pPr&gt;&lt;w:ind w:left="2160" w:hanging="360"/&gt;&lt;/w:pPr&gt;&lt;w:rPr&gt;&lt;w:rFonts w:hint="default"/&gt;&lt;/w:rPr&gt;&lt;/w:lvl&gt;&lt;w:lvl w:ilvl="6"&gt;&lt;w:start w:val="1"/&gt;&lt;w:numFmt w:val="decimal"/&gt;&lt;w:lvlText w:val="(%7)"/&gt;&lt;w:lvlJc w:val="left"/&gt;&lt;w:pPr&gt;&lt;w:ind w:left="2520" w:hanging="360"/&gt;&lt;/w:pPr&gt;&lt;w:rPr&gt;&lt;w:rFonts w:hint="default"/&gt;&lt;/w:rPr&gt;&lt;/w:lvl&gt;&lt;w:lvl w:ilvl="7"&gt;&lt;w:start w:val="1"/&gt;&lt;w:numFmt w:val="lowerLetter"/&gt;&lt;w:lvlText w:val="(%8)"/&gt;&lt;w:lvlJc w:val="left"/&gt;&lt;w:pPr&gt;&lt;w:ind w:left="2880" w:hanging="360"/&gt;&lt;/w:pPr&gt;&lt;w:rPr&gt;&lt;w:rFonts w:hint="default"/&gt;&lt;/w:rPr&gt;&lt;/w:lvl&gt;&lt;w:lvl w:ilvl="8"&gt;&lt;w:start w:val="1"/&gt;&lt;w:numFmt w:val="lowerRoman"/&gt;&lt;w:lvlText w:val="(%9)"/&gt;&lt;w:lvlJc w:val="left"/&gt;&lt;w:pPr&gt;&lt;w:ind w:left="3240" w:hanging="360"/&gt;&lt;/w:pPr&gt;&lt;w:rPr&gt;&lt;w:rFonts w:hint="default"/&gt;&lt;/w:rPr&gt;&lt;/w:lvl&gt;&lt;/w:abstractNum&gt;&lt;w:abstractNum w:abstractNumId="9" w15:restartNumberingAfterBreak="0"&gt;&lt;w:nsid w:val="3CE155D5"/&gt;&lt;w:multiLevelType w:val="multilevel"/&gt;&lt;w:tmpl w:val="041D001D"/&gt;&lt;w:lvl w:ilvl="0"&gt;&lt;w:start w:val="1"/&gt;&lt;w:numFmt w:val="decimal"/&gt;&lt;w:lvlText w:val="%1)"/&gt;&lt;w:lvlJc w:val="left"/&gt;&lt;w:pPr&gt;&lt;w:ind w:left="360" w:hanging="360"/&gt;&lt;/w:pPr&gt;&lt;/w:lvl&gt;&lt;w:lvl w:ilvl="1"&gt;&lt;w:start w:val="1"/&gt;&lt;w:numFmt w:val="lowerLetter"/&gt;&lt;w:lvlText w:val="%2)"/&gt;&lt;w:lvlJc w:val="left"/&gt;&lt;w:pPr&gt;&lt;w:ind w:left="720" w:hanging="360"/&gt;&lt;/w:pPr&gt;&lt;/w:lvl&gt;&lt;w:lvl w:ilvl="2"&gt;&lt;w:start w:val="1"/&gt;&lt;w:numFmt w:val="lowerRoman"/&gt;&lt;w:lvlText w:val="%3)"/&gt;&lt;w:lvlJc w:val="left"/&gt;&lt;w:pPr&gt;&lt;w:ind w:left="1080" w:hanging="360"/&gt;&lt;/w:pPr&gt;&lt;/w:lvl&gt;&lt;w:lvl w:ilvl="3"&gt;&lt;w:start w:val="1"/&gt;&lt;w:numFmt w:val="decimal"/&gt;&lt;w:lvlText w:val="(%4)"/&gt;&lt;w:lvlJc w:val="left"/&gt;&lt;w:pPr&gt;&lt;w:ind w:left="1440" w:hanging="360"/&gt;&lt;/w:pPr&gt;&lt;/w:lvl&gt;&lt;w:lvl w:ilvl="4"&gt;&lt;w:start w:val="1"/&gt;&lt;w:numFmt w:val="lowerLetter"/&gt;&lt;w:lvlText w:val="(%5)"/&gt;&lt;w:lvlJc w:val="left"/&gt;&lt;w:pPr&gt;&lt;w:ind w:left="1800" w:hanging="360"/&gt;&lt;/w:pPr&gt;&lt;/w:lvl&gt;&lt;w:lvl w:ilvl="5"&gt;&lt;w:start w:val="1"/&gt;&lt;w:numFmt w:val="lowerRoman"/&gt;&lt;w:lvlText w:val="(%6)"/&gt;&lt;w:lvlJc w:val="left"/&gt;&lt;w:pPr&gt;&lt;w:ind w:left="2160" w:hanging="360"/&gt;&lt;/w:pPr&gt;&lt;/w:lvl&gt;&lt;w:lvl w:ilvl="6"&gt;&lt;w:start w:val="1"/&gt;&lt;w:numFmt w:val="decimal"/&gt;&lt;w:lvlText w:val="%7."/&gt;&lt;w:lvlJc w:val="left"/&gt;&lt;w:pPr&gt;&lt;w:ind w:left="2520" w:hanging="360"/&gt;&lt;/w:pPr&gt;&lt;/w:lvl&gt;&lt;w:lvl w:ilvl="7"&gt;&lt;w:start w:val="1"/&gt;&lt;w:numFmt w:val="lowerLetter"/&gt;&lt;w:lvlText w:val="%8."/&gt;&lt;w:lvlJc w:val="left"/&gt;&lt;w:pPr&gt;&lt;w:ind w:left="2880" w:hanging="360"/&gt;&lt;/w:pPr&gt;&lt;/w:lvl&gt;&lt;w:lvl w:ilvl="8"&gt;&lt;w:start w:val="1"/&gt;&lt;w:numFmt w:val="lowerRoman"/&gt;&lt;w:lvlText w:val="%9."/&gt;&lt;w:lvlJc w:val="left"/&gt;&lt;w:pPr&gt;&lt;w:ind w:left="3240" w:hanging="360"/&gt;&lt;/w:pPr&gt;&lt;/w:lvl&gt;&lt;/w:abstractNum&gt;&lt;w:abstractNum w:abstractNumId="10" w15:restartNumberingAfterBreak="0"&gt;&lt;w:nsid w:val="3D727479"/&gt;&lt;w:multiLevelType w:val="multilevel"/&gt;&lt;w:tmpl w:val="041D0023"/&gt;&lt;w:lvl w:ilvl="0"&gt;&lt;w:start w:val="1"/&gt;&lt;w:numFmt w:val="upperRoman"/&gt;&lt;w:lvlText w:val="Artikel %1."/&gt;&lt;w:lvlJc w:val="left"/&gt;&lt;w:pPr&gt;&lt;w:ind w:left="0" w:firstLine="0"/&gt;&lt;/w:pPr&gt;&lt;/w:lvl&gt;&lt;w:lvl w:ilvl="1"&gt;&lt;w:start w:val="1"/&gt;&lt;w:numFmt w:val="decimalZero"/&gt;&lt;w:isLgl/&gt;&lt;w:lvlText w:val="Avsnitt %1.%2"/&gt;&lt;w:lvlJc w:val="left"/&gt;&lt;w:pPr&gt;&lt;w:ind w:left="0" w:firstLine="0"/&gt;&lt;/w:pPr&gt;&lt;/w:lvl&gt;&lt;w:lvl w:ilvl="2"&gt;&lt;w:start w:val="1"/&gt;&lt;w:numFmt w:val="lowerLetter"/&gt;&lt;w:lvlText w:val="(%3)"/&gt;&lt;w:lvlJc w:val="left"/&gt;&lt;w:pPr&gt;&lt;w:ind w:left="720" w:hanging="432"/&gt;&lt;/w:pPr&gt;&lt;/w:lvl&gt;&lt;w:lvl w:ilvl="3"&gt;&lt;w:start w:val="1"/&gt;&lt;w:numFmt w:val="lowerRoman"/&gt;&lt;w:lvlText w:val="(%4)"/&gt;&lt;w:lvlJc w:val="right"/&gt;&lt;w:pPr&gt;&lt;w:ind w:left="864" w:hanging="144"/&gt;&lt;/w:pPr&gt;&lt;/w:lvl&gt;&lt;w:lvl w:ilvl="4"&gt;&lt;w:start w:val="1"/&gt;&lt;w:numFmt w:val="decimal"/&gt;&lt;w:pStyle w:val="Heading5"/&gt;&lt;w:lvlText w:val="%5)"/&gt;&lt;w:lvlJc w:val="left"/&gt;&lt;w:pPr&gt;&lt;w:ind w:left="1008" w:hanging="432"/&gt;&lt;/w:pPr&gt;&lt;/w:lvl&gt;&lt;w:lvl w:ilvl="5"&gt;&lt;w:start w:val="1"/&gt;&lt;w:numFmt w:val="lowerLetter"/&gt;&lt;w:pStyle w:val="Heading6"/&gt;&lt;w:lvlText w:val="%6)"/&gt;&lt;w:lvlJc w:val="left"/&gt;&lt;w:pPr&gt;&lt;w:ind w:left="1152" w:hanging="432"/&gt;&lt;/w:pPr&gt;&lt;/w:lvl&gt;&lt;w:lvl w:ilvl="6"&gt;&lt;w:start w:val="1"/&gt;&lt;w:numFmt w:val="lowerRoman"/&gt;&lt;w:pStyle w:val="Heading7"/&gt;&lt;w:lvlText w:val="%7)"/&gt;&lt;w:lvlJc w:val="right"/&gt;&lt;w:pPr&gt;&lt;w:ind w:left="1296" w:hanging="288"/&gt;&lt;/w:pPr&gt;&lt;/w:lvl&gt;&lt;w:lvl w:ilvl="7"&gt;&lt;w:start w:val="1"/&gt;&lt;w:numFmt w:val="lowerLetter"/&gt;&lt;w:pStyle w:val="Heading8"/&gt;&lt;w:lvlText w:val="%8."/&gt;&lt;w:lvlJc w:val="left"/&gt;&lt;w:pPr&gt;&lt;w:ind w:left="1440" w:hanging="432"/&gt;&lt;/w:pPr&gt;&lt;/w:lvl&gt;&lt;w:lvl w:ilvl="8"&gt;&lt;w:start w:val="1"/&gt;&lt;w:numFmt w:val="lowerRoman"/&gt;&lt;w:pStyle w:val="Heading9"/&gt;&lt;w:lvlText w:val="%9."/&gt;&lt;w:lvlJc w:val="right"/&gt;&lt;w:pPr&gt;&lt;w:ind w:left="1584" w:hanging="144"/&gt;&lt;/w:pPr&gt;&lt;/w:lvl&gt;&lt;/w:abstractNum&gt;&lt;w:abstractNum w:abstractNumId="11" w15:restartNumberingAfterBreak="0"&gt;&lt;w:nsid w:val="43F95E9C"/&gt;&lt;w:multiLevelType w:val="multilevel"/&gt;&lt;w:tmpl w:val="5FAE225A"/&gt;&lt;w:lvl w:ilvl="0"&gt;&lt;w:start w:val="1"/&gt;&lt;w:numFmt w:val="decimal"/&gt;&lt;w:pStyle w:val="NumberedHeading1"/&gt;&lt;w:lvlText w:val="%1."/&gt;&lt;w:lvlJc w:val="left"/&gt;&lt;w:pPr&gt;&lt;w:ind w:left="907" w:hanging="907"/&gt;&lt;/w:pPr&gt;&lt;w:rPr&gt;&lt;w:rFonts w:hint="default"/&gt;&lt;/w:rPr&gt;&lt;/w:lvl&gt;&lt;w:lvl w:ilvl="1"&gt;&lt;w:start w:val="1"/&gt;&lt;w:numFmt w:val="decimal"/&gt;&lt;w:pStyle w:val="NumberedHeading2"/&gt;&lt;w:lvlText w:val="%1.%2"/&gt;&lt;w:lvlJc w:val="left"/&gt;&lt;w:pPr&gt;&lt;w:ind w:left="907" w:hanging="907"/&gt;&lt;/w:pPr&gt;&lt;w:rPr&gt;&lt;w:rFonts w:hint="default"/&gt;&lt;/w:rPr&gt;&lt;/w:lvl&gt;&lt;w:lvl w:ilvl="2"&gt;&lt;w:start w:val="1"/&gt;&lt;w:numFmt w:val="decimal"/&gt;&lt;w:pStyle w:val="NumberedHeading3"/&gt;&lt;w:lvlText w:val="%1.%2.%3"/&gt;&lt;w:lvlJc w:val="left"/&gt;&lt;w:pPr&gt;&lt;w:ind w:left="907" w:hanging="907"/&gt;&lt;/w:pPr&gt;&lt;w:rPr&gt;&lt;w:rFonts w:hint="default"/&gt;&lt;/w:rPr&gt;&lt;/w:lvl&gt;&lt;w:lvl w:ilvl="3"&gt;&lt;w:start w:val="1"/&gt;&lt;w:numFmt w:val="decimal"/&gt;&lt;w:pStyle w:val="NumberedHeading4"/&gt;&lt;w:lvlText w:val="%1.%2.%3.%4"/&gt;&lt;w:lvlJc w:val="left"/&gt;&lt;w:pPr&gt;&lt;w:ind w:left="907" w:hanging="907"/&gt;&lt;/w:pPr&gt;&lt;w:rPr&gt;&lt;w:rFonts w:hint="default"/&gt;&lt;/w:rPr&gt;&lt;/w:lvl&gt;&lt;w:lvl w:ilvl="4"&gt;&lt;w:start w:val="1"/&gt;&lt;w:numFmt w:val="lowerLetter"/&gt;&lt;w:lvlText w:val="(%5)"/&gt;&lt;w:lvlJc w:val="left"/&gt;&lt;w:pPr&gt;&lt;w:ind w:left="907" w:hanging="907"/&gt;&lt;/w:pPr&gt;&lt;w:rPr&gt;&lt;w:rFonts w:hint="default"/&gt;&lt;/w:rPr&gt;&lt;/w:lvl&gt;&lt;w:lvl w:ilvl="5"&gt;&lt;w:start w:val="1"/&gt;&lt;w:numFmt w:val="lowerRoman"/&gt;&lt;w:lvlText w:val="(%6)"/&gt;&lt;w:lvlJc w:val="left"/&gt;&lt;w:pPr&gt;&lt;w:ind w:left="907" w:hanging="907"/&gt;&lt;/w:pPr&gt;&lt;w:rPr&gt;&lt;w:rFonts w:hint="default"/&gt;&lt;/w:rPr&gt;&lt;/w:lvl&gt;&lt;w:lvl w:ilvl="6"&gt;&lt;w:start w:val="1"/&gt;&lt;w:numFmt w:val="decimal"/&gt;&lt;w:lvlText w:val="%7."/&gt;&lt;w:lvlJc w:val="left"/&gt;&lt;w:pPr&gt;&lt;w:ind w:left="907" w:hanging="907"/&gt;&lt;/w:pPr&gt;&lt;w:rPr&gt;&lt;w:rFonts w:hint="default"/&gt;&lt;/w:rPr&gt;&lt;/w:lvl&gt;&lt;w:lvl w:ilvl="7"&gt;&lt;w:start w:val="1"/&gt;&lt;w:numFmt w:val="lowerLetter"/&gt;&lt;w:lvlText w:val="%8."/&gt;&lt;w:lvlJc w:val="left"/&gt;&lt;w:pPr&gt;&lt;w:ind w:left="907" w:hanging="907"/&gt;&lt;/w:pPr&gt;&lt;w:rPr&gt;&lt;w:rFonts w:hint="default"/&gt;&lt;/w:rPr&gt;&lt;/w:lvl&gt;&lt;w:lvl w:ilvl="8"&gt;&lt;w:start w:val="1"/&gt;&lt;w:numFmt w:val="lowerRoman"/&gt;&lt;w:lvlText w:val="%9."/&gt;&lt;w:lvlJc w:val="left"/&gt;&lt;w:pPr&gt;&lt;w:ind w:left="907" w:hanging="907"/&gt;&lt;/w:pPr&gt;&lt;w:rPr&gt;&lt;w:rFonts w:hint="default"/&gt;&lt;/w:rPr&gt;&lt;/w:lvl&gt;&lt;/w:abstractNum&gt;&lt;w:abstractNum w:abstractNumId="12" w15:restartNumberingAfterBreak="0"&gt;&lt;w:nsid w:val="4CEF34F7"/&gt;&lt;w:multiLevelType w:val="multilevel"/&gt;&lt;w:tmpl w:val="041D001F"/&gt;&lt;w:lvl w:ilvl="0"&gt;&lt;w:start w:val="1"/&gt;&lt;w:numFmt w:val="decimal"/&gt;&lt;w:lvlText w:val="%1."/&gt;&lt;w:lvlJc w:val="left"/&gt;&lt;w:pPr&gt;&lt;w:ind w:left="360" w:hanging="360"/&gt;&lt;/w:pPr&gt;&lt;/w:lvl&gt;&lt;w:lvl w:ilvl="1"&gt;&lt;w:start w:val="1"/&gt;&lt;w:numFmt w:val="decimal"/&gt;&lt;w:lvlText w:val="%1.%2."/&gt;&lt;w:lvlJc w:val="left"/&gt;&lt;w:pPr&gt;&lt;w:ind w:left="792" w:hanging="432"/&gt;&lt;/w:pPr&gt;&lt;/w:lvl&gt;&lt;w:lvl w:ilvl="2"&gt;&lt;w:start w:val="1"/&gt;&lt;w:numFmt w:val="decimal"/&gt;&lt;w:lvlText w:val="%1.%2.%3."/&gt;&lt;w:lvlJc w:val="left"/&gt;&lt;w:pPr&gt;&lt;w:ind w:left="1224" w:hanging="504"/&gt;&lt;/w:pPr&gt;&lt;/w:lvl&gt;&lt;w:lvl w:ilvl="3"&gt;&lt;w:start w:val="1"/&gt;&lt;w:numFmt w:val="decimal"/&gt;&lt;w:lvlText w:val="%1.%2.%3.%4."/&gt;&lt;w:lvlJc w:val="left"/&gt;&lt;w:pPr&gt;&lt;w:ind w:left="1728" w:hanging="648"/&gt;&lt;/w:pPr&gt;&lt;/w:lvl&gt;&lt;w:lvl w:ilvl="4"&gt;&lt;w:start w:val="1"/&gt;&lt;w:numFmt w:val="decimal"/&gt;&lt;w:lvlText w:val="%1.%2.%3.%4.%5."/&gt;&lt;w:lvlJc w:val="left"/&gt;&lt;w:pPr&gt;&lt;w:ind w:left="2232" w:hanging="792"/&gt;&lt;/w:pPr&gt;&lt;/w:lvl&gt;&lt;w:lvl w:ilvl="5"&gt;&lt;w:start w:val="1"/&gt;&lt;w:numFmt w:val="decimal"/&gt;&lt;w:lvlText w:val="%1.%2.%3.%4.%5.%6."/&gt;&lt;w:lvlJc w:val="left"/&gt;&lt;w:pPr&gt;&lt;w:ind w:left="2736" w:hanging="936"/&gt;&lt;/w:pPr&gt;&lt;/w:lvl&gt;&lt;w:lvl w:ilvl="6"&gt;&lt;w:start w:val="1"/&gt;&lt;w:numFmt w:val="decimal"/&gt;&lt;w:lvlText w:val="%1.%2.%3.%4.%5.%6.%7."/&gt;&lt;w:lvlJc w:val="left"/&gt;&lt;w:pPr&gt;&lt;w:ind w:left="3240" w:hanging="1080"/&gt;&lt;/w:pPr&gt;&lt;/w:lvl&gt;&lt;w:lvl w:ilvl="7"&gt;&lt;w:start w:val="1"/&gt;&lt;w:numFmt w:val="decimal"/&gt;&lt;w:lvlText w:val="%1.%2.%3.%4.%5.%6.%7.%8."/&gt;&lt;w:lvlJc w:val="left"/&gt;&lt;w:pPr&gt;&lt;w:ind w:left="3744" w:hanging="1224"/&gt;&lt;/w:pPr&gt;&lt;/w:lvl&gt;&lt;w:lvl w:ilvl="8"&gt;&lt;w:start w:val="1"/&gt;&lt;w:numFmt w:val="decimal"/&gt;&lt;w:lvlText w:val="%1.%2.%3.%4.%5.%6.%7.%8.%9."/&gt;&lt;w:lvlJc w:val="left"/&gt;&lt;w:pPr&gt;&lt;w:ind w:left="4320" w:hanging="1440"/&gt;&lt;/w:pPr&gt;&lt;/w:lvl&gt;&lt;/w:abstractNum&gt;&lt;w:abstractNum w:abstractNumId="13" w15:restartNumberingAfterBreak="0"&gt;&lt;w:nsid w:val="566F2E6D"/&gt;&lt;w:multiLevelType w:val="multilevel"/&gt;&lt;w:tmpl w:val="6FD4AAFC"/&gt;&lt;w:lvl w:ilvl="0"&gt;&lt;w:start w:val="1"/&gt;&lt;w:numFmt w:val="bullet"/&gt;&lt;w:pStyle w:val="ListBullet"/&gt;&lt;w:lvlText w:val="—"/&gt;&lt;w:lvlJc w:val="left"/&gt;&lt;w:pPr&gt;&lt;w:ind w:left="360" w:hanging="360"/&gt;&lt;/w:pPr&gt;&lt;w:rPr&gt;&lt;w:rFonts w:ascii="Calibri" w:hAnsi="Calibri" w:hint="default"/&gt;&lt;w:color w:val="auto"/&gt;&lt;/w:rPr&gt;&lt;/w:lvl&gt;&lt;w:lvl w:ilvl="1"&gt;&lt;w:start w:val="1"/&gt;&lt;w:numFmt w:val="bullet"/&gt;&lt;w:pStyle w:val="ListBullet2"/&gt;&lt;w:lvlText w:val="—"/&gt;&lt;w:lvlJc w:val="left"/&gt;&lt;w:pPr&gt;&lt;w:ind w:left="720" w:hanging="360"/&gt;&lt;/w:pPr&gt;&lt;w:rPr&gt;&lt;w:rFonts w:ascii="Calibri" w:hAnsi="Calibri" w:hint="default"/&gt;&lt;w:color w:val="auto"/&gt;&lt;/w:rPr&gt;&lt;/w:lvl&gt;&lt;w:lvl w:ilvl="2"&gt;&lt;w:start w:val="1"/&gt;&lt;w:numFmt w:val="bullet"/&gt;&lt;w:pStyle w:val="ListBullet3"/&gt;&lt;w:lvlText w:val="—"/&gt;&lt;w:lvlJc w:val="left"/&gt;&lt;w:pPr&gt;&lt;w:ind w:left="1080" w:hanging="360"/&gt;&lt;/w:pPr&gt;&lt;w:rPr&gt;&lt;w:rFonts w:ascii="Calibri" w:hAnsi="Calibri" w:hint="default"/&gt;&lt;w:color w:val="auto"/&gt;&lt;/w:rPr&gt;&lt;/w:lvl&gt;&lt;w:lvl w:ilvl="3"&gt;&lt;w:start w:val="1"/&gt;&lt;w:numFmt w:val="bullet"/&gt;&lt;w:pStyle w:val="ListBullet4"/&gt;&lt;w:lvlText w:val="—"/&gt;&lt;w:lvlJc w:val="left"/&gt;&lt;w:pPr&gt;&lt;w:ind w:left="1440" w:hanging="360"/&gt;&lt;/w:pPr&gt;&lt;w:rPr&gt;&lt;w:rFonts w:ascii="Calibri" w:hAnsi="Calibri" w:hint="default"/&gt;&lt;w:color w:val="auto"/&gt;&lt;/w:rPr&gt;&lt;/w:lvl&gt;&lt;w:lvl w:ilvl="4"&gt;&lt;w:start w:val="1"/&gt;&lt;w:numFmt w:val="bullet"/&gt;&lt;w:pStyle w:val="ListBullet5"/&gt;&lt;w:lvlText w:val="—"/&gt;&lt;w:lvlJc w:val="left"/&gt;&lt;w:pPr&gt;&lt;w:ind w:left="1800" w:hanging="360"/&gt;&lt;/w:pPr&gt;&lt;w:rPr&gt;&lt;w:rFonts w:ascii="Calibri" w:hAnsi="Calibri" w:hint="default"/&gt;&lt;w:color w:val="auto"/&gt;&lt;/w:rPr&gt;&lt;/w:lvl&gt;&lt;w:lvl w:ilvl="5"&gt;&lt;w:start w:val="1"/&gt;&lt;w:numFmt w:val="bullet"/&gt;&lt;w:lvlText w:val="»"/&gt;&lt;w:lvlJc w:val="left"/&gt;&lt;w:pPr&gt;&lt;w:ind w:left="2160" w:hanging="360"/&gt;&lt;/w:pPr&gt;&lt;w:rPr&gt;&lt;w:rFonts w:ascii="Calibri" w:hAnsi="Calibri" w:hint="default"/&gt;&lt;w:color w:val="auto"/&gt;&lt;/w:rPr&gt;&lt;/w:lvl&gt;&lt;w:lvl w:ilvl="6"&gt;&lt;w:start w:val="1"/&gt;&lt;w:numFmt w:val="bullet"/&gt;&lt;w:lvlText w:val="•"/&gt;&lt;w:lvlJc w:val="left"/&gt;&lt;w:pPr&gt;&lt;w:ind w:left="2520" w:hanging="360"/&gt;&lt;/w:pPr&gt;&lt;w:rPr&gt;&lt;w:rFonts w:ascii="Calibri" w:hAnsi="Calibri" w:hint="default"/&gt;&lt;w:color w:val="auto"/&gt;&lt;/w:rPr&gt;&lt;/w:lvl&gt;&lt;w:lvl w:ilvl="7"&gt;&lt;w:start w:val="1"/&gt;&lt;w:numFmt w:val="bullet"/&gt;&lt;w:lvlText w:val="–"/&gt;&lt;w:lvlJc w:val="left"/&gt;&lt;w:pPr&gt;&lt;w:ind w:left="2880" w:hanging="360"/&gt;&lt;/w:pPr&gt;&lt;w:rPr&gt;&lt;w:rFonts w:ascii="Calibri" w:hAnsi="Calibri" w:hint="default"/&gt;&lt;w:color w:val="auto"/&gt;&lt;/w:rPr&gt;&lt;/w:lvl&gt;&lt;w:lvl w:ilvl="8"&gt;&lt;w:start w:val="1"/&gt;&lt;w:numFmt w:val="bullet"/&gt;&lt;w:lvlText w:val="»"/&gt;&lt;w:lvlJc w:val="left"/&gt;&lt;w:pPr&gt;&lt;w:ind w:left="3240" w:hanging="360"/&gt;&lt;/w:pPr&gt;&lt;w:rPr&gt;&lt;w:rFonts w:ascii="Calibri" w:hAnsi="Calibri" w:hint="default"/&gt;&lt;w:color w:val="auto"/&gt;&lt;/w:rPr&gt;&lt;/w:lvl&gt;&lt;/w:abstractNum&gt;&lt;w:num w:numId="1"&gt;&lt;w:abstractNumId w:val="13"/&gt;&lt;/w:num&gt;&lt;w:num w:numId="2"&gt;&lt;w:abstractNumId w:val="7"/&gt;&lt;/w:num&gt;&lt;w:num w:numId="3"&gt;&lt;w:abstractNumId w:val="6"/&gt;&lt;/w:num&gt;&lt;w:num w:numId="4"&gt;&lt;w:abstractNumId w:val="5"/&gt;&lt;/w:num&gt;&lt;w:num w:numId="5"&gt;&lt;w:abstractNumId w:val="4"/&gt;&lt;/w:num&gt;&lt;w:num w:numId="6"&gt;&lt;w:abstractNumId w:val="8"/&gt;&lt;/w:num&gt;&lt;w:num w:numId="7"&gt;&lt;w:abstractNumId w:val="3"/&gt;&lt;/w:num&gt;&lt;w:num w:numId="8"&gt;&lt;w:abstractNumId w:val="2"/&gt;&lt;/w:num&gt;&lt;w:num w:numId="9"&gt;&lt;w:abstractNumId w:val="1"/&gt;&lt;/w:num&gt;&lt;w:num w:numId="10"&gt;&lt;w:abstractNumId w:val="0"/&gt;&lt;/w:num&gt;&lt;w:num w:numId="11"&gt;&lt;w:abstractNumId w:val="13"/&gt;&lt;w:lvlOverride w:ilvl="0"&gt;&lt;w:startOverride w:val="1"/&gt;&lt;/w:lvlOverride&gt;&lt;w:lvlOverride w:ilvl="1"&gt;&lt;w:startOverride w:val="1"/&gt;&lt;/w:lvlOverride&gt;&lt;w:lvlOverride w:ilvl="2"&gt;&lt;w:startOverride w:val="1"/&gt;&lt;/w:lvlOverride&gt;&lt;w:lvlOverride w:ilvl="3"&gt;&lt;w:startOverride w:val="1"/&gt;&lt;/w:lvlOverride&gt;&lt;w:lvlOverride w:ilvl="4"&gt;&lt;w:startOverride w:val="1"/&gt;&lt;/w:lvlOverride&gt;&lt;w:lvlOverride w:ilvl="5"&gt;&lt;w:startOverride w:val="1"/&gt;&lt;/w:lvlOverride&gt;&lt;w:lvlOverride w:ilvl="6"&gt;&lt;w:startOverride w:val="1"/&gt;&lt;/w:lvlOverride&gt;&lt;w:lvlOverride w:ilvl="7"&gt;&lt;w:startOverride w:val="1"/&gt;&lt;/w:lvlOverride&gt;&lt;w:lvlOverride w:ilvl="8"&gt;&lt;w:startOverride w:val="1"/&gt;&lt;/w:lvlOverride&gt;&lt;/w:num&gt;&lt;w:num w:numId="12"&gt;&lt;w:abstractNumId w:val="11"/&gt;&lt;/w:num&gt;&lt;w:num w:numId="13"&gt;&lt;w:abstractNumId w:val="12"/&gt;&lt;/w:num&gt;&lt;w:num w:numId="14"&gt;&lt;w:abstractNumId w:val="9"/&gt;&lt;/w:num&gt;&lt;w:num w:numId="15"&gt;&lt;w:abstractNumId w:val="10"/&gt;&lt;/w:num&gt;&lt;/w:numbering&gt;&lt;/pkg:xmlData&gt;&lt;/pkg:part&gt;&lt;/pkg:package&gt;
-</Titel>
-      <TelefonPersonlig>
-			</TelefonPersonlig>
-      <EmailPersonlig>
-			</EmailPersonlig>
-    </Personinfo>
-  </KontaktuppgifterForetag>
-  <KontaktuppgifterKund>
-    <ForetagKund>
-		</ForetagKund>
-    <OrgnrKund>
-		</OrgnrKund>
-    <TelefonKund>
-		</TelefonKund>
-    <EmailKund>
-		</EmailKund>
-    <BesoksadressKund>
-		</BesoksadressKund>
-    <PostAdressKund>
-		</PostAdressKund>
-    <GataKund>
-		</GataKund>
-    <PostnummerKund>
-		</PostnummerKund>
-    <OrtKund>
-		</OrtKund>
-    <PersoninfoKund>
-      <NamnKund>
-			</NamnKund>
-      <TitelKund>
-			</TitelKund>
-      <TelefonPersonligKund>
-			</TelefonPersonligKund>
-      <EmailPersonligKund>
-			</EmailPersonligKund>
-    </PersoninfoKund>
-  </KontaktuppgifterKund>
-  <Rapportinfo>
-    <Ar>
-		</Ar>
-    <Kvartal>
-		</Kvartal>
-    <Period>
-		</Period>
-    <Manad>
-		</Manad>
-    <Nuvarandemanad>
-		</Nuvarandemanad>
-    <Foregaendemanad>
-		</Foregaendemanad>
-    <Rapportdatum>
-		</Rapportdatum>
-  </Rapportinfo>
-  <Ekonomiinfo>
-    <Belopp>
-		</Belopp>
-    <Summa>
-		</Summa>
-  </Ekonomiinfo>
-</Rehngruppen10>
+<?mso-contentType ?>
+<FormTemplates xmlns="http://schemas.microsoft.com/sharepoint/v3/contenttype/forms">
+  <Display>DocumentLibraryForm</Display>
+  <Edit>DocumentLibraryForm</Edit>
+  <New>DocumentLibraryForm</New>
+</FormTemplates>
 </file>
 
 <file path=customXml/item2.xml><?xml version="1.0" encoding="utf-8"?>
-<b:Sources xmlns:b="http://schemas.openxmlformats.org/officeDocument/2006/bibliography" xmlns="http://schemas.openxmlformats.org/officeDocument/2006/bibliography" SelectedStyle="\APASixthEditionOfficeOnline.xsl" StyleName="APA" Version="6"/>
-</file>
-
-<file path=customXml/item3.xml><?xml version="1.0" encoding="utf-8"?>
 <ct:contentTypeSchema xmlns:ct="http://schemas.microsoft.com/office/2006/metadata/contentType" xmlns:ma="http://schemas.microsoft.com/office/2006/metadata/properties/metaAttributes" ct:_="" ma:_="" ma:contentTypeName="dokument" ma:contentTypeID="0x010100129BBCBF21362E4099AE6C2F27C58737" ma:contentTypeVersion="16" ma:contentTypeDescription="Skapa ett nytt dokument." ma:contentTypeScope="" ma:versionID="0d7d7d75af5cc18099c16a95b367d914">
   <xsd:schema xmlns:xsd="http://www.w3.org/2001/XMLSchema" xmlns:xs="http://www.w3.org/2001/XMLSchema" xmlns:p="http://schemas.microsoft.com/office/2006/metadata/properties" xmlns:ns2="10c3a147-0d64-46aa-a281-dc97358e8373" xmlns:ns3="d7532cd0-e888-47d6-8f58-db0210f25002" targetNamespace="http://schemas.microsoft.com/office/2006/metadata/properties" ma:root="true" ma:fieldsID="200b5d1f0c33c4436e6ab0a9b524dcd2" ns2:_="" ns3:_="">
     <xsd:import namespace="10c3a147-0d64-46aa-a281-dc97358e8373"/>
@@ -5609,13 +5478,113 @@
 </ct:contentTypeSchema>
 </file>
 
+<file path=customXml/item3.xml><?xml version="1.0" encoding="utf-8"?>
+<b:Sources xmlns:b="http://schemas.openxmlformats.org/officeDocument/2006/bibliography" xmlns="http://schemas.openxmlformats.org/officeDocument/2006/bibliography" SelectedStyle="\APASixthEditionOfficeOnline.xsl" StyleName="APA" Version="6"/>
+</file>
+
 <file path=customXml/item4.xml><?xml version="1.0" encoding="utf-8"?>
-<?mso-contentType ?>
-<FormTemplates xmlns="http://schemas.microsoft.com/sharepoint/v3/contenttype/forms">
-  <Display>DocumentLibraryForm</Display>
-  <Edit>DocumentLibraryForm</Edit>
-  <New>DocumentLibraryForm</New>
-</FormTemplates>
+<Rehngruppen10>
+  <Dokumentinfo>
+    <Rubrik>
+		</Rubrik>
+    <Underrubrik>
+		</Underrubrik>
+    <Disclaimer>
+		</Disclaimer>
+    <Version>
+		</Version>
+    <Dokumenttyp>
+		</Dokumenttyp>
+    <Informationsklassificering>
+		</Informationsklassificering>
+    <Datum/>
+  </Dokumentinfo>
+  <KontaktuppgifterForetag>
+    <Foretag>
+		</Foretag>
+    <Orgnr>
+		</Orgnr>
+    <TelefonForetag>
+		</TelefonForetag>
+    <EmailForetag>
+		</EmailForetag>
+    <Besoksadress>
+		</Besoksadress>
+    <PostAdress>
+		</PostAdress>
+    <Gata>
+		</Gata>
+    <Postnummer>
+		</Postnummer>
+    <Ort/>
+    <Personinfo>
+      <Namn>&lt;?xml version="1.0" standalone="yes"?&gt;
+&lt;?mso-application progid="Word.Document"?&gt;
+&lt;pkg:package xmlns:pkg="http://schemas.microsoft.com/office/2006/xmlPackage"&gt;&lt;pkg:part pkg:name="/_rels/.rels" pkg:contentType="application/vnd.openxmlformats-package.relationships+xml" pkg:padding="512"&gt;&lt;pkg:xmlData&gt;&lt;Relationships xmlns="http://schemas.openxmlformats.org/package/2006/relationships"&gt;&lt;Relationship Id="rId1" Type="http://schemas.openxmlformats.org/officeDocument/2006/relationships/officeDocument" Target="word/document.xml"/&gt;&lt;/Relationships&gt;&lt;/pkg:xmlData&gt;&lt;/pkg:part&gt;&lt;pkg:part pkg:name="/word/_rels/document.xml.rels" pkg:contentType="application/vnd.openxmlformats-package.relationships+xml" pkg:padding="256"&gt;&lt;pkg:xmlData&gt;&lt;Relationships xmlns="http://schemas.openxmlformats.org/package/2006/relationships"&gt;&lt;Relationship Id="rId3" Type="http://schemas.openxmlformats.org/officeDocument/2006/relationships/glossaryDocument" Target="glossary/document.xml"/&gt;&lt;Relationship Id="rId2" Type="http://schemas.openxmlformats.org/officeDocument/2006/relationships/styles" Target="styles.xml"/&gt;&lt;Relationship Id="rId1" Type="http://schemas.openxmlformats.org/officeDocument/2006/relationships/numbering" Target="numbering.xml"/&gt;&lt;/Relationships&gt;&lt;/pkg:xmlData&gt;&lt;/pkg:part&gt;&lt;pkg:part pkg:name="/word/document.xml" pkg:contentType="application/vnd.openxmlformats-officedocument.wordprocessingml.document.main+xml"&gt;&lt;pkg:xmlData&gt;&lt;w:document xmlns:wpc="http://schemas.microsoft.com/office/word/2010/wordprocessingCanvas" xmlns:cx="http://schemas.microsoft.com/office/drawing/2014/chartex" xmlns:cx1="http://schemas.microsoft.com/office/drawing/2015/9/8/chartex" xmlns:cx2="http://schemas.microsoft.com/office/drawing/2015/10/21/chartex" xmlns:cx3="http://schemas.microsoft.com/office/drawing/2016/5/9/chartex" xmlns:cx4="http://schemas.microsoft.com/office/drawing/2016/5/10/chartex" xmlns:cx5="http://schemas.microsoft.com/office/drawing/2016/5/11/chartex" xmlns:cx6="http://schemas.microsoft.com/office/drawing/2016/5/12/chartex" xmlns:cx7="http://schemas.microsoft.com/office/drawing/2016/5/13/chartex" xmlns:cx8="http://schemas.microsoft.com/office/drawing/2016/5/14/chartex" xmlns:mc="http://schemas.openxmlformats.org/markup-compatibility/2006" xmlns:o="urn:schemas-microsoft-com:office:office" xmlns:r="http://schemas.openxmlformats.org/officeDocument/2006/relationships" xmlns:m="http://schemas.openxmlformats.org/officeDocument/2006/math" xmlns:v="urn:schemas-microsoft-com:vml" xmlns:wp14="http://schemas.microsoft.com/office/word/2010/wordprocessingDrawing" xmlns:wp="http://schemas.openxmlformats.org/drawingml/2006/wordprocessingDrawing" xmlns:w10="urn:schemas-microsoft-com:office:word" xmlns:w="http://schemas.openxmlformats.org/wordprocessingml/2006/main" xmlns:w14="http://schemas.microsoft.com/office/word/2010/wordml" xmlns:w15="http://schemas.microsoft.com/office/word/2012/wordml" xmlns:w16se="http://schemas.microsoft.com/office/word/2015/wordml/symex" xmlns:wpg="http://schemas.microsoft.com/office/word/2010/wordprocessingGroup" xmlns:wpi="http://schemas.microsoft.com/office/word/2010/wordprocessingInk" xmlns:wne="http://schemas.microsoft.com/office/word/2006/wordml" xmlns:wps="http://schemas.microsoft.com/office/word/2010/wordprocessingShape" mc:Ignorable="w14 w15 w16se wp14"&gt;&lt;w:body&gt;&lt;w:sdt&gt;&lt;w:sdtPr&gt;&lt;w:tag w:val="regName"/&gt;&lt;w:id w:val="-1755663995"/&gt;&lt;w:placeholder&gt;&lt;w:docPart w:val="B7CF53EBD28C4270BBC51AAB20A1C895"/&gt;&lt;/w:placeholder&gt;&lt;/w:sdtPr&gt;&lt;w:sdtContent&gt;&lt;w:p&gt;&lt;w:pPr&gt;&lt;w:pStyle w:val="Name"/&gt;&lt;w:cnfStyle w:val="001000000000" w:firstRow="0" w:lastRow="0" w:firstColumn="1" w:lastColumn="0" w:oddVBand="0" w:evenVBand="0" w:oddHBand="0" w:evenHBand="0" w:firstRowFirstColumn="0" w:firstRowLastColumn="0" w:lastRowFirstColumn="0" w:lastRowLastColumn="0"/&gt;&lt;/w:pPr&gt;&lt;w:r&gt;&lt;w:t&gt;Maria Dahlstrand&lt;/w:t&gt;&lt;/w:r&gt;&lt;/w:p&gt;&lt;/w:sdtContent&gt;&lt;/w:sdt&gt;&lt;w:p/&gt;&lt;w:sectPr&gt;&lt;w:pgSz w:w="12240" w:h="15840"/&gt;&lt;w:pgMar w:top="1417" w:right="1417" w:bottom="1417" w:left="1417" w:header="720" w:footer="720" w:gutter="0"/&gt;&lt;w:cols w:space="720"/&gt;&lt;/w:sectPr&gt;&lt;/w:body&gt;&lt;/w:document&gt;&lt;/pkg:xmlData&gt;&lt;/pkg:part&gt;&lt;pkg:part pkg:name="/word/glossary/settings.xml" pkg:contentType="application/vnd.openxmlformats-officedocument.wordprocessingml.settings+xml"&gt;&lt;pkg:xmlData&gt;&lt;w:settings xmlns:mc="http://schemas.openxmlformats.org/markup-compatibility/2006" xmlns:o="urn:schemas-microsoft-com:office:office" xmlns:r="http://schemas.openxmlformats.org/officeDocument/2006/relationships" xmlns:m="http://schemas.openxmlformats.org/officeDocument/2006/math" xmlns:v="urn:schemas-microsoft-com:vml" xmlns:w10="urn:schemas-microsoft-com:office:word" xmlns:w="http://schemas.openxmlformats.org/wordprocessingml/2006/main" xmlns:w14="http://schemas.microsoft.com/office/word/2010/wordml" xmlns:w15="http://schemas.microsoft.com/office/word/2012/wordml" xmlns:w16se="http://schemas.microsoft.com/office/word/2015/wordml/symex" xmlns:sl="http://schemas.openxmlformats.org/schemaLibrary/2006/main" mc:Ignorable="w14 w15 w16se"&gt;&lt;w:view w:val="normal"/&gt;&lt;w:defaultTabStop w:val="720"/&gt;&lt;w:characterSpacingControl w:val="doNotCompress"/&gt;&lt;w:compat&gt;&lt;w:useFELayout/&gt;&lt;w:compatSetting w:name="compatibilityMode" w:uri="http://schemas.microsoft.com/office/word" w:val="15"/&gt;&lt;w:compatSetting w:name="overrideTableStyleFontSizeAndJustification" w:uri="http://schemas.microsoft.com/office/word" w:val="1"/&gt;&lt;w:compatSetting w:name="enableOpenTypeFeatures" w:uri="http://schemas.microsoft.com/office/word" w:val="1"/&gt;&lt;w:compatSetting w:name="doNotFlipMirrorIndents" w:uri="http://schemas.microsoft.com/office/word" w:val="1"/&gt;&lt;w:compatSetting w:name="differentiateMultirowTableHeaders" w:uri="http://schemas.microsoft.com/office/word" w:val="1"/&gt;&lt;/w:compat&gt;&lt;m:mathPr&gt;&lt;m:mathFont m:val="Cambria Math"/&gt;&lt;m:brkBin m:val="before"/&gt;&lt;m:brkBinSub m:val="--"/&gt;&lt;m:smallFrac m:val="0"/&gt;&lt;m:dispDef/&gt;&lt;m:lMargin m:val="0"/&gt;&lt;m:rMargin m:val="0"/&gt;&lt;m:defJc m:val="centerGroup"/&gt;&lt;m:wrapIndent m:val="1440"/&gt;&lt;m:intLim m:val="subSup"/&gt;&lt;m:naryLim m:val="undOvr"/&gt;&lt;/m:mathPr&gt;&lt;w:themeFontLang w:val="en-GB"/&gt;&lt;w:clrSchemeMapping w:bg1="light1" w:t1="dark1" w:bg2="light2" w:t2="dark2" w:accent1="accent1" w:accent2="accent2" w:accent3="accent3" w:accent4="accent4" w:accent5="accent5" w:accent6="accent6" w:hyperlink="hyperlink" w:followedHyperlink="followedHyperlink"/&gt;&lt;w:decimalSymbol w:val=","/&gt;&lt;w:listSeparator w:val=";"/&gt;&lt;w15:chartTrackingRefBased/&gt;&lt;/w:settings&gt;&lt;/pkg:xmlData&gt;&lt;/pkg:part&gt;&lt;pkg:part pkg:name="/word/glossary/_rels/document.xml.rels" pkg:contentType="application/vnd.openxmlformats-package.relationships+xml"&gt;&lt;pkg:xmlData&gt;&lt;Relationships xmlns="http://schemas.openxmlformats.org/package/2006/relationships"&gt;&lt;Relationship Id="rId3" Type="http://schemas.openxmlformats.org/officeDocument/2006/relationships/webSettings" Target="webSettings.xml"/&gt;&lt;Relationship Id="rId2" Type="http://schemas.openxmlformats.org/officeDocument/2006/relationships/settings" Target="settings.xml"/&gt;&lt;Relationship Id="rId1" Type="http://schemas.openxmlformats.org/officeDocument/2006/relationships/styles" Target="styles.xml"/&gt;&lt;Relationship Id="rId4" Type="http://schemas.openxmlformats.org/officeDocument/2006/relationships/fontTable" Target="fontTable.xml"/&gt;&lt;/Relationships&gt;&lt;/pkg:xmlData&gt;&lt;/pkg:part&gt;&lt;pkg:part pkg:name="/word/glossary/document.xml" pkg:contentType="application/vnd.openxmlformats-officedocument.wordprocessingml.document.glossary+xml"&gt;&lt;pkg:xmlData&gt;&lt;w:glossaryDocument xmlns:wpc="http://schemas.microsoft.com/office/word/2010/wordprocessingCanvas" xmlns:cx="http://schemas.microsoft.com/office/drawing/2014/chartex" xmlns:cx1="http://schemas.microsoft.com/office/drawing/2015/9/8/chartex" xmlns:cx2="http://schemas.microsoft.com/office/drawing/2015/10/21/chartex" xmlns:cx3="http://schemas.microsoft.com/office/drawing/2016/5/9/chartex" xmlns:cx4="http://schemas.microsoft.com/office/drawing/2016/5/10/chartex" xmlns:cx5="http://schemas.microsoft.com/office/drawing/2016/5/11/chartex" xmlns:cx6="http://schemas.microsoft.com/office/drawing/2016/5/12/chartex" xmlns:cx7="http://schemas.microsoft.com/office/drawing/2016/5/13/chartex" xmlns:cx8="http://schemas.microsoft.com/office/drawing/2016/5/14/chartex" xmlns:mc="http://schemas.openxmlformats.org/markup-compatibility/2006" xmlns:o="urn:schemas-microsoft-com:office:office" xmlns:r="http://schemas.openxmlformats.org/officeDocument/2006/relationships" xmlns:m="http://schemas.openxmlformats.org/officeDocument/2006/math" xmlns:v="urn:schemas-microsoft-com:vml" xmlns:wp14="http://schemas.microsoft.com/office/word/2010/wordprocessingDrawing" xmlns:wp="http://schemas.openxmlformats.org/drawingml/2006/wordprocessingDrawing" xmlns:w10="urn:schemas-microsoft-com:office:word" xmlns:w="http://schemas.openxmlformats.org/wordprocessingml/2006/main" xmlns:w14="http://schemas.microsoft.com/office/word/2010/wordml" xmlns:w15="http://schemas.microsoft.com/office/word/2012/wordml" xmlns:w16se="http://schemas.microsoft.com/office/word/2015/wordml/symex" xmlns:wpg="http://schemas.microsoft.com/office/word/2010/wordprocessingGroup" xmlns:wpi="http://schemas.microsoft.com/office/word/2010/wordprocessingInk" xmlns:wne="http://schemas.microsoft.com/office/word/2006/wordml" xmlns:wps="http://schemas.microsoft.com/office/word/2010/wordprocessingShape" mc:Ignorable="w14 w15 w16se wp14"&gt;&lt;w:docParts&gt;&lt;w:docPart&gt;&lt;w:docPartPr&gt;&lt;w:name w:val="B7CF53EBD28C4270BBC51AAB20A1C895"/&gt;&lt;w:category&gt;&lt;w:name w:val="General"/&gt;&lt;w:gallery w:val="placeholder"/&gt;&lt;/w:category&gt;&lt;w:types&gt;&lt;w:type w:val="bbPlcHdr"/&gt;&lt;/w:types&gt;&lt;w:behaviors&gt;&lt;w:behavior w:val="content"/&gt;&lt;/w:behaviors&gt;&lt;w:guid w:val="{F7D69E8F-087E-454A-99F4-5E3C0519DD23}"/&gt;&lt;/w:docPartPr&gt;&lt;w:docPartBody&gt;&lt;w:p&gt;&lt;w:pPr&gt;&lt;w:pStyle w:val="B7CF53EBD28C4270BBC51AAB20A1C895"/&gt;&lt;/w:pPr&gt;&lt;w:r&gt;&lt;w:rPr&gt;&lt;w:rStyle w:val="PlaceholderText"/&gt;&lt;/w:rPr&gt;&lt;w:t&gt;Click or tap here to enter text.&lt;/w:t&gt;&lt;/w:r&gt;&lt;/w:p&gt;&lt;/w:docPartBody&gt;&lt;/w:docPart&gt;&lt;/w:docParts&gt;&lt;/w:glossaryDocument&gt;&lt;/pkg:xmlData&gt;&lt;/pkg:part&gt;&lt;pkg:part pkg:name="/word/glossary/styles.xml" pkg:contentType="application/vnd.openxmlformats-officedocument.wordprocessingml.styles+xml"&gt;&lt;pkg:xmlData&gt;&lt;w:styles xmlns:mc="http://schemas.openxmlformats.org/markup-compatibility/2006" xmlns:r="http://schemas.openxmlformats.org/officeDocument/2006/relationships" xmlns:w="http://schemas.openxmlformats.org/wordprocessingml/2006/main" xmlns:w14="http://schemas.microsoft.com/office/word/2010/wordml" xmlns:w15="http://schemas.microsoft.com/office/word/2012/wordml" xmlns:w16se="http://schemas.microsoft.com/office/word/2015/wordml/symex" mc:Ignorable="w14 w15 w16se"&gt;&lt;w:docDefaults&gt;&lt;w:rPrDefault&gt;&lt;w:rPr&gt;&lt;w:rFonts w:asciiTheme="minorHAnsi" w:eastAsiaTheme="minorEastAsia" w:hAnsiTheme="minorHAnsi" w:cstheme="minorBidi"/&gt;&lt;w:sz w:val="22"/&gt;&lt;w:szCs w:val="22"/&gt;&lt;w:lang w:val="en-GB" w:eastAsia="en-GB" w:bidi="ar-SA"/&gt;&lt;/w:rPr&gt;&lt;/w:rPrDefault&gt;&lt;w:pPrDefault&gt;&lt;w:pPr&gt;&lt;w:spacing w:after="160" w:line="259" w:lineRule="auto"/&gt;&lt;/w:pPr&gt;&lt;/w:pPrDefault&gt;&lt;/w:docDefaults&gt;&lt;w:latentStyles w:defLockedState="0" w:defUIPriority="99" w:defSemiHidden="0" w:defUnhideWhenUsed="0" w:defQFormat="0" w:count="374"&gt;&lt;w:lsdException w:name="Normal" w:uiPriority="0" w:qFormat="1"/&gt;&lt;w:lsdException w:name="heading 1" w:uiPriority="9" w:qFormat="1"/&gt;&lt;w:lsdException w:name="heading 2" w:semiHidden="1" w:uiPriority="9" w:unhideWhenUsed="1" w:qFormat="1"/&gt;&lt;w:lsdException w:name="heading 3" w:semiHidden="1" w:uiPriority="9" w:unhideWhenUsed="1" w:qFormat="1"/&gt;&lt;w:lsdException w:name="heading 4" w:semiHidden="1" w:uiPriority="9" w:unhideWhenUsed="1" w:qFormat="1"/&gt;&lt;w:lsdException w:name="heading 5" w:semiHidden="1" w:uiPriority="9" w:unhideWhenUsed="1" w:qFormat="1"/&gt;&lt;w:lsdException w:name="heading 6" w:semiHidden="1" w:uiPriority="9" w:unhideWhenUsed="1" w:qFormat="1"/&gt;&lt;w:lsdException w:name="heading 7" w:semiHidden="1" w:uiPriority="9" w:unhideWhenUsed="1" w:qFormat="1"/&gt;&lt;w:lsdException w:name="heading 8" w:semiHidden="1" w:uiPriority="9" w:unhideWhenUsed="1" w:qFormat="1"/&gt;&lt;w:lsdException w:name="heading 9" w:semiHidden="1" w:uiPriority="9" w:unhideWhenUsed="1" w:qFormat="1"/&gt;&lt;w:lsdException w:name="index 1" w:semiHidden="1" w:unhideWhenUsed="1"/&gt;&lt;w:lsdException w:name="index 2" w:semiHidden="1" w:unhideWhenUsed="1"/&gt;&lt;w:lsdException w:name="index 3" w:semiHidden="1" w:unhideWhenUsed="1"/&gt;&lt;w:lsdException w:name="index 4" w:semiHidden="1" w:unhideWhenUsed="1"/&gt;&lt;w:lsdException w:name="index 5" w:semiHidden="1" w:unhideWhenUsed="1"/&gt;&lt;w:lsdException w:name="index 6" w:semiHidden="1" w:unhideWhenUsed="1"/&gt;&lt;w:lsdException w:name="index 7" w:semiHidden="1" w:unhideWhenUsed="1"/&gt;&lt;w:lsdException w:name="index 8" w:semiHidden="1" w:unhideWhenUsed="1"/&gt;&lt;w:lsdException w:name="index 9" w:semiHidden="1" w:unhideWhenUsed="1"/&gt;&lt;w:lsdException w:name="toc 1" w:semiHidden="1" w:uiPriority="39" w:unhideWhenUsed="1"/&gt;&lt;w:lsdException w:name="toc 2" w:semiHidden="1" w:uiPriority="39" w:unhideWhenUsed="1"/&gt;&lt;w:lsdException w:name="toc 3" w:semiHidden="1" w:uiPriority="39" w:unhideWhenUsed="1"/&gt;&lt;w:lsdException w:name="toc 4" w:semiHidden="1" w:uiPriority="39" w:unhideWhenUsed="1"/&gt;&lt;w:lsdException w:name="toc 5" w:semiHidden="1" w:uiPriority="39" w:unhideWhenUsed="1"/&gt;&lt;w:lsdException w:name="toc 6" w:semiHidden="1" w:uiPriority="39" w:unhideWhenUsed="1"/&gt;&lt;w:lsdException w:name="toc 7" w:semiHidden="1" w:uiPriority="39" w:unhideWhenUsed="1"/&gt;&lt;w:lsdException w:name="toc 8" w:semiHidden="1" w:uiPriority="39" w:unhideWhenUsed="1"/&gt;&lt;w:lsdException w:name="toc 9" w:semiHidden="1" w:uiPriority="39" w:unhideWhenUsed="1"/&gt;&lt;w:lsdException w:name="Normal Indent" w:semiHidden="1" w:unhideWhenUsed="1"/&gt;&lt;w:lsdException w:name="footnote text" w:semiHidden="1" w:unhideWhenUsed="1"/&gt;&lt;w:lsdException w:name="annotation text" w:semiHidden="1" w:unhideWhenUsed="1"/&gt;&lt;w:lsdException w:name="header" w:semiHidden="1" w:unhideWhenUsed="1"/&gt;&lt;w:lsdException w:name="footer" w:semiHidden="1" w:unhideWhenUsed="1"/&gt;&lt;w:lsdException w:name="index heading" w:semiHidden="1" w:unhideWhenUsed="1"/&gt;&lt;w:lsdException w:name="caption" w:semiHidden="1" w:uiPriority="35" w:unhideWhenUsed="1" w:qFormat="1"/&gt;&lt;w:lsdException w:name="table of figures" w:semiHidden="1" w:unhideWhenUsed="1"/&gt;&lt;w:lsdException w:name="envelope address" w:semiHidden="1" w:unhideWhenUsed="1"/&gt;&lt;w:lsdException w:name="envelope return" w:semiHidden="1" w:unhideWhenUsed="1"/&gt;&lt;w:lsdException w:name="footnote reference" w:semiHidden="1" w:unhideWhenUsed="1"/&gt;&lt;w:lsdException w:name="annotation reference" w:semiHidden="1" w:unhideWhenUsed="1"/&gt;&lt;w:lsdException w:name="line number" w:semiHidden="1" w:unhideWhenUsed="1"/&gt;&lt;w:lsdException w:name="page number" w:semiHidden="1" w:unhideWhenUsed="1"/&gt;&lt;w:lsdException w:name="endnote reference" w:semiHidden="1" w:unhideWhenUsed="1"/&gt;&lt;w:lsdException w:name="endnote text" w:semiHidden="1" w:unhideWhenUsed="1"/&gt;&lt;w:lsdException w:name="table of authorities" w:semiHidden="1" w:unhideWhenUsed="1"/&gt;&lt;w:lsdException w:name="macro" w:semiHidden="1" w:unhideWhenUsed="1"/&gt;&lt;w:lsdException w:name="toa heading" w:semiHidden="1" w:unhideWhenUsed="1"/&gt;&lt;w:lsdException w:name="List" w:semiHidden="1" w:unhideWhenUsed="1"/&gt;&lt;w:lsdException w:name="List Bullet" w:semiHidden="1" w:unhideWhenUsed="1"/&gt;&lt;w:lsdException w:name="List Number" w:semiHidden="1" w:unhideWhenUsed="1"/&gt;&lt;w:lsdException w:name="List 2" w:semiHidden="1" w:unhideWhenUsed="1"/&gt;&lt;w:lsdException w:name="List 3" w:semiHidden="1" w:unhideWhenUsed="1"/&gt;&lt;w:lsdException w:name="List 4" w:semiHidden="1" w:unhideWhenUsed="1"/&gt;&lt;w:lsdException w:name="List 5" w:semiHidden="1" w:unhideWhenUsed="1"/&gt;&lt;w:lsdException w:name="List Bullet 2" w:semiHidden="1" w:unhideWhenUsed="1"/&gt;&lt;w:lsdException w:name="List Bullet 3" w:semiHidden="1" w:unhideWhenUsed="1"/&gt;&lt;w:lsdException w:name="List Bullet 4" w:semiHidden="1" w:unhideWhenUsed="1"/&gt;&lt;w:lsdException w:name="List Bullet 5" w:semiHidden="1" w:unhideWhenUsed="1"/&gt;&lt;w:lsdException w:name="List Number 2" w:semiHidden="1" w:unhideWhenUsed="1"/&gt;&lt;w:lsdException w:name="List Number 3" w:semiHidden="1" w:unhideWhenUsed="1"/&gt;&lt;w:lsdException w:name="List Number 4" w:semiHidden="1" w:unhideWhenUsed="1"/&gt;&lt;w:lsdException w:name="List Number 5" w:semiHidden="1" w:unhideWhenUsed="1"/&gt;&lt;w:lsdException w:name="Title" w:uiPriority="10" w:qFormat="1"/&gt;&lt;w:lsdException w:name="Closing" w:semiHidden="1" w:unhideWhenUsed="1"/&gt;&lt;w:lsdException w:name="Signature" w:semiHidden="1" w:unhideWhenUsed="1"/&gt;&lt;w:lsdException w:name="Default Paragraph Font" w:semiHidden="1" w:uiPriority="1" w:unhideWhenUsed="1"/&gt;&lt;w:lsdException w:name="Body Text" w:semiHidden="1" w:unhideWhenUsed="1"/&gt;&lt;w:lsdException w:name="Body Text Indent" w:semiHidden="1" w:unhideWhenUsed="1"/&gt;&lt;w:lsdException w:name="List Continue" w:semiHidden="1" w:unhideWhenUsed="1"/&gt;&lt;w:lsdException w:name="List Continue 2" w:semiHidden="1" w:unhideWhenUsed="1"/&gt;&lt;w:lsdException w:name="List Continue 3" w:semiHidden="1" w:unhideWhenUsed="1"/&gt;&lt;w:lsdException w:name="List Continue 4" w:semiHidden="1" w:unhideWhenUsed="1"/&gt;&lt;w:lsdException w:name="List Continue 5" w:semiHidden="1" w:unhideWhenUsed="1"/&gt;&lt;w:lsdException w:name="Message Header" w:semiHidden="1" w:unhideWhenUsed="1"/&gt;&lt;w:lsdException w:name="Subtitle" w:uiPriority="11" w:qFormat="1"/&gt;&lt;w:lsdException w:name="Salutation" w:semiHidden="1" w:unhideWhenUsed="1"/&gt;&lt;w:lsdException w:name="Date" w:semiHidden="1" w:unhideWhenUsed="1"/&gt;&lt;w:lsdException w:name="Body Text First Indent" w:semiHidden="1" w:unhideWhenUsed="1"/&gt;&lt;w:lsdException w:name="Body Text First Indent 2" w:semiHidden="1" w:unhideWhenUsed="1"/&gt;&lt;w:lsdException w:name="Note Heading" w:semiHidden="1" w:unhideWhenUsed="1"/&gt;&lt;w:lsdException w:name="Body Text 2" w:semiHidden="1" w:unhideWhenUsed="1"/&gt;&lt;w:lsdException w:name="Body Text 3" w:semiHidden="1" w:unhideWhenUsed="1"/&gt;&lt;w:lsdException w:name="Body Text Indent 2" w:semiHidden="1" w:unhideWhenUsed="1"/&gt;&lt;w:lsdException w:name="Body Text Indent 3" w:semiHidden="1" w:unhideWhenUsed="1"/&gt;&lt;w:lsdException w:name="Block Text" w:semiHidden="1" w:unhideWhenUsed="1"/&gt;&lt;w:lsdException w:name="Hyperlink" w:semiHidden="1" w:unhideWhenUsed="1"/&gt;&lt;w:lsdException w:name="FollowedHyperlink" w:semiHidden="1" w:unhideWhenUsed="1"/&gt;&lt;w:lsdException w:name="Strong" w:uiPriority="22" w:qFormat="1"/&gt;&lt;w:lsdException w:name="Emphasis" w:uiPriority="20" w:qFormat="1"/&gt;&lt;w:lsdException w:name="Document Map" w:semiHidden="1" w:unhideWhenUsed="1"/&gt;&lt;w:lsdException w:name="Plain Text" w:semiHidden="1" w:unhideWhenUsed="1"/&gt;&lt;w:lsdException w:name="E-mail Signature" w:semiHidden="1" w:unhideWhenUsed="1"/&gt;&lt;w:lsdException w:name="HTML Top of Form" w:semiHidden="1" w:unhideWhenUsed="1"/&gt;&lt;w:lsdException w:name="HTML Bottom of Form" w:semiHidden="1" w:unhideWhenUsed="1"/&gt;&lt;w:lsdException w:name="Normal (Web)" w:semiHidden="1" w:unhideWhenUsed="1"/&gt;&lt;w:lsdException w:name="HTML Acronym" w:semiHidden="1" w:unhideWhenUsed="1"/&gt;&lt;w:lsdException w:name="HTML Address" w:semiHidden="1" w:unhideWhenUsed="1"/&gt;&lt;w:lsdException w:name="HTML Cite" w:semiHidden="1" w:unhideWhenUsed="1"/&gt;&lt;w:lsdException w:name="HTML Code" w:semiHidden="1" w:unhideWhenUsed="1"/&gt;&lt;w:lsdException w:name="HTML Definition" w:semiHidden="1" w:unhideWhenUsed="1"/&gt;&lt;w:lsdException w:name="HTML Keyboard" w:semiHidden="1" w:unhideWhenUsed="1"/&gt;&lt;w:lsdException w:name="HTML Preformatted" w:semiHidden="1" w:unhideWhenUsed="1"/&gt;&lt;w:lsdException w:name="HTML Sample" w:semiHidden="1" w:unhideWhenUsed="1"/&gt;&lt;w:lsdException w:name="HTML Typewriter" w:semiHidden="1" w:unhideWhenUsed="1"/&gt;&lt;w:lsdException w:name="HTML Variable" w:semiHidden="1" w:unhideWhenUsed="1"/&gt;&lt;w:lsdException w:name="Normal Table" w:semiHidden="1" w:unhideWhenUsed="1"/&gt;&lt;w:lsdException w:name="annotation subject" w:semiHidden="1" w:unhideWhenUsed="1"/&gt;&lt;w:lsdException w:name="No List" w:semiHidden="1" w:unhideWhenUsed="1"/&gt;&lt;w:lsdException w:name="Outline List 1" w:semiHidden="1" w:unhideWhenUsed="1"/&gt;&lt;w:lsdException w:name="Outline List 2" w:semiHidden="1" w:unhideWhenUsed="1"/&gt;&lt;w:lsdException w:name="Outline List 3" w:semiHidden="1" w:unhideWhenUsed="1"/&gt;&lt;w:lsdException w:name="Table Simple 1" w:semiHidden="1" w:unhideWhenUsed="1"/&gt;&lt;w:lsdException w:name="Table Simple 2" w:semiHidden="1" w:unhideWhenUsed="1"/&gt;&lt;w:lsdException w:name="Table Simple 3" w:semiHidden="1" w:unhideWhenUsed="1"/&gt;&lt;w:lsdException w:name="Table Classic 1" w:semiHidden="1" w:unhideWhenUsed="1"/&gt;&lt;w:lsdException w:name="Table Classic 2" w:semiHidden="1" w:unhideWhenUsed="1"/&gt;&lt;w:lsdException w:name="Table Classic 3" w:semiHidden="1" w:unhideWhenUsed="1"/&gt;&lt;w:lsdException w:name="Table Classic 4" w:semiHidden="1" w:unhideWhenUsed="1"/&gt;&lt;w:lsdException w:name="Table Colorful 1" w:semiHidden="1" w:unhideWhenUsed="1"/&gt;&lt;w:lsdException w:name="Table Colorful 2" w:semiHidden="1" w:unhideWhenUsed="1"/&gt;&lt;w:lsdException w:name="Table Colorful 3" w:semiHidden="1" w:unhideWhenUsed="1"/&gt;&lt;w:lsdException w:name="Table Columns 1" w:semiHidden="1" w:unhideWhenUsed="1"/&gt;&lt;w:lsdException w:name="Table Columns 2" w:semiHidden="1" w:unhideWhenUsed="1"/&gt;&lt;w:lsdException w:name="Table Columns 3" w:semiHidden="1" w:unhideWhenUsed="1"/&gt;&lt;w:lsdException w:name="Table Columns 4" w:semiHidden="1" w:unhideWhenUsed="1"/&gt;&lt;w:lsdException w:name="Table Columns 5" w:semiHidden="1" w:unhideWhenUsed="1"/&gt;&lt;w:lsdException w:name="Table Grid 1" w:semiHidden="1" w:unhideWhenUsed="1"/&gt;&lt;w:lsdException w:name="Table Grid 2" w:semiHidden="1" w:unhideWhenUsed="1"/&gt;&lt;w:lsdException w:name="Table Grid 3" w:semiHidden="1" w:unhideWhenUsed="1"/&gt;&lt;w:lsdException w:name="Table Grid 4" w:semiHidden="1" w:unhideWhenUsed="1"/&gt;&lt;w:lsdException w:name="Table Grid 5" w:semiHidden="1" w:unhideWhenUsed="1"/&gt;&lt;w:lsdException w:name="Table Grid 6" w:semiHidden="1" w:unhideWhenUsed="1"/&gt;&lt;w:lsdException w:name="Table Grid 7" w:semiHidden="1" w:unhideWhenUsed="1"/&gt;&lt;w:lsdException w:name="Table Grid 8" w:semiHidden="1" w:unhideWhenUsed="1"/&gt;&lt;w:lsdException w:name="Table List 1" w:semiHidden="1" w:unhideWhenUsed="1"/&gt;&lt;w:lsdException w:name="Table List 2" w:semiHidden="1" w:unhideWhenUsed="1"/&gt;&lt;w:lsdException w:name="Table List 3" w:semiHidden="1" w:unhideWhenUsed="1"/&gt;&lt;w:lsdException w:name="Table List 4" w:semiHidden="1" w:unhideWhenUsed="1"/&gt;&lt;w:lsdException w:name="Table List 5" w:semiHidden="1" w:unhideWhenUsed="1"/&gt;&lt;w:lsdException w:name="Table List 6" w:semiHidden="1" w:unhideWhenUsed="1"/&gt;&lt;w:lsdException w:name="Table List 7" w:semiHidden="1" w:unhideWhenUsed="1"/&gt;&lt;w:lsdException w:name="Table List 8" w:semiHidden="1" w:unhideWhenUsed="1"/&gt;&lt;w:lsdException w:name="Table 3D effects 1" w:semiHidden="1" w:unhideWhenUsed="1"/&gt;&lt;w:lsdException w:name="Table 3D effects 2" w:semiHidden="1" w:unhideWhenUsed="1"/&gt;&lt;w:lsdException w:name="Table 3D effects 3" w:semiHidden="1" w:unhideWhenUsed="1"/&gt;&lt;w:lsdException w:name="Table Contemporary" w:semiHidden="1" w:unhideWhenUsed="1"/&gt;&lt;w:lsdException w:name="Table Elegant" w:semiHidden="1" w:unhideWhenUsed="1"/&gt;&lt;w:lsdException w:name="Table Professional" w:semiHidden="1" w:unhideWhenUsed="1"/&gt;&lt;w:lsdException w:name="Table Subtle 1" w:semiHidden="1" w:unhideWhenUsed="1"/&gt;&lt;w:lsdException w:name="Table Subtle 2" w:semiHidden="1" w:unhideWhenUsed="1"/&gt;&lt;w:lsdException w:name="Table Web 1" w:semiHidden="1" w:unhideWhenUsed="1"/&gt;&lt;w:lsdException w:name="Table Web 2" w:semiHidden="1" w:unhideWhenUsed="1"/&gt;&lt;w:lsdException w:name="Table Web 3" w:semiHidden="1" w:unhideWhenUsed="1"/&gt;&lt;w:lsdException w:name="Balloon Text" w:semiHidden="1" w:unhideWhenUsed="1"/&gt;&lt;w:lsdException w:name="Table Grid" w:uiPriority="39"/&gt;&lt;w:lsdException w:name="Table Theme" w:semiHidden="1" w:unhideWhenUsed="1"/&gt;&lt;w:lsdException w:name="Placeholder Text" w:semiHidden="1"/&gt;&lt;w:lsdException w:name="No Spacing" w:uiPriority="1" w:qFormat="1"/&gt;&lt;w:lsdException w:name="Light Shading" w:uiPriority="60"/&gt;&lt;w:lsdException w:name="Light List" w:uiPriority="61"/&gt;&lt;w:lsdException w:name="Light Grid" w:uiPriority="62"/&gt;&lt;w:lsdException w:name="Medium Shading 1" w:uiPriority="63"/&gt;&lt;w:lsdException w:name="Medium Shading 2" w:uiPriority="64"/&gt;&lt;w:lsdException w:name="Medium List 1" w:uiPriority="65"/&gt;&lt;w:lsdException w:name="Medium List 2" w:uiPriority="66"/&gt;&lt;w:lsdException w:name="Medium Grid 1" w:uiPriority="67"/&gt;&lt;w:lsdException w:name="Medium Grid 2" w:uiPriority="68"/&gt;&lt;w:lsdException w:name="Medium Grid 3" w:uiPriority="69"/&gt;&lt;w:lsdException w:name="Dark List" w:uiPriority="70"/&gt;&lt;w:lsdException w:name="Colorful Shading" w:uiPriority="71"/&gt;&lt;w:lsdException w:name="Colorful List" w:uiPriority="72"/&gt;&lt;w:lsdException w:name="Colorful Grid" w:uiPriority="73"/&gt;&lt;w:lsdException w:name="Light Shading Accent 1" w:uiPriority="60"/&gt;&lt;w:lsdException w:name="Light List Accent 1" w:uiPriority="61"/&gt;&lt;w:lsdException w:name="Light Grid Accent 1" w:uiPriority="62"/&gt;&lt;w:lsdException w:name="Medium Shading 1 Accent 1" w:uiPriority="63"/&gt;&lt;w:lsdException w:name="Medium Shading 2 Accent 1" w:uiPriority="64"/&gt;&lt;w:lsdException w:name="Medium List 1 Accent 1" w:uiPriority="65"/&gt;&lt;w:lsdException w:name="Revision" w:semiHidden="1"/&gt;&lt;w:lsdException w:name="List Paragraph" w:uiPriority="34" w:qFormat="1"/&gt;&lt;w:lsdException w:name="Quote" w:uiPriority="29" w:qFormat="1"/&gt;&lt;w:lsdException w:name="Intense Quote" w:uiPriority="30" w:qFormat="1"/&gt;&lt;w:lsdException w:name="Medium List 2 Accent 1" w:uiPriority="66"/&gt;&lt;w:lsdException w:name="Medium Grid 1 Accent 1" w:uiPriority="67"/&gt;&lt;w:lsdException w:name="Medium Grid 2 Accent 1" w:uiPriority="68"/&gt;&lt;w:lsdException w:name="Medium Grid 3 Accent 1" w:uiPriority="69"/&gt;&lt;w:lsdException w:name="Dark List Accent 1" w:uiPriority="70"/&gt;&lt;w:lsdException w:name="Colorful Shading Accent 1" w:uiPriority="71"/&gt;&lt;w:lsdException w:name="Colorful List Accent 1" w:uiPriority="72"/&gt;&lt;w:lsdException w:name="Colorful Grid Accent 1" w:uiPriority="73"/&gt;&lt;w:lsdException w:name="Light Shading Accent 2" w:uiPriority="60"/&gt;&lt;w:lsdException w:name="Light List Accent 2" w:uiPriority="61"/&gt;&lt;w:lsdException w:name="Light Grid Accent 2" w:uiPriority="62"/&gt;&lt;w:lsdException w:name="Medium Shading 1 Accent 2" w:uiPriority="63"/&gt;&lt;w:lsdException w:name="Medium Shading 2 Accent 2" w:uiPriority="64"/&gt;&lt;w:lsdException w:name="Medium List 1 Accent 2" w:uiPriority="65"/&gt;&lt;w:lsdException w:name="Medium List 2 Accent 2" w:uiPriority="66"/&gt;&lt;w:lsdException w:name="Medium Grid 1 Accent 2" w:uiPriority="67"/&gt;&lt;w:lsdException w:name="Medium Grid 2 Accent 2" w:uiPriority="68"/&gt;&lt;w:lsdException w:name="Medium Grid 3 Accent 2" w:uiPriority="69"/&gt;&lt;w:lsdException w:name="Dark List Accent 2" w:uiPriority="70"/&gt;&lt;w:lsdException w:name="Colorful Shading Accent 2" w:uiPriority="71"/&gt;&lt;w:lsdException w:name="Colorful List Accent 2" w:uiPriority="72"/&gt;&lt;w:lsdException w:name="Colorful Grid Accent 2" w:uiPriority="73"/&gt;&lt;w:lsdException w:name="Light Shading Accent 3" w:uiPriority="60"/&gt;&lt;w:lsdException w:name="Light List Accent 3" w:uiPriority="61"/&gt;&lt;w:lsdException w:name="Light Grid Accent 3" w:uiPriority="62"/&gt;&lt;w:lsdException w:name="Medium Shading 1 Accent 3" w:uiPriority="63"/&gt;&lt;w:lsdException w:name="Medium Shading 2 Accent 3" w:uiPriority="64"/&gt;&lt;w:lsdException w:name="Medium List 1 Accent 3" w:uiPriority="65"/&gt;&lt;w:lsdException w:name="Medium List 2 Accent 3" w:uiPriority="66"/&gt;&lt;w:lsdException w:name="Medium Grid 1 Accent 3" w:uiPriority="67"/&gt;&lt;w:lsdException w:name="Medium Grid 2 Accent 3" w:uiPriority="68"/&gt;&lt;w:lsdException w:name="Medium Grid 3 Accent 3" w:uiPriority="69"/&gt;&lt;w:lsdException w:name="Dark List Accent 3" w:uiPriority="70"/&gt;&lt;w:lsdException w:name="Colorful Shading Accent 3" w:uiPriority="71"/&gt;&lt;w:lsdException w:name="Colorful List Accent 3" w:uiPriority="72"/&gt;&lt;w:lsdException w:name="Colorful Grid Accent 3" w:uiPriority="73"/&gt;&lt;w:lsdException w:name="Light Shading Accent 4" w:uiPriority="60"/&gt;&lt;w:lsdException w:name="Light List Accent 4" w:uiPriority="61"/&gt;&lt;w:lsdException w:name="Light Grid Accent 4" w:uiPriority="62"/&gt;&lt;w:lsdException w:name="Medium Shading 1 Accent 4" w:uiPriority="63"/&gt;&lt;w:lsdException w:name="Medium Shading 2 Accent 4" w:uiPriority="64"/&gt;&lt;w:lsdException w:name="Medium List 1 Accent 4" w:uiPriority="65"/&gt;&lt;w:lsdException w:name="Medium List 2 Accent 4" w:uiPriority="66"/&gt;&lt;w:lsdException w:name="Medium Grid 1 Accent 4" w:uiPriority="67"/&gt;&lt;w:lsdException w:name="Medium Grid 2 Accent 4" w:uiPriority="68"/&gt;&lt;w:lsdException w:name="Medium Grid 3 Accent 4" w:uiPriority="69"/&gt;&lt;w:lsdException w:name="Dark List Accent 4" w:uiPriority="70"/&gt;&lt;w:lsdException w:name="Colorful Shading Accent 4" w:uiPriority="71"/&gt;&lt;w:lsdException w:name="Colorful List Accent 4" w:uiPriority="72"/&gt;&lt;w:lsdException w:name="Colorful Grid Accent 4" w:uiPriority="73"/&gt;&lt;w:lsdException w:name="Light Shading Accent 5" w:uiPriority="60"/&gt;&lt;w:lsdException w:name="Light List Accent 5" w:uiPriority="61"/&gt;&lt;w:lsdException w:name="Light Grid Accent 5" w:uiPriority="62"/&gt;&lt;w:lsdException w:name="Medium Shading 1 Accent 5" w:uiPriority="63"/&gt;&lt;w:lsdException w:name="Medium Shading 2 Accent 5" w:uiPriority="64"/&gt;&lt;w:lsdException w:name="Medium List 1 Accent 5" w:uiPriority="65"/&gt;&lt;w:lsdException w:name="Medium List 2 Accent 5" w:uiPriority="66"/&gt;&lt;w:lsdException w:name="Medium Grid 1 Accent 5" w:uiPriority="67"/&gt;&lt;w:lsdException w:name="Medium Grid 2 Accent 5" w:uiPriority="68"/&gt;&lt;w:lsdException w:name="Medium Grid 3 Accent 5" w:uiPriority="69"/&gt;&lt;w:lsdException w:name="Dark List Accent 5" w:uiPriority="70"/&gt;&lt;w:lsdException w:name="Colorful Shading Accent 5" w:uiPriority="71"/&gt;&lt;w:lsdException w:name="Colorful List Accent 5" w:uiPriority="72"/&gt;&lt;w:lsdException w:name="Colorful Grid Accent 5" w:uiPriority="73"/&gt;&lt;w:lsdException w:name="Light Shading Accent 6" w:uiPriority="60"/&gt;&lt;w:lsdException w:name="Light List Accent 6" w:uiPriority="61"/&gt;&lt;w:lsdException w:name="Light Grid Accent 6" w:uiPriority="62"/&gt;&lt;w:lsdException w:name="Medium Shading 1 Accent 6" w:uiPriority="63"/&gt;&lt;w:lsdException w:name="Medium Shading 2 Accent 6" w:uiPriority="64"/&gt;&lt;w:lsdException w:name="Medium List 1 Accent 6" w:uiPriority="65"/&gt;&lt;w:lsdException w:name="Medium List 2 Accent 6" w:uiPriority="66"/&gt;&lt;w:lsdException w:name="Medium Grid 1 Accent 6" w:uiPriority="67"/&gt;&lt;w:lsdException w:name="Medium Grid 2 Accent 6" w:uiPriority="68"/&gt;&lt;w:lsdException w:name="Medium Grid 3 Accent 6" w:uiPriority="69"/&gt;&lt;w:lsdException w:name="Dark List Accent 6" w:uiPriority="70"/&gt;&lt;w:lsdException w:name="Colorful Shading Accent 6" w:uiPriority="71"/&gt;&lt;w:lsdException w:name="Colorful List Accent 6" w:uiPriority="72"/&gt;&lt;w:lsdException w:name="Colorful Grid Accent 6" w:uiPriority="73"/&gt;&lt;w:lsdException w:name="Subtle Emphasis" w:uiPriority="19" w:qFormat="1"/&gt;&lt;w:lsdException w:name="Intense Emphasis" w:uiPriority="21" w:qFormat="1"/&gt;&lt;w:lsdException w:name="Subtle Reference" w:uiPriority="31" w:qFormat="1"/&gt;&lt;w:lsdException w:name="Intense Reference" w:uiPriority="32" w:qFormat="1"/&gt;&lt;w:lsdException w:name="Book Title" w:uiPriority="33" w:qFormat="1"/&gt;&lt;w:lsdException w:name="Bibliography" w:semiHidden="1" w:uiPriority="37" w:unhideWhenUsed="1"/&gt;&lt;w:lsdException w:name="TOC Heading" w:semiHidden="1" w:uiPriority="39" w:unhideWhenUsed="1" w:qFormat="1"/&gt;&lt;w:lsdException w:name="Plain Table 1" w:uiPriority="41"/&gt;&lt;w:lsdException w:name="Plain Table 2" w:uiPriority="42"/&gt;&lt;w:lsdException w:name="Plain Table 3" w:uiPriority="43"/&gt;&lt;w:lsdException w:name="Plain Table 4" w:uiPriority="44"/&gt;&lt;w:lsdException w:name="Plain Table 5" w:uiPriority="45"/&gt;&lt;w:lsdException w:name="Grid Table Light" w:uiPriority="40"/&gt;&lt;w:lsdException w:name="Grid Table 1 Light" w:uiPriority="46"/&gt;&lt;w:lsdException w:name="Grid Table 2" w:uiPriority="47"/&gt;&lt;w:lsdException w:name="Grid Table 3" w:uiPriority="48"/&gt;&lt;w:lsdException w:name="Grid Table 4" w:uiPriority="49"/&gt;&lt;w:lsdException w:name="Grid Table 5 Dark" w:uiPriority="50"/&gt;&lt;w:lsdException w:name="Grid Table 6 Colorful" w:uiPriority="51"/&gt;&lt;w:lsdException w:name="Grid Table 7 Colorful" w:uiPriority="52"/&gt;&lt;w:lsdException w:name="Grid Table 1 Light Accent 1" w:uiPriority="46"/&gt;&lt;w:lsdException w:name="Grid Table 2 Accent 1" w:uiPriority="47"/&gt;&lt;w:lsdException w:name="Grid Table 3 Accent 1" w:uiPriority="48"/&gt;&lt;w:lsdException w:name="Grid Table 4 Accent 1" w:uiPriority="49"/&gt;&lt;w:lsdException w:name="Grid Table 5 Dark Accent 1" w:uiPriority="50"/&gt;&lt;w:lsdException w:name="Grid Table 6 Colorful Accent 1" w:uiPriority="51"/&gt;&lt;w:lsdException w:name="Grid Table 7 Colorful Accent 1" w:uiPriority="52"/&gt;&lt;w:lsdException w:name="Grid Table 1 Light Accent 2" w:uiPriority="46"/&gt;&lt;w:lsdException w:name="Grid Table 2 Accent 2" w:uiPriority="47"/&gt;&lt;w:lsdException w:name="Grid Table 3 Accent 2" w:uiPriority="48"/&gt;&lt;w:lsdException w:name="Grid Table 4 Accent 2" w:uiPriority="49"/&gt;&lt;w:lsdException w:name="Grid Table 5 Dark Accent 2" w:uiPriority="50"/&gt;&lt;w:lsdException w:name="Grid Table 6 Colorful Accent 2" w:uiPriority="51"/&gt;&lt;w:lsdException w:name="Grid Table 7 Colorful Accent 2" w:uiPriority="52"/&gt;&lt;w:lsdException w:name="Grid Table 1 Light Accent 3" w:uiPriority="46"/&gt;&lt;w:lsdException w:name="Grid Table 2 Accent 3" w:uiPriority="47"/&gt;&lt;w:lsdException w:name="Grid Table 3 Accent 3" w:uiPriority="48"/&gt;&lt;w:lsdException w:name="Grid Table 4 Accent 3" w:uiPriority="49"/&gt;&lt;w:lsdException w:name="Grid Table 5 Dark Accent 3" w:uiPriority="50"/&gt;&lt;w:lsdException w:name="Grid Table 6 Colorful Accent 3" w:uiPriority="51"/&gt;&lt;w:lsdException w:name="Grid Table 7 Colorful Accent 3" w:uiPriority="52"/&gt;&lt;w:lsdException w:name="Grid Table 1 Light Accent 4" w:uiPriority="46"/&gt;&lt;w:lsdException w:name="Grid Table 2 Accent 4" w:uiPriority="47"/&gt;&lt;w:lsdException w:name="Grid Table 3 Accent 4" w:uiPriority="48"/&gt;&lt;w:lsdException w:name="Grid Table 4 Accent 4" w:uiPriority="49"/&gt;&lt;w:lsdException w:name="Grid Table 5 Dark Accent 4" w:uiPriority="50"/&gt;&lt;w:lsdException w:name="Grid Table 6 Colorful Accent 4" w:uiPriority="51"/&gt;&lt;w:lsdException w:name="Grid Table 7 Colorful Accent 4" w:uiPriority="52"/&gt;&lt;w:lsdException w:name="Grid Table 1 Light Accent 5" w:uiPriority="46"/&gt;&lt;w:lsdException w:name="Grid Table 2 Accent 5" w:uiPriority="47"/&gt;&lt;w:lsdException w:name="Grid Table 3 Accent 5" w:uiPriority="48"/&gt;&lt;w:lsdException w:name="Grid Table 4 Accent 5" w:uiPriority="49"/&gt;&lt;w:lsdException w:name="Grid Table 5 Dark Accent 5" w:uiPriority="50"/&gt;&lt;w:lsdException w:name="Grid Table 6 Colorful Accent 5" w:uiPriority="51"/&gt;&lt;w:lsdException w:name="Grid Table 7 Colorful Accent 5" w:uiPriority="52"/&gt;&lt;w:lsdException w:name="Grid Table 1 Light Accent 6" w:uiPriority="46"/&gt;&lt;w:lsdException w:name="Grid Table 2 Accent 6" w:uiPriority="47"/&gt;&lt;w:lsdException w:name="Grid Table 3 Accent 6" w:uiPriority="48"/&gt;&lt;w:lsdException w:name="Grid Table 4 Accent 6" w:uiPriority="49"/&gt;&lt;w:lsdException w:name="Grid Table 5 Dark Accent 6" w:uiPriority="50"/&gt;&lt;w:lsdException w:name="Grid Table 6 Colorful Accent 6" w:uiPriority="51"/&gt;&lt;w:lsdException w:name="Grid Table 7 Colorful Accent 6" w:uiPriority="52"/&gt;&lt;w:lsdException w:name="List Table 1 Light" w:uiPriority="46"/&gt;&lt;w:lsdException w:name="List Table 2" w:uiPriority="47"/&gt;&lt;w:lsdException w:name="List Table 3" w:uiPriority="48"/&gt;&lt;w:lsdException w:name="List Table 4" w:uiPriority="49"/&gt;&lt;w:lsdException w:name="List Table 5 Dark" w:uiPriority="50"/&gt;&lt;w:lsdException w:name="List Table 6 Colorful" w:uiPriority="51"/&gt;&lt;w:lsdException w:name="List Table 7 Colorful" w:uiPriority="52"/&gt;&lt;w:lsdException w:name="List Table 1 Light Accent 1" w:uiPriority="46"/&gt;&lt;w:lsdException w:name="List Table 2 Accent 1" w:uiPriority="47"/&gt;&lt;w:lsdException w:name="List Table 3 Accent 1" w:uiPriority="48"/&gt;&lt;w:lsdException w:name="List Table 4 Accent 1" w:uiPriority="49"/&gt;&lt;w:lsdException w:name="List Table 5 Dark Accent 1" w:uiPriority="50"/&gt;&lt;w:lsdException w:name="List Table 6 Colorful Accent 1" w:uiPriority="51"/&gt;&lt;w:lsdException w:name="List Table 7 Colorful Accent 1" w:uiPriority="52"/&gt;&lt;w:lsdException w:name="List Table 1 Light Accent 2" w:uiPriority="46"/&gt;&lt;w:lsdException w:name="List Table 2 Accent 2" w:uiPriority="47"/&gt;&lt;w:lsdException w:name="List Table 3 Accent 2" w:uiPriority="48"/&gt;&lt;w:lsdException w:name="List Table 4 Accent 2" w:uiPriority="49"/&gt;&lt;w:lsdException w:name="List Table 5 Dark Accent 2" w:uiPriority="50"/&gt;&lt;w:lsdException w:name="List Table 6 Colorful Accent 2" w:uiPriority="51"/&gt;&lt;w:lsdException w:name="List Table 7 Colorful Accent 2" w:uiPriority="52"/&gt;&lt;w:lsdException w:name="List Table 1 Light Accent 3" w:uiPriority="46"/&gt;&lt;w:lsdException w:name="List Table 2 Accent 3" w:uiPriority="47"/&gt;&lt;w:lsdException w:name="List Table 3 Accent 3" w:uiPriority="48"/&gt;&lt;w:lsdException w:name="List Table 4 Accent 3" w:uiPriority="49"/&gt;&lt;w:lsdException w:name="List Table 5 Dark Accent 3" w:uiPriority="50"/&gt;&lt;w:lsdException w:name="List Table 6 Colorful Accent 3" w:uiPriority="51"/&gt;&lt;w:lsdException w:name="List Table 7 Colorful Accent 3" w:uiPriority="52"/&gt;&lt;w:lsdException w:name="List Table 1 Light Accent 4" w:uiPriority="46"/&gt;&lt;w:lsdException w:name="List Table 2 Accent 4" w:uiPriority="47"/&gt;&lt;w:lsdException w:name="List Table 3 Accent 4" w:uiPriority="48"/&gt;&lt;w:lsdException w:name="List Table 4 Accent 4" w:uiPriority="49"/&gt;&lt;w:lsdException w:name="List Table 5 Dark Accent 4" w:uiPriority="50"/&gt;&lt;w:lsdException w:name="List Table 6 Colorful Accent 4" w:uiPriority="51"/&gt;&lt;w:lsdException w:name="List Table 7 Colorful Accent 4" w:uiPriority="52"/&gt;&lt;w:lsdException w:name="List Table 1 Light Accent 5" w:uiPriority="46"/&gt;&lt;w:lsdException w:name="List Table 2 Accent 5" w:uiPriority="47"/&gt;&lt;w:lsdException w:name="List Table 3 Accent 5" w:uiPriority="48"/&gt;&lt;w:lsdException w:name="List Table 4 Accent 5" w:uiPriority="49"/&gt;&lt;w:lsdException w:name="List Table 5 Dark Accent 5" w:uiPriority="50"/&gt;&lt;w:lsdException w:name="List Table 6 Colorful Accent 5" w:uiPriority="51"/&gt;&lt;w:lsdException w:name="List Table 7 Colorful Accent 5" w:uiPriority="52"/&gt;&lt;w:lsdException w:name="List Table 1 Light Accent 6" w:uiPriority="46"/&gt;&lt;w:lsdException w:name="List Table 2 Accent 6" w:uiPriority="47"/&gt;&lt;w:lsdException w:name="List Table 3 Accent 6" w:uiPriority="48"/&gt;&lt;w:lsdException w:name="List Table 4 Accent 6" w:uiPriority="49"/&gt;&lt;w:lsdException w:name="List Table 5 Dark Accent 6" w:uiPriority="50"/&gt;&lt;w:lsdException w:name="List Table 6 Colorful Accent 6" w:uiPriority="51"/&gt;&lt;w:lsdException w:name="List Table 7 Colorful Accent 6" w:uiPriority="52"/&gt;&lt;w:lsdException w:name="Mention" w:semiHidden="1" w:unhideWhenUsed="1"/&gt;&lt;w:lsdException w:name="Smart Hyperlink" w:semiHidden="1" w:unhideWhenUsed="1"/&gt;&lt;w:lsdException w:name="Hashtag" w:semiHidden="1" w:unhideWhenUsed="1"/&gt;&lt;/w:latentStyles&gt;&lt;w:style w:type="paragraph" w:default="1" w:styleId="Normal"&gt;&lt;w:name w:val="Normal"/&gt;&lt;w:qFormat/&gt;&lt;/w:style&gt;&lt;w:style w:type="character" w:default="1" w:styleId="DefaultParagraphFont"&gt;&lt;w:name w:val="Default Paragraph Font"/&gt;&lt;w:uiPriority w:val="1"/&gt;&lt;w:semiHidden/&gt;&lt;w:unhideWhenUsed/&gt;&lt;/w:style&gt;&lt;w:style w:type="table" w:default="1" w:styleId="TableNormal"&gt;&lt;w:name w:val="Normal Table"/&gt;&lt;w:uiPriority w:val="99"/&gt;&lt;w:semiHidden/&gt;&lt;w:unhideWhenUsed/&gt;&lt;w:tblPr&gt;&lt;w:tblInd w:w="0" w:type="dxa"/&gt;&lt;w:tblCellMar&gt;&lt;w:top w:w="0" w:type="dxa"/&gt;&lt;w:left w:w="108" w:type="dxa"/&gt;&lt;w:bottom w:w="0" w:type="dxa"/&gt;&lt;w:right w:w="108" w:type="dxa"/&gt;&lt;/w:tblCellMar&gt;&lt;/w:tblPr&gt;&lt;/w:style&gt;&lt;w:style w:type="numbering" w:default="1" w:styleId="NoList"&gt;&lt;w:name w:val="No List"/&gt;&lt;w:uiPriority w:val="99"/&gt;&lt;w:semiHidden/&gt;&lt;w:unhideWhenUsed/&gt;&lt;/w:style&gt;&lt;w:style w:type="character" w:styleId="PlaceholderText"&gt;&lt;w:name w:val="Placeholder Text"/&gt;&lt;w:basedOn w:val="DefaultParagraphFont"/&gt;&lt;w:uiPriority w:val="99"/&gt;&lt;w:rPr&gt;&lt;w:color w:val="7F7F7F" w:themeColor="text1" w:themeTint="80"/&gt;&lt;w:bdr w:val="none" w:sz="0" w:space="0" w:color="auto"/&gt;&lt;w:shd w:val="clear" w:color="auto" w:fill="F0F0F0"/&gt;&lt;/w:rPr&gt;&lt;/w:style&gt;&lt;w:style w:type="paragraph" w:customStyle="1" w:styleId="B7CF53EBD28C4270BBC51AAB20A1C895"&gt;&lt;w:name w:val="B7CF53EBD28C4270BBC51AAB20A1C895"/&gt;&lt;/w:style&gt;&lt;/w:styles&gt;&lt;/pkg:xmlData&gt;&lt;/pkg:part&gt;&lt;pkg:part pkg:name="/word/styles.xml" pkg:contentType="application/vnd.openxmlformats-officedocument.wordprocessingml.styles+xml"&gt;&lt;pkg:xmlData&gt;&lt;w:styles xmlns:mc="http://schemas.openxmlformats.org/markup-compatibility/2006" xmlns:r="http://schemas.openxmlformats.org/officeDocument/2006/relationships" xmlns:w="http://schemas.openxmlformats.org/wordprocessingml/2006/main" xmlns:w14="http://schemas.microsoft.com/office/word/2010/wordml" xmlns:w15="http://schemas.microsoft.com/office/word/2012/wordml" xmlns:w16se="http://schemas.microsoft.com/office/word/2015/wordml/symex" mc:Ignorable="w14 w15 w16se"&gt;&lt;w:docDefaults&gt;&lt;w:rPrDefault&gt;&lt;w:rPr&gt;&lt;w:rFonts w:asciiTheme="minorHAnsi" w:eastAsiaTheme="minorEastAsia" w:hAnsiTheme="minorHAnsi" w:cstheme="minorBidi"/&gt;&lt;w:sz w:val="19"/&gt;&lt;w:szCs w:val="19"/&gt;&lt;w:lang w:val="sv-SE" w:eastAsia="en-US" w:bidi="ar-SA"/&gt;&lt;/w:rPr&gt;&lt;/w:rPrDefault&gt;&lt;w:pPrDefault&gt;&lt;w:pPr&gt;&lt;w:spacing w:after="160" w:line="288" w:lineRule="auto"/&gt;&lt;/w:pPr&gt;&lt;/w:pPrDefault&gt;&lt;/w:docDefaults&gt;&lt;w:style w:type="paragraph" w:default="1" w:styleId="Normal"&gt;&lt;w:name w:val="Normal"/&gt;&lt;w:qFormat/&gt;&lt;w:rsid w:val="005F186C"/&gt;&lt;w:pPr&gt;&lt;w:spacing w:after="200"/&gt;&lt;/w:pPr&gt;&lt;w:rPr&gt;&lt;w:sz w:val="20"/&gt;&lt;w:lang w:val="en-GB"/&gt;&lt;/w:rPr&gt;&lt;/w:style&gt;&lt;w:style w:type="paragraph" w:styleId="Heading1"&gt;&lt;w:name w:val="heading 1"/&gt;&lt;w:basedOn w:val="Normal"/&gt;&lt;w:next w:val="Normal"/&gt;&lt;w:link w:val="Heading1Char"/&gt;&lt;w:uiPriority w:val="9"/&gt;&lt;w:qFormat/&gt;&lt;w:rsid w:val="000C3604"/&gt;&lt;w:pPr&gt;&lt;w:keepNext/&gt;&lt;w:keepLines/&gt;&lt;w:spacing w:before="240"/&gt;&lt;w:outlineLvl w:val="0"/&gt;&lt;/w:pPr&gt;&lt;w:rPr&gt;&lt;w:rFonts w:asciiTheme="majorHAnsi" w:eastAsiaTheme="majorEastAsia" w:hAnsiTheme="majorHAnsi" w:cstheme="majorBidi"/&gt;&lt;w:bCs/&gt;&lt;w:sz w:val="28"/&gt;&lt;w:szCs w:val="28"/&gt;&lt;/w:rPr&gt;&lt;/w:style&gt;&lt;w:style w:type="paragraph" w:styleId="Heading2"&gt;&lt;w:name w:val="heading 2"/&gt;&lt;w:basedOn w:val="Normal"/&gt;&lt;w:next w:val="Normal"/&gt;&lt;w:link w:val="Heading2Char"/&gt;&lt;w:uiPriority w:val="9"/&gt;&lt;w:qFormat/&gt;&lt;w:rsid w:val="000C3604"/&gt;&lt;w:pPr&gt;&lt;w:keepNext/&gt;&lt;w:keepLines/&gt;&lt;w:spacing w:before="240" w:after="80"/&gt;&lt;w:outlineLvl w:val="1"/&gt;&lt;/w:pPr&gt;&lt;w:rPr&gt;&lt;w:rFonts w:ascii="GothamMedium" w:eastAsiaTheme="majorEastAsia" w:hAnsi="GothamMedium" w:cstheme="majorBidi"/&gt;&lt;w:bCs/&gt;&lt;w:sz w:val="24"/&gt;&lt;w:szCs w:val="28"/&gt;&lt;/w:rPr&gt;&lt;/w:style&gt;&lt;w:style w:type="paragraph" w:styleId="Heading3"&gt;&lt;w:name w:val="heading 3"/&gt;&lt;w:basedOn w:val="Normal"/&gt;&lt;w:next w:val="Normal"/&gt;&lt;w:link w:val="Heading3Char"/&gt;&lt;w:uiPriority w:val="9"/&gt;&lt;w:qFormat/&gt;&lt;w:rsid w:val="00872413"/&gt;&lt;w:pPr&gt;&lt;w:keepNext/&gt;&lt;w:keepLines/&gt;&lt;w:spacing w:before="120" w:after="40"/&gt;&lt;w:outlineLvl w:val="2"/&gt;&lt;/w:pPr&gt;&lt;w:rPr&gt;&lt;w:rFonts w:ascii="GothamMedium" w:eastAsiaTheme="majorEastAsia" w:hAnsi="GothamMedium" w:cstheme="majorBidi"/&gt;&lt;w:sz w:val="22"/&gt;&lt;w:szCs w:val="24"/&gt;&lt;/w:rPr&gt;&lt;/w:style&gt;&lt;w:style w:type="paragraph" w:styleId="Heading4"&gt;&lt;w:name w:val="heading 4"/&gt;&lt;w:basedOn w:val="Normal"/&gt;&lt;w:next w:val="Normal"/&gt;&lt;w:link w:val="Heading4Char"/&gt;&lt;w:uiPriority w:val="9"/&gt;&lt;w:semiHidden/&gt;&lt;w:qFormat/&gt;&lt;w:rsid w:val="00872413"/&gt;&lt;w:pPr&gt;&lt;w:keepNext/&gt;&lt;w:keepLines/&gt;&lt;w:spacing w:before="120" w:after="40"/&gt;&lt;w:outlineLvl w:val="3"/&gt;&lt;/w:pPr&gt;&lt;w:rPr&gt;&lt;w:rFonts w:ascii="GothamMedium" w:eastAsiaTheme="majorEastAsia" w:hAnsi="GothamMedium" w:cstheme="majorBidi"/&gt;&lt;w:iCs/&gt;&lt;w:szCs w:val="24"/&gt;&lt;/w:rPr&gt;&lt;/w:style&gt;&lt;w:style w:type="paragraph" w:styleId="Heading5"&gt;&lt;w:name w:val="heading 5"/&gt;&lt;w:basedOn w:val="Normal"/&gt;&lt;w:next w:val="Normal"/&gt;&lt;w:link w:val="Heading5Char"/&gt;&lt;w:uiPriority w:val="9"/&gt;&lt;w:semiHidden/&gt;&lt;w:qFormat/&gt;&lt;w:rsid w:val="009B1B65"/&gt;&lt;w:pPr&gt;&lt;w:keepNext/&gt;&lt;w:keepLines/&gt;&lt;w:numPr&gt;&lt;w:ilvl w:val="4"/&gt;&lt;w:numId w:val="15"/&gt;&lt;/w:numPr&gt;&lt;w:spacing w:before="120" w:after="0"/&gt;&lt;w:outlineLvl w:val="4"/&gt;&lt;/w:pPr&gt;&lt;w:rPr&gt;&lt;w:rFonts w:asciiTheme="majorHAnsi" w:eastAsiaTheme="majorEastAsia" w:hAnsiTheme="majorHAnsi" w:cstheme="majorBidi"/&gt;&lt;w:b/&gt;&lt;w:bCs/&gt;&lt;/w:rPr&gt;&lt;/w:style&gt;&lt;w:style w:type="paragraph" w:styleId="Heading6"&gt;&lt;w:name w:val="heading 6"/&gt;&lt;w:basedOn w:val="Normal"/&gt;&lt;w:next w:val="Normal"/&gt;&lt;w:link w:val="Heading6Char"/&gt;&lt;w:uiPriority w:val="9"/&gt;&lt;w:semiHidden/&gt;&lt;w:rsid w:val="009B1B65"/&gt;&lt;w:pPr&gt;&lt;w:keepNext/&gt;&lt;w:keepLines/&gt;&lt;w:numPr&gt;&lt;w:ilvl w:val="5"/&gt;&lt;w:numId w:val="15"/&gt;&lt;/w:numPr&gt;&lt;w:spacing w:before="120" w:after="0"/&gt;&lt;w:outlineLvl w:val="5"/&gt;&lt;/w:pPr&gt;&lt;w:rPr&gt;&lt;w:rFonts w:asciiTheme="majorHAnsi" w:eastAsiaTheme="majorEastAsia" w:hAnsiTheme="majorHAnsi" w:cstheme="majorBidi"/&gt;&lt;w:b/&gt;&lt;w:bCs/&gt;&lt;w:i/&gt;&lt;w:iCs/&gt;&lt;/w:rPr&gt;&lt;/w:style&gt;&lt;w:style w:type="paragraph" w:styleId="Heading7"&gt;&lt;w:name w:val="heading 7"/&gt;&lt;w:basedOn w:val="Normal"/&gt;&lt;w:next w:val="Normal"/&gt;&lt;w:link w:val="Heading7Char"/&gt;&lt;w:uiPriority w:val="9"/&gt;&lt;w:semiHidden/&gt;&lt;w:rsid w:val="009B1B65"/&gt;&lt;w:pPr&gt;&lt;w:keepNext/&gt;&lt;w:keepLines/&gt;&lt;w:numPr&gt;&lt;w:ilvl w:val="6"/&gt;&lt;w:numId w:val="15"/&gt;&lt;/w:numPr&gt;&lt;w:spacing w:before="120" w:after="0"/&gt;&lt;w:outlineLvl w:val="6"/&gt;&lt;/w:pPr&gt;&lt;w:rPr&gt;&lt;w:i/&gt;&lt;w:iCs/&gt;&lt;/w:rPr&gt;&lt;/w:style&gt;&lt;w:style w:type="paragraph" w:styleId="Heading8"&gt;&lt;w:name w:val="heading 8"/&gt;&lt;w:basedOn w:val="Normal"/&gt;&lt;w:next w:val="Normal"/&gt;&lt;w:link w:val="Heading8Char"/&gt;&lt;w:uiPriority w:val="9"/&gt;&lt;w:semiHidden/&gt;&lt;w:rsid w:val="009B1B65"/&gt;&lt;w:pPr&gt;&lt;w:keepNext/&gt;&lt;w:keepLines/&gt;&lt;w:numPr&gt;&lt;w:ilvl w:val="7"/&gt;&lt;w:numId w:val="15"/&gt;&lt;/w:numPr&gt;&lt;w:spacing w:before="120" w:after="0"/&gt;&lt;w:outlineLvl w:val="7"/&gt;&lt;/w:pPr&gt;&lt;w:rPr&gt;&lt;w:b/&gt;&lt;w:bCs/&gt;&lt;/w:rPr&gt;&lt;/w:style&gt;&lt;w:style w:type="paragraph" w:styleId="Heading9"&gt;&lt;w:name w:val="heading 9"/&gt;&lt;w:basedOn w:val="Normal"/&gt;&lt;w:next w:val="Normal"/&gt;&lt;w:link w:val="Heading9Char"/&gt;&lt;w:uiPriority w:val="9"/&gt;&lt;w:semiHidden/&gt;&lt;w:rsid w:val="009B1B65"/&gt;&lt;w:pPr&gt;&lt;w:keepNext/&gt;&lt;w:keepLines/&gt;&lt;w:numPr&gt;&lt;w:ilvl w:val="8"/&gt;&lt;w:numId w:val="15"/&gt;&lt;/w:numPr&gt;&lt;w:spacing w:before="120" w:after="0"/&gt;&lt;w:outlineLvl w:val="8"/&gt;&lt;/w:pPr&gt;&lt;w:rPr&gt;&lt;w:i/&gt;&lt;w:iCs/&gt;&lt;/w:rPr&gt;&lt;/w:style&gt;&lt;w:style w:type="character" w:default="1" w:styleId="DefaultParagraphFont"&gt;&lt;w:name w:val="Default Paragraph Font"/&gt;&lt;w:uiPriority w:val="1"/&gt;&lt;w:semiHidden/&gt;&lt;w:unhideWhenUsed/&gt;&lt;/w:style&gt;&lt;w:style w:type="table" w:default="1" w:styleId="TableNormal"&gt;&lt;w:name w:val="Normal Table"/&gt;&lt;w:uiPriority w:val="99"/&gt;&lt;w:semiHidden/&gt;&lt;w:unhideWhenUsed/&gt;&lt;w:tblPr&gt;&lt;w:tblInd w:w="0" w:type="dxa"/&gt;&lt;w:tblCellMar&gt;&lt;w:top w:w="0" w:type="dxa"/&gt;&lt;w:left w:w="108" w:type="dxa"/&gt;&lt;w:bottom w:w="0" w:type="dxa"/&gt;&lt;w:right w:w="108" w:type="dxa"/&gt;&lt;/w:tblCellMar&gt;&lt;/w:tblPr&gt;&lt;/w:style&gt;&lt;w:style w:type="numbering" w:default="1" w:styleId="NoList"&gt;&lt;w:name w:val="No List"/&gt;&lt;w:uiPriority w:val="99"/&gt;&lt;w:semiHidden/&gt;&lt;w:unhideWhenUsed/&gt;&lt;/w:style&gt;&lt;w:style w:type="character" w:customStyle="1" w:styleId="Heading1Char"&gt;&lt;w:name w:val="Heading 1 Char"/&gt;&lt;w:basedOn w:val="DefaultParagraphFont"/&gt;&lt;w:link w:val="Heading1"/&gt;&lt;w:uiPriority w:val="9"/&gt;&lt;w:rsid w:val="000C3604"/&gt;&lt;w:rPr&gt;&lt;w:rFonts w:asciiTheme="majorHAnsi" w:eastAsiaTheme="majorEastAsia" w:hAnsiTheme="majorHAnsi" w:cstheme="majorBidi"/&gt;&lt;w:bCs/&gt;&lt;w:sz w:val="28"/&gt;&lt;w:szCs w:val="28"/&gt;&lt;w:lang w:val="en-GB"/&gt;&lt;/w:rPr&gt;&lt;/w:style&gt;&lt;w:style w:type="character" w:customStyle="1" w:styleId="Heading2Char"&gt;&lt;w:name w:val="Heading 2 Char"/&gt;&lt;w:basedOn w:val="DefaultParagraphFont"/&gt;&lt;w:link w:val="Heading2"/&gt;&lt;w:uiPriority w:val="9"/&gt;&lt;w:rsid w:val="000C3604"/&gt;&lt;w:rPr&gt;&lt;w:rFonts w:ascii="GothamMedium" w:eastAsiaTheme="majorEastAsia" w:hAnsi="GothamMedium" w:cstheme="majorBidi"/&gt;&lt;w:bCs/&gt;&lt;w:sz w:val="24"/&gt;&lt;w:szCs w:val="28"/&gt;&lt;w:lang w:val="en-GB"/&gt;&lt;/w:rPr&gt;&lt;/w:style&gt;&lt;w:style w:type="character" w:customStyle="1" w:styleId="Heading3Char"&gt;&lt;w:name w:val="Heading 3 Char"/&gt;&lt;w:basedOn w:val="DefaultParagraphFont"/&gt;&lt;w:link w:val="Heading3"/&gt;&lt;w:uiPriority w:val="9"/&gt;&lt;w:rsid w:val="00872413"/&gt;&lt;w:rPr&gt;&lt;w:rFonts w:ascii="GothamMedium" w:eastAsiaTheme="majorEastAsia" w:hAnsi="GothamMedium" w:cstheme="majorBidi"/&gt;&lt;w:sz w:val="22"/&gt;&lt;w:szCs w:val="24"/&gt;&lt;w:lang w:val="en-GB"/&gt;&lt;/w:rPr&gt;&lt;/w:style&gt;&lt;w:style w:type="character" w:customStyle="1" w:styleId="Heading4Char"&gt;&lt;w:name w:val="Heading 4 Char"/&gt;&lt;w:basedOn w:val="DefaultParagraphFont"/&gt;&lt;w:link w:val="Heading4"/&gt;&lt;w:uiPriority w:val="9"/&gt;&lt;w:semiHidden/&gt;&lt;w:rsid w:val="005F186C"/&gt;&lt;w:rPr&gt;&lt;w:rFonts w:ascii="GothamMedium" w:eastAsiaTheme="majorEastAsia" w:hAnsi="GothamMedium" w:cstheme="majorBidi"/&gt;&lt;w:iCs/&gt;&lt;w:sz w:val="20"/&gt;&lt;w:szCs w:val="24"/&gt;&lt;w:lang w:val="en-GB"/&gt;&lt;/w:rPr&gt;&lt;/w:style&gt;&lt;w:style w:type="character" w:customStyle="1" w:styleId="Heading5Char"&gt;&lt;w:name w:val="Heading 5 Char"/&gt;&lt;w:basedOn w:val="DefaultParagraphFont"/&gt;&lt;w:link w:val="Heading5"/&gt;&lt;w:uiPriority w:val="9"/&gt;&lt;w:semiHidden/&gt;&lt;w:rsid w:val="008E716E"/&gt;&lt;w:rPr&gt;&lt;w:rFonts w:asciiTheme="majorHAnsi" w:eastAsiaTheme="majorEastAsia" w:hAnsiTheme="majorHAnsi" w:cstheme="majorBidi"/&gt;&lt;w:b/&gt;&lt;w:bCs/&gt;&lt;w:lang w:val="en-GB"/&gt;&lt;/w:rPr&gt;&lt;/w:style&gt;&lt;w:style w:type="character" w:customStyle="1" w:styleId="Heading6Char"&gt;&lt;w:name w:val="Heading 6 Char"/&gt;&lt;w:basedOn w:val="DefaultParagraphFont"/&gt;&lt;w:link w:val="Heading6"/&gt;&lt;w:uiPriority w:val="9"/&gt;&lt;w:semiHidden/&gt;&lt;w:rsid w:val="008E716E"/&gt;&lt;w:rPr&gt;&lt;w:rFonts w:asciiTheme="majorHAnsi" w:eastAsiaTheme="majorEastAsia" w:hAnsiTheme="majorHAnsi" w:cstheme="majorBidi"/&gt;&lt;w:b/&gt;&lt;w:bCs/&gt;&lt;w:i/&gt;&lt;w:iCs/&gt;&lt;w:lang w:val="en-GB"/&gt;&lt;/w:rPr&gt;&lt;/w:style&gt;&lt;w:style w:type="character" w:customStyle="1" w:styleId="Heading7Char"&gt;&lt;w:name w:val="Heading 7 Char"/&gt;&lt;w:basedOn w:val="DefaultParagraphFont"/&gt;&lt;w:link w:val="Heading7"/&gt;&lt;w:uiPriority w:val="9"/&gt;&lt;w:semiHidden/&gt;&lt;w:rsid w:val="008E716E"/&gt;&lt;w:rPr&gt;&lt;w:i/&gt;&lt;w:iCs/&gt;&lt;w:lang w:val="en-GB"/&gt;&lt;/w:rPr&gt;&lt;/w:style&gt;&lt;w:style w:type="character" w:customStyle="1" w:styleId="Heading8Char"&gt;&lt;w:name w:val="Heading 8 Char"/&gt;&lt;w:basedOn w:val="DefaultParagraphFont"/&gt;&lt;w:link w:val="Heading8"/&gt;&lt;w:uiPriority w:val="9"/&gt;&lt;w:semiHidden/&gt;&lt;w:rsid w:val="008E716E"/&gt;&lt;w:rPr&gt;&lt;w:b/&gt;&lt;w:bCs/&gt;&lt;w:lang w:val="en-GB"/&gt;&lt;/w:rPr&gt;&lt;/w:style&gt;&lt;w:style w:type="character" w:customStyle="1" w:styleId="Heading9Char"&gt;&lt;w:name w:val="Heading 9 Char"/&gt;&lt;w:basedOn w:val="DefaultParagraphFont"/&gt;&lt;w:link w:val="Heading9"/&gt;&lt;w:uiPriority w:val="9"/&gt;&lt;w:semiHidden/&gt;&lt;w:rsid w:val="008E716E"/&gt;&lt;w:rPr&gt;&lt;w:i/&gt;&lt;w:iCs/&gt;&lt;w:lang w:val="en-GB"/&gt;&lt;/w:rPr&gt;&lt;/w:style&gt;&lt;w:style w:type="paragraph" w:styleId="Caption"&gt;&lt;w:name w:val="caption"/&gt;&lt;w:basedOn w:val="Normal"/&gt;&lt;w:next w:val="Normal"/&gt;&lt;w:uiPriority w:val="35"/&gt;&lt;w:semiHidden/&gt;&lt;w:rsid w:val="009B1B65"/&gt;&lt;w:rPr&gt;&lt;w:b/&gt;&lt;w:bCs/&gt;&lt;w:sz w:val="18"/&gt;&lt;w:szCs w:val="18"/&gt;&lt;/w:rPr&gt;&lt;/w:style&gt;&lt;w:style w:type="paragraph" w:styleId="Title"&gt;&lt;w:name w:val="Title"/&gt;&lt;w:basedOn w:val="Normal"/&gt;&lt;w:next w:val="Normal"/&gt;&lt;w:link w:val="TitleChar"/&gt;&lt;w:uiPriority w:val="10"/&gt;&lt;w:semiHidden/&gt;&lt;w:qFormat/&gt;&lt;w:rsid w:val="00872413"/&gt;&lt;w:pPr&gt;&lt;w:spacing w:after="0"/&gt;&lt;w:contextualSpacing/&gt;&lt;/w:pPr&gt;&lt;w:rPr&gt;&lt;w:rFonts w:asciiTheme="majorHAnsi" w:eastAsiaTheme="majorEastAsia" w:hAnsiTheme="majorHAnsi" w:cstheme="majorBidi"/&gt;&lt;w:bCs/&gt;&lt;w:color w:val="407077" w:themeColor="accent1"/&gt;&lt;w:sz w:val="72"/&gt;&lt;w:szCs w:val="48"/&gt;&lt;/w:rPr&gt;&lt;/w:style&gt;&lt;w:style w:type="character" w:customStyle="1" w:styleId="TitleChar"&gt;&lt;w:name w:val="Title Char"/&gt;&lt;w:basedOn w:val="DefaultParagraphFont"/&gt;&lt;w:link w:val="Title"/&gt;&lt;w:uiPriority w:val="10"/&gt;&lt;w:semiHidden/&gt;&lt;w:rsid w:val="005F186C"/&gt;&lt;w:rPr&gt;&lt;w:rFonts w:asciiTheme="majorHAnsi" w:eastAsiaTheme="majorEastAsia" w:hAnsiTheme="majorHAnsi" w:cstheme="majorBidi"/&gt;&lt;w:bCs/&gt;&lt;w:color w:val="407077" w:themeColor="accent1"/&gt;&lt;w:sz w:val="72"/&gt;&lt;w:szCs w:val="48"/&gt;&lt;w:lang w:val="en-GB"/&gt;&lt;/w:rPr&gt;&lt;/w:style&gt;&lt;w:style w:type="paragraph" w:styleId="Subtitle"&gt;&lt;w:name w:val="Subtitle"/&gt;&lt;w:basedOn w:val="Normal"/&gt;&lt;w:next w:val="Normal"/&gt;&lt;w:link w:val="SubtitleChar"/&gt;&lt;w:uiPriority w:val="11"/&gt;&lt;w:semiHidden/&gt;&lt;w:qFormat/&gt;&lt;w:rsid w:val="00872413"/&gt;&lt;w:pPr&gt;&lt;w:numPr&gt;&lt;w:ilvl w:val="1"/&gt;&lt;/w:numPr&gt;&lt;w:spacing w:before="120" w:after="240"/&gt;&lt;/w:pPr&gt;&lt;w:rPr&gt;&lt;w:rFonts w:ascii="GothamMedium" w:eastAsiaTheme="majorEastAsia" w:hAnsi="GothamMedium" w:cstheme="majorBidi"/&gt;&lt;w:color w:val="343436" w:themeColor="text2"/&gt;&lt;w:sz w:val="24"/&gt;&lt;w:szCs w:val="24"/&gt;&lt;/w:rPr&gt;&lt;/w:style&gt;&lt;w:style w:type="character" w:customStyle="1" w:styleId="SubtitleChar"&gt;&lt;w:name w:val="Subtitle Char"/&gt;&lt;w:basedOn w:val="DefaultParagraphFont"/&gt;&lt;w:link w:val="Subtitle"/&gt;&lt;w:uiPriority w:val="11"/&gt;&lt;w:semiHidden/&gt;&lt;w:rsid w:val="005F186C"/&gt;&lt;w:rPr&gt;&lt;w:rFonts w:ascii="GothamMedium" w:eastAsiaTheme="majorEastAsia" w:hAnsi="GothamMedium" w:cstheme="majorBidi"/&gt;&lt;w:color w:val="343436" w:themeColor="text2"/&gt;&lt;w:sz w:val="24"/&gt;&lt;w:szCs w:val="24"/&gt;&lt;w:lang w:val="en-GB"/&gt;&lt;/w:rPr&gt;&lt;/w:style&gt;&lt;w:style w:type="character" w:styleId="Strong"&gt;&lt;w:name w:val="Strong"/&gt;&lt;w:basedOn w:val="DefaultParagraphFont"/&gt;&lt;w:uiPriority w:val="22"/&gt;&lt;w:semiHidden/&gt;&lt;w:rsid w:val="009B1B65"/&gt;&lt;w:rPr&gt;&lt;w:b/&gt;&lt;w:bCs/&gt;&lt;w:color w:val="auto"/&gt;&lt;/w:rPr&gt;&lt;/w:style&gt;&lt;w:style w:type="character" w:styleId="Emphasis"&gt;&lt;w:name w:val="Emphasis"/&gt;&lt;w:basedOn w:val="DefaultParagraphFont"/&gt;&lt;w:uiPriority w:val="20"/&gt;&lt;w:semiHidden/&gt;&lt;w:rsid w:val="009B1B65"/&gt;&lt;w:rPr&gt;&lt;w:i/&gt;&lt;w:iCs/&gt;&lt;w:color w:val="auto"/&gt;&lt;/w:rPr&gt;&lt;/w:style&gt;&lt;w:style w:type="paragraph" w:styleId="NoSpacing"&gt;&lt;w:name w:val="No Spacing"/&gt;&lt;w:link w:val="NoSpacingChar"/&gt;&lt;w:uiPriority w:val="1"/&gt;&lt;w:qFormat/&gt;&lt;w:rsid w:val="00EA5662"/&gt;&lt;w:pPr&gt;&lt;w:spacing w:after="0"/&gt;&lt;/w:pPr&gt;&lt;/w:style&gt;&lt;w:style w:type="paragraph" w:styleId="Quote"&gt;&lt;w:name w:val="Quote"/&gt;&lt;w:basedOn w:val="Normal"/&gt;&lt;w:next w:val="Normal"/&gt;&lt;w:link w:val="QuoteChar"/&gt;&lt;w:uiPriority w:val="29"/&gt;&lt;w:semiHidden/&gt;&lt;w:rsid w:val="009B1B65"/&gt;&lt;w:pPr&gt;&lt;w:spacing w:before="200" w:line="264" w:lineRule="auto"/&gt;&lt;w:ind w:left="864" w:right="864"/&gt;&lt;w:jc w:val="center"/&gt;&lt;/w:pPr&gt;&lt;w:rPr&gt;&lt;w:rFonts w:asciiTheme="majorHAnsi" w:eastAsiaTheme="majorEastAsia" w:hAnsiTheme="majorHAnsi" w:cstheme="majorBidi"/&gt;&lt;w:i/&gt;&lt;w:iCs/&gt;&lt;w:sz w:val="24"/&gt;&lt;w:szCs w:val="24"/&gt;&lt;/w:rPr&gt;&lt;/w:style&gt;&lt;w:style w:type="character" w:customStyle="1" w:styleId="QuoteChar"&gt;&lt;w:name w:val="Quote Char"/&gt;&lt;w:basedOn w:val="DefaultParagraphFont"/&gt;&lt;w:link w:val="Quote"/&gt;&lt;w:uiPriority w:val="29"/&gt;&lt;w:semiHidden/&gt;&lt;w:rsid w:val="009B1B65"/&gt;&lt;w:rPr&gt;&lt;w:rFonts w:asciiTheme="majorHAnsi" w:eastAsiaTheme="majorEastAsia" w:hAnsiTheme="majorHAnsi" w:cstheme="majorBidi"/&gt;&lt;w:i/&gt;&lt;w:iCs/&gt;&lt;w:sz w:val="24"/&gt;&lt;w:szCs w:val="24"/&gt;&lt;/w:rPr&gt;&lt;/w:style&gt;&lt;w:style w:type="paragraph" w:styleId="IntenseQuote"&gt;&lt;w:name w:val="Intense Quote"/&gt;&lt;w:basedOn w:val="Normal"/&gt;&lt;w:next w:val="Normal"/&gt;&lt;w:link w:val="IntenseQuoteChar"/&gt;&lt;w:uiPriority w:val="30"/&gt;&lt;w:semiHidden/&gt;&lt;w:rsid w:val="009B1B65"/&gt;&lt;w:pPr&gt;&lt;w:spacing w:before="100" w:beforeAutospacing="1" w:after="240"/&gt;&lt;w:ind w:left="936" w:right="936"/&gt;&lt;w:jc w:val="center"/&gt;&lt;/w:pPr&gt;&lt;w:rPr&gt;&lt;w:rFonts w:asciiTheme="majorHAnsi" w:eastAsiaTheme="majorEastAsia" w:hAnsiTheme="majorHAnsi" w:cstheme="majorBidi"/&gt;&lt;w:sz w:val="26"/&gt;&lt;w:szCs w:val="26"/&gt;&lt;/w:rPr&gt;&lt;/w:style&gt;&lt;w:style w:type="character" w:customStyle="1" w:styleId="IntenseQuoteChar"&gt;&lt;w:name w:val="Intense Quote Char"/&gt;&lt;w:basedOn w:val="DefaultParagraphFont"/&gt;&lt;w:link w:val="IntenseQuote"/&gt;&lt;w:uiPriority w:val="30"/&gt;&lt;w:semiHidden/&gt;&lt;w:rsid w:val="009B1B65"/&gt;&lt;w:rPr&gt;&lt;w:rFonts w:asciiTheme="majorHAnsi" w:eastAsiaTheme="majorEastAsia" w:hAnsiTheme="majorHAnsi" w:cstheme="majorBidi"/&gt;&lt;w:sz w:val="26"/&gt;&lt;w:szCs w:val="26"/&gt;&lt;/w:rPr&gt;&lt;/w:style&gt;&lt;w:style w:type="character" w:styleId="SubtleEmphasis"&gt;&lt;w:name w:val="Subtle Emphasis"/&gt;&lt;w:basedOn w:val="DefaultParagraphFont"/&gt;&lt;w:uiPriority w:val="19"/&gt;&lt;w:semiHidden/&gt;&lt;w:rsid w:val="009B1B65"/&gt;&lt;w:rPr&gt;&lt;w:i/&gt;&lt;w:iCs/&gt;&lt;w:color w:val="auto"/&gt;&lt;/w:rPr&gt;&lt;/w:style&gt;&lt;w:style w:type="character" w:styleId="IntenseEmphasis"&gt;&lt;w:name w:val="Intense Emphasis"/&gt;&lt;w:basedOn w:val="DefaultParagraphFont"/&gt;&lt;w:uiPriority w:val="21"/&gt;&lt;w:semiHidden/&gt;&lt;w:rsid w:val="009B1B65"/&gt;&lt;w:rPr&gt;&lt;w:b/&gt;&lt;w:bCs/&gt;&lt;w:i/&gt;&lt;w:iCs/&gt;&lt;w:color w:val="auto"/&gt;&lt;/w:rPr&gt;&lt;/w:style&gt;&lt;w:style w:type="character" w:styleId="SubtleReference"&gt;&lt;w:name w:val="Subtle Reference"/&gt;&lt;w:basedOn w:val="DefaultParagraphFont"/&gt;&lt;w:uiPriority w:val="31"/&gt;&lt;w:semiHidden/&gt;&lt;w:rsid w:val="009B1B65"/&gt;&lt;w:rPr&gt;&lt;w:smallCaps/&gt;&lt;w:color w:val="auto"/&gt;&lt;w:u w:val="single" w:color="7F7F7F" w:themeColor="text1" w:themeTint="80"/&gt;&lt;/w:rPr&gt;&lt;/w:style&gt;&lt;w:style w:type="character" w:styleId="IntenseReference"&gt;&lt;w:name w:val="Intense Reference"/&gt;&lt;w:basedOn w:val="DefaultParagraphFont"/&gt;&lt;w:uiPriority w:val="32"/&gt;&lt;w:semiHidden/&gt;&lt;w:rsid w:val="009B1B65"/&gt;&lt;w:rPr&gt;&lt;w:b/&gt;&lt;w:bCs/&gt;&lt;w:smallCaps/&gt;&lt;w:color w:val="auto"/&gt;&lt;w:u w:val="single"/&gt;&lt;/w:rPr&gt;&lt;/w:style&gt;&lt;w:style w:type="character" w:styleId="BookTitle"&gt;&lt;w:name w:val="Book Title"/&gt;&lt;w:basedOn w:val="DefaultParagraphFont"/&gt;&lt;w:uiPriority w:val="33"/&gt;&lt;w:semiHidden/&gt;&lt;w:rsid w:val="009B1B65"/&gt;&lt;w:rPr&gt;&lt;w:b/&gt;&lt;w:bCs/&gt;&lt;w:smallCaps/&gt;&lt;w:color w:val="auto"/&gt;&lt;/w:rPr&gt;&lt;/w:style&gt;&lt;w:style w:type="paragraph" w:styleId="TOCHeading"&gt;&lt;w:name w:val="TOC Heading"/&gt;&lt;w:basedOn w:val="Normal"/&gt;&lt;w:next w:val="Normal"/&gt;&lt;w:uiPriority w:val="39"/&gt;&lt;w:semiHidden/&gt;&lt;w:rsid w:val="009F4214"/&gt;&lt;w:pPr&gt;&lt;w:keepNext/&gt;&lt;w:keepLines/&gt;&lt;w:pageBreakBefore/&gt;&lt;/w:pPr&gt;&lt;w:rPr&gt;&lt;w:rFonts w:asciiTheme="majorHAnsi" w:hAnsiTheme="majorHAnsi"/&gt;&lt;w:b/&gt;&lt;w:sz w:val="32"/&gt;&lt;/w:rPr&gt;&lt;/w:style&gt;&lt;w:style w:type="paragraph" w:styleId="ListBullet"&gt;&lt;w:name w:val="List Bullet"/&gt;&lt;w:basedOn w:val="Normal"/&gt;&lt;w:uiPriority w:val="14"/&gt;&lt;w:qFormat/&gt;&lt;w:rsid w:val="001D4B24"/&gt;&lt;w:pPr&gt;&lt;w:numPr&gt;&lt;w:numId w:val="1"/&gt;&lt;/w:numPr&gt;&lt;w:spacing w:after="80"/&gt;&lt;w:contextualSpacing/&gt;&lt;/w:pPr&gt;&lt;/w:style&gt;&lt;w:style w:type="paragraph" w:styleId="ListNumber"&gt;&lt;w:name w:val="List Number"/&gt;&lt;w:basedOn w:val="Normal"/&gt;&lt;w:uiPriority w:val="14"/&gt;&lt;w:qFormat/&gt;&lt;w:rsid w:val="00223177"/&gt;&lt;w:pPr&gt;&lt;w:numPr&gt;&lt;w:numId w:val="6"/&gt;&lt;/w:numPr&gt;&lt;w:spacing w:after="80"/&gt;&lt;w:ind w:left="357" w:hanging="357"/&gt;&lt;w:contextualSpacing/&gt;&lt;/w:pPr&gt;&lt;/w:style&gt;&lt;w:style w:type="table" w:styleId="TableGrid"&gt;&lt;w:name w:val="Table Grid"/&gt;&lt;w:basedOn w:val="TableNormal"/&gt;&lt;w:uiPriority w:val="39"/&gt;&lt;w:rsid w:val="00572408"/&gt;&lt;w:pPr&gt;&lt;w:spacing w:after="0" w:line="240" w:lineRule="auto"/&gt;&lt;/w:pPr&gt;&lt;w:tblPr/&gt;&lt;/w:style&gt;&lt;w:style w:type="paragraph" w:styleId="FootnoteText"&gt;&lt;w:name w:val="footnote text"/&gt;&lt;w:basedOn w:val="Normal"/&gt;&lt;w:link w:val="FootnoteTextChar"/&gt;&lt;w:uiPriority w:val="99"/&gt;&lt;w:semiHidden/&gt;&lt;w:rsid w:val="00872413"/&gt;&lt;w:pPr&gt;&lt;w:spacing w:after="0"/&gt;&lt;/w:pPr&gt;&lt;w:rPr&gt;&lt;w:sz w:val="14"/&gt;&lt;w:szCs w:val="20"/&gt;&lt;/w:rPr&gt;&lt;/w:style&gt;&lt;w:style w:type="character" w:customStyle="1" w:styleId="FootnoteTextChar"&gt;&lt;w:name w:val="Footnote Text Char"/&gt;&lt;w:basedOn w:val="DefaultParagraphFont"/&gt;&lt;w:link w:val="FootnoteText"/&gt;&lt;w:uiPriority w:val="99"/&gt;&lt;w:semiHidden/&gt;&lt;w:rsid w:val="005F186C"/&gt;&lt;w:rPr&gt;&lt;w:sz w:val="14"/&gt;&lt;w:szCs w:val="20"/&gt;&lt;w:lang w:val="en-GB"/&gt;&lt;/w:rPr&gt;&lt;/w:style&gt;&lt;w:style w:type="character" w:styleId="FootnoteReference"&gt;&lt;w:name w:val="footnote reference"/&gt;&lt;w:basedOn w:val="DefaultParagraphFont"/&gt;&lt;w:uiPriority w:val="99"/&gt;&lt;w:semiHidden/&gt;&lt;w:rsid w:val="00884E47"/&gt;&lt;w:rPr&gt;&lt;w:vertAlign w:val="superscript"/&gt;&lt;/w:rPr&gt;&lt;/w:style&gt;&lt;w:style w:type="paragraph" w:styleId="Header"&gt;&lt;w:name w:val="header"/&gt;&lt;w:basedOn w:val="Normal"/&gt;&lt;w:link w:val="HeaderChar"/&gt;&lt;w:uiPriority w:val="99"/&gt;&lt;w:semiHidden/&gt;&lt;w:rsid w:val="005F186C"/&gt;&lt;w:pPr&gt;&lt;w:tabs&gt;&lt;w:tab w:val="center" w:pos="4536"/&gt;&lt;w:tab w:val="right" w:pos="9072"/&gt;&lt;/w:tabs&gt;&lt;w:spacing w:after="0" w:line="240" w:lineRule="auto"/&gt;&lt;/w:pPr&gt;&lt;w:rPr&gt;&lt;w:color w:val="858585" w:themeColor="accent5"/&gt;&lt;w:sz w:val="16"/&gt;&lt;/w:rPr&gt;&lt;/w:style&gt;&lt;w:style w:type="character" w:customStyle="1" w:styleId="HeaderChar"&gt;&lt;w:name w:val="Header Char"/&gt;&lt;w:basedOn w:val="DefaultParagraphFont"/&gt;&lt;w:link w:val="Header"/&gt;&lt;w:uiPriority w:val="99"/&gt;&lt;w:semiHidden/&gt;&lt;w:rsid w:val="005F186C"/&gt;&lt;w:rPr&gt;&lt;w:color w:val="858585" w:themeColor="accent5"/&gt;&lt;w:sz w:val="16"/&gt;&lt;w:lang w:val="en-GB"/&gt;&lt;/w:rPr&gt;&lt;/w:style&gt;&lt;w:style w:type="paragraph" w:styleId="Footer"&gt;&lt;w:name w:val="footer"/&gt;&lt;w:basedOn w:val="Normal"/&gt;&lt;w:link w:val="FooterChar"/&gt;&lt;w:uiPriority w:val="99"/&gt;&lt;w:semiHidden/&gt;&lt;w:rsid w:val="005F186C"/&gt;&lt;w:pPr&gt;&lt;w:tabs&gt;&lt;w:tab w:val="center" w:pos="4536"/&gt;&lt;w:tab w:val="right" w:pos="9072"/&gt;&lt;/w:tabs&gt;&lt;w:spacing w:after="0" w:line="240" w:lineRule="auto"/&gt;&lt;/w:pPr&gt;&lt;w:rPr&gt;&lt;w:color w:val="858585" w:themeColor="accent5"/&gt;&lt;w:sz w:val="16"/&gt;&lt;/w:rPr&gt;&lt;/w:style&gt;&lt;w:style w:type="character" w:customStyle="1" w:styleId="FooterChar"&gt;&lt;w:name w:val="Footer Char"/&gt;&lt;w:basedOn w:val="DefaultParagraphFont"/&gt;&lt;w:link w:val="Footer"/&gt;&lt;w:uiPriority w:val="99"/&gt;&lt;w:semiHidden/&gt;&lt;w:rsid w:val="005F186C"/&gt;&lt;w:rPr&gt;&lt;w:color w:val="858585" w:themeColor="accent5"/&gt;&lt;w:sz w:val="16"/&gt;&lt;w:lang w:val="en-GB"/&gt;&lt;/w:rPr&gt;&lt;/w:style&gt;&lt;w:style w:type="paragraph" w:styleId="TOC1"&gt;&lt;w:name w:val="toc 1"/&gt;&lt;w:basedOn w:val="Normal"/&gt;&lt;w:next w:val="Normal"/&gt;&lt;w:uiPriority w:val="39"/&gt;&lt;w:semiHidden/&gt;&lt;w:rsid w:val="00421476"/&gt;&lt;w:pPr&gt;&lt;w:tabs&gt;&lt;w:tab w:val="right" w:leader="dot" w:pos="8210"/&gt;&lt;/w:tabs&gt;&lt;w:spacing w:after="100"/&gt;&lt;w:ind w:left="426" w:hanging="426"/&gt;&lt;/w:pPr&gt;&lt;/w:style&gt;&lt;w:style w:type="paragraph" w:styleId="TOC2"&gt;&lt;w:name w:val="toc 2"/&gt;&lt;w:basedOn w:val="Normal"/&gt;&lt;w:next w:val="Normal"/&gt;&lt;w:uiPriority w:val="39"/&gt;&lt;w:semiHidden/&gt;&lt;w:rsid w:val="00EE62A8"/&gt;&lt;w:pPr&gt;&lt;w:tabs&gt;&lt;w:tab w:val="right" w:leader="dot" w:pos="8210"/&gt;&lt;/w:tabs&gt;&lt;w:spacing w:after="100"/&gt;&lt;w:ind w:left="1134" w:hanging="708"/&gt;&lt;/w:pPr&gt;&lt;w:rPr&gt;&lt;w:noProof/&gt;&lt;/w:rPr&gt;&lt;/w:style&gt;&lt;w:style w:type="paragraph" w:styleId="TOC3"&gt;&lt;w:name w:val="toc 3"/&gt;&lt;w:basedOn w:val="Normal"/&gt;&lt;w:next w:val="Normal"/&gt;&lt;w:uiPriority w:val="39"/&gt;&lt;w:semiHidden/&gt;&lt;w:rsid w:val="00EE62A8"/&gt;&lt;w:pPr&gt;&lt;w:tabs&gt;&lt;w:tab w:val="right" w:leader="dot" w:pos="8210"/&gt;&lt;/w:tabs&gt;&lt;w:spacing w:after="100"/&gt;&lt;w:ind w:left="1134" w:hanging="694"/&gt;&lt;/w:pPr&gt;&lt;w:rPr&gt;&lt;w:noProof/&gt;&lt;/w:rPr&gt;&lt;/w:style&gt;&lt;w:style w:type="character" w:styleId="Hyperlink"&gt;&lt;w:name w:val="Hyperlink"/&gt;&lt;w:basedOn w:val="DefaultParagraphFont"/&gt;&lt;w:uiPriority w:val="99"/&gt;&lt;w:semiHidden/&gt;&lt;w:rsid w:val="008555A7"/&gt;&lt;w:rPr&gt;&lt;w:color w:val="A1BF35" w:themeColor="hyperlink"/&gt;&lt;w:u w:val="single"/&gt;&lt;/w:rPr&gt;&lt;/w:style&gt;&lt;w:style w:type="paragraph" w:styleId="TOC4"&gt;&lt;w:name w:val="toc 4"/&gt;&lt;w:basedOn w:val="Normal"/&gt;&lt;w:next w:val="Normal"/&gt;&lt;w:uiPriority w:val="39"/&gt;&lt;w:semiHidden/&gt;&lt;w:rsid w:val="00FF2698"/&gt;&lt;w:pPr&gt;&lt;w:spacing w:after="100"/&gt;&lt;w:ind w:left="660"/&gt;&lt;/w:pPr&gt;&lt;/w:style&gt;&lt;w:style w:type="paragraph" w:styleId="TOC5"&gt;&lt;w:name w:val="toc 5"/&gt;&lt;w:basedOn w:val="Normal"/&gt;&lt;w:next w:val="Normal"/&gt;&lt;w:uiPriority w:val="39"/&gt;&lt;w:semiHidden/&gt;&lt;w:rsid w:val="00FF2698"/&gt;&lt;w:pPr&gt;&lt;w:spacing w:after="100"/&gt;&lt;w:ind w:left="880"/&gt;&lt;/w:pPr&gt;&lt;/w:style&gt;&lt;w:style w:type="paragraph" w:styleId="TOC6"&gt;&lt;w:name w:val="toc 6"/&gt;&lt;w:basedOn w:val="Normal"/&gt;&lt;w:next w:val="Normal"/&gt;&lt;w:uiPriority w:val="39"/&gt;&lt;w:semiHidden/&gt;&lt;w:rsid w:val="00FF2698"/&gt;&lt;w:pPr&gt;&lt;w:spacing w:after="100"/&gt;&lt;w:ind w:left="1100"/&gt;&lt;/w:pPr&gt;&lt;/w:style&gt;&lt;w:style w:type="paragraph" w:styleId="TOC7"&gt;&lt;w:name w:val="toc 7"/&gt;&lt;w:basedOn w:val="Normal"/&gt;&lt;w:next w:val="Normal"/&gt;&lt;w:uiPriority w:val="39"/&gt;&lt;w:semiHidden/&gt;&lt;w:rsid w:val="00FF2698"/&gt;&lt;w:pPr&gt;&lt;w:spacing w:after="100"/&gt;&lt;w:ind w:left="1320"/&gt;&lt;/w:pPr&gt;&lt;/w:style&gt;&lt;w:style w:type="paragraph" w:styleId="TOC8"&gt;&lt;w:name w:val="toc 8"/&gt;&lt;w:basedOn w:val="Normal"/&gt;&lt;w:next w:val="Normal"/&gt;&lt;w:uiPriority w:val="39"/&gt;&lt;w:semiHidden/&gt;&lt;w:rsid w:val="00FF2698"/&gt;&lt;w:pPr&gt;&lt;w:spacing w:after="100"/&gt;&lt;w:ind w:left="1540"/&gt;&lt;/w:pPr&gt;&lt;/w:style&gt;&lt;w:style w:type="paragraph" w:styleId="TOC9"&gt;&lt;w:name w:val="toc 9"/&gt;&lt;w:basedOn w:val="Normal"/&gt;&lt;w:next w:val="Normal"/&gt;&lt;w:uiPriority w:val="39"/&gt;&lt;w:semiHidden/&gt;&lt;w:rsid w:val="00FF2698"/&gt;&lt;w:pPr&gt;&lt;w:spacing w:after="100"/&gt;&lt;w:ind w:left="1760"/&gt;&lt;/w:pPr&gt;&lt;/w:style&gt;&lt;w:style w:type="paragraph" w:styleId="ListNumber2"&gt;&lt;w:name w:val="List Number 2"/&gt;&lt;w:basedOn w:val="ListNumber"/&gt;&lt;w:uiPriority w:val="14"/&gt;&lt;w:rsid w:val="00130001"/&gt;&lt;w:pPr&gt;&lt;w:numPr&gt;&lt;w:ilvl w:val="1"/&gt;&lt;/w:numPr&gt;&lt;/w:pPr&gt;&lt;/w:style&gt;&lt;w:style w:type="paragraph" w:styleId="ListNumber3"&gt;&lt;w:name w:val="List Number 3"/&gt;&lt;w:basedOn w:val="ListNumber2"/&gt;&lt;w:uiPriority w:val="14"/&gt;&lt;w:rsid w:val="00130001"/&gt;&lt;w:pPr&gt;&lt;w:numPr&gt;&lt;w:ilvl w:val="2"/&gt;&lt;/w:numPr&gt;&lt;/w:pPr&gt;&lt;/w:style&gt;&lt;w:style w:type="paragraph" w:styleId="ListNumber4"&gt;&lt;w:name w:val="List Number 4"/&gt;&lt;w:basedOn w:val="ListNumber3"/&gt;&lt;w:uiPriority w:val="14"/&gt;&lt;w:semiHidden/&gt;&lt;w:rsid w:val="00130001"/&gt;&lt;w:pPr&gt;&lt;w:numPr&gt;&lt;w:ilvl w:val="3"/&gt;&lt;/w:numPr&gt;&lt;/w:pPr&gt;&lt;/w:style&gt;&lt;w:style w:type="paragraph" w:styleId="ListNumber5"&gt;&lt;w:name w:val="List Number 5"/&gt;&lt;w:basedOn w:val="ListNumber4"/&gt;&lt;w:uiPriority w:val="14"/&gt;&lt;w:semiHidden/&gt;&lt;w:rsid w:val="00130001"/&gt;&lt;w:pPr&gt;&lt;w:numPr&gt;&lt;w:ilvl w:val="4"/&gt;&lt;/w:numPr&gt;&lt;/w:pPr&gt;&lt;/w:style&gt;&lt;w:style w:type="paragraph" w:styleId="ListBullet2"&gt;&lt;w:name w:val="List Bullet 2"/&gt;&lt;w:basedOn w:val="ListBullet"/&gt;&lt;w:uiPriority w:val="14"/&gt;&lt;w:rsid w:val="00FE2BED"/&gt;&lt;w:pPr&gt;&lt;w:numPr&gt;&lt;w:ilvl w:val="1"/&gt;&lt;/w:numPr&gt;&lt;/w:pPr&gt;&lt;/w:style&gt;&lt;w:style w:type="paragraph" w:styleId="ListBullet3"&gt;&lt;w:name w:val="List Bullet 3"/&gt;&lt;w:basedOn w:val="ListBullet2"/&gt;&lt;w:uiPriority w:val="14"/&gt;&lt;w:rsid w:val="00FE2BED"/&gt;&lt;w:pPr&gt;&lt;w:numPr&gt;&lt;w:ilvl w:val="2"/&gt;&lt;/w:numPr&gt;&lt;/w:pPr&gt;&lt;/w:style&gt;&lt;w:style w:type="paragraph" w:styleId="ListBullet4"&gt;&lt;w:name w:val="List Bullet 4"/&gt;&lt;w:basedOn w:val="ListBullet3"/&gt;&lt;w:uiPriority w:val="14"/&gt;&lt;w:semiHidden/&gt;&lt;w:rsid w:val="00FE2BED"/&gt;&lt;w:pPr&gt;&lt;w:numPr&gt;&lt;w:ilvl w:val="3"/&gt;&lt;/w:numPr&gt;&lt;/w:pPr&gt;&lt;/w:style&gt;&lt;w:style w:type="paragraph" w:styleId="ListBullet5"&gt;&lt;w:name w:val="List Bullet 5"/&gt;&lt;w:basedOn w:val="ListBullet4"/&gt;&lt;w:uiPriority w:val="14"/&gt;&lt;w:semiHidden/&gt;&lt;w:rsid w:val="00FE2BED"/&gt;&lt;w:pPr&gt;&lt;w:numPr&gt;&lt;w:ilvl w:val="4"/&gt;&lt;/w:numPr&gt;&lt;/w:pPr&gt;&lt;/w:style&gt;&lt;w:style w:type="character" w:styleId="PlaceholderText"&gt;&lt;w:name w:val="Placeholder Text"/&gt;&lt;w:basedOn w:val="DefaultParagraphFont"/&gt;&lt;w:uiPriority w:val="99"/&gt;&lt;w:rsid w:val="009C6FDB"/&gt;&lt;w:rPr&gt;&lt;w:color w:val="7F7F7F" w:themeColor="text1" w:themeTint="80"/&gt;&lt;w:bdr w:val="none" w:sz="0" w:space="0" w:color="auto"/&gt;&lt;w:shd w:val="clear" w:color="auto" w:fill="F0F0F0"/&gt;&lt;/w:rPr&gt;&lt;/w:style&gt;&lt;w:style w:type="paragraph" w:customStyle="1" w:styleId="Hiddentext"&gt;&lt;w:name w:val="Hidden text"/&gt;&lt;w:basedOn w:val="Normal"/&gt;&lt;w:next w:val="Normal"/&gt;&lt;w:uiPriority w:val="24"/&gt;&lt;w:semiHidden/&gt;&lt;w:qFormat/&gt;&lt;w:rsid w:val="00D86E66"/&gt;&lt;w:rPr&gt;&lt;w:vanish/&gt;&lt;w:color w:val="C00000"/&gt;&lt;/w:rPr&gt;&lt;/w:style&gt;&lt;w:style w:type="paragraph" w:customStyle="1" w:styleId="NumberedHeading1"&gt;&lt;w:name w:val="Numbered Heading 1"/&gt;&lt;w:basedOn w:val="Heading1"/&gt;&lt;w:next w:val="Normal"/&gt;&lt;w:uiPriority w:val="10"/&gt;&lt;w:semiHidden/&gt;&lt;w:qFormat/&gt;&lt;w:rsid w:val="00494FFB"/&gt;&lt;w:pPr&gt;&lt;w:numPr&gt;&lt;w:numId w:val="12"/&gt;&lt;/w:numPr&gt;&lt;/w:pPr&gt;&lt;/w:style&gt;&lt;w:style w:type="paragraph" w:customStyle="1" w:styleId="NumberedHeading2"&gt;&lt;w:name w:val="Numbered Heading 2"/&gt;&lt;w:basedOn w:val="Heading2"/&gt;&lt;w:next w:val="Normal"/&gt;&lt;w:uiPriority w:val="10"/&gt;&lt;w:semiHidden/&gt;&lt;w:qFormat/&gt;&lt;w:rsid w:val="00DA7B63"/&gt;&lt;w:pPr&gt;&lt;w:numPr&gt;&lt;w:ilvl w:val="1"/&gt;&lt;w:numId w:val="12"/&gt;&lt;/w:numPr&gt;&lt;/w:pPr&gt;&lt;/w:style&gt;&lt;w:style w:type="paragraph" w:customStyle="1" w:styleId="NumberedHeading3"&gt;&lt;w:name w:val="Numbered Heading 3"/&gt;&lt;w:basedOn w:val="Heading3"/&gt;&lt;w:next w:val="Normal"/&gt;&lt;w:uiPriority w:val="10"/&gt;&lt;w:semiHidden/&gt;&lt;w:qFormat/&gt;&lt;w:rsid w:val="00DA7B63"/&gt;&lt;w:pPr&gt;&lt;w:numPr&gt;&lt;w:ilvl w:val="2"/&gt;&lt;w:numId w:val="12"/&gt;&lt;/w:numPr&gt;&lt;/w:pPr&gt;&lt;/w:style&gt;&lt;w:style w:type="paragraph" w:customStyle="1" w:styleId="NumberedHeading4"&gt;&lt;w:name w:val="Numbered Heading 4"/&gt;&lt;w:basedOn w:val="Heading4"/&gt;&lt;w:next w:val="Normal"/&gt;&lt;w:uiPriority w:val="10"/&gt;&lt;w:semiHidden/&gt;&lt;w:qFormat/&gt;&lt;w:rsid w:val="00DA7B63"/&gt;&lt;w:pPr&gt;&lt;w:numPr&gt;&lt;w:ilvl w:val="3"/&gt;&lt;w:numId w:val="12"/&gt;&lt;/w:numPr&gt;&lt;/w:pPr&gt;&lt;/w:style&gt;&lt;w:style w:type="character" w:customStyle="1" w:styleId="NoSpacingChar"&gt;&lt;w:name w:val="No Spacing Char"/&gt;&lt;w:basedOn w:val="DefaultParagraphFont"/&gt;&lt;w:link w:val="NoSpacing"/&gt;&lt;w:uiPriority w:val="1"/&gt;&lt;w:rsid w:val="00EE7F0A"/&gt;&lt;/w:style&gt;&lt;w:style w:type="paragraph" w:styleId="BalloonText"&gt;&lt;w:name w:val="Balloon Text"/&gt;&lt;w:basedOn w:val="Normal"/&gt;&lt;w:link w:val="BalloonTextChar"/&gt;&lt;w:uiPriority w:val="99"/&gt;&lt;w:semiHidden/&gt;&lt;w:unhideWhenUsed/&gt;&lt;w:rsid w:val="00421476"/&gt;&lt;w:pPr&gt;&lt;w:spacing w:after="0"/&gt;&lt;/w:pPr&gt;&lt;w:rPr&gt;&lt;w:rFonts w:cs="Segoe UI"/&gt;&lt;w:sz w:val="18"/&gt;&lt;w:szCs w:val="18"/&gt;&lt;/w:rPr&gt;&lt;/w:style&gt;&lt;w:style w:type="character" w:customStyle="1" w:styleId="BalloonTextChar"&gt;&lt;w:name w:val="Balloon Text Char"/&gt;&lt;w:basedOn w:val="DefaultParagraphFont"/&gt;&lt;w:link w:val="BalloonText"/&gt;&lt;w:uiPriority w:val="99"/&gt;&lt;w:semiHidden/&gt;&lt;w:rsid w:val="00421476"/&gt;&lt;w:rPr&gt;&lt;w:rFonts w:cs="Segoe UI"/&gt;&lt;w:sz w:val="18"/&gt;&lt;w:szCs w:val="18"/&gt;&lt;w:lang w:val="en-GB"/&gt;&lt;/w:rPr&gt;&lt;/w:style&gt;&lt;w:style w:type="paragraph" w:customStyle="1" w:styleId="Footertext"&gt;&lt;w:name w:val="Footer text"/&gt;&lt;w:basedOn w:val="Normal"/&gt;&lt;w:uiPriority w:val="10"/&gt;&lt;w:semiHidden/&gt;&lt;w:qFormat/&gt;&lt;w:rsid w:val="001407DF"/&gt;&lt;w:pPr&gt;&lt;w:framePr w:wrap="around" w:vAnchor="page" w:hAnchor="page" w:x="852" w:y="14176"/&gt;&lt;w:spacing w:before="40" w:after="40"/&gt;&lt;/w:pPr&gt;&lt;w:rPr&gt;&lt;w:color w:val="858585" w:themeColor="accent5"/&gt;&lt;w:sz w:val="16"/&gt;&lt;/w:rPr&gt;&lt;/w:style&gt;&lt;w:style w:type="paragraph" w:customStyle="1" w:styleId="Footertitle"&gt;&lt;w:name w:val="Footer title"/&gt;&lt;w:basedOn w:val="Footertext"/&gt;&lt;w:uiPriority w:val="10"/&gt;&lt;w:semiHidden/&gt;&lt;w:qFormat/&gt;&lt;w:rsid w:val="00E4504C"/&gt;&lt;w:pPr&gt;&lt;w:framePr w:wrap="around"/&gt;&lt;/w:pPr&gt;&lt;w:rPr&gt;&lt;w:b/&gt;&lt;w:color w:val="407077" w:themeColor="accent1"/&gt;&lt;/w:rPr&gt;&lt;/w:style&gt;&lt;w:style w:type="table" w:customStyle="1" w:styleId="BetssonTable01"&gt;&lt;w:name w:val="Betsson Table 01"/&gt;&lt;w:basedOn w:val="TableNormal"/&gt;&lt;w:uiPriority w:val="99"/&gt;&lt;w:rsid w:val="00036B11"/&gt;&lt;w:pPr&gt;&lt;w:spacing w:after="0" w:line="240" w:lineRule="auto"/&gt;&lt;w:jc w:val="right"/&gt;&lt;/w:pPr&gt;&lt;w:tblPr&gt;&lt;w:tblBorders&gt;&lt;w:bottom w:val="single" w:sz="4" w:space="0" w:color="407077" w:themeColor="accent1"/&gt;&lt;w:insideH w:val="single" w:sz="4" w:space="0" w:color="407077" w:themeColor="accent1"/&gt;&lt;/w:tblBorders&gt;&lt;w:tblCellMar&gt;&lt;w:top w:w="57" w:type="dxa"/&gt;&lt;w:left w:w="57" w:type="dxa"/&gt;&lt;w:bottom w:w="57" w:type="dxa"/&gt;&lt;w:right w:w="57" w:type="dxa"/&gt;&lt;/w:tblCellMar&gt;&lt;/w:tblPr&gt;&lt;w:tblStylePr w:type="firstRow"&gt;&lt;w:pPr&gt;&lt;w:jc w:val="right"/&gt;&lt;/w:pPr&gt;&lt;w:rPr&gt;&lt;w:rFonts w:asciiTheme="majorHAnsi" w:hAnsiTheme="majorHAnsi"/&gt;&lt;w:b/&gt;&lt;w:color w:val="407077" w:themeColor="accent1"/&gt;&lt;/w:rPr&gt;&lt;w:tblPr/&gt;&lt;w:tcPr&gt;&lt;w:tcBorders&gt;&lt;w:bottom w:val="single" w:sz="12" w:space="0" w:color="407077" w:themeColor="accent1"/&gt;&lt;/w:tcBorders&gt;&lt;w:vAlign w:val="bottom"/&gt;&lt;/w:tcPr&gt;&lt;/w:tblStylePr&gt;&lt;w:tblStylePr w:type="lastRow"&gt;&lt;w:rPr&gt;&lt;w:rFonts w:asciiTheme="majorHAnsi" w:hAnsiTheme="majorHAnsi"/&gt;&lt;w:b/&gt;&lt;/w:rPr&gt;&lt;w:tblPr/&gt;&lt;w:tcPr&gt;&lt;w:tcBorders&gt;&lt;w:top w:val="double" w:sz="4" w:space="0" w:color="407077" w:themeColor="accent1"/&gt;&lt;w:left w:val="nil"/&gt;&lt;w:bottom w:val="nil"/&gt;&lt;w:right w:val="nil"/&gt;&lt;w:insideH w:val="nil"/&gt;&lt;w:insideV w:val="nil"/&gt;&lt;w:tl2br w:val="nil"/&gt;&lt;w:tr2bl w:val="nil"/&gt;&lt;/w:tcBorders&gt;&lt;/w:tcPr&gt;&lt;/w:tblStylePr&gt;&lt;w:tblStylePr w:type="firstCol"&gt;&lt;w:pPr&gt;&lt;w:jc w:val="left"/&gt;&lt;/w:pPr&gt;&lt;/w:tblStylePr&gt;&lt;w:tblStylePr w:type="lastCol"&gt;&lt;w:rPr&gt;&lt;w:rFonts w:asciiTheme="majorHAnsi" w:hAnsiTheme="majorHAnsi"/&gt;&lt;w:b/&gt;&lt;/w:rPr&gt;&lt;/w:tblStylePr&gt;&lt;w:tblStylePr w:type="nwCell"&gt;&lt;w:pPr&gt;&lt;w:jc w:val="left"/&gt;&lt;/w:pPr&gt;&lt;w:tblPr/&gt;&lt;w:tcPr&gt;&lt;w:vAlign w:val="bottom"/&gt;&lt;/w:tcPr&gt;&lt;/w:tblStylePr&gt;&lt;/w:style&gt;&lt;w:style w:type="table" w:styleId="TableGridLight"&gt;&lt;w:name w:val="Grid Table Light"/&gt;&lt;w:aliases w:val="Betsson Table 02"/&gt;&lt;w:basedOn w:val="TableNormal"/&gt;&lt;w:uiPriority w:val="40"/&gt;&lt;w:rsid w:val="00036B11"/&gt;&lt;w:pPr&gt;&lt;w:spacing w:after="0" w:line="240" w:lineRule="auto"/&gt;&lt;w:jc w:val="right"/&gt;&lt;/w:pPr&gt;&lt;w:tblPr&gt;&lt;w:tblStyleRowBandSize w:val="1"/&gt;&lt;w:tblBorders&gt;&lt;w:insideH w:val="single" w:sz="4" w:space="0" w:color="407077" w:themeColor="accent1"/&gt;&lt;/w:tblBorders&gt;&lt;w:tblCellMar&gt;&lt;w:top w:w="57" w:type="dxa"/&gt;&lt;w:left w:w="57" w:type="dxa"/&gt;&lt;w:bottom w:w="57" w:type="dxa"/&gt;&lt;w:right w:w="57" w:type="dxa"/&gt;&lt;/w:tblCellMar&gt;&lt;/w:tblPr&gt;&lt;w:tcPr&gt;&lt;w:shd w:val="clear" w:color="auto" w:fill="auto"/&gt;&lt;/w:tcPr&gt;&lt;w:tblStylePr w:type="firstRow"&gt;&lt;w:pPr&gt;&lt;w:wordWrap/&gt;&lt;w:spacing w:beforeLines="0" w:before="80" w:beforeAutospacing="0" w:afterLines="0" w:after="0" w:afterAutospacing="0"/&gt;&lt;w:jc w:val="right"/&gt;&lt;/w:pPr&gt;&lt;w:rPr&gt;&lt;w:rFonts w:asciiTheme="majorHAnsi" w:hAnsiTheme="majorHAnsi"/&gt;&lt;w:b/&gt;&lt;w:color w:val="FFFFFF" w:themeColor="background1"/&gt;&lt;/w:rPr&gt;&lt;w:tblPr/&gt;&lt;w:tcPr&gt;&lt;w:shd w:val="clear" w:color="auto" w:fill="407077" w:themeFill="accent1"/&gt;&lt;w:vAlign w:val="bottom"/&gt;&lt;/w:tcPr&gt;&lt;/w:tblStylePr&gt;&lt;w:tblStylePr w:type="lastRow"&gt;&lt;w:rPr&gt;&lt;w:rFonts w:asciiTheme="majorHAnsi" w:hAnsiTheme="majorHAnsi"/&gt;&lt;w:b/&gt;&lt;/w:rPr&gt;&lt;w:tblPr/&gt;&lt;w:tcPr&gt;&lt;w:tcBorders&gt;&lt;w:top w:val="double" w:sz="4" w:space="0" w:color="407077" w:themeColor="accent1"/&gt;&lt;/w:tcBorders&gt;&lt;w:shd w:val="clear" w:color="auto" w:fill="auto"/&gt;&lt;/w:tcPr&gt;&lt;/w:tblStylePr&gt;&lt;w:tblStylePr w:type="firstCol"&gt;&lt;w:pPr&gt;&lt;w:jc w:val="left"/&gt;&lt;/w:pPr&gt;&lt;/w:tblStylePr&gt;&lt;w:tblStylePr w:type="lastCol"&gt;&lt;w:pPr&gt;&lt;w:jc w:val="right"/&gt;&lt;/w:pPr&gt;&lt;w:rPr&gt;&lt;w:rFonts w:asciiTheme="majorHAnsi" w:hAnsiTheme="majorHAnsi"/&gt;&lt;w:b/&gt;&lt;/w:rPr&gt;&lt;/w:tblStylePr&gt;&lt;w:tblStylePr w:type="nwCell"&gt;&lt;w:pPr&gt;&lt;w:jc w:val="left"/&gt;&lt;/w:pPr&gt;&lt;w:tblPr/&gt;&lt;w:tcPr&gt;&lt;w:vAlign w:val="bottom"/&gt;&lt;/w:tcPr&gt;&lt;/w:tblStylePr&gt;&lt;/w:style&gt;&lt;w:style w:type="paragraph" w:customStyle="1" w:styleId="Tabletext"&gt;&lt;w:name w:val="Table text"/&gt;&lt;w:basedOn w:val="Normal"/&gt;&lt;w:uiPriority w:val="15"/&gt;&lt;w:rsid w:val="005F186C"/&gt;&lt;w:pPr&gt;&lt;w:spacing w:after="0" w:line="240" w:lineRule="auto"/&gt;&lt;/w:pPr&gt;&lt;w:rPr&gt;&lt;w:sz w:val="16"/&gt;&lt;/w:rPr&gt;&lt;/w:style&gt;&lt;w:style w:type="paragraph" w:customStyle="1" w:styleId="Tabletitle"&gt;&lt;w:name w:val="Table title"/&gt;&lt;w:basedOn w:val="Tabletext"/&gt;&lt;w:uiPriority w:val="15"/&gt;&lt;w:rsid w:val="00C5110E"/&gt;&lt;w:pPr&gt;&lt;w:framePr w:wrap="around" w:vAnchor="page" w:hAnchor="page" w:x="852" w:y="14176"/&gt;&lt;w:spacing w:before="40" w:after="40"/&gt;&lt;/w:pPr&gt;&lt;w:rPr&gt;&lt;w:b/&gt;&lt;w:color w:val="407077" w:themeColor="accent1"/&gt;&lt;/w:rPr&gt;&lt;/w:style&gt;&lt;w:style w:type="paragraph" w:customStyle="1" w:styleId="FootertitleWhite"&gt;&lt;w:name w:val="Footer title White"/&gt;&lt;w:basedOn w:val="Footertitle"/&gt;&lt;w:semiHidden/&gt;&lt;w:rsid w:val="000049A5"/&gt;&lt;w:pPr&gt;&lt;w:framePr w:wrap="around"/&gt;&lt;/w:pPr&gt;&lt;w:rPr&gt;&lt;w:bCs/&gt;&lt;w:color w:val="FFFFFF" w:themeColor="background1"/&gt;&lt;/w:rPr&gt;&lt;/w:style&gt;&lt;w:style w:type="paragraph" w:styleId="DocumentMap"&gt;&lt;w:name w:val="Document Map"/&gt;&lt;w:basedOn w:val="Normal"/&gt;&lt;w:link w:val="DocumentMapChar"/&gt;&lt;w:uiPriority w:val="99"/&gt;&lt;w:semiHidden/&gt;&lt;w:rsid w:val="00421476"/&gt;&lt;w:pPr&gt;&lt;w:spacing w:after="0"/&gt;&lt;/w:pPr&gt;&lt;w:rPr&gt;&lt;w:rFonts w:cs="Segoe UI"/&gt;&lt;w:sz w:val="16"/&gt;&lt;w:szCs w:val="16"/&gt;&lt;/w:rPr&gt;&lt;/w:style&gt;&lt;w:style w:type="character" w:customStyle="1" w:styleId="DocumentMapChar"&gt;&lt;w:name w:val="Document Map Char"/&gt;&lt;w:basedOn w:val="DefaultParagraphFont"/&gt;&lt;w:link w:val="DocumentMap"/&gt;&lt;w:uiPriority w:val="99"/&gt;&lt;w:semiHidden/&gt;&lt;w:rsid w:val="00421476"/&gt;&lt;w:rPr&gt;&lt;w:rFonts w:cs="Segoe UI"/&gt;&lt;w:sz w:val="16"/&gt;&lt;w:szCs w:val="16"/&gt;&lt;w:lang w:val="en-GB"/&gt;&lt;/w:rPr&gt;&lt;/w:style&gt;&lt;w:style w:type="character" w:styleId="HTMLSample"&gt;&lt;w:name w:val="HTML Sample"/&gt;&lt;w:basedOn w:val="DefaultParagraphFont"/&gt;&lt;w:uiPriority w:val="99"/&gt;&lt;w:semiHidden/&gt;&lt;w:unhideWhenUsed/&gt;&lt;w:rsid w:val="00421476"/&gt;&lt;w:rPr&gt;&lt;w:rFonts w:asciiTheme="minorHAnsi" w:hAnsiTheme="minorHAnsi"/&gt;&lt;w:sz w:val="24"/&gt;&lt;w:szCs w:val="24"/&gt;&lt;/w:rPr&gt;&lt;/w:style&gt;&lt;w:style w:type="paragraph" w:styleId="HTMLPreformatted"&gt;&lt;w:name w:val="HTML Preformatted"/&gt;&lt;w:basedOn w:val="Normal"/&gt;&lt;w:link w:val="HTMLPreformattedChar"/&gt;&lt;w:uiPriority w:val="99"/&gt;&lt;w:semiHidden/&gt;&lt;w:rsid w:val="00421476"/&gt;&lt;w:pPr&gt;&lt;w:spacing w:after="0"/&gt;&lt;/w:pPr&gt;&lt;w:rPr&gt;&lt;w:szCs w:val="20"/&gt;&lt;/w:rPr&gt;&lt;/w:style&gt;&lt;w:style w:type="character" w:customStyle="1" w:styleId="HTMLPreformattedChar"&gt;&lt;w:name w:val="HTML Preformatted Char"/&gt;&lt;w:basedOn w:val="DefaultParagraphFont"/&gt;&lt;w:link w:val="HTMLPreformatted"/&gt;&lt;w:uiPriority w:val="99"/&gt;&lt;w:semiHidden/&gt;&lt;w:rsid w:val="00421476"/&gt;&lt;w:rPr&gt;&lt;w:sz w:val="20"/&gt;&lt;w:szCs w:val="20"/&gt;&lt;w:lang w:val="en-GB"/&gt;&lt;/w:rPr&gt;&lt;/w:style&gt;&lt;w:style w:type="character" w:styleId="HTMLCode"&gt;&lt;w:name w:val="HTML Code"/&gt;&lt;w:basedOn w:val="DefaultParagraphFont"/&gt;&lt;w:uiPriority w:val="99"/&gt;&lt;w:semiHidden/&gt;&lt;w:rsid w:val="00421476"/&gt;&lt;w:rPr&gt;&lt;w:rFonts w:asciiTheme="minorHAnsi" w:hAnsiTheme="minorHAnsi"/&gt;&lt;w:sz w:val="20"/&gt;&lt;w:szCs w:val="20"/&gt;&lt;/w:rPr&gt;&lt;/w:style&gt;&lt;w:style w:type="character" w:styleId="HTMLTypewriter"&gt;&lt;w:name w:val="HTML Typewriter"/&gt;&lt;w:basedOn w:val="DefaultParagraphFont"/&gt;&lt;w:uiPriority w:val="99"/&gt;&lt;w:semiHidden/&gt;&lt;w:rsid w:val="00421476"/&gt;&lt;w:rPr&gt;&lt;w:rFonts w:asciiTheme="minorHAnsi" w:hAnsiTheme="minorHAnsi"/&gt;&lt;w:sz w:val="20"/&gt;&lt;w:szCs w:val="20"/&gt;&lt;/w:rPr&gt;&lt;/w:style&gt;&lt;w:style w:type="character" w:styleId="HTMLKeyboard"&gt;&lt;w:name w:val="HTML Keyboard"/&gt;&lt;w:basedOn w:val="DefaultParagraphFont"/&gt;&lt;w:uiPriority w:val="99"/&gt;&lt;w:semiHidden/&gt;&lt;w:rsid w:val="00421476"/&gt;&lt;w:rPr&gt;&lt;w:rFonts w:asciiTheme="minorHAnsi" w:hAnsiTheme="minorHAnsi"/&gt;&lt;w:sz w:val="20"/&gt;&lt;w:szCs w:val="20"/&gt;&lt;/w:rPr&gt;&lt;/w:style&gt;&lt;w:style w:type="paragraph" w:styleId="MacroText"&gt;&lt;w:name w:val="macro"/&gt;&lt;w:link w:val="MacroTextChar"/&gt;&lt;w:uiPriority w:val="99"/&gt;&lt;w:semiHidden/&gt;&lt;w:rsid w:val="00421476"/&gt;&lt;w:pPr&gt;&lt;w:tabs&gt;&lt;w:tab w:val="left" w:pos="480"/&gt;&lt;w:tab w:val="left" w:pos="960"/&gt;&lt;w:tab w:val="left" w:pos="1440"/&gt;&lt;w:tab w:val="left" w:pos="1920"/&gt;&lt;w:tab w:val="left" w:pos="2400"/&gt;&lt;w:tab w:val="left" w:pos="2880"/&gt;&lt;w:tab w:val="left" w:pos="3360"/&gt;&lt;w:tab w:val="left" w:pos="3840"/&gt;&lt;w:tab w:val="left" w:pos="4320"/&gt;&lt;/w:tabs&gt;&lt;w:spacing w:after="0" w:line="240" w:lineRule="auto"/&gt;&lt;/w:pPr&gt;&lt;w:rPr&gt;&lt;w:sz w:val="20"/&gt;&lt;w:szCs w:val="20"/&gt;&lt;w:lang w:val="en-GB"/&gt;&lt;/w:rPr&gt;&lt;/w:style&gt;&lt;w:style w:type="character" w:customStyle="1" w:styleId="MacroTextChar"&gt;&lt;w:name w:val="Macro Text Char"/&gt;&lt;w:basedOn w:val="DefaultParagraphFont"/&gt;&lt;w:link w:val="MacroText"/&gt;&lt;w:uiPriority w:val="99"/&gt;&lt;w:semiHidden/&gt;&lt;w:rsid w:val="00421476"/&gt;&lt;w:rPr&gt;&lt;w:sz w:val="20"/&gt;&lt;w:szCs w:val="20"/&gt;&lt;w:lang w:val="en-GB"/&gt;&lt;/w:rPr&gt;&lt;/w:style&gt;&lt;w:style w:type="paragraph" w:styleId="NormalWeb"&gt;&lt;w:name w:val="Normal (Web)"/&gt;&lt;w:basedOn w:val="Normal"/&gt;&lt;w:uiPriority w:val="99"/&gt;&lt;w:semiHidden/&gt;&lt;w:rsid w:val="00421476"/&gt;&lt;w:rPr&gt;&lt;w:rFonts w:cs="Times New Roman"/&gt;&lt;w:sz w:val="24"/&gt;&lt;w:szCs w:val="24"/&gt;&lt;/w:rPr&gt;&lt;/w:style&gt;&lt;w:style w:type="paragraph" w:styleId="PlainText"&gt;&lt;w:name w:val="Plain Text"/&gt;&lt;w:basedOn w:val="Normal"/&gt;&lt;w:link w:val="PlainTextChar"/&gt;&lt;w:uiPriority w:val="99"/&gt;&lt;w:semiHidden/&gt;&lt;w:rsid w:val="00421476"/&gt;&lt;w:pPr&gt;&lt;w:spacing w:after="0"/&gt;&lt;/w:pPr&gt;&lt;w:rPr&gt;&lt;w:sz w:val="21"/&gt;&lt;w:szCs w:val="21"/&gt;&lt;/w:rPr&gt;&lt;/w:style&gt;&lt;w:style w:type="character" w:customStyle="1" w:styleId="PlainTextChar"&gt;&lt;w:name w:val="Plain Text Char"/&gt;&lt;w:basedOn w:val="DefaultParagraphFont"/&gt;&lt;w:link w:val="PlainText"/&gt;&lt;w:uiPriority w:val="99"/&gt;&lt;w:semiHidden/&gt;&lt;w:rsid w:val="00421476"/&gt;&lt;w:rPr&gt;&lt;w:sz w:val="21"/&gt;&lt;w:szCs w:val="21"/&gt;&lt;w:lang w:val="en-GB"/&gt;&lt;/w:rPr&gt;&lt;/w:style&gt;&lt;w:style w:type="paragraph" w:customStyle="1" w:styleId="Name"&gt;&lt;w:name w:val="Name"/&gt;&lt;w:basedOn w:val="Normal"/&gt;&lt;w:next w:val="Normal"/&gt;&lt;w:uiPriority w:val="10"/&gt;&lt;w:rsid w:val="00C17BB4"/&gt;&lt;w:pPr&gt;&lt;w:spacing w:after="0" w:line="240" w:lineRule="auto"/&gt;&lt;/w:pPr&gt;&lt;w:rPr&gt;&lt;w:rFonts w:asciiTheme="majorHAnsi" w:hAnsiTheme="majorHAnsi"/&gt;&lt;/w:rPr&gt;&lt;/w:style&gt;&lt;w:style w:type="paragraph" w:customStyle="1" w:styleId="Info"&gt;&lt;w:name w:val="Info"/&gt;&lt;w:basedOn w:val="Normal"/&gt;&lt;w:uiPriority w:val="10"/&gt;&lt;w:rsid w:val="008B734D"/&gt;&lt;w:pPr&gt;&lt;w:spacing w:after="0" w:line="240" w:lineRule="auto"/&gt;&lt;/w:pPr&gt;&lt;/w:style&gt;&lt;/w:styles&gt;&lt;/pkg:xmlData&gt;&lt;/pkg:part&gt;&lt;pkg:part pkg:name="/word/glossary/fontTable.xml" pkg:contentType="application/vnd.openxmlformats-officedocument.wordprocessingml.fontTable+xml"&gt;&lt;pkg:xmlData&gt;&lt;w:fonts xmlns:mc="http://schemas.openxmlformats.org/markup-compatibility/2006" xmlns:r="http://schemas.openxmlformats.org/officeDocument/2006/relationships" xmlns:w="http://schemas.openxmlformats.org/wordprocessingml/2006/main" xmlns:w14="http://schemas.microsoft.com/office/word/2010/wordml" xmlns:w15="http://schemas.microsoft.com/office/word/2012/wordml" xmlns:w16se="http://schemas.microsoft.com/office/word/2015/wordml/symex" mc:Ignorable="w14 w15 w16se"/&gt;&lt;/pkg:xmlData&gt;&lt;/pkg:part&gt;&lt;pkg:part pkg:name="/word/glossary/webSettings.xml" pkg:contentType="application/vnd.openxmlformats-officedocument.wordprocessingml.webSettings+xml"&gt;&lt;pkg:xmlData&gt;&lt;w:webSettings xmlns:mc="http://schemas.openxmlformats.org/markup-compatibility/2006" xmlns:r="http://schemas.openxmlformats.org/officeDocument/2006/relationships" xmlns:w="http://schemas.openxmlformats.org/wordprocessingml/2006/main" xmlns:w14="http://schemas.microsoft.com/office/word/2010/wordml" xmlns:w15="http://schemas.microsoft.com/office/word/2012/wordml" xmlns:w16se="http://schemas.microsoft.com/office/word/2015/wordml/symex" mc:Ignorable="w14 w15 w16se"&gt;&lt;w:optimizeForBrowser/&gt;&lt;w:allowPNG/&gt;&lt;/w:webSettings&gt;&lt;/pkg:xmlData&gt;&lt;/pkg:part&gt;&lt;pkg:part pkg:name="/word/numbering.xml" pkg:contentType="application/vnd.openxmlformats-officedocument.wordprocessingml.numbering+xml"&gt;&lt;pkg:xmlData&gt;&lt;w:numbering xmlns:wpc="http://schemas.microsoft.com/office/word/2010/wordprocessingCanvas" xmlns:cx="http://schemas.microsoft.com/office/drawing/2014/chartex" xmlns:cx1="http://schemas.microsoft.com/office/drawing/2015/9/8/chartex" xmlns:cx2="http://schemas.microsoft.com/office/drawing/2015/10/21/chartex" xmlns:cx3="http://schemas.microsoft.com/office/drawing/2016/5/9/chartex" xmlns:cx4="http://schemas.microsoft.com/office/drawing/2016/5/10/chartex" xmlns:cx5="http://schemas.microsoft.com/office/drawing/2016/5/11/chartex" xmlns:cx6="http://schemas.microsoft.com/office/drawing/2016/5/12/chartex" xmlns:cx7="http://schemas.microsoft.com/office/drawing/2016/5/13/chartex" xmlns:cx8="http://schemas.microsoft.com/office/drawing/2016/5/14/chartex" xmlns:mc="http://schemas.openxmlformats.org/markup-compatibility/2006" xmlns:o="urn:schemas-microsoft-com:office:office" xmlns:r="http://schemas.openxmlformats.org/officeDocument/2006/relationships" xmlns:m="http://schemas.openxmlformats.org/officeDocument/2006/math" xmlns:v="urn:schemas-microsoft-com:vml" xmlns:wp14="http://schemas.microsoft.com/office/word/2010/wordprocessingDrawing" xmlns:wp="http://schemas.openxmlformats.org/drawingml/2006/wordprocessingDrawing" xmlns:w10="urn:schemas-microsoft-com:office:word" xmlns:w="http://schemas.openxmlformats.org/wordprocessingml/2006/main" xmlns:w14="http://schemas.microsoft.com/office/word/2010/wordml" xmlns:w15="http://schemas.microsoft.com/office/word/2012/wordml" xmlns:w16se="http://schemas.microsoft.com/office/word/2015/wordml/symex" xmlns:wpg="http://schemas.microsoft.com/office/word/2010/wordprocessingGroup" xmlns:wpi="http://schemas.microsoft.com/office/word/2010/wordprocessingInk" xmlns:wne="http://schemas.microsoft.com/office/word/2006/wordml" xmlns:wps="http://schemas.microsoft.com/office/word/2010/wordprocessingShape" mc:Ignorable="w14 w15 w16se wp14"&gt;&lt;w:abstractNum w:abstractNumId="0" w15:restartNumberingAfterBreak="0"&gt;&lt;w:nsid w:val="FFFFFF7C"/&gt;&lt;w:multiLevelType w:val="singleLevel"/&gt;&lt;w:tmpl w:val="1D6AD0EC"/&gt;&lt;w:lvl w:ilvl="0"&gt;&lt;w:start w:val="1"/&gt;&lt;w:numFmt w:val="decimal"/&gt;&lt;w:lvlText w:val="%1."/&gt;&lt;w:lvlJc w:val="left"/&gt;&lt;w:pPr&gt;&lt;w:tabs&gt;&lt;w:tab w:val="num" w:pos="1492"/&gt;&lt;/w:tabs&gt;&lt;w:ind w:left="1492" w:hanging="360"/&gt;&lt;/w:pPr&gt;&lt;/w:lvl&gt;&lt;/w:abstractNum&gt;&lt;w:abstractNum w:abstractNumId="1" w15:restartNumberingAfterBreak="0"&gt;&lt;w:nsid w:val="FFFFFF7D"/&gt;&lt;w:multiLevelType w:val="singleLevel"/&gt;&lt;w:tmpl w:val="6C44DE1A"/&gt;&lt;w:lvl w:ilvl="0"&gt;&lt;w:start w:val="1"/&gt;&lt;w:numFmt w:val="decimal"/&gt;&lt;w:lvlText w:val="%1."/&gt;&lt;w:lvlJc w:val="left"/&gt;&lt;w:pPr&gt;&lt;w:tabs&gt;&lt;w:tab w:val="num" w:pos="1209"/&gt;&lt;/w:tabs&gt;&lt;w:ind w:left="1209" w:hanging="360"/&gt;&lt;/w:pPr&gt;&lt;/w:lvl&gt;&lt;/w:abstractNum&gt;&lt;w:abstractNum w:abstractNumId="2" w15:restartNumberingAfterBreak="0"&gt;&lt;w:nsid w:val="FFFFFF7E"/&gt;&lt;w:multiLevelType w:val="singleLevel"/&gt;&lt;w:tmpl w:val="83748C94"/&gt;&lt;w:lvl w:ilvl="0"&gt;&lt;w:start w:val="1"/&gt;&lt;w:numFmt w:val="decimal"/&gt;&lt;w:lvlText w:val="%1."/&gt;&lt;w:lvlJc w:val="left"/&gt;&lt;w:pPr&gt;&lt;w:tabs&gt;&lt;w:tab w:val="num" w:pos="926"/&gt;&lt;/w:tabs&gt;&lt;w:ind w:left="926" w:hanging="360"/&gt;&lt;/w:pPr&gt;&lt;/w:lvl&gt;&lt;/w:abstractNum&gt;&lt;w:abstractNum w:abstractNumId="3" w15:restartNumberingAfterBreak="0"&gt;&lt;w:nsid w:val="FFFFFF7F"/&gt;&lt;w:multiLevelType w:val="singleLevel"/&gt;&lt;w:tmpl w:val="871A6F0C"/&gt;&lt;w:lvl w:ilvl="0"&gt;&lt;w:start w:val="1"/&gt;&lt;w:numFmt w:val="decimal"/&gt;&lt;w:lvlText w:val="%1."/&gt;&lt;w:lvlJc w:val="left"/&gt;&lt;w:pPr&gt;&lt;w:tabs&gt;&lt;w:tab w:val="num" w:pos="643"/&gt;&lt;/w:tabs&gt;&lt;w:ind w:left="643" w:hanging="360"/&gt;&lt;/w:pPr&gt;&lt;/w:lvl&gt;&lt;/w:abstractNum&gt;&lt;w:abstractNum w:abstractNumId="4" w15:restartNumberingAfterBreak="0"&gt;&lt;w:nsid w:val="FFFFFF80"/&gt;&lt;w:multiLevelType w:val="singleLevel"/&gt;&lt;w:tmpl w:val="ED1CE676"/&gt;&lt;w:lvl w:ilvl="0"&gt;&lt;w:start w:val="1"/&gt;&lt;w:numFmt w:val="bullet"/&gt;&lt;w:lvlText w:val=""/&gt;&lt;w:lvlJc w:val="left"/&gt;&lt;w:pPr&gt;&lt;w:tabs&gt;&lt;w:tab w:val="num" w:pos="1492"/&gt;&lt;/w:tabs&gt;&lt;w:ind w:left="1492" w:hanging="360"/&gt;&lt;/w:pPr&gt;&lt;w:rPr&gt;&lt;w:rFonts w:ascii="Symbol" w:hAnsi="Symbol" w:hint="default"/&gt;&lt;/w:rPr&gt;&lt;/w:lvl&gt;&lt;/w:abstractNum&gt;&lt;w:abstractNum w:abstractNumId="5" w15:restartNumberingAfterBreak="0"&gt;&lt;w:nsid w:val="FFFFFF81"/&gt;&lt;w:multiLevelType w:val="singleLevel"/&gt;&lt;w:tmpl w:val="DEF60714"/&gt;&lt;w:lvl w:ilvl="0"&gt;&lt;w:start w:val="1"/&gt;&lt;w:numFmt w:val="bullet"/&gt;&lt;w:lvlText w:val=""/&gt;&lt;w:lvlJc w:val="left"/&gt;&lt;w:pPr&gt;&lt;w:tabs&gt;&lt;w:tab w:val="num" w:pos="1209"/&gt;&lt;/w:tabs&gt;&lt;w:ind w:left="1209" w:hanging="360"/&gt;&lt;/w:pPr&gt;&lt;w:rPr&gt;&lt;w:rFonts w:ascii="Symbol" w:hAnsi="Symbol" w:hint="default"/&gt;&lt;/w:rPr&gt;&lt;/w:lvl&gt;&lt;/w:abstractNum&gt;&lt;w:abstractNum w:abstractNumId="6" w15:restartNumberingAfterBreak="0"&gt;&lt;w:nsid w:val="FFFFFF82"/&gt;&lt;w:multiLevelType w:val="singleLevel"/&gt;&lt;w:tmpl w:val="91EA47E8"/&gt;&lt;w:lvl w:ilvl="0"&gt;&lt;w:start w:val="1"/&gt;&lt;w:numFmt w:val="bullet"/&gt;&lt;w:lvlText w:val=""/&gt;&lt;w:lvlJc w:val="left"/&gt;&lt;w:pPr&gt;&lt;w:tabs&gt;&lt;w:tab w:val="num" w:pos="926"/&gt;&lt;/w:tabs&gt;&lt;w:ind w:left="926" w:hanging="360"/&gt;&lt;/w:pPr&gt;&lt;w:rPr&gt;&lt;w:rFonts w:ascii="Symbol" w:hAnsi="Symbol" w:hint="default"/&gt;&lt;/w:rPr&gt;&lt;/w:lvl&gt;&lt;/w:abstractNum&gt;&lt;w:abstractNum w:abstractNumId="7" w15:restartNumberingAfterBreak="0"&gt;&lt;w:nsid w:val="FFFFFF83"/&gt;&lt;w:multiLevelType w:val="singleLevel"/&gt;&lt;w:tmpl w:val="9278B09A"/&gt;&lt;w:lvl w:ilvl="0"&gt;&lt;w:start w:val="1"/&gt;&lt;w:numFmt w:val="bullet"/&gt;&lt;w:lvlText w:val=""/&gt;&lt;w:lvlJc w:val="left"/&gt;&lt;w:pPr&gt;&lt;w:tabs&gt;&lt;w:tab w:val="num" w:pos="643"/&gt;&lt;/w:tabs&gt;&lt;w:ind w:left="643" w:hanging="360"/&gt;&lt;/w:pPr&gt;&lt;w:rPr&gt;&lt;w:rFonts w:ascii="Symbol" w:hAnsi="Symbol" w:hint="default"/&gt;&lt;/w:rPr&gt;&lt;/w:lvl&gt;&lt;/w:abstractNum&gt;&lt;w:abstractNum w:abstractNumId="8" w15:restartNumberingAfterBreak="0"&gt;&lt;w:nsid w:val="17071BBC"/&gt;&lt;w:multiLevelType w:val="multilevel"/&gt;&lt;w:tmpl w:val="B512299C"/&gt;&lt;w:lvl w:ilvl="0"&gt;&lt;w:start w:val="1"/&gt;&lt;w:numFmt w:val="decimal"/&gt;&lt;w:pStyle w:val="ListNumber"/&gt;&lt;w:lvlText w:val="%1."/&gt;&lt;w:lvlJc w:val="left"/&gt;&lt;w:pPr&gt;&lt;w:ind w:left="360" w:hanging="360"/&gt;&lt;/w:pPr&gt;&lt;w:rPr&gt;&lt;w:rFonts w:hint="default"/&gt;&lt;/w:rPr&gt;&lt;/w:lvl&gt;&lt;w:lvl w:ilvl="1"&gt;&lt;w:start w:val="1"/&gt;&lt;w:numFmt w:val="lowerLetter"/&gt;&lt;w:pStyle w:val="ListNumber2"/&gt;&lt;w:lvlText w:val="%2."/&gt;&lt;w:lvlJc w:val="left"/&gt;&lt;w:pPr&gt;&lt;w:ind w:left="720" w:hanging="360"/&gt;&lt;/w:pPr&gt;&lt;w:rPr&gt;&lt;w:rFonts w:hint="default"/&gt;&lt;/w:rPr&gt;&lt;/w:lvl&gt;&lt;w:lvl w:ilvl="2"&gt;&lt;w:start w:val="1"/&gt;&lt;w:numFmt w:val="lowerRoman"/&gt;&lt;w:pStyle w:val="ListNumber3"/&gt;&lt;w:lvlText w:val="%3)"/&gt;&lt;w:lvlJc w:val="left"/&gt;&lt;w:pPr&gt;&lt;w:ind w:left="1080" w:hanging="360"/&gt;&lt;/w:pPr&gt;&lt;w:rPr&gt;&lt;w:rFonts w:hint="default"/&gt;&lt;/w:rPr&gt;&lt;/w:lvl&gt;&lt;w:lvl w:ilvl="3"&gt;&lt;w:start w:val="1"/&gt;&lt;w:numFmt w:val="decimal"/&gt;&lt;w:pStyle w:val="ListNumber4"/&gt;&lt;w:lvlText w:val="%4)"/&gt;&lt;w:lvlJc w:val="left"/&gt;&lt;w:pPr&gt;&lt;w:ind w:left="1440" w:hanging="360"/&gt;&lt;/w:pPr&gt;&lt;w:rPr&gt;&lt;w:rFonts w:hint="default"/&gt;&lt;/w:rPr&gt;&lt;/w:lvl&gt;&lt;w:lvl w:ilvl="4"&gt;&lt;w:start w:val="1"/&gt;&lt;w:numFmt w:val="lowerLetter"/&gt;&lt;w:pStyle w:val="ListNumber5"/&gt;&lt;w:lvlText w:val="%5)"/&gt;&lt;w:lvlJc w:val="left"/&gt;&lt;w:pPr&gt;&lt;w:ind w:left="1800" w:hanging="360"/&gt;&lt;/w:pPr&gt;&lt;w:rPr&gt;&lt;w:rFonts w:hint="default"/&gt;&lt;/w:rPr&gt;&lt;/w:lvl&gt;&lt;w:lvl w:ilvl="5"&gt;&lt;w:start w:val="1"/&gt;&lt;w:numFmt w:val="lowerRoman"/&gt;&lt;w:lvlText w:val="%6)"/&gt;&lt;w:lvlJc w:val="left"/&gt;&lt;w:pPr&gt;&lt;w:ind w:left="2160" w:hanging="360"/&gt;&lt;/w:pPr&gt;&lt;w:rPr&gt;&lt;w:rFonts w:hint="default"/&gt;&lt;/w:rPr&gt;&lt;/w:lvl&gt;&lt;w:lvl w:ilvl="6"&gt;&lt;w:start w:val="1"/&gt;&lt;w:numFmt w:val="decimal"/&gt;&lt;w:lvlText w:val="(%7)"/&gt;&lt;w:lvlJc w:val="left"/&gt;&lt;w:pPr&gt;&lt;w:ind w:left="2520" w:hanging="360"/&gt;&lt;/w:pPr&gt;&lt;w:rPr&gt;&lt;w:rFonts w:hint="default"/&gt;&lt;/w:rPr&gt;&lt;/w:lvl&gt;&lt;w:lvl w:ilvl="7"&gt;&lt;w:start w:val="1"/&gt;&lt;w:numFmt w:val="lowerLetter"/&gt;&lt;w:lvlText w:val="(%8)"/&gt;&lt;w:lvlJc w:val="left"/&gt;&lt;w:pPr&gt;&lt;w:ind w:left="2880" w:hanging="360"/&gt;&lt;/w:pPr&gt;&lt;w:rPr&gt;&lt;w:rFonts w:hint="default"/&gt;&lt;/w:rPr&gt;&lt;/w:lvl&gt;&lt;w:lvl w:ilvl="8"&gt;&lt;w:start w:val="1"/&gt;&lt;w:numFmt w:val="lowerRoman"/&gt;&lt;w:lvlText w:val="(%9)"/&gt;&lt;w:lvlJc w:val="left"/&gt;&lt;w:pPr&gt;&lt;w:ind w:left="3240" w:hanging="360"/&gt;&lt;/w:pPr&gt;&lt;w:rPr&gt;&lt;w:rFonts w:hint="default"/&gt;&lt;/w:rPr&gt;&lt;/w:lvl&gt;&lt;/w:abstractNum&gt;&lt;w:abstractNum w:abstractNumId="9" w15:restartNumberingAfterBreak="0"&gt;&lt;w:nsid w:val="3CE155D5"/&gt;&lt;w:multiLevelType w:val="multilevel"/&gt;&lt;w:tmpl w:val="041D001D"/&gt;&lt;w:lvl w:ilvl="0"&gt;&lt;w:start w:val="1"/&gt;&lt;w:numFmt w:val="decimal"/&gt;&lt;w:lvlText w:val="%1)"/&gt;&lt;w:lvlJc w:val="left"/&gt;&lt;w:pPr&gt;&lt;w:ind w:left="360" w:hanging="360"/&gt;&lt;/w:pPr&gt;&lt;/w:lvl&gt;&lt;w:lvl w:ilvl="1"&gt;&lt;w:start w:val="1"/&gt;&lt;w:numFmt w:val="lowerLetter"/&gt;&lt;w:lvlText w:val="%2)"/&gt;&lt;w:lvlJc w:val="left"/&gt;&lt;w:pPr&gt;&lt;w:ind w:left="720" w:hanging="360"/&gt;&lt;/w:pPr&gt;&lt;/w:lvl&gt;&lt;w:lvl w:ilvl="2"&gt;&lt;w:start w:val="1"/&gt;&lt;w:numFmt w:val="lowerRoman"/&gt;&lt;w:lvlText w:val="%3)"/&gt;&lt;w:lvlJc w:val="left"/&gt;&lt;w:pPr&gt;&lt;w:ind w:left="1080" w:hanging="360"/&gt;&lt;/w:pPr&gt;&lt;/w:lvl&gt;&lt;w:lvl w:ilvl="3"&gt;&lt;w:start w:val="1"/&gt;&lt;w:numFmt w:val="decimal"/&gt;&lt;w:lvlText w:val="(%4)"/&gt;&lt;w:lvlJc w:val="left"/&gt;&lt;w:pPr&gt;&lt;w:ind w:left="1440" w:hanging="360"/&gt;&lt;/w:pPr&gt;&lt;/w:lvl&gt;&lt;w:lvl w:ilvl="4"&gt;&lt;w:start w:val="1"/&gt;&lt;w:numFmt w:val="lowerLetter"/&gt;&lt;w:lvlText w:val="(%5)"/&gt;&lt;w:lvlJc w:val="left"/&gt;&lt;w:pPr&gt;&lt;w:ind w:left="1800" w:hanging="360"/&gt;&lt;/w:pPr&gt;&lt;/w:lvl&gt;&lt;w:lvl w:ilvl="5"&gt;&lt;w:start w:val="1"/&gt;&lt;w:numFmt w:val="lowerRoman"/&gt;&lt;w:lvlText w:val="(%6)"/&gt;&lt;w:lvlJc w:val="left"/&gt;&lt;w:pPr&gt;&lt;w:ind w:left="2160" w:hanging="360"/&gt;&lt;/w:pPr&gt;&lt;/w:lvl&gt;&lt;w:lvl w:ilvl="6"&gt;&lt;w:start w:val="1"/&gt;&lt;w:numFmt w:val="decimal"/&gt;&lt;w:lvlText w:val="%7."/&gt;&lt;w:lvlJc w:val="left"/&gt;&lt;w:pPr&gt;&lt;w:ind w:left="2520" w:hanging="360"/&gt;&lt;/w:pPr&gt;&lt;/w:lvl&gt;&lt;w:lvl w:ilvl="7"&gt;&lt;w:start w:val="1"/&gt;&lt;w:numFmt w:val="lowerLetter"/&gt;&lt;w:lvlText w:val="%8."/&gt;&lt;w:lvlJc w:val="left"/&gt;&lt;w:pPr&gt;&lt;w:ind w:left="2880" w:hanging="360"/&gt;&lt;/w:pPr&gt;&lt;/w:lvl&gt;&lt;w:lvl w:ilvl="8"&gt;&lt;w:start w:val="1"/&gt;&lt;w:numFmt w:val="lowerRoman"/&gt;&lt;w:lvlText w:val="%9."/&gt;&lt;w:lvlJc w:val="left"/&gt;&lt;w:pPr&gt;&lt;w:ind w:left="3240" w:hanging="360"/&gt;&lt;/w:pPr&gt;&lt;/w:lvl&gt;&lt;/w:abstractNum&gt;&lt;w:abstractNum w:abstractNumId="10" w15:restartNumberingAfterBreak="0"&gt;&lt;w:nsid w:val="3D727479"/&gt;&lt;w:multiLevelType w:val="multilevel"/&gt;&lt;w:tmpl w:val="041D0023"/&gt;&lt;w:lvl w:ilvl="0"&gt;&lt;w:start w:val="1"/&gt;&lt;w:numFmt w:val="upperRoman"/&gt;&lt;w:lvlText w:val="Artikel %1."/&gt;&lt;w:lvlJc w:val="left"/&gt;&lt;w:pPr&gt;&lt;w:ind w:left="0" w:firstLine="0"/&gt;&lt;/w:pPr&gt;&lt;/w:lvl&gt;&lt;w:lvl w:ilvl="1"&gt;&lt;w:start w:val="1"/&gt;&lt;w:numFmt w:val="decimalZero"/&gt;&lt;w:isLgl/&gt;&lt;w:lvlText w:val="Avsnitt %1.%2"/&gt;&lt;w:lvlJc w:val="left"/&gt;&lt;w:pPr&gt;&lt;w:ind w:left="0" w:firstLine="0"/&gt;&lt;/w:pPr&gt;&lt;/w:lvl&gt;&lt;w:lvl w:ilvl="2"&gt;&lt;w:start w:val="1"/&gt;&lt;w:numFmt w:val="lowerLetter"/&gt;&lt;w:lvlText w:val="(%3)"/&gt;&lt;w:lvlJc w:val="left"/&gt;&lt;w:pPr&gt;&lt;w:ind w:left="720" w:hanging="432"/&gt;&lt;/w:pPr&gt;&lt;/w:lvl&gt;&lt;w:lvl w:ilvl="3"&gt;&lt;w:start w:val="1"/&gt;&lt;w:numFmt w:val="lowerRoman"/&gt;&lt;w:lvlText w:val="(%4)"/&gt;&lt;w:lvlJc w:val="right"/&gt;&lt;w:pPr&gt;&lt;w:ind w:left="864" w:hanging="144"/&gt;&lt;/w:pPr&gt;&lt;/w:lvl&gt;&lt;w:lvl w:ilvl="4"&gt;&lt;w:start w:val="1"/&gt;&lt;w:numFmt w:val="decimal"/&gt;&lt;w:pStyle w:val="Heading5"/&gt;&lt;w:lvlText w:val="%5)"/&gt;&lt;w:lvlJc w:val="left"/&gt;&lt;w:pPr&gt;&lt;w:ind w:left="1008" w:hanging="432"/&gt;&lt;/w:pPr&gt;&lt;/w:lvl&gt;&lt;w:lvl w:ilvl="5"&gt;&lt;w:start w:val="1"/&gt;&lt;w:numFmt w:val="lowerLetter"/&gt;&lt;w:pStyle w:val="Heading6"/&gt;&lt;w:lvlText w:val="%6)"/&gt;&lt;w:lvlJc w:val="left"/&gt;&lt;w:pPr&gt;&lt;w:ind w:left="1152" w:hanging="432"/&gt;&lt;/w:pPr&gt;&lt;/w:lvl&gt;&lt;w:lvl w:ilvl="6"&gt;&lt;w:start w:val="1"/&gt;&lt;w:numFmt w:val="lowerRoman"/&gt;&lt;w:pStyle w:val="Heading7"/&gt;&lt;w:lvlText w:val="%7)"/&gt;&lt;w:lvlJc w:val="right"/&gt;&lt;w:pPr&gt;&lt;w:ind w:left="1296" w:hanging="288"/&gt;&lt;/w:pPr&gt;&lt;/w:lvl&gt;&lt;w:lvl w:ilvl="7"&gt;&lt;w:start w:val="1"/&gt;&lt;w:numFmt w:val="lowerLetter"/&gt;&lt;w:pStyle w:val="Heading8"/&gt;&lt;w:lvlText w:val="%8."/&gt;&lt;w:lvlJc w:val="left"/&gt;&lt;w:pPr&gt;&lt;w:ind w:left="1440" w:hanging="432"/&gt;&lt;/w:pPr&gt;&lt;/w:lvl&gt;&lt;w:lvl w:ilvl="8"&gt;&lt;w:start w:val="1"/&gt;&lt;w:numFmt w:val="lowerRoman"/&gt;&lt;w:pStyle w:val="Heading9"/&gt;&lt;w:lvlText w:val="%9."/&gt;&lt;w:lvlJc w:val="right"/&gt;&lt;w:pPr&gt;&lt;w:ind w:left="1584" w:hanging="144"/&gt;&lt;/w:pPr&gt;&lt;/w:lvl&gt;&lt;/w:abstractNum&gt;&lt;w:abstractNum w:abstractNumId="11" w15:restartNumberingAfterBreak="0"&gt;&lt;w:nsid w:val="43F95E9C"/&gt;&lt;w:multiLevelType w:val="multilevel"/&gt;&lt;w:tmpl w:val="5FAE225A"/&gt;&lt;w:lvl w:ilvl="0"&gt;&lt;w:start w:val="1"/&gt;&lt;w:numFmt w:val="decimal"/&gt;&lt;w:pStyle w:val="NumberedHeading1"/&gt;&lt;w:lvlText w:val="%1."/&gt;&lt;w:lvlJc w:val="left"/&gt;&lt;w:pPr&gt;&lt;w:ind w:left="907" w:hanging="907"/&gt;&lt;/w:pPr&gt;&lt;w:rPr&gt;&lt;w:rFonts w:hint="default"/&gt;&lt;/w:rPr&gt;&lt;/w:lvl&gt;&lt;w:lvl w:ilvl="1"&gt;&lt;w:start w:val="1"/&gt;&lt;w:numFmt w:val="decimal"/&gt;&lt;w:pStyle w:val="NumberedHeading2"/&gt;&lt;w:lvlText w:val="%1.%2"/&gt;&lt;w:lvlJc w:val="left"/&gt;&lt;w:pPr&gt;&lt;w:ind w:left="907" w:hanging="907"/&gt;&lt;/w:pPr&gt;&lt;w:rPr&gt;&lt;w:rFonts w:hint="default"/&gt;&lt;/w:rPr&gt;&lt;/w:lvl&gt;&lt;w:lvl w:ilvl="2"&gt;&lt;w:start w:val="1"/&gt;&lt;w:numFmt w:val="decimal"/&gt;&lt;w:pStyle w:val="NumberedHeading3"/&gt;&lt;w:lvlText w:val="%1.%2.%3"/&gt;&lt;w:lvlJc w:val="left"/&gt;&lt;w:pPr&gt;&lt;w:ind w:left="907" w:hanging="907"/&gt;&lt;/w:pPr&gt;&lt;w:rPr&gt;&lt;w:rFonts w:hint="default"/&gt;&lt;/w:rPr&gt;&lt;/w:lvl&gt;&lt;w:lvl w:ilvl="3"&gt;&lt;w:start w:val="1"/&gt;&lt;w:numFmt w:val="decimal"/&gt;&lt;w:pStyle w:val="NumberedHeading4"/&gt;&lt;w:lvlText w:val="%1.%2.%3.%4"/&gt;&lt;w:lvlJc w:val="left"/&gt;&lt;w:pPr&gt;&lt;w:ind w:left="907" w:hanging="907"/&gt;&lt;/w:pPr&gt;&lt;w:rPr&gt;&lt;w:rFonts w:hint="default"/&gt;&lt;/w:rPr&gt;&lt;/w:lvl&gt;&lt;w:lvl w:ilvl="4"&gt;&lt;w:start w:val="1"/&gt;&lt;w:numFmt w:val="lowerLetter"/&gt;&lt;w:lvlText w:val="(%5)"/&gt;&lt;w:lvlJc w:val="left"/&gt;&lt;w:pPr&gt;&lt;w:ind w:left="907" w:hanging="907"/&gt;&lt;/w:pPr&gt;&lt;w:rPr&gt;&lt;w:rFonts w:hint="default"/&gt;&lt;/w:rPr&gt;&lt;/w:lvl&gt;&lt;w:lvl w:ilvl="5"&gt;&lt;w:start w:val="1"/&gt;&lt;w:numFmt w:val="lowerRoman"/&gt;&lt;w:lvlText w:val="(%6)"/&gt;&lt;w:lvlJc w:val="left"/&gt;&lt;w:pPr&gt;&lt;w:ind w:left="907" w:hanging="907"/&gt;&lt;/w:pPr&gt;&lt;w:rPr&gt;&lt;w:rFonts w:hint="default"/&gt;&lt;/w:rPr&gt;&lt;/w:lvl&gt;&lt;w:lvl w:ilvl="6"&gt;&lt;w:start w:val="1"/&gt;&lt;w:numFmt w:val="decimal"/&gt;&lt;w:lvlText w:val="%7."/&gt;&lt;w:lvlJc w:val="left"/&gt;&lt;w:pPr&gt;&lt;w:ind w:left="907" w:hanging="907"/&gt;&lt;/w:pPr&gt;&lt;w:rPr&gt;&lt;w:rFonts w:hint="default"/&gt;&lt;/w:rPr&gt;&lt;/w:lvl&gt;&lt;w:lvl w:ilvl="7"&gt;&lt;w:start w:val="1"/&gt;&lt;w:numFmt w:val="lowerLetter"/&gt;&lt;w:lvlText w:val="%8."/&gt;&lt;w:lvlJc w:val="left"/&gt;&lt;w:pPr&gt;&lt;w:ind w:left="907" w:hanging="907"/&gt;&lt;/w:pPr&gt;&lt;w:rPr&gt;&lt;w:rFonts w:hint="default"/&gt;&lt;/w:rPr&gt;&lt;/w:lvl&gt;&lt;w:lvl w:ilvl="8"&gt;&lt;w:start w:val="1"/&gt;&lt;w:numFmt w:val="lowerRoman"/&gt;&lt;w:lvlText w:val="%9."/&gt;&lt;w:lvlJc w:val="left"/&gt;&lt;w:pPr&gt;&lt;w:ind w:left="907" w:hanging="907"/&gt;&lt;/w:pPr&gt;&lt;w:rPr&gt;&lt;w:rFonts w:hint="default"/&gt;&lt;/w:rPr&gt;&lt;/w:lvl&gt;&lt;/w:abstractNum&gt;&lt;w:abstractNum w:abstractNumId="12" w15:restartNumberingAfterBreak="0"&gt;&lt;w:nsid w:val="4CEF34F7"/&gt;&lt;w:multiLevelType w:val="multilevel"/&gt;&lt;w:tmpl w:val="041D001F"/&gt;&lt;w:lvl w:ilvl="0"&gt;&lt;w:start w:val="1"/&gt;&lt;w:numFmt w:val="decimal"/&gt;&lt;w:lvlText w:val="%1."/&gt;&lt;w:lvlJc w:val="left"/&gt;&lt;w:pPr&gt;&lt;w:ind w:left="360" w:hanging="360"/&gt;&lt;/w:pPr&gt;&lt;/w:lvl&gt;&lt;w:lvl w:ilvl="1"&gt;&lt;w:start w:val="1"/&gt;&lt;w:numFmt w:val="decimal"/&gt;&lt;w:lvlText w:val="%1.%2."/&gt;&lt;w:lvlJc w:val="left"/&gt;&lt;w:pPr&gt;&lt;w:ind w:left="792" w:hanging="432"/&gt;&lt;/w:pPr&gt;&lt;/w:lvl&gt;&lt;w:lvl w:ilvl="2"&gt;&lt;w:start w:val="1"/&gt;&lt;w:numFmt w:val="decimal"/&gt;&lt;w:lvlText w:val="%1.%2.%3."/&gt;&lt;w:lvlJc w:val="left"/&gt;&lt;w:pPr&gt;&lt;w:ind w:left="1224" w:hanging="504"/&gt;&lt;/w:pPr&gt;&lt;/w:lvl&gt;&lt;w:lvl w:ilvl="3"&gt;&lt;w:start w:val="1"/&gt;&lt;w:numFmt w:val="decimal"/&gt;&lt;w:lvlText w:val="%1.%2.%3.%4."/&gt;&lt;w:lvlJc w:val="left"/&gt;&lt;w:pPr&gt;&lt;w:ind w:left="1728" w:hanging="648"/&gt;&lt;/w:pPr&gt;&lt;/w:lvl&gt;&lt;w:lvl w:ilvl="4"&gt;&lt;w:start w:val="1"/&gt;&lt;w:numFmt w:val="decimal"/&gt;&lt;w:lvlText w:val="%1.%2.%3.%4.%5."/&gt;&lt;w:lvlJc w:val="left"/&gt;&lt;w:pPr&gt;&lt;w:ind w:left="2232" w:hanging="792"/&gt;&lt;/w:pPr&gt;&lt;/w:lvl&gt;&lt;w:lvl w:ilvl="5"&gt;&lt;w:start w:val="1"/&gt;&lt;w:numFmt w:val="decimal"/&gt;&lt;w:lvlText w:val="%1.%2.%3.%4.%5.%6."/&gt;&lt;w:lvlJc w:val="left"/&gt;&lt;w:pPr&gt;&lt;w:ind w:left="2736" w:hanging="936"/&gt;&lt;/w:pPr&gt;&lt;/w:lvl&gt;&lt;w:lvl w:ilvl="6"&gt;&lt;w:start w:val="1"/&gt;&lt;w:numFmt w:val="decimal"/&gt;&lt;w:lvlText w:val="%1.%2.%3.%4.%5.%6.%7."/&gt;&lt;w:lvlJc w:val="left"/&gt;&lt;w:pPr&gt;&lt;w:ind w:left="3240" w:hanging="1080"/&gt;&lt;/w:pPr&gt;&lt;/w:lvl&gt;&lt;w:lvl w:ilvl="7"&gt;&lt;w:start w:val="1"/&gt;&lt;w:numFmt w:val="decimal"/&gt;&lt;w:lvlText w:val="%1.%2.%3.%4.%5.%6.%7.%8."/&gt;&lt;w:lvlJc w:val="left"/&gt;&lt;w:pPr&gt;&lt;w:ind w:left="3744" w:hanging="1224"/&gt;&lt;/w:pPr&gt;&lt;/w:lvl&gt;&lt;w:lvl w:ilvl="8"&gt;&lt;w:start w:val="1"/&gt;&lt;w:numFmt w:val="decimal"/&gt;&lt;w:lvlText w:val="%1.%2.%3.%4.%5.%6.%7.%8.%9."/&gt;&lt;w:lvlJc w:val="left"/&gt;&lt;w:pPr&gt;&lt;w:ind w:left="4320" w:hanging="1440"/&gt;&lt;/w:pPr&gt;&lt;/w:lvl&gt;&lt;/w:abstractNum&gt;&lt;w:abstractNum w:abstractNumId="13" w15:restartNumberingAfterBreak="0"&gt;&lt;w:nsid w:val="566F2E6D"/&gt;&lt;w:multiLevelType w:val="multilevel"/&gt;&lt;w:tmpl w:val="6FD4AAFC"/&gt;&lt;w:lvl w:ilvl="0"&gt;&lt;w:start w:val="1"/&gt;&lt;w:numFmt w:val="bullet"/&gt;&lt;w:pStyle w:val="ListBullet"/&gt;&lt;w:lvlText w:val="—"/&gt;&lt;w:lvlJc w:val="left"/&gt;&lt;w:pPr&gt;&lt;w:ind w:left="360" w:hanging="360"/&gt;&lt;/w:pPr&gt;&lt;w:rPr&gt;&lt;w:rFonts w:ascii="Calibri" w:hAnsi="Calibri" w:hint="default"/&gt;&lt;w:color w:val="auto"/&gt;&lt;/w:rPr&gt;&lt;/w:lvl&gt;&lt;w:lvl w:ilvl="1"&gt;&lt;w:start w:val="1"/&gt;&lt;w:numFmt w:val="bullet"/&gt;&lt;w:pStyle w:val="ListBullet2"/&gt;&lt;w:lvlText w:val="—"/&gt;&lt;w:lvlJc w:val="left"/&gt;&lt;w:pPr&gt;&lt;w:ind w:left="720" w:hanging="360"/&gt;&lt;/w:pPr&gt;&lt;w:rPr&gt;&lt;w:rFonts w:ascii="Calibri" w:hAnsi="Calibri" w:hint="default"/&gt;&lt;w:color w:val="auto"/&gt;&lt;/w:rPr&gt;&lt;/w:lvl&gt;&lt;w:lvl w:ilvl="2"&gt;&lt;w:start w:val="1"/&gt;&lt;w:numFmt w:val="bullet"/&gt;&lt;w:pStyle w:val="ListBullet3"/&gt;&lt;w:lvlText w:val="—"/&gt;&lt;w:lvlJc w:val="left"/&gt;&lt;w:pPr&gt;&lt;w:ind w:left="1080" w:hanging="360"/&gt;&lt;/w:pPr&gt;&lt;w:rPr&gt;&lt;w:rFonts w:ascii="Calibri" w:hAnsi="Calibri" w:hint="default"/&gt;&lt;w:color w:val="auto"/&gt;&lt;/w:rPr&gt;&lt;/w:lvl&gt;&lt;w:lvl w:ilvl="3"&gt;&lt;w:start w:val="1"/&gt;&lt;w:numFmt w:val="bullet"/&gt;&lt;w:pStyle w:val="ListBullet4"/&gt;&lt;w:lvlText w:val="—"/&gt;&lt;w:lvlJc w:val="left"/&gt;&lt;w:pPr&gt;&lt;w:ind w:left="1440" w:hanging="360"/&gt;&lt;/w:pPr&gt;&lt;w:rPr&gt;&lt;w:rFonts w:ascii="Calibri" w:hAnsi="Calibri" w:hint="default"/&gt;&lt;w:color w:val="auto"/&gt;&lt;/w:rPr&gt;&lt;/w:lvl&gt;&lt;w:lvl w:ilvl="4"&gt;&lt;w:start w:val="1"/&gt;&lt;w:numFmt w:val="bullet"/&gt;&lt;w:pStyle w:val="ListBullet5"/&gt;&lt;w:lvlText w:val="—"/&gt;&lt;w:lvlJc w:val="left"/&gt;&lt;w:pPr&gt;&lt;w:ind w:left="1800" w:hanging="360"/&gt;&lt;/w:pPr&gt;&lt;w:rPr&gt;&lt;w:rFonts w:ascii="Calibri" w:hAnsi="Calibri" w:hint="default"/&gt;&lt;w:color w:val="auto"/&gt;&lt;/w:rPr&gt;&lt;/w:lvl&gt;&lt;w:lvl w:ilvl="5"&gt;&lt;w:start w:val="1"/&gt;&lt;w:numFmt w:val="bullet"/&gt;&lt;w:lvlText w:val="»"/&gt;&lt;w:lvlJc w:val="left"/&gt;&lt;w:pPr&gt;&lt;w:ind w:left="2160" w:hanging="360"/&gt;&lt;/w:pPr&gt;&lt;w:rPr&gt;&lt;w:rFonts w:ascii="Calibri" w:hAnsi="Calibri" w:hint="default"/&gt;&lt;w:color w:val="auto"/&gt;&lt;/w:rPr&gt;&lt;/w:lvl&gt;&lt;w:lvl w:ilvl="6"&gt;&lt;w:start w:val="1"/&gt;&lt;w:numFmt w:val="bullet"/&gt;&lt;w:lvlText w:val="•"/&gt;&lt;w:lvlJc w:val="left"/&gt;&lt;w:pPr&gt;&lt;w:ind w:left="2520" w:hanging="360"/&gt;&lt;/w:pPr&gt;&lt;w:rPr&gt;&lt;w:rFonts w:ascii="Calibri" w:hAnsi="Calibri" w:hint="default"/&gt;&lt;w:color w:val="auto"/&gt;&lt;/w:rPr&gt;&lt;/w:lvl&gt;&lt;w:lvl w:ilvl="7"&gt;&lt;w:start w:val="1"/&gt;&lt;w:numFmt w:val="bullet"/&gt;&lt;w:lvlText w:val="–"/&gt;&lt;w:lvlJc w:val="left"/&gt;&lt;w:pPr&gt;&lt;w:ind w:left="2880" w:hanging="360"/&gt;&lt;/w:pPr&gt;&lt;w:rPr&gt;&lt;w:rFonts w:ascii="Calibri" w:hAnsi="Calibri" w:hint="default"/&gt;&lt;w:color w:val="auto"/&gt;&lt;/w:rPr&gt;&lt;/w:lvl&gt;&lt;w:lvl w:ilvl="8"&gt;&lt;w:start w:val="1"/&gt;&lt;w:numFmt w:val="bullet"/&gt;&lt;w:lvlText w:val="»"/&gt;&lt;w:lvlJc w:val="left"/&gt;&lt;w:pPr&gt;&lt;w:ind w:left="3240" w:hanging="360"/&gt;&lt;/w:pPr&gt;&lt;w:rPr&gt;&lt;w:rFonts w:ascii="Calibri" w:hAnsi="Calibri" w:hint="default"/&gt;&lt;w:color w:val="auto"/&gt;&lt;/w:rPr&gt;&lt;/w:lvl&gt;&lt;/w:abstractNum&gt;&lt;w:num w:numId="1"&gt;&lt;w:abstractNumId w:val="13"/&gt;&lt;/w:num&gt;&lt;w:num w:numId="2"&gt;&lt;w:abstractNumId w:val="7"/&gt;&lt;/w:num&gt;&lt;w:num w:numId="3"&gt;&lt;w:abstractNumId w:val="6"/&gt;&lt;/w:num&gt;&lt;w:num w:numId="4"&gt;&lt;w:abstractNumId w:val="5"/&gt;&lt;/w:num&gt;&lt;w:num w:numId="5"&gt;&lt;w:abstractNumId w:val="4"/&gt;&lt;/w:num&gt;&lt;w:num w:numId="6"&gt;&lt;w:abstractNumId w:val="8"/&gt;&lt;/w:num&gt;&lt;w:num w:numId="7"&gt;&lt;w:abstractNumId w:val="3"/&gt;&lt;/w:num&gt;&lt;w:num w:numId="8"&gt;&lt;w:abstractNumId w:val="2"/&gt;&lt;/w:num&gt;&lt;w:num w:numId="9"&gt;&lt;w:abstractNumId w:val="1"/&gt;&lt;/w:num&gt;&lt;w:num w:numId="10"&gt;&lt;w:abstractNumId w:val="0"/&gt;&lt;/w:num&gt;&lt;w:num w:numId="11"&gt;&lt;w:abstractNumId w:val="13"/&gt;&lt;w:lvlOverride w:ilvl="0"&gt;&lt;w:startOverride w:val="1"/&gt;&lt;/w:lvlOverride&gt;&lt;w:lvlOverride w:ilvl="1"&gt;&lt;w:startOverride w:val="1"/&gt;&lt;/w:lvlOverride&gt;&lt;w:lvlOverride w:ilvl="2"&gt;&lt;w:startOverride w:val="1"/&gt;&lt;/w:lvlOverride&gt;&lt;w:lvlOverride w:ilvl="3"&gt;&lt;w:startOverride w:val="1"/&gt;&lt;/w:lvlOverride&gt;&lt;w:lvlOverride w:ilvl="4"&gt;&lt;w:startOverride w:val="1"/&gt;&lt;/w:lvlOverride&gt;&lt;w:lvlOverride w:ilvl="5"&gt;&lt;w:startOverride w:val="1"/&gt;&lt;/w:lvlOverride&gt;&lt;w:lvlOverride w:ilvl="6"&gt;&lt;w:startOverride w:val="1"/&gt;&lt;/w:lvlOverride&gt;&lt;w:lvlOverride w:ilvl="7"&gt;&lt;w:startOverride w:val="1"/&gt;&lt;/w:lvlOverride&gt;&lt;w:lvlOverride w:ilvl="8"&gt;&lt;w:startOverride w:val="1"/&gt;&lt;/w:lvlOverride&gt;&lt;/w:num&gt;&lt;w:num w:numId="12"&gt;&lt;w:abstractNumId w:val="11"/&gt;&lt;/w:num&gt;&lt;w:num w:numId="13"&gt;&lt;w:abstractNumId w:val="12"/&gt;&lt;/w:num&gt;&lt;w:num w:numId="14"&gt;&lt;w:abstractNumId w:val="9"/&gt;&lt;/w:num&gt;&lt;w:num w:numId="15"&gt;&lt;w:abstractNumId w:val="10"/&gt;&lt;/w:num&gt;&lt;/w:numbering&gt;&lt;/pkg:xmlData&gt;&lt;/pkg:part&gt;&lt;/pkg:package&gt;
+</Namn>
+      <Titel>&lt;?xml version="1.0" standalone="yes"?&gt;
+&lt;?mso-application progid="Word.Document"?&gt;
+&lt;pkg:package xmlns:pkg="http://schemas.microsoft.com/office/2006/xmlPackage"&gt;&lt;pkg:part pkg:name="/_rels/.rels" pkg:contentType="application/vnd.openxmlformats-package.relationships+xml" pkg:padding="512"&gt;&lt;pkg:xmlData&gt;&lt;Relationships xmlns="http://schemas.openxmlformats.org/package/2006/relationships"&gt;&lt;Relationship Id="rId1" Type="http://schemas.openxmlformats.org/officeDocument/2006/relationships/officeDocument" Target="word/document.xml"/&gt;&lt;/Relationships&gt;&lt;/pkg:xmlData&gt;&lt;/pkg:part&gt;&lt;pkg:part pkg:name="/word/_rels/document.xml.rels" pkg:contentType="application/vnd.openxmlformats-package.relationships+xml" pkg:padding="256"&gt;&lt;pkg:xmlData&gt;&lt;Relationships xmlns="http://schemas.openxmlformats.org/package/2006/relationships"&gt;&lt;Relationship Id="rId3" Type="http://schemas.openxmlformats.org/officeDocument/2006/relationships/glossaryDocument" Target="glossary/document.xml"/&gt;&lt;Relationship Id="rId2" Type="http://schemas.openxmlformats.org/officeDocument/2006/relationships/styles" Target="styles.xml"/&gt;&lt;Relationship Id="rId1" Type="http://schemas.openxmlformats.org/officeDocument/2006/relationships/numbering" Target="numbering.xml"/&gt;&lt;/Relationships&gt;&lt;/pkg:xmlData&gt;&lt;/pkg:part&gt;&lt;pkg:part pkg:name="/word/document.xml" pkg:contentType="application/vnd.openxmlformats-officedocument.wordprocessingml.document.main+xml"&gt;&lt;pkg:xmlData&gt;&lt;w:document xmlns:wpc="http://schemas.microsoft.com/office/word/2010/wordprocessingCanvas" xmlns:cx="http://schemas.microsoft.com/office/drawing/2014/chartex" xmlns:cx1="http://schemas.microsoft.com/office/drawing/2015/9/8/chartex" xmlns:cx2="http://schemas.microsoft.com/office/drawing/2015/10/21/chartex" xmlns:cx3="http://schemas.microsoft.com/office/drawing/2016/5/9/chartex" xmlns:cx4="http://schemas.microsoft.com/office/drawing/2016/5/10/chartex" xmlns:cx5="http://schemas.microsoft.com/office/drawing/2016/5/11/chartex" xmlns:cx6="http://schemas.microsoft.com/office/drawing/2016/5/12/chartex" xmlns:cx7="http://schemas.microsoft.com/office/drawing/2016/5/13/chartex" xmlns:cx8="http://schemas.microsoft.com/office/drawing/2016/5/14/chartex" xmlns:mc="http://schemas.openxmlformats.org/markup-compatibility/2006" xmlns:o="urn:schemas-microsoft-com:office:office" xmlns:r="http://schemas.openxmlformats.org/officeDocument/2006/relationships" xmlns:m="http://schemas.openxmlformats.org/officeDocument/2006/math" xmlns:v="urn:schemas-microsoft-com:vml" xmlns:wp14="http://schemas.microsoft.com/office/word/2010/wordprocessingDrawing" xmlns:wp="http://schemas.openxmlformats.org/drawingml/2006/wordprocessingDrawing" xmlns:w10="urn:schemas-microsoft-com:office:word" xmlns:w="http://schemas.openxmlformats.org/wordprocessingml/2006/main" xmlns:w14="http://schemas.microsoft.com/office/word/2010/wordml" xmlns:w15="http://schemas.microsoft.com/office/word/2012/wordml" xmlns:w16se="http://schemas.microsoft.com/office/word/2015/wordml/symex" xmlns:wpg="http://schemas.microsoft.com/office/word/2010/wordprocessingGroup" xmlns:wpi="http://schemas.microsoft.com/office/word/2010/wordprocessingInk" xmlns:wne="http://schemas.microsoft.com/office/word/2006/wordml" xmlns:wps="http://schemas.microsoft.com/office/word/2010/wordprocessingShape" mc:Ignorable="w14 w15 w16se wp14"&gt;&lt;w:body&gt;&lt;w:sdt&gt;&lt;w:sdtPr&gt;&lt;w:tag w:val="regTitle"/&gt;&lt;w:id w:val="2084647071"/&gt;&lt;w:placeholder&gt;&lt;w:docPart w:val="F25D791C5B2F4E19930DB86356413466"/&gt;&lt;/w:placeholder&gt;&lt;/w:sdtPr&gt;&lt;w:sdtContent&gt;&lt;w:p&gt;&lt;w:r&gt;&lt;w:t&gt;Consultant&lt;/w:t&gt;&lt;/w:r&gt;&lt;/w:p&gt;&lt;/w:sdtContent&gt;&lt;/w:sdt&gt;&lt;w:sectPr&gt;&lt;w:pgSz w:w="12240" w:h="15840"/&gt;&lt;w:pgMar w:top="1417" w:right="1417" w:bottom="1417" w:left="1417" w:header="720" w:footer="720" w:gutter="0"/&gt;&lt;w:cols w:space="720"/&gt;&lt;/w:sectPr&gt;&lt;/w:body&gt;&lt;/w:document&gt;&lt;/pkg:xmlData&gt;&lt;/pkg:part&gt;&lt;pkg:part pkg:name="/word/glossary/settings.xml" pkg:contentType="application/vnd.openxmlformats-officedocument.wordprocessingml.settings+xml"&gt;&lt;pkg:xmlData&gt;&lt;w:settings xmlns:mc="http://schemas.openxmlformats.org/markup-compatibility/2006" xmlns:o="urn:schemas-microsoft-com:office:office" xmlns:r="http://schemas.openxmlformats.org/officeDocument/2006/relationships" xmlns:m="http://schemas.openxmlformats.org/officeDocument/2006/math" xmlns:v="urn:schemas-microsoft-com:vml" xmlns:w10="urn:schemas-microsoft-com:office:word" xmlns:w="http://schemas.openxmlformats.org/wordprocessingml/2006/main" xmlns:w14="http://schemas.microsoft.com/office/word/2010/wordml" xmlns:w15="http://schemas.microsoft.com/office/word/2012/wordml" xmlns:w16se="http://schemas.microsoft.com/office/word/2015/wordml/symex" xmlns:sl="http://schemas.openxmlformats.org/schemaLibrary/2006/main" mc:Ignorable="w14 w15 w16se"&gt;&lt;w:view w:val="normal"/&gt;&lt;w:defaultTabStop w:val="720"/&gt;&lt;w:characterSpacingControl w:val="doNotCompress"/&gt;&lt;w:compat&gt;&lt;w:useFELayout/&gt;&lt;w:compatSetting w:name="compatibilityMode" w:uri="http://schemas.microsoft.com/office/word" w:val="15"/&gt;&lt;w:compatSetting w:name="overrideTableStyleFontSizeAndJustification" w:uri="http://schemas.microsoft.com/office/word" w:val="1"/&gt;&lt;w:compatSetting w:name="enableOpenTypeFeatures" w:uri="http://schemas.microsoft.com/office/word" w:val="1"/&gt;&lt;w:compatSetting w:name="doNotFlipMirrorIndents" w:uri="http://schemas.microsoft.com/office/word" w:val="1"/&gt;&lt;w:compatSetting w:name="differentiateMultirowTableHeaders" w:uri="http://schemas.microsoft.com/office/word" w:val="1"/&gt;&lt;/w:compat&gt;&lt;m:mathPr&gt;&lt;m:mathFont m:val="Cambria Math"/&gt;&lt;m:brkBin m:val="before"/&gt;&lt;m:brkBinSub m:val="--"/&gt;&lt;m:smallFrac m:val="0"/&gt;&lt;m:dispDef/&gt;&lt;m:lMargin m:val="0"/&gt;&lt;m:rMargin m:val="0"/&gt;&lt;m:defJc m:val="centerGroup"/&gt;&lt;m:wrapIndent m:val="1440"/&gt;&lt;m:intLim m:val="subSup"/&gt;&lt;m:naryLim m:val="undOvr"/&gt;&lt;/m:mathPr&gt;&lt;w:themeFontLang w:val="en-GB"/&gt;&lt;w:clrSchemeMapping w:bg1="light1" w:t1="dark1" w:bg2="light2" w:t2="dark2" w:accent1="accent1" w:accent2="accent2" w:accent3="accent3" w:accent4="accent4" w:accent5="accent5" w:accent6="accent6" w:hyperlink="hyperlink" w:followedHyperlink="followedHyperlink"/&gt;&lt;w:decimalSymbol w:val=","/&gt;&lt;w:listSeparator w:val=";"/&gt;&lt;w15:chartTrackingRefBased/&gt;&lt;/w:settings&gt;&lt;/pkg:xmlData&gt;&lt;/pkg:part&gt;&lt;pkg:part pkg:name="/word/glossary/_rels/document.xml.rels" pkg:contentType="application/vnd.openxmlformats-package.relationships+xml"&gt;&lt;pkg:xmlData&gt;&lt;Relationships xmlns="http://schemas.openxmlformats.org/package/2006/relationships"&gt;&lt;Relationship Id="rId3" Type="http://schemas.openxmlformats.org/officeDocument/2006/relationships/webSettings" Target="webSettings.xml"/&gt;&lt;Relationship Id="rId2" Type="http://schemas.openxmlformats.org/officeDocument/2006/relationships/settings" Target="settings.xml"/&gt;&lt;Relationship Id="rId1" Type="http://schemas.openxmlformats.org/officeDocument/2006/relationships/styles" Target="styles.xml"/&gt;&lt;Relationship Id="rId4" Type="http://schemas.openxmlformats.org/officeDocument/2006/relationships/fontTable" Target="fontTable.xml"/&gt;&lt;/Relationships&gt;&lt;/pkg:xmlData&gt;&lt;/pkg:part&gt;&lt;pkg:part pkg:name="/word/glossary/document.xml" pkg:contentType="application/vnd.openxmlformats-officedocument.wordprocessingml.document.glossary+xml"&gt;&lt;pkg:xmlData&gt;&lt;w:glossaryDocument xmlns:wpc="http://schemas.microsoft.com/office/word/2010/wordprocessingCanvas" xmlns:cx="http://schemas.microsoft.com/office/drawing/2014/chartex" xmlns:cx1="http://schemas.microsoft.com/office/drawing/2015/9/8/chartex" xmlns:cx2="http://schemas.microsoft.com/office/drawing/2015/10/21/chartex" xmlns:cx3="http://schemas.microsoft.com/office/drawing/2016/5/9/chartex" xmlns:cx4="http://schemas.microsoft.com/office/drawing/2016/5/10/chartex" xmlns:cx5="http://schemas.microsoft.com/office/drawing/2016/5/11/chartex" xmlns:cx6="http://schemas.microsoft.com/office/drawing/2016/5/12/chartex" xmlns:cx7="http://schemas.microsoft.com/office/drawing/2016/5/13/chartex" xmlns:cx8="http://schemas.microsoft.com/office/drawing/2016/5/14/chartex" xmlns:mc="http://schemas.openxmlformats.org/markup-compatibility/2006" xmlns:o="urn:schemas-microsoft-com:office:office" xmlns:r="http://schemas.openxmlformats.org/officeDocument/2006/relationships" xmlns:m="http://schemas.openxmlformats.org/officeDocument/2006/math" xmlns:v="urn:schemas-microsoft-com:vml" xmlns:wp14="http://schemas.microsoft.com/office/word/2010/wordprocessingDrawing" xmlns:wp="http://schemas.openxmlformats.org/drawingml/2006/wordprocessingDrawing" xmlns:w10="urn:schemas-microsoft-com:office:word" xmlns:w="http://schemas.openxmlformats.org/wordprocessingml/2006/main" xmlns:w14="http://schemas.microsoft.com/office/word/2010/wordml" xmlns:w15="http://schemas.microsoft.com/office/word/2012/wordml" xmlns:w16se="http://schemas.microsoft.com/office/word/2015/wordml/symex" xmlns:wpg="http://schemas.microsoft.com/office/word/2010/wordprocessingGroup" xmlns:wpi="http://schemas.microsoft.com/office/word/2010/wordprocessingInk" xmlns:wne="http://schemas.microsoft.com/office/word/2006/wordml" xmlns:wps="http://schemas.microsoft.com/office/word/2010/wordprocessingShape" mc:Ignorable="w14 w15 w16se wp14"&gt;&lt;w:docParts&gt;&lt;w:docPart&gt;&lt;w:docPartPr&gt;&lt;w:name w:val="F25D791C5B2F4E19930DB86356413466"/&gt;&lt;w:category&gt;&lt;w:name w:val="General"/&gt;&lt;w:gallery w:val="placeholder"/&gt;&lt;/w:category&gt;&lt;w:types&gt;&lt;w:type w:val="bbPlcHdr"/&gt;&lt;/w:types&gt;&lt;w:behaviors&gt;&lt;w:behavior w:val="content"/&gt;&lt;/w:behaviors&gt;&lt;w:guid w:val="{D7CC999A-6FA2-4301-AF13-D17E1333918F}"/&gt;&lt;/w:docPartPr&gt;&lt;w:docPartBody&gt;&lt;w:p&gt;&lt;w:pPr&gt;&lt;w:pStyle w:val="F25D791C5B2F4E19930DB86356413466"/&gt;&lt;/w:pPr&gt;&lt;w:r&gt;&lt;w:rPr&gt;&lt;w:rStyle w:val="PlaceholderText"/&gt;&lt;/w:rPr&gt;&lt;w:t&gt;Click or tap here to enter text.&lt;/w:t&gt;&lt;/w:r&gt;&lt;/w:p&gt;&lt;/w:docPartBody&gt;&lt;/w:docPart&gt;&lt;/w:docParts&gt;&lt;/w:glossaryDocument&gt;&lt;/pkg:xmlData&gt;&lt;/pkg:part&gt;&lt;pkg:part pkg:name="/word/glossary/styles.xml" pkg:contentType="application/vnd.openxmlformats-officedocument.wordprocessingml.styles+xml"&gt;&lt;pkg:xmlData&gt;&lt;w:styles xmlns:mc="http://schemas.openxmlformats.org/markup-compatibility/2006" xmlns:r="http://schemas.openxmlformats.org/officeDocument/2006/relationships" xmlns:w="http://schemas.openxmlformats.org/wordprocessingml/2006/main" xmlns:w14="http://schemas.microsoft.com/office/word/2010/wordml" xmlns:w15="http://schemas.microsoft.com/office/word/2012/wordml" xmlns:w16se="http://schemas.microsoft.com/office/word/2015/wordml/symex" mc:Ignorable="w14 w15 w16se"&gt;&lt;w:docDefaults&gt;&lt;w:rPrDefault&gt;&lt;w:rPr&gt;&lt;w:rFonts w:asciiTheme="minorHAnsi" w:eastAsiaTheme="minorEastAsia" w:hAnsiTheme="minorHAnsi" w:cstheme="minorBidi"/&gt;&lt;w:sz w:val="22"/&gt;&lt;w:szCs w:val="22"/&gt;&lt;w:lang w:val="en-GB" w:eastAsia="en-GB" w:bidi="ar-SA"/&gt;&lt;/w:rPr&gt;&lt;/w:rPrDefault&gt;&lt;w:pPrDefault&gt;&lt;w:pPr&gt;&lt;w:spacing w:after="160" w:line="259" w:lineRule="auto"/&gt;&lt;/w:pPr&gt;&lt;/w:pPrDefault&gt;&lt;/w:docDefaults&gt;&lt;w:latentStyles w:defLockedState="0" w:defUIPriority="99" w:defSemiHidden="0" w:defUnhideWhenUsed="0" w:defQFormat="0" w:count="374"&gt;&lt;w:lsdException w:name="Normal" w:uiPriority="0" w:qFormat="1"/&gt;&lt;w:lsdException w:name="heading 1" w:uiPriority="9" w:qFormat="1"/&gt;&lt;w:lsdException w:name="heading 2" w:semiHidden="1" w:uiPriority="9" w:unhideWhenUsed="1" w:qFormat="1"/&gt;&lt;w:lsdException w:name="heading 3" w:semiHidden="1" w:uiPriority="9" w:unhideWhenUsed="1" w:qFormat="1"/&gt;&lt;w:lsdException w:name="heading 4" w:semiHidden="1" w:uiPriority="9" w:unhideWhenUsed="1" w:qFormat="1"/&gt;&lt;w:lsdException w:name="heading 5" w:semiHidden="1" w:uiPriority="9" w:unhideWhenUsed="1" w:qFormat="1"/&gt;&lt;w:lsdException w:name="heading 6" w:semiHidden="1" w:uiPriority="9" w:unhideWhenUsed="1" w:qFormat="1"/&gt;&lt;w:lsdException w:name="heading 7" w:semiHidden="1" w:uiPriority="9" w:unhideWhenUsed="1" w:qFormat="1"/&gt;&lt;w:lsdException w:name="heading 8" w:semiHidden="1" w:uiPriority="9" w:unhideWhenUsed="1" w:qFormat="1"/&gt;&lt;w:lsdException w:name="heading 9" w:semiHidden="1" w:uiPriority="9" w:unhideWhenUsed="1" w:qFormat="1"/&gt;&lt;w:lsdException w:name="index 1" w:semiHidden="1" w:unhideWhenUsed="1"/&gt;&lt;w:lsdException w:name="index 2" w:semiHidden="1" w:unhideWhenUsed="1"/&gt;&lt;w:lsdException w:name="index 3" w:semiHidden="1" w:unhideWhenUsed="1"/&gt;&lt;w:lsdException w:name="index 4" w:semiHidden="1" w:unhideWhenUsed="1"/&gt;&lt;w:lsdException w:name="index 5" w:semiHidden="1" w:unhideWhenUsed="1"/&gt;&lt;w:lsdException w:name="index 6" w:semiHidden="1" w:unhideWhenUsed="1"/&gt;&lt;w:lsdException w:name="index 7" w:semiHidden="1" w:unhideWhenUsed="1"/&gt;&lt;w:lsdException w:name="index 8" w:semiHidden="1" w:unhideWhenUsed="1"/&gt;&lt;w:lsdException w:name="index 9" w:semiHidden="1" w:unhideWhenUsed="1"/&gt;&lt;w:lsdException w:name="toc 1" w:semiHidden="1" w:uiPriority="39" w:unhideWhenUsed="1"/&gt;&lt;w:lsdException w:name="toc 2" w:semiHidden="1" w:uiPriority="39" w:unhideWhenUsed="1"/&gt;&lt;w:lsdException w:name="toc 3" w:semiHidden="1" w:uiPriority="39" w:unhideWhenUsed="1"/&gt;&lt;w:lsdException w:name="toc 4" w:semiHidden="1" w:uiPriority="39" w:unhideWhenUsed="1"/&gt;&lt;w:lsdException w:name="toc 5" w:semiHidden="1" w:uiPriority="39" w:unhideWhenUsed="1"/&gt;&lt;w:lsdException w:name="toc 6" w:semiHidden="1" w:uiPriority="39" w:unhideWhenUsed="1"/&gt;&lt;w:lsdException w:name="toc 7" w:semiHidden="1" w:uiPriority="39" w:unhideWhenUsed="1"/&gt;&lt;w:lsdException w:name="toc 8" w:semiHidden="1" w:uiPriority="39" w:unhideWhenUsed="1"/&gt;&lt;w:lsdException w:name="toc 9" w:semiHidden="1" w:uiPriority="39" w:unhideWhenUsed="1"/&gt;&lt;w:lsdException w:name="Normal Indent" w:semiHidden="1" w:unhideWhenUsed="1"/&gt;&lt;w:lsdException w:name="footnote text" w:semiHidden="1" w:unhideWhenUsed="1"/&gt;&lt;w:lsdException w:name="annotation text" w:semiHidden="1" w:unhideWhenUsed="1"/&gt;&lt;w:lsdException w:name="header" w:semiHidden="1" w:unhideWhenUsed="1"/&gt;&lt;w:lsdException w:name="footer" w:semiHidden="1" w:unhideWhenUsed="1"/&gt;&lt;w:lsdException w:name="index heading" w:semiHidden="1" w:unhideWhenUsed="1"/&gt;&lt;w:lsdException w:name="caption" w:semiHidden="1" w:uiPriority="35" w:unhideWhenUsed="1" w:qFormat="1"/&gt;&lt;w:lsdException w:name="table of figures" w:semiHidden="1" w:unhideWhenUsed="1"/&gt;&lt;w:lsdException w:name="envelope address" w:semiHidden="1" w:unhideWhenUsed="1"/&gt;&lt;w:lsdException w:name="envelope return" w:semiHidden="1" w:unhideWhenUsed="1"/&gt;&lt;w:lsdException w:name="footnote reference" w:semiHidden="1" w:unhideWhenUsed="1"/&gt;&lt;w:lsdException w:name="annotation reference" w:semiHidden="1" w:unhideWhenUsed="1"/&gt;&lt;w:lsdException w:name="line number" w:semiHidden="1" w:unhideWhenUsed="1"/&gt;&lt;w:lsdException w:name="page number" w:semiHidden="1" w:unhideWhenUsed="1"/&gt;&lt;w:lsdException w:name="endnote reference" w:semiHidden="1" w:unhideWhenUsed="1"/&gt;&lt;w:lsdException w:name="endnote text" w:semiHidden="1" w:unhideWhenUsed="1"/&gt;&lt;w:lsdException w:name="table of authorities" w:semiHidden="1" w:unhideWhenUsed="1"/&gt;&lt;w:lsdException w:name="macro" w:semiHidden="1" w:unhideWhenUsed="1"/&gt;&lt;w:lsdException w:name="toa heading" w:semiHidden="1" w:unhideWhenUsed="1"/&gt;&lt;w:lsdException w:name="List" w:semiHidden="1" w:unhideWhenUsed="1"/&gt;&lt;w:lsdException w:name="List Bullet" w:semiHidden="1" w:unhideWhenUsed="1"/&gt;&lt;w:lsdException w:name="List Number" w:semiHidden="1" w:unhideWhenUsed="1"/&gt;&lt;w:lsdException w:name="List 2" w:semiHidden="1" w:unhideWhenUsed="1"/&gt;&lt;w:lsdException w:name="List 3" w:semiHidden="1" w:unhideWhenUsed="1"/&gt;&lt;w:lsdException w:name="List 4" w:semiHidden="1" w:unhideWhenUsed="1"/&gt;&lt;w:lsdException w:name="List 5" w:semiHidden="1" w:unhideWhenUsed="1"/&gt;&lt;w:lsdException w:name="List Bullet 2" w:semiHidden="1" w:unhideWhenUsed="1"/&gt;&lt;w:lsdException w:name="List Bullet 3" w:semiHidden="1" w:unhideWhenUsed="1"/&gt;&lt;w:lsdException w:name="List Bullet 4" w:semiHidden="1" w:unhideWhenUsed="1"/&gt;&lt;w:lsdException w:name="List Bullet 5" w:semiHidden="1" w:unhideWhenUsed="1"/&gt;&lt;w:lsdException w:name="List Number 2" w:semiHidden="1" w:unhideWhenUsed="1"/&gt;&lt;w:lsdException w:name="List Number 3" w:semiHidden="1" w:unhideWhenUsed="1"/&gt;&lt;w:lsdException w:name="List Number 4" w:semiHidden="1" w:unhideWhenUsed="1"/&gt;&lt;w:lsdException w:name="List Number 5" w:semiHidden="1" w:unhideWhenUsed="1"/&gt;&lt;w:lsdException w:name="Title" w:uiPriority="10" w:qFormat="1"/&gt;&lt;w:lsdException w:name="Closing" w:semiHidden="1" w:unhideWhenUsed="1"/&gt;&lt;w:lsdException w:name="Signature" w:semiHidden="1" w:unhideWhenUsed="1"/&gt;&lt;w:lsdException w:name="Default Paragraph Font" w:semiHidden="1" w:uiPriority="1" w:unhideWhenUsed="1"/&gt;&lt;w:lsdException w:name="Body Text" w:semiHidden="1" w:unhideWhenUsed="1"/&gt;&lt;w:lsdException w:name="Body Text Indent" w:semiHidden="1" w:unhideWhenUsed="1"/&gt;&lt;w:lsdException w:name="List Continue" w:semiHidden="1" w:unhideWhenUsed="1"/&gt;&lt;w:lsdException w:name="List Continue 2" w:semiHidden="1" w:unhideWhenUsed="1"/&gt;&lt;w:lsdException w:name="List Continue 3" w:semiHidden="1" w:unhideWhenUsed="1"/&gt;&lt;w:lsdException w:name="List Continue 4" w:semiHidden="1" w:unhideWhenUsed="1"/&gt;&lt;w:lsdException w:name="List Continue 5" w:semiHidden="1" w:unhideWhenUsed="1"/&gt;&lt;w:lsdException w:name="Message Header" w:semiHidden="1" w:unhideWhenUsed="1"/&gt;&lt;w:lsdException w:name="Subtitle" w:uiPriority="11" w:qFormat="1"/&gt;&lt;w:lsdException w:name="Salutation" w:semiHidden="1" w:unhideWhenUsed="1"/&gt;&lt;w:lsdException w:name="Date" w:semiHidden="1" w:unhideWhenUsed="1"/&gt;&lt;w:lsdException w:name="Body Text First Indent" w:semiHidden="1" w:unhideWhenUsed="1"/&gt;&lt;w:lsdException w:name="Body Text First Indent 2" w:semiHidden="1" w:unhideWhenUsed="1"/&gt;&lt;w:lsdException w:name="Note Heading" w:semiHidden="1" w:unhideWhenUsed="1"/&gt;&lt;w:lsdException w:name="Body Text 2" w:semiHidden="1" w:unhideWhenUsed="1"/&gt;&lt;w:lsdException w:name="Body Text 3" w:semiHidden="1" w:unhideWhenUsed="1"/&gt;&lt;w:lsdException w:name="Body Text Indent 2" w:semiHidden="1" w:unhideWhenUsed="1"/&gt;&lt;w:lsdException w:name="Body Text Indent 3" w:semiHidden="1" w:unhideWhenUsed="1"/&gt;&lt;w:lsdException w:name="Block Text" w:semiHidden="1" w:unhideWhenUsed="1"/&gt;&lt;w:lsdException w:name="Hyperlink" w:semiHidden="1" w:unhideWhenUsed="1"/&gt;&lt;w:lsdException w:name="FollowedHyperlink" w:semiHidden="1" w:unhideWhenUsed="1"/&gt;&lt;w:lsdException w:name="Strong" w:uiPriority="22" w:qFormat="1"/&gt;&lt;w:lsdException w:name="Emphasis" w:uiPriority="20" w:qFormat="1"/&gt;&lt;w:lsdException w:name="Document Map" w:semiHidden="1" w:unhideWhenUsed="1"/&gt;&lt;w:lsdException w:name="Plain Text" w:semiHidden="1" w:unhideWhenUsed="1"/&gt;&lt;w:lsdException w:name="E-mail Signature" w:semiHidden="1" w:unhideWhenUsed="1"/&gt;&lt;w:lsdException w:name="HTML Top of Form" w:semiHidden="1" w:unhideWhenUsed="1"/&gt;&lt;w:lsdException w:name="HTML Bottom of Form" w:semiHidden="1" w:unhideWhenUsed="1"/&gt;&lt;w:lsdException w:name="Normal (Web)" w:semiHidden="1" w:unhideWhenUsed="1"/&gt;&lt;w:lsdException w:name="HTML Acronym" w:semiHidden="1" w:unhideWhenUsed="1"/&gt;&lt;w:lsdException w:name="HTML Address" w:semiHidden="1" w:unhideWhenUsed="1"/&gt;&lt;w:lsdException w:name="HTML Cite" w:semiHidden="1" w:unhideWhenUsed="1"/&gt;&lt;w:lsdException w:name="HTML Code" w:semiHidden="1" w:unhideWhenUsed="1"/&gt;&lt;w:lsdException w:name="HTML Definition" w:semiHidden="1" w:unhideWhenUsed="1"/&gt;&lt;w:lsdException w:name="HTML Keyboard" w:semiHidden="1" w:unhideWhenUsed="1"/&gt;&lt;w:lsdException w:name="HTML Preformatted" w:semiHidden="1" w:unhideWhenUsed="1"/&gt;&lt;w:lsdException w:name="HTML Sample" w:semiHidden="1" w:unhideWhenUsed="1"/&gt;&lt;w:lsdException w:name="HTML Typewriter" w:semiHidden="1" w:unhideWhenUsed="1"/&gt;&lt;w:lsdException w:name="HTML Variable" w:semiHidden="1" w:unhideWhenUsed="1"/&gt;&lt;w:lsdException w:name="Normal Table" w:semiHidden="1" w:unhideWhenUsed="1"/&gt;&lt;w:lsdException w:name="annotation subject" w:semiHidden="1" w:unhideWhenUsed="1"/&gt;&lt;w:lsdException w:name="No List" w:semiHidden="1" w:unhideWhenUsed="1"/&gt;&lt;w:lsdException w:name="Outline List 1" w:semiHidden="1" w:unhideWhenUsed="1"/&gt;&lt;w:lsdException w:name="Outline List 2" w:semiHidden="1" w:unhideWhenUsed="1"/&gt;&lt;w:lsdException w:name="Outline List 3" w:semiHidden="1" w:unhideWhenUsed="1"/&gt;&lt;w:lsdException w:name="Table Simple 1" w:semiHidden="1" w:unhideWhenUsed="1"/&gt;&lt;w:lsdException w:name="Table Simple 2" w:semiHidden="1" w:unhideWhenUsed="1"/&gt;&lt;w:lsdException w:name="Table Simple 3" w:semiHidden="1" w:unhideWhenUsed="1"/&gt;&lt;w:lsdException w:name="Table Classic 1" w:semiHidden="1" w:unhideWhenUsed="1"/&gt;&lt;w:lsdException w:name="Table Classic 2" w:semiHidden="1" w:unhideWhenUsed="1"/&gt;&lt;w:lsdException w:name="Table Classic 3" w:semiHidden="1" w:unhideWhenUsed="1"/&gt;&lt;w:lsdException w:name="Table Classic 4" w:semiHidden="1" w:unhideWhenUsed="1"/&gt;&lt;w:lsdException w:name="Table Colorful 1" w:semiHidden="1" w:unhideWhenUsed="1"/&gt;&lt;w:lsdException w:name="Table Colorful 2" w:semiHidden="1" w:unhideWhenUsed="1"/&gt;&lt;w:lsdException w:name="Table Colorful 3" w:semiHidden="1" w:unhideWhenUsed="1"/&gt;&lt;w:lsdException w:name="Table Columns 1" w:semiHidden="1" w:unhideWhenUsed="1"/&gt;&lt;w:lsdException w:name="Table Columns 2" w:semiHidden="1" w:unhideWhenUsed="1"/&gt;&lt;w:lsdException w:name="Table Columns 3" w:semiHidden="1" w:unhideWhenUsed="1"/&gt;&lt;w:lsdException w:name="Table Columns 4" w:semiHidden="1" w:unhideWhenUsed="1"/&gt;&lt;w:lsdException w:name="Table Columns 5" w:semiHidden="1" w:unhideWhenUsed="1"/&gt;&lt;w:lsdException w:name="Table Grid 1" w:semiHidden="1" w:unhideWhenUsed="1"/&gt;&lt;w:lsdException w:name="Table Grid 2" w:semiHidden="1" w:unhideWhenUsed="1"/&gt;&lt;w:lsdException w:name="Table Grid 3" w:semiHidden="1" w:unhideWhenUsed="1"/&gt;&lt;w:lsdException w:name="Table Grid 4" w:semiHidden="1" w:unhideWhenUsed="1"/&gt;&lt;w:lsdException w:name="Table Grid 5" w:semiHidden="1" w:unhideWhenUsed="1"/&gt;&lt;w:lsdException w:name="Table Grid 6" w:semiHidden="1" w:unhideWhenUsed="1"/&gt;&lt;w:lsdException w:name="Table Grid 7" w:semiHidden="1" w:unhideWhenUsed="1"/&gt;&lt;w:lsdException w:name="Table Grid 8" w:semiHidden="1" w:unhideWhenUsed="1"/&gt;&lt;w:lsdException w:name="Table List 1" w:semiHidden="1" w:unhideWhenUsed="1"/&gt;&lt;w:lsdException w:name="Table List 2" w:semiHidden="1" w:unhideWhenUsed="1"/&gt;&lt;w:lsdException w:name="Table List 3" w:semiHidden="1" w:unhideWhenUsed="1"/&gt;&lt;w:lsdException w:name="Table List 4" w:semiHidden="1" w:unhideWhenUsed="1"/&gt;&lt;w:lsdException w:name="Table List 5" w:semiHidden="1" w:unhideWhenUsed="1"/&gt;&lt;w:lsdException w:name="Table List 6" w:semiHidden="1" w:unhideWhenUsed="1"/&gt;&lt;w:lsdException w:name="Table List 7" w:semiHidden="1" w:unhideWhenUsed="1"/&gt;&lt;w:lsdException w:name="Table List 8" w:semiHidden="1" w:unhideWhenUsed="1"/&gt;&lt;w:lsdException w:name="Table 3D effects 1" w:semiHidden="1" w:unhideWhenUsed="1"/&gt;&lt;w:lsdException w:name="Table 3D effects 2" w:semiHidden="1" w:unhideWhenUsed="1"/&gt;&lt;w:lsdException w:name="Table 3D effects 3" w:semiHidden="1" w:unhideWhenUsed="1"/&gt;&lt;w:lsdException w:name="Table Contemporary" w:semiHidden="1" w:unhideWhenUsed="1"/&gt;&lt;w:lsdException w:name="Table Elegant" w:semiHidden="1" w:unhideWhenUsed="1"/&gt;&lt;w:lsdException w:name="Table Professional" w:semiHidden="1" w:unhideWhenUsed="1"/&gt;&lt;w:lsdException w:name="Table Subtle 1" w:semiHidden="1" w:unhideWhenUsed="1"/&gt;&lt;w:lsdException w:name="Table Subtle 2" w:semiHidden="1" w:unhideWhenUsed="1"/&gt;&lt;w:lsdException w:name="Table Web 1" w:semiHidden="1" w:unhideWhenUsed="1"/&gt;&lt;w:lsdException w:name="Table Web 2" w:semiHidden="1" w:unhideWhenUsed="1"/&gt;&lt;w:lsdException w:name="Table Web 3" w:semiHidden="1" w:unhideWhenUsed="1"/&gt;&lt;w:lsdException w:name="Balloon Text" w:semiHidden="1" w:unhideWhenUsed="1"/&gt;&lt;w:lsdException w:name="Table Grid" w:uiPriority="39"/&gt;&lt;w:lsdException w:name="Table Theme" w:semiHidden="1" w:unhideWhenUsed="1"/&gt;&lt;w:lsdException w:name="Placeholder Text" w:semiHidden="1"/&gt;&lt;w:lsdException w:name="No Spacing" w:uiPriority="1" w:qFormat="1"/&gt;&lt;w:lsdException w:name="Light Shading" w:uiPriority="60"/&gt;&lt;w:lsdException w:name="Light List" w:uiPriority="61"/&gt;&lt;w:lsdException w:name="Light Grid" w:uiPriority="62"/&gt;&lt;w:lsdException w:name="Medium Shading 1" w:uiPriority="63"/&gt;&lt;w:lsdException w:name="Medium Shading 2" w:uiPriority="64"/&gt;&lt;w:lsdException w:name="Medium List 1" w:uiPriority="65"/&gt;&lt;w:lsdException w:name="Medium List 2" w:uiPriority="66"/&gt;&lt;w:lsdException w:name="Medium Grid 1" w:uiPriority="67"/&gt;&lt;w:lsdException w:name="Medium Grid 2" w:uiPriority="68"/&gt;&lt;w:lsdException w:name="Medium Grid 3" w:uiPriority="69"/&gt;&lt;w:lsdException w:name="Dark List" w:uiPriority="70"/&gt;&lt;w:lsdException w:name="Colorful Shading" w:uiPriority="71"/&gt;&lt;w:lsdException w:name="Colorful List" w:uiPriority="72"/&gt;&lt;w:lsdException w:name="Colorful Grid" w:uiPriority="73"/&gt;&lt;w:lsdException w:name="Light Shading Accent 1" w:uiPriority="60"/&gt;&lt;w:lsdException w:name="Light List Accent 1" w:uiPriority="61"/&gt;&lt;w:lsdException w:name="Light Grid Accent 1" w:uiPriority="62"/&gt;&lt;w:lsdException w:name="Medium Shading 1 Accent 1" w:uiPriority="63"/&gt;&lt;w:lsdException w:name="Medium Shading 2 Accent 1" w:uiPriority="64"/&gt;&lt;w:lsdException w:name="Medium List 1 Accent 1" w:uiPriority="65"/&gt;&lt;w:lsdException w:name="Revision" w:semiHidden="1"/&gt;&lt;w:lsdException w:name="List Paragraph" w:uiPriority="34" w:qFormat="1"/&gt;&lt;w:lsdException w:name="Quote" w:uiPriority="29" w:qFormat="1"/&gt;&lt;w:lsdException w:name="Intense Quote" w:uiPriority="30" w:qFormat="1"/&gt;&lt;w:lsdException w:name="Medium List 2 Accent 1" w:uiPriority="66"/&gt;&lt;w:lsdException w:name="Medium Grid 1 Accent 1" w:uiPriority="67"/&gt;&lt;w:lsdException w:name="Medium Grid 2 Accent 1" w:uiPriority="68"/&gt;&lt;w:lsdException w:name="Medium Grid 3 Accent 1" w:uiPriority="69"/&gt;&lt;w:lsdException w:name="Dark List Accent 1" w:uiPriority="70"/&gt;&lt;w:lsdException w:name="Colorful Shading Accent 1" w:uiPriority="71"/&gt;&lt;w:lsdException w:name="Colorful List Accent 1" w:uiPriority="72"/&gt;&lt;w:lsdException w:name="Colorful Grid Accent 1" w:uiPriority="73"/&gt;&lt;w:lsdException w:name="Light Shading Accent 2" w:uiPriority="60"/&gt;&lt;w:lsdException w:name="Light List Accent 2" w:uiPriority="61"/&gt;&lt;w:lsdException w:name="Light Grid Accent 2" w:uiPriority="62"/&gt;&lt;w:lsdException w:name="Medium Shading 1 Accent 2" w:uiPriority="63"/&gt;&lt;w:lsdException w:name="Medium Shading 2 Accent 2" w:uiPriority="64"/&gt;&lt;w:lsdException w:name="Medium List 1 Accent 2" w:uiPriority="65"/&gt;&lt;w:lsdException w:name="Medium List 2 Accent 2" w:uiPriority="66"/&gt;&lt;w:lsdException w:name="Medium Grid 1 Accent 2" w:uiPriority="67"/&gt;&lt;w:lsdException w:name="Medium Grid 2 Accent 2" w:uiPriority="68"/&gt;&lt;w:lsdException w:name="Medium Grid 3 Accent 2" w:uiPriority="69"/&gt;&lt;w:lsdException w:name="Dark List Accent 2" w:uiPriority="70"/&gt;&lt;w:lsdException w:name="Colorful Shading Accent 2" w:uiPriority="71"/&gt;&lt;w:lsdException w:name="Colorful List Accent 2" w:uiPriority="72"/&gt;&lt;w:lsdException w:name="Colorful Grid Accent 2" w:uiPriority="73"/&gt;&lt;w:lsdException w:name="Light Shading Accent 3" w:uiPriority="60"/&gt;&lt;w:lsdException w:name="Light List Accent 3" w:uiPriority="61"/&gt;&lt;w:lsdException w:name="Light Grid Accent 3" w:uiPriority="62"/&gt;&lt;w:lsdException w:name="Medium Shading 1 Accent 3" w:uiPriority="63"/&gt;&lt;w:lsdException w:name="Medium Shading 2 Accent 3" w:uiPriority="64"/&gt;&lt;w:lsdException w:name="Medium List 1 Accent 3" w:uiPriority="65"/&gt;&lt;w:lsdException w:name="Medium List 2 Accent 3" w:uiPriority="66"/&gt;&lt;w:lsdException w:name="Medium Grid 1 Accent 3" w:uiPriority="67"/&gt;&lt;w:lsdException w:name="Medium Grid 2 Accent 3" w:uiPriority="68"/&gt;&lt;w:lsdException w:name="Medium Grid 3 Accent 3" w:uiPriority="69"/&gt;&lt;w:lsdException w:name="Dark List Accent 3" w:uiPriority="70"/&gt;&lt;w:lsdException w:name="Colorful Shading Accent 3" w:uiPriority="71"/&gt;&lt;w:lsdException w:name="Colorful List Accent 3" w:uiPriority="72"/&gt;&lt;w:lsdException w:name="Colorful Grid Accent 3" w:uiPriority="73"/&gt;&lt;w:lsdException w:name="Light Shading Accent 4" w:uiPriority="60"/&gt;&lt;w:lsdException w:name="Light List Accent 4" w:uiPriority="61"/&gt;&lt;w:lsdException w:name="Light Grid Accent 4" w:uiPriority="62"/&gt;&lt;w:lsdException w:name="Medium Shading 1 Accent 4" w:uiPriority="63"/&gt;&lt;w:lsdException w:name="Medium Shading 2 Accent 4" w:uiPriority="64"/&gt;&lt;w:lsdException w:name="Medium List 1 Accent 4" w:uiPriority="65"/&gt;&lt;w:lsdException w:name="Medium List 2 Accent 4" w:uiPriority="66"/&gt;&lt;w:lsdException w:name="Medium Grid 1 Accent 4" w:uiPriority="67"/&gt;&lt;w:lsdException w:name="Medium Grid 2 Accent 4" w:uiPriority="68"/&gt;&lt;w:lsdException w:name="Medium Grid 3 Accent 4" w:uiPriority="69"/&gt;&lt;w:lsdException w:name="Dark List Accent 4" w:uiPriority="70"/&gt;&lt;w:lsdException w:name="Colorful Shading Accent 4" w:uiPriority="71"/&gt;&lt;w:lsdException w:name="Colorful List Accent 4" w:uiPriority="72"/&gt;&lt;w:lsdException w:name="Colorful Grid Accent 4" w:uiPriority="73"/&gt;&lt;w:lsdException w:name="Light Shading Accent 5" w:uiPriority="60"/&gt;&lt;w:lsdException w:name="Light List Accent 5" w:uiPriority="61"/&gt;&lt;w:lsdException w:name="Light Grid Accent 5" w:uiPriority="62"/&gt;&lt;w:lsdException w:name="Medium Shading 1 Accent 5" w:uiPriority="63"/&gt;&lt;w:lsdException w:name="Medium Shading 2 Accent 5" w:uiPriority="64"/&gt;&lt;w:lsdException w:name="Medium List 1 Accent 5" w:uiPriority="65"/&gt;&lt;w:lsdException w:name="Medium List 2 Accent 5" w:uiPriority="66"/&gt;&lt;w:lsdException w:name="Medium Grid 1 Accent 5" w:uiPriority="67"/&gt;&lt;w:lsdException w:name="Medium Grid 2 Accent 5" w:uiPriority="68"/&gt;&lt;w:lsdException w:name="Medium Grid 3 Accent 5" w:uiPriority="69"/&gt;&lt;w:lsdException w:name="Dark List Accent 5" w:uiPriority="70"/&gt;&lt;w:lsdException w:name="Colorful Shading Accent 5" w:uiPriority="71"/&gt;&lt;w:lsdException w:name="Colorful List Accent 5" w:uiPriority="72"/&gt;&lt;w:lsdException w:name="Colorful Grid Accent 5" w:uiPriority="73"/&gt;&lt;w:lsdException w:name="Light Shading Accent 6" w:uiPriority="60"/&gt;&lt;w:lsdException w:name="Light List Accent 6" w:uiPriority="61"/&gt;&lt;w:lsdException w:name="Light Grid Accent 6" w:uiPriority="62"/&gt;&lt;w:lsdException w:name="Medium Shading 1 Accent 6" w:uiPriority="63"/&gt;&lt;w:lsdException w:name="Medium Shading 2 Accent 6" w:uiPriority="64"/&gt;&lt;w:lsdException w:name="Medium List 1 Accent 6" w:uiPriority="65"/&gt;&lt;w:lsdException w:name="Medium List 2 Accent 6" w:uiPriority="66"/&gt;&lt;w:lsdException w:name="Medium Grid 1 Accent 6" w:uiPriority="67"/&gt;&lt;w:lsdException w:name="Medium Grid 2 Accent 6" w:uiPriority="68"/&gt;&lt;w:lsdException w:name="Medium Grid 3 Accent 6" w:uiPriority="69"/&gt;&lt;w:lsdException w:name="Dark List Accent 6" w:uiPriority="70"/&gt;&lt;w:lsdException w:name="Colorful Shading Accent 6" w:uiPriority="71"/&gt;&lt;w:lsdException w:name="Colorful List Accent 6" w:uiPriority="72"/&gt;&lt;w:lsdException w:name="Colorful Grid Accent 6" w:uiPriority="73"/&gt;&lt;w:lsdException w:name="Subtle Emphasis" w:uiPriority="19" w:qFormat="1"/&gt;&lt;w:lsdException w:name="Intense Emphasis" w:uiPriority="21" w:qFormat="1"/&gt;&lt;w:lsdException w:name="Subtle Reference" w:uiPriority="31" w:qFormat="1"/&gt;&lt;w:lsdException w:name="Intense Reference" w:uiPriority="32" w:qFormat="1"/&gt;&lt;w:lsdException w:name="Book Title" w:uiPriority="33" w:qFormat="1"/&gt;&lt;w:lsdException w:name="Bibliography" w:semiHidden="1" w:uiPriority="37" w:unhideWhenUsed="1"/&gt;&lt;w:lsdException w:name="TOC Heading" w:semiHidden="1" w:uiPriority="39" w:unhideWhenUsed="1" w:qFormat="1"/&gt;&lt;w:lsdException w:name="Plain Table 1" w:uiPriority="41"/&gt;&lt;w:lsdException w:name="Plain Table 2" w:uiPriority="42"/&gt;&lt;w:lsdException w:name="Plain Table 3" w:uiPriority="43"/&gt;&lt;w:lsdException w:name="Plain Table 4" w:uiPriority="44"/&gt;&lt;w:lsdException w:name="Plain Table 5" w:uiPriority="45"/&gt;&lt;w:lsdException w:name="Grid Table Light" w:uiPriority="40"/&gt;&lt;w:lsdException w:name="Grid Table 1 Light" w:uiPriority="46"/&gt;&lt;w:lsdException w:name="Grid Table 2" w:uiPriority="47"/&gt;&lt;w:lsdException w:name="Grid Table 3" w:uiPriority="48"/&gt;&lt;w:lsdException w:name="Grid Table 4" w:uiPriority="49"/&gt;&lt;w:lsdException w:name="Grid Table 5 Dark" w:uiPriority="50"/&gt;&lt;w:lsdException w:name="Grid Table 6 Colorful" w:uiPriority="51"/&gt;&lt;w:lsdException w:name="Grid Table 7 Colorful" w:uiPriority="52"/&gt;&lt;w:lsdException w:name="Grid Table 1 Light Accent 1" w:uiPriority="46"/&gt;&lt;w:lsdException w:name="Grid Table 2 Accent 1" w:uiPriority="47"/&gt;&lt;w:lsdException w:name="Grid Table 3 Accent 1" w:uiPriority="48"/&gt;&lt;w:lsdException w:name="Grid Table 4 Accent 1" w:uiPriority="49"/&gt;&lt;w:lsdException w:name="Grid Table 5 Dark Accent 1" w:uiPriority="50"/&gt;&lt;w:lsdException w:name="Grid Table 6 Colorful Accent 1" w:uiPriority="51"/&gt;&lt;w:lsdException w:name="Grid Table 7 Colorful Accent 1" w:uiPriority="52"/&gt;&lt;w:lsdException w:name="Grid Table 1 Light Accent 2" w:uiPriority="46"/&gt;&lt;w:lsdException w:name="Grid Table 2 Accent 2" w:uiPriority="47"/&gt;&lt;w:lsdException w:name="Grid Table 3 Accent 2" w:uiPriority="48"/&gt;&lt;w:lsdException w:name="Grid Table 4 Accent 2" w:uiPriority="49"/&gt;&lt;w:lsdException w:name="Grid Table 5 Dark Accent 2" w:uiPriority="50"/&gt;&lt;w:lsdException w:name="Grid Table 6 Colorful Accent 2" w:uiPriority="51"/&gt;&lt;w:lsdException w:name="Grid Table 7 Colorful Accent 2" w:uiPriority="52"/&gt;&lt;w:lsdException w:name="Grid Table 1 Light Accent 3" w:uiPriority="46"/&gt;&lt;w:lsdException w:name="Grid Table 2 Accent 3" w:uiPriority="47"/&gt;&lt;w:lsdException w:name="Grid Table 3 Accent 3" w:uiPriority="48"/&gt;&lt;w:lsdException w:name="Grid Table 4 Accent 3" w:uiPriority="49"/&gt;&lt;w:lsdException w:name="Grid Table 5 Dark Accent 3" w:uiPriority="50"/&gt;&lt;w:lsdException w:name="Grid Table 6 Colorful Accent 3" w:uiPriority="51"/&gt;&lt;w:lsdException w:name="Grid Table 7 Colorful Accent 3" w:uiPriority="52"/&gt;&lt;w:lsdException w:name="Grid Table 1 Light Accent 4" w:uiPriority="46"/&gt;&lt;w:lsdException w:name="Grid Table 2 Accent 4" w:uiPriority="47"/&gt;&lt;w:lsdException w:name="Grid Table 3 Accent 4" w:uiPriority="48"/&gt;&lt;w:lsdException w:name="Grid Table 4 Accent 4" w:uiPriority="49"/&gt;&lt;w:lsdException w:name="Grid Table 5 Dark Accent 4" w:uiPriority="50"/&gt;&lt;w:lsdException w:name="Grid Table 6 Colorful Accent 4" w:uiPriority="51"/&gt;&lt;w:lsdException w:name="Grid Table 7 Colorful Accent 4" w:uiPriority="52"/&gt;&lt;w:lsdException w:name="Grid Table 1 Light Accent 5" w:uiPriority="46"/&gt;&lt;w:lsdException w:name="Grid Table 2 Accent 5" w:uiPriority="47"/&gt;&lt;w:lsdException w:name="Grid Table 3 Accent 5" w:uiPriority="48"/&gt;&lt;w:lsdException w:name="Grid Table 4 Accent 5" w:uiPriority="49"/&gt;&lt;w:lsdException w:name="Grid Table 5 Dark Accent 5" w:uiPriority="50"/&gt;&lt;w:lsdException w:name="Grid Table 6 Colorful Accent 5" w:uiPriority="51"/&gt;&lt;w:lsdException w:name="Grid Table 7 Colorful Accent 5" w:uiPriority="52"/&gt;&lt;w:lsdException w:name="Grid Table 1 Light Accent 6" w:uiPriority="46"/&gt;&lt;w:lsdException w:name="Grid Table 2 Accent 6" w:uiPriority="47"/&gt;&lt;w:lsdException w:name="Grid Table 3 Accent 6" w:uiPriority="48"/&gt;&lt;w:lsdException w:name="Grid Table 4 Accent 6" w:uiPriority="49"/&gt;&lt;w:lsdException w:name="Grid Table 5 Dark Accent 6" w:uiPriority="50"/&gt;&lt;w:lsdException w:name="Grid Table 6 Colorful Accent 6" w:uiPriority="51"/&gt;&lt;w:lsdException w:name="Grid Table 7 Colorful Accent 6" w:uiPriority="52"/&gt;&lt;w:lsdException w:name="List Table 1 Light" w:uiPriority="46"/&gt;&lt;w:lsdException w:name="List Table 2" w:uiPriority="47"/&gt;&lt;w:lsdException w:name="List Table 3" w:uiPriority="48"/&gt;&lt;w:lsdException w:name="List Table 4" w:uiPriority="49"/&gt;&lt;w:lsdException w:name="List Table 5 Dark" w:uiPriority="50"/&gt;&lt;w:lsdException w:name="List Table 6 Colorful" w:uiPriority="51"/&gt;&lt;w:lsdException w:name="List Table 7 Colorful" w:uiPriority="52"/&gt;&lt;w:lsdException w:name="List Table 1 Light Accent 1" w:uiPriority="46"/&gt;&lt;w:lsdException w:name="List Table 2 Accent 1" w:uiPriority="47"/&gt;&lt;w:lsdException w:name="List Table 3 Accent 1" w:uiPriority="48"/&gt;&lt;w:lsdException w:name="List Table 4 Accent 1" w:uiPriority="49"/&gt;&lt;w:lsdException w:name="List Table 5 Dark Accent 1" w:uiPriority="50"/&gt;&lt;w:lsdException w:name="List Table 6 Colorful Accent 1" w:uiPriority="51"/&gt;&lt;w:lsdException w:name="List Table 7 Colorful Accent 1" w:uiPriority="52"/&gt;&lt;w:lsdException w:name="List Table 1 Light Accent 2" w:uiPriority="46"/&gt;&lt;w:lsdException w:name="List Table 2 Accent 2" w:uiPriority="47"/&gt;&lt;w:lsdException w:name="List Table 3 Accent 2" w:uiPriority="48"/&gt;&lt;w:lsdException w:name="List Table 4 Accent 2" w:uiPriority="49"/&gt;&lt;w:lsdException w:name="List Table 5 Dark Accent 2" w:uiPriority="50"/&gt;&lt;w:lsdException w:name="List Table 6 Colorful Accent 2" w:uiPriority="51"/&gt;&lt;w:lsdException w:name="List Table 7 Colorful Accent 2" w:uiPriority="52"/&gt;&lt;w:lsdException w:name="List Table 1 Light Accent 3" w:uiPriority="46"/&gt;&lt;w:lsdException w:name="List Table 2 Accent 3" w:uiPriority="47"/&gt;&lt;w:lsdException w:name="List Table 3 Accent 3" w:uiPriority="48"/&gt;&lt;w:lsdException w:name="List Table 4 Accent 3" w:uiPriority="49"/&gt;&lt;w:lsdException w:name="List Table 5 Dark Accent 3" w:uiPriority="50"/&gt;&lt;w:lsdException w:name="List Table 6 Colorful Accent 3" w:uiPriority="51"/&gt;&lt;w:lsdException w:name="List Table 7 Colorful Accent 3" w:uiPriority="52"/&gt;&lt;w:lsdException w:name="List Table 1 Light Accent 4" w:uiPriority="46"/&gt;&lt;w:lsdException w:name="List Table 2 Accent 4" w:uiPriority="47"/&gt;&lt;w:lsdException w:name="List Table 3 Accent 4" w:uiPriority="48"/&gt;&lt;w:lsdException w:name="List Table 4 Accent 4" w:uiPriority="49"/&gt;&lt;w:lsdException w:name="List Table 5 Dark Accent 4" w:uiPriority="50"/&gt;&lt;w:lsdException w:name="List Table 6 Colorful Accent 4" w:uiPriority="51"/&gt;&lt;w:lsdException w:name="List Table 7 Colorful Accent 4" w:uiPriority="52"/&gt;&lt;w:lsdException w:name="List Table 1 Light Accent 5" w:uiPriority="46"/&gt;&lt;w:lsdException w:name="List Table 2 Accent 5" w:uiPriority="47"/&gt;&lt;w:lsdException w:name="List Table 3 Accent 5" w:uiPriority="48"/&gt;&lt;w:lsdException w:name="List Table 4 Accent 5" w:uiPriority="49"/&gt;&lt;w:lsdException w:name="List Table 5 Dark Accent 5" w:uiPriority="50"/&gt;&lt;w:lsdException w:name="List Table 6 Colorful Accent 5" w:uiPriority="51"/&gt;&lt;w:lsdException w:name="List Table 7 Colorful Accent 5" w:uiPriority="52"/&gt;&lt;w:lsdException w:name="List Table 1 Light Accent 6" w:uiPriority="46"/&gt;&lt;w:lsdException w:name="List Table 2 Accent 6" w:uiPriority="47"/&gt;&lt;w:lsdException w:name="List Table 3 Accent 6" w:uiPriority="48"/&gt;&lt;w:lsdException w:name="List Table 4 Accent 6" w:uiPriority="49"/&gt;&lt;w:lsdException w:name="List Table 5 Dark Accent 6" w:uiPriority="50"/&gt;&lt;w:lsdException w:name="List Table 6 Colorful Accent 6" w:uiPriority="51"/&gt;&lt;w:lsdException w:name="List Table 7 Colorful Accent 6" w:uiPriority="52"/&gt;&lt;w:lsdException w:name="Mention" w:semiHidden="1" w:unhideWhenUsed="1"/&gt;&lt;w:lsdException w:name="Smart Hyperlink" w:semiHidden="1" w:unhideWhenUsed="1"/&gt;&lt;w:lsdException w:name="Hashtag" w:semiHidden="1" w:unhideWhenUsed="1"/&gt;&lt;/w:latentStyles&gt;&lt;w:style w:type="paragraph" w:default="1" w:styleId="Normal"&gt;&lt;w:name w:val="Normal"/&gt;&lt;w:qFormat/&gt;&lt;/w:style&gt;&lt;w:style w:type="character" w:default="1" w:styleId="DefaultParagraphFont"&gt;&lt;w:name w:val="Default Paragraph Font"/&gt;&lt;w:uiPriority w:val="1"/&gt;&lt;w:semiHidden/&gt;&lt;w:unhideWhenUsed/&gt;&lt;/w:style&gt;&lt;w:style w:type="table" w:default="1" w:styleId="TableNormal"&gt;&lt;w:name w:val="Normal Table"/&gt;&lt;w:uiPriority w:val="99"/&gt;&lt;w:semiHidden/&gt;&lt;w:unhideWhenUsed/&gt;&lt;w:tblPr&gt;&lt;w:tblInd w:w="0" w:type="dxa"/&gt;&lt;w:tblCellMar&gt;&lt;w:top w:w="0" w:type="dxa"/&gt;&lt;w:left w:w="108" w:type="dxa"/&gt;&lt;w:bottom w:w="0" w:type="dxa"/&gt;&lt;w:right w:w="108" w:type="dxa"/&gt;&lt;/w:tblCellMar&gt;&lt;/w:tblPr&gt;&lt;/w:style&gt;&lt;w:style w:type="numbering" w:default="1" w:styleId="NoList"&gt;&lt;w:name w:val="No List"/&gt;&lt;w:uiPriority w:val="99"/&gt;&lt;w:semiHidden/&gt;&lt;w:unhideWhenUsed/&gt;&lt;/w:style&gt;&lt;w:style w:type="character" w:styleId="PlaceholderText"&gt;&lt;w:name w:val="Placeholder Text"/&gt;&lt;w:basedOn w:val="DefaultParagraphFont"/&gt;&lt;w:uiPriority w:val="99"/&gt;&lt;w:rPr&gt;&lt;w:color w:val="7F7F7F" w:themeColor="text1" w:themeTint="80"/&gt;&lt;w:bdr w:val="none" w:sz="0" w:space="0" w:color="auto"/&gt;&lt;w:shd w:val="clear" w:color="auto" w:fill="F0F0F0"/&gt;&lt;/w:rPr&gt;&lt;/w:style&gt;&lt;w:style w:type="paragraph" w:customStyle="1" w:styleId="F25D791C5B2F4E19930DB86356413466"&gt;&lt;w:name w:val="F25D791C5B2F4E19930DB86356413466"/&gt;&lt;/w:style&gt;&lt;/w:styles&gt;&lt;/pkg:xmlData&gt;&lt;/pkg:part&gt;&lt;pkg:part pkg:name="/word/styles.xml" pkg:contentType="application/vnd.openxmlformats-officedocument.wordprocessingml.styles+xml"&gt;&lt;pkg:xmlData&gt;&lt;w:styles xmlns:mc="http://schemas.openxmlformats.org/markup-compatibility/2006" xmlns:r="http://schemas.openxmlformats.org/officeDocument/2006/relationships" xmlns:w="http://schemas.openxmlformats.org/wordprocessingml/2006/main" xmlns:w14="http://schemas.microsoft.com/office/word/2010/wordml" xmlns:w15="http://schemas.microsoft.com/office/word/2012/wordml" xmlns:w16se="http://schemas.microsoft.com/office/word/2015/wordml/symex" mc:Ignorable="w14 w15 w16se"&gt;&lt;w:docDefaults&gt;&lt;w:rPrDefault&gt;&lt;w:rPr&gt;&lt;w:rFonts w:asciiTheme="minorHAnsi" w:eastAsiaTheme="minorEastAsia" w:hAnsiTheme="minorHAnsi" w:cstheme="minorBidi"/&gt;&lt;w:sz w:val="19"/&gt;&lt;w:szCs w:val="19"/&gt;&lt;w:lang w:val="sv-SE" w:eastAsia="en-US" w:bidi="ar-SA"/&gt;&lt;/w:rPr&gt;&lt;/w:rPrDefault&gt;&lt;w:pPrDefault&gt;&lt;w:pPr&gt;&lt;w:spacing w:after="160" w:line="288" w:lineRule="auto"/&gt;&lt;/w:pPr&gt;&lt;/w:pPrDefault&gt;&lt;/w:docDefaults&gt;&lt;w:style w:type="paragraph" w:default="1" w:styleId="Normal"&gt;&lt;w:name w:val="Normal"/&gt;&lt;w:qFormat/&gt;&lt;w:rsid w:val="005F186C"/&gt;&lt;w:pPr&gt;&lt;w:spacing w:after="200"/&gt;&lt;/w:pPr&gt;&lt;w:rPr&gt;&lt;w:sz w:val="20"/&gt;&lt;w:lang w:val="en-GB"/&gt;&lt;/w:rPr&gt;&lt;/w:style&gt;&lt;w:style w:type="paragraph" w:styleId="Heading1"&gt;&lt;w:name w:val="heading 1"/&gt;&lt;w:basedOn w:val="Normal"/&gt;&lt;w:next w:val="Normal"/&gt;&lt;w:link w:val="Heading1Char"/&gt;&lt;w:uiPriority w:val="9"/&gt;&lt;w:qFormat/&gt;&lt;w:rsid w:val="000C3604"/&gt;&lt;w:pPr&gt;&lt;w:keepNext/&gt;&lt;w:keepLines/&gt;&lt;w:spacing w:before="240"/&gt;&lt;w:outlineLvl w:val="0"/&gt;&lt;/w:pPr&gt;&lt;w:rPr&gt;&lt;w:rFonts w:asciiTheme="majorHAnsi" w:eastAsiaTheme="majorEastAsia" w:hAnsiTheme="majorHAnsi" w:cstheme="majorBidi"/&gt;&lt;w:bCs/&gt;&lt;w:sz w:val="28"/&gt;&lt;w:szCs w:val="28"/&gt;&lt;/w:rPr&gt;&lt;/w:style&gt;&lt;w:style w:type="paragraph" w:styleId="Heading2"&gt;&lt;w:name w:val="heading 2"/&gt;&lt;w:basedOn w:val="Normal"/&gt;&lt;w:next w:val="Normal"/&gt;&lt;w:link w:val="Heading2Char"/&gt;&lt;w:uiPriority w:val="9"/&gt;&lt;w:qFormat/&gt;&lt;w:rsid w:val="000C3604"/&gt;&lt;w:pPr&gt;&lt;w:keepNext/&gt;&lt;w:keepLines/&gt;&lt;w:spacing w:before="240" w:after="80"/&gt;&lt;w:outlineLvl w:val="1"/&gt;&lt;/w:pPr&gt;&lt;w:rPr&gt;&lt;w:rFonts w:ascii="GothamMedium" w:eastAsiaTheme="majorEastAsia" w:hAnsi="GothamMedium" w:cstheme="majorBidi"/&gt;&lt;w:bCs/&gt;&lt;w:sz w:val="24"/&gt;&lt;w:szCs w:val="28"/&gt;&lt;/w:rPr&gt;&lt;/w:style&gt;&lt;w:style w:type="paragraph" w:styleId="Heading3"&gt;&lt;w:name w:val="heading 3"/&gt;&lt;w:basedOn w:val="Normal"/&gt;&lt;w:next w:val="Normal"/&gt;&lt;w:link w:val="Heading3Char"/&gt;&lt;w:uiPriority w:val="9"/&gt;&lt;w:qFormat/&gt;&lt;w:rsid w:val="00872413"/&gt;&lt;w:pPr&gt;&lt;w:keepNext/&gt;&lt;w:keepLines/&gt;&lt;w:spacing w:before="120" w:after="40"/&gt;&lt;w:outlineLvl w:val="2"/&gt;&lt;/w:pPr&gt;&lt;w:rPr&gt;&lt;w:rFonts w:ascii="GothamMedium" w:eastAsiaTheme="majorEastAsia" w:hAnsi="GothamMedium" w:cstheme="majorBidi"/&gt;&lt;w:sz w:val="22"/&gt;&lt;w:szCs w:val="24"/&gt;&lt;/w:rPr&gt;&lt;/w:style&gt;&lt;w:style w:type="paragraph" w:styleId="Heading4"&gt;&lt;w:name w:val="heading 4"/&gt;&lt;w:basedOn w:val="Normal"/&gt;&lt;w:next w:val="Normal"/&gt;&lt;w:link w:val="Heading4Char"/&gt;&lt;w:uiPriority w:val="9"/&gt;&lt;w:semiHidden/&gt;&lt;w:qFormat/&gt;&lt;w:rsid w:val="00872413"/&gt;&lt;w:pPr&gt;&lt;w:keepNext/&gt;&lt;w:keepLines/&gt;&lt;w:spacing w:before="120" w:after="40"/&gt;&lt;w:outlineLvl w:val="3"/&gt;&lt;/w:pPr&gt;&lt;w:rPr&gt;&lt;w:rFonts w:ascii="GothamMedium" w:eastAsiaTheme="majorEastAsia" w:hAnsi="GothamMedium" w:cstheme="majorBidi"/&gt;&lt;w:iCs/&gt;&lt;w:szCs w:val="24"/&gt;&lt;/w:rPr&gt;&lt;/w:style&gt;&lt;w:style w:type="paragraph" w:styleId="Heading5"&gt;&lt;w:name w:val="heading 5"/&gt;&lt;w:basedOn w:val="Normal"/&gt;&lt;w:next w:val="Normal"/&gt;&lt;w:link w:val="Heading5Char"/&gt;&lt;w:uiPriority w:val="9"/&gt;&lt;w:semiHidden/&gt;&lt;w:qFormat/&gt;&lt;w:rsid w:val="009B1B65"/&gt;&lt;w:pPr&gt;&lt;w:keepNext/&gt;&lt;w:keepLines/&gt;&lt;w:numPr&gt;&lt;w:ilvl w:val="4"/&gt;&lt;w:numId w:val="15"/&gt;&lt;/w:numPr&gt;&lt;w:spacing w:before="120" w:after="0"/&gt;&lt;w:outlineLvl w:val="4"/&gt;&lt;/w:pPr&gt;&lt;w:rPr&gt;&lt;w:rFonts w:asciiTheme="majorHAnsi" w:eastAsiaTheme="majorEastAsia" w:hAnsiTheme="majorHAnsi" w:cstheme="majorBidi"/&gt;&lt;w:b/&gt;&lt;w:bCs/&gt;&lt;/w:rPr&gt;&lt;/w:style&gt;&lt;w:style w:type="paragraph" w:styleId="Heading6"&gt;&lt;w:name w:val="heading 6"/&gt;&lt;w:basedOn w:val="Normal"/&gt;&lt;w:next w:val="Normal"/&gt;&lt;w:link w:val="Heading6Char"/&gt;&lt;w:uiPriority w:val="9"/&gt;&lt;w:semiHidden/&gt;&lt;w:rsid w:val="009B1B65"/&gt;&lt;w:pPr&gt;&lt;w:keepNext/&gt;&lt;w:keepLines/&gt;&lt;w:numPr&gt;&lt;w:ilvl w:val="5"/&gt;&lt;w:numId w:val="15"/&gt;&lt;/w:numPr&gt;&lt;w:spacing w:before="120" w:after="0"/&gt;&lt;w:outlineLvl w:val="5"/&gt;&lt;/w:pPr&gt;&lt;w:rPr&gt;&lt;w:rFonts w:asciiTheme="majorHAnsi" w:eastAsiaTheme="majorEastAsia" w:hAnsiTheme="majorHAnsi" w:cstheme="majorBidi"/&gt;&lt;w:b/&gt;&lt;w:bCs/&gt;&lt;w:i/&gt;&lt;w:iCs/&gt;&lt;/w:rPr&gt;&lt;/w:style&gt;&lt;w:style w:type="paragraph" w:styleId="Heading7"&gt;&lt;w:name w:val="heading 7"/&gt;&lt;w:basedOn w:val="Normal"/&gt;&lt;w:next w:val="Normal"/&gt;&lt;w:link w:val="Heading7Char"/&gt;&lt;w:uiPriority w:val="9"/&gt;&lt;w:semiHidden/&gt;&lt;w:rsid w:val="009B1B65"/&gt;&lt;w:pPr&gt;&lt;w:keepNext/&gt;&lt;w:keepLines/&gt;&lt;w:numPr&gt;&lt;w:ilvl w:val="6"/&gt;&lt;w:numId w:val="15"/&gt;&lt;/w:numPr&gt;&lt;w:spacing w:before="120" w:after="0"/&gt;&lt;w:outlineLvl w:val="6"/&gt;&lt;/w:pPr&gt;&lt;w:rPr&gt;&lt;w:i/&gt;&lt;w:iCs/&gt;&lt;/w:rPr&gt;&lt;/w:style&gt;&lt;w:style w:type="paragraph" w:styleId="Heading8"&gt;&lt;w:name w:val="heading 8"/&gt;&lt;w:basedOn w:val="Normal"/&gt;&lt;w:next w:val="Normal"/&gt;&lt;w:link w:val="Heading8Char"/&gt;&lt;w:uiPriority w:val="9"/&gt;&lt;w:semiHidden/&gt;&lt;w:rsid w:val="009B1B65"/&gt;&lt;w:pPr&gt;&lt;w:keepNext/&gt;&lt;w:keepLines/&gt;&lt;w:numPr&gt;&lt;w:ilvl w:val="7"/&gt;&lt;w:numId w:val="15"/&gt;&lt;/w:numPr&gt;&lt;w:spacing w:before="120" w:after="0"/&gt;&lt;w:outlineLvl w:val="7"/&gt;&lt;/w:pPr&gt;&lt;w:rPr&gt;&lt;w:b/&gt;&lt;w:bCs/&gt;&lt;/w:rPr&gt;&lt;/w:style&gt;&lt;w:style w:type="paragraph" w:styleId="Heading9"&gt;&lt;w:name w:val="heading 9"/&gt;&lt;w:basedOn w:val="Normal"/&gt;&lt;w:next w:val="Normal"/&gt;&lt;w:link w:val="Heading9Char"/&gt;&lt;w:uiPriority w:val="9"/&gt;&lt;w:semiHidden/&gt;&lt;w:rsid w:val="009B1B65"/&gt;&lt;w:pPr&gt;&lt;w:keepNext/&gt;&lt;w:keepLines/&gt;&lt;w:numPr&gt;&lt;w:ilvl w:val="8"/&gt;&lt;w:numId w:val="15"/&gt;&lt;/w:numPr&gt;&lt;w:spacing w:before="120" w:after="0"/&gt;&lt;w:outlineLvl w:val="8"/&gt;&lt;/w:pPr&gt;&lt;w:rPr&gt;&lt;w:i/&gt;&lt;w:iCs/&gt;&lt;/w:rPr&gt;&lt;/w:style&gt;&lt;w:style w:type="character" w:default="1" w:styleId="DefaultParagraphFont"&gt;&lt;w:name w:val="Default Paragraph Font"/&gt;&lt;w:uiPriority w:val="1"/&gt;&lt;w:semiHidden/&gt;&lt;w:unhideWhenUsed/&gt;&lt;/w:style&gt;&lt;w:style w:type="table" w:default="1" w:styleId="TableNormal"&gt;&lt;w:name w:val="Normal Table"/&gt;&lt;w:uiPriority w:val="99"/&gt;&lt;w:semiHidden/&gt;&lt;w:unhideWhenUsed/&gt;&lt;w:tblPr&gt;&lt;w:tblInd w:w="0" w:type="dxa"/&gt;&lt;w:tblCellMar&gt;&lt;w:top w:w="0" w:type="dxa"/&gt;&lt;w:left w:w="108" w:type="dxa"/&gt;&lt;w:bottom w:w="0" w:type="dxa"/&gt;&lt;w:right w:w="108" w:type="dxa"/&gt;&lt;/w:tblCellMar&gt;&lt;/w:tblPr&gt;&lt;/w:style&gt;&lt;w:style w:type="numbering" w:default="1" w:styleId="NoList"&gt;&lt;w:name w:val="No List"/&gt;&lt;w:uiPriority w:val="99"/&gt;&lt;w:semiHidden/&gt;&lt;w:unhideWhenUsed/&gt;&lt;/w:style&gt;&lt;w:style w:type="character" w:customStyle="1" w:styleId="Heading1Char"&gt;&lt;w:name w:val="Heading 1 Char"/&gt;&lt;w:basedOn w:val="DefaultParagraphFont"/&gt;&lt;w:link w:val="Heading1"/&gt;&lt;w:uiPriority w:val="9"/&gt;&lt;w:rsid w:val="000C3604"/&gt;&lt;w:rPr&gt;&lt;w:rFonts w:asciiTheme="majorHAnsi" w:eastAsiaTheme="majorEastAsia" w:hAnsiTheme="majorHAnsi" w:cstheme="majorBidi"/&gt;&lt;w:bCs/&gt;&lt;w:sz w:val="28"/&gt;&lt;w:szCs w:val="28"/&gt;&lt;w:lang w:val="en-GB"/&gt;&lt;/w:rPr&gt;&lt;/w:style&gt;&lt;w:style w:type="character" w:customStyle="1" w:styleId="Heading2Char"&gt;&lt;w:name w:val="Heading 2 Char"/&gt;&lt;w:basedOn w:val="DefaultParagraphFont"/&gt;&lt;w:link w:val="Heading2"/&gt;&lt;w:uiPriority w:val="9"/&gt;&lt;w:rsid w:val="000C3604"/&gt;&lt;w:rPr&gt;&lt;w:rFonts w:ascii="GothamMedium" w:eastAsiaTheme="majorEastAsia" w:hAnsi="GothamMedium" w:cstheme="majorBidi"/&gt;&lt;w:bCs/&gt;&lt;w:sz w:val="24"/&gt;&lt;w:szCs w:val="28"/&gt;&lt;w:lang w:val="en-GB"/&gt;&lt;/w:rPr&gt;&lt;/w:style&gt;&lt;w:style w:type="character" w:customStyle="1" w:styleId="Heading3Char"&gt;&lt;w:name w:val="Heading 3 Char"/&gt;&lt;w:basedOn w:val="DefaultParagraphFont"/&gt;&lt;w:link w:val="Heading3"/&gt;&lt;w:uiPriority w:val="9"/&gt;&lt;w:rsid w:val="00872413"/&gt;&lt;w:rPr&gt;&lt;w:rFonts w:ascii="GothamMedium" w:eastAsiaTheme="majorEastAsia" w:hAnsi="GothamMedium" w:cstheme="majorBidi"/&gt;&lt;w:sz w:val="22"/&gt;&lt;w:szCs w:val="24"/&gt;&lt;w:lang w:val="en-GB"/&gt;&lt;/w:rPr&gt;&lt;/w:style&gt;&lt;w:style w:type="character" w:customStyle="1" w:styleId="Heading4Char"&gt;&lt;w:name w:val="Heading 4 Char"/&gt;&lt;w:basedOn w:val="DefaultParagraphFont"/&gt;&lt;w:link w:val="Heading4"/&gt;&lt;w:uiPriority w:val="9"/&gt;&lt;w:semiHidden/&gt;&lt;w:rsid w:val="005F186C"/&gt;&lt;w:rPr&gt;&lt;w:rFonts w:ascii="GothamMedium" w:eastAsiaTheme="majorEastAsia" w:hAnsi="GothamMedium" w:cstheme="majorBidi"/&gt;&lt;w:iCs/&gt;&lt;w:sz w:val="20"/&gt;&lt;w:szCs w:val="24"/&gt;&lt;w:lang w:val="en-GB"/&gt;&lt;/w:rPr&gt;&lt;/w:style&gt;&lt;w:style w:type="character" w:customStyle="1" w:styleId="Heading5Char"&gt;&lt;w:name w:val="Heading 5 Char"/&gt;&lt;w:basedOn w:val="DefaultParagraphFont"/&gt;&lt;w:link w:val="Heading5"/&gt;&lt;w:uiPriority w:val="9"/&gt;&lt;w:semiHidden/&gt;&lt;w:rsid w:val="008E716E"/&gt;&lt;w:rPr&gt;&lt;w:rFonts w:asciiTheme="majorHAnsi" w:eastAsiaTheme="majorEastAsia" w:hAnsiTheme="majorHAnsi" w:cstheme="majorBidi"/&gt;&lt;w:b/&gt;&lt;w:bCs/&gt;&lt;w:lang w:val="en-GB"/&gt;&lt;/w:rPr&gt;&lt;/w:style&gt;&lt;w:style w:type="character" w:customStyle="1" w:styleId="Heading6Char"&gt;&lt;w:name w:val="Heading 6 Char"/&gt;&lt;w:basedOn w:val="DefaultParagraphFont"/&gt;&lt;w:link w:val="Heading6"/&gt;&lt;w:uiPriority w:val="9"/&gt;&lt;w:semiHidden/&gt;&lt;w:rsid w:val="008E716E"/&gt;&lt;w:rPr&gt;&lt;w:rFonts w:asciiTheme="majorHAnsi" w:eastAsiaTheme="majorEastAsia" w:hAnsiTheme="majorHAnsi" w:cstheme="majorBidi"/&gt;&lt;w:b/&gt;&lt;w:bCs/&gt;&lt;w:i/&gt;&lt;w:iCs/&gt;&lt;w:lang w:val="en-GB"/&gt;&lt;/w:rPr&gt;&lt;/w:style&gt;&lt;w:style w:type="character" w:customStyle="1" w:styleId="Heading7Char"&gt;&lt;w:name w:val="Heading 7 Char"/&gt;&lt;w:basedOn w:val="DefaultParagraphFont"/&gt;&lt;w:link w:val="Heading7"/&gt;&lt;w:uiPriority w:val="9"/&gt;&lt;w:semiHidden/&gt;&lt;w:rsid w:val="008E716E"/&gt;&lt;w:rPr&gt;&lt;w:i/&gt;&lt;w:iCs/&gt;&lt;w:lang w:val="en-GB"/&gt;&lt;/w:rPr&gt;&lt;/w:style&gt;&lt;w:style w:type="character" w:customStyle="1" w:styleId="Heading8Char"&gt;&lt;w:name w:val="Heading 8 Char"/&gt;&lt;w:basedOn w:val="DefaultParagraphFont"/&gt;&lt;w:link w:val="Heading8"/&gt;&lt;w:uiPriority w:val="9"/&gt;&lt;w:semiHidden/&gt;&lt;w:rsid w:val="008E716E"/&gt;&lt;w:rPr&gt;&lt;w:b/&gt;&lt;w:bCs/&gt;&lt;w:lang w:val="en-GB"/&gt;&lt;/w:rPr&gt;&lt;/w:style&gt;&lt;w:style w:type="character" w:customStyle="1" w:styleId="Heading9Char"&gt;&lt;w:name w:val="Heading 9 Char"/&gt;&lt;w:basedOn w:val="DefaultParagraphFont"/&gt;&lt;w:link w:val="Heading9"/&gt;&lt;w:uiPriority w:val="9"/&gt;&lt;w:semiHidden/&gt;&lt;w:rsid w:val="008E716E"/&gt;&lt;w:rPr&gt;&lt;w:i/&gt;&lt;w:iCs/&gt;&lt;w:lang w:val="en-GB"/&gt;&lt;/w:rPr&gt;&lt;/w:style&gt;&lt;w:style w:type="paragraph" w:styleId="Caption"&gt;&lt;w:name w:val="caption"/&gt;&lt;w:basedOn w:val="Normal"/&gt;&lt;w:next w:val="Normal"/&gt;&lt;w:uiPriority w:val="35"/&gt;&lt;w:semiHidden/&gt;&lt;w:rsid w:val="009B1B65"/&gt;&lt;w:rPr&gt;&lt;w:b/&gt;&lt;w:bCs/&gt;&lt;w:sz w:val="18"/&gt;&lt;w:szCs w:val="18"/&gt;&lt;/w:rPr&gt;&lt;/w:style&gt;&lt;w:style w:type="paragraph" w:styleId="Title"&gt;&lt;w:name w:val="Title"/&gt;&lt;w:basedOn w:val="Normal"/&gt;&lt;w:next w:val="Normal"/&gt;&lt;w:link w:val="TitleChar"/&gt;&lt;w:uiPriority w:val="10"/&gt;&lt;w:semiHidden/&gt;&lt;w:qFormat/&gt;&lt;w:rsid w:val="00872413"/&gt;&lt;w:pPr&gt;&lt;w:spacing w:after="0"/&gt;&lt;w:contextualSpacing/&gt;&lt;/w:pPr&gt;&lt;w:rPr&gt;&lt;w:rFonts w:asciiTheme="majorHAnsi" w:eastAsiaTheme="majorEastAsia" w:hAnsiTheme="majorHAnsi" w:cstheme="majorBidi"/&gt;&lt;w:bCs/&gt;&lt;w:color w:val="407077" w:themeColor="accent1"/&gt;&lt;w:sz w:val="72"/&gt;&lt;w:szCs w:val="48"/&gt;&lt;/w:rPr&gt;&lt;/w:style&gt;&lt;w:style w:type="character" w:customStyle="1" w:styleId="TitleChar"&gt;&lt;w:name w:val="Title Char"/&gt;&lt;w:basedOn w:val="DefaultParagraphFont"/&gt;&lt;w:link w:val="Title"/&gt;&lt;w:uiPriority w:val="10"/&gt;&lt;w:semiHidden/&gt;&lt;w:rsid w:val="005F186C"/&gt;&lt;w:rPr&gt;&lt;w:rFonts w:asciiTheme="majorHAnsi" w:eastAsiaTheme="majorEastAsia" w:hAnsiTheme="majorHAnsi" w:cstheme="majorBidi"/&gt;&lt;w:bCs/&gt;&lt;w:color w:val="407077" w:themeColor="accent1"/&gt;&lt;w:sz w:val="72"/&gt;&lt;w:szCs w:val="48"/&gt;&lt;w:lang w:val="en-GB"/&gt;&lt;/w:rPr&gt;&lt;/w:style&gt;&lt;w:style w:type="paragraph" w:styleId="Subtitle"&gt;&lt;w:name w:val="Subtitle"/&gt;&lt;w:basedOn w:val="Normal"/&gt;&lt;w:next w:val="Normal"/&gt;&lt;w:link w:val="SubtitleChar"/&gt;&lt;w:uiPriority w:val="11"/&gt;&lt;w:semiHidden/&gt;&lt;w:qFormat/&gt;&lt;w:rsid w:val="00872413"/&gt;&lt;w:pPr&gt;&lt;w:numPr&gt;&lt;w:ilvl w:val="1"/&gt;&lt;/w:numPr&gt;&lt;w:spacing w:before="120" w:after="240"/&gt;&lt;/w:pPr&gt;&lt;w:rPr&gt;&lt;w:rFonts w:ascii="GothamMedium" w:eastAsiaTheme="majorEastAsia" w:hAnsi="GothamMedium" w:cstheme="majorBidi"/&gt;&lt;w:color w:val="343436" w:themeColor="text2"/&gt;&lt;w:sz w:val="24"/&gt;&lt;w:szCs w:val="24"/&gt;&lt;/w:rPr&gt;&lt;/w:style&gt;&lt;w:style w:type="character" w:customStyle="1" w:styleId="SubtitleChar"&gt;&lt;w:name w:val="Subtitle Char"/&gt;&lt;w:basedOn w:val="DefaultParagraphFont"/&gt;&lt;w:link w:val="Subtitle"/&gt;&lt;w:uiPriority w:val="11"/&gt;&lt;w:semiHidden/&gt;&lt;w:rsid w:val="005F186C"/&gt;&lt;w:rPr&gt;&lt;w:rFonts w:ascii="GothamMedium" w:eastAsiaTheme="majorEastAsia" w:hAnsi="GothamMedium" w:cstheme="majorBidi"/&gt;&lt;w:color w:val="343436" w:themeColor="text2"/&gt;&lt;w:sz w:val="24"/&gt;&lt;w:szCs w:val="24"/&gt;&lt;w:lang w:val="en-GB"/&gt;&lt;/w:rPr&gt;&lt;/w:style&gt;&lt;w:style w:type="character" w:styleId="Strong"&gt;&lt;w:name w:val="Strong"/&gt;&lt;w:basedOn w:val="DefaultParagraphFont"/&gt;&lt;w:uiPriority w:val="22"/&gt;&lt;w:semiHidden/&gt;&lt;w:rsid w:val="009B1B65"/&gt;&lt;w:rPr&gt;&lt;w:b/&gt;&lt;w:bCs/&gt;&lt;w:color w:val="auto"/&gt;&lt;/w:rPr&gt;&lt;/w:style&gt;&lt;w:style w:type="character" w:styleId="Emphasis"&gt;&lt;w:name w:val="Emphasis"/&gt;&lt;w:basedOn w:val="DefaultParagraphFont"/&gt;&lt;w:uiPriority w:val="20"/&gt;&lt;w:semiHidden/&gt;&lt;w:rsid w:val="009B1B65"/&gt;&lt;w:rPr&gt;&lt;w:i/&gt;&lt;w:iCs/&gt;&lt;w:color w:val="auto"/&gt;&lt;/w:rPr&gt;&lt;/w:style&gt;&lt;w:style w:type="paragraph" w:styleId="NoSpacing"&gt;&lt;w:name w:val="No Spacing"/&gt;&lt;w:link w:val="NoSpacingChar"/&gt;&lt;w:uiPriority w:val="1"/&gt;&lt;w:qFormat/&gt;&lt;w:rsid w:val="00EA5662"/&gt;&lt;w:pPr&gt;&lt;w:spacing w:after="0"/&gt;&lt;/w:pPr&gt;&lt;/w:style&gt;&lt;w:style w:type="paragraph" w:styleId="Quote"&gt;&lt;w:name w:val="Quote"/&gt;&lt;w:basedOn w:val="Normal"/&gt;&lt;w:next w:val="Normal"/&gt;&lt;w:link w:val="QuoteChar"/&gt;&lt;w:uiPriority w:val="29"/&gt;&lt;w:semiHidden/&gt;&lt;w:rsid w:val="009B1B65"/&gt;&lt;w:pPr&gt;&lt;w:spacing w:before="200" w:line="264" w:lineRule="auto"/&gt;&lt;w:ind w:left="864" w:right="864"/&gt;&lt;w:jc w:val="center"/&gt;&lt;/w:pPr&gt;&lt;w:rPr&gt;&lt;w:rFonts w:asciiTheme="majorHAnsi" w:eastAsiaTheme="majorEastAsia" w:hAnsiTheme="majorHAnsi" w:cstheme="majorBidi"/&gt;&lt;w:i/&gt;&lt;w:iCs/&gt;&lt;w:sz w:val="24"/&gt;&lt;w:szCs w:val="24"/&gt;&lt;/w:rPr&gt;&lt;/w:style&gt;&lt;w:style w:type="character" w:customStyle="1" w:styleId="QuoteChar"&gt;&lt;w:name w:val="Quote Char"/&gt;&lt;w:basedOn w:val="DefaultParagraphFont"/&gt;&lt;w:link w:val="Quote"/&gt;&lt;w:uiPriority w:val="29"/&gt;&lt;w:semiHidden/&gt;&lt;w:rsid w:val="009B1B65"/&gt;&lt;w:rPr&gt;&lt;w:rFonts w:asciiTheme="majorHAnsi" w:eastAsiaTheme="majorEastAsia" w:hAnsiTheme="majorHAnsi" w:cstheme="majorBidi"/&gt;&lt;w:i/&gt;&lt;w:iCs/&gt;&lt;w:sz w:val="24"/&gt;&lt;w:szCs w:val="24"/&gt;&lt;/w:rPr&gt;&lt;/w:style&gt;&lt;w:style w:type="paragraph" w:styleId="IntenseQuote"&gt;&lt;w:name w:val="Intense Quote"/&gt;&lt;w:basedOn w:val="Normal"/&gt;&lt;w:next w:val="Normal"/&gt;&lt;w:link w:val="IntenseQuoteChar"/&gt;&lt;w:uiPriority w:val="30"/&gt;&lt;w:semiHidden/&gt;&lt;w:rsid w:val="009B1B65"/&gt;&lt;w:pPr&gt;&lt;w:spacing w:before="100" w:beforeAutospacing="1" w:after="240"/&gt;&lt;w:ind w:left="936" w:right="936"/&gt;&lt;w:jc w:val="center"/&gt;&lt;/w:pPr&gt;&lt;w:rPr&gt;&lt;w:rFonts w:asciiTheme="majorHAnsi" w:eastAsiaTheme="majorEastAsia" w:hAnsiTheme="majorHAnsi" w:cstheme="majorBidi"/&gt;&lt;w:sz w:val="26"/&gt;&lt;w:szCs w:val="26"/&gt;&lt;/w:rPr&gt;&lt;/w:style&gt;&lt;w:style w:type="character" w:customStyle="1" w:styleId="IntenseQuoteChar"&gt;&lt;w:name w:val="Intense Quote Char"/&gt;&lt;w:basedOn w:val="DefaultParagraphFont"/&gt;&lt;w:link w:val="IntenseQuote"/&gt;&lt;w:uiPriority w:val="30"/&gt;&lt;w:semiHidden/&gt;&lt;w:rsid w:val="009B1B65"/&gt;&lt;w:rPr&gt;&lt;w:rFonts w:asciiTheme="majorHAnsi" w:eastAsiaTheme="majorEastAsia" w:hAnsiTheme="majorHAnsi" w:cstheme="majorBidi"/&gt;&lt;w:sz w:val="26"/&gt;&lt;w:szCs w:val="26"/&gt;&lt;/w:rPr&gt;&lt;/w:style&gt;&lt;w:style w:type="character" w:styleId="SubtleEmphasis"&gt;&lt;w:name w:val="Subtle Emphasis"/&gt;&lt;w:basedOn w:val="DefaultParagraphFont"/&gt;&lt;w:uiPriority w:val="19"/&gt;&lt;w:semiHidden/&gt;&lt;w:rsid w:val="009B1B65"/&gt;&lt;w:rPr&gt;&lt;w:i/&gt;&lt;w:iCs/&gt;&lt;w:color w:val="auto"/&gt;&lt;/w:rPr&gt;&lt;/w:style&gt;&lt;w:style w:type="character" w:styleId="IntenseEmphasis"&gt;&lt;w:name w:val="Intense Emphasis"/&gt;&lt;w:basedOn w:val="DefaultParagraphFont"/&gt;&lt;w:uiPriority w:val="21"/&gt;&lt;w:semiHidden/&gt;&lt;w:rsid w:val="009B1B65"/&gt;&lt;w:rPr&gt;&lt;w:b/&gt;&lt;w:bCs/&gt;&lt;w:i/&gt;&lt;w:iCs/&gt;&lt;w:color w:val="auto"/&gt;&lt;/w:rPr&gt;&lt;/w:style&gt;&lt;w:style w:type="character" w:styleId="SubtleReference"&gt;&lt;w:name w:val="Subtle Reference"/&gt;&lt;w:basedOn w:val="DefaultParagraphFont"/&gt;&lt;w:uiPriority w:val="31"/&gt;&lt;w:semiHidden/&gt;&lt;w:rsid w:val="009B1B65"/&gt;&lt;w:rPr&gt;&lt;w:smallCaps/&gt;&lt;w:color w:val="auto"/&gt;&lt;w:u w:val="single" w:color="7F7F7F" w:themeColor="text1" w:themeTint="80"/&gt;&lt;/w:rPr&gt;&lt;/w:style&gt;&lt;w:style w:type="character" w:styleId="IntenseReference"&gt;&lt;w:name w:val="Intense Reference"/&gt;&lt;w:basedOn w:val="DefaultParagraphFont"/&gt;&lt;w:uiPriority w:val="32"/&gt;&lt;w:semiHidden/&gt;&lt;w:rsid w:val="009B1B65"/&gt;&lt;w:rPr&gt;&lt;w:b/&gt;&lt;w:bCs/&gt;&lt;w:smallCaps/&gt;&lt;w:color w:val="auto"/&gt;&lt;w:u w:val="single"/&gt;&lt;/w:rPr&gt;&lt;/w:style&gt;&lt;w:style w:type="character" w:styleId="BookTitle"&gt;&lt;w:name w:val="Book Title"/&gt;&lt;w:basedOn w:val="DefaultParagraphFont"/&gt;&lt;w:uiPriority w:val="33"/&gt;&lt;w:semiHidden/&gt;&lt;w:rsid w:val="009B1B65"/&gt;&lt;w:rPr&gt;&lt;w:b/&gt;&lt;w:bCs/&gt;&lt;w:smallCaps/&gt;&lt;w:color w:val="auto"/&gt;&lt;/w:rPr&gt;&lt;/w:style&gt;&lt;w:style w:type="paragraph" w:styleId="TOCHeading"&gt;&lt;w:name w:val="TOC Heading"/&gt;&lt;w:basedOn w:val="Normal"/&gt;&lt;w:next w:val="Normal"/&gt;&lt;w:uiPriority w:val="39"/&gt;&lt;w:semiHidden/&gt;&lt;w:rsid w:val="009F4214"/&gt;&lt;w:pPr&gt;&lt;w:keepNext/&gt;&lt;w:keepLines/&gt;&lt;w:pageBreakBefore/&gt;&lt;/w:pPr&gt;&lt;w:rPr&gt;&lt;w:rFonts w:asciiTheme="majorHAnsi" w:hAnsiTheme="majorHAnsi"/&gt;&lt;w:b/&gt;&lt;w:sz w:val="32"/&gt;&lt;/w:rPr&gt;&lt;/w:style&gt;&lt;w:style w:type="paragraph" w:styleId="ListBullet"&gt;&lt;w:name w:val="List Bullet"/&gt;&lt;w:basedOn w:val="Normal"/&gt;&lt;w:uiPriority w:val="14"/&gt;&lt;w:qFormat/&gt;&lt;w:rsid w:val="001D4B24"/&gt;&lt;w:pPr&gt;&lt;w:numPr&gt;&lt;w:numId w:val="1"/&gt;&lt;/w:numPr&gt;&lt;w:spacing w:after="80"/&gt;&lt;w:contextualSpacing/&gt;&lt;/w:pPr&gt;&lt;/w:style&gt;&lt;w:style w:type="paragraph" w:styleId="ListNumber"&gt;&lt;w:name w:val="List Number"/&gt;&lt;w:basedOn w:val="Normal"/&gt;&lt;w:uiPriority w:val="14"/&gt;&lt;w:qFormat/&gt;&lt;w:rsid w:val="00223177"/&gt;&lt;w:pPr&gt;&lt;w:numPr&gt;&lt;w:numId w:val="6"/&gt;&lt;/w:numPr&gt;&lt;w:spacing w:after="80"/&gt;&lt;w:ind w:left="357" w:hanging="357"/&gt;&lt;w:contextualSpacing/&gt;&lt;/w:pPr&gt;&lt;/w:style&gt;&lt;w:style w:type="table" w:styleId="TableGrid"&gt;&lt;w:name w:val="Table Grid"/&gt;&lt;w:basedOn w:val="TableNormal"/&gt;&lt;w:uiPriority w:val="39"/&gt;&lt;w:rsid w:val="00572408"/&gt;&lt;w:pPr&gt;&lt;w:spacing w:after="0" w:line="240" w:lineRule="auto"/&gt;&lt;/w:pPr&gt;&lt;w:tblPr/&gt;&lt;/w:style&gt;&lt;w:style w:type="paragraph" w:styleId="FootnoteText"&gt;&lt;w:name w:val="footnote text"/&gt;&lt;w:basedOn w:val="Normal"/&gt;&lt;w:link w:val="FootnoteTextChar"/&gt;&lt;w:uiPriority w:val="99"/&gt;&lt;w:semiHidden/&gt;&lt;w:rsid w:val="00872413"/&gt;&lt;w:pPr&gt;&lt;w:spacing w:after="0"/&gt;&lt;/w:pPr&gt;&lt;w:rPr&gt;&lt;w:sz w:val="14"/&gt;&lt;w:szCs w:val="20"/&gt;&lt;/w:rPr&gt;&lt;/w:style&gt;&lt;w:style w:type="character" w:customStyle="1" w:styleId="FootnoteTextChar"&gt;&lt;w:name w:val="Footnote Text Char"/&gt;&lt;w:basedOn w:val="DefaultParagraphFont"/&gt;&lt;w:link w:val="FootnoteText"/&gt;&lt;w:uiPriority w:val="99"/&gt;&lt;w:semiHidden/&gt;&lt;w:rsid w:val="005F186C"/&gt;&lt;w:rPr&gt;&lt;w:sz w:val="14"/&gt;&lt;w:szCs w:val="20"/&gt;&lt;w:lang w:val="en-GB"/&gt;&lt;/w:rPr&gt;&lt;/w:style&gt;&lt;w:style w:type="character" w:styleId="FootnoteReference"&gt;&lt;w:name w:val="footnote reference"/&gt;&lt;w:basedOn w:val="DefaultParagraphFont"/&gt;&lt;w:uiPriority w:val="99"/&gt;&lt;w:semiHidden/&gt;&lt;w:rsid w:val="00884E47"/&gt;&lt;w:rPr&gt;&lt;w:vertAlign w:val="superscript"/&gt;&lt;/w:rPr&gt;&lt;/w:style&gt;&lt;w:style w:type="paragraph" w:styleId="Header"&gt;&lt;w:name w:val="header"/&gt;&lt;w:basedOn w:val="Normal"/&gt;&lt;w:link w:val="HeaderChar"/&gt;&lt;w:uiPriority w:val="99"/&gt;&lt;w:semiHidden/&gt;&lt;w:rsid w:val="005F186C"/&gt;&lt;w:pPr&gt;&lt;w:tabs&gt;&lt;w:tab w:val="center" w:pos="4536"/&gt;&lt;w:tab w:val="right" w:pos="9072"/&gt;&lt;/w:tabs&gt;&lt;w:spacing w:after="0" w:line="240" w:lineRule="auto"/&gt;&lt;/w:pPr&gt;&lt;w:rPr&gt;&lt;w:color w:val="858585" w:themeColor="accent5"/&gt;&lt;w:sz w:val="16"/&gt;&lt;/w:rPr&gt;&lt;/w:style&gt;&lt;w:style w:type="character" w:customStyle="1" w:styleId="HeaderChar"&gt;&lt;w:name w:val="Header Char"/&gt;&lt;w:basedOn w:val="DefaultParagraphFont"/&gt;&lt;w:link w:val="Header"/&gt;&lt;w:uiPriority w:val="99"/&gt;&lt;w:semiHidden/&gt;&lt;w:rsid w:val="005F186C"/&gt;&lt;w:rPr&gt;&lt;w:color w:val="858585" w:themeColor="accent5"/&gt;&lt;w:sz w:val="16"/&gt;&lt;w:lang w:val="en-GB"/&gt;&lt;/w:rPr&gt;&lt;/w:style&gt;&lt;w:style w:type="paragraph" w:styleId="Footer"&gt;&lt;w:name w:val="footer"/&gt;&lt;w:basedOn w:val="Normal"/&gt;&lt;w:link w:val="FooterChar"/&gt;&lt;w:uiPriority w:val="99"/&gt;&lt;w:semiHidden/&gt;&lt;w:rsid w:val="005F186C"/&gt;&lt;w:pPr&gt;&lt;w:tabs&gt;&lt;w:tab w:val="center" w:pos="4536"/&gt;&lt;w:tab w:val="right" w:pos="9072"/&gt;&lt;/w:tabs&gt;&lt;w:spacing w:after="0" w:line="240" w:lineRule="auto"/&gt;&lt;/w:pPr&gt;&lt;w:rPr&gt;&lt;w:color w:val="858585" w:themeColor="accent5"/&gt;&lt;w:sz w:val="16"/&gt;&lt;/w:rPr&gt;&lt;/w:style&gt;&lt;w:style w:type="character" w:customStyle="1" w:styleId="FooterChar"&gt;&lt;w:name w:val="Footer Char"/&gt;&lt;w:basedOn w:val="DefaultParagraphFont"/&gt;&lt;w:link w:val="Footer"/&gt;&lt;w:uiPriority w:val="99"/&gt;&lt;w:semiHidden/&gt;&lt;w:rsid w:val="005F186C"/&gt;&lt;w:rPr&gt;&lt;w:color w:val="858585" w:themeColor="accent5"/&gt;&lt;w:sz w:val="16"/&gt;&lt;w:lang w:val="en-GB"/&gt;&lt;/w:rPr&gt;&lt;/w:style&gt;&lt;w:style w:type="paragraph" w:styleId="TOC1"&gt;&lt;w:name w:val="toc 1"/&gt;&lt;w:basedOn w:val="Normal"/&gt;&lt;w:next w:val="Normal"/&gt;&lt;w:uiPriority w:val="39"/&gt;&lt;w:semiHidden/&gt;&lt;w:rsid w:val="00421476"/&gt;&lt;w:pPr&gt;&lt;w:tabs&gt;&lt;w:tab w:val="right" w:leader="dot" w:pos="8210"/&gt;&lt;/w:tabs&gt;&lt;w:spacing w:after="100"/&gt;&lt;w:ind w:left="426" w:hanging="426"/&gt;&lt;/w:pPr&gt;&lt;/w:style&gt;&lt;w:style w:type="paragraph" w:styleId="TOC2"&gt;&lt;w:name w:val="toc 2"/&gt;&lt;w:basedOn w:val="Normal"/&gt;&lt;w:next w:val="Normal"/&gt;&lt;w:uiPriority w:val="39"/&gt;&lt;w:semiHidden/&gt;&lt;w:rsid w:val="00EE62A8"/&gt;&lt;w:pPr&gt;&lt;w:tabs&gt;&lt;w:tab w:val="right" w:leader="dot" w:pos="8210"/&gt;&lt;/w:tabs&gt;&lt;w:spacing w:after="100"/&gt;&lt;w:ind w:left="1134" w:hanging="708"/&gt;&lt;/w:pPr&gt;&lt;w:rPr&gt;&lt;w:noProof/&gt;&lt;/w:rPr&gt;&lt;/w:style&gt;&lt;w:style w:type="paragraph" w:styleId="TOC3"&gt;&lt;w:name w:val="toc 3"/&gt;&lt;w:basedOn w:val="Normal"/&gt;&lt;w:next w:val="Normal"/&gt;&lt;w:uiPriority w:val="39"/&gt;&lt;w:semiHidden/&gt;&lt;w:rsid w:val="00EE62A8"/&gt;&lt;w:pPr&gt;&lt;w:tabs&gt;&lt;w:tab w:val="right" w:leader="dot" w:pos="8210"/&gt;&lt;/w:tabs&gt;&lt;w:spacing w:after="100"/&gt;&lt;w:ind w:left="1134" w:hanging="694"/&gt;&lt;/w:pPr&gt;&lt;w:rPr&gt;&lt;w:noProof/&gt;&lt;/w:rPr&gt;&lt;/w:style&gt;&lt;w:style w:type="character" w:styleId="Hyperlink"&gt;&lt;w:name w:val="Hyperlink"/&gt;&lt;w:basedOn w:val="DefaultParagraphFont"/&gt;&lt;w:uiPriority w:val="99"/&gt;&lt;w:semiHidden/&gt;&lt;w:rsid w:val="008555A7"/&gt;&lt;w:rPr&gt;&lt;w:color w:val="A1BF35" w:themeColor="hyperlink"/&gt;&lt;w:u w:val="single"/&gt;&lt;/w:rPr&gt;&lt;/w:style&gt;&lt;w:style w:type="paragraph" w:styleId="TOC4"&gt;&lt;w:name w:val="toc 4"/&gt;&lt;w:basedOn w:val="Normal"/&gt;&lt;w:next w:val="Normal"/&gt;&lt;w:uiPriority w:val="39"/&gt;&lt;w:semiHidden/&gt;&lt;w:rsid w:val="00FF2698"/&gt;&lt;w:pPr&gt;&lt;w:spacing w:after="100"/&gt;&lt;w:ind w:left="660"/&gt;&lt;/w:pPr&gt;&lt;/w:style&gt;&lt;w:style w:type="paragraph" w:styleId="TOC5"&gt;&lt;w:name w:val="toc 5"/&gt;&lt;w:basedOn w:val="Normal"/&gt;&lt;w:next w:val="Normal"/&gt;&lt;w:uiPriority w:val="39"/&gt;&lt;w:semiHidden/&gt;&lt;w:rsid w:val="00FF2698"/&gt;&lt;w:pPr&gt;&lt;w:spacing w:after="100"/&gt;&lt;w:ind w:left="880"/&gt;&lt;/w:pPr&gt;&lt;/w:style&gt;&lt;w:style w:type="paragraph" w:styleId="TOC6"&gt;&lt;w:name w:val="toc 6"/&gt;&lt;w:basedOn w:val="Normal"/&gt;&lt;w:next w:val="Normal"/&gt;&lt;w:uiPriority w:val="39"/&gt;&lt;w:semiHidden/&gt;&lt;w:rsid w:val="00FF2698"/&gt;&lt;w:pPr&gt;&lt;w:spacing w:after="100"/&gt;&lt;w:ind w:left="1100"/&gt;&lt;/w:pPr&gt;&lt;/w:style&gt;&lt;w:style w:type="paragraph" w:styleId="TOC7"&gt;&lt;w:name w:val="toc 7"/&gt;&lt;w:basedOn w:val="Normal"/&gt;&lt;w:next w:val="Normal"/&gt;&lt;w:uiPriority w:val="39"/&gt;&lt;w:semiHidden/&gt;&lt;w:rsid w:val="00FF2698"/&gt;&lt;w:pPr&gt;&lt;w:spacing w:after="100"/&gt;&lt;w:ind w:left="1320"/&gt;&lt;/w:pPr&gt;&lt;/w:style&gt;&lt;w:style w:type="paragraph" w:styleId="TOC8"&gt;&lt;w:name w:val="toc 8"/&gt;&lt;w:basedOn w:val="Normal"/&gt;&lt;w:next w:val="Normal"/&gt;&lt;w:uiPriority w:val="39"/&gt;&lt;w:semiHidden/&gt;&lt;w:rsid w:val="00FF2698"/&gt;&lt;w:pPr&gt;&lt;w:spacing w:after="100"/&gt;&lt;w:ind w:left="1540"/&gt;&lt;/w:pPr&gt;&lt;/w:style&gt;&lt;w:style w:type="paragraph" w:styleId="TOC9"&gt;&lt;w:name w:val="toc 9"/&gt;&lt;w:basedOn w:val="Normal"/&gt;&lt;w:next w:val="Normal"/&gt;&lt;w:uiPriority w:val="39"/&gt;&lt;w:semiHidden/&gt;&lt;w:rsid w:val="00FF2698"/&gt;&lt;w:pPr&gt;&lt;w:spacing w:after="100"/&gt;&lt;w:ind w:left="1760"/&gt;&lt;/w:pPr&gt;&lt;/w:style&gt;&lt;w:style w:type="paragraph" w:styleId="ListNumber2"&gt;&lt;w:name w:val="List Number 2"/&gt;&lt;w:basedOn w:val="ListNumber"/&gt;&lt;w:uiPriority w:val="14"/&gt;&lt;w:rsid w:val="00130001"/&gt;&lt;w:pPr&gt;&lt;w:numPr&gt;&lt;w:ilvl w:val="1"/&gt;&lt;/w:numPr&gt;&lt;/w:pPr&gt;&lt;/w:style&gt;&lt;w:style w:type="paragraph" w:styleId="ListNumber3"&gt;&lt;w:name w:val="List Number 3"/&gt;&lt;w:basedOn w:val="ListNumber2"/&gt;&lt;w:uiPriority w:val="14"/&gt;&lt;w:rsid w:val="00130001"/&gt;&lt;w:pPr&gt;&lt;w:numPr&gt;&lt;w:ilvl w:val="2"/&gt;&lt;/w:numPr&gt;&lt;/w:pPr&gt;&lt;/w:style&gt;&lt;w:style w:type="paragraph" w:styleId="ListNumber4"&gt;&lt;w:name w:val="List Number 4"/&gt;&lt;w:basedOn w:val="ListNumber3"/&gt;&lt;w:uiPriority w:val="14"/&gt;&lt;w:semiHidden/&gt;&lt;w:rsid w:val="00130001"/&gt;&lt;w:pPr&gt;&lt;w:numPr&gt;&lt;w:ilvl w:val="3"/&gt;&lt;/w:numPr&gt;&lt;/w:pPr&gt;&lt;/w:style&gt;&lt;w:style w:type="paragraph" w:styleId="ListNumber5"&gt;&lt;w:name w:val="List Number 5"/&gt;&lt;w:basedOn w:val="ListNumber4"/&gt;&lt;w:uiPriority w:val="14"/&gt;&lt;w:semiHidden/&gt;&lt;w:rsid w:val="00130001"/&gt;&lt;w:pPr&gt;&lt;w:numPr&gt;&lt;w:ilvl w:val="4"/&gt;&lt;/w:numPr&gt;&lt;/w:pPr&gt;&lt;/w:style&gt;&lt;w:style w:type="paragraph" w:styleId="ListBullet2"&gt;&lt;w:name w:val="List Bullet 2"/&gt;&lt;w:basedOn w:val="ListBullet"/&gt;&lt;w:uiPriority w:val="14"/&gt;&lt;w:rsid w:val="00FE2BED"/&gt;&lt;w:pPr&gt;&lt;w:numPr&gt;&lt;w:ilvl w:val="1"/&gt;&lt;/w:numPr&gt;&lt;/w:pPr&gt;&lt;/w:style&gt;&lt;w:style w:type="paragraph" w:styleId="ListBullet3"&gt;&lt;w:name w:val="List Bullet 3"/&gt;&lt;w:basedOn w:val="ListBullet2"/&gt;&lt;w:uiPriority w:val="14"/&gt;&lt;w:rsid w:val="00FE2BED"/&gt;&lt;w:pPr&gt;&lt;w:numPr&gt;&lt;w:ilvl w:val="2"/&gt;&lt;/w:numPr&gt;&lt;/w:pPr&gt;&lt;/w:style&gt;&lt;w:style w:type="paragraph" w:styleId="ListBullet4"&gt;&lt;w:name w:val="List Bullet 4"/&gt;&lt;w:basedOn w:val="ListBullet3"/&gt;&lt;w:uiPriority w:val="14"/&gt;&lt;w:semiHidden/&gt;&lt;w:rsid w:val="00FE2BED"/&gt;&lt;w:pPr&gt;&lt;w:numPr&gt;&lt;w:ilvl w:val="3"/&gt;&lt;/w:numPr&gt;&lt;/w:pPr&gt;&lt;/w:style&gt;&lt;w:style w:type="paragraph" w:styleId="ListBullet5"&gt;&lt;w:name w:val="List Bullet 5"/&gt;&lt;w:basedOn w:val="ListBullet4"/&gt;&lt;w:uiPriority w:val="14"/&gt;&lt;w:semiHidden/&gt;&lt;w:rsid w:val="00FE2BED"/&gt;&lt;w:pPr&gt;&lt;w:numPr&gt;&lt;w:ilvl w:val="4"/&gt;&lt;/w:numPr&gt;&lt;/w:pPr&gt;&lt;/w:style&gt;&lt;w:style w:type="character" w:styleId="PlaceholderText"&gt;&lt;w:name w:val="Placeholder Text"/&gt;&lt;w:basedOn w:val="DefaultParagraphFont"/&gt;&lt;w:uiPriority w:val="99"/&gt;&lt;w:rsid w:val="009C6FDB"/&gt;&lt;w:rPr&gt;&lt;w:color w:val="7F7F7F" w:themeColor="text1" w:themeTint="80"/&gt;&lt;w:bdr w:val="none" w:sz="0" w:space="0" w:color="auto"/&gt;&lt;w:shd w:val="clear" w:color="auto" w:fill="F0F0F0"/&gt;&lt;/w:rPr&gt;&lt;/w:style&gt;&lt;w:style w:type="paragraph" w:customStyle="1" w:styleId="Hiddentext"&gt;&lt;w:name w:val="Hidden text"/&gt;&lt;w:basedOn w:val="Normal"/&gt;&lt;w:next w:val="Normal"/&gt;&lt;w:uiPriority w:val="24"/&gt;&lt;w:semiHidden/&gt;&lt;w:qFormat/&gt;&lt;w:rsid w:val="00D86E66"/&gt;&lt;w:rPr&gt;&lt;w:vanish/&gt;&lt;w:color w:val="C00000"/&gt;&lt;/w:rPr&gt;&lt;/w:style&gt;&lt;w:style w:type="paragraph" w:customStyle="1" w:styleId="NumberedHeading1"&gt;&lt;w:name w:val="Numbered Heading 1"/&gt;&lt;w:basedOn w:val="Heading1"/&gt;&lt;w:next w:val="Normal"/&gt;&lt;w:uiPriority w:val="10"/&gt;&lt;w:semiHidden/&gt;&lt;w:qFormat/&gt;&lt;w:rsid w:val="00494FFB"/&gt;&lt;w:pPr&gt;&lt;w:numPr&gt;&lt;w:numId w:val="12"/&gt;&lt;/w:numPr&gt;&lt;/w:pPr&gt;&lt;/w:style&gt;&lt;w:style w:type="paragraph" w:customStyle="1" w:styleId="NumberedHeading2"&gt;&lt;w:name w:val="Numbered Heading 2"/&gt;&lt;w:basedOn w:val="Heading2"/&gt;&lt;w:next w:val="Normal"/&gt;&lt;w:uiPriority w:val="10"/&gt;&lt;w:semiHidden/&gt;&lt;w:qFormat/&gt;&lt;w:rsid w:val="00DA7B63"/&gt;&lt;w:pPr&gt;&lt;w:numPr&gt;&lt;w:ilvl w:val="1"/&gt;&lt;w:numId w:val="12"/&gt;&lt;/w:numPr&gt;&lt;/w:pPr&gt;&lt;/w:style&gt;&lt;w:style w:type="paragraph" w:customStyle="1" w:styleId="NumberedHeading3"&gt;&lt;w:name w:val="Numbered Heading 3"/&gt;&lt;w:basedOn w:val="Heading3"/&gt;&lt;w:next w:val="Normal"/&gt;&lt;w:uiPriority w:val="10"/&gt;&lt;w:semiHidden/&gt;&lt;w:qFormat/&gt;&lt;w:rsid w:val="00DA7B63"/&gt;&lt;w:pPr&gt;&lt;w:numPr&gt;&lt;w:ilvl w:val="2"/&gt;&lt;w:numId w:val="12"/&gt;&lt;/w:numPr&gt;&lt;/w:pPr&gt;&lt;/w:style&gt;&lt;w:style w:type="paragraph" w:customStyle="1" w:styleId="NumberedHeading4"&gt;&lt;w:name w:val="Numbered Heading 4"/&gt;&lt;w:basedOn w:val="Heading4"/&gt;&lt;w:next w:val="Normal"/&gt;&lt;w:uiPriority w:val="10"/&gt;&lt;w:semiHidden/&gt;&lt;w:qFormat/&gt;&lt;w:rsid w:val="00DA7B63"/&gt;&lt;w:pPr&gt;&lt;w:numPr&gt;&lt;w:ilvl w:val="3"/&gt;&lt;w:numId w:val="12"/&gt;&lt;/w:numPr&gt;&lt;/w:pPr&gt;&lt;/w:style&gt;&lt;w:style w:type="character" w:customStyle="1" w:styleId="NoSpacingChar"&gt;&lt;w:name w:val="No Spacing Char"/&gt;&lt;w:basedOn w:val="DefaultParagraphFont"/&gt;&lt;w:link w:val="NoSpacing"/&gt;&lt;w:uiPriority w:val="1"/&gt;&lt;w:rsid w:val="00EE7F0A"/&gt;&lt;/w:style&gt;&lt;w:style w:type="paragraph" w:styleId="BalloonText"&gt;&lt;w:name w:val="Balloon Text"/&gt;&lt;w:basedOn w:val="Normal"/&gt;&lt;w:link w:val="BalloonTextChar"/&gt;&lt;w:uiPriority w:val="99"/&gt;&lt;w:semiHidden/&gt;&lt;w:unhideWhenUsed/&gt;&lt;w:rsid w:val="00421476"/&gt;&lt;w:pPr&gt;&lt;w:spacing w:after="0"/&gt;&lt;/w:pPr&gt;&lt;w:rPr&gt;&lt;w:rFonts w:cs="Segoe UI"/&gt;&lt;w:sz w:val="18"/&gt;&lt;w:szCs w:val="18"/&gt;&lt;/w:rPr&gt;&lt;/w:style&gt;&lt;w:style w:type="character" w:customStyle="1" w:styleId="BalloonTextChar"&gt;&lt;w:name w:val="Balloon Text Char"/&gt;&lt;w:basedOn w:val="DefaultParagraphFont"/&gt;&lt;w:link w:val="BalloonText"/&gt;&lt;w:uiPriority w:val="99"/&gt;&lt;w:semiHidden/&gt;&lt;w:rsid w:val="00421476"/&gt;&lt;w:rPr&gt;&lt;w:rFonts w:cs="Segoe UI"/&gt;&lt;w:sz w:val="18"/&gt;&lt;w:szCs w:val="18"/&gt;&lt;w:lang w:val="en-GB"/&gt;&lt;/w:rPr&gt;&lt;/w:style&gt;&lt;w:style w:type="paragraph" w:customStyle="1" w:styleId="Footertext"&gt;&lt;w:name w:val="Footer text"/&gt;&lt;w:basedOn w:val="Normal"/&gt;&lt;w:uiPriority w:val="10"/&gt;&lt;w:semiHidden/&gt;&lt;w:qFormat/&gt;&lt;w:rsid w:val="001407DF"/&gt;&lt;w:pPr&gt;&lt;w:framePr w:wrap="around" w:vAnchor="page" w:hAnchor="page" w:x="852" w:y="14176"/&gt;&lt;w:spacing w:before="40" w:after="40"/&gt;&lt;/w:pPr&gt;&lt;w:rPr&gt;&lt;w:color w:val="858585" w:themeColor="accent5"/&gt;&lt;w:sz w:val="16"/&gt;&lt;/w:rPr&gt;&lt;/w:style&gt;&lt;w:style w:type="paragraph" w:customStyle="1" w:styleId="Footertitle"&gt;&lt;w:name w:val="Footer title"/&gt;&lt;w:basedOn w:val="Footertext"/&gt;&lt;w:uiPriority w:val="10"/&gt;&lt;w:semiHidden/&gt;&lt;w:qFormat/&gt;&lt;w:rsid w:val="00E4504C"/&gt;&lt;w:pPr&gt;&lt;w:framePr w:wrap="around"/&gt;&lt;/w:pPr&gt;&lt;w:rPr&gt;&lt;w:b/&gt;&lt;w:color w:val="407077" w:themeColor="accent1"/&gt;&lt;/w:rPr&gt;&lt;/w:style&gt;&lt;w:style w:type="table" w:customStyle="1" w:styleId="BetssonTable01"&gt;&lt;w:name w:val="Betsson Table 01"/&gt;&lt;w:basedOn w:val="TableNormal"/&gt;&lt;w:uiPriority w:val="99"/&gt;&lt;w:rsid w:val="00036B11"/&gt;&lt;w:pPr&gt;&lt;w:spacing w:after="0" w:line="240" w:lineRule="auto"/&gt;&lt;w:jc w:val="right"/&gt;&lt;/w:pPr&gt;&lt;w:tblPr&gt;&lt;w:tblBorders&gt;&lt;w:bottom w:val="single" w:sz="4" w:space="0" w:color="407077" w:themeColor="accent1"/&gt;&lt;w:insideH w:val="single" w:sz="4" w:space="0" w:color="407077" w:themeColor="accent1"/&gt;&lt;/w:tblBorders&gt;&lt;w:tblCellMar&gt;&lt;w:top w:w="57" w:type="dxa"/&gt;&lt;w:left w:w="57" w:type="dxa"/&gt;&lt;w:bottom w:w="57" w:type="dxa"/&gt;&lt;w:right w:w="57" w:type="dxa"/&gt;&lt;/w:tblCellMar&gt;&lt;/w:tblPr&gt;&lt;w:tblStylePr w:type="firstRow"&gt;&lt;w:pPr&gt;&lt;w:jc w:val="right"/&gt;&lt;/w:pPr&gt;&lt;w:rPr&gt;&lt;w:rFonts w:asciiTheme="majorHAnsi" w:hAnsiTheme="majorHAnsi"/&gt;&lt;w:b/&gt;&lt;w:color w:val="407077" w:themeColor="accent1"/&gt;&lt;/w:rPr&gt;&lt;w:tblPr/&gt;&lt;w:tcPr&gt;&lt;w:tcBorders&gt;&lt;w:bottom w:val="single" w:sz="12" w:space="0" w:color="407077" w:themeColor="accent1"/&gt;&lt;/w:tcBorders&gt;&lt;w:vAlign w:val="bottom"/&gt;&lt;/w:tcPr&gt;&lt;/w:tblStylePr&gt;&lt;w:tblStylePr w:type="lastRow"&gt;&lt;w:rPr&gt;&lt;w:rFonts w:asciiTheme="majorHAnsi" w:hAnsiTheme="majorHAnsi"/&gt;&lt;w:b/&gt;&lt;/w:rPr&gt;&lt;w:tblPr/&gt;&lt;w:tcPr&gt;&lt;w:tcBorders&gt;&lt;w:top w:val="double" w:sz="4" w:space="0" w:color="407077" w:themeColor="accent1"/&gt;&lt;w:left w:val="nil"/&gt;&lt;w:bottom w:val="nil"/&gt;&lt;w:right w:val="nil"/&gt;&lt;w:insideH w:val="nil"/&gt;&lt;w:insideV w:val="nil"/&gt;&lt;w:tl2br w:val="nil"/&gt;&lt;w:tr2bl w:val="nil"/&gt;&lt;/w:tcBorders&gt;&lt;/w:tcPr&gt;&lt;/w:tblStylePr&gt;&lt;w:tblStylePr w:type="firstCol"&gt;&lt;w:pPr&gt;&lt;w:jc w:val="left"/&gt;&lt;/w:pPr&gt;&lt;/w:tblStylePr&gt;&lt;w:tblStylePr w:type="lastCol"&gt;&lt;w:rPr&gt;&lt;w:rFonts w:asciiTheme="majorHAnsi" w:hAnsiTheme="majorHAnsi"/&gt;&lt;w:b/&gt;&lt;/w:rPr&gt;&lt;/w:tblStylePr&gt;&lt;w:tblStylePr w:type="nwCell"&gt;&lt;w:pPr&gt;&lt;w:jc w:val="left"/&gt;&lt;/w:pPr&gt;&lt;w:tblPr/&gt;&lt;w:tcPr&gt;&lt;w:vAlign w:val="bottom"/&gt;&lt;/w:tcPr&gt;&lt;/w:tblStylePr&gt;&lt;/w:style&gt;&lt;w:style w:type="table" w:styleId="TableGridLight"&gt;&lt;w:name w:val="Grid Table Light"/&gt;&lt;w:aliases w:val="Betsson Table 02"/&gt;&lt;w:basedOn w:val="TableNormal"/&gt;&lt;w:uiPriority w:val="40"/&gt;&lt;w:rsid w:val="00036B11"/&gt;&lt;w:pPr&gt;&lt;w:spacing w:after="0" w:line="240" w:lineRule="auto"/&gt;&lt;w:jc w:val="right"/&gt;&lt;/w:pPr&gt;&lt;w:tblPr&gt;&lt;w:tblStyleRowBandSize w:val="1"/&gt;&lt;w:tblBorders&gt;&lt;w:insideH w:val="single" w:sz="4" w:space="0" w:color="407077" w:themeColor="accent1"/&gt;&lt;/w:tblBorders&gt;&lt;w:tblCellMar&gt;&lt;w:top w:w="57" w:type="dxa"/&gt;&lt;w:left w:w="57" w:type="dxa"/&gt;&lt;w:bottom w:w="57" w:type="dxa"/&gt;&lt;w:right w:w="57" w:type="dxa"/&gt;&lt;/w:tblCellMar&gt;&lt;/w:tblPr&gt;&lt;w:tcPr&gt;&lt;w:shd w:val="clear" w:color="auto" w:fill="auto"/&gt;&lt;/w:tcPr&gt;&lt;w:tblStylePr w:type="firstRow"&gt;&lt;w:pPr&gt;&lt;w:wordWrap/&gt;&lt;w:spacing w:beforeLines="0" w:before="80" w:beforeAutospacing="0" w:afterLines="0" w:after="0" w:afterAutospacing="0"/&gt;&lt;w:jc w:val="right"/&gt;&lt;/w:pPr&gt;&lt;w:rPr&gt;&lt;w:rFonts w:asciiTheme="majorHAnsi" w:hAnsiTheme="majorHAnsi"/&gt;&lt;w:b/&gt;&lt;w:color w:val="FFFFFF" w:themeColor="background1"/&gt;&lt;/w:rPr&gt;&lt;w:tblPr/&gt;&lt;w:tcPr&gt;&lt;w:shd w:val="clear" w:color="auto" w:fill="407077" w:themeFill="accent1"/&gt;&lt;w:vAlign w:val="bottom"/&gt;&lt;/w:tcPr&gt;&lt;/w:tblStylePr&gt;&lt;w:tblStylePr w:type="lastRow"&gt;&lt;w:rPr&gt;&lt;w:rFonts w:asciiTheme="majorHAnsi" w:hAnsiTheme="majorHAnsi"/&gt;&lt;w:b/&gt;&lt;/w:rPr&gt;&lt;w:tblPr/&gt;&lt;w:tcPr&gt;&lt;w:tcBorders&gt;&lt;w:top w:val="double" w:sz="4" w:space="0" w:color="407077" w:themeColor="accent1"/&gt;&lt;/w:tcBorders&gt;&lt;w:shd w:val="clear" w:color="auto" w:fill="auto"/&gt;&lt;/w:tcPr&gt;&lt;/w:tblStylePr&gt;&lt;w:tblStylePr w:type="firstCol"&gt;&lt;w:pPr&gt;&lt;w:jc w:val="left"/&gt;&lt;/w:pPr&gt;&lt;/w:tblStylePr&gt;&lt;w:tblStylePr w:type="lastCol"&gt;&lt;w:pPr&gt;&lt;w:jc w:val="right"/&gt;&lt;/w:pPr&gt;&lt;w:rPr&gt;&lt;w:rFonts w:asciiTheme="majorHAnsi" w:hAnsiTheme="majorHAnsi"/&gt;&lt;w:b/&gt;&lt;/w:rPr&gt;&lt;/w:tblStylePr&gt;&lt;w:tblStylePr w:type="nwCell"&gt;&lt;w:pPr&gt;&lt;w:jc w:val="left"/&gt;&lt;/w:pPr&gt;&lt;w:tblPr/&gt;&lt;w:tcPr&gt;&lt;w:vAlign w:val="bottom"/&gt;&lt;/w:tcPr&gt;&lt;/w:tblStylePr&gt;&lt;/w:style&gt;&lt;w:style w:type="paragraph" w:customStyle="1" w:styleId="Tabletext"&gt;&lt;w:name w:val="Table text"/&gt;&lt;w:basedOn w:val="Normal"/&gt;&lt;w:uiPriority w:val="15"/&gt;&lt;w:rsid w:val="005F186C"/&gt;&lt;w:pPr&gt;&lt;w:spacing w:after="0" w:line="240" w:lineRule="auto"/&gt;&lt;/w:pPr&gt;&lt;w:rPr&gt;&lt;w:sz w:val="16"/&gt;&lt;/w:rPr&gt;&lt;/w:style&gt;&lt;w:style w:type="paragraph" w:customStyle="1" w:styleId="Tabletitle"&gt;&lt;w:name w:val="Table title"/&gt;&lt;w:basedOn w:val="Tabletext"/&gt;&lt;w:uiPriority w:val="15"/&gt;&lt;w:rsid w:val="00C5110E"/&gt;&lt;w:pPr&gt;&lt;w:framePr w:wrap="around" w:vAnchor="page" w:hAnchor="page" w:x="852" w:y="14176"/&gt;&lt;w:spacing w:before="40" w:after="40"/&gt;&lt;/w:pPr&gt;&lt;w:rPr&gt;&lt;w:b/&gt;&lt;w:color w:val="407077" w:themeColor="accent1"/&gt;&lt;/w:rPr&gt;&lt;/w:style&gt;&lt;w:style w:type="paragraph" w:customStyle="1" w:styleId="FootertitleWhite"&gt;&lt;w:name w:val="Footer title White"/&gt;&lt;w:basedOn w:val="Footertitle"/&gt;&lt;w:semiHidden/&gt;&lt;w:rsid w:val="000049A5"/&gt;&lt;w:pPr&gt;&lt;w:framePr w:wrap="around"/&gt;&lt;/w:pPr&gt;&lt;w:rPr&gt;&lt;w:bCs/&gt;&lt;w:color w:val="FFFFFF" w:themeColor="background1"/&gt;&lt;/w:rPr&gt;&lt;/w:style&gt;&lt;w:style w:type="paragraph" w:styleId="DocumentMap"&gt;&lt;w:name w:val="Document Map"/&gt;&lt;w:basedOn w:val="Normal"/&gt;&lt;w:link w:val="DocumentMapChar"/&gt;&lt;w:uiPriority w:val="99"/&gt;&lt;w:semiHidden/&gt;&lt;w:rsid w:val="00421476"/&gt;&lt;w:pPr&gt;&lt;w:spacing w:after="0"/&gt;&lt;/w:pPr&gt;&lt;w:rPr&gt;&lt;w:rFonts w:cs="Segoe UI"/&gt;&lt;w:sz w:val="16"/&gt;&lt;w:szCs w:val="16"/&gt;&lt;/w:rPr&gt;&lt;/w:style&gt;&lt;w:style w:type="character" w:customStyle="1" w:styleId="DocumentMapChar"&gt;&lt;w:name w:val="Document Map Char"/&gt;&lt;w:basedOn w:val="DefaultParagraphFont"/&gt;&lt;w:link w:val="DocumentMap"/&gt;&lt;w:uiPriority w:val="99"/&gt;&lt;w:semiHidden/&gt;&lt;w:rsid w:val="00421476"/&gt;&lt;w:rPr&gt;&lt;w:rFonts w:cs="Segoe UI"/&gt;&lt;w:sz w:val="16"/&gt;&lt;w:szCs w:val="16"/&gt;&lt;w:lang w:val="en-GB"/&gt;&lt;/w:rPr&gt;&lt;/w:style&gt;&lt;w:style w:type="character" w:styleId="HTMLSample"&gt;&lt;w:name w:val="HTML Sample"/&gt;&lt;w:basedOn w:val="DefaultParagraphFont"/&gt;&lt;w:uiPriority w:val="99"/&gt;&lt;w:semiHidden/&gt;&lt;w:unhideWhenUsed/&gt;&lt;w:rsid w:val="00421476"/&gt;&lt;w:rPr&gt;&lt;w:rFonts w:asciiTheme="minorHAnsi" w:hAnsiTheme="minorHAnsi"/&gt;&lt;w:sz w:val="24"/&gt;&lt;w:szCs w:val="24"/&gt;&lt;/w:rPr&gt;&lt;/w:style&gt;&lt;w:style w:type="paragraph" w:styleId="HTMLPreformatted"&gt;&lt;w:name w:val="HTML Preformatted"/&gt;&lt;w:basedOn w:val="Normal"/&gt;&lt;w:link w:val="HTMLPreformattedChar"/&gt;&lt;w:uiPriority w:val="99"/&gt;&lt;w:semiHidden/&gt;&lt;w:rsid w:val="00421476"/&gt;&lt;w:pPr&gt;&lt;w:spacing w:after="0"/&gt;&lt;/w:pPr&gt;&lt;w:rPr&gt;&lt;w:szCs w:val="20"/&gt;&lt;/w:rPr&gt;&lt;/w:style&gt;&lt;w:style w:type="character" w:customStyle="1" w:styleId="HTMLPreformattedChar"&gt;&lt;w:name w:val="HTML Preformatted Char"/&gt;&lt;w:basedOn w:val="DefaultParagraphFont"/&gt;&lt;w:link w:val="HTMLPreformatted"/&gt;&lt;w:uiPriority w:val="99"/&gt;&lt;w:semiHidden/&gt;&lt;w:rsid w:val="00421476"/&gt;&lt;w:rPr&gt;&lt;w:sz w:val="20"/&gt;&lt;w:szCs w:val="20"/&gt;&lt;w:lang w:val="en-GB"/&gt;&lt;/w:rPr&gt;&lt;/w:style&gt;&lt;w:style w:type="character" w:styleId="HTMLCode"&gt;&lt;w:name w:val="HTML Code"/&gt;&lt;w:basedOn w:val="DefaultParagraphFont"/&gt;&lt;w:uiPriority w:val="99"/&gt;&lt;w:semiHidden/&gt;&lt;w:rsid w:val="00421476"/&gt;&lt;w:rPr&gt;&lt;w:rFonts w:asciiTheme="minorHAnsi" w:hAnsiTheme="minorHAnsi"/&gt;&lt;w:sz w:val="20"/&gt;&lt;w:szCs w:val="20"/&gt;&lt;/w:rPr&gt;&lt;/w:style&gt;&lt;w:style w:type="character" w:styleId="HTMLTypewriter"&gt;&lt;w:name w:val="HTML Typewriter"/&gt;&lt;w:basedOn w:val="DefaultParagraphFont"/&gt;&lt;w:uiPriority w:val="99"/&gt;&lt;w:semiHidden/&gt;&lt;w:rsid w:val="00421476"/&gt;&lt;w:rPr&gt;&lt;w:rFonts w:asciiTheme="minorHAnsi" w:hAnsiTheme="minorHAnsi"/&gt;&lt;w:sz w:val="20"/&gt;&lt;w:szCs w:val="20"/&gt;&lt;/w:rPr&gt;&lt;/w:style&gt;&lt;w:style w:type="character" w:styleId="HTMLKeyboard"&gt;&lt;w:name w:val="HTML Keyboard"/&gt;&lt;w:basedOn w:val="DefaultParagraphFont"/&gt;&lt;w:uiPriority w:val="99"/&gt;&lt;w:semiHidden/&gt;&lt;w:rsid w:val="00421476"/&gt;&lt;w:rPr&gt;&lt;w:rFonts w:asciiTheme="minorHAnsi" w:hAnsiTheme="minorHAnsi"/&gt;&lt;w:sz w:val="20"/&gt;&lt;w:szCs w:val="20"/&gt;&lt;/w:rPr&gt;&lt;/w:style&gt;&lt;w:style w:type="paragraph" w:styleId="MacroText"&gt;&lt;w:name w:val="macro"/&gt;&lt;w:link w:val="MacroTextChar"/&gt;&lt;w:uiPriority w:val="99"/&gt;&lt;w:semiHidden/&gt;&lt;w:rsid w:val="00421476"/&gt;&lt;w:pPr&gt;&lt;w:tabs&gt;&lt;w:tab w:val="left" w:pos="480"/&gt;&lt;w:tab w:val="left" w:pos="960"/&gt;&lt;w:tab w:val="left" w:pos="1440"/&gt;&lt;w:tab w:val="left" w:pos="1920"/&gt;&lt;w:tab w:val="left" w:pos="2400"/&gt;&lt;w:tab w:val="left" w:pos="2880"/&gt;&lt;w:tab w:val="left" w:pos="3360"/&gt;&lt;w:tab w:val="left" w:pos="3840"/&gt;&lt;w:tab w:val="left" w:pos="4320"/&gt;&lt;/w:tabs&gt;&lt;w:spacing w:after="0" w:line="240" w:lineRule="auto"/&gt;&lt;/w:pPr&gt;&lt;w:rPr&gt;&lt;w:sz w:val="20"/&gt;&lt;w:szCs w:val="20"/&gt;&lt;w:lang w:val="en-GB"/&gt;&lt;/w:rPr&gt;&lt;/w:style&gt;&lt;w:style w:type="character" w:customStyle="1" w:styleId="MacroTextChar"&gt;&lt;w:name w:val="Macro Text Char"/&gt;&lt;w:basedOn w:val="DefaultParagraphFont"/&gt;&lt;w:link w:val="MacroText"/&gt;&lt;w:uiPriority w:val="99"/&gt;&lt;w:semiHidden/&gt;&lt;w:rsid w:val="00421476"/&gt;&lt;w:rPr&gt;&lt;w:sz w:val="20"/&gt;&lt;w:szCs w:val="20"/&gt;&lt;w:lang w:val="en-GB"/&gt;&lt;/w:rPr&gt;&lt;/w:style&gt;&lt;w:style w:type="paragraph" w:styleId="NormalWeb"&gt;&lt;w:name w:val="Normal (Web)"/&gt;&lt;w:basedOn w:val="Normal"/&gt;&lt;w:uiPriority w:val="99"/&gt;&lt;w:semiHidden/&gt;&lt;w:rsid w:val="00421476"/&gt;&lt;w:rPr&gt;&lt;w:rFonts w:cs="Times New Roman"/&gt;&lt;w:sz w:val="24"/&gt;&lt;w:szCs w:val="24"/&gt;&lt;/w:rPr&gt;&lt;/w:style&gt;&lt;w:style w:type="paragraph" w:styleId="PlainText"&gt;&lt;w:name w:val="Plain Text"/&gt;&lt;w:basedOn w:val="Normal"/&gt;&lt;w:link w:val="PlainTextChar"/&gt;&lt;w:uiPriority w:val="99"/&gt;&lt;w:semiHidden/&gt;&lt;w:rsid w:val="00421476"/&gt;&lt;w:pPr&gt;&lt;w:spacing w:after="0"/&gt;&lt;/w:pPr&gt;&lt;w:rPr&gt;&lt;w:sz w:val="21"/&gt;&lt;w:szCs w:val="21"/&gt;&lt;/w:rPr&gt;&lt;/w:style&gt;&lt;w:style w:type="character" w:customStyle="1" w:styleId="PlainTextChar"&gt;&lt;w:name w:val="Plain Text Char"/&gt;&lt;w:basedOn w:val="DefaultParagraphFont"/&gt;&lt;w:link w:val="PlainText"/&gt;&lt;w:uiPriority w:val="99"/&gt;&lt;w:semiHidden/&gt;&lt;w:rsid w:val="00421476"/&gt;&lt;w:rPr&gt;&lt;w:sz w:val="21"/&gt;&lt;w:szCs w:val="21"/&gt;&lt;w:lang w:val="en-GB"/&gt;&lt;/w:rPr&gt;&lt;/w:style&gt;&lt;w:style w:type="paragraph" w:customStyle="1" w:styleId="Name"&gt;&lt;w:name w:val="Name"/&gt;&lt;w:basedOn w:val="Normal"/&gt;&lt;w:next w:val="Normal"/&gt;&lt;w:uiPriority w:val="10"/&gt;&lt;w:rsid w:val="00C17BB4"/&gt;&lt;w:pPr&gt;&lt;w:spacing w:after="0" w:line="240" w:lineRule="auto"/&gt;&lt;/w:pPr&gt;&lt;w:rPr&gt;&lt;w:rFonts w:asciiTheme="majorHAnsi" w:hAnsiTheme="majorHAnsi"/&gt;&lt;/w:rPr&gt;&lt;/w:style&gt;&lt;w:style w:type="paragraph" w:customStyle="1" w:styleId="Info"&gt;&lt;w:name w:val="Info"/&gt;&lt;w:basedOn w:val="Normal"/&gt;&lt;w:uiPriority w:val="10"/&gt;&lt;w:rsid w:val="008B734D"/&gt;&lt;w:pPr&gt;&lt;w:spacing w:after="0" w:line="240" w:lineRule="auto"/&gt;&lt;/w:pPr&gt;&lt;/w:style&gt;&lt;/w:styles&gt;&lt;/pkg:xmlData&gt;&lt;/pkg:part&gt;&lt;pkg:part pkg:name="/word/glossary/fontTable.xml" pkg:contentType="application/vnd.openxmlformats-officedocument.wordprocessingml.fontTable+xml"&gt;&lt;pkg:xmlData&gt;&lt;w:fonts xmlns:mc="http://schemas.openxmlformats.org/markup-compatibility/2006" xmlns:r="http://schemas.openxmlformats.org/officeDocument/2006/relationships" xmlns:w="http://schemas.openxmlformats.org/wordprocessingml/2006/main" xmlns:w14="http://schemas.microsoft.com/office/word/2010/wordml" xmlns:w15="http://schemas.microsoft.com/office/word/2012/wordml" xmlns:w16se="http://schemas.microsoft.com/office/word/2015/wordml/symex" mc:Ignorable="w14 w15 w16se"/&gt;&lt;/pkg:xmlData&gt;&lt;/pkg:part&gt;&lt;pkg:part pkg:name="/word/glossary/webSettings.xml" pkg:contentType="application/vnd.openxmlformats-officedocument.wordprocessingml.webSettings+xml"&gt;&lt;pkg:xmlData&gt;&lt;w:webSettings xmlns:mc="http://schemas.openxmlformats.org/markup-compatibility/2006" xmlns:r="http://schemas.openxmlformats.org/officeDocument/2006/relationships" xmlns:w="http://schemas.openxmlformats.org/wordprocessingml/2006/main" xmlns:w14="http://schemas.microsoft.com/office/word/2010/wordml" xmlns:w15="http://schemas.microsoft.com/office/word/2012/wordml" xmlns:w16se="http://schemas.microsoft.com/office/word/2015/wordml/symex" mc:Ignorable="w14 w15 w16se"&gt;&lt;w:optimizeForBrowser/&gt;&lt;w:allowPNG/&gt;&lt;/w:webSettings&gt;&lt;/pkg:xmlData&gt;&lt;/pkg:part&gt;&lt;pkg:part pkg:name="/word/numbering.xml" pkg:contentType="application/vnd.openxmlformats-officedocument.wordprocessingml.numbering+xml"&gt;&lt;pkg:xmlData&gt;&lt;w:numbering xmlns:wpc="http://schemas.microsoft.com/office/word/2010/wordprocessingCanvas" xmlns:cx="http://schemas.microsoft.com/office/drawing/2014/chartex" xmlns:cx1="http://schemas.microsoft.com/office/drawing/2015/9/8/chartex" xmlns:cx2="http://schemas.microsoft.com/office/drawing/2015/10/21/chartex" xmlns:cx3="http://schemas.microsoft.com/office/drawing/2016/5/9/chartex" xmlns:cx4="http://schemas.microsoft.com/office/drawing/2016/5/10/chartex" xmlns:cx5="http://schemas.microsoft.com/office/drawing/2016/5/11/chartex" xmlns:cx6="http://schemas.microsoft.com/office/drawing/2016/5/12/chartex" xmlns:cx7="http://schemas.microsoft.com/office/drawing/2016/5/13/chartex" xmlns:cx8="http://schemas.microsoft.com/office/drawing/2016/5/14/chartex" xmlns:mc="http://schemas.openxmlformats.org/markup-compatibility/2006" xmlns:o="urn:schemas-microsoft-com:office:office" xmlns:r="http://schemas.openxmlformats.org/officeDocument/2006/relationships" xmlns:m="http://schemas.openxmlformats.org/officeDocument/2006/math" xmlns:v="urn:schemas-microsoft-com:vml" xmlns:wp14="http://schemas.microsoft.com/office/word/2010/wordprocessingDrawing" xmlns:wp="http://schemas.openxmlformats.org/drawingml/2006/wordprocessingDrawing" xmlns:w10="urn:schemas-microsoft-com:office:word" xmlns:w="http://schemas.openxmlformats.org/wordprocessingml/2006/main" xmlns:w14="http://schemas.microsoft.com/office/word/2010/wordml" xmlns:w15="http://schemas.microsoft.com/office/word/2012/wordml" xmlns:w16se="http://schemas.microsoft.com/office/word/2015/wordml/symex" xmlns:wpg="http://schemas.microsoft.com/office/word/2010/wordprocessingGroup" xmlns:wpi="http://schemas.microsoft.com/office/word/2010/wordprocessingInk" xmlns:wne="http://schemas.microsoft.com/office/word/2006/wordml" xmlns:wps="http://schemas.microsoft.com/office/word/2010/wordprocessingShape" mc:Ignorable="w14 w15 w16se wp14"&gt;&lt;w:abstractNum w:abstractNumId="0" w15:restartNumberingAfterBreak="0"&gt;&lt;w:nsid w:val="FFFFFF7C"/&gt;&lt;w:multiLevelType w:val="singleLevel"/&gt;&lt;w:tmpl w:val="1D6AD0EC"/&gt;&lt;w:lvl w:ilvl="0"&gt;&lt;w:start w:val="1"/&gt;&lt;w:numFmt w:val="decimal"/&gt;&lt;w:lvlText w:val="%1."/&gt;&lt;w:lvlJc w:val="left"/&gt;&lt;w:pPr&gt;&lt;w:tabs&gt;&lt;w:tab w:val="num" w:pos="1492"/&gt;&lt;/w:tabs&gt;&lt;w:ind w:left="1492" w:hanging="360"/&gt;&lt;/w:pPr&gt;&lt;/w:lvl&gt;&lt;/w:abstractNum&gt;&lt;w:abstractNum w:abstractNumId="1" w15:restartNumberingAfterBreak="0"&gt;&lt;w:nsid w:val="FFFFFF7D"/&gt;&lt;w:multiLevelType w:val="singleLevel"/&gt;&lt;w:tmpl w:val="6C44DE1A"/&gt;&lt;w:lvl w:ilvl="0"&gt;&lt;w:start w:val="1"/&gt;&lt;w:numFmt w:val="decimal"/&gt;&lt;w:lvlText w:val="%1."/&gt;&lt;w:lvlJc w:val="left"/&gt;&lt;w:pPr&gt;&lt;w:tabs&gt;&lt;w:tab w:val="num" w:pos="1209"/&gt;&lt;/w:tabs&gt;&lt;w:ind w:left="1209" w:hanging="360"/&gt;&lt;/w:pPr&gt;&lt;/w:lvl&gt;&lt;/w:abstractNum&gt;&lt;w:abstractNum w:abstractNumId="2" w15:restartNumberingAfterBreak="0"&gt;&lt;w:nsid w:val="FFFFFF7E"/&gt;&lt;w:multiLevelType w:val="singleLevel"/&gt;&lt;w:tmpl w:val="83748C94"/&gt;&lt;w:lvl w:ilvl="0"&gt;&lt;w:start w:val="1"/&gt;&lt;w:numFmt w:val="decimal"/&gt;&lt;w:lvlText w:val="%1."/&gt;&lt;w:lvlJc w:val="left"/&gt;&lt;w:pPr&gt;&lt;w:tabs&gt;&lt;w:tab w:val="num" w:pos="926"/&gt;&lt;/w:tabs&gt;&lt;w:ind w:left="926" w:hanging="360"/&gt;&lt;/w:pPr&gt;&lt;/w:lvl&gt;&lt;/w:abstractNum&gt;&lt;w:abstractNum w:abstractNumId="3" w15:restartNumberingAfterBreak="0"&gt;&lt;w:nsid w:val="FFFFFF7F"/&gt;&lt;w:multiLevelType w:val="singleLevel"/&gt;&lt;w:tmpl w:val="871A6F0C"/&gt;&lt;w:lvl w:ilvl="0"&gt;&lt;w:start w:val="1"/&gt;&lt;w:numFmt w:val="decimal"/&gt;&lt;w:lvlText w:val="%1."/&gt;&lt;w:lvlJc w:val="left"/&gt;&lt;w:pPr&gt;&lt;w:tabs&gt;&lt;w:tab w:val="num" w:pos="643"/&gt;&lt;/w:tabs&gt;&lt;w:ind w:left="643" w:hanging="360"/&gt;&lt;/w:pPr&gt;&lt;/w:lvl&gt;&lt;/w:abstractNum&gt;&lt;w:abstractNum w:abstractNumId="4" w15:restartNumberingAfterBreak="0"&gt;&lt;w:nsid w:val="FFFFFF80"/&gt;&lt;w:multiLevelType w:val="singleLevel"/&gt;&lt;w:tmpl w:val="ED1CE676"/&gt;&lt;w:lvl w:ilvl="0"&gt;&lt;w:start w:val="1"/&gt;&lt;w:numFmt w:val="bullet"/&gt;&lt;w:lvlText w:val=""/&gt;&lt;w:lvlJc w:val="left"/&gt;&lt;w:pPr&gt;&lt;w:tabs&gt;&lt;w:tab w:val="num" w:pos="1492"/&gt;&lt;/w:tabs&gt;&lt;w:ind w:left="1492" w:hanging="360"/&gt;&lt;/w:pPr&gt;&lt;w:rPr&gt;&lt;w:rFonts w:ascii="Symbol" w:hAnsi="Symbol" w:hint="default"/&gt;&lt;/w:rPr&gt;&lt;/w:lvl&gt;&lt;/w:abstractNum&gt;&lt;w:abstractNum w:abstractNumId="5" w15:restartNumberingAfterBreak="0"&gt;&lt;w:nsid w:val="FFFFFF81"/&gt;&lt;w:multiLevelType w:val="singleLevel"/&gt;&lt;w:tmpl w:val="DEF60714"/&gt;&lt;w:lvl w:ilvl="0"&gt;&lt;w:start w:val="1"/&gt;&lt;w:numFmt w:val="bullet"/&gt;&lt;w:lvlText w:val=""/&gt;&lt;w:lvlJc w:val="left"/&gt;&lt;w:pPr&gt;&lt;w:tabs&gt;&lt;w:tab w:val="num" w:pos="1209"/&gt;&lt;/w:tabs&gt;&lt;w:ind w:left="1209" w:hanging="360"/&gt;&lt;/w:pPr&gt;&lt;w:rPr&gt;&lt;w:rFonts w:ascii="Symbol" w:hAnsi="Symbol" w:hint="default"/&gt;&lt;/w:rPr&gt;&lt;/w:lvl&gt;&lt;/w:abstractNum&gt;&lt;w:abstractNum w:abstractNumId="6" w15:restartNumberingAfterBreak="0"&gt;&lt;w:nsid w:val="FFFFFF82"/&gt;&lt;w:multiLevelType w:val="singleLevel"/&gt;&lt;w:tmpl w:val="91EA47E8"/&gt;&lt;w:lvl w:ilvl="0"&gt;&lt;w:start w:val="1"/&gt;&lt;w:numFmt w:val="bullet"/&gt;&lt;w:lvlText w:val=""/&gt;&lt;w:lvlJc w:val="left"/&gt;&lt;w:pPr&gt;&lt;w:tabs&gt;&lt;w:tab w:val="num" w:pos="926"/&gt;&lt;/w:tabs&gt;&lt;w:ind w:left="926" w:hanging="360"/&gt;&lt;/w:pPr&gt;&lt;w:rPr&gt;&lt;w:rFonts w:ascii="Symbol" w:hAnsi="Symbol" w:hint="default"/&gt;&lt;/w:rPr&gt;&lt;/w:lvl&gt;&lt;/w:abstractNum&gt;&lt;w:abstractNum w:abstractNumId="7" w15:restartNumberingAfterBreak="0"&gt;&lt;w:nsid w:val="FFFFFF83"/&gt;&lt;w:multiLevelType w:val="singleLevel"/&gt;&lt;w:tmpl w:val="9278B09A"/&gt;&lt;w:lvl w:ilvl="0"&gt;&lt;w:start w:val="1"/&gt;&lt;w:numFmt w:val="bullet"/&gt;&lt;w:lvlText w:val=""/&gt;&lt;w:lvlJc w:val="left"/&gt;&lt;w:pPr&gt;&lt;w:tabs&gt;&lt;w:tab w:val="num" w:pos="643"/&gt;&lt;/w:tabs&gt;&lt;w:ind w:left="643" w:hanging="360"/&gt;&lt;/w:pPr&gt;&lt;w:rPr&gt;&lt;w:rFonts w:ascii="Symbol" w:hAnsi="Symbol" w:hint="default"/&gt;&lt;/w:rPr&gt;&lt;/w:lvl&gt;&lt;/w:abstractNum&gt;&lt;w:abstractNum w:abstractNumId="8" w15:restartNumberingAfterBreak="0"&gt;&lt;w:nsid w:val="17071BBC"/&gt;&lt;w:multiLevelType w:val="multilevel"/&gt;&lt;w:tmpl w:val="B512299C"/&gt;&lt;w:lvl w:ilvl="0"&gt;&lt;w:start w:val="1"/&gt;&lt;w:numFmt w:val="decimal"/&gt;&lt;w:pStyle w:val="ListNumber"/&gt;&lt;w:lvlText w:val="%1."/&gt;&lt;w:lvlJc w:val="left"/&gt;&lt;w:pPr&gt;&lt;w:ind w:left="360" w:hanging="360"/&gt;&lt;/w:pPr&gt;&lt;w:rPr&gt;&lt;w:rFonts w:hint="default"/&gt;&lt;/w:rPr&gt;&lt;/w:lvl&gt;&lt;w:lvl w:ilvl="1"&gt;&lt;w:start w:val="1"/&gt;&lt;w:numFmt w:val="lowerLetter"/&gt;&lt;w:pStyle w:val="ListNumber2"/&gt;&lt;w:lvlText w:val="%2."/&gt;&lt;w:lvlJc w:val="left"/&gt;&lt;w:pPr&gt;&lt;w:ind w:left="720" w:hanging="360"/&gt;&lt;/w:pPr&gt;&lt;w:rPr&gt;&lt;w:rFonts w:hint="default"/&gt;&lt;/w:rPr&gt;&lt;/w:lvl&gt;&lt;w:lvl w:ilvl="2"&gt;&lt;w:start w:val="1"/&gt;&lt;w:numFmt w:val="lowerRoman"/&gt;&lt;w:pStyle w:val="ListNumber3"/&gt;&lt;w:lvlText w:val="%3)"/&gt;&lt;w:lvlJc w:val="left"/&gt;&lt;w:pPr&gt;&lt;w:ind w:left="1080" w:hanging="360"/&gt;&lt;/w:pPr&gt;&lt;w:rPr&gt;&lt;w:rFonts w:hint="default"/&gt;&lt;/w:rPr&gt;&lt;/w:lvl&gt;&lt;w:lvl w:ilvl="3"&gt;&lt;w:start w:val="1"/&gt;&lt;w:numFmt w:val="decimal"/&gt;&lt;w:pStyle w:val="ListNumber4"/&gt;&lt;w:lvlText w:val="%4)"/&gt;&lt;w:lvlJc w:val="left"/&gt;&lt;w:pPr&gt;&lt;w:ind w:left="1440" w:hanging="360"/&gt;&lt;/w:pPr&gt;&lt;w:rPr&gt;&lt;w:rFonts w:hint="default"/&gt;&lt;/w:rPr&gt;&lt;/w:lvl&gt;&lt;w:lvl w:ilvl="4"&gt;&lt;w:start w:val="1"/&gt;&lt;w:numFmt w:val="lowerLetter"/&gt;&lt;w:pStyle w:val="ListNumber5"/&gt;&lt;w:lvlText w:val="%5)"/&gt;&lt;w:lvlJc w:val="left"/&gt;&lt;w:pPr&gt;&lt;w:ind w:left="1800" w:hanging="360"/&gt;&lt;/w:pPr&gt;&lt;w:rPr&gt;&lt;w:rFonts w:hint="default"/&gt;&lt;/w:rPr&gt;&lt;/w:lvl&gt;&lt;w:lvl w:ilvl="5"&gt;&lt;w:start w:val="1"/&gt;&lt;w:numFmt w:val="lowerRoman"/&gt;&lt;w:lvlText w:val="%6)"/&gt;&lt;w:lvlJc w:val="left"/&gt;&lt;w:pPr&gt;&lt;w:ind w:left="2160" w:hanging="360"/&gt;&lt;/w:pPr&gt;&lt;w:rPr&gt;&lt;w:rFonts w:hint="default"/&gt;&lt;/w:rPr&gt;&lt;/w:lvl&gt;&lt;w:lvl w:ilvl="6"&gt;&lt;w:start w:val="1"/&gt;&lt;w:numFmt w:val="decimal"/&gt;&lt;w:lvlText w:val="(%7)"/&gt;&lt;w:lvlJc w:val="left"/&gt;&lt;w:pPr&gt;&lt;w:ind w:left="2520" w:hanging="360"/&gt;&lt;/w:pPr&gt;&lt;w:rPr&gt;&lt;w:rFonts w:hint="default"/&gt;&lt;/w:rPr&gt;&lt;/w:lvl&gt;&lt;w:lvl w:ilvl="7"&gt;&lt;w:start w:val="1"/&gt;&lt;w:numFmt w:val="lowerLetter"/&gt;&lt;w:lvlText w:val="(%8)"/&gt;&lt;w:lvlJc w:val="left"/&gt;&lt;w:pPr&gt;&lt;w:ind w:left="2880" w:hanging="360"/&gt;&lt;/w:pPr&gt;&lt;w:rPr&gt;&lt;w:rFonts w:hint="default"/&gt;&lt;/w:rPr&gt;&lt;/w:lvl&gt;&lt;w:lvl w:ilvl="8"&gt;&lt;w:start w:val="1"/&gt;&lt;w:numFmt w:val="lowerRoman"/&gt;&lt;w:lvlText w:val="(%9)"/&gt;&lt;w:lvlJc w:val="left"/&gt;&lt;w:pPr&gt;&lt;w:ind w:left="3240" w:hanging="360"/&gt;&lt;/w:pPr&gt;&lt;w:rPr&gt;&lt;w:rFonts w:hint="default"/&gt;&lt;/w:rPr&gt;&lt;/w:lvl&gt;&lt;/w:abstractNum&gt;&lt;w:abstractNum w:abstractNumId="9" w15:restartNumberingAfterBreak="0"&gt;&lt;w:nsid w:val="3CE155D5"/&gt;&lt;w:multiLevelType w:val="multilevel"/&gt;&lt;w:tmpl w:val="041D001D"/&gt;&lt;w:lvl w:ilvl="0"&gt;&lt;w:start w:val="1"/&gt;&lt;w:numFmt w:val="decimal"/&gt;&lt;w:lvlText w:val="%1)"/&gt;&lt;w:lvlJc w:val="left"/&gt;&lt;w:pPr&gt;&lt;w:ind w:left="360" w:hanging="360"/&gt;&lt;/w:pPr&gt;&lt;/w:lvl&gt;&lt;w:lvl w:ilvl="1"&gt;&lt;w:start w:val="1"/&gt;&lt;w:numFmt w:val="lowerLetter"/&gt;&lt;w:lvlText w:val="%2)"/&gt;&lt;w:lvlJc w:val="left"/&gt;&lt;w:pPr&gt;&lt;w:ind w:left="720" w:hanging="360"/&gt;&lt;/w:pPr&gt;&lt;/w:lvl&gt;&lt;w:lvl w:ilvl="2"&gt;&lt;w:start w:val="1"/&gt;&lt;w:numFmt w:val="lowerRoman"/&gt;&lt;w:lvlText w:val="%3)"/&gt;&lt;w:lvlJc w:val="left"/&gt;&lt;w:pPr&gt;&lt;w:ind w:left="1080" w:hanging="360"/&gt;&lt;/w:pPr&gt;&lt;/w:lvl&gt;&lt;w:lvl w:ilvl="3"&gt;&lt;w:start w:val="1"/&gt;&lt;w:numFmt w:val="decimal"/&gt;&lt;w:lvlText w:val="(%4)"/&gt;&lt;w:lvlJc w:val="left"/&gt;&lt;w:pPr&gt;&lt;w:ind w:left="1440" w:hanging="360"/&gt;&lt;/w:pPr&gt;&lt;/w:lvl&gt;&lt;w:lvl w:ilvl="4"&gt;&lt;w:start w:val="1"/&gt;&lt;w:numFmt w:val="lowerLetter"/&gt;&lt;w:lvlText w:val="(%5)"/&gt;&lt;w:lvlJc w:val="left"/&gt;&lt;w:pPr&gt;&lt;w:ind w:left="1800" w:hanging="360"/&gt;&lt;/w:pPr&gt;&lt;/w:lvl&gt;&lt;w:lvl w:ilvl="5"&gt;&lt;w:start w:val="1"/&gt;&lt;w:numFmt w:val="lowerRoman"/&gt;&lt;w:lvlText w:val="(%6)"/&gt;&lt;w:lvlJc w:val="left"/&gt;&lt;w:pPr&gt;&lt;w:ind w:left="2160" w:hanging="360"/&gt;&lt;/w:pPr&gt;&lt;/w:lvl&gt;&lt;w:lvl w:ilvl="6"&gt;&lt;w:start w:val="1"/&gt;&lt;w:numFmt w:val="decimal"/&gt;&lt;w:lvlText w:val="%7."/&gt;&lt;w:lvlJc w:val="left"/&gt;&lt;w:pPr&gt;&lt;w:ind w:left="2520" w:hanging="360"/&gt;&lt;/w:pPr&gt;&lt;/w:lvl&gt;&lt;w:lvl w:ilvl="7"&gt;&lt;w:start w:val="1"/&gt;&lt;w:numFmt w:val="lowerLetter"/&gt;&lt;w:lvlText w:val="%8."/&gt;&lt;w:lvlJc w:val="left"/&gt;&lt;w:pPr&gt;&lt;w:ind w:left="2880" w:hanging="360"/&gt;&lt;/w:pPr&gt;&lt;/w:lvl&gt;&lt;w:lvl w:ilvl="8"&gt;&lt;w:start w:val="1"/&gt;&lt;w:numFmt w:val="lowerRoman"/&gt;&lt;w:lvlText w:val="%9."/&gt;&lt;w:lvlJc w:val="left"/&gt;&lt;w:pPr&gt;&lt;w:ind w:left="3240" w:hanging="360"/&gt;&lt;/w:pPr&gt;&lt;/w:lvl&gt;&lt;/w:abstractNum&gt;&lt;w:abstractNum w:abstractNumId="10" w15:restartNumberingAfterBreak="0"&gt;&lt;w:nsid w:val="3D727479"/&gt;&lt;w:multiLevelType w:val="multilevel"/&gt;&lt;w:tmpl w:val="041D0023"/&gt;&lt;w:lvl w:ilvl="0"&gt;&lt;w:start w:val="1"/&gt;&lt;w:numFmt w:val="upperRoman"/&gt;&lt;w:lvlText w:val="Artikel %1."/&gt;&lt;w:lvlJc w:val="left"/&gt;&lt;w:pPr&gt;&lt;w:ind w:left="0" w:firstLine="0"/&gt;&lt;/w:pPr&gt;&lt;/w:lvl&gt;&lt;w:lvl w:ilvl="1"&gt;&lt;w:start w:val="1"/&gt;&lt;w:numFmt w:val="decimalZero"/&gt;&lt;w:isLgl/&gt;&lt;w:lvlText w:val="Avsnitt %1.%2"/&gt;&lt;w:lvlJc w:val="left"/&gt;&lt;w:pPr&gt;&lt;w:ind w:left="0" w:firstLine="0"/&gt;&lt;/w:pPr&gt;&lt;/w:lvl&gt;&lt;w:lvl w:ilvl="2"&gt;&lt;w:start w:val="1"/&gt;&lt;w:numFmt w:val="lowerLetter"/&gt;&lt;w:lvlText w:val="(%3)"/&gt;&lt;w:lvlJc w:val="left"/&gt;&lt;w:pPr&gt;&lt;w:ind w:left="720" w:hanging="432"/&gt;&lt;/w:pPr&gt;&lt;/w:lvl&gt;&lt;w:lvl w:ilvl="3"&gt;&lt;w:start w:val="1"/&gt;&lt;w:numFmt w:val="lowerRoman"/&gt;&lt;w:lvlText w:val="(%4)"/&gt;&lt;w:lvlJc w:val="right"/&gt;&lt;w:pPr&gt;&lt;w:ind w:left="864" w:hanging="144"/&gt;&lt;/w:pPr&gt;&lt;/w:lvl&gt;&lt;w:lvl w:ilvl="4"&gt;&lt;w:start w:val="1"/&gt;&lt;w:numFmt w:val="decimal"/&gt;&lt;w:pStyle w:val="Heading5"/&gt;&lt;w:lvlText w:val="%5)"/&gt;&lt;w:lvlJc w:val="left"/&gt;&lt;w:pPr&gt;&lt;w:ind w:left="1008" w:hanging="432"/&gt;&lt;/w:pPr&gt;&lt;/w:lvl&gt;&lt;w:lvl w:ilvl="5"&gt;&lt;w:start w:val="1"/&gt;&lt;w:numFmt w:val="lowerLetter"/&gt;&lt;w:pStyle w:val="Heading6"/&gt;&lt;w:lvlText w:val="%6)"/&gt;&lt;w:lvlJc w:val="left"/&gt;&lt;w:pPr&gt;&lt;w:ind w:left="1152" w:hanging="432"/&gt;&lt;/w:pPr&gt;&lt;/w:lvl&gt;&lt;w:lvl w:ilvl="6"&gt;&lt;w:start w:val="1"/&gt;&lt;w:numFmt w:val="lowerRoman"/&gt;&lt;w:pStyle w:val="Heading7"/&gt;&lt;w:lvlText w:val="%7)"/&gt;&lt;w:lvlJc w:val="right"/&gt;&lt;w:pPr&gt;&lt;w:ind w:left="1296" w:hanging="288"/&gt;&lt;/w:pPr&gt;&lt;/w:lvl&gt;&lt;w:lvl w:ilvl="7"&gt;&lt;w:start w:val="1"/&gt;&lt;w:numFmt w:val="lowerLetter"/&gt;&lt;w:pStyle w:val="Heading8"/&gt;&lt;w:lvlText w:val="%8."/&gt;&lt;w:lvlJc w:val="left"/&gt;&lt;w:pPr&gt;&lt;w:ind w:left="1440" w:hanging="432"/&gt;&lt;/w:pPr&gt;&lt;/w:lvl&gt;&lt;w:lvl w:ilvl="8"&gt;&lt;w:start w:val="1"/&gt;&lt;w:numFmt w:val="lowerRoman"/&gt;&lt;w:pStyle w:val="Heading9"/&gt;&lt;w:lvlText w:val="%9."/&gt;&lt;w:lvlJc w:val="right"/&gt;&lt;w:pPr&gt;&lt;w:ind w:left="1584" w:hanging="144"/&gt;&lt;/w:pPr&gt;&lt;/w:lvl&gt;&lt;/w:abstractNum&gt;&lt;w:abstractNum w:abstractNumId="11" w15:restartNumberingAfterBreak="0"&gt;&lt;w:nsid w:val="43F95E9C"/&gt;&lt;w:multiLevelType w:val="multilevel"/&gt;&lt;w:tmpl w:val="5FAE225A"/&gt;&lt;w:lvl w:ilvl="0"&gt;&lt;w:start w:val="1"/&gt;&lt;w:numFmt w:val="decimal"/&gt;&lt;w:pStyle w:val="NumberedHeading1"/&gt;&lt;w:lvlText w:val="%1."/&gt;&lt;w:lvlJc w:val="left"/&gt;&lt;w:pPr&gt;&lt;w:ind w:left="907" w:hanging="907"/&gt;&lt;/w:pPr&gt;&lt;w:rPr&gt;&lt;w:rFonts w:hint="default"/&gt;&lt;/w:rPr&gt;&lt;/w:lvl&gt;&lt;w:lvl w:ilvl="1"&gt;&lt;w:start w:val="1"/&gt;&lt;w:numFmt w:val="decimal"/&gt;&lt;w:pStyle w:val="NumberedHeading2"/&gt;&lt;w:lvlText w:val="%1.%2"/&gt;&lt;w:lvlJc w:val="left"/&gt;&lt;w:pPr&gt;&lt;w:ind w:left="907" w:hanging="907"/&gt;&lt;/w:pPr&gt;&lt;w:rPr&gt;&lt;w:rFonts w:hint="default"/&gt;&lt;/w:rPr&gt;&lt;/w:lvl&gt;&lt;w:lvl w:ilvl="2"&gt;&lt;w:start w:val="1"/&gt;&lt;w:numFmt w:val="decimal"/&gt;&lt;w:pStyle w:val="NumberedHeading3"/&gt;&lt;w:lvlText w:val="%1.%2.%3"/&gt;&lt;w:lvlJc w:val="left"/&gt;&lt;w:pPr&gt;&lt;w:ind w:left="907" w:hanging="907"/&gt;&lt;/w:pPr&gt;&lt;w:rPr&gt;&lt;w:rFonts w:hint="default"/&gt;&lt;/w:rPr&gt;&lt;/w:lvl&gt;&lt;w:lvl w:ilvl="3"&gt;&lt;w:start w:val="1"/&gt;&lt;w:numFmt w:val="decimal"/&gt;&lt;w:pStyle w:val="NumberedHeading4"/&gt;&lt;w:lvlText w:val="%1.%2.%3.%4"/&gt;&lt;w:lvlJc w:val="left"/&gt;&lt;w:pPr&gt;&lt;w:ind w:left="907" w:hanging="907"/&gt;&lt;/w:pPr&gt;&lt;w:rPr&gt;&lt;w:rFonts w:hint="default"/&gt;&lt;/w:rPr&gt;&lt;/w:lvl&gt;&lt;w:lvl w:ilvl="4"&gt;&lt;w:start w:val="1"/&gt;&lt;w:numFmt w:val="lowerLetter"/&gt;&lt;w:lvlText w:val="(%5)"/&gt;&lt;w:lvlJc w:val="left"/&gt;&lt;w:pPr&gt;&lt;w:ind w:left="907" w:hanging="907"/&gt;&lt;/w:pPr&gt;&lt;w:rPr&gt;&lt;w:rFonts w:hint="default"/&gt;&lt;/w:rPr&gt;&lt;/w:lvl&gt;&lt;w:lvl w:ilvl="5"&gt;&lt;w:start w:val="1"/&gt;&lt;w:numFmt w:val="lowerRoman"/&gt;&lt;w:lvlText w:val="(%6)"/&gt;&lt;w:lvlJc w:val="left"/&gt;&lt;w:pPr&gt;&lt;w:ind w:left="907" w:hanging="907"/&gt;&lt;/w:pPr&gt;&lt;w:rPr&gt;&lt;w:rFonts w:hint="default"/&gt;&lt;/w:rPr&gt;&lt;/w:lvl&gt;&lt;w:lvl w:ilvl="6"&gt;&lt;w:start w:val="1"/&gt;&lt;w:numFmt w:val="decimal"/&gt;&lt;w:lvlText w:val="%7."/&gt;&lt;w:lvlJc w:val="left"/&gt;&lt;w:pPr&gt;&lt;w:ind w:left="907" w:hanging="907"/&gt;&lt;/w:pPr&gt;&lt;w:rPr&gt;&lt;w:rFonts w:hint="default"/&gt;&lt;/w:rPr&gt;&lt;/w:lvl&gt;&lt;w:lvl w:ilvl="7"&gt;&lt;w:start w:val="1"/&gt;&lt;w:numFmt w:val="lowerLetter"/&gt;&lt;w:lvlText w:val="%8."/&gt;&lt;w:lvlJc w:val="left"/&gt;&lt;w:pPr&gt;&lt;w:ind w:left="907" w:hanging="907"/&gt;&lt;/w:pPr&gt;&lt;w:rPr&gt;&lt;w:rFonts w:hint="default"/&gt;&lt;/w:rPr&gt;&lt;/w:lvl&gt;&lt;w:lvl w:ilvl="8"&gt;&lt;w:start w:val="1"/&gt;&lt;w:numFmt w:val="lowerRoman"/&gt;&lt;w:lvlText w:val="%9."/&gt;&lt;w:lvlJc w:val="left"/&gt;&lt;w:pPr&gt;&lt;w:ind w:left="907" w:hanging="907"/&gt;&lt;/w:pPr&gt;&lt;w:rPr&gt;&lt;w:rFonts w:hint="default"/&gt;&lt;/w:rPr&gt;&lt;/w:lvl&gt;&lt;/w:abstractNum&gt;&lt;w:abstractNum w:abstractNumId="12" w15:restartNumberingAfterBreak="0"&gt;&lt;w:nsid w:val="4CEF34F7"/&gt;&lt;w:multiLevelType w:val="multilevel"/&gt;&lt;w:tmpl w:val="041D001F"/&gt;&lt;w:lvl w:ilvl="0"&gt;&lt;w:start w:val="1"/&gt;&lt;w:numFmt w:val="decimal"/&gt;&lt;w:lvlText w:val="%1."/&gt;&lt;w:lvlJc w:val="left"/&gt;&lt;w:pPr&gt;&lt;w:ind w:left="360" w:hanging="360"/&gt;&lt;/w:pPr&gt;&lt;/w:lvl&gt;&lt;w:lvl w:ilvl="1"&gt;&lt;w:start w:val="1"/&gt;&lt;w:numFmt w:val="decimal"/&gt;&lt;w:lvlText w:val="%1.%2."/&gt;&lt;w:lvlJc w:val="left"/&gt;&lt;w:pPr&gt;&lt;w:ind w:left="792" w:hanging="432"/&gt;&lt;/w:pPr&gt;&lt;/w:lvl&gt;&lt;w:lvl w:ilvl="2"&gt;&lt;w:start w:val="1"/&gt;&lt;w:numFmt w:val="decimal"/&gt;&lt;w:lvlText w:val="%1.%2.%3."/&gt;&lt;w:lvlJc w:val="left"/&gt;&lt;w:pPr&gt;&lt;w:ind w:left="1224" w:hanging="504"/&gt;&lt;/w:pPr&gt;&lt;/w:lvl&gt;&lt;w:lvl w:ilvl="3"&gt;&lt;w:start w:val="1"/&gt;&lt;w:numFmt w:val="decimal"/&gt;&lt;w:lvlText w:val="%1.%2.%3.%4."/&gt;&lt;w:lvlJc w:val="left"/&gt;&lt;w:pPr&gt;&lt;w:ind w:left="1728" w:hanging="648"/&gt;&lt;/w:pPr&gt;&lt;/w:lvl&gt;&lt;w:lvl w:ilvl="4"&gt;&lt;w:start w:val="1"/&gt;&lt;w:numFmt w:val="decimal"/&gt;&lt;w:lvlText w:val="%1.%2.%3.%4.%5."/&gt;&lt;w:lvlJc w:val="left"/&gt;&lt;w:pPr&gt;&lt;w:ind w:left="2232" w:hanging="792"/&gt;&lt;/w:pPr&gt;&lt;/w:lvl&gt;&lt;w:lvl w:ilvl="5"&gt;&lt;w:start w:val="1"/&gt;&lt;w:numFmt w:val="decimal"/&gt;&lt;w:lvlText w:val="%1.%2.%3.%4.%5.%6."/&gt;&lt;w:lvlJc w:val="left"/&gt;&lt;w:pPr&gt;&lt;w:ind w:left="2736" w:hanging="936"/&gt;&lt;/w:pPr&gt;&lt;/w:lvl&gt;&lt;w:lvl w:ilvl="6"&gt;&lt;w:start w:val="1"/&gt;&lt;w:numFmt w:val="decimal"/&gt;&lt;w:lvlText w:val="%1.%2.%3.%4.%5.%6.%7."/&gt;&lt;w:lvlJc w:val="left"/&gt;&lt;w:pPr&gt;&lt;w:ind w:left="3240" w:hanging="1080"/&gt;&lt;/w:pPr&gt;&lt;/w:lvl&gt;&lt;w:lvl w:ilvl="7"&gt;&lt;w:start w:val="1"/&gt;&lt;w:numFmt w:val="decimal"/&gt;&lt;w:lvlText w:val="%1.%2.%3.%4.%5.%6.%7.%8."/&gt;&lt;w:lvlJc w:val="left"/&gt;&lt;w:pPr&gt;&lt;w:ind w:left="3744" w:hanging="1224"/&gt;&lt;/w:pPr&gt;&lt;/w:lvl&gt;&lt;w:lvl w:ilvl="8"&gt;&lt;w:start w:val="1"/&gt;&lt;w:numFmt w:val="decimal"/&gt;&lt;w:lvlText w:val="%1.%2.%3.%4.%5.%6.%7.%8.%9."/&gt;&lt;w:lvlJc w:val="left"/&gt;&lt;w:pPr&gt;&lt;w:ind w:left="4320" w:hanging="1440"/&gt;&lt;/w:pPr&gt;&lt;/w:lvl&gt;&lt;/w:abstractNum&gt;&lt;w:abstractNum w:abstractNumId="13" w15:restartNumberingAfterBreak="0"&gt;&lt;w:nsid w:val="566F2E6D"/&gt;&lt;w:multiLevelType w:val="multilevel"/&gt;&lt;w:tmpl w:val="6FD4AAFC"/&gt;&lt;w:lvl w:ilvl="0"&gt;&lt;w:start w:val="1"/&gt;&lt;w:numFmt w:val="bullet"/&gt;&lt;w:pStyle w:val="ListBullet"/&gt;&lt;w:lvlText w:val="—"/&gt;&lt;w:lvlJc w:val="left"/&gt;&lt;w:pPr&gt;&lt;w:ind w:left="360" w:hanging="360"/&gt;&lt;/w:pPr&gt;&lt;w:rPr&gt;&lt;w:rFonts w:ascii="Calibri" w:hAnsi="Calibri" w:hint="default"/&gt;&lt;w:color w:val="auto"/&gt;&lt;/w:rPr&gt;&lt;/w:lvl&gt;&lt;w:lvl w:ilvl="1"&gt;&lt;w:start w:val="1"/&gt;&lt;w:numFmt w:val="bullet"/&gt;&lt;w:pStyle w:val="ListBullet2"/&gt;&lt;w:lvlText w:val="—"/&gt;&lt;w:lvlJc w:val="left"/&gt;&lt;w:pPr&gt;&lt;w:ind w:left="720" w:hanging="360"/&gt;&lt;/w:pPr&gt;&lt;w:rPr&gt;&lt;w:rFonts w:ascii="Calibri" w:hAnsi="Calibri" w:hint="default"/&gt;&lt;w:color w:val="auto"/&gt;&lt;/w:rPr&gt;&lt;/w:lvl&gt;&lt;w:lvl w:ilvl="2"&gt;&lt;w:start w:val="1"/&gt;&lt;w:numFmt w:val="bullet"/&gt;&lt;w:pStyle w:val="ListBullet3"/&gt;&lt;w:lvlText w:val="—"/&gt;&lt;w:lvlJc w:val="left"/&gt;&lt;w:pPr&gt;&lt;w:ind w:left="1080" w:hanging="360"/&gt;&lt;/w:pPr&gt;&lt;w:rPr&gt;&lt;w:rFonts w:ascii="Calibri" w:hAnsi="Calibri" w:hint="default"/&gt;&lt;w:color w:val="auto"/&gt;&lt;/w:rPr&gt;&lt;/w:lvl&gt;&lt;w:lvl w:ilvl="3"&gt;&lt;w:start w:val="1"/&gt;&lt;w:numFmt w:val="bullet"/&gt;&lt;w:pStyle w:val="ListBullet4"/&gt;&lt;w:lvlText w:val="—"/&gt;&lt;w:lvlJc w:val="left"/&gt;&lt;w:pPr&gt;&lt;w:ind w:left="1440" w:hanging="360"/&gt;&lt;/w:pPr&gt;&lt;w:rPr&gt;&lt;w:rFonts w:ascii="Calibri" w:hAnsi="Calibri" w:hint="default"/&gt;&lt;w:color w:val="auto"/&gt;&lt;/w:rPr&gt;&lt;/w:lvl&gt;&lt;w:lvl w:ilvl="4"&gt;&lt;w:start w:val="1"/&gt;&lt;w:numFmt w:val="bullet"/&gt;&lt;w:pStyle w:val="ListBullet5"/&gt;&lt;w:lvlText w:val="—"/&gt;&lt;w:lvlJc w:val="left"/&gt;&lt;w:pPr&gt;&lt;w:ind w:left="1800" w:hanging="360"/&gt;&lt;/w:pPr&gt;&lt;w:rPr&gt;&lt;w:rFonts w:ascii="Calibri" w:hAnsi="Calibri" w:hint="default"/&gt;&lt;w:color w:val="auto"/&gt;&lt;/w:rPr&gt;&lt;/w:lvl&gt;&lt;w:lvl w:ilvl="5"&gt;&lt;w:start w:val="1"/&gt;&lt;w:numFmt w:val="bullet"/&gt;&lt;w:lvlText w:val="»"/&gt;&lt;w:lvlJc w:val="left"/&gt;&lt;w:pPr&gt;&lt;w:ind w:left="2160" w:hanging="360"/&gt;&lt;/w:pPr&gt;&lt;w:rPr&gt;&lt;w:rFonts w:ascii="Calibri" w:hAnsi="Calibri" w:hint="default"/&gt;&lt;w:color w:val="auto"/&gt;&lt;/w:rPr&gt;&lt;/w:lvl&gt;&lt;w:lvl w:ilvl="6"&gt;&lt;w:start w:val="1"/&gt;&lt;w:numFmt w:val="bullet"/&gt;&lt;w:lvlText w:val="•"/&gt;&lt;w:lvlJc w:val="left"/&gt;&lt;w:pPr&gt;&lt;w:ind w:left="2520" w:hanging="360"/&gt;&lt;/w:pPr&gt;&lt;w:rPr&gt;&lt;w:rFonts w:ascii="Calibri" w:hAnsi="Calibri" w:hint="default"/&gt;&lt;w:color w:val="auto"/&gt;&lt;/w:rPr&gt;&lt;/w:lvl&gt;&lt;w:lvl w:ilvl="7"&gt;&lt;w:start w:val="1"/&gt;&lt;w:numFmt w:val="bullet"/&gt;&lt;w:lvlText w:val="–"/&gt;&lt;w:lvlJc w:val="left"/&gt;&lt;w:pPr&gt;&lt;w:ind w:left="2880" w:hanging="360"/&gt;&lt;/w:pPr&gt;&lt;w:rPr&gt;&lt;w:rFonts w:ascii="Calibri" w:hAnsi="Calibri" w:hint="default"/&gt;&lt;w:color w:val="auto"/&gt;&lt;/w:rPr&gt;&lt;/w:lvl&gt;&lt;w:lvl w:ilvl="8"&gt;&lt;w:start w:val="1"/&gt;&lt;w:numFmt w:val="bullet"/&gt;&lt;w:lvlText w:val="»"/&gt;&lt;w:lvlJc w:val="left"/&gt;&lt;w:pPr&gt;&lt;w:ind w:left="3240" w:hanging="360"/&gt;&lt;/w:pPr&gt;&lt;w:rPr&gt;&lt;w:rFonts w:ascii="Calibri" w:hAnsi="Calibri" w:hint="default"/&gt;&lt;w:color w:val="auto"/&gt;&lt;/w:rPr&gt;&lt;/w:lvl&gt;&lt;/w:abstractNum&gt;&lt;w:num w:numId="1"&gt;&lt;w:abstractNumId w:val="13"/&gt;&lt;/w:num&gt;&lt;w:num w:numId="2"&gt;&lt;w:abstractNumId w:val="7"/&gt;&lt;/w:num&gt;&lt;w:num w:numId="3"&gt;&lt;w:abstractNumId w:val="6"/&gt;&lt;/w:num&gt;&lt;w:num w:numId="4"&gt;&lt;w:abstractNumId w:val="5"/&gt;&lt;/w:num&gt;&lt;w:num w:numId="5"&gt;&lt;w:abstractNumId w:val="4"/&gt;&lt;/w:num&gt;&lt;w:num w:numId="6"&gt;&lt;w:abstractNumId w:val="8"/&gt;&lt;/w:num&gt;&lt;w:num w:numId="7"&gt;&lt;w:abstractNumId w:val="3"/&gt;&lt;/w:num&gt;&lt;w:num w:numId="8"&gt;&lt;w:abstractNumId w:val="2"/&gt;&lt;/w:num&gt;&lt;w:num w:numId="9"&gt;&lt;w:abstractNumId w:val="1"/&gt;&lt;/w:num&gt;&lt;w:num w:numId="10"&gt;&lt;w:abstractNumId w:val="0"/&gt;&lt;/w:num&gt;&lt;w:num w:numId="11"&gt;&lt;w:abstractNumId w:val="13"/&gt;&lt;w:lvlOverride w:ilvl="0"&gt;&lt;w:startOverride w:val="1"/&gt;&lt;/w:lvlOverride&gt;&lt;w:lvlOverride w:ilvl="1"&gt;&lt;w:startOverride w:val="1"/&gt;&lt;/w:lvlOverride&gt;&lt;w:lvlOverride w:ilvl="2"&gt;&lt;w:startOverride w:val="1"/&gt;&lt;/w:lvlOverride&gt;&lt;w:lvlOverride w:ilvl="3"&gt;&lt;w:startOverride w:val="1"/&gt;&lt;/w:lvlOverride&gt;&lt;w:lvlOverride w:ilvl="4"&gt;&lt;w:startOverride w:val="1"/&gt;&lt;/w:lvlOverride&gt;&lt;w:lvlOverride w:ilvl="5"&gt;&lt;w:startOverride w:val="1"/&gt;&lt;/w:lvlOverride&gt;&lt;w:lvlOverride w:ilvl="6"&gt;&lt;w:startOverride w:val="1"/&gt;&lt;/w:lvlOverride&gt;&lt;w:lvlOverride w:ilvl="7"&gt;&lt;w:startOverride w:val="1"/&gt;&lt;/w:lvlOverride&gt;&lt;w:lvlOverride w:ilvl="8"&gt;&lt;w:startOverride w:val="1"/&gt;&lt;/w:lvlOverride&gt;&lt;/w:num&gt;&lt;w:num w:numId="12"&gt;&lt;w:abstractNumId w:val="11"/&gt;&lt;/w:num&gt;&lt;w:num w:numId="13"&gt;&lt;w:abstractNumId w:val="12"/&gt;&lt;/w:num&gt;&lt;w:num w:numId="14"&gt;&lt;w:abstractNumId w:val="9"/&gt;&lt;/w:num&gt;&lt;w:num w:numId="15"&gt;&lt;w:abstractNumId w:val="10"/&gt;&lt;/w:num&gt;&lt;/w:numbering&gt;&lt;/pkg:xmlData&gt;&lt;/pkg:part&gt;&lt;/pkg:package&gt;
+</Titel>
+      <TelefonPersonlig>
+			</TelefonPersonlig>
+      <EmailPersonlig>
+			</EmailPersonlig>
+    </Personinfo>
+  </KontaktuppgifterForetag>
+  <KontaktuppgifterKund>
+    <ForetagKund>
+		</ForetagKund>
+    <OrgnrKund>
+		</OrgnrKund>
+    <TelefonKund>
+		</TelefonKund>
+    <EmailKund>
+		</EmailKund>
+    <BesoksadressKund>
+		</BesoksadressKund>
+    <PostAdressKund>
+		</PostAdressKund>
+    <GataKund>
+		</GataKund>
+    <PostnummerKund>
+		</PostnummerKund>
+    <OrtKund>
+		</OrtKund>
+    <PersoninfoKund>
+      <NamnKund>
+			</NamnKund>
+      <TitelKund>
+			</TitelKund>
+      <TelefonPersonligKund>
+			</TelefonPersonligKund>
+      <EmailPersonligKund>
+			</EmailPersonligKund>
+    </PersoninfoKund>
+  </KontaktuppgifterKund>
+  <Rapportinfo>
+    <Ar>
+		</Ar>
+    <Kvartal>
+		</Kvartal>
+    <Period>
+		</Period>
+    <Manad>
+		</Manad>
+    <Nuvarandemanad>
+		</Nuvarandemanad>
+    <Foregaendemanad>
+		</Foregaendemanad>
+    <Rapportdatum>
+		</Rapportdatum>
+  </Rapportinfo>
+  <Ekonomiinfo>
+    <Belopp>
+		</Belopp>
+    <Summa>
+		</Summa>
+  </Ekonomiinfo>
+</Rehngruppen10>
 </file>
 
 <file path=customXml/item5.xml><?xml version="1.0" encoding="utf-8"?>
@@ -5630,20 +5599,14 @@
 </file>
 
 <file path=customXml/itemProps1.xml><?xml version="1.0" encoding="utf-8"?>
-<ds:datastoreItem xmlns:ds="http://schemas.openxmlformats.org/officeDocument/2006/customXml" ds:itemID="{DC7B2992-90CA-4E95-80E1-2EC82D6CF75B}">
-  <ds:schemaRefs/>
+<ds:datastoreItem xmlns:ds="http://schemas.openxmlformats.org/officeDocument/2006/customXml" ds:itemID="{B27EFCFB-0056-415F-B00A-D74C21B6EF32}">
+  <ds:schemaRefs>
+    <ds:schemaRef ds:uri="http://schemas.microsoft.com/sharepoint/v3/contenttype/forms"/>
+  </ds:schemaRefs>
 </ds:datastoreItem>
 </file>
 
 <file path=customXml/itemProps2.xml><?xml version="1.0" encoding="utf-8"?>
-<ds:datastoreItem xmlns:ds="http://schemas.openxmlformats.org/officeDocument/2006/customXml" ds:itemID="{54068D82-7AFB-438D-9B71-7781E6651574}">
-  <ds:schemaRefs>
-    <ds:schemaRef ds:uri="http://schemas.openxmlformats.org/officeDocument/2006/bibliography"/>
-  </ds:schemaRefs>
-</ds:datastoreItem>
-</file>
-
-<file path=customXml/itemProps3.xml><?xml version="1.0" encoding="utf-8"?>
 <ds:datastoreItem xmlns:ds="http://schemas.openxmlformats.org/officeDocument/2006/customXml" ds:itemID="{6DE2568F-F1C0-4003-AA94-181BEEC2A763}">
   <ds:schemaRefs>
     <ds:schemaRef ds:uri="http://schemas.microsoft.com/office/2006/metadata/contentType"/>
@@ -5662,11 +5625,17 @@
 </ds:datastoreItem>
 </file>
 
+<file path=customXml/itemProps3.xml><?xml version="1.0" encoding="utf-8"?>
+<ds:datastoreItem xmlns:ds="http://schemas.openxmlformats.org/officeDocument/2006/customXml" ds:itemID="{54068D82-7AFB-438D-9B71-7781E6651574}">
+  <ds:schemaRefs>
+    <ds:schemaRef ds:uri="http://schemas.openxmlformats.org/officeDocument/2006/bibliography"/>
+  </ds:schemaRefs>
+</ds:datastoreItem>
+</file>
+
 <file path=customXml/itemProps4.xml><?xml version="1.0" encoding="utf-8"?>
-<ds:datastoreItem xmlns:ds="http://schemas.openxmlformats.org/officeDocument/2006/customXml" ds:itemID="{B27EFCFB-0056-415F-B00A-D74C21B6EF32}">
-  <ds:schemaRefs>
-    <ds:schemaRef ds:uri="http://schemas.microsoft.com/sharepoint/v3/contenttype/forms"/>
-  </ds:schemaRefs>
+<ds:datastoreItem xmlns:ds="http://schemas.openxmlformats.org/officeDocument/2006/customXml" ds:itemID="{DC7B2992-90CA-4E95-80E1-2EC82D6CF75B}">
+  <ds:schemaRefs/>
 </ds:datastoreItem>
 </file>
 

</xml_diff>

<commit_message>
Updated the reference listing and mind map
Made the reference list in alphabetical order like the one on Zotero to reduce confusion wen moving to collections and tags
</commit_message>
<xml_diff>
--- a/About.docx
+++ b/About.docx
@@ -42,15 +42,39 @@
           <w:b/>
           <w:bCs/>
         </w:rPr>
-        <w:t>What my mini-dissertation would be about</w:t>
-      </w:r>
-    </w:p>
-    <w:p>
-      <w:pPr>
-        <w:spacing w:after="160"/>
-      </w:pPr>
-      <w:r>
-        <w:t>In this mini-dissertation, I will build the same Mini Jira full-stack application but implement the backend in two different ways: a monolithic architecture and a modular/layered architecture. Both versions will support the same functionality (projects, issues, comments, authentication, and validation) so that the comparison is fair. The focus will be to evaluate how monolithic vs modular architecture impacts maintainability, development complexity, performance, and ease of testing. I will collect evidence using automated tests (unit and integration tests, plus selected end-to-end flows), CI pipelines for consistent test execution, and practical code metrics such as complexity and change impact when adding a new feature.</w:t>
+        <w:t xml:space="preserve">What my </w:t>
+      </w:r>
+      <w:proofErr w:type="gramStart"/>
+      <w:r>
+        <w:rPr>
+          <w:b/>
+          <w:bCs/>
+        </w:rPr>
+        <w:t>mini-dissertation</w:t>
+      </w:r>
+      <w:proofErr w:type="gramEnd"/>
+      <w:r>
+        <w:rPr>
+          <w:b/>
+          <w:bCs/>
+        </w:rPr>
+        <w:t xml:space="preserve"> would be about</w:t>
+      </w:r>
+    </w:p>
+    <w:p>
+      <w:pPr>
+        <w:spacing w:after="160"/>
+      </w:pPr>
+      <w:r>
+        <w:t xml:space="preserve">In this mini-dissertation, I will build the same Mini Jira full-stack application but implement the backend in two </w:t>
+      </w:r>
+      <w:proofErr w:type="gramStart"/>
+      <w:r>
+        <w:t>different ways</w:t>
+      </w:r>
+      <w:proofErr w:type="gramEnd"/>
+      <w:r>
+        <w:t>: a monolithic architecture and a modular/layered architecture. Both versions will support the same functionality (projects, issues, comments, authentication, and validation) so that the comparison is fair. The focus will be to evaluate how monolithic vs modular architecture impacts maintainability, development complexity, performance, and ease of testing. I will collect evidence using automated tests (unit and integration tests, plus selected end-to-end flows), CI pipelines for consistent test execution, and practical code metrics such as complexity and change impact when adding a new feature.</w:t>
       </w:r>
     </w:p>
     <w:p>
@@ -82,8 +106,17 @@
           <w:b/>
           <w:bCs/>
         </w:rPr>
-        <w:t>Define the comparison setup</w:t>
-      </w:r>
+        <w:t xml:space="preserve">Define the comparison </w:t>
+      </w:r>
+      <w:proofErr w:type="gramStart"/>
+      <w:r>
+        <w:rPr>
+          <w:b/>
+          <w:bCs/>
+        </w:rPr>
+        <w:t>setup</w:t>
+      </w:r>
+      <w:proofErr w:type="gramEnd"/>
     </w:p>
     <w:p>
       <w:pPr>
@@ -122,8 +155,17 @@
           <w:b/>
           <w:bCs/>
         </w:rPr>
-        <w:t>Design shared requirements</w:t>
-      </w:r>
+        <w:t xml:space="preserve">Design shared </w:t>
+      </w:r>
+      <w:proofErr w:type="gramStart"/>
+      <w:r>
+        <w:rPr>
+          <w:b/>
+          <w:bCs/>
+        </w:rPr>
+        <w:t>requirements</w:t>
+      </w:r>
+      <w:proofErr w:type="gramEnd"/>
     </w:p>
     <w:p>
       <w:pPr>
@@ -162,8 +204,17 @@
           <w:b/>
           <w:bCs/>
         </w:rPr>
-        <w:t>Build the front-end once</w:t>
-      </w:r>
+        <w:t xml:space="preserve">Build the front-end </w:t>
+      </w:r>
+      <w:proofErr w:type="gramStart"/>
+      <w:r>
+        <w:rPr>
+          <w:b/>
+          <w:bCs/>
+        </w:rPr>
+        <w:t>once</w:t>
+      </w:r>
+      <w:proofErr w:type="gramEnd"/>
     </w:p>
     <w:p>
       <w:pPr>
@@ -307,8 +358,17 @@
           <w:b/>
           <w:bCs/>
         </w:rPr>
-        <w:t>Create a shared test suite</w:t>
-      </w:r>
+        <w:t xml:space="preserve">Create a shared test </w:t>
+      </w:r>
+      <w:proofErr w:type="gramStart"/>
+      <w:r>
+        <w:rPr>
+          <w:b/>
+          <w:bCs/>
+        </w:rPr>
+        <w:t>suite</w:t>
+      </w:r>
+      <w:proofErr w:type="gramEnd"/>
     </w:p>
     <w:p>
       <w:pPr>
@@ -359,8 +419,17 @@
           <w:b/>
           <w:bCs/>
         </w:rPr>
-        <w:t>Add CI pipelines</w:t>
-      </w:r>
+        <w:t xml:space="preserve">Add CI </w:t>
+      </w:r>
+      <w:proofErr w:type="gramStart"/>
+      <w:r>
+        <w:rPr>
+          <w:b/>
+          <w:bCs/>
+        </w:rPr>
+        <w:t>pipelines</w:t>
+      </w:r>
+      <w:proofErr w:type="gramEnd"/>
     </w:p>
     <w:p>
       <w:pPr>
@@ -383,7 +452,15 @@
         <w:spacing w:after="160"/>
       </w:pPr>
       <w:r>
-        <w:t>Ensure results are recorded and comparable.</w:t>
+        <w:t xml:space="preserve">Ensure results </w:t>
+      </w:r>
+      <w:proofErr w:type="gramStart"/>
+      <w:r>
+        <w:t>are recorded</w:t>
+      </w:r>
+      <w:proofErr w:type="gramEnd"/>
+      <w:r>
+        <w:t xml:space="preserve"> and comparable.</w:t>
       </w:r>
     </w:p>
     <w:p>
@@ -399,8 +476,17 @@
           <w:b/>
           <w:bCs/>
         </w:rPr>
-        <w:t>Run evaluation experiments</w:t>
-      </w:r>
+        <w:t xml:space="preserve">Run evaluation </w:t>
+      </w:r>
+      <w:proofErr w:type="gramStart"/>
+      <w:r>
+        <w:rPr>
+          <w:b/>
+          <w:bCs/>
+        </w:rPr>
+        <w:t>experiments</w:t>
+      </w:r>
+      <w:proofErr w:type="gramEnd"/>
     </w:p>
     <w:p>
       <w:pPr>
@@ -449,7 +535,15 @@
         <w:t>Maintainability</w:t>
       </w:r>
       <w:r>
-        <w:t xml:space="preserve"> (complexity metrics, how many files change for a new feature)</w:t>
+        <w:t xml:space="preserve"> (complexity metrics, how </w:t>
+      </w:r>
+      <w:proofErr w:type="gramStart"/>
+      <w:r>
+        <w:t>many</w:t>
+      </w:r>
+      <w:proofErr w:type="gramEnd"/>
+      <w:r>
+        <w:t xml:space="preserve"> files change for a new feature)</w:t>
       </w:r>
     </w:p>
     <w:p>
@@ -487,7 +581,15 @@
         <w:t>Ease of testing</w:t>
       </w:r>
       <w:r>
-        <w:t xml:space="preserve"> (how quickly and cleanly logic can be unit tested)</w:t>
+        <w:t xml:space="preserve"> (how quickly and cleanly logic can be unit </w:t>
+      </w:r>
+      <w:proofErr w:type="gramStart"/>
+      <w:r>
+        <w:t>tested</w:t>
+      </w:r>
+      <w:proofErr w:type="gramEnd"/>
+      <w:r>
+        <w:t>)</w:t>
       </w:r>
     </w:p>
     <w:p>
@@ -503,8 +605,17 @@
           <w:b/>
           <w:bCs/>
         </w:rPr>
-        <w:t>Add a controlled “change request”</w:t>
-      </w:r>
+        <w:t xml:space="preserve">Add a controlled “change </w:t>
+      </w:r>
+      <w:proofErr w:type="gramStart"/>
+      <w:r>
+        <w:rPr>
+          <w:b/>
+          <w:bCs/>
+        </w:rPr>
+        <w:t>request”</w:t>
+      </w:r>
+      <w:proofErr w:type="gramEnd"/>
     </w:p>
     <w:p>
       <w:pPr>
@@ -653,7 +764,15 @@
         <w:spacing w:after="160"/>
       </w:pPr>
       <w:r>
-        <w:t>RQ3: How does architecture influence testability, measured by unit-test coverage of business logic, integration test stability, and the effort required to isolate and test core rules?</w:t>
+        <w:t xml:space="preserve">RQ3: How does architecture influence testability, measured by unit-test coverage of business logic, integration test stability, and the effort required to isolate and </w:t>
+      </w:r>
+      <w:proofErr w:type="gramStart"/>
+      <w:r>
+        <w:t>test</w:t>
+      </w:r>
+      <w:proofErr w:type="gramEnd"/>
+      <w:r>
+        <w:t xml:space="preserve"> core rules?</w:t>
       </w:r>
     </w:p>
     <w:p>
@@ -679,10 +798,396 @@
         <w:spacing w:after="160"/>
       </w:pPr>
       <w:r>
-        <w:t>[1]</w:t>
-      </w:r>
-      <w:r>
-        <w:t xml:space="preserve"> L. F. Al-</w:t>
+        <w:t xml:space="preserve">[1] H. Mumtaz, P. Singh, and K. Blincoe, “A Systematic Mapping Study on Architectural Smells Detection,” </w:t>
+      </w:r>
+      <w:r>
+        <w:rPr>
+          <w:i/>
+          <w:iCs/>
+        </w:rPr>
+        <w:t>Journal of Systems and Software</w:t>
+      </w:r>
+      <w:r>
+        <w:t xml:space="preserve">, vol. 173, Art. no. 110885, 2021, </w:t>
+      </w:r>
+      <w:proofErr w:type="spellStart"/>
+      <w:r>
+        <w:t>doi</w:t>
+      </w:r>
+      <w:proofErr w:type="spellEnd"/>
+      <w:r>
+        <w:t>: 10.1016/j.jss.2020.110885.</w:t>
+      </w:r>
+    </w:p>
+    <w:p>
+      <w:pPr>
+        <w:spacing w:after="160"/>
+      </w:pPr>
+      <w:r>
+        <w:t xml:space="preserve">[2] P. Rachow and M. Riebisch, “An Architecture Smell Knowledge Base for Managing Architecture Technical Debt,” in </w:t>
+      </w:r>
+      <w:r>
+        <w:rPr>
+          <w:i/>
+          <w:iCs/>
+        </w:rPr>
+        <w:t>Proc. IEEE/ACM Int. Conf. on Technical Debt (</w:t>
+      </w:r>
+      <w:proofErr w:type="spellStart"/>
+      <w:r>
+        <w:rPr>
+          <w:i/>
+          <w:iCs/>
+        </w:rPr>
+        <w:t>TechDebt</w:t>
+      </w:r>
+      <w:proofErr w:type="spellEnd"/>
+      <w:r>
+        <w:rPr>
+          <w:i/>
+          <w:iCs/>
+        </w:rPr>
+        <w:t>)</w:t>
+      </w:r>
+      <w:r>
+        <w:t xml:space="preserve">, pp. 1–10, 2022, </w:t>
+      </w:r>
+      <w:proofErr w:type="spellStart"/>
+      <w:r>
+        <w:t>doi</w:t>
+      </w:r>
+      <w:proofErr w:type="spellEnd"/>
+      <w:r>
+        <w:t>: 10.1145/3524843.3528092.</w:t>
+      </w:r>
+    </w:p>
+    <w:p>
+      <w:pPr>
+        <w:spacing w:after="160"/>
+      </w:pPr>
+      <w:r>
+        <w:t xml:space="preserve">[3] R. Jolak, S. Karlsson, and F. </w:t>
+      </w:r>
+      <w:proofErr w:type="spellStart"/>
+      <w:r>
+        <w:t>Dobslaw</w:t>
+      </w:r>
+      <w:proofErr w:type="spellEnd"/>
+      <w:r>
+        <w:t xml:space="preserve">, “An Empirical Investigation of the Impact of Architectural Smells on Software Maintainability,” </w:t>
+      </w:r>
+      <w:r>
+        <w:rPr>
+          <w:i/>
+          <w:iCs/>
+        </w:rPr>
+        <w:t>Journal of Systems and Software</w:t>
+      </w:r>
+      <w:r>
+        <w:t xml:space="preserve">, vol. 225, Art. no. 112382, 2025, </w:t>
+      </w:r>
+      <w:proofErr w:type="spellStart"/>
+      <w:r>
+        <w:t>doi</w:t>
+      </w:r>
+      <w:proofErr w:type="spellEnd"/>
+      <w:r>
+        <w:t>: 10.1016/j.jss.2025.112382.</w:t>
+      </w:r>
+    </w:p>
+    <w:p>
+      <w:pPr>
+        <w:spacing w:after="160"/>
+      </w:pPr>
+      <w:r>
+        <w:t xml:space="preserve">[4] A. J. J. Tan, C. Y. Chong, and A. </w:t>
+      </w:r>
+      <w:proofErr w:type="spellStart"/>
+      <w:r>
+        <w:t>Aleti</w:t>
+      </w:r>
+      <w:proofErr w:type="spellEnd"/>
+      <w:r>
+        <w:t xml:space="preserve">, “Closing the Loop for Software </w:t>
+      </w:r>
+      <w:proofErr w:type="spellStart"/>
+      <w:r>
+        <w:t>Remodularisation</w:t>
+      </w:r>
+      <w:proofErr w:type="spellEnd"/>
+      <w:r>
+        <w:t xml:space="preserve"> – REARRANGE: An Effort Estimation Approach for Software Clustering-Based </w:t>
+      </w:r>
+      <w:proofErr w:type="spellStart"/>
+      <w:r>
+        <w:t>Remodularisation</w:t>
+      </w:r>
+      <w:proofErr w:type="spellEnd"/>
+      <w:r>
+        <w:t xml:space="preserve">,” in </w:t>
+      </w:r>
+      <w:r>
+        <w:rPr>
+          <w:i/>
+          <w:iCs/>
+        </w:rPr>
+        <w:t>Companion Proc. IEEE/ACM Int. Conf. on Software Engineering (ICSE-Companion)</w:t>
+      </w:r>
+      <w:r>
+        <w:t xml:space="preserve">, 2023, pp. 326–327, </w:t>
+      </w:r>
+      <w:proofErr w:type="spellStart"/>
+      <w:r>
+        <w:t>doi</w:t>
+      </w:r>
+      <w:proofErr w:type="spellEnd"/>
+      <w:r>
+        <w:t>: 10.1109/ICSE-Companion58688.2023.00090.</w:t>
+      </w:r>
+    </w:p>
+    <w:p>
+      <w:pPr>
+        <w:spacing w:after="160"/>
+      </w:pPr>
+      <w:r>
+        <w:t xml:space="preserve">[5] G.-D. Schwarz, F. Quast, and D. Riehle, “Ensuring Syntactic Interoperability Using Consumer-Driven Contract Testing,” </w:t>
+      </w:r>
+      <w:r>
+        <w:rPr>
+          <w:i/>
+          <w:iCs/>
+        </w:rPr>
+        <w:t>Software Testing, Verification and Reliability</w:t>
+      </w:r>
+      <w:r>
+        <w:t xml:space="preserve">, 2025, </w:t>
+      </w:r>
+      <w:proofErr w:type="spellStart"/>
+      <w:r>
+        <w:t>doi</w:t>
+      </w:r>
+      <w:proofErr w:type="spellEnd"/>
+      <w:r>
+        <w:t>: 10.1002/stvr.70006.</w:t>
+      </w:r>
+    </w:p>
+    <w:p>
+      <w:pPr>
+        <w:spacing w:after="160"/>
+      </w:pPr>
+      <w:r>
+        <w:t xml:space="preserve">[6] P. </w:t>
+      </w:r>
+      <w:proofErr w:type="spellStart"/>
+      <w:r>
+        <w:t>Gnoyke</w:t>
+      </w:r>
+      <w:proofErr w:type="spellEnd"/>
+      <w:r>
+        <w:t xml:space="preserve">, S. Schulze, and J. Krüger, “Evolution Patterns of Software-Architecture Smells: An Empirical Study of Intra- and Inter-Version Smells,” </w:t>
+      </w:r>
+      <w:r>
+        <w:rPr>
+          <w:i/>
+          <w:iCs/>
+        </w:rPr>
+        <w:t>Journal of Systems and Software</w:t>
+      </w:r>
+      <w:r>
+        <w:t xml:space="preserve">, vol. 217, Art. no. 112170, 2024, </w:t>
+      </w:r>
+      <w:proofErr w:type="spellStart"/>
+      <w:r>
+        <w:t>doi</w:t>
+      </w:r>
+      <w:proofErr w:type="spellEnd"/>
+      <w:r>
+        <w:t>: 10.1016/j.jss.2024.112170.</w:t>
+      </w:r>
+    </w:p>
+    <w:p>
+      <w:pPr>
+        <w:spacing w:after="160"/>
+      </w:pPr>
+      <w:r>
+        <w:t xml:space="preserve">[7] D. Sas, P. </w:t>
+      </w:r>
+      <w:proofErr w:type="spellStart"/>
+      <w:r>
+        <w:t>Avgeriou</w:t>
+      </w:r>
+      <w:proofErr w:type="spellEnd"/>
+      <w:r>
+        <w:t xml:space="preserve">, R. </w:t>
+      </w:r>
+      <w:proofErr w:type="spellStart"/>
+      <w:r>
+        <w:t>Kruizinga</w:t>
+      </w:r>
+      <w:proofErr w:type="spellEnd"/>
+      <w:r>
+        <w:t xml:space="preserve">, and R. Scheedler, “Exploring the Relation Between Co-changes and Architectural Smells,” </w:t>
+      </w:r>
+      <w:r>
+        <w:rPr>
+          <w:i/>
+          <w:iCs/>
+        </w:rPr>
+        <w:t>SN Computer Science</w:t>
+      </w:r>
+      <w:r>
+        <w:t xml:space="preserve">, 2021, </w:t>
+      </w:r>
+      <w:proofErr w:type="spellStart"/>
+      <w:r>
+        <w:t>doi</w:t>
+      </w:r>
+      <w:proofErr w:type="spellEnd"/>
+      <w:r>
+        <w:t>: 10.1007/s42979-020-00407-5.</w:t>
+      </w:r>
+    </w:p>
+    <w:p>
+      <w:pPr>
+        <w:spacing w:after="160"/>
+      </w:pPr>
+      <w:r>
+        <w:lastRenderedPageBreak/>
+        <w:t xml:space="preserve">[8] N. Naveen, R. Singh, and A. </w:t>
+      </w:r>
+      <w:proofErr w:type="spellStart"/>
+      <w:r>
+        <w:t>Rathee</w:t>
+      </w:r>
+      <w:proofErr w:type="spellEnd"/>
+      <w:r>
+        <w:t xml:space="preserve">, “Improving Software Modularity Using Software </w:t>
+      </w:r>
+      <w:proofErr w:type="spellStart"/>
+      <w:r>
+        <w:t>Remodularization</w:t>
+      </w:r>
+      <w:proofErr w:type="spellEnd"/>
+      <w:r>
+        <w:t xml:space="preserve">: Challenges and Opportunities,” </w:t>
+      </w:r>
+      <w:r>
+        <w:rPr>
+          <w:i/>
+          <w:iCs/>
+        </w:rPr>
+        <w:t>ITM Web of Conferences</w:t>
+      </w:r>
+      <w:r>
+        <w:t xml:space="preserve">, vol. 54, Art. no. 01008, 2023, </w:t>
+      </w:r>
+      <w:proofErr w:type="spellStart"/>
+      <w:r>
+        <w:t>doi</w:t>
+      </w:r>
+      <w:proofErr w:type="spellEnd"/>
+      <w:r>
+        <w:t>: 10.1051/</w:t>
+      </w:r>
+      <w:proofErr w:type="spellStart"/>
+      <w:r>
+        <w:t>itmconf</w:t>
+      </w:r>
+      <w:proofErr w:type="spellEnd"/>
+      <w:r>
+        <w:t>/20235401008.</w:t>
+      </w:r>
+    </w:p>
+    <w:p>
+      <w:pPr>
+        <w:spacing w:after="160"/>
+      </w:pPr>
+      <w:r>
+        <w:t xml:space="preserve">[9] E. Pisch, Y. Cai, R. </w:t>
+      </w:r>
+      <w:proofErr w:type="spellStart"/>
+      <w:r>
+        <w:t>Kazman</w:t>
+      </w:r>
+      <w:proofErr w:type="spellEnd"/>
+      <w:r>
+        <w:t xml:space="preserve">, J. Lefever, and H. Fang, “M-score: An Empirically Derived Software Modularity Metric,” in </w:t>
+      </w:r>
+      <w:r>
+        <w:rPr>
+          <w:i/>
+          <w:iCs/>
+        </w:rPr>
+        <w:t>Proc. ACM/IEEE Int. Symp. on Empirical Software Engineering and Measurement (ESEM)</w:t>
+      </w:r>
+      <w:r>
+        <w:t xml:space="preserve">, pp. 382–392, 2024, </w:t>
+      </w:r>
+      <w:proofErr w:type="spellStart"/>
+      <w:r>
+        <w:t>doi</w:t>
+      </w:r>
+      <w:proofErr w:type="spellEnd"/>
+      <w:r>
+        <w:t>: 10.1145/3674805.3686697.</w:t>
+      </w:r>
+    </w:p>
+    <w:p>
+      <w:pPr>
+        <w:spacing w:after="160"/>
+      </w:pPr>
+      <w:r>
+        <w:t xml:space="preserve">[10] R. Su and X. Li, “Modular Monolith: Is This the Trend in Software </w:t>
+      </w:r>
+      <w:proofErr w:type="gramStart"/>
+      <w:r>
+        <w:t>Architecture?,</w:t>
+      </w:r>
+      <w:proofErr w:type="gramEnd"/>
+      <w:r>
+        <w:t xml:space="preserve">” in </w:t>
+      </w:r>
+      <w:r>
+        <w:rPr>
+          <w:i/>
+          <w:iCs/>
+        </w:rPr>
+        <w:t>Proc. 1st Int. Workshop on New Trends in Software Architecture (</w:t>
+      </w:r>
+      <w:proofErr w:type="spellStart"/>
+      <w:r>
+        <w:rPr>
+          <w:i/>
+          <w:iCs/>
+        </w:rPr>
+        <w:t>SATrends</w:t>
+      </w:r>
+      <w:proofErr w:type="spellEnd"/>
+      <w:r>
+        <w:rPr>
+          <w:i/>
+          <w:iCs/>
+        </w:rPr>
+        <w:t xml:space="preserve"> ’24)</w:t>
+      </w:r>
+      <w:r>
+        <w:t xml:space="preserve">, 2024, </w:t>
+      </w:r>
+      <w:proofErr w:type="spellStart"/>
+      <w:r>
+        <w:t>doi</w:t>
+      </w:r>
+      <w:proofErr w:type="spellEnd"/>
+      <w:r>
+        <w:t>: 10.1145/3643657.3643911.</w:t>
+      </w:r>
+    </w:p>
+    <w:p>
+      <w:pPr>
+        <w:spacing w:after="160"/>
+      </w:pPr>
+      <w:r>
+        <w:t>[11] L. F. Al-</w:t>
       </w:r>
       <w:proofErr w:type="spellStart"/>
       <w:r>
@@ -708,63 +1213,83 @@
       </w:r>
       <w:proofErr w:type="spellEnd"/>
       <w:r>
-        <w:t xml:space="preserve">: 10.3390/fi17110496. </w:t>
-      </w:r>
-    </w:p>
-    <w:p>
-      <w:pPr>
-        <w:spacing w:after="160"/>
-      </w:pPr>
-      <w:r>
-        <w:t>[2]</w:t>
-      </w:r>
-      <w:r>
-        <w:t xml:space="preserve"> R. Su and X. Li, “Modular Monolith: Is This the Trend in Software Architecture?,” in </w:t>
+        <w:t>: 10.3390/fi17110496.</w:t>
+      </w:r>
+    </w:p>
+    <w:p>
+      <w:pPr>
+        <w:spacing w:after="160"/>
+      </w:pPr>
+      <w:r>
+        <w:t xml:space="preserve">[12] M. Esposito, M. Robredo, F. </w:t>
+      </w:r>
+      <w:proofErr w:type="spellStart"/>
+      <w:r>
+        <w:t>Arcelli</w:t>
+      </w:r>
+      <w:proofErr w:type="spellEnd"/>
+      <w:r>
+        <w:t xml:space="preserve"> Fontana, and V. Lenarduzzi, “On the Correlation Between Architectural Smells and Static Analysis Warnings,” </w:t>
       </w:r>
       <w:r>
         <w:rPr>
           <w:i/>
           <w:iCs/>
         </w:rPr>
-        <w:t>Proc. 1st Int. Workshop on New Trends in Software Architecture (</w:t>
+        <w:t>Software Quality Journal</w:t>
+      </w:r>
+      <w:r>
+        <w:t xml:space="preserve">, 2025, </w:t>
       </w:r>
       <w:proofErr w:type="spellStart"/>
+      <w:r>
+        <w:t>doi</w:t>
+      </w:r>
+      <w:proofErr w:type="spellEnd"/>
+      <w:r>
+        <w:t>: 10.1007/s11219-025-09730-7.</w:t>
+      </w:r>
+    </w:p>
+    <w:p>
+      <w:pPr>
+        <w:spacing w:after="160"/>
+      </w:pPr>
+      <w:r>
+        <w:t xml:space="preserve">[13] O. Özkan, C. Babur, and B. </w:t>
+      </w:r>
+      <w:proofErr w:type="spellStart"/>
+      <w:r>
+        <w:t>Tekinerdogan</w:t>
+      </w:r>
+      <w:proofErr w:type="spellEnd"/>
+      <w:r>
+        <w:t xml:space="preserve">, “Refactoring with Domain-Driven Design in an Industrial Context: An Action Research Report,” </w:t>
+      </w:r>
       <w:r>
         <w:rPr>
           <w:i/>
           <w:iCs/>
         </w:rPr>
-        <w:t>SATrends</w:t>
+        <w:t>Empirical Software Engineering</w:t>
+      </w:r>
+      <w:r>
+        <w:t xml:space="preserve">, 2023, </w:t>
+      </w:r>
+      <w:proofErr w:type="spellStart"/>
+      <w:r>
+        <w:t>doi</w:t>
       </w:r>
       <w:proofErr w:type="spellEnd"/>
       <w:r>
-        <w:rPr>
-          <w:i/>
-          <w:iCs/>
-        </w:rPr>
-        <w:t xml:space="preserve"> ’24)</w:t>
-      </w:r>
-      <w:r>
-        <w:t xml:space="preserve">, 2024, </w:t>
-      </w:r>
-      <w:proofErr w:type="spellStart"/>
-      <w:r>
-        <w:t>doi</w:t>
-      </w:r>
-      <w:proofErr w:type="spellEnd"/>
-      <w:r>
-        <w:t xml:space="preserve">: 10.1145/3643657.3643911. </w:t>
-      </w:r>
-    </w:p>
-    <w:p>
-      <w:pPr>
-        <w:spacing w:after="160"/>
-      </w:pPr>
-      <w:r>
-        <w:t xml:space="preserve">[3] </w:t>
-      </w:r>
-      <w:r>
-        <w:t xml:space="preserve">C. Schröder, A. van der Feltz, A. Panichella, and M. </w:t>
+        <w:t>: 10.1007/s10664-023-10310-1.</w:t>
+      </w:r>
+    </w:p>
+    <w:p>
+      <w:pPr>
+        <w:spacing w:after="160"/>
+      </w:pPr>
+      <w:r>
+        <w:t xml:space="preserve">[14] C. Schröder, A. van der Feltz, A. Panichella, and M. </w:t>
       </w:r>
       <w:proofErr w:type="spellStart"/>
       <w:r>
@@ -798,167 +1323,7 @@
         <w:spacing w:after="160"/>
       </w:pPr>
       <w:r>
-        <w:t>[4]</w:t>
-      </w:r>
-      <w:r>
-        <w:t xml:space="preserve"> E. Pisch, Y. Cai, R. </w:t>
-      </w:r>
-      <w:proofErr w:type="spellStart"/>
-      <w:r>
-        <w:t>Kazman</w:t>
-      </w:r>
-      <w:proofErr w:type="spellEnd"/>
-      <w:r>
-        <w:t xml:space="preserve">, J. Lefever, and H. Fang, “M-score: An Empirically Derived Software Modularity Metric,” in </w:t>
-      </w:r>
-      <w:r>
-        <w:rPr>
-          <w:i/>
-          <w:iCs/>
-        </w:rPr>
-        <w:t>Proc. ACM/IEEE Int. Symp. on Empirical Software Engineering and Measurement (ESEM)</w:t>
-      </w:r>
-      <w:r>
-        <w:t xml:space="preserve">, pp. 382–392, 2024, </w:t>
-      </w:r>
-      <w:proofErr w:type="spellStart"/>
-      <w:r>
-        <w:t>doi</w:t>
-      </w:r>
-      <w:proofErr w:type="spellEnd"/>
-      <w:r>
-        <w:t xml:space="preserve">: 10.1145/3674805.3686697. </w:t>
-      </w:r>
-    </w:p>
-    <w:p>
-      <w:pPr>
-        <w:spacing w:after="160"/>
-      </w:pPr>
-      <w:r>
-        <w:t>[5]</w:t>
-      </w:r>
-      <w:r>
-        <w:t xml:space="preserve"> P. Rachow and M. Riebisch, “An Architecture Smell Knowledge Base for Managing Architecture Technical Debt,” in </w:t>
-      </w:r>
-      <w:r>
-        <w:rPr>
-          <w:i/>
-          <w:iCs/>
-        </w:rPr>
-        <w:t>Proc. IEEE/ACM Int. Conf. on Technical Debt (</w:t>
-      </w:r>
-      <w:proofErr w:type="spellStart"/>
-      <w:r>
-        <w:rPr>
-          <w:i/>
-          <w:iCs/>
-        </w:rPr>
-        <w:t>TechDebt</w:t>
-      </w:r>
-      <w:proofErr w:type="spellEnd"/>
-      <w:r>
-        <w:rPr>
-          <w:i/>
-          <w:iCs/>
-        </w:rPr>
-        <w:t>)</w:t>
-      </w:r>
-      <w:r>
-        <w:t xml:space="preserve">, pp. 1–10, 2022, </w:t>
-      </w:r>
-      <w:proofErr w:type="spellStart"/>
-      <w:r>
-        <w:t>doi</w:t>
-      </w:r>
-      <w:proofErr w:type="spellEnd"/>
-      <w:r>
-        <w:t xml:space="preserve">: 10.1145/3524843.3528092. </w:t>
-      </w:r>
-    </w:p>
-    <w:p>
-      <w:pPr>
-        <w:spacing w:after="160"/>
-      </w:pPr>
-      <w:r>
-        <w:t>[6]</w:t>
-      </w:r>
-      <w:r>
-        <w:t xml:space="preserve"> P. </w:t>
-      </w:r>
-      <w:proofErr w:type="spellStart"/>
-      <w:r>
-        <w:t>Gnoyke</w:t>
-      </w:r>
-      <w:proofErr w:type="spellEnd"/>
-      <w:r>
-        <w:t xml:space="preserve">, S. Schulze, and J. Krüger, “Evolution Patterns of Software-Architecture Smells: An Empirical Study of Intra- and Inter-Version Smells,” </w:t>
-      </w:r>
-      <w:r>
-        <w:rPr>
-          <w:i/>
-          <w:iCs/>
-        </w:rPr>
-        <w:t>Journal of Systems and Software</w:t>
-      </w:r>
-      <w:r>
-        <w:t xml:space="preserve">, vol. 217, Art. no. 112170, 2024, </w:t>
-      </w:r>
-      <w:proofErr w:type="spellStart"/>
-      <w:r>
-        <w:t>doi</w:t>
-      </w:r>
-      <w:proofErr w:type="spellEnd"/>
-      <w:r>
-        <w:t xml:space="preserve">: 10.1016/j.jss.2024.112170. </w:t>
-      </w:r>
-    </w:p>
-    <w:p>
-      <w:pPr>
-        <w:spacing w:after="160"/>
-      </w:pPr>
-      <w:r>
-        <w:t>[7]</w:t>
-      </w:r>
-      <w:r>
-        <w:t xml:space="preserve"> R. Jolak, S. Karlsson, and F. </w:t>
-      </w:r>
-      <w:proofErr w:type="spellStart"/>
-      <w:r>
-        <w:t>Dobslaw</w:t>
-      </w:r>
-      <w:proofErr w:type="spellEnd"/>
-      <w:r>
-        <w:t xml:space="preserve">, “An Empirical Investigation of the Impact of Architectural Smells on Software Maintainability,” </w:t>
-      </w:r>
-      <w:r>
-        <w:rPr>
-          <w:i/>
-          <w:iCs/>
-        </w:rPr>
-        <w:t>Journal of Systems and Software</w:t>
-      </w:r>
-      <w:r>
-        <w:t xml:space="preserve">, vol. 225, Art. no. 112382, 2025, </w:t>
-      </w:r>
-      <w:proofErr w:type="spellStart"/>
-      <w:r>
-        <w:t>doi</w:t>
-      </w:r>
-      <w:proofErr w:type="spellEnd"/>
-      <w:r>
-        <w:t xml:space="preserve">: 10.1016/j.jss.2025.112382. </w:t>
-      </w:r>
-    </w:p>
-    <w:p>
-      <w:pPr>
-        <w:spacing w:after="160"/>
-      </w:pPr>
-      <w:r>
-        <w:lastRenderedPageBreak/>
-        <w:t>[8]</w:t>
-      </w:r>
-      <w:r>
-        <w:t xml:space="preserve"> L. da S. Sousa, W. </w:t>
+        <w:t xml:space="preserve">[15] L. da S. Sousa, W. </w:t>
       </w:r>
       <w:proofErr w:type="spellStart"/>
       <w:r>
@@ -992,293 +1357,7 @@
       </w:r>
       <w:proofErr w:type="spellEnd"/>
       <w:r>
-        <w:t xml:space="preserve">: 10.1145/3387904.3389276. </w:t>
-      </w:r>
-    </w:p>
-    <w:p>
-      <w:pPr>
-        <w:spacing w:after="160"/>
-      </w:pPr>
-      <w:r>
-        <w:t>[9]</w:t>
-      </w:r>
-      <w:r>
-        <w:t xml:space="preserve"> H. Mumtaz, P. Singh, and K. Blincoe, “A Systematic Mapping Study on Architectural Smells Detection,” </w:t>
-      </w:r>
-      <w:r>
-        <w:rPr>
-          <w:i/>
-          <w:iCs/>
-        </w:rPr>
-        <w:t>Journal of Systems and Software</w:t>
-      </w:r>
-      <w:r>
-        <w:t xml:space="preserve">, vol. 173, Art. no. 110885, 2021, </w:t>
-      </w:r>
-      <w:proofErr w:type="spellStart"/>
-      <w:r>
-        <w:t>doi</w:t>
-      </w:r>
-      <w:proofErr w:type="spellEnd"/>
-      <w:r>
-        <w:t xml:space="preserve">: 10.1016/j.jss.2020.110885. </w:t>
-      </w:r>
-    </w:p>
-    <w:p>
-      <w:pPr>
-        <w:spacing w:after="160"/>
-      </w:pPr>
-      <w:r>
-        <w:t>[10]</w:t>
-      </w:r>
-      <w:r>
-        <w:t xml:space="preserve"> </w:t>
-      </w:r>
-      <w:r>
-        <w:t xml:space="preserve">A. J. J. Tan, C. Y. Chong, and A. </w:t>
-      </w:r>
-      <w:proofErr w:type="spellStart"/>
-      <w:r>
-        <w:t>Aleti</w:t>
-      </w:r>
-      <w:proofErr w:type="spellEnd"/>
-      <w:r>
-        <w:t xml:space="preserve">, “Closing the Loop for Software </w:t>
-      </w:r>
-      <w:proofErr w:type="spellStart"/>
-      <w:r>
-        <w:t>Remodularisation</w:t>
-      </w:r>
-      <w:proofErr w:type="spellEnd"/>
-      <w:r>
-        <w:t xml:space="preserve"> – REARRANGE: An Effort Estimation Approach for Software Clustering-Based </w:t>
-      </w:r>
-      <w:proofErr w:type="spellStart"/>
-      <w:r>
-        <w:t>Remodularisation</w:t>
-      </w:r>
-      <w:proofErr w:type="spellEnd"/>
-      <w:r>
-        <w:t xml:space="preserve">,” in </w:t>
-      </w:r>
-      <w:r>
-        <w:rPr>
-          <w:i/>
-          <w:iCs/>
-        </w:rPr>
-        <w:t>Companion Proc. IEEE/ACM Int. Conf. on Software Engineering (ICSE-Companion)</w:t>
-      </w:r>
-      <w:r>
-        <w:t xml:space="preserve">, 2023, pp. 326–327, </w:t>
-      </w:r>
-      <w:proofErr w:type="spellStart"/>
-      <w:r>
-        <w:t>doi</w:t>
-      </w:r>
-      <w:proofErr w:type="spellEnd"/>
-      <w:r>
-        <w:t>: 10.1109/ICSE-Companion58688.2023.00090.</w:t>
-      </w:r>
-    </w:p>
-    <w:p>
-      <w:pPr>
-        <w:spacing w:after="160"/>
-      </w:pPr>
-      <w:r>
-        <w:t>[11]</w:t>
-      </w:r>
-      <w:r>
-        <w:t xml:space="preserve"> M. Esposito, M. Robredo, F. </w:t>
-      </w:r>
-      <w:proofErr w:type="spellStart"/>
-      <w:r>
-        <w:t>Arcelli</w:t>
-      </w:r>
-      <w:proofErr w:type="spellEnd"/>
-      <w:r>
-        <w:t xml:space="preserve"> Fontana, and V. Lenarduzzi, “On the Correlation Between Architectural Smells and Static Analysis Warnings,” </w:t>
-      </w:r>
-      <w:r>
-        <w:rPr>
-          <w:i/>
-          <w:iCs/>
-        </w:rPr>
-        <w:t>Software Quality Journal</w:t>
-      </w:r>
-      <w:r>
-        <w:t xml:space="preserve">, 2025, </w:t>
-      </w:r>
-      <w:proofErr w:type="spellStart"/>
-      <w:r>
-        <w:t>doi</w:t>
-      </w:r>
-      <w:proofErr w:type="spellEnd"/>
-      <w:r>
-        <w:t xml:space="preserve">: 10.1007/s11219-025-09730-7. </w:t>
-      </w:r>
-    </w:p>
-    <w:p>
-      <w:pPr>
-        <w:spacing w:after="160"/>
-      </w:pPr>
-      <w:r>
-        <w:t>[12]</w:t>
-      </w:r>
-      <w:r>
-        <w:t xml:space="preserve"> O. Özkan, C. Babur, and B. </w:t>
-      </w:r>
-      <w:proofErr w:type="spellStart"/>
-      <w:r>
-        <w:t>Tekinerdogan</w:t>
-      </w:r>
-      <w:proofErr w:type="spellEnd"/>
-      <w:r>
-        <w:t xml:space="preserve">, “Refactoring with Domain-Driven Design in an Industrial Context: An Action Research Report,” </w:t>
-      </w:r>
-      <w:r>
-        <w:rPr>
-          <w:i/>
-          <w:iCs/>
-        </w:rPr>
-        <w:t>Empirical Software Engineering</w:t>
-      </w:r>
-      <w:r>
-        <w:t xml:space="preserve">, 2023, </w:t>
-      </w:r>
-      <w:proofErr w:type="spellStart"/>
-      <w:r>
-        <w:t>doi</w:t>
-      </w:r>
-      <w:proofErr w:type="spellEnd"/>
-      <w:r>
-        <w:t xml:space="preserve">: 10.1007/s10664-023-10310-1. </w:t>
-      </w:r>
-    </w:p>
-    <w:p>
-      <w:pPr>
-        <w:spacing w:after="160"/>
-      </w:pPr>
-      <w:r>
-        <w:t>[13]</w:t>
-      </w:r>
-      <w:r>
-        <w:t xml:space="preserve"> D. Sas, P. </w:t>
-      </w:r>
-      <w:proofErr w:type="spellStart"/>
-      <w:r>
-        <w:t>Avgeriou</w:t>
-      </w:r>
-      <w:proofErr w:type="spellEnd"/>
-      <w:r>
-        <w:t xml:space="preserve">, R. </w:t>
-      </w:r>
-      <w:proofErr w:type="spellStart"/>
-      <w:r>
-        <w:t>Kruizinga</w:t>
-      </w:r>
-      <w:proofErr w:type="spellEnd"/>
-      <w:r>
-        <w:t xml:space="preserve">, and R. Scheedler, “Exploring the Relation Between Co-changes and Architectural Smells,” </w:t>
-      </w:r>
-      <w:r>
-        <w:rPr>
-          <w:i/>
-          <w:iCs/>
-        </w:rPr>
-        <w:t>SN Computer Science</w:t>
-      </w:r>
-      <w:r>
-        <w:t xml:space="preserve">, 2021, </w:t>
-      </w:r>
-      <w:proofErr w:type="spellStart"/>
-      <w:r>
-        <w:t>doi</w:t>
-      </w:r>
-      <w:proofErr w:type="spellEnd"/>
-      <w:r>
-        <w:t xml:space="preserve">: 10.1007/s42979-020-00407-5. </w:t>
-      </w:r>
-    </w:p>
-    <w:p>
-      <w:pPr>
-        <w:spacing w:after="160"/>
-      </w:pPr>
-      <w:r>
-        <w:t>[14]</w:t>
-      </w:r>
-      <w:r>
-        <w:t xml:space="preserve"> N. Naveen, R. Singh, and A. </w:t>
-      </w:r>
-      <w:proofErr w:type="spellStart"/>
-      <w:r>
-        <w:t>Rathee</w:t>
-      </w:r>
-      <w:proofErr w:type="spellEnd"/>
-      <w:r>
-        <w:t xml:space="preserve">, “Improving Software Modularity Using Software </w:t>
-      </w:r>
-      <w:proofErr w:type="spellStart"/>
-      <w:r>
-        <w:t>Remodularization</w:t>
-      </w:r>
-      <w:proofErr w:type="spellEnd"/>
-      <w:r>
-        <w:t xml:space="preserve">: Challenges and Opportunities,” </w:t>
-      </w:r>
-      <w:r>
-        <w:rPr>
-          <w:i/>
-          <w:iCs/>
-        </w:rPr>
-        <w:t>ITM Web of Conferences</w:t>
-      </w:r>
-      <w:r>
-        <w:t xml:space="preserve">, vol. 54, Art. no. 01008, 2023, </w:t>
-      </w:r>
-      <w:proofErr w:type="spellStart"/>
-      <w:r>
-        <w:t>doi</w:t>
-      </w:r>
-      <w:proofErr w:type="spellEnd"/>
-      <w:r>
-        <w:t>: 10.1051/</w:t>
-      </w:r>
-      <w:proofErr w:type="spellStart"/>
-      <w:r>
-        <w:t>itmconf</w:t>
-      </w:r>
-      <w:proofErr w:type="spellEnd"/>
-      <w:r>
-        <w:t xml:space="preserve">/20235401008. </w:t>
-      </w:r>
-    </w:p>
-    <w:p>
-      <w:pPr>
-        <w:spacing w:after="160"/>
-      </w:pPr>
-      <w:r>
-        <w:t>[15]</w:t>
-      </w:r>
-      <w:r>
-        <w:t xml:space="preserve"> G.-D. Schwarz, F. Quast, and D. Riehle, “Ensuring Syntactic Interoperability Using Consumer-Driven Contract Testing,” </w:t>
-      </w:r>
-      <w:r>
-        <w:rPr>
-          <w:i/>
-          <w:iCs/>
-        </w:rPr>
-        <w:t>Software Testing, Verification and Reliability</w:t>
-      </w:r>
-      <w:r>
-        <w:t xml:space="preserve">, 2025, </w:t>
-      </w:r>
-      <w:proofErr w:type="spellStart"/>
-      <w:r>
-        <w:t>doi</w:t>
-      </w:r>
-      <w:proofErr w:type="spellEnd"/>
-      <w:r>
-        <w:t>: 10.1002/stvr.70006.</w:t>
+        <w:t>: 10.1145/3387904.3389276.</w:t>
       </w:r>
     </w:p>
     <w:p>
@@ -3469,7 +3548,6 @@
   <w:style w:type="character" w:default="1" w:styleId="DefaultParagraphFont">
     <w:name w:val="Default Paragraph Font"/>
     <w:uiPriority w:val="1"/>
-    <w:semiHidden/>
     <w:unhideWhenUsed/>
   </w:style>
   <w:style w:type="table" w:default="1" w:styleId="TableNormal">
@@ -5227,15 +5305,115 @@
 </file>
 
 <file path=customXml/item1.xml><?xml version="1.0" encoding="utf-8"?>
-<?mso-contentType ?>
-<FormTemplates xmlns="http://schemas.microsoft.com/sharepoint/v3/contenttype/forms">
-  <Display>DocumentLibraryForm</Display>
-  <Edit>DocumentLibraryForm</Edit>
-  <New>DocumentLibraryForm</New>
-</FormTemplates>
+<Rehngruppen10>
+  <Dokumentinfo>
+    <Rubrik>
+		</Rubrik>
+    <Underrubrik>
+		</Underrubrik>
+    <Disclaimer>
+		</Disclaimer>
+    <Version>
+		</Version>
+    <Dokumenttyp>
+		</Dokumenttyp>
+    <Informationsklassificering>
+		</Informationsklassificering>
+    <Datum/>
+  </Dokumentinfo>
+  <KontaktuppgifterForetag>
+    <Foretag>
+		</Foretag>
+    <Orgnr>
+		</Orgnr>
+    <TelefonForetag>
+		</TelefonForetag>
+    <EmailForetag>
+		</EmailForetag>
+    <Besoksadress>
+		</Besoksadress>
+    <PostAdress>
+		</PostAdress>
+    <Gata>
+		</Gata>
+    <Postnummer>
+		</Postnummer>
+    <Ort/>
+    <Personinfo>
+      <Namn>&lt;?xml version="1.0" standalone="yes"?&gt;
+&lt;?mso-application progid="Word.Document"?&gt;
+&lt;pkg:package xmlns:pkg="http://schemas.microsoft.com/office/2006/xmlPackage"&gt;&lt;pkg:part pkg:name="/_rels/.rels" pkg:contentType="application/vnd.openxmlformats-package.relationships+xml" pkg:padding="512"&gt;&lt;pkg:xmlData&gt;&lt;Relationships xmlns="http://schemas.openxmlformats.org/package/2006/relationships"&gt;&lt;Relationship Id="rId1" Type="http://schemas.openxmlformats.org/officeDocument/2006/relationships/officeDocument" Target="word/document.xml"/&gt;&lt;/Relationships&gt;&lt;/pkg:xmlData&gt;&lt;/pkg:part&gt;&lt;pkg:part pkg:name="/word/_rels/document.xml.rels" pkg:contentType="application/vnd.openxmlformats-package.relationships+xml" pkg:padding="256"&gt;&lt;pkg:xmlData&gt;&lt;Relationships xmlns="http://schemas.openxmlformats.org/package/2006/relationships"&gt;&lt;Relationship Id="rId3" Type="http://schemas.openxmlformats.org/officeDocument/2006/relationships/glossaryDocument" Target="glossary/document.xml"/&gt;&lt;Relationship Id="rId2" Type="http://schemas.openxmlformats.org/officeDocument/2006/relationships/styles" Target="styles.xml"/&gt;&lt;Relationship Id="rId1" Type="http://schemas.openxmlformats.org/officeDocument/2006/relationships/numbering" Target="numbering.xml"/&gt;&lt;/Relationships&gt;&lt;/pkg:xmlData&gt;&lt;/pkg:part&gt;&lt;pkg:part pkg:name="/word/document.xml" pkg:contentType="application/vnd.openxmlformats-officedocument.wordprocessingml.document.main+xml"&gt;&lt;pkg:xmlData&gt;&lt;w:document xmlns:wpc="http://schemas.microsoft.com/office/word/2010/wordprocessingCanvas" xmlns:cx="http://schemas.microsoft.com/office/drawing/2014/chartex" xmlns:cx1="http://schemas.microsoft.com/office/drawing/2015/9/8/chartex" xmlns:cx2="http://schemas.microsoft.com/office/drawing/2015/10/21/chartex" xmlns:cx3="http://schemas.microsoft.com/office/drawing/2016/5/9/chartex" xmlns:cx4="http://schemas.microsoft.com/office/drawing/2016/5/10/chartex" xmlns:cx5="http://schemas.microsoft.com/office/drawing/2016/5/11/chartex" xmlns:cx6="http://schemas.microsoft.com/office/drawing/2016/5/12/chartex" xmlns:cx7="http://schemas.microsoft.com/office/drawing/2016/5/13/chartex" xmlns:cx8="http://schemas.microsoft.com/office/drawing/2016/5/14/chartex" xmlns:mc="http://schemas.openxmlformats.org/markup-compatibility/2006" xmlns:o="urn:schemas-microsoft-com:office:office" xmlns:r="http://schemas.openxmlformats.org/officeDocument/2006/relationships" xmlns:m="http://schemas.openxmlformats.org/officeDocument/2006/math" xmlns:v="urn:schemas-microsoft-com:vml" xmlns:wp14="http://schemas.microsoft.com/office/word/2010/wordprocessingDrawing" xmlns:wp="http://schemas.openxmlformats.org/drawingml/2006/wordprocessingDrawing" xmlns:w10="urn:schemas-microsoft-com:office:word" xmlns:w="http://schemas.openxmlformats.org/wordprocessingml/2006/main" xmlns:w14="http://schemas.microsoft.com/office/word/2010/wordml" xmlns:w15="http://schemas.microsoft.com/office/word/2012/wordml" xmlns:w16se="http://schemas.microsoft.com/office/word/2015/wordml/symex" xmlns:wpg="http://schemas.microsoft.com/office/word/2010/wordprocessingGroup" xmlns:wpi="http://schemas.microsoft.com/office/word/2010/wordprocessingInk" xmlns:wne="http://schemas.microsoft.com/office/word/2006/wordml" xmlns:wps="http://schemas.microsoft.com/office/word/2010/wordprocessingShape" mc:Ignorable="w14 w15 w16se wp14"&gt;&lt;w:body&gt;&lt;w:sdt&gt;&lt;w:sdtPr&gt;&lt;w:tag w:val="regName"/&gt;&lt;w:id w:val="-1755663995"/&gt;&lt;w:placeholder&gt;&lt;w:docPart w:val="B7CF53EBD28C4270BBC51AAB20A1C895"/&gt;&lt;/w:placeholder&gt;&lt;/w:sdtPr&gt;&lt;w:sdtContent&gt;&lt;w:p&gt;&lt;w:pPr&gt;&lt;w:pStyle w:val="Name"/&gt;&lt;w:cnfStyle w:val="001000000000" w:firstRow="0" w:lastRow="0" w:firstColumn="1" w:lastColumn="0" w:oddVBand="0" w:evenVBand="0" w:oddHBand="0" w:evenHBand="0" w:firstRowFirstColumn="0" w:firstRowLastColumn="0" w:lastRowFirstColumn="0" w:lastRowLastColumn="0"/&gt;&lt;/w:pPr&gt;&lt;w:r&gt;&lt;w:t&gt;Maria Dahlstrand&lt;/w:t&gt;&lt;/w:r&gt;&lt;/w:p&gt;&lt;/w:sdtContent&gt;&lt;/w:sdt&gt;&lt;w:p/&gt;&lt;w:sectPr&gt;&lt;w:pgSz w:w="12240" w:h="15840"/&gt;&lt;w:pgMar w:top="1417" w:right="1417" w:bottom="1417" w:left="1417" w:header="720" w:footer="720" w:gutter="0"/&gt;&lt;w:cols w:space="720"/&gt;&lt;/w:sectPr&gt;&lt;/w:body&gt;&lt;/w:document&gt;&lt;/pkg:xmlData&gt;&lt;/pkg:part&gt;&lt;pkg:part pkg:name="/word/glossary/settings.xml" pkg:contentType="application/vnd.openxmlformats-officedocument.wordprocessingml.settings+xml"&gt;&lt;pkg:xmlData&gt;&lt;w:settings xmlns:mc="http://schemas.openxmlformats.org/markup-compatibility/2006" xmlns:o="urn:schemas-microsoft-com:office:office" xmlns:r="http://schemas.openxmlformats.org/officeDocument/2006/relationships" xmlns:m="http://schemas.openxmlformats.org/officeDocument/2006/math" xmlns:v="urn:schemas-microsoft-com:vml" xmlns:w10="urn:schemas-microsoft-com:office:word" xmlns:w="http://schemas.openxmlformats.org/wordprocessingml/2006/main" xmlns:w14="http://schemas.microsoft.com/office/word/2010/wordml" xmlns:w15="http://schemas.microsoft.com/office/word/2012/wordml" xmlns:w16se="http://schemas.microsoft.com/office/word/2015/wordml/symex" xmlns:sl="http://schemas.openxmlformats.org/schemaLibrary/2006/main" mc:Ignorable="w14 w15 w16se"&gt;&lt;w:view w:val="normal"/&gt;&lt;w:defaultTabStop w:val="720"/&gt;&lt;w:characterSpacingControl w:val="doNotCompress"/&gt;&lt;w:compat&gt;&lt;w:useFELayout/&gt;&lt;w:compatSetting w:name="compatibilityMode" w:uri="http://schemas.microsoft.com/office/word" w:val="15"/&gt;&lt;w:compatSetting w:name="overrideTableStyleFontSizeAndJustification" w:uri="http://schemas.microsoft.com/office/word" w:val="1"/&gt;&lt;w:compatSetting w:name="enableOpenTypeFeatures" w:uri="http://schemas.microsoft.com/office/word" w:val="1"/&gt;&lt;w:compatSetting w:name="doNotFlipMirrorIndents" w:uri="http://schemas.microsoft.com/office/word" w:val="1"/&gt;&lt;w:compatSetting w:name="differentiateMultirowTableHeaders" w:uri="http://schemas.microsoft.com/office/word" w:val="1"/&gt;&lt;/w:compat&gt;&lt;m:mathPr&gt;&lt;m:mathFont m:val="Cambria Math"/&gt;&lt;m:brkBin m:val="before"/&gt;&lt;m:brkBinSub m:val="--"/&gt;&lt;m:smallFrac m:val="0"/&gt;&lt;m:dispDef/&gt;&lt;m:lMargin m:val="0"/&gt;&lt;m:rMargin m:val="0"/&gt;&lt;m:defJc m:val="centerGroup"/&gt;&lt;m:wrapIndent m:val="1440"/&gt;&lt;m:intLim m:val="subSup"/&gt;&lt;m:naryLim m:val="undOvr"/&gt;&lt;/m:mathPr&gt;&lt;w:themeFontLang w:val="en-GB"/&gt;&lt;w:clrSchemeMapping w:bg1="light1" w:t1="dark1" w:bg2="light2" w:t2="dark2" w:accent1="accent1" w:accent2="accent2" w:accent3="accent3" w:accent4="accent4" w:accent5="accent5" w:accent6="accent6" w:hyperlink="hyperlink" w:followedHyperlink="followedHyperlink"/&gt;&lt;w:decimalSymbol w:val=","/&gt;&lt;w:listSeparator w:val=";"/&gt;&lt;w15:chartTrackingRefBased/&gt;&lt;/w:settings&gt;&lt;/pkg:xmlData&gt;&lt;/pkg:part&gt;&lt;pkg:part pkg:name="/word/glossary/_rels/document.xml.rels" pkg:contentType="application/vnd.openxmlformats-package.relationships+xml"&gt;&lt;pkg:xmlData&gt;&lt;Relationships xmlns="http://schemas.openxmlformats.org/package/2006/relationships"&gt;&lt;Relationship Id="rId3" Type="http://schemas.openxmlformats.org/officeDocument/2006/relationships/webSettings" Target="webSettings.xml"/&gt;&lt;Relationship Id="rId2" Type="http://schemas.openxmlformats.org/officeDocument/2006/relationships/settings" Target="settings.xml"/&gt;&lt;Relationship Id="rId1" Type="http://schemas.openxmlformats.org/officeDocument/2006/relationships/styles" Target="styles.xml"/&gt;&lt;Relationship Id="rId4" Type="http://schemas.openxmlformats.org/officeDocument/2006/relationships/fontTable" Target="fontTable.xml"/&gt;&lt;/Relationships&gt;&lt;/pkg:xmlData&gt;&lt;/pkg:part&gt;&lt;pkg:part pkg:name="/word/glossary/document.xml" pkg:contentType="application/vnd.openxmlformats-officedocument.wordprocessingml.document.glossary+xml"&gt;&lt;pkg:xmlData&gt;&lt;w:glossaryDocument xmlns:wpc="http://schemas.microsoft.com/office/word/2010/wordprocessingCanvas" xmlns:cx="http://schemas.microsoft.com/office/drawing/2014/chartex" xmlns:cx1="http://schemas.microsoft.com/office/drawing/2015/9/8/chartex" xmlns:cx2="http://schemas.microsoft.com/office/drawing/2015/10/21/chartex" xmlns:cx3="http://schemas.microsoft.com/office/drawing/2016/5/9/chartex" xmlns:cx4="http://schemas.microsoft.com/office/drawing/2016/5/10/chartex" xmlns:cx5="http://schemas.microsoft.com/office/drawing/2016/5/11/chartex" xmlns:cx6="http://schemas.microsoft.com/office/drawing/2016/5/12/chartex" xmlns:cx7="http://schemas.microsoft.com/office/drawing/2016/5/13/chartex" xmlns:cx8="http://schemas.microsoft.com/office/drawing/2016/5/14/chartex" xmlns:mc="http://schemas.openxmlformats.org/markup-compatibility/2006" xmlns:o="urn:schemas-microsoft-com:office:office" xmlns:r="http://schemas.openxmlformats.org/officeDocument/2006/relationships" xmlns:m="http://schemas.openxmlformats.org/officeDocument/2006/math" xmlns:v="urn:schemas-microsoft-com:vml" xmlns:wp14="http://schemas.microsoft.com/office/word/2010/wordprocessingDrawing" xmlns:wp="http://schemas.openxmlformats.org/drawingml/2006/wordprocessingDrawing" xmlns:w10="urn:schemas-microsoft-com:office:word" xmlns:w="http://schemas.openxmlformats.org/wordprocessingml/2006/main" xmlns:w14="http://schemas.microsoft.com/office/word/2010/wordml" xmlns:w15="http://schemas.microsoft.com/office/word/2012/wordml" xmlns:w16se="http://schemas.microsoft.com/office/word/2015/wordml/symex" xmlns:wpg="http://schemas.microsoft.com/office/word/2010/wordprocessingGroup" xmlns:wpi="http://schemas.microsoft.com/office/word/2010/wordprocessingInk" xmlns:wne="http://schemas.microsoft.com/office/word/2006/wordml" xmlns:wps="http://schemas.microsoft.com/office/word/2010/wordprocessingShape" mc:Ignorable="w14 w15 w16se wp14"&gt;&lt;w:docParts&gt;&lt;w:docPart&gt;&lt;w:docPartPr&gt;&lt;w:name w:val="B7CF53EBD28C4270BBC51AAB20A1C895"/&gt;&lt;w:category&gt;&lt;w:name w:val="General"/&gt;&lt;w:gallery w:val="placeholder"/&gt;&lt;/w:category&gt;&lt;w:types&gt;&lt;w:type w:val="bbPlcHdr"/&gt;&lt;/w:types&gt;&lt;w:behaviors&gt;&lt;w:behavior w:val="content"/&gt;&lt;/w:behaviors&gt;&lt;w:guid w:val="{F7D69E8F-087E-454A-99F4-5E3C0519DD23}"/&gt;&lt;/w:docPartPr&gt;&lt;w:docPartBody&gt;&lt;w:p&gt;&lt;w:pPr&gt;&lt;w:pStyle w:val="B7CF53EBD28C4270BBC51AAB20A1C895"/&gt;&lt;/w:pPr&gt;&lt;w:r&gt;&lt;w:rPr&gt;&lt;w:rStyle w:val="PlaceholderText"/&gt;&lt;/w:rPr&gt;&lt;w:t&gt;Click or tap here to enter text.&lt;/w:t&gt;&lt;/w:r&gt;&lt;/w:p&gt;&lt;/w:docPartBody&gt;&lt;/w:docPart&gt;&lt;/w:docParts&gt;&lt;/w:glossaryDocument&gt;&lt;/pkg:xmlData&gt;&lt;/pkg:part&gt;&lt;pkg:part pkg:name="/word/glossary/styles.xml" pkg:contentType="application/vnd.openxmlformats-officedocument.wordprocessingml.styles+xml"&gt;&lt;pkg:xmlData&gt;&lt;w:styles xmlns:mc="http://schemas.openxmlformats.org/markup-compatibility/2006" xmlns:r="http://schemas.openxmlformats.org/officeDocument/2006/relationships" xmlns:w="http://schemas.openxmlformats.org/wordprocessingml/2006/main" xmlns:w14="http://schemas.microsoft.com/office/word/2010/wordml" xmlns:w15="http://schemas.microsoft.com/office/word/2012/wordml" xmlns:w16se="http://schemas.microsoft.com/office/word/2015/wordml/symex" mc:Ignorable="w14 w15 w16se"&gt;&lt;w:docDefaults&gt;&lt;w:rPrDefault&gt;&lt;w:rPr&gt;&lt;w:rFonts w:asciiTheme="minorHAnsi" w:eastAsiaTheme="minorEastAsia" w:hAnsiTheme="minorHAnsi" w:cstheme="minorBidi"/&gt;&lt;w:sz w:val="22"/&gt;&lt;w:szCs w:val="22"/&gt;&lt;w:lang w:val="en-GB" w:eastAsia="en-GB" w:bidi="ar-SA"/&gt;&lt;/w:rPr&gt;&lt;/w:rPrDefault&gt;&lt;w:pPrDefault&gt;&lt;w:pPr&gt;&lt;w:spacing w:after="160" w:line="259" w:lineRule="auto"/&gt;&lt;/w:pPr&gt;&lt;/w:pPrDefault&gt;&lt;/w:docDefaults&gt;&lt;w:latentStyles w:defLockedState="0" w:defUIPriority="99" w:defSemiHidden="0" w:defUnhideWhenUsed="0" w:defQFormat="0" w:count="374"&gt;&lt;w:lsdException w:name="Normal" w:uiPriority="0" w:qFormat="1"/&gt;&lt;w:lsdException w:name="heading 1" w:uiPriority="9" w:qFormat="1"/&gt;&lt;w:lsdException w:name="heading 2" w:semiHidden="1" w:uiPriority="9" w:unhideWhenUsed="1" w:qFormat="1"/&gt;&lt;w:lsdException w:name="heading 3" w:semiHidden="1" w:uiPriority="9" w:unhideWhenUsed="1" w:qFormat="1"/&gt;&lt;w:lsdException w:name="heading 4" w:semiHidden="1" w:uiPriority="9" w:unhideWhenUsed="1" w:qFormat="1"/&gt;&lt;w:lsdException w:name="heading 5" w:semiHidden="1" w:uiPriority="9" w:unhideWhenUsed="1" w:qFormat="1"/&gt;&lt;w:lsdException w:name="heading 6" w:semiHidden="1" w:uiPriority="9" w:unhideWhenUsed="1" w:qFormat="1"/&gt;&lt;w:lsdException w:name="heading 7" w:semiHidden="1" w:uiPriority="9" w:unhideWhenUsed="1" w:qFormat="1"/&gt;&lt;w:lsdException w:name="heading 8" w:semiHidden="1" w:uiPriority="9" w:unhideWhenUsed="1" w:qFormat="1"/&gt;&lt;w:lsdException w:name="heading 9" w:semiHidden="1" w:uiPriority="9" w:unhideWhenUsed="1" w:qFormat="1"/&gt;&lt;w:lsdException w:name="index 1" w:semiHidden="1" w:unhideWhenUsed="1"/&gt;&lt;w:lsdException w:name="index 2" w:semiHidden="1" w:unhideWhenUsed="1"/&gt;&lt;w:lsdException w:name="index 3" w:semiHidden="1" w:unhideWhenUsed="1"/&gt;&lt;w:lsdException w:name="index 4" w:semiHidden="1" w:unhideWhenUsed="1"/&gt;&lt;w:lsdException w:name="index 5" w:semiHidden="1" w:unhideWhenUsed="1"/&gt;&lt;w:lsdException w:name="index 6" w:semiHidden="1" w:unhideWhenUsed="1"/&gt;&lt;w:lsdException w:name="index 7" w:semiHidden="1" w:unhideWhenUsed="1"/&gt;&lt;w:lsdException w:name="index 8" w:semiHidden="1" w:unhideWhenUsed="1"/&gt;&lt;w:lsdException w:name="index 9" w:semiHidden="1" w:unhideWhenUsed="1"/&gt;&lt;w:lsdException w:name="toc 1" w:semiHidden="1" w:uiPriority="39" w:unhideWhenUsed="1"/&gt;&lt;w:lsdException w:name="toc 2" w:semiHidden="1" w:uiPriority="39" w:unhideWhenUsed="1"/&gt;&lt;w:lsdException w:name="toc 3" w:semiHidden="1" w:uiPriority="39" w:unhideWhenUsed="1"/&gt;&lt;w:lsdException w:name="toc 4" w:semiHidden="1" w:uiPriority="39" w:unhideWhenUsed="1"/&gt;&lt;w:lsdException w:name="toc 5" w:semiHidden="1" w:uiPriority="39" w:unhideWhenUsed="1"/&gt;&lt;w:lsdException w:name="toc 6" w:semiHidden="1" w:uiPriority="39" w:unhideWhenUsed="1"/&gt;&lt;w:lsdException w:name="toc 7" w:semiHidden="1" w:uiPriority="39" w:unhideWhenUsed="1"/&gt;&lt;w:lsdException w:name="toc 8" w:semiHidden="1" w:uiPriority="39" w:unhideWhenUsed="1"/&gt;&lt;w:lsdException w:name="toc 9" w:semiHidden="1" w:uiPriority="39" w:unhideWhenUsed="1"/&gt;&lt;w:lsdException w:name="Normal Indent" w:semiHidden="1" w:unhideWhenUsed="1"/&gt;&lt;w:lsdException w:name="footnote text" w:semiHidden="1" w:unhideWhenUsed="1"/&gt;&lt;w:lsdException w:name="annotation text" w:semiHidden="1" w:unhideWhenUsed="1"/&gt;&lt;w:lsdException w:name="header" w:semiHidden="1" w:unhideWhenUsed="1"/&gt;&lt;w:lsdException w:name="footer" w:semiHidden="1" w:unhideWhenUsed="1"/&gt;&lt;w:lsdException w:name="index heading" w:semiHidden="1" w:unhideWhenUsed="1"/&gt;&lt;w:lsdException w:name="caption" w:semiHidden="1" w:uiPriority="35" w:unhideWhenUsed="1" w:qFormat="1"/&gt;&lt;w:lsdException w:name="table of figures" w:semiHidden="1" w:unhideWhenUsed="1"/&gt;&lt;w:lsdException w:name="envelope address" w:semiHidden="1" w:unhideWhenUsed="1"/&gt;&lt;w:lsdException w:name="envelope return" w:semiHidden="1" w:unhideWhenUsed="1"/&gt;&lt;w:lsdException w:name="footnote reference" w:semiHidden="1" w:unhideWhenUsed="1"/&gt;&lt;w:lsdException w:name="annotation reference" w:semiHidden="1" w:unhideWhenUsed="1"/&gt;&lt;w:lsdException w:name="line number" w:semiHidden="1" w:unhideWhenUsed="1"/&gt;&lt;w:lsdException w:name="page number" w:semiHidden="1" w:unhideWhenUsed="1"/&gt;&lt;w:lsdException w:name="endnote reference" w:semiHidden="1" w:unhideWhenUsed="1"/&gt;&lt;w:lsdException w:name="endnote text" w:semiHidden="1" w:unhideWhenUsed="1"/&gt;&lt;w:lsdException w:name="table of authorities" w:semiHidden="1" w:unhideWhenUsed="1"/&gt;&lt;w:lsdException w:name="macro" w:semiHidden="1" w:unhideWhenUsed="1"/&gt;&lt;w:lsdException w:name="toa heading" w:semiHidden="1" w:unhideWhenUsed="1"/&gt;&lt;w:lsdException w:name="List" w:semiHidden="1" w:unhideWhenUsed="1"/&gt;&lt;w:lsdException w:name="List Bullet" w:semiHidden="1" w:unhideWhenUsed="1"/&gt;&lt;w:lsdException w:name="List Number" w:semiHidden="1" w:unhideWhenUsed="1"/&gt;&lt;w:lsdException w:name="List 2" w:semiHidden="1" w:unhideWhenUsed="1"/&gt;&lt;w:lsdException w:name="List 3" w:semiHidden="1" w:unhideWhenUsed="1"/&gt;&lt;w:lsdException w:name="List 4" w:semiHidden="1" w:unhideWhenUsed="1"/&gt;&lt;w:lsdException w:name="List 5" w:semiHidden="1" w:unhideWhenUsed="1"/&gt;&lt;w:lsdException w:name="List Bullet 2" w:semiHidden="1" w:unhideWhenUsed="1"/&gt;&lt;w:lsdException w:name="List Bullet 3" w:semiHidden="1" w:unhideWhenUsed="1"/&gt;&lt;w:lsdException w:name="List Bullet 4" w:semiHidden="1" w:unhideWhenUsed="1"/&gt;&lt;w:lsdException w:name="List Bullet 5" w:semiHidden="1" w:unhideWhenUsed="1"/&gt;&lt;w:lsdException w:name="List Number 2" w:semiHidden="1" w:unhideWhenUsed="1"/&gt;&lt;w:lsdException w:name="List Number 3" w:semiHidden="1" w:unhideWhenUsed="1"/&gt;&lt;w:lsdException w:name="List Number 4" w:semiHidden="1" w:unhideWhenUsed="1"/&gt;&lt;w:lsdException w:name="List Number 5" w:semiHidden="1" w:unhideWhenUsed="1"/&gt;&lt;w:lsdException w:name="Title" w:uiPriority="10" w:qFormat="1"/&gt;&lt;w:lsdException w:name="Closing" w:semiHidden="1" w:unhideWhenUsed="1"/&gt;&lt;w:lsdException w:name="Signature" w:semiHidden="1" w:unhideWhenUsed="1"/&gt;&lt;w:lsdException w:name="Default Paragraph Font" w:semiHidden="1" w:uiPriority="1" w:unhideWhenUsed="1"/&gt;&lt;w:lsdException w:name="Body Text" w:semiHidden="1" w:unhideWhenUsed="1"/&gt;&lt;w:lsdException w:name="Body Text Indent" w:semiHidden="1" w:unhideWhenUsed="1"/&gt;&lt;w:lsdException w:name="List Continue" w:semiHidden="1" w:unhideWhenUsed="1"/&gt;&lt;w:lsdException w:name="List Continue 2" w:semiHidden="1" w:unhideWhenUsed="1"/&gt;&lt;w:lsdException w:name="List Continue 3" w:semiHidden="1" w:unhideWhenUsed="1"/&gt;&lt;w:lsdException w:name="List Continue 4" w:semiHidden="1" w:unhideWhenUsed="1"/&gt;&lt;w:lsdException w:name="List Continue 5" w:semiHidden="1" w:unhideWhenUsed="1"/&gt;&lt;w:lsdException w:name="Message Header" w:semiHidden="1" w:unhideWhenUsed="1"/&gt;&lt;w:lsdException w:name="Subtitle" w:uiPriority="11" w:qFormat="1"/&gt;&lt;w:lsdException w:name="Salutation" w:semiHidden="1" w:unhideWhenUsed="1"/&gt;&lt;w:lsdException w:name="Date" w:semiHidden="1" w:unhideWhenUsed="1"/&gt;&lt;w:lsdException w:name="Body Text First Indent" w:semiHidden="1" w:unhideWhenUsed="1"/&gt;&lt;w:lsdException w:name="Body Text First Indent 2" w:semiHidden="1" w:unhideWhenUsed="1"/&gt;&lt;w:lsdException w:name="Note Heading" w:semiHidden="1" w:unhideWhenUsed="1"/&gt;&lt;w:lsdException w:name="Body Text 2" w:semiHidden="1" w:unhideWhenUsed="1"/&gt;&lt;w:lsdException w:name="Body Text 3" w:semiHidden="1" w:unhideWhenUsed="1"/&gt;&lt;w:lsdException w:name="Body Text Indent 2" w:semiHidden="1" w:unhideWhenUsed="1"/&gt;&lt;w:lsdException w:name="Body Text Indent 3" w:semiHidden="1" w:unhideWhenUsed="1"/&gt;&lt;w:lsdException w:name="Block Text" w:semiHidden="1" w:unhideWhenUsed="1"/&gt;&lt;w:lsdException w:name="Hyperlink" w:semiHidden="1" w:unhideWhenUsed="1"/&gt;&lt;w:lsdException w:name="FollowedHyperlink" w:semiHidden="1" w:unhideWhenUsed="1"/&gt;&lt;w:lsdException w:name="Strong" w:uiPriority="22" w:qFormat="1"/&gt;&lt;w:lsdException w:name="Emphasis" w:uiPriority="20" w:qFormat="1"/&gt;&lt;w:lsdException w:name="Document Map" w:semiHidden="1" w:unhideWhenUsed="1"/&gt;&lt;w:lsdException w:name="Plain Text" w:semiHidden="1" w:unhideWhenUsed="1"/&gt;&lt;w:lsdException w:name="E-mail Signature" w:semiHidden="1" w:unhideWhenUsed="1"/&gt;&lt;w:lsdException w:name="HTML Top of Form" w:semiHidden="1" w:unhideWhenUsed="1"/&gt;&lt;w:lsdException w:name="HTML Bottom of Form" w:semiHidden="1" w:unhideWhenUsed="1"/&gt;&lt;w:lsdException w:name="Normal (Web)" w:semiHidden="1" w:unhideWhenUsed="1"/&gt;&lt;w:lsdException w:name="HTML Acronym" w:semiHidden="1" w:unhideWhenUsed="1"/&gt;&lt;w:lsdException w:name="HTML Address" w:semiHidden="1" w:unhideWhenUsed="1"/&gt;&lt;w:lsdException w:name="HTML Cite" w:semiHidden="1" w:unhideWhenUsed="1"/&gt;&lt;w:lsdException w:name="HTML Code" w:semiHidden="1" w:unhideWhenUsed="1"/&gt;&lt;w:lsdException w:name="HTML Definition" w:semiHidden="1" w:unhideWhenUsed="1"/&gt;&lt;w:lsdException w:name="HTML Keyboard" w:semiHidden="1" w:unhideWhenUsed="1"/&gt;&lt;w:lsdException w:name="HTML Preformatted" w:semiHidden="1" w:unhideWhenUsed="1"/&gt;&lt;w:lsdException w:name="HTML Sample" w:semiHidden="1" w:unhideWhenUsed="1"/&gt;&lt;w:lsdException w:name="HTML Typewriter" w:semiHidden="1" w:unhideWhenUsed="1"/&gt;&lt;w:lsdException w:name="HTML Variable" w:semiHidden="1" w:unhideWhenUsed="1"/&gt;&lt;w:lsdException w:name="Normal Table" w:semiHidden="1" w:unhideWhenUsed="1"/&gt;&lt;w:lsdException w:name="annotation subject" w:semiHidden="1" w:unhideWhenUsed="1"/&gt;&lt;w:lsdException w:name="No List" w:semiHidden="1" w:unhideWhenUsed="1"/&gt;&lt;w:lsdException w:name="Outline List 1" w:semiHidden="1" w:unhideWhenUsed="1"/&gt;&lt;w:lsdException w:name="Outline List 2" w:semiHidden="1" w:unhideWhenUsed="1"/&gt;&lt;w:lsdException w:name="Outline List 3" w:semiHidden="1" w:unhideWhenUsed="1"/&gt;&lt;w:lsdException w:name="Table Simple 1" w:semiHidden="1" w:unhideWhenUsed="1"/&gt;&lt;w:lsdException w:name="Table Simple 2" w:semiHidden="1" w:unhideWhenUsed="1"/&gt;&lt;w:lsdException w:name="Table Simple 3" w:semiHidden="1" w:unhideWhenUsed="1"/&gt;&lt;w:lsdException w:name="Table Classic 1" w:semiHidden="1" w:unhideWhenUsed="1"/&gt;&lt;w:lsdException w:name="Table Classic 2" w:semiHidden="1" w:unhideWhenUsed="1"/&gt;&lt;w:lsdException w:name="Table Classic 3" w:semiHidden="1" w:unhideWhenUsed="1"/&gt;&lt;w:lsdException w:name="Table Classic 4" w:semiHidden="1" w:unhideWhenUsed="1"/&gt;&lt;w:lsdException w:name="Table Colorful 1" w:semiHidden="1" w:unhideWhenUsed="1"/&gt;&lt;w:lsdException w:name="Table Colorful 2" w:semiHidden="1" w:unhideWhenUsed="1"/&gt;&lt;w:lsdException w:name="Table Colorful 3" w:semiHidden="1" w:unhideWhenUsed="1"/&gt;&lt;w:lsdException w:name="Table Columns 1" w:semiHidden="1" w:unhideWhenUsed="1"/&gt;&lt;w:lsdException w:name="Table Columns 2" w:semiHidden="1" w:unhideWhenUsed="1"/&gt;&lt;w:lsdException w:name="Table Columns 3" w:semiHidden="1" w:unhideWhenUsed="1"/&gt;&lt;w:lsdException w:name="Table Columns 4" w:semiHidden="1" w:unhideWhenUsed="1"/&gt;&lt;w:lsdException w:name="Table Columns 5" w:semiHidden="1" w:unhideWhenUsed="1"/&gt;&lt;w:lsdException w:name="Table Grid 1" w:semiHidden="1" w:unhideWhenUsed="1"/&gt;&lt;w:lsdException w:name="Table Grid 2" w:semiHidden="1" w:unhideWhenUsed="1"/&gt;&lt;w:lsdException w:name="Table Grid 3" w:semiHidden="1" w:unhideWhenUsed="1"/&gt;&lt;w:lsdException w:name="Table Grid 4" w:semiHidden="1" w:unhideWhenUsed="1"/&gt;&lt;w:lsdException w:name="Table Grid 5" w:semiHidden="1" w:unhideWhenUsed="1"/&gt;&lt;w:lsdException w:name="Table Grid 6" w:semiHidden="1" w:unhideWhenUsed="1"/&gt;&lt;w:lsdException w:name="Table Grid 7" w:semiHidden="1" w:unhideWhenUsed="1"/&gt;&lt;w:lsdException w:name="Table Grid 8" w:semiHidden="1" w:unhideWhenUsed="1"/&gt;&lt;w:lsdException w:name="Table List 1" w:semiHidden="1" w:unhideWhenUsed="1"/&gt;&lt;w:lsdException w:name="Table List 2" w:semiHidden="1" w:unhideWhenUsed="1"/&gt;&lt;w:lsdException w:name="Table List 3" w:semiHidden="1" w:unhideWhenUsed="1"/&gt;&lt;w:lsdException w:name="Table List 4" w:semiHidden="1" w:unhideWhenUsed="1"/&gt;&lt;w:lsdException w:name="Table List 5" w:semiHidden="1" w:unhideWhenUsed="1"/&gt;&lt;w:lsdException w:name="Table List 6" w:semiHidden="1" w:unhideWhenUsed="1"/&gt;&lt;w:lsdException w:name="Table List 7" w:semiHidden="1" w:unhideWhenUsed="1"/&gt;&lt;w:lsdException w:name="Table List 8" w:semiHidden="1" w:unhideWhenUsed="1"/&gt;&lt;w:lsdException w:name="Table 3D effects 1" w:semiHidden="1" w:unhideWhenUsed="1"/&gt;&lt;w:lsdException w:name="Table 3D effects 2" w:semiHidden="1" w:unhideWhenUsed="1"/&gt;&lt;w:lsdException w:name="Table 3D effects 3" w:semiHidden="1" w:unhideWhenUsed="1"/&gt;&lt;w:lsdException w:name="Table Contemporary" w:semiHidden="1" w:unhideWhenUsed="1"/&gt;&lt;w:lsdException w:name="Table Elegant" w:semiHidden="1" w:unhideWhenUsed="1"/&gt;&lt;w:lsdException w:name="Table Professional" w:semiHidden="1" w:unhideWhenUsed="1"/&gt;&lt;w:lsdException w:name="Table Subtle 1" w:semiHidden="1" w:unhideWhenUsed="1"/&gt;&lt;w:lsdException w:name="Table Subtle 2" w:semiHidden="1" w:unhideWhenUsed="1"/&gt;&lt;w:lsdException w:name="Table Web 1" w:semiHidden="1" w:unhideWhenUsed="1"/&gt;&lt;w:lsdException w:name="Table Web 2" w:semiHidden="1" w:unhideWhenUsed="1"/&gt;&lt;w:lsdException w:name="Table Web 3" w:semiHidden="1" w:unhideWhenUsed="1"/&gt;&lt;w:lsdException w:name="Balloon Text" w:semiHidden="1" w:unhideWhenUsed="1"/&gt;&lt;w:lsdException w:name="Table Grid" w:uiPriority="39"/&gt;&lt;w:lsdException w:name="Table Theme" w:semiHidden="1" w:unhideWhenUsed="1"/&gt;&lt;w:lsdException w:name="Placeholder Text" w:semiHidden="1"/&gt;&lt;w:lsdException w:name="No Spacing" w:uiPriority="1" w:qFormat="1"/&gt;&lt;w:lsdException w:name="Light Shading" w:uiPriority="60"/&gt;&lt;w:lsdException w:name="Light List" w:uiPriority="61"/&gt;&lt;w:lsdException w:name="Light Grid" w:uiPriority="62"/&gt;&lt;w:lsdException w:name="Medium Shading 1" w:uiPriority="63"/&gt;&lt;w:lsdException w:name="Medium Shading 2" w:uiPriority="64"/&gt;&lt;w:lsdException w:name="Medium List 1" w:uiPriority="65"/&gt;&lt;w:lsdException w:name="Medium List 2" w:uiPriority="66"/&gt;&lt;w:lsdException w:name="Medium Grid 1" w:uiPriority="67"/&gt;&lt;w:lsdException w:name="Medium Grid 2" w:uiPriority="68"/&gt;&lt;w:lsdException w:name="Medium Grid 3" w:uiPriority="69"/&gt;&lt;w:lsdException w:name="Dark List" w:uiPriority="70"/&gt;&lt;w:lsdException w:name="Colorful Shading" w:uiPriority="71"/&gt;&lt;w:lsdException w:name="Colorful List" w:uiPriority="72"/&gt;&lt;w:lsdException w:name="Colorful Grid" w:uiPriority="73"/&gt;&lt;w:lsdException w:name="Light Shading Accent 1" w:uiPriority="60"/&gt;&lt;w:lsdException w:name="Light List Accent 1" w:uiPriority="61"/&gt;&lt;w:lsdException w:name="Light Grid Accent 1" w:uiPriority="62"/&gt;&lt;w:lsdException w:name="Medium Shading 1 Accent 1" w:uiPriority="63"/&gt;&lt;w:lsdException w:name="Medium Shading 2 Accent 1" w:uiPriority="64"/&gt;&lt;w:lsdException w:name="Medium List 1 Accent 1" w:uiPriority="65"/&gt;&lt;w:lsdException w:name="Revision" w:semiHidden="1"/&gt;&lt;w:lsdException w:name="List Paragraph" w:uiPriority="34" w:qFormat="1"/&gt;&lt;w:lsdException w:name="Quote" w:uiPriority="29" w:qFormat="1"/&gt;&lt;w:lsdException w:name="Intense Quote" w:uiPriority="30" w:qFormat="1"/&gt;&lt;w:lsdException w:name="Medium List 2 Accent 1" w:uiPriority="66"/&gt;&lt;w:lsdException w:name="Medium Grid 1 Accent 1" w:uiPriority="67"/&gt;&lt;w:lsdException w:name="Medium Grid 2 Accent 1" w:uiPriority="68"/&gt;&lt;w:lsdException w:name="Medium Grid 3 Accent 1" w:uiPriority="69"/&gt;&lt;w:lsdException w:name="Dark List Accent 1" w:uiPriority="70"/&gt;&lt;w:lsdException w:name="Colorful Shading Accent 1" w:uiPriority="71"/&gt;&lt;w:lsdException w:name="Colorful List Accent 1" w:uiPriority="72"/&gt;&lt;w:lsdException w:name="Colorful Grid Accent 1" w:uiPriority="73"/&gt;&lt;w:lsdException w:name="Light Shading Accent 2" w:uiPriority="60"/&gt;&lt;w:lsdException w:name="Light List Accent 2" w:uiPriority="61"/&gt;&lt;w:lsdException w:name="Light Grid Accent 2" w:uiPriority="62"/&gt;&lt;w:lsdException w:name="Medium Shading 1 Accent 2" w:uiPriority="63"/&gt;&lt;w:lsdException w:name="Medium Shading 2 Accent 2" w:uiPriority="64"/&gt;&lt;w:lsdException w:name="Medium List 1 Accent 2" w:uiPriority="65"/&gt;&lt;w:lsdException w:name="Medium List 2 Accent 2" w:uiPriority="66"/&gt;&lt;w:lsdException w:name="Medium Grid 1 Accent 2" w:uiPriority="67"/&gt;&lt;w:lsdException w:name="Medium Grid 2 Accent 2" w:uiPriority="68"/&gt;&lt;w:lsdException w:name="Medium Grid 3 Accent 2" w:uiPriority="69"/&gt;&lt;w:lsdException w:name="Dark List Accent 2" w:uiPriority="70"/&gt;&lt;w:lsdException w:name="Colorful Shading Accent 2" w:uiPriority="71"/&gt;&lt;w:lsdException w:name="Colorful List Accent 2" w:uiPriority="72"/&gt;&lt;w:lsdException w:name="Colorful Grid Accent 2" w:uiPriority="73"/&gt;&lt;w:lsdException w:name="Light Shading Accent 3" w:uiPriority="60"/&gt;&lt;w:lsdException w:name="Light List Accent 3" w:uiPriority="61"/&gt;&lt;w:lsdException w:name="Light Grid Accent 3" w:uiPriority="62"/&gt;&lt;w:lsdException w:name="Medium Shading 1 Accent 3" w:uiPriority="63"/&gt;&lt;w:lsdException w:name="Medium Shading 2 Accent 3" w:uiPriority="64"/&gt;&lt;w:lsdException w:name="Medium List 1 Accent 3" w:uiPriority="65"/&gt;&lt;w:lsdException w:name="Medium List 2 Accent 3" w:uiPriority="66"/&gt;&lt;w:lsdException w:name="Medium Grid 1 Accent 3" w:uiPriority="67"/&gt;&lt;w:lsdException w:name="Medium Grid 2 Accent 3" w:uiPriority="68"/&gt;&lt;w:lsdException w:name="Medium Grid 3 Accent 3" w:uiPriority="69"/&gt;&lt;w:lsdException w:name="Dark List Accent 3" w:uiPriority="70"/&gt;&lt;w:lsdException w:name="Colorful Shading Accent 3" w:uiPriority="71"/&gt;&lt;w:lsdException w:name="Colorful List Accent 3" w:uiPriority="72"/&gt;&lt;w:lsdException w:name="Colorful Grid Accent 3" w:uiPriority="73"/&gt;&lt;w:lsdException w:name="Light Shading Accent 4" w:uiPriority="60"/&gt;&lt;w:lsdException w:name="Light List Accent 4" w:uiPriority="61"/&gt;&lt;w:lsdException w:name="Light Grid Accent 4" w:uiPriority="62"/&gt;&lt;w:lsdException w:name="Medium Shading 1 Accent 4" w:uiPriority="63"/&gt;&lt;w:lsdException w:name="Medium Shading 2 Accent 4" w:uiPriority="64"/&gt;&lt;w:lsdException w:name="Medium List 1 Accent 4" w:uiPriority="65"/&gt;&lt;w:lsdException w:name="Medium List 2 Accent 4" w:uiPriority="66"/&gt;&lt;w:lsdException w:name="Medium Grid 1 Accent 4" w:uiPriority="67"/&gt;&lt;w:lsdException w:name="Medium Grid 2 Accent 4" w:uiPriority="68"/&gt;&lt;w:lsdException w:name="Medium Grid 3 Accent 4" w:uiPriority="69"/&gt;&lt;w:lsdException w:name="Dark List Accent 4" w:uiPriority="70"/&gt;&lt;w:lsdException w:name="Colorful Shading Accent 4" w:uiPriority="71"/&gt;&lt;w:lsdException w:name="Colorful List Accent 4" w:uiPriority="72"/&gt;&lt;w:lsdException w:name="Colorful Grid Accent 4" w:uiPriority="73"/&gt;&lt;w:lsdException w:name="Light Shading Accent 5" w:uiPriority="60"/&gt;&lt;w:lsdException w:name="Light List Accent 5" w:uiPriority="61"/&gt;&lt;w:lsdException w:name="Light Grid Accent 5" w:uiPriority="62"/&gt;&lt;w:lsdException w:name="Medium Shading 1 Accent 5" w:uiPriority="63"/&gt;&lt;w:lsdException w:name="Medium Shading 2 Accent 5" w:uiPriority="64"/&gt;&lt;w:lsdException w:name="Medium List 1 Accent 5" w:uiPriority="65"/&gt;&lt;w:lsdException w:name="Medium List 2 Accent 5" w:uiPriority="66"/&gt;&lt;w:lsdException w:name="Medium Grid 1 Accent 5" w:uiPriority="67"/&gt;&lt;w:lsdException w:name="Medium Grid 2 Accent 5" w:uiPriority="68"/&gt;&lt;w:lsdException w:name="Medium Grid 3 Accent 5" w:uiPriority="69"/&gt;&lt;w:lsdException w:name="Dark List Accent 5" w:uiPriority="70"/&gt;&lt;w:lsdException w:name="Colorful Shading Accent 5" w:uiPriority="71"/&gt;&lt;w:lsdException w:name="Colorful List Accent 5" w:uiPriority="72"/&gt;&lt;w:lsdException w:name="Colorful Grid Accent 5" w:uiPriority="73"/&gt;&lt;w:lsdException w:name="Light Shading Accent 6" w:uiPriority="60"/&gt;&lt;w:lsdException w:name="Light List Accent 6" w:uiPriority="61"/&gt;&lt;w:lsdException w:name="Light Grid Accent 6" w:uiPriority="62"/&gt;&lt;w:lsdException w:name="Medium Shading 1 Accent 6" w:uiPriority="63"/&gt;&lt;w:lsdException w:name="Medium Shading 2 Accent 6" w:uiPriority="64"/&gt;&lt;w:lsdException w:name="Medium List 1 Accent 6" w:uiPriority="65"/&gt;&lt;w:lsdException w:name="Medium List 2 Accent 6" w:uiPriority="66"/&gt;&lt;w:lsdException w:name="Medium Grid 1 Accent 6" w:uiPriority="67"/&gt;&lt;w:lsdException w:name="Medium Grid 2 Accent 6" w:uiPriority="68"/&gt;&lt;w:lsdException w:name="Medium Grid 3 Accent 6" w:uiPriority="69"/&gt;&lt;w:lsdException w:name="Dark List Accent 6" w:uiPriority="70"/&gt;&lt;w:lsdException w:name="Colorful Shading Accent 6" w:uiPriority="71"/&gt;&lt;w:lsdException w:name="Colorful List Accent 6" w:uiPriority="72"/&gt;&lt;w:lsdException w:name="Colorful Grid Accent 6" w:uiPriority="73"/&gt;&lt;w:lsdException w:name="Subtle Emphasis" w:uiPriority="19" w:qFormat="1"/&gt;&lt;w:lsdException w:name="Intense Emphasis" w:uiPriority="21" w:qFormat="1"/&gt;&lt;w:lsdException w:name="Subtle Reference" w:uiPriority="31" w:qFormat="1"/&gt;&lt;w:lsdException w:name="Intense Reference" w:uiPriority="32" w:qFormat="1"/&gt;&lt;w:lsdException w:name="Book Title" w:uiPriority="33" w:qFormat="1"/&gt;&lt;w:lsdException w:name="Bibliography" w:semiHidden="1" w:uiPriority="37" w:unhideWhenUsed="1"/&gt;&lt;w:lsdException w:name="TOC Heading" w:semiHidden="1" w:uiPriority="39" w:unhideWhenUsed="1" w:qFormat="1"/&gt;&lt;w:lsdException w:name="Plain Table 1" w:uiPriority="41"/&gt;&lt;w:lsdException w:name="Plain Table 2" w:uiPriority="42"/&gt;&lt;w:lsdException w:name="Plain Table 3" w:uiPriority="43"/&gt;&lt;w:lsdException w:name="Plain Table 4" w:uiPriority="44"/&gt;&lt;w:lsdException w:name="Plain Table 5" w:uiPriority="45"/&gt;&lt;w:lsdException w:name="Grid Table Light" w:uiPriority="40"/&gt;&lt;w:lsdException w:name="Grid Table 1 Light" w:uiPriority="46"/&gt;&lt;w:lsdException w:name="Grid Table 2" w:uiPriority="47"/&gt;&lt;w:lsdException w:name="Grid Table 3" w:uiPriority="48"/&gt;&lt;w:lsdException w:name="Grid Table 4" w:uiPriority="49"/&gt;&lt;w:lsdException w:name="Grid Table 5 Dark" w:uiPriority="50"/&gt;&lt;w:lsdException w:name="Grid Table 6 Colorful" w:uiPriority="51"/&gt;&lt;w:lsdException w:name="Grid Table 7 Colorful" w:uiPriority="52"/&gt;&lt;w:lsdException w:name="Grid Table 1 Light Accent 1" w:uiPriority="46"/&gt;&lt;w:lsdException w:name="Grid Table 2 Accent 1" w:uiPriority="47"/&gt;&lt;w:lsdException w:name="Grid Table 3 Accent 1" w:uiPriority="48"/&gt;&lt;w:lsdException w:name="Grid Table 4 Accent 1" w:uiPriority="49"/&gt;&lt;w:lsdException w:name="Grid Table 5 Dark Accent 1" w:uiPriority="50"/&gt;&lt;w:lsdException w:name="Grid Table 6 Colorful Accent 1" w:uiPriority="51"/&gt;&lt;w:lsdException w:name="Grid Table 7 Colorful Accent 1" w:uiPriority="52"/&gt;&lt;w:lsdException w:name="Grid Table 1 Light Accent 2" w:uiPriority="46"/&gt;&lt;w:lsdException w:name="Grid Table 2 Accent 2" w:uiPriority="47"/&gt;&lt;w:lsdException w:name="Grid Table 3 Accent 2" w:uiPriority="48"/&gt;&lt;w:lsdException w:name="Grid Table 4 Accent 2" w:uiPriority="49"/&gt;&lt;w:lsdException w:name="Grid Table 5 Dark Accent 2" w:uiPriority="50"/&gt;&lt;w:lsdException w:name="Grid Table 6 Colorful Accent 2" w:uiPriority="51"/&gt;&lt;w:lsdException w:name="Grid Table 7 Colorful Accent 2" w:uiPriority="52"/&gt;&lt;w:lsdException w:name="Grid Table 1 Light Accent 3" w:uiPriority="46"/&gt;&lt;w:lsdException w:name="Grid Table 2 Accent 3" w:uiPriority="47"/&gt;&lt;w:lsdException w:name="Grid Table 3 Accent 3" w:uiPriority="48"/&gt;&lt;w:lsdException w:name="Grid Table 4 Accent 3" w:uiPriority="49"/&gt;&lt;w:lsdException w:name="Grid Table 5 Dark Accent 3" w:uiPriority="50"/&gt;&lt;w:lsdException w:name="Grid Table 6 Colorful Accent 3" w:uiPriority="51"/&gt;&lt;w:lsdException w:name="Grid Table 7 Colorful Accent 3" w:uiPriority="52"/&gt;&lt;w:lsdException w:name="Grid Table 1 Light Accent 4" w:uiPriority="46"/&gt;&lt;w:lsdException w:name="Grid Table 2 Accent 4" w:uiPriority="47"/&gt;&lt;w:lsdException w:name="Grid Table 3 Accent 4" w:uiPriority="48"/&gt;&lt;w:lsdException w:name="Grid Table 4 Accent 4" w:uiPriority="49"/&gt;&lt;w:lsdException w:name="Grid Table 5 Dark Accent 4" w:uiPriority="50"/&gt;&lt;w:lsdException w:name="Grid Table 6 Colorful Accent 4" w:uiPriority="51"/&gt;&lt;w:lsdException w:name="Grid Table 7 Colorful Accent 4" w:uiPriority="52"/&gt;&lt;w:lsdException w:name="Grid Table 1 Light Accent 5" w:uiPriority="46"/&gt;&lt;w:lsdException w:name="Grid Table 2 Accent 5" w:uiPriority="47"/&gt;&lt;w:lsdException w:name="Grid Table 3 Accent 5" w:uiPriority="48"/&gt;&lt;w:lsdException w:name="Grid Table 4 Accent 5" w:uiPriority="49"/&gt;&lt;w:lsdException w:name="Grid Table 5 Dark Accent 5" w:uiPriority="50"/&gt;&lt;w:lsdException w:name="Grid Table 6 Colorful Accent 5" w:uiPriority="51"/&gt;&lt;w:lsdException w:name="Grid Table 7 Colorful Accent 5" w:uiPriority="52"/&gt;&lt;w:lsdException w:name="Grid Table 1 Light Accent 6" w:uiPriority="46"/&gt;&lt;w:lsdException w:name="Grid Table 2 Accent 6" w:uiPriority="47"/&gt;&lt;w:lsdException w:name="Grid Table 3 Accent 6" w:uiPriority="48"/&gt;&lt;w:lsdException w:name="Grid Table 4 Accent 6" w:uiPriority="49"/&gt;&lt;w:lsdException w:name="Grid Table 5 Dark Accent 6" w:uiPriority="50"/&gt;&lt;w:lsdException w:name="Grid Table 6 Colorful Accent 6" w:uiPriority="51"/&gt;&lt;w:lsdException w:name="Grid Table 7 Colorful Accent 6" w:uiPriority="52"/&gt;&lt;w:lsdException w:name="List Table 1 Light" w:uiPriority="46"/&gt;&lt;w:lsdException w:name="List Table 2" w:uiPriority="47"/&gt;&lt;w:lsdException w:name="List Table 3" w:uiPriority="48"/&gt;&lt;w:lsdException w:name="List Table 4" w:uiPriority="49"/&gt;&lt;w:lsdException w:name="List Table 5 Dark" w:uiPriority="50"/&gt;&lt;w:lsdException w:name="List Table 6 Colorful" w:uiPriority="51"/&gt;&lt;w:lsdException w:name="List Table 7 Colorful" w:uiPriority="52"/&gt;&lt;w:lsdException w:name="List Table 1 Light Accent 1" w:uiPriority="46"/&gt;&lt;w:lsdException w:name="List Table 2 Accent 1" w:uiPriority="47"/&gt;&lt;w:lsdException w:name="List Table 3 Accent 1" w:uiPriority="48"/&gt;&lt;w:lsdException w:name="List Table 4 Accent 1" w:uiPriority="49"/&gt;&lt;w:lsdException w:name="List Table 5 Dark Accent 1" w:uiPriority="50"/&gt;&lt;w:lsdException w:name="List Table 6 Colorful Accent 1" w:uiPriority="51"/&gt;&lt;w:lsdException w:name="List Table 7 Colorful Accent 1" w:uiPriority="52"/&gt;&lt;w:lsdException w:name="List Table 1 Light Accent 2" w:uiPriority="46"/&gt;&lt;w:lsdException w:name="List Table 2 Accent 2" w:uiPriority="47"/&gt;&lt;w:lsdException w:name="List Table 3 Accent 2" w:uiPriority="48"/&gt;&lt;w:lsdException w:name="List Table 4 Accent 2" w:uiPriority="49"/&gt;&lt;w:lsdException w:name="List Table 5 Dark Accent 2" w:uiPriority="50"/&gt;&lt;w:lsdException w:name="List Table 6 Colorful Accent 2" w:uiPriority="51"/&gt;&lt;w:lsdException w:name="List Table 7 Colorful Accent 2" w:uiPriority="52"/&gt;&lt;w:lsdException w:name="List Table 1 Light Accent 3" w:uiPriority="46"/&gt;&lt;w:lsdException w:name="List Table 2 Accent 3" w:uiPriority="47"/&gt;&lt;w:lsdException w:name="List Table 3 Accent 3" w:uiPriority="48"/&gt;&lt;w:lsdException w:name="List Table 4 Accent 3" w:uiPriority="49"/&gt;&lt;w:lsdException w:name="List Table 5 Dark Accent 3" w:uiPriority="50"/&gt;&lt;w:lsdException w:name="List Table 6 Colorful Accent 3" w:uiPriority="51"/&gt;&lt;w:lsdException w:name="List Table 7 Colorful Accent 3" w:uiPriority="52"/&gt;&lt;w:lsdException w:name="List Table 1 Light Accent 4" w:uiPriority="46"/&gt;&lt;w:lsdException w:name="List Table 2 Accent 4" w:uiPriority="47"/&gt;&lt;w:lsdException w:name="List Table 3 Accent 4" w:uiPriority="48"/&gt;&lt;w:lsdException w:name="List Table 4 Accent 4" w:uiPriority="49"/&gt;&lt;w:lsdException w:name="List Table 5 Dark Accent 4" w:uiPriority="50"/&gt;&lt;w:lsdException w:name="List Table 6 Colorful Accent 4" w:uiPriority="51"/&gt;&lt;w:lsdException w:name="List Table 7 Colorful Accent 4" w:uiPriority="52"/&gt;&lt;w:lsdException w:name="List Table 1 Light Accent 5" w:uiPriority="46"/&gt;&lt;w:lsdException w:name="List Table 2 Accent 5" w:uiPriority="47"/&gt;&lt;w:lsdException w:name="List Table 3 Accent 5" w:uiPriority="48"/&gt;&lt;w:lsdException w:name="List Table 4 Accent 5" w:uiPriority="49"/&gt;&lt;w:lsdException w:name="List Table 5 Dark Accent 5" w:uiPriority="50"/&gt;&lt;w:lsdException w:name="List Table 6 Colorful Accent 5" w:uiPriority="51"/&gt;&lt;w:lsdException w:name="List Table 7 Colorful Accent 5" w:uiPriority="52"/&gt;&lt;w:lsdException w:name="List Table 1 Light Accent 6" w:uiPriority="46"/&gt;&lt;w:lsdException w:name="List Table 2 Accent 6" w:uiPriority="47"/&gt;&lt;w:lsdException w:name="List Table 3 Accent 6" w:uiPriority="48"/&gt;&lt;w:lsdException w:name="List Table 4 Accent 6" w:uiPriority="49"/&gt;&lt;w:lsdException w:name="List Table 5 Dark Accent 6" w:uiPriority="50"/&gt;&lt;w:lsdException w:name="List Table 6 Colorful Accent 6" w:uiPriority="51"/&gt;&lt;w:lsdException w:name="List Table 7 Colorful Accent 6" w:uiPriority="52"/&gt;&lt;w:lsdException w:name="Mention" w:semiHidden="1" w:unhideWhenUsed="1"/&gt;&lt;w:lsdException w:name="Smart Hyperlink" w:semiHidden="1" w:unhideWhenUsed="1"/&gt;&lt;w:lsdException w:name="Hashtag" w:semiHidden="1" w:unhideWhenUsed="1"/&gt;&lt;/w:latentStyles&gt;&lt;w:style w:type="paragraph" w:default="1" w:styleId="Normal"&gt;&lt;w:name w:val="Normal"/&gt;&lt;w:qFormat/&gt;&lt;/w:style&gt;&lt;w:style w:type="character" w:default="1" w:styleId="DefaultParagraphFont"&gt;&lt;w:name w:val="Default Paragraph Font"/&gt;&lt;w:uiPriority w:val="1"/&gt;&lt;w:semiHidden/&gt;&lt;w:unhideWhenUsed/&gt;&lt;/w:style&gt;&lt;w:style w:type="table" w:default="1" w:styleId="TableNormal"&gt;&lt;w:name w:val="Normal Table"/&gt;&lt;w:uiPriority w:val="99"/&gt;&lt;w:semiHidden/&gt;&lt;w:unhideWhenUsed/&gt;&lt;w:tblPr&gt;&lt;w:tblInd w:w="0" w:type="dxa"/&gt;&lt;w:tblCellMar&gt;&lt;w:top w:w="0" w:type="dxa"/&gt;&lt;w:left w:w="108" w:type="dxa"/&gt;&lt;w:bottom w:w="0" w:type="dxa"/&gt;&lt;w:right w:w="108" w:type="dxa"/&gt;&lt;/w:tblCellMar&gt;&lt;/w:tblPr&gt;&lt;/w:style&gt;&lt;w:style w:type="numbering" w:default="1" w:styleId="NoList"&gt;&lt;w:name w:val="No List"/&gt;&lt;w:uiPriority w:val="99"/&gt;&lt;w:semiHidden/&gt;&lt;w:unhideWhenUsed/&gt;&lt;/w:style&gt;&lt;w:style w:type="character" w:styleId="PlaceholderText"&gt;&lt;w:name w:val="Placeholder Text"/&gt;&lt;w:basedOn w:val="DefaultParagraphFont"/&gt;&lt;w:uiPriority w:val="99"/&gt;&lt;w:rPr&gt;&lt;w:color w:val="7F7F7F" w:themeColor="text1" w:themeTint="80"/&gt;&lt;w:bdr w:val="none" w:sz="0" w:space="0" w:color="auto"/&gt;&lt;w:shd w:val="clear" w:color="auto" w:fill="F0F0F0"/&gt;&lt;/w:rPr&gt;&lt;/w:style&gt;&lt;w:style w:type="paragraph" w:customStyle="1" w:styleId="B7CF53EBD28C4270BBC51AAB20A1C895"&gt;&lt;w:name w:val="B7CF53EBD28C4270BBC51AAB20A1C895"/&gt;&lt;/w:style&gt;&lt;/w:styles&gt;&lt;/pkg:xmlData&gt;&lt;/pkg:part&gt;&lt;pkg:part pkg:name="/word/styles.xml" pkg:contentType="application/vnd.openxmlformats-officedocument.wordprocessingml.styles+xml"&gt;&lt;pkg:xmlData&gt;&lt;w:styles xmlns:mc="http://schemas.openxmlformats.org/markup-compatibility/2006" xmlns:r="http://schemas.openxmlformats.org/officeDocument/2006/relationships" xmlns:w="http://schemas.openxmlformats.org/wordprocessingml/2006/main" xmlns:w14="http://schemas.microsoft.com/office/word/2010/wordml" xmlns:w15="http://schemas.microsoft.com/office/word/2012/wordml" xmlns:w16se="http://schemas.microsoft.com/office/word/2015/wordml/symex" mc:Ignorable="w14 w15 w16se"&gt;&lt;w:docDefaults&gt;&lt;w:rPrDefault&gt;&lt;w:rPr&gt;&lt;w:rFonts w:asciiTheme="minorHAnsi" w:eastAsiaTheme="minorEastAsia" w:hAnsiTheme="minorHAnsi" w:cstheme="minorBidi"/&gt;&lt;w:sz w:val="19"/&gt;&lt;w:szCs w:val="19"/&gt;&lt;w:lang w:val="sv-SE" w:eastAsia="en-US" w:bidi="ar-SA"/&gt;&lt;/w:rPr&gt;&lt;/w:rPrDefault&gt;&lt;w:pPrDefault&gt;&lt;w:pPr&gt;&lt;w:spacing w:after="160" w:line="288" w:lineRule="auto"/&gt;&lt;/w:pPr&gt;&lt;/w:pPrDefault&gt;&lt;/w:docDefaults&gt;&lt;w:style w:type="paragraph" w:default="1" w:styleId="Normal"&gt;&lt;w:name w:val="Normal"/&gt;&lt;w:qFormat/&gt;&lt;w:rsid w:val="005F186C"/&gt;&lt;w:pPr&gt;&lt;w:spacing w:after="200"/&gt;&lt;/w:pPr&gt;&lt;w:rPr&gt;&lt;w:sz w:val="20"/&gt;&lt;w:lang w:val="en-GB"/&gt;&lt;/w:rPr&gt;&lt;/w:style&gt;&lt;w:style w:type="paragraph" w:styleId="Heading1"&gt;&lt;w:name w:val="heading 1"/&gt;&lt;w:basedOn w:val="Normal"/&gt;&lt;w:next w:val="Normal"/&gt;&lt;w:link w:val="Heading1Char"/&gt;&lt;w:uiPriority w:val="9"/&gt;&lt;w:qFormat/&gt;&lt;w:rsid w:val="000C3604"/&gt;&lt;w:pPr&gt;&lt;w:keepNext/&gt;&lt;w:keepLines/&gt;&lt;w:spacing w:before="240"/&gt;&lt;w:outlineLvl w:val="0"/&gt;&lt;/w:pPr&gt;&lt;w:rPr&gt;&lt;w:rFonts w:asciiTheme="majorHAnsi" w:eastAsiaTheme="majorEastAsia" w:hAnsiTheme="majorHAnsi" w:cstheme="majorBidi"/&gt;&lt;w:bCs/&gt;&lt;w:sz w:val="28"/&gt;&lt;w:szCs w:val="28"/&gt;&lt;/w:rPr&gt;&lt;/w:style&gt;&lt;w:style w:type="paragraph" w:styleId="Heading2"&gt;&lt;w:name w:val="heading 2"/&gt;&lt;w:basedOn w:val="Normal"/&gt;&lt;w:next w:val="Normal"/&gt;&lt;w:link w:val="Heading2Char"/&gt;&lt;w:uiPriority w:val="9"/&gt;&lt;w:qFormat/&gt;&lt;w:rsid w:val="000C3604"/&gt;&lt;w:pPr&gt;&lt;w:keepNext/&gt;&lt;w:keepLines/&gt;&lt;w:spacing w:before="240" w:after="80"/&gt;&lt;w:outlineLvl w:val="1"/&gt;&lt;/w:pPr&gt;&lt;w:rPr&gt;&lt;w:rFonts w:ascii="GothamMedium" w:eastAsiaTheme="majorEastAsia" w:hAnsi="GothamMedium" w:cstheme="majorBidi"/&gt;&lt;w:bCs/&gt;&lt;w:sz w:val="24"/&gt;&lt;w:szCs w:val="28"/&gt;&lt;/w:rPr&gt;&lt;/w:style&gt;&lt;w:style w:type="paragraph" w:styleId="Heading3"&gt;&lt;w:name w:val="heading 3"/&gt;&lt;w:basedOn w:val="Normal"/&gt;&lt;w:next w:val="Normal"/&gt;&lt;w:link w:val="Heading3Char"/&gt;&lt;w:uiPriority w:val="9"/&gt;&lt;w:qFormat/&gt;&lt;w:rsid w:val="00872413"/&gt;&lt;w:pPr&gt;&lt;w:keepNext/&gt;&lt;w:keepLines/&gt;&lt;w:spacing w:before="120" w:after="40"/&gt;&lt;w:outlineLvl w:val="2"/&gt;&lt;/w:pPr&gt;&lt;w:rPr&gt;&lt;w:rFonts w:ascii="GothamMedium" w:eastAsiaTheme="majorEastAsia" w:hAnsi="GothamMedium" w:cstheme="majorBidi"/&gt;&lt;w:sz w:val="22"/&gt;&lt;w:szCs w:val="24"/&gt;&lt;/w:rPr&gt;&lt;/w:style&gt;&lt;w:style w:type="paragraph" w:styleId="Heading4"&gt;&lt;w:name w:val="heading 4"/&gt;&lt;w:basedOn w:val="Normal"/&gt;&lt;w:next w:val="Normal"/&gt;&lt;w:link w:val="Heading4Char"/&gt;&lt;w:uiPriority w:val="9"/&gt;&lt;w:semiHidden/&gt;&lt;w:qFormat/&gt;&lt;w:rsid w:val="00872413"/&gt;&lt;w:pPr&gt;&lt;w:keepNext/&gt;&lt;w:keepLines/&gt;&lt;w:spacing w:before="120" w:after="40"/&gt;&lt;w:outlineLvl w:val="3"/&gt;&lt;/w:pPr&gt;&lt;w:rPr&gt;&lt;w:rFonts w:ascii="GothamMedium" w:eastAsiaTheme="majorEastAsia" w:hAnsi="GothamMedium" w:cstheme="majorBidi"/&gt;&lt;w:iCs/&gt;&lt;w:szCs w:val="24"/&gt;&lt;/w:rPr&gt;&lt;/w:style&gt;&lt;w:style w:type="paragraph" w:styleId="Heading5"&gt;&lt;w:name w:val="heading 5"/&gt;&lt;w:basedOn w:val="Normal"/&gt;&lt;w:next w:val="Normal"/&gt;&lt;w:link w:val="Heading5Char"/&gt;&lt;w:uiPriority w:val="9"/&gt;&lt;w:semiHidden/&gt;&lt;w:qFormat/&gt;&lt;w:rsid w:val="009B1B65"/&gt;&lt;w:pPr&gt;&lt;w:keepNext/&gt;&lt;w:keepLines/&gt;&lt;w:numPr&gt;&lt;w:ilvl w:val="4"/&gt;&lt;w:numId w:val="15"/&gt;&lt;/w:numPr&gt;&lt;w:spacing w:before="120" w:after="0"/&gt;&lt;w:outlineLvl w:val="4"/&gt;&lt;/w:pPr&gt;&lt;w:rPr&gt;&lt;w:rFonts w:asciiTheme="majorHAnsi" w:eastAsiaTheme="majorEastAsia" w:hAnsiTheme="majorHAnsi" w:cstheme="majorBidi"/&gt;&lt;w:b/&gt;&lt;w:bCs/&gt;&lt;/w:rPr&gt;&lt;/w:style&gt;&lt;w:style w:type="paragraph" w:styleId="Heading6"&gt;&lt;w:name w:val="heading 6"/&gt;&lt;w:basedOn w:val="Normal"/&gt;&lt;w:next w:val="Normal"/&gt;&lt;w:link w:val="Heading6Char"/&gt;&lt;w:uiPriority w:val="9"/&gt;&lt;w:semiHidden/&gt;&lt;w:rsid w:val="009B1B65"/&gt;&lt;w:pPr&gt;&lt;w:keepNext/&gt;&lt;w:keepLines/&gt;&lt;w:numPr&gt;&lt;w:ilvl w:val="5"/&gt;&lt;w:numId w:val="15"/&gt;&lt;/w:numPr&gt;&lt;w:spacing w:before="120" w:after="0"/&gt;&lt;w:outlineLvl w:val="5"/&gt;&lt;/w:pPr&gt;&lt;w:rPr&gt;&lt;w:rFonts w:asciiTheme="majorHAnsi" w:eastAsiaTheme="majorEastAsia" w:hAnsiTheme="majorHAnsi" w:cstheme="majorBidi"/&gt;&lt;w:b/&gt;&lt;w:bCs/&gt;&lt;w:i/&gt;&lt;w:iCs/&gt;&lt;/w:rPr&gt;&lt;/w:style&gt;&lt;w:style w:type="paragraph" w:styleId="Heading7"&gt;&lt;w:name w:val="heading 7"/&gt;&lt;w:basedOn w:val="Normal"/&gt;&lt;w:next w:val="Normal"/&gt;&lt;w:link w:val="Heading7Char"/&gt;&lt;w:uiPriority w:val="9"/&gt;&lt;w:semiHidden/&gt;&lt;w:rsid w:val="009B1B65"/&gt;&lt;w:pPr&gt;&lt;w:keepNext/&gt;&lt;w:keepLines/&gt;&lt;w:numPr&gt;&lt;w:ilvl w:val="6"/&gt;&lt;w:numId w:val="15"/&gt;&lt;/w:numPr&gt;&lt;w:spacing w:before="120" w:after="0"/&gt;&lt;w:outlineLvl w:val="6"/&gt;&lt;/w:pPr&gt;&lt;w:rPr&gt;&lt;w:i/&gt;&lt;w:iCs/&gt;&lt;/w:rPr&gt;&lt;/w:style&gt;&lt;w:style w:type="paragraph" w:styleId="Heading8"&gt;&lt;w:name w:val="heading 8"/&gt;&lt;w:basedOn w:val="Normal"/&gt;&lt;w:next w:val="Normal"/&gt;&lt;w:link w:val="Heading8Char"/&gt;&lt;w:uiPriority w:val="9"/&gt;&lt;w:semiHidden/&gt;&lt;w:rsid w:val="009B1B65"/&gt;&lt;w:pPr&gt;&lt;w:keepNext/&gt;&lt;w:keepLines/&gt;&lt;w:numPr&gt;&lt;w:ilvl w:val="7"/&gt;&lt;w:numId w:val="15"/&gt;&lt;/w:numPr&gt;&lt;w:spacing w:before="120" w:after="0"/&gt;&lt;w:outlineLvl w:val="7"/&gt;&lt;/w:pPr&gt;&lt;w:rPr&gt;&lt;w:b/&gt;&lt;w:bCs/&gt;&lt;/w:rPr&gt;&lt;/w:style&gt;&lt;w:style w:type="paragraph" w:styleId="Heading9"&gt;&lt;w:name w:val="heading 9"/&gt;&lt;w:basedOn w:val="Normal"/&gt;&lt;w:next w:val="Normal"/&gt;&lt;w:link w:val="Heading9Char"/&gt;&lt;w:uiPriority w:val="9"/&gt;&lt;w:semiHidden/&gt;&lt;w:rsid w:val="009B1B65"/&gt;&lt;w:pPr&gt;&lt;w:keepNext/&gt;&lt;w:keepLines/&gt;&lt;w:numPr&gt;&lt;w:ilvl w:val="8"/&gt;&lt;w:numId w:val="15"/&gt;&lt;/w:numPr&gt;&lt;w:spacing w:before="120" w:after="0"/&gt;&lt;w:outlineLvl w:val="8"/&gt;&lt;/w:pPr&gt;&lt;w:rPr&gt;&lt;w:i/&gt;&lt;w:iCs/&gt;&lt;/w:rPr&gt;&lt;/w:style&gt;&lt;w:style w:type="character" w:default="1" w:styleId="DefaultParagraphFont"&gt;&lt;w:name w:val="Default Paragraph Font"/&gt;&lt;w:uiPriority w:val="1"/&gt;&lt;w:semiHidden/&gt;&lt;w:unhideWhenUsed/&gt;&lt;/w:style&gt;&lt;w:style w:type="table" w:default="1" w:styleId="TableNormal"&gt;&lt;w:name w:val="Normal Table"/&gt;&lt;w:uiPriority w:val="99"/&gt;&lt;w:semiHidden/&gt;&lt;w:unhideWhenUsed/&gt;&lt;w:tblPr&gt;&lt;w:tblInd w:w="0" w:type="dxa"/&gt;&lt;w:tblCellMar&gt;&lt;w:top w:w="0" w:type="dxa"/&gt;&lt;w:left w:w="108" w:type="dxa"/&gt;&lt;w:bottom w:w="0" w:type="dxa"/&gt;&lt;w:right w:w="108" w:type="dxa"/&gt;&lt;/w:tblCellMar&gt;&lt;/w:tblPr&gt;&lt;/w:style&gt;&lt;w:style w:type="numbering" w:default="1" w:styleId="NoList"&gt;&lt;w:name w:val="No List"/&gt;&lt;w:uiPriority w:val="99"/&gt;&lt;w:semiHidden/&gt;&lt;w:unhideWhenUsed/&gt;&lt;/w:style&gt;&lt;w:style w:type="character" w:customStyle="1" w:styleId="Heading1Char"&gt;&lt;w:name w:val="Heading 1 Char"/&gt;&lt;w:basedOn w:val="DefaultParagraphFont"/&gt;&lt;w:link w:val="Heading1"/&gt;&lt;w:uiPriority w:val="9"/&gt;&lt;w:rsid w:val="000C3604"/&gt;&lt;w:rPr&gt;&lt;w:rFonts w:asciiTheme="majorHAnsi" w:eastAsiaTheme="majorEastAsia" w:hAnsiTheme="majorHAnsi" w:cstheme="majorBidi"/&gt;&lt;w:bCs/&gt;&lt;w:sz w:val="28"/&gt;&lt;w:szCs w:val="28"/&gt;&lt;w:lang w:val="en-GB"/&gt;&lt;/w:rPr&gt;&lt;/w:style&gt;&lt;w:style w:type="character" w:customStyle="1" w:styleId="Heading2Char"&gt;&lt;w:name w:val="Heading 2 Char"/&gt;&lt;w:basedOn w:val="DefaultParagraphFont"/&gt;&lt;w:link w:val="Heading2"/&gt;&lt;w:uiPriority w:val="9"/&gt;&lt;w:rsid w:val="000C3604"/&gt;&lt;w:rPr&gt;&lt;w:rFonts w:ascii="GothamMedium" w:eastAsiaTheme="majorEastAsia" w:hAnsi="GothamMedium" w:cstheme="majorBidi"/&gt;&lt;w:bCs/&gt;&lt;w:sz w:val="24"/&gt;&lt;w:szCs w:val="28"/&gt;&lt;w:lang w:val="en-GB"/&gt;&lt;/w:rPr&gt;&lt;/w:style&gt;&lt;w:style w:type="character" w:customStyle="1" w:styleId="Heading3Char"&gt;&lt;w:name w:val="Heading 3 Char"/&gt;&lt;w:basedOn w:val="DefaultParagraphFont"/&gt;&lt;w:link w:val="Heading3"/&gt;&lt;w:uiPriority w:val="9"/&gt;&lt;w:rsid w:val="00872413"/&gt;&lt;w:rPr&gt;&lt;w:rFonts w:ascii="GothamMedium" w:eastAsiaTheme="majorEastAsia" w:hAnsi="GothamMedium" w:cstheme="majorBidi"/&gt;&lt;w:sz w:val="22"/&gt;&lt;w:szCs w:val="24"/&gt;&lt;w:lang w:val="en-GB"/&gt;&lt;/w:rPr&gt;&lt;/w:style&gt;&lt;w:style w:type="character" w:customStyle="1" w:styleId="Heading4Char"&gt;&lt;w:name w:val="Heading 4 Char"/&gt;&lt;w:basedOn w:val="DefaultParagraphFont"/&gt;&lt;w:link w:val="Heading4"/&gt;&lt;w:uiPriority w:val="9"/&gt;&lt;w:semiHidden/&gt;&lt;w:rsid w:val="005F186C"/&gt;&lt;w:rPr&gt;&lt;w:rFonts w:ascii="GothamMedium" w:eastAsiaTheme="majorEastAsia" w:hAnsi="GothamMedium" w:cstheme="majorBidi"/&gt;&lt;w:iCs/&gt;&lt;w:sz w:val="20"/&gt;&lt;w:szCs w:val="24"/&gt;&lt;w:lang w:val="en-GB"/&gt;&lt;/w:rPr&gt;&lt;/w:style&gt;&lt;w:style w:type="character" w:customStyle="1" w:styleId="Heading5Char"&gt;&lt;w:name w:val="Heading 5 Char"/&gt;&lt;w:basedOn w:val="DefaultParagraphFont"/&gt;&lt;w:link w:val="Heading5"/&gt;&lt;w:uiPriority w:val="9"/&gt;&lt;w:semiHidden/&gt;&lt;w:rsid w:val="008E716E"/&gt;&lt;w:rPr&gt;&lt;w:rFonts w:asciiTheme="majorHAnsi" w:eastAsiaTheme="majorEastAsia" w:hAnsiTheme="majorHAnsi" w:cstheme="majorBidi"/&gt;&lt;w:b/&gt;&lt;w:bCs/&gt;&lt;w:lang w:val="en-GB"/&gt;&lt;/w:rPr&gt;&lt;/w:style&gt;&lt;w:style w:type="character" w:customStyle="1" w:styleId="Heading6Char"&gt;&lt;w:name w:val="Heading 6 Char"/&gt;&lt;w:basedOn w:val="DefaultParagraphFont"/&gt;&lt;w:link w:val="Heading6"/&gt;&lt;w:uiPriority w:val="9"/&gt;&lt;w:semiHidden/&gt;&lt;w:rsid w:val="008E716E"/&gt;&lt;w:rPr&gt;&lt;w:rFonts w:asciiTheme="majorHAnsi" w:eastAsiaTheme="majorEastAsia" w:hAnsiTheme="majorHAnsi" w:cstheme="majorBidi"/&gt;&lt;w:b/&gt;&lt;w:bCs/&gt;&lt;w:i/&gt;&lt;w:iCs/&gt;&lt;w:lang w:val="en-GB"/&gt;&lt;/w:rPr&gt;&lt;/w:style&gt;&lt;w:style w:type="character" w:customStyle="1" w:styleId="Heading7Char"&gt;&lt;w:name w:val="Heading 7 Char"/&gt;&lt;w:basedOn w:val="DefaultParagraphFont"/&gt;&lt;w:link w:val="Heading7"/&gt;&lt;w:uiPriority w:val="9"/&gt;&lt;w:semiHidden/&gt;&lt;w:rsid w:val="008E716E"/&gt;&lt;w:rPr&gt;&lt;w:i/&gt;&lt;w:iCs/&gt;&lt;w:lang w:val="en-GB"/&gt;&lt;/w:rPr&gt;&lt;/w:style&gt;&lt;w:style w:type="character" w:customStyle="1" w:styleId="Heading8Char"&gt;&lt;w:name w:val="Heading 8 Char"/&gt;&lt;w:basedOn w:val="DefaultParagraphFont"/&gt;&lt;w:link w:val="Heading8"/&gt;&lt;w:uiPriority w:val="9"/&gt;&lt;w:semiHidden/&gt;&lt;w:rsid w:val="008E716E"/&gt;&lt;w:rPr&gt;&lt;w:b/&gt;&lt;w:bCs/&gt;&lt;w:lang w:val="en-GB"/&gt;&lt;/w:rPr&gt;&lt;/w:style&gt;&lt;w:style w:type="character" w:customStyle="1" w:styleId="Heading9Char"&gt;&lt;w:name w:val="Heading 9 Char"/&gt;&lt;w:basedOn w:val="DefaultParagraphFont"/&gt;&lt;w:link w:val="Heading9"/&gt;&lt;w:uiPriority w:val="9"/&gt;&lt;w:semiHidden/&gt;&lt;w:rsid w:val="008E716E"/&gt;&lt;w:rPr&gt;&lt;w:i/&gt;&lt;w:iCs/&gt;&lt;w:lang w:val="en-GB"/&gt;&lt;/w:rPr&gt;&lt;/w:style&gt;&lt;w:style w:type="paragraph" w:styleId="Caption"&gt;&lt;w:name w:val="caption"/&gt;&lt;w:basedOn w:val="Normal"/&gt;&lt;w:next w:val="Normal"/&gt;&lt;w:uiPriority w:val="35"/&gt;&lt;w:semiHidden/&gt;&lt;w:rsid w:val="009B1B65"/&gt;&lt;w:rPr&gt;&lt;w:b/&gt;&lt;w:bCs/&gt;&lt;w:sz w:val="18"/&gt;&lt;w:szCs w:val="18"/&gt;&lt;/w:rPr&gt;&lt;/w:style&gt;&lt;w:style w:type="paragraph" w:styleId="Title"&gt;&lt;w:name w:val="Title"/&gt;&lt;w:basedOn w:val="Normal"/&gt;&lt;w:next w:val="Normal"/&gt;&lt;w:link w:val="TitleChar"/&gt;&lt;w:uiPriority w:val="10"/&gt;&lt;w:semiHidden/&gt;&lt;w:qFormat/&gt;&lt;w:rsid w:val="00872413"/&gt;&lt;w:pPr&gt;&lt;w:spacing w:after="0"/&gt;&lt;w:contextualSpacing/&gt;&lt;/w:pPr&gt;&lt;w:rPr&gt;&lt;w:rFonts w:asciiTheme="majorHAnsi" w:eastAsiaTheme="majorEastAsia" w:hAnsiTheme="majorHAnsi" w:cstheme="majorBidi"/&gt;&lt;w:bCs/&gt;&lt;w:color w:val="407077" w:themeColor="accent1"/&gt;&lt;w:sz w:val="72"/&gt;&lt;w:szCs w:val="48"/&gt;&lt;/w:rPr&gt;&lt;/w:style&gt;&lt;w:style w:type="character" w:customStyle="1" w:styleId="TitleChar"&gt;&lt;w:name w:val="Title Char"/&gt;&lt;w:basedOn w:val="DefaultParagraphFont"/&gt;&lt;w:link w:val="Title"/&gt;&lt;w:uiPriority w:val="10"/&gt;&lt;w:semiHidden/&gt;&lt;w:rsid w:val="005F186C"/&gt;&lt;w:rPr&gt;&lt;w:rFonts w:asciiTheme="majorHAnsi" w:eastAsiaTheme="majorEastAsia" w:hAnsiTheme="majorHAnsi" w:cstheme="majorBidi"/&gt;&lt;w:bCs/&gt;&lt;w:color w:val="407077" w:themeColor="accent1"/&gt;&lt;w:sz w:val="72"/&gt;&lt;w:szCs w:val="48"/&gt;&lt;w:lang w:val="en-GB"/&gt;&lt;/w:rPr&gt;&lt;/w:style&gt;&lt;w:style w:type="paragraph" w:styleId="Subtitle"&gt;&lt;w:name w:val="Subtitle"/&gt;&lt;w:basedOn w:val="Normal"/&gt;&lt;w:next w:val="Normal"/&gt;&lt;w:link w:val="SubtitleChar"/&gt;&lt;w:uiPriority w:val="11"/&gt;&lt;w:semiHidden/&gt;&lt;w:qFormat/&gt;&lt;w:rsid w:val="00872413"/&gt;&lt;w:pPr&gt;&lt;w:numPr&gt;&lt;w:ilvl w:val="1"/&gt;&lt;/w:numPr&gt;&lt;w:spacing w:before="120" w:after="240"/&gt;&lt;/w:pPr&gt;&lt;w:rPr&gt;&lt;w:rFonts w:ascii="GothamMedium" w:eastAsiaTheme="majorEastAsia" w:hAnsi="GothamMedium" w:cstheme="majorBidi"/&gt;&lt;w:color w:val="343436" w:themeColor="text2"/&gt;&lt;w:sz w:val="24"/&gt;&lt;w:szCs w:val="24"/&gt;&lt;/w:rPr&gt;&lt;/w:style&gt;&lt;w:style w:type="character" w:customStyle="1" w:styleId="SubtitleChar"&gt;&lt;w:name w:val="Subtitle Char"/&gt;&lt;w:basedOn w:val="DefaultParagraphFont"/&gt;&lt;w:link w:val="Subtitle"/&gt;&lt;w:uiPriority w:val="11"/&gt;&lt;w:semiHidden/&gt;&lt;w:rsid w:val="005F186C"/&gt;&lt;w:rPr&gt;&lt;w:rFonts w:ascii="GothamMedium" w:eastAsiaTheme="majorEastAsia" w:hAnsi="GothamMedium" w:cstheme="majorBidi"/&gt;&lt;w:color w:val="343436" w:themeColor="text2"/&gt;&lt;w:sz w:val="24"/&gt;&lt;w:szCs w:val="24"/&gt;&lt;w:lang w:val="en-GB"/&gt;&lt;/w:rPr&gt;&lt;/w:style&gt;&lt;w:style w:type="character" w:styleId="Strong"&gt;&lt;w:name w:val="Strong"/&gt;&lt;w:basedOn w:val="DefaultParagraphFont"/&gt;&lt;w:uiPriority w:val="22"/&gt;&lt;w:semiHidden/&gt;&lt;w:rsid w:val="009B1B65"/&gt;&lt;w:rPr&gt;&lt;w:b/&gt;&lt;w:bCs/&gt;&lt;w:color w:val="auto"/&gt;&lt;/w:rPr&gt;&lt;/w:style&gt;&lt;w:style w:type="character" w:styleId="Emphasis"&gt;&lt;w:name w:val="Emphasis"/&gt;&lt;w:basedOn w:val="DefaultParagraphFont"/&gt;&lt;w:uiPriority w:val="20"/&gt;&lt;w:semiHidden/&gt;&lt;w:rsid w:val="009B1B65"/&gt;&lt;w:rPr&gt;&lt;w:i/&gt;&lt;w:iCs/&gt;&lt;w:color w:val="auto"/&gt;&lt;/w:rPr&gt;&lt;/w:style&gt;&lt;w:style w:type="paragraph" w:styleId="NoSpacing"&gt;&lt;w:name w:val="No Spacing"/&gt;&lt;w:link w:val="NoSpacingChar"/&gt;&lt;w:uiPriority w:val="1"/&gt;&lt;w:qFormat/&gt;&lt;w:rsid w:val="00EA5662"/&gt;&lt;w:pPr&gt;&lt;w:spacing w:after="0"/&gt;&lt;/w:pPr&gt;&lt;/w:style&gt;&lt;w:style w:type="paragraph" w:styleId="Quote"&gt;&lt;w:name w:val="Quote"/&gt;&lt;w:basedOn w:val="Normal"/&gt;&lt;w:next w:val="Normal"/&gt;&lt;w:link w:val="QuoteChar"/&gt;&lt;w:uiPriority w:val="29"/&gt;&lt;w:semiHidden/&gt;&lt;w:rsid w:val="009B1B65"/&gt;&lt;w:pPr&gt;&lt;w:spacing w:before="200" w:line="264" w:lineRule="auto"/&gt;&lt;w:ind w:left="864" w:right="864"/&gt;&lt;w:jc w:val="center"/&gt;&lt;/w:pPr&gt;&lt;w:rPr&gt;&lt;w:rFonts w:asciiTheme="majorHAnsi" w:eastAsiaTheme="majorEastAsia" w:hAnsiTheme="majorHAnsi" w:cstheme="majorBidi"/&gt;&lt;w:i/&gt;&lt;w:iCs/&gt;&lt;w:sz w:val="24"/&gt;&lt;w:szCs w:val="24"/&gt;&lt;/w:rPr&gt;&lt;/w:style&gt;&lt;w:style w:type="character" w:customStyle="1" w:styleId="QuoteChar"&gt;&lt;w:name w:val="Quote Char"/&gt;&lt;w:basedOn w:val="DefaultParagraphFont"/&gt;&lt;w:link w:val="Quote"/&gt;&lt;w:uiPriority w:val="29"/&gt;&lt;w:semiHidden/&gt;&lt;w:rsid w:val="009B1B65"/&gt;&lt;w:rPr&gt;&lt;w:rFonts w:asciiTheme="majorHAnsi" w:eastAsiaTheme="majorEastAsia" w:hAnsiTheme="majorHAnsi" w:cstheme="majorBidi"/&gt;&lt;w:i/&gt;&lt;w:iCs/&gt;&lt;w:sz w:val="24"/&gt;&lt;w:szCs w:val="24"/&gt;&lt;/w:rPr&gt;&lt;/w:style&gt;&lt;w:style w:type="paragraph" w:styleId="IntenseQuote"&gt;&lt;w:name w:val="Intense Quote"/&gt;&lt;w:basedOn w:val="Normal"/&gt;&lt;w:next w:val="Normal"/&gt;&lt;w:link w:val="IntenseQuoteChar"/&gt;&lt;w:uiPriority w:val="30"/&gt;&lt;w:semiHidden/&gt;&lt;w:rsid w:val="009B1B65"/&gt;&lt;w:pPr&gt;&lt;w:spacing w:before="100" w:beforeAutospacing="1" w:after="240"/&gt;&lt;w:ind w:left="936" w:right="936"/&gt;&lt;w:jc w:val="center"/&gt;&lt;/w:pPr&gt;&lt;w:rPr&gt;&lt;w:rFonts w:asciiTheme="majorHAnsi" w:eastAsiaTheme="majorEastAsia" w:hAnsiTheme="majorHAnsi" w:cstheme="majorBidi"/&gt;&lt;w:sz w:val="26"/&gt;&lt;w:szCs w:val="26"/&gt;&lt;/w:rPr&gt;&lt;/w:style&gt;&lt;w:style w:type="character" w:customStyle="1" w:styleId="IntenseQuoteChar"&gt;&lt;w:name w:val="Intense Quote Char"/&gt;&lt;w:basedOn w:val="DefaultParagraphFont"/&gt;&lt;w:link w:val="IntenseQuote"/&gt;&lt;w:uiPriority w:val="30"/&gt;&lt;w:semiHidden/&gt;&lt;w:rsid w:val="009B1B65"/&gt;&lt;w:rPr&gt;&lt;w:rFonts w:asciiTheme="majorHAnsi" w:eastAsiaTheme="majorEastAsia" w:hAnsiTheme="majorHAnsi" w:cstheme="majorBidi"/&gt;&lt;w:sz w:val="26"/&gt;&lt;w:szCs w:val="26"/&gt;&lt;/w:rPr&gt;&lt;/w:style&gt;&lt;w:style w:type="character" w:styleId="SubtleEmphasis"&gt;&lt;w:name w:val="Subtle Emphasis"/&gt;&lt;w:basedOn w:val="DefaultParagraphFont"/&gt;&lt;w:uiPriority w:val="19"/&gt;&lt;w:semiHidden/&gt;&lt;w:rsid w:val="009B1B65"/&gt;&lt;w:rPr&gt;&lt;w:i/&gt;&lt;w:iCs/&gt;&lt;w:color w:val="auto"/&gt;&lt;/w:rPr&gt;&lt;/w:style&gt;&lt;w:style w:type="character" w:styleId="IntenseEmphasis"&gt;&lt;w:name w:val="Intense Emphasis"/&gt;&lt;w:basedOn w:val="DefaultParagraphFont"/&gt;&lt;w:uiPriority w:val="21"/&gt;&lt;w:semiHidden/&gt;&lt;w:rsid w:val="009B1B65"/&gt;&lt;w:rPr&gt;&lt;w:b/&gt;&lt;w:bCs/&gt;&lt;w:i/&gt;&lt;w:iCs/&gt;&lt;w:color w:val="auto"/&gt;&lt;/w:rPr&gt;&lt;/w:style&gt;&lt;w:style w:type="character" w:styleId="SubtleReference"&gt;&lt;w:name w:val="Subtle Reference"/&gt;&lt;w:basedOn w:val="DefaultParagraphFont"/&gt;&lt;w:uiPriority w:val="31"/&gt;&lt;w:semiHidden/&gt;&lt;w:rsid w:val="009B1B65"/&gt;&lt;w:rPr&gt;&lt;w:smallCaps/&gt;&lt;w:color w:val="auto"/&gt;&lt;w:u w:val="single" w:color="7F7F7F" w:themeColor="text1" w:themeTint="80"/&gt;&lt;/w:rPr&gt;&lt;/w:style&gt;&lt;w:style w:type="character" w:styleId="IntenseReference"&gt;&lt;w:name w:val="Intense Reference"/&gt;&lt;w:basedOn w:val="DefaultParagraphFont"/&gt;&lt;w:uiPriority w:val="32"/&gt;&lt;w:semiHidden/&gt;&lt;w:rsid w:val="009B1B65"/&gt;&lt;w:rPr&gt;&lt;w:b/&gt;&lt;w:bCs/&gt;&lt;w:smallCaps/&gt;&lt;w:color w:val="auto"/&gt;&lt;w:u w:val="single"/&gt;&lt;/w:rPr&gt;&lt;/w:style&gt;&lt;w:style w:type="character" w:styleId="BookTitle"&gt;&lt;w:name w:val="Book Title"/&gt;&lt;w:basedOn w:val="DefaultParagraphFont"/&gt;&lt;w:uiPriority w:val="33"/&gt;&lt;w:semiHidden/&gt;&lt;w:rsid w:val="009B1B65"/&gt;&lt;w:rPr&gt;&lt;w:b/&gt;&lt;w:bCs/&gt;&lt;w:smallCaps/&gt;&lt;w:color w:val="auto"/&gt;&lt;/w:rPr&gt;&lt;/w:style&gt;&lt;w:style w:type="paragraph" w:styleId="TOCHeading"&gt;&lt;w:name w:val="TOC Heading"/&gt;&lt;w:basedOn w:val="Normal"/&gt;&lt;w:next w:val="Normal"/&gt;&lt;w:uiPriority w:val="39"/&gt;&lt;w:semiHidden/&gt;&lt;w:rsid w:val="009F4214"/&gt;&lt;w:pPr&gt;&lt;w:keepNext/&gt;&lt;w:keepLines/&gt;&lt;w:pageBreakBefore/&gt;&lt;/w:pPr&gt;&lt;w:rPr&gt;&lt;w:rFonts w:asciiTheme="majorHAnsi" w:hAnsiTheme="majorHAnsi"/&gt;&lt;w:b/&gt;&lt;w:sz w:val="32"/&gt;&lt;/w:rPr&gt;&lt;/w:style&gt;&lt;w:style w:type="paragraph" w:styleId="ListBullet"&gt;&lt;w:name w:val="List Bullet"/&gt;&lt;w:basedOn w:val="Normal"/&gt;&lt;w:uiPriority w:val="14"/&gt;&lt;w:qFormat/&gt;&lt;w:rsid w:val="001D4B24"/&gt;&lt;w:pPr&gt;&lt;w:numPr&gt;&lt;w:numId w:val="1"/&gt;&lt;/w:numPr&gt;&lt;w:spacing w:after="80"/&gt;&lt;w:contextualSpacing/&gt;&lt;/w:pPr&gt;&lt;/w:style&gt;&lt;w:style w:type="paragraph" w:styleId="ListNumber"&gt;&lt;w:name w:val="List Number"/&gt;&lt;w:basedOn w:val="Normal"/&gt;&lt;w:uiPriority w:val="14"/&gt;&lt;w:qFormat/&gt;&lt;w:rsid w:val="00223177"/&gt;&lt;w:pPr&gt;&lt;w:numPr&gt;&lt;w:numId w:val="6"/&gt;&lt;/w:numPr&gt;&lt;w:spacing w:after="80"/&gt;&lt;w:ind w:left="357" w:hanging="357"/&gt;&lt;w:contextualSpacing/&gt;&lt;/w:pPr&gt;&lt;/w:style&gt;&lt;w:style w:type="table" w:styleId="TableGrid"&gt;&lt;w:name w:val="Table Grid"/&gt;&lt;w:basedOn w:val="TableNormal"/&gt;&lt;w:uiPriority w:val="39"/&gt;&lt;w:rsid w:val="00572408"/&gt;&lt;w:pPr&gt;&lt;w:spacing w:after="0" w:line="240" w:lineRule="auto"/&gt;&lt;/w:pPr&gt;&lt;w:tblPr/&gt;&lt;/w:style&gt;&lt;w:style w:type="paragraph" w:styleId="FootnoteText"&gt;&lt;w:name w:val="footnote text"/&gt;&lt;w:basedOn w:val="Normal"/&gt;&lt;w:link w:val="FootnoteTextChar"/&gt;&lt;w:uiPriority w:val="99"/&gt;&lt;w:semiHidden/&gt;&lt;w:rsid w:val="00872413"/&gt;&lt;w:pPr&gt;&lt;w:spacing w:after="0"/&gt;&lt;/w:pPr&gt;&lt;w:rPr&gt;&lt;w:sz w:val="14"/&gt;&lt;w:szCs w:val="20"/&gt;&lt;/w:rPr&gt;&lt;/w:style&gt;&lt;w:style w:type="character" w:customStyle="1" w:styleId="FootnoteTextChar"&gt;&lt;w:name w:val="Footnote Text Char"/&gt;&lt;w:basedOn w:val="DefaultParagraphFont"/&gt;&lt;w:link w:val="FootnoteText"/&gt;&lt;w:uiPriority w:val="99"/&gt;&lt;w:semiHidden/&gt;&lt;w:rsid w:val="005F186C"/&gt;&lt;w:rPr&gt;&lt;w:sz w:val="14"/&gt;&lt;w:szCs w:val="20"/&gt;&lt;w:lang w:val="en-GB"/&gt;&lt;/w:rPr&gt;&lt;/w:style&gt;&lt;w:style w:type="character" w:styleId="FootnoteReference"&gt;&lt;w:name w:val="footnote reference"/&gt;&lt;w:basedOn w:val="DefaultParagraphFont"/&gt;&lt;w:uiPriority w:val="99"/&gt;&lt;w:semiHidden/&gt;&lt;w:rsid w:val="00884E47"/&gt;&lt;w:rPr&gt;&lt;w:vertAlign w:val="superscript"/&gt;&lt;/w:rPr&gt;&lt;/w:style&gt;&lt;w:style w:type="paragraph" w:styleId="Header"&gt;&lt;w:name w:val="header"/&gt;&lt;w:basedOn w:val="Normal"/&gt;&lt;w:link w:val="HeaderChar"/&gt;&lt;w:uiPriority w:val="99"/&gt;&lt;w:semiHidden/&gt;&lt;w:rsid w:val="005F186C"/&gt;&lt;w:pPr&gt;&lt;w:tabs&gt;&lt;w:tab w:val="center" w:pos="4536"/&gt;&lt;w:tab w:val="right" w:pos="9072"/&gt;&lt;/w:tabs&gt;&lt;w:spacing w:after="0" w:line="240" w:lineRule="auto"/&gt;&lt;/w:pPr&gt;&lt;w:rPr&gt;&lt;w:color w:val="858585" w:themeColor="accent5"/&gt;&lt;w:sz w:val="16"/&gt;&lt;/w:rPr&gt;&lt;/w:style&gt;&lt;w:style w:type="character" w:customStyle="1" w:styleId="HeaderChar"&gt;&lt;w:name w:val="Header Char"/&gt;&lt;w:basedOn w:val="DefaultParagraphFont"/&gt;&lt;w:link w:val="Header"/&gt;&lt;w:uiPriority w:val="99"/&gt;&lt;w:semiHidden/&gt;&lt;w:rsid w:val="005F186C"/&gt;&lt;w:rPr&gt;&lt;w:color w:val="858585" w:themeColor="accent5"/&gt;&lt;w:sz w:val="16"/&gt;&lt;w:lang w:val="en-GB"/&gt;&lt;/w:rPr&gt;&lt;/w:style&gt;&lt;w:style w:type="paragraph" w:styleId="Footer"&gt;&lt;w:name w:val="footer"/&gt;&lt;w:basedOn w:val="Normal"/&gt;&lt;w:link w:val="FooterChar"/&gt;&lt;w:uiPriority w:val="99"/&gt;&lt;w:semiHidden/&gt;&lt;w:rsid w:val="005F186C"/&gt;&lt;w:pPr&gt;&lt;w:tabs&gt;&lt;w:tab w:val="center" w:pos="4536"/&gt;&lt;w:tab w:val="right" w:pos="9072"/&gt;&lt;/w:tabs&gt;&lt;w:spacing w:after="0" w:line="240" w:lineRule="auto"/&gt;&lt;/w:pPr&gt;&lt;w:rPr&gt;&lt;w:color w:val="858585" w:themeColor="accent5"/&gt;&lt;w:sz w:val="16"/&gt;&lt;/w:rPr&gt;&lt;/w:style&gt;&lt;w:style w:type="character" w:customStyle="1" w:styleId="FooterChar"&gt;&lt;w:name w:val="Footer Char"/&gt;&lt;w:basedOn w:val="DefaultParagraphFont"/&gt;&lt;w:link w:val="Footer"/&gt;&lt;w:uiPriority w:val="99"/&gt;&lt;w:semiHidden/&gt;&lt;w:rsid w:val="005F186C"/&gt;&lt;w:rPr&gt;&lt;w:color w:val="858585" w:themeColor="accent5"/&gt;&lt;w:sz w:val="16"/&gt;&lt;w:lang w:val="en-GB"/&gt;&lt;/w:rPr&gt;&lt;/w:style&gt;&lt;w:style w:type="paragraph" w:styleId="TOC1"&gt;&lt;w:name w:val="toc 1"/&gt;&lt;w:basedOn w:val="Normal"/&gt;&lt;w:next w:val="Normal"/&gt;&lt;w:uiPriority w:val="39"/&gt;&lt;w:semiHidden/&gt;&lt;w:rsid w:val="00421476"/&gt;&lt;w:pPr&gt;&lt;w:tabs&gt;&lt;w:tab w:val="right" w:leader="dot" w:pos="8210"/&gt;&lt;/w:tabs&gt;&lt;w:spacing w:after="100"/&gt;&lt;w:ind w:left="426" w:hanging="426"/&gt;&lt;/w:pPr&gt;&lt;/w:style&gt;&lt;w:style w:type="paragraph" w:styleId="TOC2"&gt;&lt;w:name w:val="toc 2"/&gt;&lt;w:basedOn w:val="Normal"/&gt;&lt;w:next w:val="Normal"/&gt;&lt;w:uiPriority w:val="39"/&gt;&lt;w:semiHidden/&gt;&lt;w:rsid w:val="00EE62A8"/&gt;&lt;w:pPr&gt;&lt;w:tabs&gt;&lt;w:tab w:val="right" w:leader="dot" w:pos="8210"/&gt;&lt;/w:tabs&gt;&lt;w:spacing w:after="100"/&gt;&lt;w:ind w:left="1134" w:hanging="708"/&gt;&lt;/w:pPr&gt;&lt;w:rPr&gt;&lt;w:noProof/&gt;&lt;/w:rPr&gt;&lt;/w:style&gt;&lt;w:style w:type="paragraph" w:styleId="TOC3"&gt;&lt;w:name w:val="toc 3"/&gt;&lt;w:basedOn w:val="Normal"/&gt;&lt;w:next w:val="Normal"/&gt;&lt;w:uiPriority w:val="39"/&gt;&lt;w:semiHidden/&gt;&lt;w:rsid w:val="00EE62A8"/&gt;&lt;w:pPr&gt;&lt;w:tabs&gt;&lt;w:tab w:val="right" w:leader="dot" w:pos="8210"/&gt;&lt;/w:tabs&gt;&lt;w:spacing w:after="100"/&gt;&lt;w:ind w:left="1134" w:hanging="694"/&gt;&lt;/w:pPr&gt;&lt;w:rPr&gt;&lt;w:noProof/&gt;&lt;/w:rPr&gt;&lt;/w:style&gt;&lt;w:style w:type="character" w:styleId="Hyperlink"&gt;&lt;w:name w:val="Hyperlink"/&gt;&lt;w:basedOn w:val="DefaultParagraphFont"/&gt;&lt;w:uiPriority w:val="99"/&gt;&lt;w:semiHidden/&gt;&lt;w:rsid w:val="008555A7"/&gt;&lt;w:rPr&gt;&lt;w:color w:val="A1BF35" w:themeColor="hyperlink"/&gt;&lt;w:u w:val="single"/&gt;&lt;/w:rPr&gt;&lt;/w:style&gt;&lt;w:style w:type="paragraph" w:styleId="TOC4"&gt;&lt;w:name w:val="toc 4"/&gt;&lt;w:basedOn w:val="Normal"/&gt;&lt;w:next w:val="Normal"/&gt;&lt;w:uiPriority w:val="39"/&gt;&lt;w:semiHidden/&gt;&lt;w:rsid w:val="00FF2698"/&gt;&lt;w:pPr&gt;&lt;w:spacing w:after="100"/&gt;&lt;w:ind w:left="660"/&gt;&lt;/w:pPr&gt;&lt;/w:style&gt;&lt;w:style w:type="paragraph" w:styleId="TOC5"&gt;&lt;w:name w:val="toc 5"/&gt;&lt;w:basedOn w:val="Normal"/&gt;&lt;w:next w:val="Normal"/&gt;&lt;w:uiPriority w:val="39"/&gt;&lt;w:semiHidden/&gt;&lt;w:rsid w:val="00FF2698"/&gt;&lt;w:pPr&gt;&lt;w:spacing w:after="100"/&gt;&lt;w:ind w:left="880"/&gt;&lt;/w:pPr&gt;&lt;/w:style&gt;&lt;w:style w:type="paragraph" w:styleId="TOC6"&gt;&lt;w:name w:val="toc 6"/&gt;&lt;w:basedOn w:val="Normal"/&gt;&lt;w:next w:val="Normal"/&gt;&lt;w:uiPriority w:val="39"/&gt;&lt;w:semiHidden/&gt;&lt;w:rsid w:val="00FF2698"/&gt;&lt;w:pPr&gt;&lt;w:spacing w:after="100"/&gt;&lt;w:ind w:left="1100"/&gt;&lt;/w:pPr&gt;&lt;/w:style&gt;&lt;w:style w:type="paragraph" w:styleId="TOC7"&gt;&lt;w:name w:val="toc 7"/&gt;&lt;w:basedOn w:val="Normal"/&gt;&lt;w:next w:val="Normal"/&gt;&lt;w:uiPriority w:val="39"/&gt;&lt;w:semiHidden/&gt;&lt;w:rsid w:val="00FF2698"/&gt;&lt;w:pPr&gt;&lt;w:spacing w:after="100"/&gt;&lt;w:ind w:left="1320"/&gt;&lt;/w:pPr&gt;&lt;/w:style&gt;&lt;w:style w:type="paragraph" w:styleId="TOC8"&gt;&lt;w:name w:val="toc 8"/&gt;&lt;w:basedOn w:val="Normal"/&gt;&lt;w:next w:val="Normal"/&gt;&lt;w:uiPriority w:val="39"/&gt;&lt;w:semiHidden/&gt;&lt;w:rsid w:val="00FF2698"/&gt;&lt;w:pPr&gt;&lt;w:spacing w:after="100"/&gt;&lt;w:ind w:left="1540"/&gt;&lt;/w:pPr&gt;&lt;/w:style&gt;&lt;w:style w:type="paragraph" w:styleId="TOC9"&gt;&lt;w:name w:val="toc 9"/&gt;&lt;w:basedOn w:val="Normal"/&gt;&lt;w:next w:val="Normal"/&gt;&lt;w:uiPriority w:val="39"/&gt;&lt;w:semiHidden/&gt;&lt;w:rsid w:val="00FF2698"/&gt;&lt;w:pPr&gt;&lt;w:spacing w:after="100"/&gt;&lt;w:ind w:left="1760"/&gt;&lt;/w:pPr&gt;&lt;/w:style&gt;&lt;w:style w:type="paragraph" w:styleId="ListNumber2"&gt;&lt;w:name w:val="List Number 2"/&gt;&lt;w:basedOn w:val="ListNumber"/&gt;&lt;w:uiPriority w:val="14"/&gt;&lt;w:rsid w:val="00130001"/&gt;&lt;w:pPr&gt;&lt;w:numPr&gt;&lt;w:ilvl w:val="1"/&gt;&lt;/w:numPr&gt;&lt;/w:pPr&gt;&lt;/w:style&gt;&lt;w:style w:type="paragraph" w:styleId="ListNumber3"&gt;&lt;w:name w:val="List Number 3"/&gt;&lt;w:basedOn w:val="ListNumber2"/&gt;&lt;w:uiPriority w:val="14"/&gt;&lt;w:rsid w:val="00130001"/&gt;&lt;w:pPr&gt;&lt;w:numPr&gt;&lt;w:ilvl w:val="2"/&gt;&lt;/w:numPr&gt;&lt;/w:pPr&gt;&lt;/w:style&gt;&lt;w:style w:type="paragraph" w:styleId="ListNumber4"&gt;&lt;w:name w:val="List Number 4"/&gt;&lt;w:basedOn w:val="ListNumber3"/&gt;&lt;w:uiPriority w:val="14"/&gt;&lt;w:semiHidden/&gt;&lt;w:rsid w:val="00130001"/&gt;&lt;w:pPr&gt;&lt;w:numPr&gt;&lt;w:ilvl w:val="3"/&gt;&lt;/w:numPr&gt;&lt;/w:pPr&gt;&lt;/w:style&gt;&lt;w:style w:type="paragraph" w:styleId="ListNumber5"&gt;&lt;w:name w:val="List Number 5"/&gt;&lt;w:basedOn w:val="ListNumber4"/&gt;&lt;w:uiPriority w:val="14"/&gt;&lt;w:semiHidden/&gt;&lt;w:rsid w:val="00130001"/&gt;&lt;w:pPr&gt;&lt;w:numPr&gt;&lt;w:ilvl w:val="4"/&gt;&lt;/w:numPr&gt;&lt;/w:pPr&gt;&lt;/w:style&gt;&lt;w:style w:type="paragraph" w:styleId="ListBullet2"&gt;&lt;w:name w:val="List Bullet 2"/&gt;&lt;w:basedOn w:val="ListBullet"/&gt;&lt;w:uiPriority w:val="14"/&gt;&lt;w:rsid w:val="00FE2BED"/&gt;&lt;w:pPr&gt;&lt;w:numPr&gt;&lt;w:ilvl w:val="1"/&gt;&lt;/w:numPr&gt;&lt;/w:pPr&gt;&lt;/w:style&gt;&lt;w:style w:type="paragraph" w:styleId="ListBullet3"&gt;&lt;w:name w:val="List Bullet 3"/&gt;&lt;w:basedOn w:val="ListBullet2"/&gt;&lt;w:uiPriority w:val="14"/&gt;&lt;w:rsid w:val="00FE2BED"/&gt;&lt;w:pPr&gt;&lt;w:numPr&gt;&lt;w:ilvl w:val="2"/&gt;&lt;/w:numPr&gt;&lt;/w:pPr&gt;&lt;/w:style&gt;&lt;w:style w:type="paragraph" w:styleId="ListBullet4"&gt;&lt;w:name w:val="List Bullet 4"/&gt;&lt;w:basedOn w:val="ListBullet3"/&gt;&lt;w:uiPriority w:val="14"/&gt;&lt;w:semiHidden/&gt;&lt;w:rsid w:val="00FE2BED"/&gt;&lt;w:pPr&gt;&lt;w:numPr&gt;&lt;w:ilvl w:val="3"/&gt;&lt;/w:numPr&gt;&lt;/w:pPr&gt;&lt;/w:style&gt;&lt;w:style w:type="paragraph" w:styleId="ListBullet5"&gt;&lt;w:name w:val="List Bullet 5"/&gt;&lt;w:basedOn w:val="ListBullet4"/&gt;&lt;w:uiPriority w:val="14"/&gt;&lt;w:semiHidden/&gt;&lt;w:rsid w:val="00FE2BED"/&gt;&lt;w:pPr&gt;&lt;w:numPr&gt;&lt;w:ilvl w:val="4"/&gt;&lt;/w:numPr&gt;&lt;/w:pPr&gt;&lt;/w:style&gt;&lt;w:style w:type="character" w:styleId="PlaceholderText"&gt;&lt;w:name w:val="Placeholder Text"/&gt;&lt;w:basedOn w:val="DefaultParagraphFont"/&gt;&lt;w:uiPriority w:val="99"/&gt;&lt;w:rsid w:val="009C6FDB"/&gt;&lt;w:rPr&gt;&lt;w:color w:val="7F7F7F" w:themeColor="text1" w:themeTint="80"/&gt;&lt;w:bdr w:val="none" w:sz="0" w:space="0" w:color="auto"/&gt;&lt;w:shd w:val="clear" w:color="auto" w:fill="F0F0F0"/&gt;&lt;/w:rPr&gt;&lt;/w:style&gt;&lt;w:style w:type="paragraph" w:customStyle="1" w:styleId="Hiddentext"&gt;&lt;w:name w:val="Hidden text"/&gt;&lt;w:basedOn w:val="Normal"/&gt;&lt;w:next w:val="Normal"/&gt;&lt;w:uiPriority w:val="24"/&gt;&lt;w:semiHidden/&gt;&lt;w:qFormat/&gt;&lt;w:rsid w:val="00D86E66"/&gt;&lt;w:rPr&gt;&lt;w:vanish/&gt;&lt;w:color w:val="C00000"/&gt;&lt;/w:rPr&gt;&lt;/w:style&gt;&lt;w:style w:type="paragraph" w:customStyle="1" w:styleId="NumberedHeading1"&gt;&lt;w:name w:val="Numbered Heading 1"/&gt;&lt;w:basedOn w:val="Heading1"/&gt;&lt;w:next w:val="Normal"/&gt;&lt;w:uiPriority w:val="10"/&gt;&lt;w:semiHidden/&gt;&lt;w:qFormat/&gt;&lt;w:rsid w:val="00494FFB"/&gt;&lt;w:pPr&gt;&lt;w:numPr&gt;&lt;w:numId w:val="12"/&gt;&lt;/w:numPr&gt;&lt;/w:pPr&gt;&lt;/w:style&gt;&lt;w:style w:type="paragraph" w:customStyle="1" w:styleId="NumberedHeading2"&gt;&lt;w:name w:val="Numbered Heading 2"/&gt;&lt;w:basedOn w:val="Heading2"/&gt;&lt;w:next w:val="Normal"/&gt;&lt;w:uiPriority w:val="10"/&gt;&lt;w:semiHidden/&gt;&lt;w:qFormat/&gt;&lt;w:rsid w:val="00DA7B63"/&gt;&lt;w:pPr&gt;&lt;w:numPr&gt;&lt;w:ilvl w:val="1"/&gt;&lt;w:numId w:val="12"/&gt;&lt;/w:numPr&gt;&lt;/w:pPr&gt;&lt;/w:style&gt;&lt;w:style w:type="paragraph" w:customStyle="1" w:styleId="NumberedHeading3"&gt;&lt;w:name w:val="Numbered Heading 3"/&gt;&lt;w:basedOn w:val="Heading3"/&gt;&lt;w:next w:val="Normal"/&gt;&lt;w:uiPriority w:val="10"/&gt;&lt;w:semiHidden/&gt;&lt;w:qFormat/&gt;&lt;w:rsid w:val="00DA7B63"/&gt;&lt;w:pPr&gt;&lt;w:numPr&gt;&lt;w:ilvl w:val="2"/&gt;&lt;w:numId w:val="12"/&gt;&lt;/w:numPr&gt;&lt;/w:pPr&gt;&lt;/w:style&gt;&lt;w:style w:type="paragraph" w:customStyle="1" w:styleId="NumberedHeading4"&gt;&lt;w:name w:val="Numbered Heading 4"/&gt;&lt;w:basedOn w:val="Heading4"/&gt;&lt;w:next w:val="Normal"/&gt;&lt;w:uiPriority w:val="10"/&gt;&lt;w:semiHidden/&gt;&lt;w:qFormat/&gt;&lt;w:rsid w:val="00DA7B63"/&gt;&lt;w:pPr&gt;&lt;w:numPr&gt;&lt;w:ilvl w:val="3"/&gt;&lt;w:numId w:val="12"/&gt;&lt;/w:numPr&gt;&lt;/w:pPr&gt;&lt;/w:style&gt;&lt;w:style w:type="character" w:customStyle="1" w:styleId="NoSpacingChar"&gt;&lt;w:name w:val="No Spacing Char"/&gt;&lt;w:basedOn w:val="DefaultParagraphFont"/&gt;&lt;w:link w:val="NoSpacing"/&gt;&lt;w:uiPriority w:val="1"/&gt;&lt;w:rsid w:val="00EE7F0A"/&gt;&lt;/w:style&gt;&lt;w:style w:type="paragraph" w:styleId="BalloonText"&gt;&lt;w:name w:val="Balloon Text"/&gt;&lt;w:basedOn w:val="Normal"/&gt;&lt;w:link w:val="BalloonTextChar"/&gt;&lt;w:uiPriority w:val="99"/&gt;&lt;w:semiHidden/&gt;&lt;w:unhideWhenUsed/&gt;&lt;w:rsid w:val="00421476"/&gt;&lt;w:pPr&gt;&lt;w:spacing w:after="0"/&gt;&lt;/w:pPr&gt;&lt;w:rPr&gt;&lt;w:rFonts w:cs="Segoe UI"/&gt;&lt;w:sz w:val="18"/&gt;&lt;w:szCs w:val="18"/&gt;&lt;/w:rPr&gt;&lt;/w:style&gt;&lt;w:style w:type="character" w:customStyle="1" w:styleId="BalloonTextChar"&gt;&lt;w:name w:val="Balloon Text Char"/&gt;&lt;w:basedOn w:val="DefaultParagraphFont"/&gt;&lt;w:link w:val="BalloonText"/&gt;&lt;w:uiPriority w:val="99"/&gt;&lt;w:semiHidden/&gt;&lt;w:rsid w:val="00421476"/&gt;&lt;w:rPr&gt;&lt;w:rFonts w:cs="Segoe UI"/&gt;&lt;w:sz w:val="18"/&gt;&lt;w:szCs w:val="18"/&gt;&lt;w:lang w:val="en-GB"/&gt;&lt;/w:rPr&gt;&lt;/w:style&gt;&lt;w:style w:type="paragraph" w:customStyle="1" w:styleId="Footertext"&gt;&lt;w:name w:val="Footer text"/&gt;&lt;w:basedOn w:val="Normal"/&gt;&lt;w:uiPriority w:val="10"/&gt;&lt;w:semiHidden/&gt;&lt;w:qFormat/&gt;&lt;w:rsid w:val="001407DF"/&gt;&lt;w:pPr&gt;&lt;w:framePr w:wrap="around" w:vAnchor="page" w:hAnchor="page" w:x="852" w:y="14176"/&gt;&lt;w:spacing w:before="40" w:after="40"/&gt;&lt;/w:pPr&gt;&lt;w:rPr&gt;&lt;w:color w:val="858585" w:themeColor="accent5"/&gt;&lt;w:sz w:val="16"/&gt;&lt;/w:rPr&gt;&lt;/w:style&gt;&lt;w:style w:type="paragraph" w:customStyle="1" w:styleId="Footertitle"&gt;&lt;w:name w:val="Footer title"/&gt;&lt;w:basedOn w:val="Footertext"/&gt;&lt;w:uiPriority w:val="10"/&gt;&lt;w:semiHidden/&gt;&lt;w:qFormat/&gt;&lt;w:rsid w:val="00E4504C"/&gt;&lt;w:pPr&gt;&lt;w:framePr w:wrap="around"/&gt;&lt;/w:pPr&gt;&lt;w:rPr&gt;&lt;w:b/&gt;&lt;w:color w:val="407077" w:themeColor="accent1"/&gt;&lt;/w:rPr&gt;&lt;/w:style&gt;&lt;w:style w:type="table" w:customStyle="1" w:styleId="BetssonTable01"&gt;&lt;w:name w:val="Betsson Table 01"/&gt;&lt;w:basedOn w:val="TableNormal"/&gt;&lt;w:uiPriority w:val="99"/&gt;&lt;w:rsid w:val="00036B11"/&gt;&lt;w:pPr&gt;&lt;w:spacing w:after="0" w:line="240" w:lineRule="auto"/&gt;&lt;w:jc w:val="right"/&gt;&lt;/w:pPr&gt;&lt;w:tblPr&gt;&lt;w:tblBorders&gt;&lt;w:bottom w:val="single" w:sz="4" w:space="0" w:color="407077" w:themeColor="accent1"/&gt;&lt;w:insideH w:val="single" w:sz="4" w:space="0" w:color="407077" w:themeColor="accent1"/&gt;&lt;/w:tblBorders&gt;&lt;w:tblCellMar&gt;&lt;w:top w:w="57" w:type="dxa"/&gt;&lt;w:left w:w="57" w:type="dxa"/&gt;&lt;w:bottom w:w="57" w:type="dxa"/&gt;&lt;w:right w:w="57" w:type="dxa"/&gt;&lt;/w:tblCellMar&gt;&lt;/w:tblPr&gt;&lt;w:tblStylePr w:type="firstRow"&gt;&lt;w:pPr&gt;&lt;w:jc w:val="right"/&gt;&lt;/w:pPr&gt;&lt;w:rPr&gt;&lt;w:rFonts w:asciiTheme="majorHAnsi" w:hAnsiTheme="majorHAnsi"/&gt;&lt;w:b/&gt;&lt;w:color w:val="407077" w:themeColor="accent1"/&gt;&lt;/w:rPr&gt;&lt;w:tblPr/&gt;&lt;w:tcPr&gt;&lt;w:tcBorders&gt;&lt;w:bottom w:val="single" w:sz="12" w:space="0" w:color="407077" w:themeColor="accent1"/&gt;&lt;/w:tcBorders&gt;&lt;w:vAlign w:val="bottom"/&gt;&lt;/w:tcPr&gt;&lt;/w:tblStylePr&gt;&lt;w:tblStylePr w:type="lastRow"&gt;&lt;w:rPr&gt;&lt;w:rFonts w:asciiTheme="majorHAnsi" w:hAnsiTheme="majorHAnsi"/&gt;&lt;w:b/&gt;&lt;/w:rPr&gt;&lt;w:tblPr/&gt;&lt;w:tcPr&gt;&lt;w:tcBorders&gt;&lt;w:top w:val="double" w:sz="4" w:space="0" w:color="407077" w:themeColor="accent1"/&gt;&lt;w:left w:val="nil"/&gt;&lt;w:bottom w:val="nil"/&gt;&lt;w:right w:val="nil"/&gt;&lt;w:insideH w:val="nil"/&gt;&lt;w:insideV w:val="nil"/&gt;&lt;w:tl2br w:val="nil"/&gt;&lt;w:tr2bl w:val="nil"/&gt;&lt;/w:tcBorders&gt;&lt;/w:tcPr&gt;&lt;/w:tblStylePr&gt;&lt;w:tblStylePr w:type="firstCol"&gt;&lt;w:pPr&gt;&lt;w:jc w:val="left"/&gt;&lt;/w:pPr&gt;&lt;/w:tblStylePr&gt;&lt;w:tblStylePr w:type="lastCol"&gt;&lt;w:rPr&gt;&lt;w:rFonts w:asciiTheme="majorHAnsi" w:hAnsiTheme="majorHAnsi"/&gt;&lt;w:b/&gt;&lt;/w:rPr&gt;&lt;/w:tblStylePr&gt;&lt;w:tblStylePr w:type="nwCell"&gt;&lt;w:pPr&gt;&lt;w:jc w:val="left"/&gt;&lt;/w:pPr&gt;&lt;w:tblPr/&gt;&lt;w:tcPr&gt;&lt;w:vAlign w:val="bottom"/&gt;&lt;/w:tcPr&gt;&lt;/w:tblStylePr&gt;&lt;/w:style&gt;&lt;w:style w:type="table" w:styleId="TableGridLight"&gt;&lt;w:name w:val="Grid Table Light"/&gt;&lt;w:aliases w:val="Betsson Table 02"/&gt;&lt;w:basedOn w:val="TableNormal"/&gt;&lt;w:uiPriority w:val="40"/&gt;&lt;w:rsid w:val="00036B11"/&gt;&lt;w:pPr&gt;&lt;w:spacing w:after="0" w:line="240" w:lineRule="auto"/&gt;&lt;w:jc w:val="right"/&gt;&lt;/w:pPr&gt;&lt;w:tblPr&gt;&lt;w:tblStyleRowBandSize w:val="1"/&gt;&lt;w:tblBorders&gt;&lt;w:insideH w:val="single" w:sz="4" w:space="0" w:color="407077" w:themeColor="accent1"/&gt;&lt;/w:tblBorders&gt;&lt;w:tblCellMar&gt;&lt;w:top w:w="57" w:type="dxa"/&gt;&lt;w:left w:w="57" w:type="dxa"/&gt;&lt;w:bottom w:w="57" w:type="dxa"/&gt;&lt;w:right w:w="57" w:type="dxa"/&gt;&lt;/w:tblCellMar&gt;&lt;/w:tblPr&gt;&lt;w:tcPr&gt;&lt;w:shd w:val="clear" w:color="auto" w:fill="auto"/&gt;&lt;/w:tcPr&gt;&lt;w:tblStylePr w:type="firstRow"&gt;&lt;w:pPr&gt;&lt;w:wordWrap/&gt;&lt;w:spacing w:beforeLines="0" w:before="80" w:beforeAutospacing="0" w:afterLines="0" w:after="0" w:afterAutospacing="0"/&gt;&lt;w:jc w:val="right"/&gt;&lt;/w:pPr&gt;&lt;w:rPr&gt;&lt;w:rFonts w:asciiTheme="majorHAnsi" w:hAnsiTheme="majorHAnsi"/&gt;&lt;w:b/&gt;&lt;w:color w:val="FFFFFF" w:themeColor="background1"/&gt;&lt;/w:rPr&gt;&lt;w:tblPr/&gt;&lt;w:tcPr&gt;&lt;w:shd w:val="clear" w:color="auto" w:fill="407077" w:themeFill="accent1"/&gt;&lt;w:vAlign w:val="bottom"/&gt;&lt;/w:tcPr&gt;&lt;/w:tblStylePr&gt;&lt;w:tblStylePr w:type="lastRow"&gt;&lt;w:rPr&gt;&lt;w:rFonts w:asciiTheme="majorHAnsi" w:hAnsiTheme="majorHAnsi"/&gt;&lt;w:b/&gt;&lt;/w:rPr&gt;&lt;w:tblPr/&gt;&lt;w:tcPr&gt;&lt;w:tcBorders&gt;&lt;w:top w:val="double" w:sz="4" w:space="0" w:color="407077" w:themeColor="accent1"/&gt;&lt;/w:tcBorders&gt;&lt;w:shd w:val="clear" w:color="auto" w:fill="auto"/&gt;&lt;/w:tcPr&gt;&lt;/w:tblStylePr&gt;&lt;w:tblStylePr w:type="firstCol"&gt;&lt;w:pPr&gt;&lt;w:jc w:val="left"/&gt;&lt;/w:pPr&gt;&lt;/w:tblStylePr&gt;&lt;w:tblStylePr w:type="lastCol"&gt;&lt;w:pPr&gt;&lt;w:jc w:val="right"/&gt;&lt;/w:pPr&gt;&lt;w:rPr&gt;&lt;w:rFonts w:asciiTheme="majorHAnsi" w:hAnsiTheme="majorHAnsi"/&gt;&lt;w:b/&gt;&lt;/w:rPr&gt;&lt;/w:tblStylePr&gt;&lt;w:tblStylePr w:type="nwCell"&gt;&lt;w:pPr&gt;&lt;w:jc w:val="left"/&gt;&lt;/w:pPr&gt;&lt;w:tblPr/&gt;&lt;w:tcPr&gt;&lt;w:vAlign w:val="bottom"/&gt;&lt;/w:tcPr&gt;&lt;/w:tblStylePr&gt;&lt;/w:style&gt;&lt;w:style w:type="paragraph" w:customStyle="1" w:styleId="Tabletext"&gt;&lt;w:name w:val="Table text"/&gt;&lt;w:basedOn w:val="Normal"/&gt;&lt;w:uiPriority w:val="15"/&gt;&lt;w:rsid w:val="005F186C"/&gt;&lt;w:pPr&gt;&lt;w:spacing w:after="0" w:line="240" w:lineRule="auto"/&gt;&lt;/w:pPr&gt;&lt;w:rPr&gt;&lt;w:sz w:val="16"/&gt;&lt;/w:rPr&gt;&lt;/w:style&gt;&lt;w:style w:type="paragraph" w:customStyle="1" w:styleId="Tabletitle"&gt;&lt;w:name w:val="Table title"/&gt;&lt;w:basedOn w:val="Tabletext"/&gt;&lt;w:uiPriority w:val="15"/&gt;&lt;w:rsid w:val="00C5110E"/&gt;&lt;w:pPr&gt;&lt;w:framePr w:wrap="around" w:vAnchor="page" w:hAnchor="page" w:x="852" w:y="14176"/&gt;&lt;w:spacing w:before="40" w:after="40"/&gt;&lt;/w:pPr&gt;&lt;w:rPr&gt;&lt;w:b/&gt;&lt;w:color w:val="407077" w:themeColor="accent1"/&gt;&lt;/w:rPr&gt;&lt;/w:style&gt;&lt;w:style w:type="paragraph" w:customStyle="1" w:styleId="FootertitleWhite"&gt;&lt;w:name w:val="Footer title White"/&gt;&lt;w:basedOn w:val="Footertitle"/&gt;&lt;w:semiHidden/&gt;&lt;w:rsid w:val="000049A5"/&gt;&lt;w:pPr&gt;&lt;w:framePr w:wrap="around"/&gt;&lt;/w:pPr&gt;&lt;w:rPr&gt;&lt;w:bCs/&gt;&lt;w:color w:val="FFFFFF" w:themeColor="background1"/&gt;&lt;/w:rPr&gt;&lt;/w:style&gt;&lt;w:style w:type="paragraph" w:styleId="DocumentMap"&gt;&lt;w:name w:val="Document Map"/&gt;&lt;w:basedOn w:val="Normal"/&gt;&lt;w:link w:val="DocumentMapChar"/&gt;&lt;w:uiPriority w:val="99"/&gt;&lt;w:semiHidden/&gt;&lt;w:rsid w:val="00421476"/&gt;&lt;w:pPr&gt;&lt;w:spacing w:after="0"/&gt;&lt;/w:pPr&gt;&lt;w:rPr&gt;&lt;w:rFonts w:cs="Segoe UI"/&gt;&lt;w:sz w:val="16"/&gt;&lt;w:szCs w:val="16"/&gt;&lt;/w:rPr&gt;&lt;/w:style&gt;&lt;w:style w:type="character" w:customStyle="1" w:styleId="DocumentMapChar"&gt;&lt;w:name w:val="Document Map Char"/&gt;&lt;w:basedOn w:val="DefaultParagraphFont"/&gt;&lt;w:link w:val="DocumentMap"/&gt;&lt;w:uiPriority w:val="99"/&gt;&lt;w:semiHidden/&gt;&lt;w:rsid w:val="00421476"/&gt;&lt;w:rPr&gt;&lt;w:rFonts w:cs="Segoe UI"/&gt;&lt;w:sz w:val="16"/&gt;&lt;w:szCs w:val="16"/&gt;&lt;w:lang w:val="en-GB"/&gt;&lt;/w:rPr&gt;&lt;/w:style&gt;&lt;w:style w:type="character" w:styleId="HTMLSample"&gt;&lt;w:name w:val="HTML Sample"/&gt;&lt;w:basedOn w:val="DefaultParagraphFont"/&gt;&lt;w:uiPriority w:val="99"/&gt;&lt;w:semiHidden/&gt;&lt;w:unhideWhenUsed/&gt;&lt;w:rsid w:val="00421476"/&gt;&lt;w:rPr&gt;&lt;w:rFonts w:asciiTheme="minorHAnsi" w:hAnsiTheme="minorHAnsi"/&gt;&lt;w:sz w:val="24"/&gt;&lt;w:szCs w:val="24"/&gt;&lt;/w:rPr&gt;&lt;/w:style&gt;&lt;w:style w:type="paragraph" w:styleId="HTMLPreformatted"&gt;&lt;w:name w:val="HTML Preformatted"/&gt;&lt;w:basedOn w:val="Normal"/&gt;&lt;w:link w:val="HTMLPreformattedChar"/&gt;&lt;w:uiPriority w:val="99"/&gt;&lt;w:semiHidden/&gt;&lt;w:rsid w:val="00421476"/&gt;&lt;w:pPr&gt;&lt;w:spacing w:after="0"/&gt;&lt;/w:pPr&gt;&lt;w:rPr&gt;&lt;w:szCs w:val="20"/&gt;&lt;/w:rPr&gt;&lt;/w:style&gt;&lt;w:style w:type="character" w:customStyle="1" w:styleId="HTMLPreformattedChar"&gt;&lt;w:name w:val="HTML Preformatted Char"/&gt;&lt;w:basedOn w:val="DefaultParagraphFont"/&gt;&lt;w:link w:val="HTMLPreformatted"/&gt;&lt;w:uiPriority w:val="99"/&gt;&lt;w:semiHidden/&gt;&lt;w:rsid w:val="00421476"/&gt;&lt;w:rPr&gt;&lt;w:sz w:val="20"/&gt;&lt;w:szCs w:val="20"/&gt;&lt;w:lang w:val="en-GB"/&gt;&lt;/w:rPr&gt;&lt;/w:style&gt;&lt;w:style w:type="character" w:styleId="HTMLCode"&gt;&lt;w:name w:val="HTML Code"/&gt;&lt;w:basedOn w:val="DefaultParagraphFont"/&gt;&lt;w:uiPriority w:val="99"/&gt;&lt;w:semiHidden/&gt;&lt;w:rsid w:val="00421476"/&gt;&lt;w:rPr&gt;&lt;w:rFonts w:asciiTheme="minorHAnsi" w:hAnsiTheme="minorHAnsi"/&gt;&lt;w:sz w:val="20"/&gt;&lt;w:szCs w:val="20"/&gt;&lt;/w:rPr&gt;&lt;/w:style&gt;&lt;w:style w:type="character" w:styleId="HTMLTypewriter"&gt;&lt;w:name w:val="HTML Typewriter"/&gt;&lt;w:basedOn w:val="DefaultParagraphFont"/&gt;&lt;w:uiPriority w:val="99"/&gt;&lt;w:semiHidden/&gt;&lt;w:rsid w:val="00421476"/&gt;&lt;w:rPr&gt;&lt;w:rFonts w:asciiTheme="minorHAnsi" w:hAnsiTheme="minorHAnsi"/&gt;&lt;w:sz w:val="20"/&gt;&lt;w:szCs w:val="20"/&gt;&lt;/w:rPr&gt;&lt;/w:style&gt;&lt;w:style w:type="character" w:styleId="HTMLKeyboard"&gt;&lt;w:name w:val="HTML Keyboard"/&gt;&lt;w:basedOn w:val="DefaultParagraphFont"/&gt;&lt;w:uiPriority w:val="99"/&gt;&lt;w:semiHidden/&gt;&lt;w:rsid w:val="00421476"/&gt;&lt;w:rPr&gt;&lt;w:rFonts w:asciiTheme="minorHAnsi" w:hAnsiTheme="minorHAnsi"/&gt;&lt;w:sz w:val="20"/&gt;&lt;w:szCs w:val="20"/&gt;&lt;/w:rPr&gt;&lt;/w:style&gt;&lt;w:style w:type="paragraph" w:styleId="MacroText"&gt;&lt;w:name w:val="macro"/&gt;&lt;w:link w:val="MacroTextChar"/&gt;&lt;w:uiPriority w:val="99"/&gt;&lt;w:semiHidden/&gt;&lt;w:rsid w:val="00421476"/&gt;&lt;w:pPr&gt;&lt;w:tabs&gt;&lt;w:tab w:val="left" w:pos="480"/&gt;&lt;w:tab w:val="left" w:pos="960"/&gt;&lt;w:tab w:val="left" w:pos="1440"/&gt;&lt;w:tab w:val="left" w:pos="1920"/&gt;&lt;w:tab w:val="left" w:pos="2400"/&gt;&lt;w:tab w:val="left" w:pos="2880"/&gt;&lt;w:tab w:val="left" w:pos="3360"/&gt;&lt;w:tab w:val="left" w:pos="3840"/&gt;&lt;w:tab w:val="left" w:pos="4320"/&gt;&lt;/w:tabs&gt;&lt;w:spacing w:after="0" w:line="240" w:lineRule="auto"/&gt;&lt;/w:pPr&gt;&lt;w:rPr&gt;&lt;w:sz w:val="20"/&gt;&lt;w:szCs w:val="20"/&gt;&lt;w:lang w:val="en-GB"/&gt;&lt;/w:rPr&gt;&lt;/w:style&gt;&lt;w:style w:type="character" w:customStyle="1" w:styleId="MacroTextChar"&gt;&lt;w:name w:val="Macro Text Char"/&gt;&lt;w:basedOn w:val="DefaultParagraphFont"/&gt;&lt;w:link w:val="MacroText"/&gt;&lt;w:uiPriority w:val="99"/&gt;&lt;w:semiHidden/&gt;&lt;w:rsid w:val="00421476"/&gt;&lt;w:rPr&gt;&lt;w:sz w:val="20"/&gt;&lt;w:szCs w:val="20"/&gt;&lt;w:lang w:val="en-GB"/&gt;&lt;/w:rPr&gt;&lt;/w:style&gt;&lt;w:style w:type="paragraph" w:styleId="NormalWeb"&gt;&lt;w:name w:val="Normal (Web)"/&gt;&lt;w:basedOn w:val="Normal"/&gt;&lt;w:uiPriority w:val="99"/&gt;&lt;w:semiHidden/&gt;&lt;w:rsid w:val="00421476"/&gt;&lt;w:rPr&gt;&lt;w:rFonts w:cs="Times New Roman"/&gt;&lt;w:sz w:val="24"/&gt;&lt;w:szCs w:val="24"/&gt;&lt;/w:rPr&gt;&lt;/w:style&gt;&lt;w:style w:type="paragraph" w:styleId="PlainText"&gt;&lt;w:name w:val="Plain Text"/&gt;&lt;w:basedOn w:val="Normal"/&gt;&lt;w:link w:val="PlainTextChar"/&gt;&lt;w:uiPriority w:val="99"/&gt;&lt;w:semiHidden/&gt;&lt;w:rsid w:val="00421476"/&gt;&lt;w:pPr&gt;&lt;w:spacing w:after="0"/&gt;&lt;/w:pPr&gt;&lt;w:rPr&gt;&lt;w:sz w:val="21"/&gt;&lt;w:szCs w:val="21"/&gt;&lt;/w:rPr&gt;&lt;/w:style&gt;&lt;w:style w:type="character" w:customStyle="1" w:styleId="PlainTextChar"&gt;&lt;w:name w:val="Plain Text Char"/&gt;&lt;w:basedOn w:val="DefaultParagraphFont"/&gt;&lt;w:link w:val="PlainText"/&gt;&lt;w:uiPriority w:val="99"/&gt;&lt;w:semiHidden/&gt;&lt;w:rsid w:val="00421476"/&gt;&lt;w:rPr&gt;&lt;w:sz w:val="21"/&gt;&lt;w:szCs w:val="21"/&gt;&lt;w:lang w:val="en-GB"/&gt;&lt;/w:rPr&gt;&lt;/w:style&gt;&lt;w:style w:type="paragraph" w:customStyle="1" w:styleId="Name"&gt;&lt;w:name w:val="Name"/&gt;&lt;w:basedOn w:val="Normal"/&gt;&lt;w:next w:val="Normal"/&gt;&lt;w:uiPriority w:val="10"/&gt;&lt;w:rsid w:val="00C17BB4"/&gt;&lt;w:pPr&gt;&lt;w:spacing w:after="0" w:line="240" w:lineRule="auto"/&gt;&lt;/w:pPr&gt;&lt;w:rPr&gt;&lt;w:rFonts w:asciiTheme="majorHAnsi" w:hAnsiTheme="majorHAnsi"/&gt;&lt;/w:rPr&gt;&lt;/w:style&gt;&lt;w:style w:type="paragraph" w:customStyle="1" w:styleId="Info"&gt;&lt;w:name w:val="Info"/&gt;&lt;w:basedOn w:val="Normal"/&gt;&lt;w:uiPriority w:val="10"/&gt;&lt;w:rsid w:val="008B734D"/&gt;&lt;w:pPr&gt;&lt;w:spacing w:after="0" w:line="240" w:lineRule="auto"/&gt;&lt;/w:pPr&gt;&lt;/w:style&gt;&lt;/w:styles&gt;&lt;/pkg:xmlData&gt;&lt;/pkg:part&gt;&lt;pkg:part pkg:name="/word/glossary/fontTable.xml" pkg:contentType="application/vnd.openxmlformats-officedocument.wordprocessingml.fontTable+xml"&gt;&lt;pkg:xmlData&gt;&lt;w:fonts xmlns:mc="http://schemas.openxmlformats.org/markup-compatibility/2006" xmlns:r="http://schemas.openxmlformats.org/officeDocument/2006/relationships" xmlns:w="http://schemas.openxmlformats.org/wordprocessingml/2006/main" xmlns:w14="http://schemas.microsoft.com/office/word/2010/wordml" xmlns:w15="http://schemas.microsoft.com/office/word/2012/wordml" xmlns:w16se="http://schemas.microsoft.com/office/word/2015/wordml/symex" mc:Ignorable="w14 w15 w16se"/&gt;&lt;/pkg:xmlData&gt;&lt;/pkg:part&gt;&lt;pkg:part pkg:name="/word/glossary/webSettings.xml" pkg:contentType="application/vnd.openxmlformats-officedocument.wordprocessingml.webSettings+xml"&gt;&lt;pkg:xmlData&gt;&lt;w:webSettings xmlns:mc="http://schemas.openxmlformats.org/markup-compatibility/2006" xmlns:r="http://schemas.openxmlformats.org/officeDocument/2006/relationships" xmlns:w="http://schemas.openxmlformats.org/wordprocessingml/2006/main" xmlns:w14="http://schemas.microsoft.com/office/word/2010/wordml" xmlns:w15="http://schemas.microsoft.com/office/word/2012/wordml" xmlns:w16se="http://schemas.microsoft.com/office/word/2015/wordml/symex" mc:Ignorable="w14 w15 w16se"&gt;&lt;w:optimizeForBrowser/&gt;&lt;w:allowPNG/&gt;&lt;/w:webSettings&gt;&lt;/pkg:xmlData&gt;&lt;/pkg:part&gt;&lt;pkg:part pkg:name="/word/numbering.xml" pkg:contentType="application/vnd.openxmlformats-officedocument.wordprocessingml.numbering+xml"&gt;&lt;pkg:xmlData&gt;&lt;w:numbering xmlns:wpc="http://schemas.microsoft.com/office/word/2010/wordprocessingCanvas" xmlns:cx="http://schemas.microsoft.com/office/drawing/2014/chartex" xmlns:cx1="http://schemas.microsoft.com/office/drawing/2015/9/8/chartex" xmlns:cx2="http://schemas.microsoft.com/office/drawing/2015/10/21/chartex" xmlns:cx3="http://schemas.microsoft.com/office/drawing/2016/5/9/chartex" xmlns:cx4="http://schemas.microsoft.com/office/drawing/2016/5/10/chartex" xmlns:cx5="http://schemas.microsoft.com/office/drawing/2016/5/11/chartex" xmlns:cx6="http://schemas.microsoft.com/office/drawing/2016/5/12/chartex" xmlns:cx7="http://schemas.microsoft.com/office/drawing/2016/5/13/chartex" xmlns:cx8="http://schemas.microsoft.com/office/drawing/2016/5/14/chartex" xmlns:mc="http://schemas.openxmlformats.org/markup-compatibility/2006" xmlns:o="urn:schemas-microsoft-com:office:office" xmlns:r="http://schemas.openxmlformats.org/officeDocument/2006/relationships" xmlns:m="http://schemas.openxmlformats.org/officeDocument/2006/math" xmlns:v="urn:schemas-microsoft-com:vml" xmlns:wp14="http://schemas.microsoft.com/office/word/2010/wordprocessingDrawing" xmlns:wp="http://schemas.openxmlformats.org/drawingml/2006/wordprocessingDrawing" xmlns:w10="urn:schemas-microsoft-com:office:word" xmlns:w="http://schemas.openxmlformats.org/wordprocessingml/2006/main" xmlns:w14="http://schemas.microsoft.com/office/word/2010/wordml" xmlns:w15="http://schemas.microsoft.com/office/word/2012/wordml" xmlns:w16se="http://schemas.microsoft.com/office/word/2015/wordml/symex" xmlns:wpg="http://schemas.microsoft.com/office/word/2010/wordprocessingGroup" xmlns:wpi="http://schemas.microsoft.com/office/word/2010/wordprocessingInk" xmlns:wne="http://schemas.microsoft.com/office/word/2006/wordml" xmlns:wps="http://schemas.microsoft.com/office/word/2010/wordprocessingShape" mc:Ignorable="w14 w15 w16se wp14"&gt;&lt;w:abstractNum w:abstractNumId="0" w15:restartNumberingAfterBreak="0"&gt;&lt;w:nsid w:val="FFFFFF7C"/&gt;&lt;w:multiLevelType w:val="singleLevel"/&gt;&lt;w:tmpl w:val="1D6AD0EC"/&gt;&lt;w:lvl w:ilvl="0"&gt;&lt;w:start w:val="1"/&gt;&lt;w:numFmt w:val="decimal"/&gt;&lt;w:lvlText w:val="%1."/&gt;&lt;w:lvlJc w:val="left"/&gt;&lt;w:pPr&gt;&lt;w:tabs&gt;&lt;w:tab w:val="num" w:pos="1492"/&gt;&lt;/w:tabs&gt;&lt;w:ind w:left="1492" w:hanging="360"/&gt;&lt;/w:pPr&gt;&lt;/w:lvl&gt;&lt;/w:abstractNum&gt;&lt;w:abstractNum w:abstractNumId="1" w15:restartNumberingAfterBreak="0"&gt;&lt;w:nsid w:val="FFFFFF7D"/&gt;&lt;w:multiLevelType w:val="singleLevel"/&gt;&lt;w:tmpl w:val="6C44DE1A"/&gt;&lt;w:lvl w:ilvl="0"&gt;&lt;w:start w:val="1"/&gt;&lt;w:numFmt w:val="decimal"/&gt;&lt;w:lvlText w:val="%1."/&gt;&lt;w:lvlJc w:val="left"/&gt;&lt;w:pPr&gt;&lt;w:tabs&gt;&lt;w:tab w:val="num" w:pos="1209"/&gt;&lt;/w:tabs&gt;&lt;w:ind w:left="1209" w:hanging="360"/&gt;&lt;/w:pPr&gt;&lt;/w:lvl&gt;&lt;/w:abstractNum&gt;&lt;w:abstractNum w:abstractNumId="2" w15:restartNumberingAfterBreak="0"&gt;&lt;w:nsid w:val="FFFFFF7E"/&gt;&lt;w:multiLevelType w:val="singleLevel"/&gt;&lt;w:tmpl w:val="83748C94"/&gt;&lt;w:lvl w:ilvl="0"&gt;&lt;w:start w:val="1"/&gt;&lt;w:numFmt w:val="decimal"/&gt;&lt;w:lvlText w:val="%1."/&gt;&lt;w:lvlJc w:val="left"/&gt;&lt;w:pPr&gt;&lt;w:tabs&gt;&lt;w:tab w:val="num" w:pos="926"/&gt;&lt;/w:tabs&gt;&lt;w:ind w:left="926" w:hanging="360"/&gt;&lt;/w:pPr&gt;&lt;/w:lvl&gt;&lt;/w:abstractNum&gt;&lt;w:abstractNum w:abstractNumId="3" w15:restartNumberingAfterBreak="0"&gt;&lt;w:nsid w:val="FFFFFF7F"/&gt;&lt;w:multiLevelType w:val="singleLevel"/&gt;&lt;w:tmpl w:val="871A6F0C"/&gt;&lt;w:lvl w:ilvl="0"&gt;&lt;w:start w:val="1"/&gt;&lt;w:numFmt w:val="decimal"/&gt;&lt;w:lvlText w:val="%1."/&gt;&lt;w:lvlJc w:val="left"/&gt;&lt;w:pPr&gt;&lt;w:tabs&gt;&lt;w:tab w:val="num" w:pos="643"/&gt;&lt;/w:tabs&gt;&lt;w:ind w:left="643" w:hanging="360"/&gt;&lt;/w:pPr&gt;&lt;/w:lvl&gt;&lt;/w:abstractNum&gt;&lt;w:abstractNum w:abstractNumId="4" w15:restartNumberingAfterBreak="0"&gt;&lt;w:nsid w:val="FFFFFF80"/&gt;&lt;w:multiLevelType w:val="singleLevel"/&gt;&lt;w:tmpl w:val="ED1CE676"/&gt;&lt;w:lvl w:ilvl="0"&gt;&lt;w:start w:val="1"/&gt;&lt;w:numFmt w:val="bullet"/&gt;&lt;w:lvlText w:val=""/&gt;&lt;w:lvlJc w:val="left"/&gt;&lt;w:pPr&gt;&lt;w:tabs&gt;&lt;w:tab w:val="num" w:pos="1492"/&gt;&lt;/w:tabs&gt;&lt;w:ind w:left="1492" w:hanging="360"/&gt;&lt;/w:pPr&gt;&lt;w:rPr&gt;&lt;w:rFonts w:ascii="Symbol" w:hAnsi="Symbol" w:hint="default"/&gt;&lt;/w:rPr&gt;&lt;/w:lvl&gt;&lt;/w:abstractNum&gt;&lt;w:abstractNum w:abstractNumId="5" w15:restartNumberingAfterBreak="0"&gt;&lt;w:nsid w:val="FFFFFF81"/&gt;&lt;w:multiLevelType w:val="singleLevel"/&gt;&lt;w:tmpl w:val="DEF60714"/&gt;&lt;w:lvl w:ilvl="0"&gt;&lt;w:start w:val="1"/&gt;&lt;w:numFmt w:val="bullet"/&gt;&lt;w:lvlText w:val=""/&gt;&lt;w:lvlJc w:val="left"/&gt;&lt;w:pPr&gt;&lt;w:tabs&gt;&lt;w:tab w:val="num" w:pos="1209"/&gt;&lt;/w:tabs&gt;&lt;w:ind w:left="1209" w:hanging="360"/&gt;&lt;/w:pPr&gt;&lt;w:rPr&gt;&lt;w:rFonts w:ascii="Symbol" w:hAnsi="Symbol" w:hint="default"/&gt;&lt;/w:rPr&gt;&lt;/w:lvl&gt;&lt;/w:abstractNum&gt;&lt;w:abstractNum w:abstractNumId="6" w15:restartNumberingAfterBreak="0"&gt;&lt;w:nsid w:val="FFFFFF82"/&gt;&lt;w:multiLevelType w:val="singleLevel"/&gt;&lt;w:tmpl w:val="91EA47E8"/&gt;&lt;w:lvl w:ilvl="0"&gt;&lt;w:start w:val="1"/&gt;&lt;w:numFmt w:val="bullet"/&gt;&lt;w:lvlText w:val=""/&gt;&lt;w:lvlJc w:val="left"/&gt;&lt;w:pPr&gt;&lt;w:tabs&gt;&lt;w:tab w:val="num" w:pos="926"/&gt;&lt;/w:tabs&gt;&lt;w:ind w:left="926" w:hanging="360"/&gt;&lt;/w:pPr&gt;&lt;w:rPr&gt;&lt;w:rFonts w:ascii="Symbol" w:hAnsi="Symbol" w:hint="default"/&gt;&lt;/w:rPr&gt;&lt;/w:lvl&gt;&lt;/w:abstractNum&gt;&lt;w:abstractNum w:abstractNumId="7" w15:restartNumberingAfterBreak="0"&gt;&lt;w:nsid w:val="FFFFFF83"/&gt;&lt;w:multiLevelType w:val="singleLevel"/&gt;&lt;w:tmpl w:val="9278B09A"/&gt;&lt;w:lvl w:ilvl="0"&gt;&lt;w:start w:val="1"/&gt;&lt;w:numFmt w:val="bullet"/&gt;&lt;w:lvlText w:val=""/&gt;&lt;w:lvlJc w:val="left"/&gt;&lt;w:pPr&gt;&lt;w:tabs&gt;&lt;w:tab w:val="num" w:pos="643"/&gt;&lt;/w:tabs&gt;&lt;w:ind w:left="643" w:hanging="360"/&gt;&lt;/w:pPr&gt;&lt;w:rPr&gt;&lt;w:rFonts w:ascii="Symbol" w:hAnsi="Symbol" w:hint="default"/&gt;&lt;/w:rPr&gt;&lt;/w:lvl&gt;&lt;/w:abstractNum&gt;&lt;w:abstractNum w:abstractNumId="8" w15:restartNumberingAfterBreak="0"&gt;&lt;w:nsid w:val="17071BBC"/&gt;&lt;w:multiLevelType w:val="multilevel"/&gt;&lt;w:tmpl w:val="B512299C"/&gt;&lt;w:lvl w:ilvl="0"&gt;&lt;w:start w:val="1"/&gt;&lt;w:numFmt w:val="decimal"/&gt;&lt;w:pStyle w:val="ListNumber"/&gt;&lt;w:lvlText w:val="%1."/&gt;&lt;w:lvlJc w:val="left"/&gt;&lt;w:pPr&gt;&lt;w:ind w:left="360" w:hanging="360"/&gt;&lt;/w:pPr&gt;&lt;w:rPr&gt;&lt;w:rFonts w:hint="default"/&gt;&lt;/w:rPr&gt;&lt;/w:lvl&gt;&lt;w:lvl w:ilvl="1"&gt;&lt;w:start w:val="1"/&gt;&lt;w:numFmt w:val="lowerLetter"/&gt;&lt;w:pStyle w:val="ListNumber2"/&gt;&lt;w:lvlText w:val="%2."/&gt;&lt;w:lvlJc w:val="left"/&gt;&lt;w:pPr&gt;&lt;w:ind w:left="720" w:hanging="360"/&gt;&lt;/w:pPr&gt;&lt;w:rPr&gt;&lt;w:rFonts w:hint="default"/&gt;&lt;/w:rPr&gt;&lt;/w:lvl&gt;&lt;w:lvl w:ilvl="2"&gt;&lt;w:start w:val="1"/&gt;&lt;w:numFmt w:val="lowerRoman"/&gt;&lt;w:pStyle w:val="ListNumber3"/&gt;&lt;w:lvlText w:val="%3)"/&gt;&lt;w:lvlJc w:val="left"/&gt;&lt;w:pPr&gt;&lt;w:ind w:left="1080" w:hanging="360"/&gt;&lt;/w:pPr&gt;&lt;w:rPr&gt;&lt;w:rFonts w:hint="default"/&gt;&lt;/w:rPr&gt;&lt;/w:lvl&gt;&lt;w:lvl w:ilvl="3"&gt;&lt;w:start w:val="1"/&gt;&lt;w:numFmt w:val="decimal"/&gt;&lt;w:pStyle w:val="ListNumber4"/&gt;&lt;w:lvlText w:val="%4)"/&gt;&lt;w:lvlJc w:val="left"/&gt;&lt;w:pPr&gt;&lt;w:ind w:left="1440" w:hanging="360"/&gt;&lt;/w:pPr&gt;&lt;w:rPr&gt;&lt;w:rFonts w:hint="default"/&gt;&lt;/w:rPr&gt;&lt;/w:lvl&gt;&lt;w:lvl w:ilvl="4"&gt;&lt;w:start w:val="1"/&gt;&lt;w:numFmt w:val="lowerLetter"/&gt;&lt;w:pStyle w:val="ListNumber5"/&gt;&lt;w:lvlText w:val="%5)"/&gt;&lt;w:lvlJc w:val="left"/&gt;&lt;w:pPr&gt;&lt;w:ind w:left="1800" w:hanging="360"/&gt;&lt;/w:pPr&gt;&lt;w:rPr&gt;&lt;w:rFonts w:hint="default"/&gt;&lt;/w:rPr&gt;&lt;/w:lvl&gt;&lt;w:lvl w:ilvl="5"&gt;&lt;w:start w:val="1"/&gt;&lt;w:numFmt w:val="lowerRoman"/&gt;&lt;w:lvlText w:val="%6)"/&gt;&lt;w:lvlJc w:val="left"/&gt;&lt;w:pPr&gt;&lt;w:ind w:left="2160" w:hanging="360"/&gt;&lt;/w:pPr&gt;&lt;w:rPr&gt;&lt;w:rFonts w:hint="default"/&gt;&lt;/w:rPr&gt;&lt;/w:lvl&gt;&lt;w:lvl w:ilvl="6"&gt;&lt;w:start w:val="1"/&gt;&lt;w:numFmt w:val="decimal"/&gt;&lt;w:lvlText w:val="(%7)"/&gt;&lt;w:lvlJc w:val="left"/&gt;&lt;w:pPr&gt;&lt;w:ind w:left="2520" w:hanging="360"/&gt;&lt;/w:pPr&gt;&lt;w:rPr&gt;&lt;w:rFonts w:hint="default"/&gt;&lt;/w:rPr&gt;&lt;/w:lvl&gt;&lt;w:lvl w:ilvl="7"&gt;&lt;w:start w:val="1"/&gt;&lt;w:numFmt w:val="lowerLetter"/&gt;&lt;w:lvlText w:val="(%8)"/&gt;&lt;w:lvlJc w:val="left"/&gt;&lt;w:pPr&gt;&lt;w:ind w:left="2880" w:hanging="360"/&gt;&lt;/w:pPr&gt;&lt;w:rPr&gt;&lt;w:rFonts w:hint="default"/&gt;&lt;/w:rPr&gt;&lt;/w:lvl&gt;&lt;w:lvl w:ilvl="8"&gt;&lt;w:start w:val="1"/&gt;&lt;w:numFmt w:val="lowerRoman"/&gt;&lt;w:lvlText w:val="(%9)"/&gt;&lt;w:lvlJc w:val="left"/&gt;&lt;w:pPr&gt;&lt;w:ind w:left="3240" w:hanging="360"/&gt;&lt;/w:pPr&gt;&lt;w:rPr&gt;&lt;w:rFonts w:hint="default"/&gt;&lt;/w:rPr&gt;&lt;/w:lvl&gt;&lt;/w:abstractNum&gt;&lt;w:abstractNum w:abstractNumId="9" w15:restartNumberingAfterBreak="0"&gt;&lt;w:nsid w:val="3CE155D5"/&gt;&lt;w:multiLevelType w:val="multilevel"/&gt;&lt;w:tmpl w:val="041D001D"/&gt;&lt;w:lvl w:ilvl="0"&gt;&lt;w:start w:val="1"/&gt;&lt;w:numFmt w:val="decimal"/&gt;&lt;w:lvlText w:val="%1)"/&gt;&lt;w:lvlJc w:val="left"/&gt;&lt;w:pPr&gt;&lt;w:ind w:left="360" w:hanging="360"/&gt;&lt;/w:pPr&gt;&lt;/w:lvl&gt;&lt;w:lvl w:ilvl="1"&gt;&lt;w:start w:val="1"/&gt;&lt;w:numFmt w:val="lowerLetter"/&gt;&lt;w:lvlText w:val="%2)"/&gt;&lt;w:lvlJc w:val="left"/&gt;&lt;w:pPr&gt;&lt;w:ind w:left="720" w:hanging="360"/&gt;&lt;/w:pPr&gt;&lt;/w:lvl&gt;&lt;w:lvl w:ilvl="2"&gt;&lt;w:start w:val="1"/&gt;&lt;w:numFmt w:val="lowerRoman"/&gt;&lt;w:lvlText w:val="%3)"/&gt;&lt;w:lvlJc w:val="left"/&gt;&lt;w:pPr&gt;&lt;w:ind w:left="1080" w:hanging="360"/&gt;&lt;/w:pPr&gt;&lt;/w:lvl&gt;&lt;w:lvl w:ilvl="3"&gt;&lt;w:start w:val="1"/&gt;&lt;w:numFmt w:val="decimal"/&gt;&lt;w:lvlText w:val="(%4)"/&gt;&lt;w:lvlJc w:val="left"/&gt;&lt;w:pPr&gt;&lt;w:ind w:left="1440" w:hanging="360"/&gt;&lt;/w:pPr&gt;&lt;/w:lvl&gt;&lt;w:lvl w:ilvl="4"&gt;&lt;w:start w:val="1"/&gt;&lt;w:numFmt w:val="lowerLetter"/&gt;&lt;w:lvlText w:val="(%5)"/&gt;&lt;w:lvlJc w:val="left"/&gt;&lt;w:pPr&gt;&lt;w:ind w:left="1800" w:hanging="360"/&gt;&lt;/w:pPr&gt;&lt;/w:lvl&gt;&lt;w:lvl w:ilvl="5"&gt;&lt;w:start w:val="1"/&gt;&lt;w:numFmt w:val="lowerRoman"/&gt;&lt;w:lvlText w:val="(%6)"/&gt;&lt;w:lvlJc w:val="left"/&gt;&lt;w:pPr&gt;&lt;w:ind w:left="2160" w:hanging="360"/&gt;&lt;/w:pPr&gt;&lt;/w:lvl&gt;&lt;w:lvl w:ilvl="6"&gt;&lt;w:start w:val="1"/&gt;&lt;w:numFmt w:val="decimal"/&gt;&lt;w:lvlText w:val="%7."/&gt;&lt;w:lvlJc w:val="left"/&gt;&lt;w:pPr&gt;&lt;w:ind w:left="2520" w:hanging="360"/&gt;&lt;/w:pPr&gt;&lt;/w:lvl&gt;&lt;w:lvl w:ilvl="7"&gt;&lt;w:start w:val="1"/&gt;&lt;w:numFmt w:val="lowerLetter"/&gt;&lt;w:lvlText w:val="%8."/&gt;&lt;w:lvlJc w:val="left"/&gt;&lt;w:pPr&gt;&lt;w:ind w:left="2880" w:hanging="360"/&gt;&lt;/w:pPr&gt;&lt;/w:lvl&gt;&lt;w:lvl w:ilvl="8"&gt;&lt;w:start w:val="1"/&gt;&lt;w:numFmt w:val="lowerRoman"/&gt;&lt;w:lvlText w:val="%9."/&gt;&lt;w:lvlJc w:val="left"/&gt;&lt;w:pPr&gt;&lt;w:ind w:left="3240" w:hanging="360"/&gt;&lt;/w:pPr&gt;&lt;/w:lvl&gt;&lt;/w:abstractNum&gt;&lt;w:abstractNum w:abstractNumId="10" w15:restartNumberingAfterBreak="0"&gt;&lt;w:nsid w:val="3D727479"/&gt;&lt;w:multiLevelType w:val="multilevel"/&gt;&lt;w:tmpl w:val="041D0023"/&gt;&lt;w:lvl w:ilvl="0"&gt;&lt;w:start w:val="1"/&gt;&lt;w:numFmt w:val="upperRoman"/&gt;&lt;w:lvlText w:val="Artikel %1."/&gt;&lt;w:lvlJc w:val="left"/&gt;&lt;w:pPr&gt;&lt;w:ind w:left="0" w:firstLine="0"/&gt;&lt;/w:pPr&gt;&lt;/w:lvl&gt;&lt;w:lvl w:ilvl="1"&gt;&lt;w:start w:val="1"/&gt;&lt;w:numFmt w:val="decimalZero"/&gt;&lt;w:isLgl/&gt;&lt;w:lvlText w:val="Avsnitt %1.%2"/&gt;&lt;w:lvlJc w:val="left"/&gt;&lt;w:pPr&gt;&lt;w:ind w:left="0" w:firstLine="0"/&gt;&lt;/w:pPr&gt;&lt;/w:lvl&gt;&lt;w:lvl w:ilvl="2"&gt;&lt;w:start w:val="1"/&gt;&lt;w:numFmt w:val="lowerLetter"/&gt;&lt;w:lvlText w:val="(%3)"/&gt;&lt;w:lvlJc w:val="left"/&gt;&lt;w:pPr&gt;&lt;w:ind w:left="720" w:hanging="432"/&gt;&lt;/w:pPr&gt;&lt;/w:lvl&gt;&lt;w:lvl w:ilvl="3"&gt;&lt;w:start w:val="1"/&gt;&lt;w:numFmt w:val="lowerRoman"/&gt;&lt;w:lvlText w:val="(%4)"/&gt;&lt;w:lvlJc w:val="right"/&gt;&lt;w:pPr&gt;&lt;w:ind w:left="864" w:hanging="144"/&gt;&lt;/w:pPr&gt;&lt;/w:lvl&gt;&lt;w:lvl w:ilvl="4"&gt;&lt;w:start w:val="1"/&gt;&lt;w:numFmt w:val="decimal"/&gt;&lt;w:pStyle w:val="Heading5"/&gt;&lt;w:lvlText w:val="%5)"/&gt;&lt;w:lvlJc w:val="left"/&gt;&lt;w:pPr&gt;&lt;w:ind w:left="1008" w:hanging="432"/&gt;&lt;/w:pPr&gt;&lt;/w:lvl&gt;&lt;w:lvl w:ilvl="5"&gt;&lt;w:start w:val="1"/&gt;&lt;w:numFmt w:val="lowerLetter"/&gt;&lt;w:pStyle w:val="Heading6"/&gt;&lt;w:lvlText w:val="%6)"/&gt;&lt;w:lvlJc w:val="left"/&gt;&lt;w:pPr&gt;&lt;w:ind w:left="1152" w:hanging="432"/&gt;&lt;/w:pPr&gt;&lt;/w:lvl&gt;&lt;w:lvl w:ilvl="6"&gt;&lt;w:start w:val="1"/&gt;&lt;w:numFmt w:val="lowerRoman"/&gt;&lt;w:pStyle w:val="Heading7"/&gt;&lt;w:lvlText w:val="%7)"/&gt;&lt;w:lvlJc w:val="right"/&gt;&lt;w:pPr&gt;&lt;w:ind w:left="1296" w:hanging="288"/&gt;&lt;/w:pPr&gt;&lt;/w:lvl&gt;&lt;w:lvl w:ilvl="7"&gt;&lt;w:start w:val="1"/&gt;&lt;w:numFmt w:val="lowerLetter"/&gt;&lt;w:pStyle w:val="Heading8"/&gt;&lt;w:lvlText w:val="%8."/&gt;&lt;w:lvlJc w:val="left"/&gt;&lt;w:pPr&gt;&lt;w:ind w:left="1440" w:hanging="432"/&gt;&lt;/w:pPr&gt;&lt;/w:lvl&gt;&lt;w:lvl w:ilvl="8"&gt;&lt;w:start w:val="1"/&gt;&lt;w:numFmt w:val="lowerRoman"/&gt;&lt;w:pStyle w:val="Heading9"/&gt;&lt;w:lvlText w:val="%9."/&gt;&lt;w:lvlJc w:val="right"/&gt;&lt;w:pPr&gt;&lt;w:ind w:left="1584" w:hanging="144"/&gt;&lt;/w:pPr&gt;&lt;/w:lvl&gt;&lt;/w:abstractNum&gt;&lt;w:abstractNum w:abstractNumId="11" w15:restartNumberingAfterBreak="0"&gt;&lt;w:nsid w:val="43F95E9C"/&gt;&lt;w:multiLevelType w:val="multilevel"/&gt;&lt;w:tmpl w:val="5FAE225A"/&gt;&lt;w:lvl w:ilvl="0"&gt;&lt;w:start w:val="1"/&gt;&lt;w:numFmt w:val="decimal"/&gt;&lt;w:pStyle w:val="NumberedHeading1"/&gt;&lt;w:lvlText w:val="%1."/&gt;&lt;w:lvlJc w:val="left"/&gt;&lt;w:pPr&gt;&lt;w:ind w:left="907" w:hanging="907"/&gt;&lt;/w:pPr&gt;&lt;w:rPr&gt;&lt;w:rFonts w:hint="default"/&gt;&lt;/w:rPr&gt;&lt;/w:lvl&gt;&lt;w:lvl w:ilvl="1"&gt;&lt;w:start w:val="1"/&gt;&lt;w:numFmt w:val="decimal"/&gt;&lt;w:pStyle w:val="NumberedHeading2"/&gt;&lt;w:lvlText w:val="%1.%2"/&gt;&lt;w:lvlJc w:val="left"/&gt;&lt;w:pPr&gt;&lt;w:ind w:left="907" w:hanging="907"/&gt;&lt;/w:pPr&gt;&lt;w:rPr&gt;&lt;w:rFonts w:hint="default"/&gt;&lt;/w:rPr&gt;&lt;/w:lvl&gt;&lt;w:lvl w:ilvl="2"&gt;&lt;w:start w:val="1"/&gt;&lt;w:numFmt w:val="decimal"/&gt;&lt;w:pStyle w:val="NumberedHeading3"/&gt;&lt;w:lvlText w:val="%1.%2.%3"/&gt;&lt;w:lvlJc w:val="left"/&gt;&lt;w:pPr&gt;&lt;w:ind w:left="907" w:hanging="907"/&gt;&lt;/w:pPr&gt;&lt;w:rPr&gt;&lt;w:rFonts w:hint="default"/&gt;&lt;/w:rPr&gt;&lt;/w:lvl&gt;&lt;w:lvl w:ilvl="3"&gt;&lt;w:start w:val="1"/&gt;&lt;w:numFmt w:val="decimal"/&gt;&lt;w:pStyle w:val="NumberedHeading4"/&gt;&lt;w:lvlText w:val="%1.%2.%3.%4"/&gt;&lt;w:lvlJc w:val="left"/&gt;&lt;w:pPr&gt;&lt;w:ind w:left="907" w:hanging="907"/&gt;&lt;/w:pPr&gt;&lt;w:rPr&gt;&lt;w:rFonts w:hint="default"/&gt;&lt;/w:rPr&gt;&lt;/w:lvl&gt;&lt;w:lvl w:ilvl="4"&gt;&lt;w:start w:val="1"/&gt;&lt;w:numFmt w:val="lowerLetter"/&gt;&lt;w:lvlText w:val="(%5)"/&gt;&lt;w:lvlJc w:val="left"/&gt;&lt;w:pPr&gt;&lt;w:ind w:left="907" w:hanging="907"/&gt;&lt;/w:pPr&gt;&lt;w:rPr&gt;&lt;w:rFonts w:hint="default"/&gt;&lt;/w:rPr&gt;&lt;/w:lvl&gt;&lt;w:lvl w:ilvl="5"&gt;&lt;w:start w:val="1"/&gt;&lt;w:numFmt w:val="lowerRoman"/&gt;&lt;w:lvlText w:val="(%6)"/&gt;&lt;w:lvlJc w:val="left"/&gt;&lt;w:pPr&gt;&lt;w:ind w:left="907" w:hanging="907"/&gt;&lt;/w:pPr&gt;&lt;w:rPr&gt;&lt;w:rFonts w:hint="default"/&gt;&lt;/w:rPr&gt;&lt;/w:lvl&gt;&lt;w:lvl w:ilvl="6"&gt;&lt;w:start w:val="1"/&gt;&lt;w:numFmt w:val="decimal"/&gt;&lt;w:lvlText w:val="%7."/&gt;&lt;w:lvlJc w:val="left"/&gt;&lt;w:pPr&gt;&lt;w:ind w:left="907" w:hanging="907"/&gt;&lt;/w:pPr&gt;&lt;w:rPr&gt;&lt;w:rFonts w:hint="default"/&gt;&lt;/w:rPr&gt;&lt;/w:lvl&gt;&lt;w:lvl w:ilvl="7"&gt;&lt;w:start w:val="1"/&gt;&lt;w:numFmt w:val="lowerLetter"/&gt;&lt;w:lvlText w:val="%8."/&gt;&lt;w:lvlJc w:val="left"/&gt;&lt;w:pPr&gt;&lt;w:ind w:left="907" w:hanging="907"/&gt;&lt;/w:pPr&gt;&lt;w:rPr&gt;&lt;w:rFonts w:hint="default"/&gt;&lt;/w:rPr&gt;&lt;/w:lvl&gt;&lt;w:lvl w:ilvl="8"&gt;&lt;w:start w:val="1"/&gt;&lt;w:numFmt w:val="lowerRoman"/&gt;&lt;w:lvlText w:val="%9."/&gt;&lt;w:lvlJc w:val="left"/&gt;&lt;w:pPr&gt;&lt;w:ind w:left="907" w:hanging="907"/&gt;&lt;/w:pPr&gt;&lt;w:rPr&gt;&lt;w:rFonts w:hint="default"/&gt;&lt;/w:rPr&gt;&lt;/w:lvl&gt;&lt;/w:abstractNum&gt;&lt;w:abstractNum w:abstractNumId="12" w15:restartNumberingAfterBreak="0"&gt;&lt;w:nsid w:val="4CEF34F7"/&gt;&lt;w:multiLevelType w:val="multilevel"/&gt;&lt;w:tmpl w:val="041D001F"/&gt;&lt;w:lvl w:ilvl="0"&gt;&lt;w:start w:val="1"/&gt;&lt;w:numFmt w:val="decimal"/&gt;&lt;w:lvlText w:val="%1."/&gt;&lt;w:lvlJc w:val="left"/&gt;&lt;w:pPr&gt;&lt;w:ind w:left="360" w:hanging="360"/&gt;&lt;/w:pPr&gt;&lt;/w:lvl&gt;&lt;w:lvl w:ilvl="1"&gt;&lt;w:start w:val="1"/&gt;&lt;w:numFmt w:val="decimal"/&gt;&lt;w:lvlText w:val="%1.%2."/&gt;&lt;w:lvlJc w:val="left"/&gt;&lt;w:pPr&gt;&lt;w:ind w:left="792" w:hanging="432"/&gt;&lt;/w:pPr&gt;&lt;/w:lvl&gt;&lt;w:lvl w:ilvl="2"&gt;&lt;w:start w:val="1"/&gt;&lt;w:numFmt w:val="decimal"/&gt;&lt;w:lvlText w:val="%1.%2.%3."/&gt;&lt;w:lvlJc w:val="left"/&gt;&lt;w:pPr&gt;&lt;w:ind w:left="1224" w:hanging="504"/&gt;&lt;/w:pPr&gt;&lt;/w:lvl&gt;&lt;w:lvl w:ilvl="3"&gt;&lt;w:start w:val="1"/&gt;&lt;w:numFmt w:val="decimal"/&gt;&lt;w:lvlText w:val="%1.%2.%3.%4."/&gt;&lt;w:lvlJc w:val="left"/&gt;&lt;w:pPr&gt;&lt;w:ind w:left="1728" w:hanging="648"/&gt;&lt;/w:pPr&gt;&lt;/w:lvl&gt;&lt;w:lvl w:ilvl="4"&gt;&lt;w:start w:val="1"/&gt;&lt;w:numFmt w:val="decimal"/&gt;&lt;w:lvlText w:val="%1.%2.%3.%4.%5."/&gt;&lt;w:lvlJc w:val="left"/&gt;&lt;w:pPr&gt;&lt;w:ind w:left="2232" w:hanging="792"/&gt;&lt;/w:pPr&gt;&lt;/w:lvl&gt;&lt;w:lvl w:ilvl="5"&gt;&lt;w:start w:val="1"/&gt;&lt;w:numFmt w:val="decimal"/&gt;&lt;w:lvlText w:val="%1.%2.%3.%4.%5.%6."/&gt;&lt;w:lvlJc w:val="left"/&gt;&lt;w:pPr&gt;&lt;w:ind w:left="2736" w:hanging="936"/&gt;&lt;/w:pPr&gt;&lt;/w:lvl&gt;&lt;w:lvl w:ilvl="6"&gt;&lt;w:start w:val="1"/&gt;&lt;w:numFmt w:val="decimal"/&gt;&lt;w:lvlText w:val="%1.%2.%3.%4.%5.%6.%7."/&gt;&lt;w:lvlJc w:val="left"/&gt;&lt;w:pPr&gt;&lt;w:ind w:left="3240" w:hanging="1080"/&gt;&lt;/w:pPr&gt;&lt;/w:lvl&gt;&lt;w:lvl w:ilvl="7"&gt;&lt;w:start w:val="1"/&gt;&lt;w:numFmt w:val="decimal"/&gt;&lt;w:lvlText w:val="%1.%2.%3.%4.%5.%6.%7.%8."/&gt;&lt;w:lvlJc w:val="left"/&gt;&lt;w:pPr&gt;&lt;w:ind w:left="3744" w:hanging="1224"/&gt;&lt;/w:pPr&gt;&lt;/w:lvl&gt;&lt;w:lvl w:ilvl="8"&gt;&lt;w:start w:val="1"/&gt;&lt;w:numFmt w:val="decimal"/&gt;&lt;w:lvlText w:val="%1.%2.%3.%4.%5.%6.%7.%8.%9."/&gt;&lt;w:lvlJc w:val="left"/&gt;&lt;w:pPr&gt;&lt;w:ind w:left="4320" w:hanging="1440"/&gt;&lt;/w:pPr&gt;&lt;/w:lvl&gt;&lt;/w:abstractNum&gt;&lt;w:abstractNum w:abstractNumId="13" w15:restartNumberingAfterBreak="0"&gt;&lt;w:nsid w:val="566F2E6D"/&gt;&lt;w:multiLevelType w:val="multilevel"/&gt;&lt;w:tmpl w:val="6FD4AAFC"/&gt;&lt;w:lvl w:ilvl="0"&gt;&lt;w:start w:val="1"/&gt;&lt;w:numFmt w:val="bullet"/&gt;&lt;w:pStyle w:val="ListBullet"/&gt;&lt;w:lvlText w:val="—"/&gt;&lt;w:lvlJc w:val="left"/&gt;&lt;w:pPr&gt;&lt;w:ind w:left="360" w:hanging="360"/&gt;&lt;/w:pPr&gt;&lt;w:rPr&gt;&lt;w:rFonts w:ascii="Calibri" w:hAnsi="Calibri" w:hint="default"/&gt;&lt;w:color w:val="auto"/&gt;&lt;/w:rPr&gt;&lt;/w:lvl&gt;&lt;w:lvl w:ilvl="1"&gt;&lt;w:start w:val="1"/&gt;&lt;w:numFmt w:val="bullet"/&gt;&lt;w:pStyle w:val="ListBullet2"/&gt;&lt;w:lvlText w:val="—"/&gt;&lt;w:lvlJc w:val="left"/&gt;&lt;w:pPr&gt;&lt;w:ind w:left="720" w:hanging="360"/&gt;&lt;/w:pPr&gt;&lt;w:rPr&gt;&lt;w:rFonts w:ascii="Calibri" w:hAnsi="Calibri" w:hint="default"/&gt;&lt;w:color w:val="auto"/&gt;&lt;/w:rPr&gt;&lt;/w:lvl&gt;&lt;w:lvl w:ilvl="2"&gt;&lt;w:start w:val="1"/&gt;&lt;w:numFmt w:val="bullet"/&gt;&lt;w:pStyle w:val="ListBullet3"/&gt;&lt;w:lvlText w:val="—"/&gt;&lt;w:lvlJc w:val="left"/&gt;&lt;w:pPr&gt;&lt;w:ind w:left="1080" w:hanging="360"/&gt;&lt;/w:pPr&gt;&lt;w:rPr&gt;&lt;w:rFonts w:ascii="Calibri" w:hAnsi="Calibri" w:hint="default"/&gt;&lt;w:color w:val="auto"/&gt;&lt;/w:rPr&gt;&lt;/w:lvl&gt;&lt;w:lvl w:ilvl="3"&gt;&lt;w:start w:val="1"/&gt;&lt;w:numFmt w:val="bullet"/&gt;&lt;w:pStyle w:val="ListBullet4"/&gt;&lt;w:lvlText w:val="—"/&gt;&lt;w:lvlJc w:val="left"/&gt;&lt;w:pPr&gt;&lt;w:ind w:left="1440" w:hanging="360"/&gt;&lt;/w:pPr&gt;&lt;w:rPr&gt;&lt;w:rFonts w:ascii="Calibri" w:hAnsi="Calibri" w:hint="default"/&gt;&lt;w:color w:val="auto"/&gt;&lt;/w:rPr&gt;&lt;/w:lvl&gt;&lt;w:lvl w:ilvl="4"&gt;&lt;w:start w:val="1"/&gt;&lt;w:numFmt w:val="bullet"/&gt;&lt;w:pStyle w:val="ListBullet5"/&gt;&lt;w:lvlText w:val="—"/&gt;&lt;w:lvlJc w:val="left"/&gt;&lt;w:pPr&gt;&lt;w:ind w:left="1800" w:hanging="360"/&gt;&lt;/w:pPr&gt;&lt;w:rPr&gt;&lt;w:rFonts w:ascii="Calibri" w:hAnsi="Calibri" w:hint="default"/&gt;&lt;w:color w:val="auto"/&gt;&lt;/w:rPr&gt;&lt;/w:lvl&gt;&lt;w:lvl w:ilvl="5"&gt;&lt;w:start w:val="1"/&gt;&lt;w:numFmt w:val="bullet"/&gt;&lt;w:lvlText w:val="»"/&gt;&lt;w:lvlJc w:val="left"/&gt;&lt;w:pPr&gt;&lt;w:ind w:left="2160" w:hanging="360"/&gt;&lt;/w:pPr&gt;&lt;w:rPr&gt;&lt;w:rFonts w:ascii="Calibri" w:hAnsi="Calibri" w:hint="default"/&gt;&lt;w:color w:val="auto"/&gt;&lt;/w:rPr&gt;&lt;/w:lvl&gt;&lt;w:lvl w:ilvl="6"&gt;&lt;w:start w:val="1"/&gt;&lt;w:numFmt w:val="bullet"/&gt;&lt;w:lvlText w:val="•"/&gt;&lt;w:lvlJc w:val="left"/&gt;&lt;w:pPr&gt;&lt;w:ind w:left="2520" w:hanging="360"/&gt;&lt;/w:pPr&gt;&lt;w:rPr&gt;&lt;w:rFonts w:ascii="Calibri" w:hAnsi="Calibri" w:hint="default"/&gt;&lt;w:color w:val="auto"/&gt;&lt;/w:rPr&gt;&lt;/w:lvl&gt;&lt;w:lvl w:ilvl="7"&gt;&lt;w:start w:val="1"/&gt;&lt;w:numFmt w:val="bullet"/&gt;&lt;w:lvlText w:val="–"/&gt;&lt;w:lvlJc w:val="left"/&gt;&lt;w:pPr&gt;&lt;w:ind w:left="2880" w:hanging="360"/&gt;&lt;/w:pPr&gt;&lt;w:rPr&gt;&lt;w:rFonts w:ascii="Calibri" w:hAnsi="Calibri" w:hint="default"/&gt;&lt;w:color w:val="auto"/&gt;&lt;/w:rPr&gt;&lt;/w:lvl&gt;&lt;w:lvl w:ilvl="8"&gt;&lt;w:start w:val="1"/&gt;&lt;w:numFmt w:val="bullet"/&gt;&lt;w:lvlText w:val="»"/&gt;&lt;w:lvlJc w:val="left"/&gt;&lt;w:pPr&gt;&lt;w:ind w:left="3240" w:hanging="360"/&gt;&lt;/w:pPr&gt;&lt;w:rPr&gt;&lt;w:rFonts w:ascii="Calibri" w:hAnsi="Calibri" w:hint="default"/&gt;&lt;w:color w:val="auto"/&gt;&lt;/w:rPr&gt;&lt;/w:lvl&gt;&lt;/w:abstractNum&gt;&lt;w:num w:numId="1"&gt;&lt;w:abstractNumId w:val="13"/&gt;&lt;/w:num&gt;&lt;w:num w:numId="2"&gt;&lt;w:abstractNumId w:val="7"/&gt;&lt;/w:num&gt;&lt;w:num w:numId="3"&gt;&lt;w:abstractNumId w:val="6"/&gt;&lt;/w:num&gt;&lt;w:num w:numId="4"&gt;&lt;w:abstractNumId w:val="5"/&gt;&lt;/w:num&gt;&lt;w:num w:numId="5"&gt;&lt;w:abstractNumId w:val="4"/&gt;&lt;/w:num&gt;&lt;w:num w:numId="6"&gt;&lt;w:abstractNumId w:val="8"/&gt;&lt;/w:num&gt;&lt;w:num w:numId="7"&gt;&lt;w:abstractNumId w:val="3"/&gt;&lt;/w:num&gt;&lt;w:num w:numId="8"&gt;&lt;w:abstractNumId w:val="2"/&gt;&lt;/w:num&gt;&lt;w:num w:numId="9"&gt;&lt;w:abstractNumId w:val="1"/&gt;&lt;/w:num&gt;&lt;w:num w:numId="10"&gt;&lt;w:abstractNumId w:val="0"/&gt;&lt;/w:num&gt;&lt;w:num w:numId="11"&gt;&lt;w:abstractNumId w:val="13"/&gt;&lt;w:lvlOverride w:ilvl="0"&gt;&lt;w:startOverride w:val="1"/&gt;&lt;/w:lvlOverride&gt;&lt;w:lvlOverride w:ilvl="1"&gt;&lt;w:startOverride w:val="1"/&gt;&lt;/w:lvlOverride&gt;&lt;w:lvlOverride w:ilvl="2"&gt;&lt;w:startOverride w:val="1"/&gt;&lt;/w:lvlOverride&gt;&lt;w:lvlOverride w:ilvl="3"&gt;&lt;w:startOverride w:val="1"/&gt;&lt;/w:lvlOverride&gt;&lt;w:lvlOverride w:ilvl="4"&gt;&lt;w:startOverride w:val="1"/&gt;&lt;/w:lvlOverride&gt;&lt;w:lvlOverride w:ilvl="5"&gt;&lt;w:startOverride w:val="1"/&gt;&lt;/w:lvlOverride&gt;&lt;w:lvlOverride w:ilvl="6"&gt;&lt;w:startOverride w:val="1"/&gt;&lt;/w:lvlOverride&gt;&lt;w:lvlOverride w:ilvl="7"&gt;&lt;w:startOverride w:val="1"/&gt;&lt;/w:lvlOverride&gt;&lt;w:lvlOverride w:ilvl="8"&gt;&lt;w:startOverride w:val="1"/&gt;&lt;/w:lvlOverride&gt;&lt;/w:num&gt;&lt;w:num w:numId="12"&gt;&lt;w:abstractNumId w:val="11"/&gt;&lt;/w:num&gt;&lt;w:num w:numId="13"&gt;&lt;w:abstractNumId w:val="12"/&gt;&lt;/w:num&gt;&lt;w:num w:numId="14"&gt;&lt;w:abstractNumId w:val="9"/&gt;&lt;/w:num&gt;&lt;w:num w:numId="15"&gt;&lt;w:abstractNumId w:val="10"/&gt;&lt;/w:num&gt;&lt;/w:numbering&gt;&lt;/pkg:xmlData&gt;&lt;/pkg:part&gt;&lt;/pkg:package&gt;
+</Namn>
+      <Titel>&lt;?xml version="1.0" standalone="yes"?&gt;
+&lt;?mso-application progid="Word.Document"?&gt;
+&lt;pkg:package xmlns:pkg="http://schemas.microsoft.com/office/2006/xmlPackage"&gt;&lt;pkg:part pkg:name="/_rels/.rels" pkg:contentType="application/vnd.openxmlformats-package.relationships+xml" pkg:padding="512"&gt;&lt;pkg:xmlData&gt;&lt;Relationships xmlns="http://schemas.openxmlformats.org/package/2006/relationships"&gt;&lt;Relationship Id="rId1" Type="http://schemas.openxmlformats.org/officeDocument/2006/relationships/officeDocument" Target="word/document.xml"/&gt;&lt;/Relationships&gt;&lt;/pkg:xmlData&gt;&lt;/pkg:part&gt;&lt;pkg:part pkg:name="/word/_rels/document.xml.rels" pkg:contentType="application/vnd.openxmlformats-package.relationships+xml" pkg:padding="256"&gt;&lt;pkg:xmlData&gt;&lt;Relationships xmlns="http://schemas.openxmlformats.org/package/2006/relationships"&gt;&lt;Relationship Id="rId3" Type="http://schemas.openxmlformats.org/officeDocument/2006/relationships/glossaryDocument" Target="glossary/document.xml"/&gt;&lt;Relationship Id="rId2" Type="http://schemas.openxmlformats.org/officeDocument/2006/relationships/styles" Target="styles.xml"/&gt;&lt;Relationship Id="rId1" Type="http://schemas.openxmlformats.org/officeDocument/2006/relationships/numbering" Target="numbering.xml"/&gt;&lt;/Relationships&gt;&lt;/pkg:xmlData&gt;&lt;/pkg:part&gt;&lt;pkg:part pkg:name="/word/document.xml" pkg:contentType="application/vnd.openxmlformats-officedocument.wordprocessingml.document.main+xml"&gt;&lt;pkg:xmlData&gt;&lt;w:document xmlns:wpc="http://schemas.microsoft.com/office/word/2010/wordprocessingCanvas" xmlns:cx="http://schemas.microsoft.com/office/drawing/2014/chartex" xmlns:cx1="http://schemas.microsoft.com/office/drawing/2015/9/8/chartex" xmlns:cx2="http://schemas.microsoft.com/office/drawing/2015/10/21/chartex" xmlns:cx3="http://schemas.microsoft.com/office/drawing/2016/5/9/chartex" xmlns:cx4="http://schemas.microsoft.com/office/drawing/2016/5/10/chartex" xmlns:cx5="http://schemas.microsoft.com/office/drawing/2016/5/11/chartex" xmlns:cx6="http://schemas.microsoft.com/office/drawing/2016/5/12/chartex" xmlns:cx7="http://schemas.microsoft.com/office/drawing/2016/5/13/chartex" xmlns:cx8="http://schemas.microsoft.com/office/drawing/2016/5/14/chartex" xmlns:mc="http://schemas.openxmlformats.org/markup-compatibility/2006" xmlns:o="urn:schemas-microsoft-com:office:office" xmlns:r="http://schemas.openxmlformats.org/officeDocument/2006/relationships" xmlns:m="http://schemas.openxmlformats.org/officeDocument/2006/math" xmlns:v="urn:schemas-microsoft-com:vml" xmlns:wp14="http://schemas.microsoft.com/office/word/2010/wordprocessingDrawing" xmlns:wp="http://schemas.openxmlformats.org/drawingml/2006/wordprocessingDrawing" xmlns:w10="urn:schemas-microsoft-com:office:word" xmlns:w="http://schemas.openxmlformats.org/wordprocessingml/2006/main" xmlns:w14="http://schemas.microsoft.com/office/word/2010/wordml" xmlns:w15="http://schemas.microsoft.com/office/word/2012/wordml" xmlns:w16se="http://schemas.microsoft.com/office/word/2015/wordml/symex" xmlns:wpg="http://schemas.microsoft.com/office/word/2010/wordprocessingGroup" xmlns:wpi="http://schemas.microsoft.com/office/word/2010/wordprocessingInk" xmlns:wne="http://schemas.microsoft.com/office/word/2006/wordml" xmlns:wps="http://schemas.microsoft.com/office/word/2010/wordprocessingShape" mc:Ignorable="w14 w15 w16se wp14"&gt;&lt;w:body&gt;&lt;w:sdt&gt;&lt;w:sdtPr&gt;&lt;w:tag w:val="regTitle"/&gt;&lt;w:id w:val="2084647071"/&gt;&lt;w:placeholder&gt;&lt;w:docPart w:val="F25D791C5B2F4E19930DB86356413466"/&gt;&lt;/w:placeholder&gt;&lt;/w:sdtPr&gt;&lt;w:sdtContent&gt;&lt;w:p&gt;&lt;w:r&gt;&lt;w:t&gt;Consultant&lt;/w:t&gt;&lt;/w:r&gt;&lt;/w:p&gt;&lt;/w:sdtContent&gt;&lt;/w:sdt&gt;&lt;w:sectPr&gt;&lt;w:pgSz w:w="12240" w:h="15840"/&gt;&lt;w:pgMar w:top="1417" w:right="1417" w:bottom="1417" w:left="1417" w:header="720" w:footer="720" w:gutter="0"/&gt;&lt;w:cols w:space="720"/&gt;&lt;/w:sectPr&gt;&lt;/w:body&gt;&lt;/w:document&gt;&lt;/pkg:xmlData&gt;&lt;/pkg:part&gt;&lt;pkg:part pkg:name="/word/glossary/settings.xml" pkg:contentType="application/vnd.openxmlformats-officedocument.wordprocessingml.settings+xml"&gt;&lt;pkg:xmlData&gt;&lt;w:settings xmlns:mc="http://schemas.openxmlformats.org/markup-compatibility/2006" xmlns:o="urn:schemas-microsoft-com:office:office" xmlns:r="http://schemas.openxmlformats.org/officeDocument/2006/relationships" xmlns:m="http://schemas.openxmlformats.org/officeDocument/2006/math" xmlns:v="urn:schemas-microsoft-com:vml" xmlns:w10="urn:schemas-microsoft-com:office:word" xmlns:w="http://schemas.openxmlformats.org/wordprocessingml/2006/main" xmlns:w14="http://schemas.microsoft.com/office/word/2010/wordml" xmlns:w15="http://schemas.microsoft.com/office/word/2012/wordml" xmlns:w16se="http://schemas.microsoft.com/office/word/2015/wordml/symex" xmlns:sl="http://schemas.openxmlformats.org/schemaLibrary/2006/main" mc:Ignorable="w14 w15 w16se"&gt;&lt;w:view w:val="normal"/&gt;&lt;w:defaultTabStop w:val="720"/&gt;&lt;w:characterSpacingControl w:val="doNotCompress"/&gt;&lt;w:compat&gt;&lt;w:useFELayout/&gt;&lt;w:compatSetting w:name="compatibilityMode" w:uri="http://schemas.microsoft.com/office/word" w:val="15"/&gt;&lt;w:compatSetting w:name="overrideTableStyleFontSizeAndJustification" w:uri="http://schemas.microsoft.com/office/word" w:val="1"/&gt;&lt;w:compatSetting w:name="enableOpenTypeFeatures" w:uri="http://schemas.microsoft.com/office/word" w:val="1"/&gt;&lt;w:compatSetting w:name="doNotFlipMirrorIndents" w:uri="http://schemas.microsoft.com/office/word" w:val="1"/&gt;&lt;w:compatSetting w:name="differentiateMultirowTableHeaders" w:uri="http://schemas.microsoft.com/office/word" w:val="1"/&gt;&lt;/w:compat&gt;&lt;m:mathPr&gt;&lt;m:mathFont m:val="Cambria Math"/&gt;&lt;m:brkBin m:val="before"/&gt;&lt;m:brkBinSub m:val="--"/&gt;&lt;m:smallFrac m:val="0"/&gt;&lt;m:dispDef/&gt;&lt;m:lMargin m:val="0"/&gt;&lt;m:rMargin m:val="0"/&gt;&lt;m:defJc m:val="centerGroup"/&gt;&lt;m:wrapIndent m:val="1440"/&gt;&lt;m:intLim m:val="subSup"/&gt;&lt;m:naryLim m:val="undOvr"/&gt;&lt;/m:mathPr&gt;&lt;w:themeFontLang w:val="en-GB"/&gt;&lt;w:clrSchemeMapping w:bg1="light1" w:t1="dark1" w:bg2="light2" w:t2="dark2" w:accent1="accent1" w:accent2="accent2" w:accent3="accent3" w:accent4="accent4" w:accent5="accent5" w:accent6="accent6" w:hyperlink="hyperlink" w:followedHyperlink="followedHyperlink"/&gt;&lt;w:decimalSymbol w:val=","/&gt;&lt;w:listSeparator w:val=";"/&gt;&lt;w15:chartTrackingRefBased/&gt;&lt;/w:settings&gt;&lt;/pkg:xmlData&gt;&lt;/pkg:part&gt;&lt;pkg:part pkg:name="/word/glossary/_rels/document.xml.rels" pkg:contentType="application/vnd.openxmlformats-package.relationships+xml"&gt;&lt;pkg:xmlData&gt;&lt;Relationships xmlns="http://schemas.openxmlformats.org/package/2006/relationships"&gt;&lt;Relationship Id="rId3" Type="http://schemas.openxmlformats.org/officeDocument/2006/relationships/webSettings" Target="webSettings.xml"/&gt;&lt;Relationship Id="rId2" Type="http://schemas.openxmlformats.org/officeDocument/2006/relationships/settings" Target="settings.xml"/&gt;&lt;Relationship Id="rId1" Type="http://schemas.openxmlformats.org/officeDocument/2006/relationships/styles" Target="styles.xml"/&gt;&lt;Relationship Id="rId4" Type="http://schemas.openxmlformats.org/officeDocument/2006/relationships/fontTable" Target="fontTable.xml"/&gt;&lt;/Relationships&gt;&lt;/pkg:xmlData&gt;&lt;/pkg:part&gt;&lt;pkg:part pkg:name="/word/glossary/document.xml" pkg:contentType="application/vnd.openxmlformats-officedocument.wordprocessingml.document.glossary+xml"&gt;&lt;pkg:xmlData&gt;&lt;w:glossaryDocument xmlns:wpc="http://schemas.microsoft.com/office/word/2010/wordprocessingCanvas" xmlns:cx="http://schemas.microsoft.com/office/drawing/2014/chartex" xmlns:cx1="http://schemas.microsoft.com/office/drawing/2015/9/8/chartex" xmlns:cx2="http://schemas.microsoft.com/office/drawing/2015/10/21/chartex" xmlns:cx3="http://schemas.microsoft.com/office/drawing/2016/5/9/chartex" xmlns:cx4="http://schemas.microsoft.com/office/drawing/2016/5/10/chartex" xmlns:cx5="http://schemas.microsoft.com/office/drawing/2016/5/11/chartex" xmlns:cx6="http://schemas.microsoft.com/office/drawing/2016/5/12/chartex" xmlns:cx7="http://schemas.microsoft.com/office/drawing/2016/5/13/chartex" xmlns:cx8="http://schemas.microsoft.com/office/drawing/2016/5/14/chartex" xmlns:mc="http://schemas.openxmlformats.org/markup-compatibility/2006" xmlns:o="urn:schemas-microsoft-com:office:office" xmlns:r="http://schemas.openxmlformats.org/officeDocument/2006/relationships" xmlns:m="http://schemas.openxmlformats.org/officeDocument/2006/math" xmlns:v="urn:schemas-microsoft-com:vml" xmlns:wp14="http://schemas.microsoft.com/office/word/2010/wordprocessingDrawing" xmlns:wp="http://schemas.openxmlformats.org/drawingml/2006/wordprocessingDrawing" xmlns:w10="urn:schemas-microsoft-com:office:word" xmlns:w="http://schemas.openxmlformats.org/wordprocessingml/2006/main" xmlns:w14="http://schemas.microsoft.com/office/word/2010/wordml" xmlns:w15="http://schemas.microsoft.com/office/word/2012/wordml" xmlns:w16se="http://schemas.microsoft.com/office/word/2015/wordml/symex" xmlns:wpg="http://schemas.microsoft.com/office/word/2010/wordprocessingGroup" xmlns:wpi="http://schemas.microsoft.com/office/word/2010/wordprocessingInk" xmlns:wne="http://schemas.microsoft.com/office/word/2006/wordml" xmlns:wps="http://schemas.microsoft.com/office/word/2010/wordprocessingShape" mc:Ignorable="w14 w15 w16se wp14"&gt;&lt;w:docParts&gt;&lt;w:docPart&gt;&lt;w:docPartPr&gt;&lt;w:name w:val="F25D791C5B2F4E19930DB86356413466"/&gt;&lt;w:category&gt;&lt;w:name w:val="General"/&gt;&lt;w:gallery w:val="placeholder"/&gt;&lt;/w:category&gt;&lt;w:types&gt;&lt;w:type w:val="bbPlcHdr"/&gt;&lt;/w:types&gt;&lt;w:behaviors&gt;&lt;w:behavior w:val="content"/&gt;&lt;/w:behaviors&gt;&lt;w:guid w:val="{D7CC999A-6FA2-4301-AF13-D17E1333918F}"/&gt;&lt;/w:docPartPr&gt;&lt;w:docPartBody&gt;&lt;w:p&gt;&lt;w:pPr&gt;&lt;w:pStyle w:val="F25D791C5B2F4E19930DB86356413466"/&gt;&lt;/w:pPr&gt;&lt;w:r&gt;&lt;w:rPr&gt;&lt;w:rStyle w:val="PlaceholderText"/&gt;&lt;/w:rPr&gt;&lt;w:t&gt;Click or tap here to enter text.&lt;/w:t&gt;&lt;/w:r&gt;&lt;/w:p&gt;&lt;/w:docPartBody&gt;&lt;/w:docPart&gt;&lt;/w:docParts&gt;&lt;/w:glossaryDocument&gt;&lt;/pkg:xmlData&gt;&lt;/pkg:part&gt;&lt;pkg:part pkg:name="/word/glossary/styles.xml" pkg:contentType="application/vnd.openxmlformats-officedocument.wordprocessingml.styles+xml"&gt;&lt;pkg:xmlData&gt;&lt;w:styles xmlns:mc="http://schemas.openxmlformats.org/markup-compatibility/2006" xmlns:r="http://schemas.openxmlformats.org/officeDocument/2006/relationships" xmlns:w="http://schemas.openxmlformats.org/wordprocessingml/2006/main" xmlns:w14="http://schemas.microsoft.com/office/word/2010/wordml" xmlns:w15="http://schemas.microsoft.com/office/word/2012/wordml" xmlns:w16se="http://schemas.microsoft.com/office/word/2015/wordml/symex" mc:Ignorable="w14 w15 w16se"&gt;&lt;w:docDefaults&gt;&lt;w:rPrDefault&gt;&lt;w:rPr&gt;&lt;w:rFonts w:asciiTheme="minorHAnsi" w:eastAsiaTheme="minorEastAsia" w:hAnsiTheme="minorHAnsi" w:cstheme="minorBidi"/&gt;&lt;w:sz w:val="22"/&gt;&lt;w:szCs w:val="22"/&gt;&lt;w:lang w:val="en-GB" w:eastAsia="en-GB" w:bidi="ar-SA"/&gt;&lt;/w:rPr&gt;&lt;/w:rPrDefault&gt;&lt;w:pPrDefault&gt;&lt;w:pPr&gt;&lt;w:spacing w:after="160" w:line="259" w:lineRule="auto"/&gt;&lt;/w:pPr&gt;&lt;/w:pPrDefault&gt;&lt;/w:docDefaults&gt;&lt;w:latentStyles w:defLockedState="0" w:defUIPriority="99" w:defSemiHidden="0" w:defUnhideWhenUsed="0" w:defQFormat="0" w:count="374"&gt;&lt;w:lsdException w:name="Normal" w:uiPriority="0" w:qFormat="1"/&gt;&lt;w:lsdException w:name="heading 1" w:uiPriority="9" w:qFormat="1"/&gt;&lt;w:lsdException w:name="heading 2" w:semiHidden="1" w:uiPriority="9" w:unhideWhenUsed="1" w:qFormat="1"/&gt;&lt;w:lsdException w:name="heading 3" w:semiHidden="1" w:uiPriority="9" w:unhideWhenUsed="1" w:qFormat="1"/&gt;&lt;w:lsdException w:name="heading 4" w:semiHidden="1" w:uiPriority="9" w:unhideWhenUsed="1" w:qFormat="1"/&gt;&lt;w:lsdException w:name="heading 5" w:semiHidden="1" w:uiPriority="9" w:unhideWhenUsed="1" w:qFormat="1"/&gt;&lt;w:lsdException w:name="heading 6" w:semiHidden="1" w:uiPriority="9" w:unhideWhenUsed="1" w:qFormat="1"/&gt;&lt;w:lsdException w:name="heading 7" w:semiHidden="1" w:uiPriority="9" w:unhideWhenUsed="1" w:qFormat="1"/&gt;&lt;w:lsdException w:name="heading 8" w:semiHidden="1" w:uiPriority="9" w:unhideWhenUsed="1" w:qFormat="1"/&gt;&lt;w:lsdException w:name="heading 9" w:semiHidden="1" w:uiPriority="9" w:unhideWhenUsed="1" w:qFormat="1"/&gt;&lt;w:lsdException w:name="index 1" w:semiHidden="1" w:unhideWhenUsed="1"/&gt;&lt;w:lsdException w:name="index 2" w:semiHidden="1" w:unhideWhenUsed="1"/&gt;&lt;w:lsdException w:name="index 3" w:semiHidden="1" w:unhideWhenUsed="1"/&gt;&lt;w:lsdException w:name="index 4" w:semiHidden="1" w:unhideWhenUsed="1"/&gt;&lt;w:lsdException w:name="index 5" w:semiHidden="1" w:unhideWhenUsed="1"/&gt;&lt;w:lsdException w:name="index 6" w:semiHidden="1" w:unhideWhenUsed="1"/&gt;&lt;w:lsdException w:name="index 7" w:semiHidden="1" w:unhideWhenUsed="1"/&gt;&lt;w:lsdException w:name="index 8" w:semiHidden="1" w:unhideWhenUsed="1"/&gt;&lt;w:lsdException w:name="index 9" w:semiHidden="1" w:unhideWhenUsed="1"/&gt;&lt;w:lsdException w:name="toc 1" w:semiHidden="1" w:uiPriority="39" w:unhideWhenUsed="1"/&gt;&lt;w:lsdException w:name="toc 2" w:semiHidden="1" w:uiPriority="39" w:unhideWhenUsed="1"/&gt;&lt;w:lsdException w:name="toc 3" w:semiHidden="1" w:uiPriority="39" w:unhideWhenUsed="1"/&gt;&lt;w:lsdException w:name="toc 4" w:semiHidden="1" w:uiPriority="39" w:unhideWhenUsed="1"/&gt;&lt;w:lsdException w:name="toc 5" w:semiHidden="1" w:uiPriority="39" w:unhideWhenUsed="1"/&gt;&lt;w:lsdException w:name="toc 6" w:semiHidden="1" w:uiPriority="39" w:unhideWhenUsed="1"/&gt;&lt;w:lsdException w:name="toc 7" w:semiHidden="1" w:uiPriority="39" w:unhideWhenUsed="1"/&gt;&lt;w:lsdException w:name="toc 8" w:semiHidden="1" w:uiPriority="39" w:unhideWhenUsed="1"/&gt;&lt;w:lsdException w:name="toc 9" w:semiHidden="1" w:uiPriority="39" w:unhideWhenUsed="1"/&gt;&lt;w:lsdException w:name="Normal Indent" w:semiHidden="1" w:unhideWhenUsed="1"/&gt;&lt;w:lsdException w:name="footnote text" w:semiHidden="1" w:unhideWhenUsed="1"/&gt;&lt;w:lsdException w:name="annotation text" w:semiHidden="1" w:unhideWhenUsed="1"/&gt;&lt;w:lsdException w:name="header" w:semiHidden="1" w:unhideWhenUsed="1"/&gt;&lt;w:lsdException w:name="footer" w:semiHidden="1" w:unhideWhenUsed="1"/&gt;&lt;w:lsdException w:name="index heading" w:semiHidden="1" w:unhideWhenUsed="1"/&gt;&lt;w:lsdException w:name="caption" w:semiHidden="1" w:uiPriority="35" w:unhideWhenUsed="1" w:qFormat="1"/&gt;&lt;w:lsdException w:name="table of figures" w:semiHidden="1" w:unhideWhenUsed="1"/&gt;&lt;w:lsdException w:name="envelope address" w:semiHidden="1" w:unhideWhenUsed="1"/&gt;&lt;w:lsdException w:name="envelope return" w:semiHidden="1" w:unhideWhenUsed="1"/&gt;&lt;w:lsdException w:name="footnote reference" w:semiHidden="1" w:unhideWhenUsed="1"/&gt;&lt;w:lsdException w:name="annotation reference" w:semiHidden="1" w:unhideWhenUsed="1"/&gt;&lt;w:lsdException w:name="line number" w:semiHidden="1" w:unhideWhenUsed="1"/&gt;&lt;w:lsdException w:name="page number" w:semiHidden="1" w:unhideWhenUsed="1"/&gt;&lt;w:lsdException w:name="endnote reference" w:semiHidden="1" w:unhideWhenUsed="1"/&gt;&lt;w:lsdException w:name="endnote text" w:semiHidden="1" w:unhideWhenUsed="1"/&gt;&lt;w:lsdException w:name="table of authorities" w:semiHidden="1" w:unhideWhenUsed="1"/&gt;&lt;w:lsdException w:name="macro" w:semiHidden="1" w:unhideWhenUsed="1"/&gt;&lt;w:lsdException w:name="toa heading" w:semiHidden="1" w:unhideWhenUsed="1"/&gt;&lt;w:lsdException w:name="List" w:semiHidden="1" w:unhideWhenUsed="1"/&gt;&lt;w:lsdException w:name="List Bullet" w:semiHidden="1" w:unhideWhenUsed="1"/&gt;&lt;w:lsdException w:name="List Number" w:semiHidden="1" w:unhideWhenUsed="1"/&gt;&lt;w:lsdException w:name="List 2" w:semiHidden="1" w:unhideWhenUsed="1"/&gt;&lt;w:lsdException w:name="List 3" w:semiHidden="1" w:unhideWhenUsed="1"/&gt;&lt;w:lsdException w:name="List 4" w:semiHidden="1" w:unhideWhenUsed="1"/&gt;&lt;w:lsdException w:name="List 5" w:semiHidden="1" w:unhideWhenUsed="1"/&gt;&lt;w:lsdException w:name="List Bullet 2" w:semiHidden="1" w:unhideWhenUsed="1"/&gt;&lt;w:lsdException w:name="List Bullet 3" w:semiHidden="1" w:unhideWhenUsed="1"/&gt;&lt;w:lsdException w:name="List Bullet 4" w:semiHidden="1" w:unhideWhenUsed="1"/&gt;&lt;w:lsdException w:name="List Bullet 5" w:semiHidden="1" w:unhideWhenUsed="1"/&gt;&lt;w:lsdException w:name="List Number 2" w:semiHidden="1" w:unhideWhenUsed="1"/&gt;&lt;w:lsdException w:name="List Number 3" w:semiHidden="1" w:unhideWhenUsed="1"/&gt;&lt;w:lsdException w:name="List Number 4" w:semiHidden="1" w:unhideWhenUsed="1"/&gt;&lt;w:lsdException w:name="List Number 5" w:semiHidden="1" w:unhideWhenUsed="1"/&gt;&lt;w:lsdException w:name="Title" w:uiPriority="10" w:qFormat="1"/&gt;&lt;w:lsdException w:name="Closing" w:semiHidden="1" w:unhideWhenUsed="1"/&gt;&lt;w:lsdException w:name="Signature" w:semiHidden="1" w:unhideWhenUsed="1"/&gt;&lt;w:lsdException w:name="Default Paragraph Font" w:semiHidden="1" w:uiPriority="1" w:unhideWhenUsed="1"/&gt;&lt;w:lsdException w:name="Body Text" w:semiHidden="1" w:unhideWhenUsed="1"/&gt;&lt;w:lsdException w:name="Body Text Indent" w:semiHidden="1" w:unhideWhenUsed="1"/&gt;&lt;w:lsdException w:name="List Continue" w:semiHidden="1" w:unhideWhenUsed="1"/&gt;&lt;w:lsdException w:name="List Continue 2" w:semiHidden="1" w:unhideWhenUsed="1"/&gt;&lt;w:lsdException w:name="List Continue 3" w:semiHidden="1" w:unhideWhenUsed="1"/&gt;&lt;w:lsdException w:name="List Continue 4" w:semiHidden="1" w:unhideWhenUsed="1"/&gt;&lt;w:lsdException w:name="List Continue 5" w:semiHidden="1" w:unhideWhenUsed="1"/&gt;&lt;w:lsdException w:name="Message Header" w:semiHidden="1" w:unhideWhenUsed="1"/&gt;&lt;w:lsdException w:name="Subtitle" w:uiPriority="11" w:qFormat="1"/&gt;&lt;w:lsdException w:name="Salutation" w:semiHidden="1" w:unhideWhenUsed="1"/&gt;&lt;w:lsdException w:name="Date" w:semiHidden="1" w:unhideWhenUsed="1"/&gt;&lt;w:lsdException w:name="Body Text First Indent" w:semiHidden="1" w:unhideWhenUsed="1"/&gt;&lt;w:lsdException w:name="Body Text First Indent 2" w:semiHidden="1" w:unhideWhenUsed="1"/&gt;&lt;w:lsdException w:name="Note Heading" w:semiHidden="1" w:unhideWhenUsed="1"/&gt;&lt;w:lsdException w:name="Body Text 2" w:semiHidden="1" w:unhideWhenUsed="1"/&gt;&lt;w:lsdException w:name="Body Text 3" w:semiHidden="1" w:unhideWhenUsed="1"/&gt;&lt;w:lsdException w:name="Body Text Indent 2" w:semiHidden="1" w:unhideWhenUsed="1"/&gt;&lt;w:lsdException w:name="Body Text Indent 3" w:semiHidden="1" w:unhideWhenUsed="1"/&gt;&lt;w:lsdException w:name="Block Text" w:semiHidden="1" w:unhideWhenUsed="1"/&gt;&lt;w:lsdException w:name="Hyperlink" w:semiHidden="1" w:unhideWhenUsed="1"/&gt;&lt;w:lsdException w:name="FollowedHyperlink" w:semiHidden="1" w:unhideWhenUsed="1"/&gt;&lt;w:lsdException w:name="Strong" w:uiPriority="22" w:qFormat="1"/&gt;&lt;w:lsdException w:name="Emphasis" w:uiPriority="20" w:qFormat="1"/&gt;&lt;w:lsdException w:name="Document Map" w:semiHidden="1" w:unhideWhenUsed="1"/&gt;&lt;w:lsdException w:name="Plain Text" w:semiHidden="1" w:unhideWhenUsed="1"/&gt;&lt;w:lsdException w:name="E-mail Signature" w:semiHidden="1" w:unhideWhenUsed="1"/&gt;&lt;w:lsdException w:name="HTML Top of Form" w:semiHidden="1" w:unhideWhenUsed="1"/&gt;&lt;w:lsdException w:name="HTML Bottom of Form" w:semiHidden="1" w:unhideWhenUsed="1"/&gt;&lt;w:lsdException w:name="Normal (Web)" w:semiHidden="1" w:unhideWhenUsed="1"/&gt;&lt;w:lsdException w:name="HTML Acronym" w:semiHidden="1" w:unhideWhenUsed="1"/&gt;&lt;w:lsdException w:name="HTML Address" w:semiHidden="1" w:unhideWhenUsed="1"/&gt;&lt;w:lsdException w:name="HTML Cite" w:semiHidden="1" w:unhideWhenUsed="1"/&gt;&lt;w:lsdException w:name="HTML Code" w:semiHidden="1" w:unhideWhenUsed="1"/&gt;&lt;w:lsdException w:name="HTML Definition" w:semiHidden="1" w:unhideWhenUsed="1"/&gt;&lt;w:lsdException w:name="HTML Keyboard" w:semiHidden="1" w:unhideWhenUsed="1"/&gt;&lt;w:lsdException w:name="HTML Preformatted" w:semiHidden="1" w:unhideWhenUsed="1"/&gt;&lt;w:lsdException w:name="HTML Sample" w:semiHidden="1" w:unhideWhenUsed="1"/&gt;&lt;w:lsdException w:name="HTML Typewriter" w:semiHidden="1" w:unhideWhenUsed="1"/&gt;&lt;w:lsdException w:name="HTML Variable" w:semiHidden="1" w:unhideWhenUsed="1"/&gt;&lt;w:lsdException w:name="Normal Table" w:semiHidden="1" w:unhideWhenUsed="1"/&gt;&lt;w:lsdException w:name="annotation subject" w:semiHidden="1" w:unhideWhenUsed="1"/&gt;&lt;w:lsdException w:name="No List" w:semiHidden="1" w:unhideWhenUsed="1"/&gt;&lt;w:lsdException w:name="Outline List 1" w:semiHidden="1" w:unhideWhenUsed="1"/&gt;&lt;w:lsdException w:name="Outline List 2" w:semiHidden="1" w:unhideWhenUsed="1"/&gt;&lt;w:lsdException w:name="Outline List 3" w:semiHidden="1" w:unhideWhenUsed="1"/&gt;&lt;w:lsdException w:name="Table Simple 1" w:semiHidden="1" w:unhideWhenUsed="1"/&gt;&lt;w:lsdException w:name="Table Simple 2" w:semiHidden="1" w:unhideWhenUsed="1"/&gt;&lt;w:lsdException w:name="Table Simple 3" w:semiHidden="1" w:unhideWhenUsed="1"/&gt;&lt;w:lsdException w:name="Table Classic 1" w:semiHidden="1" w:unhideWhenUsed="1"/&gt;&lt;w:lsdException w:name="Table Classic 2" w:semiHidden="1" w:unhideWhenUsed="1"/&gt;&lt;w:lsdException w:name="Table Classic 3" w:semiHidden="1" w:unhideWhenUsed="1"/&gt;&lt;w:lsdException w:name="Table Classic 4" w:semiHidden="1" w:unhideWhenUsed="1"/&gt;&lt;w:lsdException w:name="Table Colorful 1" w:semiHidden="1" w:unhideWhenUsed="1"/&gt;&lt;w:lsdException w:name="Table Colorful 2" w:semiHidden="1" w:unhideWhenUsed="1"/&gt;&lt;w:lsdException w:name="Table Colorful 3" w:semiHidden="1" w:unhideWhenUsed="1"/&gt;&lt;w:lsdException w:name="Table Columns 1" w:semiHidden="1" w:unhideWhenUsed="1"/&gt;&lt;w:lsdException w:name="Table Columns 2" w:semiHidden="1" w:unhideWhenUsed="1"/&gt;&lt;w:lsdException w:name="Table Columns 3" w:semiHidden="1" w:unhideWhenUsed="1"/&gt;&lt;w:lsdException w:name="Table Columns 4" w:semiHidden="1" w:unhideWhenUsed="1"/&gt;&lt;w:lsdException w:name="Table Columns 5" w:semiHidden="1" w:unhideWhenUsed="1"/&gt;&lt;w:lsdException w:name="Table Grid 1" w:semiHidden="1" w:unhideWhenUsed="1"/&gt;&lt;w:lsdException w:name="Table Grid 2" w:semiHidden="1" w:unhideWhenUsed="1"/&gt;&lt;w:lsdException w:name="Table Grid 3" w:semiHidden="1" w:unhideWhenUsed="1"/&gt;&lt;w:lsdException w:name="Table Grid 4" w:semiHidden="1" w:unhideWhenUsed="1"/&gt;&lt;w:lsdException w:name="Table Grid 5" w:semiHidden="1" w:unhideWhenUsed="1"/&gt;&lt;w:lsdException w:name="Table Grid 6" w:semiHidden="1" w:unhideWhenUsed="1"/&gt;&lt;w:lsdException w:name="Table Grid 7" w:semiHidden="1" w:unhideWhenUsed="1"/&gt;&lt;w:lsdException w:name="Table Grid 8" w:semiHidden="1" w:unhideWhenUsed="1"/&gt;&lt;w:lsdException w:name="Table List 1" w:semiHidden="1" w:unhideWhenUsed="1"/&gt;&lt;w:lsdException w:name="Table List 2" w:semiHidden="1" w:unhideWhenUsed="1"/&gt;&lt;w:lsdException w:name="Table List 3" w:semiHidden="1" w:unhideWhenUsed="1"/&gt;&lt;w:lsdException w:name="Table List 4" w:semiHidden="1" w:unhideWhenUsed="1"/&gt;&lt;w:lsdException w:name="Table List 5" w:semiHidden="1" w:unhideWhenUsed="1"/&gt;&lt;w:lsdException w:name="Table List 6" w:semiHidden="1" w:unhideWhenUsed="1"/&gt;&lt;w:lsdException w:name="Table List 7" w:semiHidden="1" w:unhideWhenUsed="1"/&gt;&lt;w:lsdException w:name="Table List 8" w:semiHidden="1" w:unhideWhenUsed="1"/&gt;&lt;w:lsdException w:name="Table 3D effects 1" w:semiHidden="1" w:unhideWhenUsed="1"/&gt;&lt;w:lsdException w:name="Table 3D effects 2" w:semiHidden="1" w:unhideWhenUsed="1"/&gt;&lt;w:lsdException w:name="Table 3D effects 3" w:semiHidden="1" w:unhideWhenUsed="1"/&gt;&lt;w:lsdException w:name="Table Contemporary" w:semiHidden="1" w:unhideWhenUsed="1"/&gt;&lt;w:lsdException w:name="Table Elegant" w:semiHidden="1" w:unhideWhenUsed="1"/&gt;&lt;w:lsdException w:name="Table Professional" w:semiHidden="1" w:unhideWhenUsed="1"/&gt;&lt;w:lsdException w:name="Table Subtle 1" w:semiHidden="1" w:unhideWhenUsed="1"/&gt;&lt;w:lsdException w:name="Table Subtle 2" w:semiHidden="1" w:unhideWhenUsed="1"/&gt;&lt;w:lsdException w:name="Table Web 1" w:semiHidden="1" w:unhideWhenUsed="1"/&gt;&lt;w:lsdException w:name="Table Web 2" w:semiHidden="1" w:unhideWhenUsed="1"/&gt;&lt;w:lsdException w:name="Table Web 3" w:semiHidden="1" w:unhideWhenUsed="1"/&gt;&lt;w:lsdException w:name="Balloon Text" w:semiHidden="1" w:unhideWhenUsed="1"/&gt;&lt;w:lsdException w:name="Table Grid" w:uiPriority="39"/&gt;&lt;w:lsdException w:name="Table Theme" w:semiHidden="1" w:unhideWhenUsed="1"/&gt;&lt;w:lsdException w:name="Placeholder Text" w:semiHidden="1"/&gt;&lt;w:lsdException w:name="No Spacing" w:uiPriority="1" w:qFormat="1"/&gt;&lt;w:lsdException w:name="Light Shading" w:uiPriority="60"/&gt;&lt;w:lsdException w:name="Light List" w:uiPriority="61"/&gt;&lt;w:lsdException w:name="Light Grid" w:uiPriority="62"/&gt;&lt;w:lsdException w:name="Medium Shading 1" w:uiPriority="63"/&gt;&lt;w:lsdException w:name="Medium Shading 2" w:uiPriority="64"/&gt;&lt;w:lsdException w:name="Medium List 1" w:uiPriority="65"/&gt;&lt;w:lsdException w:name="Medium List 2" w:uiPriority="66"/&gt;&lt;w:lsdException w:name="Medium Grid 1" w:uiPriority="67"/&gt;&lt;w:lsdException w:name="Medium Grid 2" w:uiPriority="68"/&gt;&lt;w:lsdException w:name="Medium Grid 3" w:uiPriority="69"/&gt;&lt;w:lsdException w:name="Dark List" w:uiPriority="70"/&gt;&lt;w:lsdException w:name="Colorful Shading" w:uiPriority="71"/&gt;&lt;w:lsdException w:name="Colorful List" w:uiPriority="72"/&gt;&lt;w:lsdException w:name="Colorful Grid" w:uiPriority="73"/&gt;&lt;w:lsdException w:name="Light Shading Accent 1" w:uiPriority="60"/&gt;&lt;w:lsdException w:name="Light List Accent 1" w:uiPriority="61"/&gt;&lt;w:lsdException w:name="Light Grid Accent 1" w:uiPriority="62"/&gt;&lt;w:lsdException w:name="Medium Shading 1 Accent 1" w:uiPriority="63"/&gt;&lt;w:lsdException w:name="Medium Shading 2 Accent 1" w:uiPriority="64"/&gt;&lt;w:lsdException w:name="Medium List 1 Accent 1" w:uiPriority="65"/&gt;&lt;w:lsdException w:name="Revision" w:semiHidden="1"/&gt;&lt;w:lsdException w:name="List Paragraph" w:uiPriority="34" w:qFormat="1"/&gt;&lt;w:lsdException w:name="Quote" w:uiPriority="29" w:qFormat="1"/&gt;&lt;w:lsdException w:name="Intense Quote" w:uiPriority="30" w:qFormat="1"/&gt;&lt;w:lsdException w:name="Medium List 2 Accent 1" w:uiPriority="66"/&gt;&lt;w:lsdException w:name="Medium Grid 1 Accent 1" w:uiPriority="67"/&gt;&lt;w:lsdException w:name="Medium Grid 2 Accent 1" w:uiPriority="68"/&gt;&lt;w:lsdException w:name="Medium Grid 3 Accent 1" w:uiPriority="69"/&gt;&lt;w:lsdException w:name="Dark List Accent 1" w:uiPriority="70"/&gt;&lt;w:lsdException w:name="Colorful Shading Accent 1" w:uiPriority="71"/&gt;&lt;w:lsdException w:name="Colorful List Accent 1" w:uiPriority="72"/&gt;&lt;w:lsdException w:name="Colorful Grid Accent 1" w:uiPriority="73"/&gt;&lt;w:lsdException w:name="Light Shading Accent 2" w:uiPriority="60"/&gt;&lt;w:lsdException w:name="Light List Accent 2" w:uiPriority="61"/&gt;&lt;w:lsdException w:name="Light Grid Accent 2" w:uiPriority="62"/&gt;&lt;w:lsdException w:name="Medium Shading 1 Accent 2" w:uiPriority="63"/&gt;&lt;w:lsdException w:name="Medium Shading 2 Accent 2" w:uiPriority="64"/&gt;&lt;w:lsdException w:name="Medium List 1 Accent 2" w:uiPriority="65"/&gt;&lt;w:lsdException w:name="Medium List 2 Accent 2" w:uiPriority="66"/&gt;&lt;w:lsdException w:name="Medium Grid 1 Accent 2" w:uiPriority="67"/&gt;&lt;w:lsdException w:name="Medium Grid 2 Accent 2" w:uiPriority="68"/&gt;&lt;w:lsdException w:name="Medium Grid 3 Accent 2" w:uiPriority="69"/&gt;&lt;w:lsdException w:name="Dark List Accent 2" w:uiPriority="70"/&gt;&lt;w:lsdException w:name="Colorful Shading Accent 2" w:uiPriority="71"/&gt;&lt;w:lsdException w:name="Colorful List Accent 2" w:uiPriority="72"/&gt;&lt;w:lsdException w:name="Colorful Grid Accent 2" w:uiPriority="73"/&gt;&lt;w:lsdException w:name="Light Shading Accent 3" w:uiPriority="60"/&gt;&lt;w:lsdException w:name="Light List Accent 3" w:uiPriority="61"/&gt;&lt;w:lsdException w:name="Light Grid Accent 3" w:uiPriority="62"/&gt;&lt;w:lsdException w:name="Medium Shading 1 Accent 3" w:uiPriority="63"/&gt;&lt;w:lsdException w:name="Medium Shading 2 Accent 3" w:uiPriority="64"/&gt;&lt;w:lsdException w:name="Medium List 1 Accent 3" w:uiPriority="65"/&gt;&lt;w:lsdException w:name="Medium List 2 Accent 3" w:uiPriority="66"/&gt;&lt;w:lsdException w:name="Medium Grid 1 Accent 3" w:uiPriority="67"/&gt;&lt;w:lsdException w:name="Medium Grid 2 Accent 3" w:uiPriority="68"/&gt;&lt;w:lsdException w:name="Medium Grid 3 Accent 3" w:uiPriority="69"/&gt;&lt;w:lsdException w:name="Dark List Accent 3" w:uiPriority="70"/&gt;&lt;w:lsdException w:name="Colorful Shading Accent 3" w:uiPriority="71"/&gt;&lt;w:lsdException w:name="Colorful List Accent 3" w:uiPriority="72"/&gt;&lt;w:lsdException w:name="Colorful Grid Accent 3" w:uiPriority="73"/&gt;&lt;w:lsdException w:name="Light Shading Accent 4" w:uiPriority="60"/&gt;&lt;w:lsdException w:name="Light List Accent 4" w:uiPriority="61"/&gt;&lt;w:lsdException w:name="Light Grid Accent 4" w:uiPriority="62"/&gt;&lt;w:lsdException w:name="Medium Shading 1 Accent 4" w:uiPriority="63"/&gt;&lt;w:lsdException w:name="Medium Shading 2 Accent 4" w:uiPriority="64"/&gt;&lt;w:lsdException w:name="Medium List 1 Accent 4" w:uiPriority="65"/&gt;&lt;w:lsdException w:name="Medium List 2 Accent 4" w:uiPriority="66"/&gt;&lt;w:lsdException w:name="Medium Grid 1 Accent 4" w:uiPriority="67"/&gt;&lt;w:lsdException w:name="Medium Grid 2 Accent 4" w:uiPriority="68"/&gt;&lt;w:lsdException w:name="Medium Grid 3 Accent 4" w:uiPriority="69"/&gt;&lt;w:lsdException w:name="Dark List Accent 4" w:uiPriority="70"/&gt;&lt;w:lsdException w:name="Colorful Shading Accent 4" w:uiPriority="71"/&gt;&lt;w:lsdException w:name="Colorful List Accent 4" w:uiPriority="72"/&gt;&lt;w:lsdException w:name="Colorful Grid Accent 4" w:uiPriority="73"/&gt;&lt;w:lsdException w:name="Light Shading Accent 5" w:uiPriority="60"/&gt;&lt;w:lsdException w:name="Light List Accent 5" w:uiPriority="61"/&gt;&lt;w:lsdException w:name="Light Grid Accent 5" w:uiPriority="62"/&gt;&lt;w:lsdException w:name="Medium Shading 1 Accent 5" w:uiPriority="63"/&gt;&lt;w:lsdException w:name="Medium Shading 2 Accent 5" w:uiPriority="64"/&gt;&lt;w:lsdException w:name="Medium List 1 Accent 5" w:uiPriority="65"/&gt;&lt;w:lsdException w:name="Medium List 2 Accent 5" w:uiPriority="66"/&gt;&lt;w:lsdException w:name="Medium Grid 1 Accent 5" w:uiPriority="67"/&gt;&lt;w:lsdException w:name="Medium Grid 2 Accent 5" w:uiPriority="68"/&gt;&lt;w:lsdException w:name="Medium Grid 3 Accent 5" w:uiPriority="69"/&gt;&lt;w:lsdException w:name="Dark List Accent 5" w:uiPriority="70"/&gt;&lt;w:lsdException w:name="Colorful Shading Accent 5" w:uiPriority="71"/&gt;&lt;w:lsdException w:name="Colorful List Accent 5" w:uiPriority="72"/&gt;&lt;w:lsdException w:name="Colorful Grid Accent 5" w:uiPriority="73"/&gt;&lt;w:lsdException w:name="Light Shading Accent 6" w:uiPriority="60"/&gt;&lt;w:lsdException w:name="Light List Accent 6" w:uiPriority="61"/&gt;&lt;w:lsdException w:name="Light Grid Accent 6" w:uiPriority="62"/&gt;&lt;w:lsdException w:name="Medium Shading 1 Accent 6" w:uiPriority="63"/&gt;&lt;w:lsdException w:name="Medium Shading 2 Accent 6" w:uiPriority="64"/&gt;&lt;w:lsdException w:name="Medium List 1 Accent 6" w:uiPriority="65"/&gt;&lt;w:lsdException w:name="Medium List 2 Accent 6" w:uiPriority="66"/&gt;&lt;w:lsdException w:name="Medium Grid 1 Accent 6" w:uiPriority="67"/&gt;&lt;w:lsdException w:name="Medium Grid 2 Accent 6" w:uiPriority="68"/&gt;&lt;w:lsdException w:name="Medium Grid 3 Accent 6" w:uiPriority="69"/&gt;&lt;w:lsdException w:name="Dark List Accent 6" w:uiPriority="70"/&gt;&lt;w:lsdException w:name="Colorful Shading Accent 6" w:uiPriority="71"/&gt;&lt;w:lsdException w:name="Colorful List Accent 6" w:uiPriority="72"/&gt;&lt;w:lsdException w:name="Colorful Grid Accent 6" w:uiPriority="73"/&gt;&lt;w:lsdException w:name="Subtle Emphasis" w:uiPriority="19" w:qFormat="1"/&gt;&lt;w:lsdException w:name="Intense Emphasis" w:uiPriority="21" w:qFormat="1"/&gt;&lt;w:lsdException w:name="Subtle Reference" w:uiPriority="31" w:qFormat="1"/&gt;&lt;w:lsdException w:name="Intense Reference" w:uiPriority="32" w:qFormat="1"/&gt;&lt;w:lsdException w:name="Book Title" w:uiPriority="33" w:qFormat="1"/&gt;&lt;w:lsdException w:name="Bibliography" w:semiHidden="1" w:uiPriority="37" w:unhideWhenUsed="1"/&gt;&lt;w:lsdException w:name="TOC Heading" w:semiHidden="1" w:uiPriority="39" w:unhideWhenUsed="1" w:qFormat="1"/&gt;&lt;w:lsdException w:name="Plain Table 1" w:uiPriority="41"/&gt;&lt;w:lsdException w:name="Plain Table 2" w:uiPriority="42"/&gt;&lt;w:lsdException w:name="Plain Table 3" w:uiPriority="43"/&gt;&lt;w:lsdException w:name="Plain Table 4" w:uiPriority="44"/&gt;&lt;w:lsdException w:name="Plain Table 5" w:uiPriority="45"/&gt;&lt;w:lsdException w:name="Grid Table Light" w:uiPriority="40"/&gt;&lt;w:lsdException w:name="Grid Table 1 Light" w:uiPriority="46"/&gt;&lt;w:lsdException w:name="Grid Table 2" w:uiPriority="47"/&gt;&lt;w:lsdException w:name="Grid Table 3" w:uiPriority="48"/&gt;&lt;w:lsdException w:name="Grid Table 4" w:uiPriority="49"/&gt;&lt;w:lsdException w:name="Grid Table 5 Dark" w:uiPriority="50"/&gt;&lt;w:lsdException w:name="Grid Table 6 Colorful" w:uiPriority="51"/&gt;&lt;w:lsdException w:name="Grid Table 7 Colorful" w:uiPriority="52"/&gt;&lt;w:lsdException w:name="Grid Table 1 Light Accent 1" w:uiPriority="46"/&gt;&lt;w:lsdException w:name="Grid Table 2 Accent 1" w:uiPriority="47"/&gt;&lt;w:lsdException w:name="Grid Table 3 Accent 1" w:uiPriority="48"/&gt;&lt;w:lsdException w:name="Grid Table 4 Accent 1" w:uiPriority="49"/&gt;&lt;w:lsdException w:name="Grid Table 5 Dark Accent 1" w:uiPriority="50"/&gt;&lt;w:lsdException w:name="Grid Table 6 Colorful Accent 1" w:uiPriority="51"/&gt;&lt;w:lsdException w:name="Grid Table 7 Colorful Accent 1" w:uiPriority="52"/&gt;&lt;w:lsdException w:name="Grid Table 1 Light Accent 2" w:uiPriority="46"/&gt;&lt;w:lsdException w:name="Grid Table 2 Accent 2" w:uiPriority="47"/&gt;&lt;w:lsdException w:name="Grid Table 3 Accent 2" w:uiPriority="48"/&gt;&lt;w:lsdException w:name="Grid Table 4 Accent 2" w:uiPriority="49"/&gt;&lt;w:lsdException w:name="Grid Table 5 Dark Accent 2" w:uiPriority="50"/&gt;&lt;w:lsdException w:name="Grid Table 6 Colorful Accent 2" w:uiPriority="51"/&gt;&lt;w:lsdException w:name="Grid Table 7 Colorful Accent 2" w:uiPriority="52"/&gt;&lt;w:lsdException w:name="Grid Table 1 Light Accent 3" w:uiPriority="46"/&gt;&lt;w:lsdException w:name="Grid Table 2 Accent 3" w:uiPriority="47"/&gt;&lt;w:lsdException w:name="Grid Table 3 Accent 3" w:uiPriority="48"/&gt;&lt;w:lsdException w:name="Grid Table 4 Accent 3" w:uiPriority="49"/&gt;&lt;w:lsdException w:name="Grid Table 5 Dark Accent 3" w:uiPriority="50"/&gt;&lt;w:lsdException w:name="Grid Table 6 Colorful Accent 3" w:uiPriority="51"/&gt;&lt;w:lsdException w:name="Grid Table 7 Colorful Accent 3" w:uiPriority="52"/&gt;&lt;w:lsdException w:name="Grid Table 1 Light Accent 4" w:uiPriority="46"/&gt;&lt;w:lsdException w:name="Grid Table 2 Accent 4" w:uiPriority="47"/&gt;&lt;w:lsdException w:name="Grid Table 3 Accent 4" w:uiPriority="48"/&gt;&lt;w:lsdException w:name="Grid Table 4 Accent 4" w:uiPriority="49"/&gt;&lt;w:lsdException w:name="Grid Table 5 Dark Accent 4" w:uiPriority="50"/&gt;&lt;w:lsdException w:name="Grid Table 6 Colorful Accent 4" w:uiPriority="51"/&gt;&lt;w:lsdException w:name="Grid Table 7 Colorful Accent 4" w:uiPriority="52"/&gt;&lt;w:lsdException w:name="Grid Table 1 Light Accent 5" w:uiPriority="46"/&gt;&lt;w:lsdException w:name="Grid Table 2 Accent 5" w:uiPriority="47"/&gt;&lt;w:lsdException w:name="Grid Table 3 Accent 5" w:uiPriority="48"/&gt;&lt;w:lsdException w:name="Grid Table 4 Accent 5" w:uiPriority="49"/&gt;&lt;w:lsdException w:name="Grid Table 5 Dark Accent 5" w:uiPriority="50"/&gt;&lt;w:lsdException w:name="Grid Table 6 Colorful Accent 5" w:uiPriority="51"/&gt;&lt;w:lsdException w:name="Grid Table 7 Colorful Accent 5" w:uiPriority="52"/&gt;&lt;w:lsdException w:name="Grid Table 1 Light Accent 6" w:uiPriority="46"/&gt;&lt;w:lsdException w:name="Grid Table 2 Accent 6" w:uiPriority="47"/&gt;&lt;w:lsdException w:name="Grid Table 3 Accent 6" w:uiPriority="48"/&gt;&lt;w:lsdException w:name="Grid Table 4 Accent 6" w:uiPriority="49"/&gt;&lt;w:lsdException w:name="Grid Table 5 Dark Accent 6" w:uiPriority="50"/&gt;&lt;w:lsdException w:name="Grid Table 6 Colorful Accent 6" w:uiPriority="51"/&gt;&lt;w:lsdException w:name="Grid Table 7 Colorful Accent 6" w:uiPriority="52"/&gt;&lt;w:lsdException w:name="List Table 1 Light" w:uiPriority="46"/&gt;&lt;w:lsdException w:name="List Table 2" w:uiPriority="47"/&gt;&lt;w:lsdException w:name="List Table 3" w:uiPriority="48"/&gt;&lt;w:lsdException w:name="List Table 4" w:uiPriority="49"/&gt;&lt;w:lsdException w:name="List Table 5 Dark" w:uiPriority="50"/&gt;&lt;w:lsdException w:name="List Table 6 Colorful" w:uiPriority="51"/&gt;&lt;w:lsdException w:name="List Table 7 Colorful" w:uiPriority="52"/&gt;&lt;w:lsdException w:name="List Table 1 Light Accent 1" w:uiPriority="46"/&gt;&lt;w:lsdException w:name="List Table 2 Accent 1" w:uiPriority="47"/&gt;&lt;w:lsdException w:name="List Table 3 Accent 1" w:uiPriority="48"/&gt;&lt;w:lsdException w:name="List Table 4 Accent 1" w:uiPriority="49"/&gt;&lt;w:lsdException w:name="List Table 5 Dark Accent 1" w:uiPriority="50"/&gt;&lt;w:lsdException w:name="List Table 6 Colorful Accent 1" w:uiPriority="51"/&gt;&lt;w:lsdException w:name="List Table 7 Colorful Accent 1" w:uiPriority="52"/&gt;&lt;w:lsdException w:name="List Table 1 Light Accent 2" w:uiPriority="46"/&gt;&lt;w:lsdException w:name="List Table 2 Accent 2" w:uiPriority="47"/&gt;&lt;w:lsdException w:name="List Table 3 Accent 2" w:uiPriority="48"/&gt;&lt;w:lsdException w:name="List Table 4 Accent 2" w:uiPriority="49"/&gt;&lt;w:lsdException w:name="List Table 5 Dark Accent 2" w:uiPriority="50"/&gt;&lt;w:lsdException w:name="List Table 6 Colorful Accent 2" w:uiPriority="51"/&gt;&lt;w:lsdException w:name="List Table 7 Colorful Accent 2" w:uiPriority="52"/&gt;&lt;w:lsdException w:name="List Table 1 Light Accent 3" w:uiPriority="46"/&gt;&lt;w:lsdException w:name="List Table 2 Accent 3" w:uiPriority="47"/&gt;&lt;w:lsdException w:name="List Table 3 Accent 3" w:uiPriority="48"/&gt;&lt;w:lsdException w:name="List Table 4 Accent 3" w:uiPriority="49"/&gt;&lt;w:lsdException w:name="List Table 5 Dark Accent 3" w:uiPriority="50"/&gt;&lt;w:lsdException w:name="List Table 6 Colorful Accent 3" w:uiPriority="51"/&gt;&lt;w:lsdException w:name="List Table 7 Colorful Accent 3" w:uiPriority="52"/&gt;&lt;w:lsdException w:name="List Table 1 Light Accent 4" w:uiPriority="46"/&gt;&lt;w:lsdException w:name="List Table 2 Accent 4" w:uiPriority="47"/&gt;&lt;w:lsdException w:name="List Table 3 Accent 4" w:uiPriority="48"/&gt;&lt;w:lsdException w:name="List Table 4 Accent 4" w:uiPriority="49"/&gt;&lt;w:lsdException w:name="List Table 5 Dark Accent 4" w:uiPriority="50"/&gt;&lt;w:lsdException w:name="List Table 6 Colorful Accent 4" w:uiPriority="51"/&gt;&lt;w:lsdException w:name="List Table 7 Colorful Accent 4" w:uiPriority="52"/&gt;&lt;w:lsdException w:name="List Table 1 Light Accent 5" w:uiPriority="46"/&gt;&lt;w:lsdException w:name="List Table 2 Accent 5" w:uiPriority="47"/&gt;&lt;w:lsdException w:name="List Table 3 Accent 5" w:uiPriority="48"/&gt;&lt;w:lsdException w:name="List Table 4 Accent 5" w:uiPriority="49"/&gt;&lt;w:lsdException w:name="List Table 5 Dark Accent 5" w:uiPriority="50"/&gt;&lt;w:lsdException w:name="List Table 6 Colorful Accent 5" w:uiPriority="51"/&gt;&lt;w:lsdException w:name="List Table 7 Colorful Accent 5" w:uiPriority="52"/&gt;&lt;w:lsdException w:name="List Table 1 Light Accent 6" w:uiPriority="46"/&gt;&lt;w:lsdException w:name="List Table 2 Accent 6" w:uiPriority="47"/&gt;&lt;w:lsdException w:name="List Table 3 Accent 6" w:uiPriority="48"/&gt;&lt;w:lsdException w:name="List Table 4 Accent 6" w:uiPriority="49"/&gt;&lt;w:lsdException w:name="List Table 5 Dark Accent 6" w:uiPriority="50"/&gt;&lt;w:lsdException w:name="List Table 6 Colorful Accent 6" w:uiPriority="51"/&gt;&lt;w:lsdException w:name="List Table 7 Colorful Accent 6" w:uiPriority="52"/&gt;&lt;w:lsdException w:name="Mention" w:semiHidden="1" w:unhideWhenUsed="1"/&gt;&lt;w:lsdException w:name="Smart Hyperlink" w:semiHidden="1" w:unhideWhenUsed="1"/&gt;&lt;w:lsdException w:name="Hashtag" w:semiHidden="1" w:unhideWhenUsed="1"/&gt;&lt;/w:latentStyles&gt;&lt;w:style w:type="paragraph" w:default="1" w:styleId="Normal"&gt;&lt;w:name w:val="Normal"/&gt;&lt;w:qFormat/&gt;&lt;/w:style&gt;&lt;w:style w:type="character" w:default="1" w:styleId="DefaultParagraphFont"&gt;&lt;w:name w:val="Default Paragraph Font"/&gt;&lt;w:uiPriority w:val="1"/&gt;&lt;w:semiHidden/&gt;&lt;w:unhideWhenUsed/&gt;&lt;/w:style&gt;&lt;w:style w:type="table" w:default="1" w:styleId="TableNormal"&gt;&lt;w:name w:val="Normal Table"/&gt;&lt;w:uiPriority w:val="99"/&gt;&lt;w:semiHidden/&gt;&lt;w:unhideWhenUsed/&gt;&lt;w:tblPr&gt;&lt;w:tblInd w:w="0" w:type="dxa"/&gt;&lt;w:tblCellMar&gt;&lt;w:top w:w="0" w:type="dxa"/&gt;&lt;w:left w:w="108" w:type="dxa"/&gt;&lt;w:bottom w:w="0" w:type="dxa"/&gt;&lt;w:right w:w="108" w:type="dxa"/&gt;&lt;/w:tblCellMar&gt;&lt;/w:tblPr&gt;&lt;/w:style&gt;&lt;w:style w:type="numbering" w:default="1" w:styleId="NoList"&gt;&lt;w:name w:val="No List"/&gt;&lt;w:uiPriority w:val="99"/&gt;&lt;w:semiHidden/&gt;&lt;w:unhideWhenUsed/&gt;&lt;/w:style&gt;&lt;w:style w:type="character" w:styleId="PlaceholderText"&gt;&lt;w:name w:val="Placeholder Text"/&gt;&lt;w:basedOn w:val="DefaultParagraphFont"/&gt;&lt;w:uiPriority w:val="99"/&gt;&lt;w:rPr&gt;&lt;w:color w:val="7F7F7F" w:themeColor="text1" w:themeTint="80"/&gt;&lt;w:bdr w:val="none" w:sz="0" w:space="0" w:color="auto"/&gt;&lt;w:shd w:val="clear" w:color="auto" w:fill="F0F0F0"/&gt;&lt;/w:rPr&gt;&lt;/w:style&gt;&lt;w:style w:type="paragraph" w:customStyle="1" w:styleId="F25D791C5B2F4E19930DB86356413466"&gt;&lt;w:name w:val="F25D791C5B2F4E19930DB86356413466"/&gt;&lt;/w:style&gt;&lt;/w:styles&gt;&lt;/pkg:xmlData&gt;&lt;/pkg:part&gt;&lt;pkg:part pkg:name="/word/styles.xml" pkg:contentType="application/vnd.openxmlformats-officedocument.wordprocessingml.styles+xml"&gt;&lt;pkg:xmlData&gt;&lt;w:styles xmlns:mc="http://schemas.openxmlformats.org/markup-compatibility/2006" xmlns:r="http://schemas.openxmlformats.org/officeDocument/2006/relationships" xmlns:w="http://schemas.openxmlformats.org/wordprocessingml/2006/main" xmlns:w14="http://schemas.microsoft.com/office/word/2010/wordml" xmlns:w15="http://schemas.microsoft.com/office/word/2012/wordml" xmlns:w16se="http://schemas.microsoft.com/office/word/2015/wordml/symex" mc:Ignorable="w14 w15 w16se"&gt;&lt;w:docDefaults&gt;&lt;w:rPrDefault&gt;&lt;w:rPr&gt;&lt;w:rFonts w:asciiTheme="minorHAnsi" w:eastAsiaTheme="minorEastAsia" w:hAnsiTheme="minorHAnsi" w:cstheme="minorBidi"/&gt;&lt;w:sz w:val="19"/&gt;&lt;w:szCs w:val="19"/&gt;&lt;w:lang w:val="sv-SE" w:eastAsia="en-US" w:bidi="ar-SA"/&gt;&lt;/w:rPr&gt;&lt;/w:rPrDefault&gt;&lt;w:pPrDefault&gt;&lt;w:pPr&gt;&lt;w:spacing w:after="160" w:line="288" w:lineRule="auto"/&gt;&lt;/w:pPr&gt;&lt;/w:pPrDefault&gt;&lt;/w:docDefaults&gt;&lt;w:style w:type="paragraph" w:default="1" w:styleId="Normal"&gt;&lt;w:name w:val="Normal"/&gt;&lt;w:qFormat/&gt;&lt;w:rsid w:val="005F186C"/&gt;&lt;w:pPr&gt;&lt;w:spacing w:after="200"/&gt;&lt;/w:pPr&gt;&lt;w:rPr&gt;&lt;w:sz w:val="20"/&gt;&lt;w:lang w:val="en-GB"/&gt;&lt;/w:rPr&gt;&lt;/w:style&gt;&lt;w:style w:type="paragraph" w:styleId="Heading1"&gt;&lt;w:name w:val="heading 1"/&gt;&lt;w:basedOn w:val="Normal"/&gt;&lt;w:next w:val="Normal"/&gt;&lt;w:link w:val="Heading1Char"/&gt;&lt;w:uiPriority w:val="9"/&gt;&lt;w:qFormat/&gt;&lt;w:rsid w:val="000C3604"/&gt;&lt;w:pPr&gt;&lt;w:keepNext/&gt;&lt;w:keepLines/&gt;&lt;w:spacing w:before="240"/&gt;&lt;w:outlineLvl w:val="0"/&gt;&lt;/w:pPr&gt;&lt;w:rPr&gt;&lt;w:rFonts w:asciiTheme="majorHAnsi" w:eastAsiaTheme="majorEastAsia" w:hAnsiTheme="majorHAnsi" w:cstheme="majorBidi"/&gt;&lt;w:bCs/&gt;&lt;w:sz w:val="28"/&gt;&lt;w:szCs w:val="28"/&gt;&lt;/w:rPr&gt;&lt;/w:style&gt;&lt;w:style w:type="paragraph" w:styleId="Heading2"&gt;&lt;w:name w:val="heading 2"/&gt;&lt;w:basedOn w:val="Normal"/&gt;&lt;w:next w:val="Normal"/&gt;&lt;w:link w:val="Heading2Char"/&gt;&lt;w:uiPriority w:val="9"/&gt;&lt;w:qFormat/&gt;&lt;w:rsid w:val="000C3604"/&gt;&lt;w:pPr&gt;&lt;w:keepNext/&gt;&lt;w:keepLines/&gt;&lt;w:spacing w:before="240" w:after="80"/&gt;&lt;w:outlineLvl w:val="1"/&gt;&lt;/w:pPr&gt;&lt;w:rPr&gt;&lt;w:rFonts w:ascii="GothamMedium" w:eastAsiaTheme="majorEastAsia" w:hAnsi="GothamMedium" w:cstheme="majorBidi"/&gt;&lt;w:bCs/&gt;&lt;w:sz w:val="24"/&gt;&lt;w:szCs w:val="28"/&gt;&lt;/w:rPr&gt;&lt;/w:style&gt;&lt;w:style w:type="paragraph" w:styleId="Heading3"&gt;&lt;w:name w:val="heading 3"/&gt;&lt;w:basedOn w:val="Normal"/&gt;&lt;w:next w:val="Normal"/&gt;&lt;w:link w:val="Heading3Char"/&gt;&lt;w:uiPriority w:val="9"/&gt;&lt;w:qFormat/&gt;&lt;w:rsid w:val="00872413"/&gt;&lt;w:pPr&gt;&lt;w:keepNext/&gt;&lt;w:keepLines/&gt;&lt;w:spacing w:before="120" w:after="40"/&gt;&lt;w:outlineLvl w:val="2"/&gt;&lt;/w:pPr&gt;&lt;w:rPr&gt;&lt;w:rFonts w:ascii="GothamMedium" w:eastAsiaTheme="majorEastAsia" w:hAnsi="GothamMedium" w:cstheme="majorBidi"/&gt;&lt;w:sz w:val="22"/&gt;&lt;w:szCs w:val="24"/&gt;&lt;/w:rPr&gt;&lt;/w:style&gt;&lt;w:style w:type="paragraph" w:styleId="Heading4"&gt;&lt;w:name w:val="heading 4"/&gt;&lt;w:basedOn w:val="Normal"/&gt;&lt;w:next w:val="Normal"/&gt;&lt;w:link w:val="Heading4Char"/&gt;&lt;w:uiPriority w:val="9"/&gt;&lt;w:semiHidden/&gt;&lt;w:qFormat/&gt;&lt;w:rsid w:val="00872413"/&gt;&lt;w:pPr&gt;&lt;w:keepNext/&gt;&lt;w:keepLines/&gt;&lt;w:spacing w:before="120" w:after="40"/&gt;&lt;w:outlineLvl w:val="3"/&gt;&lt;/w:pPr&gt;&lt;w:rPr&gt;&lt;w:rFonts w:ascii="GothamMedium" w:eastAsiaTheme="majorEastAsia" w:hAnsi="GothamMedium" w:cstheme="majorBidi"/&gt;&lt;w:iCs/&gt;&lt;w:szCs w:val="24"/&gt;&lt;/w:rPr&gt;&lt;/w:style&gt;&lt;w:style w:type="paragraph" w:styleId="Heading5"&gt;&lt;w:name w:val="heading 5"/&gt;&lt;w:basedOn w:val="Normal"/&gt;&lt;w:next w:val="Normal"/&gt;&lt;w:link w:val="Heading5Char"/&gt;&lt;w:uiPriority w:val="9"/&gt;&lt;w:semiHidden/&gt;&lt;w:qFormat/&gt;&lt;w:rsid w:val="009B1B65"/&gt;&lt;w:pPr&gt;&lt;w:keepNext/&gt;&lt;w:keepLines/&gt;&lt;w:numPr&gt;&lt;w:ilvl w:val="4"/&gt;&lt;w:numId w:val="15"/&gt;&lt;/w:numPr&gt;&lt;w:spacing w:before="120" w:after="0"/&gt;&lt;w:outlineLvl w:val="4"/&gt;&lt;/w:pPr&gt;&lt;w:rPr&gt;&lt;w:rFonts w:asciiTheme="majorHAnsi" w:eastAsiaTheme="majorEastAsia" w:hAnsiTheme="majorHAnsi" w:cstheme="majorBidi"/&gt;&lt;w:b/&gt;&lt;w:bCs/&gt;&lt;/w:rPr&gt;&lt;/w:style&gt;&lt;w:style w:type="paragraph" w:styleId="Heading6"&gt;&lt;w:name w:val="heading 6"/&gt;&lt;w:basedOn w:val="Normal"/&gt;&lt;w:next w:val="Normal"/&gt;&lt;w:link w:val="Heading6Char"/&gt;&lt;w:uiPriority w:val="9"/&gt;&lt;w:semiHidden/&gt;&lt;w:rsid w:val="009B1B65"/&gt;&lt;w:pPr&gt;&lt;w:keepNext/&gt;&lt;w:keepLines/&gt;&lt;w:numPr&gt;&lt;w:ilvl w:val="5"/&gt;&lt;w:numId w:val="15"/&gt;&lt;/w:numPr&gt;&lt;w:spacing w:before="120" w:after="0"/&gt;&lt;w:outlineLvl w:val="5"/&gt;&lt;/w:pPr&gt;&lt;w:rPr&gt;&lt;w:rFonts w:asciiTheme="majorHAnsi" w:eastAsiaTheme="majorEastAsia" w:hAnsiTheme="majorHAnsi" w:cstheme="majorBidi"/&gt;&lt;w:b/&gt;&lt;w:bCs/&gt;&lt;w:i/&gt;&lt;w:iCs/&gt;&lt;/w:rPr&gt;&lt;/w:style&gt;&lt;w:style w:type="paragraph" w:styleId="Heading7"&gt;&lt;w:name w:val="heading 7"/&gt;&lt;w:basedOn w:val="Normal"/&gt;&lt;w:next w:val="Normal"/&gt;&lt;w:link w:val="Heading7Char"/&gt;&lt;w:uiPriority w:val="9"/&gt;&lt;w:semiHidden/&gt;&lt;w:rsid w:val="009B1B65"/&gt;&lt;w:pPr&gt;&lt;w:keepNext/&gt;&lt;w:keepLines/&gt;&lt;w:numPr&gt;&lt;w:ilvl w:val="6"/&gt;&lt;w:numId w:val="15"/&gt;&lt;/w:numPr&gt;&lt;w:spacing w:before="120" w:after="0"/&gt;&lt;w:outlineLvl w:val="6"/&gt;&lt;/w:pPr&gt;&lt;w:rPr&gt;&lt;w:i/&gt;&lt;w:iCs/&gt;&lt;/w:rPr&gt;&lt;/w:style&gt;&lt;w:style w:type="paragraph" w:styleId="Heading8"&gt;&lt;w:name w:val="heading 8"/&gt;&lt;w:basedOn w:val="Normal"/&gt;&lt;w:next w:val="Normal"/&gt;&lt;w:link w:val="Heading8Char"/&gt;&lt;w:uiPriority w:val="9"/&gt;&lt;w:semiHidden/&gt;&lt;w:rsid w:val="009B1B65"/&gt;&lt;w:pPr&gt;&lt;w:keepNext/&gt;&lt;w:keepLines/&gt;&lt;w:numPr&gt;&lt;w:ilvl w:val="7"/&gt;&lt;w:numId w:val="15"/&gt;&lt;/w:numPr&gt;&lt;w:spacing w:before="120" w:after="0"/&gt;&lt;w:outlineLvl w:val="7"/&gt;&lt;/w:pPr&gt;&lt;w:rPr&gt;&lt;w:b/&gt;&lt;w:bCs/&gt;&lt;/w:rPr&gt;&lt;/w:style&gt;&lt;w:style w:type="paragraph" w:styleId="Heading9"&gt;&lt;w:name w:val="heading 9"/&gt;&lt;w:basedOn w:val="Normal"/&gt;&lt;w:next w:val="Normal"/&gt;&lt;w:link w:val="Heading9Char"/&gt;&lt;w:uiPriority w:val="9"/&gt;&lt;w:semiHidden/&gt;&lt;w:rsid w:val="009B1B65"/&gt;&lt;w:pPr&gt;&lt;w:keepNext/&gt;&lt;w:keepLines/&gt;&lt;w:numPr&gt;&lt;w:ilvl w:val="8"/&gt;&lt;w:numId w:val="15"/&gt;&lt;/w:numPr&gt;&lt;w:spacing w:before="120" w:after="0"/&gt;&lt;w:outlineLvl w:val="8"/&gt;&lt;/w:pPr&gt;&lt;w:rPr&gt;&lt;w:i/&gt;&lt;w:iCs/&gt;&lt;/w:rPr&gt;&lt;/w:style&gt;&lt;w:style w:type="character" w:default="1" w:styleId="DefaultParagraphFont"&gt;&lt;w:name w:val="Default Paragraph Font"/&gt;&lt;w:uiPriority w:val="1"/&gt;&lt;w:semiHidden/&gt;&lt;w:unhideWhenUsed/&gt;&lt;/w:style&gt;&lt;w:style w:type="table" w:default="1" w:styleId="TableNormal"&gt;&lt;w:name w:val="Normal Table"/&gt;&lt;w:uiPriority w:val="99"/&gt;&lt;w:semiHidden/&gt;&lt;w:unhideWhenUsed/&gt;&lt;w:tblPr&gt;&lt;w:tblInd w:w="0" w:type="dxa"/&gt;&lt;w:tblCellMar&gt;&lt;w:top w:w="0" w:type="dxa"/&gt;&lt;w:left w:w="108" w:type="dxa"/&gt;&lt;w:bottom w:w="0" w:type="dxa"/&gt;&lt;w:right w:w="108" w:type="dxa"/&gt;&lt;/w:tblCellMar&gt;&lt;/w:tblPr&gt;&lt;/w:style&gt;&lt;w:style w:type="numbering" w:default="1" w:styleId="NoList"&gt;&lt;w:name w:val="No List"/&gt;&lt;w:uiPriority w:val="99"/&gt;&lt;w:semiHidden/&gt;&lt;w:unhideWhenUsed/&gt;&lt;/w:style&gt;&lt;w:style w:type="character" w:customStyle="1" w:styleId="Heading1Char"&gt;&lt;w:name w:val="Heading 1 Char"/&gt;&lt;w:basedOn w:val="DefaultParagraphFont"/&gt;&lt;w:link w:val="Heading1"/&gt;&lt;w:uiPriority w:val="9"/&gt;&lt;w:rsid w:val="000C3604"/&gt;&lt;w:rPr&gt;&lt;w:rFonts w:asciiTheme="majorHAnsi" w:eastAsiaTheme="majorEastAsia" w:hAnsiTheme="majorHAnsi" w:cstheme="majorBidi"/&gt;&lt;w:bCs/&gt;&lt;w:sz w:val="28"/&gt;&lt;w:szCs w:val="28"/&gt;&lt;w:lang w:val="en-GB"/&gt;&lt;/w:rPr&gt;&lt;/w:style&gt;&lt;w:style w:type="character" w:customStyle="1" w:styleId="Heading2Char"&gt;&lt;w:name w:val="Heading 2 Char"/&gt;&lt;w:basedOn w:val="DefaultParagraphFont"/&gt;&lt;w:link w:val="Heading2"/&gt;&lt;w:uiPriority w:val="9"/&gt;&lt;w:rsid w:val="000C3604"/&gt;&lt;w:rPr&gt;&lt;w:rFonts w:ascii="GothamMedium" w:eastAsiaTheme="majorEastAsia" w:hAnsi="GothamMedium" w:cstheme="majorBidi"/&gt;&lt;w:bCs/&gt;&lt;w:sz w:val="24"/&gt;&lt;w:szCs w:val="28"/&gt;&lt;w:lang w:val="en-GB"/&gt;&lt;/w:rPr&gt;&lt;/w:style&gt;&lt;w:style w:type="character" w:customStyle="1" w:styleId="Heading3Char"&gt;&lt;w:name w:val="Heading 3 Char"/&gt;&lt;w:basedOn w:val="DefaultParagraphFont"/&gt;&lt;w:link w:val="Heading3"/&gt;&lt;w:uiPriority w:val="9"/&gt;&lt;w:rsid w:val="00872413"/&gt;&lt;w:rPr&gt;&lt;w:rFonts w:ascii="GothamMedium" w:eastAsiaTheme="majorEastAsia" w:hAnsi="GothamMedium" w:cstheme="majorBidi"/&gt;&lt;w:sz w:val="22"/&gt;&lt;w:szCs w:val="24"/&gt;&lt;w:lang w:val="en-GB"/&gt;&lt;/w:rPr&gt;&lt;/w:style&gt;&lt;w:style w:type="character" w:customStyle="1" w:styleId="Heading4Char"&gt;&lt;w:name w:val="Heading 4 Char"/&gt;&lt;w:basedOn w:val="DefaultParagraphFont"/&gt;&lt;w:link w:val="Heading4"/&gt;&lt;w:uiPriority w:val="9"/&gt;&lt;w:semiHidden/&gt;&lt;w:rsid w:val="005F186C"/&gt;&lt;w:rPr&gt;&lt;w:rFonts w:ascii="GothamMedium" w:eastAsiaTheme="majorEastAsia" w:hAnsi="GothamMedium" w:cstheme="majorBidi"/&gt;&lt;w:iCs/&gt;&lt;w:sz w:val="20"/&gt;&lt;w:szCs w:val="24"/&gt;&lt;w:lang w:val="en-GB"/&gt;&lt;/w:rPr&gt;&lt;/w:style&gt;&lt;w:style w:type="character" w:customStyle="1" w:styleId="Heading5Char"&gt;&lt;w:name w:val="Heading 5 Char"/&gt;&lt;w:basedOn w:val="DefaultParagraphFont"/&gt;&lt;w:link w:val="Heading5"/&gt;&lt;w:uiPriority w:val="9"/&gt;&lt;w:semiHidden/&gt;&lt;w:rsid w:val="008E716E"/&gt;&lt;w:rPr&gt;&lt;w:rFonts w:asciiTheme="majorHAnsi" w:eastAsiaTheme="majorEastAsia" w:hAnsiTheme="majorHAnsi" w:cstheme="majorBidi"/&gt;&lt;w:b/&gt;&lt;w:bCs/&gt;&lt;w:lang w:val="en-GB"/&gt;&lt;/w:rPr&gt;&lt;/w:style&gt;&lt;w:style w:type="character" w:customStyle="1" w:styleId="Heading6Char"&gt;&lt;w:name w:val="Heading 6 Char"/&gt;&lt;w:basedOn w:val="DefaultParagraphFont"/&gt;&lt;w:link w:val="Heading6"/&gt;&lt;w:uiPriority w:val="9"/&gt;&lt;w:semiHidden/&gt;&lt;w:rsid w:val="008E716E"/&gt;&lt;w:rPr&gt;&lt;w:rFonts w:asciiTheme="majorHAnsi" w:eastAsiaTheme="majorEastAsia" w:hAnsiTheme="majorHAnsi" w:cstheme="majorBidi"/&gt;&lt;w:b/&gt;&lt;w:bCs/&gt;&lt;w:i/&gt;&lt;w:iCs/&gt;&lt;w:lang w:val="en-GB"/&gt;&lt;/w:rPr&gt;&lt;/w:style&gt;&lt;w:style w:type="character" w:customStyle="1" w:styleId="Heading7Char"&gt;&lt;w:name w:val="Heading 7 Char"/&gt;&lt;w:basedOn w:val="DefaultParagraphFont"/&gt;&lt;w:link w:val="Heading7"/&gt;&lt;w:uiPriority w:val="9"/&gt;&lt;w:semiHidden/&gt;&lt;w:rsid w:val="008E716E"/&gt;&lt;w:rPr&gt;&lt;w:i/&gt;&lt;w:iCs/&gt;&lt;w:lang w:val="en-GB"/&gt;&lt;/w:rPr&gt;&lt;/w:style&gt;&lt;w:style w:type="character" w:customStyle="1" w:styleId="Heading8Char"&gt;&lt;w:name w:val="Heading 8 Char"/&gt;&lt;w:basedOn w:val="DefaultParagraphFont"/&gt;&lt;w:link w:val="Heading8"/&gt;&lt;w:uiPriority w:val="9"/&gt;&lt;w:semiHidden/&gt;&lt;w:rsid w:val="008E716E"/&gt;&lt;w:rPr&gt;&lt;w:b/&gt;&lt;w:bCs/&gt;&lt;w:lang w:val="en-GB"/&gt;&lt;/w:rPr&gt;&lt;/w:style&gt;&lt;w:style w:type="character" w:customStyle="1" w:styleId="Heading9Char"&gt;&lt;w:name w:val="Heading 9 Char"/&gt;&lt;w:basedOn w:val="DefaultParagraphFont"/&gt;&lt;w:link w:val="Heading9"/&gt;&lt;w:uiPriority w:val="9"/&gt;&lt;w:semiHidden/&gt;&lt;w:rsid w:val="008E716E"/&gt;&lt;w:rPr&gt;&lt;w:i/&gt;&lt;w:iCs/&gt;&lt;w:lang w:val="en-GB"/&gt;&lt;/w:rPr&gt;&lt;/w:style&gt;&lt;w:style w:type="paragraph" w:styleId="Caption"&gt;&lt;w:name w:val="caption"/&gt;&lt;w:basedOn w:val="Normal"/&gt;&lt;w:next w:val="Normal"/&gt;&lt;w:uiPriority w:val="35"/&gt;&lt;w:semiHidden/&gt;&lt;w:rsid w:val="009B1B65"/&gt;&lt;w:rPr&gt;&lt;w:b/&gt;&lt;w:bCs/&gt;&lt;w:sz w:val="18"/&gt;&lt;w:szCs w:val="18"/&gt;&lt;/w:rPr&gt;&lt;/w:style&gt;&lt;w:style w:type="paragraph" w:styleId="Title"&gt;&lt;w:name w:val="Title"/&gt;&lt;w:basedOn w:val="Normal"/&gt;&lt;w:next w:val="Normal"/&gt;&lt;w:link w:val="TitleChar"/&gt;&lt;w:uiPriority w:val="10"/&gt;&lt;w:semiHidden/&gt;&lt;w:qFormat/&gt;&lt;w:rsid w:val="00872413"/&gt;&lt;w:pPr&gt;&lt;w:spacing w:after="0"/&gt;&lt;w:contextualSpacing/&gt;&lt;/w:pPr&gt;&lt;w:rPr&gt;&lt;w:rFonts w:asciiTheme="majorHAnsi" w:eastAsiaTheme="majorEastAsia" w:hAnsiTheme="majorHAnsi" w:cstheme="majorBidi"/&gt;&lt;w:bCs/&gt;&lt;w:color w:val="407077" w:themeColor="accent1"/&gt;&lt;w:sz w:val="72"/&gt;&lt;w:szCs w:val="48"/&gt;&lt;/w:rPr&gt;&lt;/w:style&gt;&lt;w:style w:type="character" w:customStyle="1" w:styleId="TitleChar"&gt;&lt;w:name w:val="Title Char"/&gt;&lt;w:basedOn w:val="DefaultParagraphFont"/&gt;&lt;w:link w:val="Title"/&gt;&lt;w:uiPriority w:val="10"/&gt;&lt;w:semiHidden/&gt;&lt;w:rsid w:val="005F186C"/&gt;&lt;w:rPr&gt;&lt;w:rFonts w:asciiTheme="majorHAnsi" w:eastAsiaTheme="majorEastAsia" w:hAnsiTheme="majorHAnsi" w:cstheme="majorBidi"/&gt;&lt;w:bCs/&gt;&lt;w:color w:val="407077" w:themeColor="accent1"/&gt;&lt;w:sz w:val="72"/&gt;&lt;w:szCs w:val="48"/&gt;&lt;w:lang w:val="en-GB"/&gt;&lt;/w:rPr&gt;&lt;/w:style&gt;&lt;w:style w:type="paragraph" w:styleId="Subtitle"&gt;&lt;w:name w:val="Subtitle"/&gt;&lt;w:basedOn w:val="Normal"/&gt;&lt;w:next w:val="Normal"/&gt;&lt;w:link w:val="SubtitleChar"/&gt;&lt;w:uiPriority w:val="11"/&gt;&lt;w:semiHidden/&gt;&lt;w:qFormat/&gt;&lt;w:rsid w:val="00872413"/&gt;&lt;w:pPr&gt;&lt;w:numPr&gt;&lt;w:ilvl w:val="1"/&gt;&lt;/w:numPr&gt;&lt;w:spacing w:before="120" w:after="240"/&gt;&lt;/w:pPr&gt;&lt;w:rPr&gt;&lt;w:rFonts w:ascii="GothamMedium" w:eastAsiaTheme="majorEastAsia" w:hAnsi="GothamMedium" w:cstheme="majorBidi"/&gt;&lt;w:color w:val="343436" w:themeColor="text2"/&gt;&lt;w:sz w:val="24"/&gt;&lt;w:szCs w:val="24"/&gt;&lt;/w:rPr&gt;&lt;/w:style&gt;&lt;w:style w:type="character" w:customStyle="1" w:styleId="SubtitleChar"&gt;&lt;w:name w:val="Subtitle Char"/&gt;&lt;w:basedOn w:val="DefaultParagraphFont"/&gt;&lt;w:link w:val="Subtitle"/&gt;&lt;w:uiPriority w:val="11"/&gt;&lt;w:semiHidden/&gt;&lt;w:rsid w:val="005F186C"/&gt;&lt;w:rPr&gt;&lt;w:rFonts w:ascii="GothamMedium" w:eastAsiaTheme="majorEastAsia" w:hAnsi="GothamMedium" w:cstheme="majorBidi"/&gt;&lt;w:color w:val="343436" w:themeColor="text2"/&gt;&lt;w:sz w:val="24"/&gt;&lt;w:szCs w:val="24"/&gt;&lt;w:lang w:val="en-GB"/&gt;&lt;/w:rPr&gt;&lt;/w:style&gt;&lt;w:style w:type="character" w:styleId="Strong"&gt;&lt;w:name w:val="Strong"/&gt;&lt;w:basedOn w:val="DefaultParagraphFont"/&gt;&lt;w:uiPriority w:val="22"/&gt;&lt;w:semiHidden/&gt;&lt;w:rsid w:val="009B1B65"/&gt;&lt;w:rPr&gt;&lt;w:b/&gt;&lt;w:bCs/&gt;&lt;w:color w:val="auto"/&gt;&lt;/w:rPr&gt;&lt;/w:style&gt;&lt;w:style w:type="character" w:styleId="Emphasis"&gt;&lt;w:name w:val="Emphasis"/&gt;&lt;w:basedOn w:val="DefaultParagraphFont"/&gt;&lt;w:uiPriority w:val="20"/&gt;&lt;w:semiHidden/&gt;&lt;w:rsid w:val="009B1B65"/&gt;&lt;w:rPr&gt;&lt;w:i/&gt;&lt;w:iCs/&gt;&lt;w:color w:val="auto"/&gt;&lt;/w:rPr&gt;&lt;/w:style&gt;&lt;w:style w:type="paragraph" w:styleId="NoSpacing"&gt;&lt;w:name w:val="No Spacing"/&gt;&lt;w:link w:val="NoSpacingChar"/&gt;&lt;w:uiPriority w:val="1"/&gt;&lt;w:qFormat/&gt;&lt;w:rsid w:val="00EA5662"/&gt;&lt;w:pPr&gt;&lt;w:spacing w:after="0"/&gt;&lt;/w:pPr&gt;&lt;/w:style&gt;&lt;w:style w:type="paragraph" w:styleId="Quote"&gt;&lt;w:name w:val="Quote"/&gt;&lt;w:basedOn w:val="Normal"/&gt;&lt;w:next w:val="Normal"/&gt;&lt;w:link w:val="QuoteChar"/&gt;&lt;w:uiPriority w:val="29"/&gt;&lt;w:semiHidden/&gt;&lt;w:rsid w:val="009B1B65"/&gt;&lt;w:pPr&gt;&lt;w:spacing w:before="200" w:line="264" w:lineRule="auto"/&gt;&lt;w:ind w:left="864" w:right="864"/&gt;&lt;w:jc w:val="center"/&gt;&lt;/w:pPr&gt;&lt;w:rPr&gt;&lt;w:rFonts w:asciiTheme="majorHAnsi" w:eastAsiaTheme="majorEastAsia" w:hAnsiTheme="majorHAnsi" w:cstheme="majorBidi"/&gt;&lt;w:i/&gt;&lt;w:iCs/&gt;&lt;w:sz w:val="24"/&gt;&lt;w:szCs w:val="24"/&gt;&lt;/w:rPr&gt;&lt;/w:style&gt;&lt;w:style w:type="character" w:customStyle="1" w:styleId="QuoteChar"&gt;&lt;w:name w:val="Quote Char"/&gt;&lt;w:basedOn w:val="DefaultParagraphFont"/&gt;&lt;w:link w:val="Quote"/&gt;&lt;w:uiPriority w:val="29"/&gt;&lt;w:semiHidden/&gt;&lt;w:rsid w:val="009B1B65"/&gt;&lt;w:rPr&gt;&lt;w:rFonts w:asciiTheme="majorHAnsi" w:eastAsiaTheme="majorEastAsia" w:hAnsiTheme="majorHAnsi" w:cstheme="majorBidi"/&gt;&lt;w:i/&gt;&lt;w:iCs/&gt;&lt;w:sz w:val="24"/&gt;&lt;w:szCs w:val="24"/&gt;&lt;/w:rPr&gt;&lt;/w:style&gt;&lt;w:style w:type="paragraph" w:styleId="IntenseQuote"&gt;&lt;w:name w:val="Intense Quote"/&gt;&lt;w:basedOn w:val="Normal"/&gt;&lt;w:next w:val="Normal"/&gt;&lt;w:link w:val="IntenseQuoteChar"/&gt;&lt;w:uiPriority w:val="30"/&gt;&lt;w:semiHidden/&gt;&lt;w:rsid w:val="009B1B65"/&gt;&lt;w:pPr&gt;&lt;w:spacing w:before="100" w:beforeAutospacing="1" w:after="240"/&gt;&lt;w:ind w:left="936" w:right="936"/&gt;&lt;w:jc w:val="center"/&gt;&lt;/w:pPr&gt;&lt;w:rPr&gt;&lt;w:rFonts w:asciiTheme="majorHAnsi" w:eastAsiaTheme="majorEastAsia" w:hAnsiTheme="majorHAnsi" w:cstheme="majorBidi"/&gt;&lt;w:sz w:val="26"/&gt;&lt;w:szCs w:val="26"/&gt;&lt;/w:rPr&gt;&lt;/w:style&gt;&lt;w:style w:type="character" w:customStyle="1" w:styleId="IntenseQuoteChar"&gt;&lt;w:name w:val="Intense Quote Char"/&gt;&lt;w:basedOn w:val="DefaultParagraphFont"/&gt;&lt;w:link w:val="IntenseQuote"/&gt;&lt;w:uiPriority w:val="30"/&gt;&lt;w:semiHidden/&gt;&lt;w:rsid w:val="009B1B65"/&gt;&lt;w:rPr&gt;&lt;w:rFonts w:asciiTheme="majorHAnsi" w:eastAsiaTheme="majorEastAsia" w:hAnsiTheme="majorHAnsi" w:cstheme="majorBidi"/&gt;&lt;w:sz w:val="26"/&gt;&lt;w:szCs w:val="26"/&gt;&lt;/w:rPr&gt;&lt;/w:style&gt;&lt;w:style w:type="character" w:styleId="SubtleEmphasis"&gt;&lt;w:name w:val="Subtle Emphasis"/&gt;&lt;w:basedOn w:val="DefaultParagraphFont"/&gt;&lt;w:uiPriority w:val="19"/&gt;&lt;w:semiHidden/&gt;&lt;w:rsid w:val="009B1B65"/&gt;&lt;w:rPr&gt;&lt;w:i/&gt;&lt;w:iCs/&gt;&lt;w:color w:val="auto"/&gt;&lt;/w:rPr&gt;&lt;/w:style&gt;&lt;w:style w:type="character" w:styleId="IntenseEmphasis"&gt;&lt;w:name w:val="Intense Emphasis"/&gt;&lt;w:basedOn w:val="DefaultParagraphFont"/&gt;&lt;w:uiPriority w:val="21"/&gt;&lt;w:semiHidden/&gt;&lt;w:rsid w:val="009B1B65"/&gt;&lt;w:rPr&gt;&lt;w:b/&gt;&lt;w:bCs/&gt;&lt;w:i/&gt;&lt;w:iCs/&gt;&lt;w:color w:val="auto"/&gt;&lt;/w:rPr&gt;&lt;/w:style&gt;&lt;w:style w:type="character" w:styleId="SubtleReference"&gt;&lt;w:name w:val="Subtle Reference"/&gt;&lt;w:basedOn w:val="DefaultParagraphFont"/&gt;&lt;w:uiPriority w:val="31"/&gt;&lt;w:semiHidden/&gt;&lt;w:rsid w:val="009B1B65"/&gt;&lt;w:rPr&gt;&lt;w:smallCaps/&gt;&lt;w:color w:val="auto"/&gt;&lt;w:u w:val="single" w:color="7F7F7F" w:themeColor="text1" w:themeTint="80"/&gt;&lt;/w:rPr&gt;&lt;/w:style&gt;&lt;w:style w:type="character" w:styleId="IntenseReference"&gt;&lt;w:name w:val="Intense Reference"/&gt;&lt;w:basedOn w:val="DefaultParagraphFont"/&gt;&lt;w:uiPriority w:val="32"/&gt;&lt;w:semiHidden/&gt;&lt;w:rsid w:val="009B1B65"/&gt;&lt;w:rPr&gt;&lt;w:b/&gt;&lt;w:bCs/&gt;&lt;w:smallCaps/&gt;&lt;w:color w:val="auto"/&gt;&lt;w:u w:val="single"/&gt;&lt;/w:rPr&gt;&lt;/w:style&gt;&lt;w:style w:type="character" w:styleId="BookTitle"&gt;&lt;w:name w:val="Book Title"/&gt;&lt;w:basedOn w:val="DefaultParagraphFont"/&gt;&lt;w:uiPriority w:val="33"/&gt;&lt;w:semiHidden/&gt;&lt;w:rsid w:val="009B1B65"/&gt;&lt;w:rPr&gt;&lt;w:b/&gt;&lt;w:bCs/&gt;&lt;w:smallCaps/&gt;&lt;w:color w:val="auto"/&gt;&lt;/w:rPr&gt;&lt;/w:style&gt;&lt;w:style w:type="paragraph" w:styleId="TOCHeading"&gt;&lt;w:name w:val="TOC Heading"/&gt;&lt;w:basedOn w:val="Normal"/&gt;&lt;w:next w:val="Normal"/&gt;&lt;w:uiPriority w:val="39"/&gt;&lt;w:semiHidden/&gt;&lt;w:rsid w:val="009F4214"/&gt;&lt;w:pPr&gt;&lt;w:keepNext/&gt;&lt;w:keepLines/&gt;&lt;w:pageBreakBefore/&gt;&lt;/w:pPr&gt;&lt;w:rPr&gt;&lt;w:rFonts w:asciiTheme="majorHAnsi" w:hAnsiTheme="majorHAnsi"/&gt;&lt;w:b/&gt;&lt;w:sz w:val="32"/&gt;&lt;/w:rPr&gt;&lt;/w:style&gt;&lt;w:style w:type="paragraph" w:styleId="ListBullet"&gt;&lt;w:name w:val="List Bullet"/&gt;&lt;w:basedOn w:val="Normal"/&gt;&lt;w:uiPriority w:val="14"/&gt;&lt;w:qFormat/&gt;&lt;w:rsid w:val="001D4B24"/&gt;&lt;w:pPr&gt;&lt;w:numPr&gt;&lt;w:numId w:val="1"/&gt;&lt;/w:numPr&gt;&lt;w:spacing w:after="80"/&gt;&lt;w:contextualSpacing/&gt;&lt;/w:pPr&gt;&lt;/w:style&gt;&lt;w:style w:type="paragraph" w:styleId="ListNumber"&gt;&lt;w:name w:val="List Number"/&gt;&lt;w:basedOn w:val="Normal"/&gt;&lt;w:uiPriority w:val="14"/&gt;&lt;w:qFormat/&gt;&lt;w:rsid w:val="00223177"/&gt;&lt;w:pPr&gt;&lt;w:numPr&gt;&lt;w:numId w:val="6"/&gt;&lt;/w:numPr&gt;&lt;w:spacing w:after="80"/&gt;&lt;w:ind w:left="357" w:hanging="357"/&gt;&lt;w:contextualSpacing/&gt;&lt;/w:pPr&gt;&lt;/w:style&gt;&lt;w:style w:type="table" w:styleId="TableGrid"&gt;&lt;w:name w:val="Table Grid"/&gt;&lt;w:basedOn w:val="TableNormal"/&gt;&lt;w:uiPriority w:val="39"/&gt;&lt;w:rsid w:val="00572408"/&gt;&lt;w:pPr&gt;&lt;w:spacing w:after="0" w:line="240" w:lineRule="auto"/&gt;&lt;/w:pPr&gt;&lt;w:tblPr/&gt;&lt;/w:style&gt;&lt;w:style w:type="paragraph" w:styleId="FootnoteText"&gt;&lt;w:name w:val="footnote text"/&gt;&lt;w:basedOn w:val="Normal"/&gt;&lt;w:link w:val="FootnoteTextChar"/&gt;&lt;w:uiPriority w:val="99"/&gt;&lt;w:semiHidden/&gt;&lt;w:rsid w:val="00872413"/&gt;&lt;w:pPr&gt;&lt;w:spacing w:after="0"/&gt;&lt;/w:pPr&gt;&lt;w:rPr&gt;&lt;w:sz w:val="14"/&gt;&lt;w:szCs w:val="20"/&gt;&lt;/w:rPr&gt;&lt;/w:style&gt;&lt;w:style w:type="character" w:customStyle="1" w:styleId="FootnoteTextChar"&gt;&lt;w:name w:val="Footnote Text Char"/&gt;&lt;w:basedOn w:val="DefaultParagraphFont"/&gt;&lt;w:link w:val="FootnoteText"/&gt;&lt;w:uiPriority w:val="99"/&gt;&lt;w:semiHidden/&gt;&lt;w:rsid w:val="005F186C"/&gt;&lt;w:rPr&gt;&lt;w:sz w:val="14"/&gt;&lt;w:szCs w:val="20"/&gt;&lt;w:lang w:val="en-GB"/&gt;&lt;/w:rPr&gt;&lt;/w:style&gt;&lt;w:style w:type="character" w:styleId="FootnoteReference"&gt;&lt;w:name w:val="footnote reference"/&gt;&lt;w:basedOn w:val="DefaultParagraphFont"/&gt;&lt;w:uiPriority w:val="99"/&gt;&lt;w:semiHidden/&gt;&lt;w:rsid w:val="00884E47"/&gt;&lt;w:rPr&gt;&lt;w:vertAlign w:val="superscript"/&gt;&lt;/w:rPr&gt;&lt;/w:style&gt;&lt;w:style w:type="paragraph" w:styleId="Header"&gt;&lt;w:name w:val="header"/&gt;&lt;w:basedOn w:val="Normal"/&gt;&lt;w:link w:val="HeaderChar"/&gt;&lt;w:uiPriority w:val="99"/&gt;&lt;w:semiHidden/&gt;&lt;w:rsid w:val="005F186C"/&gt;&lt;w:pPr&gt;&lt;w:tabs&gt;&lt;w:tab w:val="center" w:pos="4536"/&gt;&lt;w:tab w:val="right" w:pos="9072"/&gt;&lt;/w:tabs&gt;&lt;w:spacing w:after="0" w:line="240" w:lineRule="auto"/&gt;&lt;/w:pPr&gt;&lt;w:rPr&gt;&lt;w:color w:val="858585" w:themeColor="accent5"/&gt;&lt;w:sz w:val="16"/&gt;&lt;/w:rPr&gt;&lt;/w:style&gt;&lt;w:style w:type="character" w:customStyle="1" w:styleId="HeaderChar"&gt;&lt;w:name w:val="Header Char"/&gt;&lt;w:basedOn w:val="DefaultParagraphFont"/&gt;&lt;w:link w:val="Header"/&gt;&lt;w:uiPriority w:val="99"/&gt;&lt;w:semiHidden/&gt;&lt;w:rsid w:val="005F186C"/&gt;&lt;w:rPr&gt;&lt;w:color w:val="858585" w:themeColor="accent5"/&gt;&lt;w:sz w:val="16"/&gt;&lt;w:lang w:val="en-GB"/&gt;&lt;/w:rPr&gt;&lt;/w:style&gt;&lt;w:style w:type="paragraph" w:styleId="Footer"&gt;&lt;w:name w:val="footer"/&gt;&lt;w:basedOn w:val="Normal"/&gt;&lt;w:link w:val="FooterChar"/&gt;&lt;w:uiPriority w:val="99"/&gt;&lt;w:semiHidden/&gt;&lt;w:rsid w:val="005F186C"/&gt;&lt;w:pPr&gt;&lt;w:tabs&gt;&lt;w:tab w:val="center" w:pos="4536"/&gt;&lt;w:tab w:val="right" w:pos="9072"/&gt;&lt;/w:tabs&gt;&lt;w:spacing w:after="0" w:line="240" w:lineRule="auto"/&gt;&lt;/w:pPr&gt;&lt;w:rPr&gt;&lt;w:color w:val="858585" w:themeColor="accent5"/&gt;&lt;w:sz w:val="16"/&gt;&lt;/w:rPr&gt;&lt;/w:style&gt;&lt;w:style w:type="character" w:customStyle="1" w:styleId="FooterChar"&gt;&lt;w:name w:val="Footer Char"/&gt;&lt;w:basedOn w:val="DefaultParagraphFont"/&gt;&lt;w:link w:val="Footer"/&gt;&lt;w:uiPriority w:val="99"/&gt;&lt;w:semiHidden/&gt;&lt;w:rsid w:val="005F186C"/&gt;&lt;w:rPr&gt;&lt;w:color w:val="858585" w:themeColor="accent5"/&gt;&lt;w:sz w:val="16"/&gt;&lt;w:lang w:val="en-GB"/&gt;&lt;/w:rPr&gt;&lt;/w:style&gt;&lt;w:style w:type="paragraph" w:styleId="TOC1"&gt;&lt;w:name w:val="toc 1"/&gt;&lt;w:basedOn w:val="Normal"/&gt;&lt;w:next w:val="Normal"/&gt;&lt;w:uiPriority w:val="39"/&gt;&lt;w:semiHidden/&gt;&lt;w:rsid w:val="00421476"/&gt;&lt;w:pPr&gt;&lt;w:tabs&gt;&lt;w:tab w:val="right" w:leader="dot" w:pos="8210"/&gt;&lt;/w:tabs&gt;&lt;w:spacing w:after="100"/&gt;&lt;w:ind w:left="426" w:hanging="426"/&gt;&lt;/w:pPr&gt;&lt;/w:style&gt;&lt;w:style w:type="paragraph" w:styleId="TOC2"&gt;&lt;w:name w:val="toc 2"/&gt;&lt;w:basedOn w:val="Normal"/&gt;&lt;w:next w:val="Normal"/&gt;&lt;w:uiPriority w:val="39"/&gt;&lt;w:semiHidden/&gt;&lt;w:rsid w:val="00EE62A8"/&gt;&lt;w:pPr&gt;&lt;w:tabs&gt;&lt;w:tab w:val="right" w:leader="dot" w:pos="8210"/&gt;&lt;/w:tabs&gt;&lt;w:spacing w:after="100"/&gt;&lt;w:ind w:left="1134" w:hanging="708"/&gt;&lt;/w:pPr&gt;&lt;w:rPr&gt;&lt;w:noProof/&gt;&lt;/w:rPr&gt;&lt;/w:style&gt;&lt;w:style w:type="paragraph" w:styleId="TOC3"&gt;&lt;w:name w:val="toc 3"/&gt;&lt;w:basedOn w:val="Normal"/&gt;&lt;w:next w:val="Normal"/&gt;&lt;w:uiPriority w:val="39"/&gt;&lt;w:semiHidden/&gt;&lt;w:rsid w:val="00EE62A8"/&gt;&lt;w:pPr&gt;&lt;w:tabs&gt;&lt;w:tab w:val="right" w:leader="dot" w:pos="8210"/&gt;&lt;/w:tabs&gt;&lt;w:spacing w:after="100"/&gt;&lt;w:ind w:left="1134" w:hanging="694"/&gt;&lt;/w:pPr&gt;&lt;w:rPr&gt;&lt;w:noProof/&gt;&lt;/w:rPr&gt;&lt;/w:style&gt;&lt;w:style w:type="character" w:styleId="Hyperlink"&gt;&lt;w:name w:val="Hyperlink"/&gt;&lt;w:basedOn w:val="DefaultParagraphFont"/&gt;&lt;w:uiPriority w:val="99"/&gt;&lt;w:semiHidden/&gt;&lt;w:rsid w:val="008555A7"/&gt;&lt;w:rPr&gt;&lt;w:color w:val="A1BF35" w:themeColor="hyperlink"/&gt;&lt;w:u w:val="single"/&gt;&lt;/w:rPr&gt;&lt;/w:style&gt;&lt;w:style w:type="paragraph" w:styleId="TOC4"&gt;&lt;w:name w:val="toc 4"/&gt;&lt;w:basedOn w:val="Normal"/&gt;&lt;w:next w:val="Normal"/&gt;&lt;w:uiPriority w:val="39"/&gt;&lt;w:semiHidden/&gt;&lt;w:rsid w:val="00FF2698"/&gt;&lt;w:pPr&gt;&lt;w:spacing w:after="100"/&gt;&lt;w:ind w:left="660"/&gt;&lt;/w:pPr&gt;&lt;/w:style&gt;&lt;w:style w:type="paragraph" w:styleId="TOC5"&gt;&lt;w:name w:val="toc 5"/&gt;&lt;w:basedOn w:val="Normal"/&gt;&lt;w:next w:val="Normal"/&gt;&lt;w:uiPriority w:val="39"/&gt;&lt;w:semiHidden/&gt;&lt;w:rsid w:val="00FF2698"/&gt;&lt;w:pPr&gt;&lt;w:spacing w:after="100"/&gt;&lt;w:ind w:left="880"/&gt;&lt;/w:pPr&gt;&lt;/w:style&gt;&lt;w:style w:type="paragraph" w:styleId="TOC6"&gt;&lt;w:name w:val="toc 6"/&gt;&lt;w:basedOn w:val="Normal"/&gt;&lt;w:next w:val="Normal"/&gt;&lt;w:uiPriority w:val="39"/&gt;&lt;w:semiHidden/&gt;&lt;w:rsid w:val="00FF2698"/&gt;&lt;w:pPr&gt;&lt;w:spacing w:after="100"/&gt;&lt;w:ind w:left="1100"/&gt;&lt;/w:pPr&gt;&lt;/w:style&gt;&lt;w:style w:type="paragraph" w:styleId="TOC7"&gt;&lt;w:name w:val="toc 7"/&gt;&lt;w:basedOn w:val="Normal"/&gt;&lt;w:next w:val="Normal"/&gt;&lt;w:uiPriority w:val="39"/&gt;&lt;w:semiHidden/&gt;&lt;w:rsid w:val="00FF2698"/&gt;&lt;w:pPr&gt;&lt;w:spacing w:after="100"/&gt;&lt;w:ind w:left="1320"/&gt;&lt;/w:pPr&gt;&lt;/w:style&gt;&lt;w:style w:type="paragraph" w:styleId="TOC8"&gt;&lt;w:name w:val="toc 8"/&gt;&lt;w:basedOn w:val="Normal"/&gt;&lt;w:next w:val="Normal"/&gt;&lt;w:uiPriority w:val="39"/&gt;&lt;w:semiHidden/&gt;&lt;w:rsid w:val="00FF2698"/&gt;&lt;w:pPr&gt;&lt;w:spacing w:after="100"/&gt;&lt;w:ind w:left="1540"/&gt;&lt;/w:pPr&gt;&lt;/w:style&gt;&lt;w:style w:type="paragraph" w:styleId="TOC9"&gt;&lt;w:name w:val="toc 9"/&gt;&lt;w:basedOn w:val="Normal"/&gt;&lt;w:next w:val="Normal"/&gt;&lt;w:uiPriority w:val="39"/&gt;&lt;w:semiHidden/&gt;&lt;w:rsid w:val="00FF2698"/&gt;&lt;w:pPr&gt;&lt;w:spacing w:after="100"/&gt;&lt;w:ind w:left="1760"/&gt;&lt;/w:pPr&gt;&lt;/w:style&gt;&lt;w:style w:type="paragraph" w:styleId="ListNumber2"&gt;&lt;w:name w:val="List Number 2"/&gt;&lt;w:basedOn w:val="ListNumber"/&gt;&lt;w:uiPriority w:val="14"/&gt;&lt;w:rsid w:val="00130001"/&gt;&lt;w:pPr&gt;&lt;w:numPr&gt;&lt;w:ilvl w:val="1"/&gt;&lt;/w:numPr&gt;&lt;/w:pPr&gt;&lt;/w:style&gt;&lt;w:style w:type="paragraph" w:styleId="ListNumber3"&gt;&lt;w:name w:val="List Number 3"/&gt;&lt;w:basedOn w:val="ListNumber2"/&gt;&lt;w:uiPriority w:val="14"/&gt;&lt;w:rsid w:val="00130001"/&gt;&lt;w:pPr&gt;&lt;w:numPr&gt;&lt;w:ilvl w:val="2"/&gt;&lt;/w:numPr&gt;&lt;/w:pPr&gt;&lt;/w:style&gt;&lt;w:style w:type="paragraph" w:styleId="ListNumber4"&gt;&lt;w:name w:val="List Number 4"/&gt;&lt;w:basedOn w:val="ListNumber3"/&gt;&lt;w:uiPriority w:val="14"/&gt;&lt;w:semiHidden/&gt;&lt;w:rsid w:val="00130001"/&gt;&lt;w:pPr&gt;&lt;w:numPr&gt;&lt;w:ilvl w:val="3"/&gt;&lt;/w:numPr&gt;&lt;/w:pPr&gt;&lt;/w:style&gt;&lt;w:style w:type="paragraph" w:styleId="ListNumber5"&gt;&lt;w:name w:val="List Number 5"/&gt;&lt;w:basedOn w:val="ListNumber4"/&gt;&lt;w:uiPriority w:val="14"/&gt;&lt;w:semiHidden/&gt;&lt;w:rsid w:val="00130001"/&gt;&lt;w:pPr&gt;&lt;w:numPr&gt;&lt;w:ilvl w:val="4"/&gt;&lt;/w:numPr&gt;&lt;/w:pPr&gt;&lt;/w:style&gt;&lt;w:style w:type="paragraph" w:styleId="ListBullet2"&gt;&lt;w:name w:val="List Bullet 2"/&gt;&lt;w:basedOn w:val="ListBullet"/&gt;&lt;w:uiPriority w:val="14"/&gt;&lt;w:rsid w:val="00FE2BED"/&gt;&lt;w:pPr&gt;&lt;w:numPr&gt;&lt;w:ilvl w:val="1"/&gt;&lt;/w:numPr&gt;&lt;/w:pPr&gt;&lt;/w:style&gt;&lt;w:style w:type="paragraph" w:styleId="ListBullet3"&gt;&lt;w:name w:val="List Bullet 3"/&gt;&lt;w:basedOn w:val="ListBullet2"/&gt;&lt;w:uiPriority w:val="14"/&gt;&lt;w:rsid w:val="00FE2BED"/&gt;&lt;w:pPr&gt;&lt;w:numPr&gt;&lt;w:ilvl w:val="2"/&gt;&lt;/w:numPr&gt;&lt;/w:pPr&gt;&lt;/w:style&gt;&lt;w:style w:type="paragraph" w:styleId="ListBullet4"&gt;&lt;w:name w:val="List Bullet 4"/&gt;&lt;w:basedOn w:val="ListBullet3"/&gt;&lt;w:uiPriority w:val="14"/&gt;&lt;w:semiHidden/&gt;&lt;w:rsid w:val="00FE2BED"/&gt;&lt;w:pPr&gt;&lt;w:numPr&gt;&lt;w:ilvl w:val="3"/&gt;&lt;/w:numPr&gt;&lt;/w:pPr&gt;&lt;/w:style&gt;&lt;w:style w:type="paragraph" w:styleId="ListBullet5"&gt;&lt;w:name w:val="List Bullet 5"/&gt;&lt;w:basedOn w:val="ListBullet4"/&gt;&lt;w:uiPriority w:val="14"/&gt;&lt;w:semiHidden/&gt;&lt;w:rsid w:val="00FE2BED"/&gt;&lt;w:pPr&gt;&lt;w:numPr&gt;&lt;w:ilvl w:val="4"/&gt;&lt;/w:numPr&gt;&lt;/w:pPr&gt;&lt;/w:style&gt;&lt;w:style w:type="character" w:styleId="PlaceholderText"&gt;&lt;w:name w:val="Placeholder Text"/&gt;&lt;w:basedOn w:val="DefaultParagraphFont"/&gt;&lt;w:uiPriority w:val="99"/&gt;&lt;w:rsid w:val="009C6FDB"/&gt;&lt;w:rPr&gt;&lt;w:color w:val="7F7F7F" w:themeColor="text1" w:themeTint="80"/&gt;&lt;w:bdr w:val="none" w:sz="0" w:space="0" w:color="auto"/&gt;&lt;w:shd w:val="clear" w:color="auto" w:fill="F0F0F0"/&gt;&lt;/w:rPr&gt;&lt;/w:style&gt;&lt;w:style w:type="paragraph" w:customStyle="1" w:styleId="Hiddentext"&gt;&lt;w:name w:val="Hidden text"/&gt;&lt;w:basedOn w:val="Normal"/&gt;&lt;w:next w:val="Normal"/&gt;&lt;w:uiPriority w:val="24"/&gt;&lt;w:semiHidden/&gt;&lt;w:qFormat/&gt;&lt;w:rsid w:val="00D86E66"/&gt;&lt;w:rPr&gt;&lt;w:vanish/&gt;&lt;w:color w:val="C00000"/&gt;&lt;/w:rPr&gt;&lt;/w:style&gt;&lt;w:style w:type="paragraph" w:customStyle="1" w:styleId="NumberedHeading1"&gt;&lt;w:name w:val="Numbered Heading 1"/&gt;&lt;w:basedOn w:val="Heading1"/&gt;&lt;w:next w:val="Normal"/&gt;&lt;w:uiPriority w:val="10"/&gt;&lt;w:semiHidden/&gt;&lt;w:qFormat/&gt;&lt;w:rsid w:val="00494FFB"/&gt;&lt;w:pPr&gt;&lt;w:numPr&gt;&lt;w:numId w:val="12"/&gt;&lt;/w:numPr&gt;&lt;/w:pPr&gt;&lt;/w:style&gt;&lt;w:style w:type="paragraph" w:customStyle="1" w:styleId="NumberedHeading2"&gt;&lt;w:name w:val="Numbered Heading 2"/&gt;&lt;w:basedOn w:val="Heading2"/&gt;&lt;w:next w:val="Normal"/&gt;&lt;w:uiPriority w:val="10"/&gt;&lt;w:semiHidden/&gt;&lt;w:qFormat/&gt;&lt;w:rsid w:val="00DA7B63"/&gt;&lt;w:pPr&gt;&lt;w:numPr&gt;&lt;w:ilvl w:val="1"/&gt;&lt;w:numId w:val="12"/&gt;&lt;/w:numPr&gt;&lt;/w:pPr&gt;&lt;/w:style&gt;&lt;w:style w:type="paragraph" w:customStyle="1" w:styleId="NumberedHeading3"&gt;&lt;w:name w:val="Numbered Heading 3"/&gt;&lt;w:basedOn w:val="Heading3"/&gt;&lt;w:next w:val="Normal"/&gt;&lt;w:uiPriority w:val="10"/&gt;&lt;w:semiHidden/&gt;&lt;w:qFormat/&gt;&lt;w:rsid w:val="00DA7B63"/&gt;&lt;w:pPr&gt;&lt;w:numPr&gt;&lt;w:ilvl w:val="2"/&gt;&lt;w:numId w:val="12"/&gt;&lt;/w:numPr&gt;&lt;/w:pPr&gt;&lt;/w:style&gt;&lt;w:style w:type="paragraph" w:customStyle="1" w:styleId="NumberedHeading4"&gt;&lt;w:name w:val="Numbered Heading 4"/&gt;&lt;w:basedOn w:val="Heading4"/&gt;&lt;w:next w:val="Normal"/&gt;&lt;w:uiPriority w:val="10"/&gt;&lt;w:semiHidden/&gt;&lt;w:qFormat/&gt;&lt;w:rsid w:val="00DA7B63"/&gt;&lt;w:pPr&gt;&lt;w:numPr&gt;&lt;w:ilvl w:val="3"/&gt;&lt;w:numId w:val="12"/&gt;&lt;/w:numPr&gt;&lt;/w:pPr&gt;&lt;/w:style&gt;&lt;w:style w:type="character" w:customStyle="1" w:styleId="NoSpacingChar"&gt;&lt;w:name w:val="No Spacing Char"/&gt;&lt;w:basedOn w:val="DefaultParagraphFont"/&gt;&lt;w:link w:val="NoSpacing"/&gt;&lt;w:uiPriority w:val="1"/&gt;&lt;w:rsid w:val="00EE7F0A"/&gt;&lt;/w:style&gt;&lt;w:style w:type="paragraph" w:styleId="BalloonText"&gt;&lt;w:name w:val="Balloon Text"/&gt;&lt;w:basedOn w:val="Normal"/&gt;&lt;w:link w:val="BalloonTextChar"/&gt;&lt;w:uiPriority w:val="99"/&gt;&lt;w:semiHidden/&gt;&lt;w:unhideWhenUsed/&gt;&lt;w:rsid w:val="00421476"/&gt;&lt;w:pPr&gt;&lt;w:spacing w:after="0"/&gt;&lt;/w:pPr&gt;&lt;w:rPr&gt;&lt;w:rFonts w:cs="Segoe UI"/&gt;&lt;w:sz w:val="18"/&gt;&lt;w:szCs w:val="18"/&gt;&lt;/w:rPr&gt;&lt;/w:style&gt;&lt;w:style w:type="character" w:customStyle="1" w:styleId="BalloonTextChar"&gt;&lt;w:name w:val="Balloon Text Char"/&gt;&lt;w:basedOn w:val="DefaultParagraphFont"/&gt;&lt;w:link w:val="BalloonText"/&gt;&lt;w:uiPriority w:val="99"/&gt;&lt;w:semiHidden/&gt;&lt;w:rsid w:val="00421476"/&gt;&lt;w:rPr&gt;&lt;w:rFonts w:cs="Segoe UI"/&gt;&lt;w:sz w:val="18"/&gt;&lt;w:szCs w:val="18"/&gt;&lt;w:lang w:val="en-GB"/&gt;&lt;/w:rPr&gt;&lt;/w:style&gt;&lt;w:style w:type="paragraph" w:customStyle="1" w:styleId="Footertext"&gt;&lt;w:name w:val="Footer text"/&gt;&lt;w:basedOn w:val="Normal"/&gt;&lt;w:uiPriority w:val="10"/&gt;&lt;w:semiHidden/&gt;&lt;w:qFormat/&gt;&lt;w:rsid w:val="001407DF"/&gt;&lt;w:pPr&gt;&lt;w:framePr w:wrap="around" w:vAnchor="page" w:hAnchor="page" w:x="852" w:y="14176"/&gt;&lt;w:spacing w:before="40" w:after="40"/&gt;&lt;/w:pPr&gt;&lt;w:rPr&gt;&lt;w:color w:val="858585" w:themeColor="accent5"/&gt;&lt;w:sz w:val="16"/&gt;&lt;/w:rPr&gt;&lt;/w:style&gt;&lt;w:style w:type="paragraph" w:customStyle="1" w:styleId="Footertitle"&gt;&lt;w:name w:val="Footer title"/&gt;&lt;w:basedOn w:val="Footertext"/&gt;&lt;w:uiPriority w:val="10"/&gt;&lt;w:semiHidden/&gt;&lt;w:qFormat/&gt;&lt;w:rsid w:val="00E4504C"/&gt;&lt;w:pPr&gt;&lt;w:framePr w:wrap="around"/&gt;&lt;/w:pPr&gt;&lt;w:rPr&gt;&lt;w:b/&gt;&lt;w:color w:val="407077" w:themeColor="accent1"/&gt;&lt;/w:rPr&gt;&lt;/w:style&gt;&lt;w:style w:type="table" w:customStyle="1" w:styleId="BetssonTable01"&gt;&lt;w:name w:val="Betsson Table 01"/&gt;&lt;w:basedOn w:val="TableNormal"/&gt;&lt;w:uiPriority w:val="99"/&gt;&lt;w:rsid w:val="00036B11"/&gt;&lt;w:pPr&gt;&lt;w:spacing w:after="0" w:line="240" w:lineRule="auto"/&gt;&lt;w:jc w:val="right"/&gt;&lt;/w:pPr&gt;&lt;w:tblPr&gt;&lt;w:tblBorders&gt;&lt;w:bottom w:val="single" w:sz="4" w:space="0" w:color="407077" w:themeColor="accent1"/&gt;&lt;w:insideH w:val="single" w:sz="4" w:space="0" w:color="407077" w:themeColor="accent1"/&gt;&lt;/w:tblBorders&gt;&lt;w:tblCellMar&gt;&lt;w:top w:w="57" w:type="dxa"/&gt;&lt;w:left w:w="57" w:type="dxa"/&gt;&lt;w:bottom w:w="57" w:type="dxa"/&gt;&lt;w:right w:w="57" w:type="dxa"/&gt;&lt;/w:tblCellMar&gt;&lt;/w:tblPr&gt;&lt;w:tblStylePr w:type="firstRow"&gt;&lt;w:pPr&gt;&lt;w:jc w:val="right"/&gt;&lt;/w:pPr&gt;&lt;w:rPr&gt;&lt;w:rFonts w:asciiTheme="majorHAnsi" w:hAnsiTheme="majorHAnsi"/&gt;&lt;w:b/&gt;&lt;w:color w:val="407077" w:themeColor="accent1"/&gt;&lt;/w:rPr&gt;&lt;w:tblPr/&gt;&lt;w:tcPr&gt;&lt;w:tcBorders&gt;&lt;w:bottom w:val="single" w:sz="12" w:space="0" w:color="407077" w:themeColor="accent1"/&gt;&lt;/w:tcBorders&gt;&lt;w:vAlign w:val="bottom"/&gt;&lt;/w:tcPr&gt;&lt;/w:tblStylePr&gt;&lt;w:tblStylePr w:type="lastRow"&gt;&lt;w:rPr&gt;&lt;w:rFonts w:asciiTheme="majorHAnsi" w:hAnsiTheme="majorHAnsi"/&gt;&lt;w:b/&gt;&lt;/w:rPr&gt;&lt;w:tblPr/&gt;&lt;w:tcPr&gt;&lt;w:tcBorders&gt;&lt;w:top w:val="double" w:sz="4" w:space="0" w:color="407077" w:themeColor="accent1"/&gt;&lt;w:left w:val="nil"/&gt;&lt;w:bottom w:val="nil"/&gt;&lt;w:right w:val="nil"/&gt;&lt;w:insideH w:val="nil"/&gt;&lt;w:insideV w:val="nil"/&gt;&lt;w:tl2br w:val="nil"/&gt;&lt;w:tr2bl w:val="nil"/&gt;&lt;/w:tcBorders&gt;&lt;/w:tcPr&gt;&lt;/w:tblStylePr&gt;&lt;w:tblStylePr w:type="firstCol"&gt;&lt;w:pPr&gt;&lt;w:jc w:val="left"/&gt;&lt;/w:pPr&gt;&lt;/w:tblStylePr&gt;&lt;w:tblStylePr w:type="lastCol"&gt;&lt;w:rPr&gt;&lt;w:rFonts w:asciiTheme="majorHAnsi" w:hAnsiTheme="majorHAnsi"/&gt;&lt;w:b/&gt;&lt;/w:rPr&gt;&lt;/w:tblStylePr&gt;&lt;w:tblStylePr w:type="nwCell"&gt;&lt;w:pPr&gt;&lt;w:jc w:val="left"/&gt;&lt;/w:pPr&gt;&lt;w:tblPr/&gt;&lt;w:tcPr&gt;&lt;w:vAlign w:val="bottom"/&gt;&lt;/w:tcPr&gt;&lt;/w:tblStylePr&gt;&lt;/w:style&gt;&lt;w:style w:type="table" w:styleId="TableGridLight"&gt;&lt;w:name w:val="Grid Table Light"/&gt;&lt;w:aliases w:val="Betsson Table 02"/&gt;&lt;w:basedOn w:val="TableNormal"/&gt;&lt;w:uiPriority w:val="40"/&gt;&lt;w:rsid w:val="00036B11"/&gt;&lt;w:pPr&gt;&lt;w:spacing w:after="0" w:line="240" w:lineRule="auto"/&gt;&lt;w:jc w:val="right"/&gt;&lt;/w:pPr&gt;&lt;w:tblPr&gt;&lt;w:tblStyleRowBandSize w:val="1"/&gt;&lt;w:tblBorders&gt;&lt;w:insideH w:val="single" w:sz="4" w:space="0" w:color="407077" w:themeColor="accent1"/&gt;&lt;/w:tblBorders&gt;&lt;w:tblCellMar&gt;&lt;w:top w:w="57" w:type="dxa"/&gt;&lt;w:left w:w="57" w:type="dxa"/&gt;&lt;w:bottom w:w="57" w:type="dxa"/&gt;&lt;w:right w:w="57" w:type="dxa"/&gt;&lt;/w:tblCellMar&gt;&lt;/w:tblPr&gt;&lt;w:tcPr&gt;&lt;w:shd w:val="clear" w:color="auto" w:fill="auto"/&gt;&lt;/w:tcPr&gt;&lt;w:tblStylePr w:type="firstRow"&gt;&lt;w:pPr&gt;&lt;w:wordWrap/&gt;&lt;w:spacing w:beforeLines="0" w:before="80" w:beforeAutospacing="0" w:afterLines="0" w:after="0" w:afterAutospacing="0"/&gt;&lt;w:jc w:val="right"/&gt;&lt;/w:pPr&gt;&lt;w:rPr&gt;&lt;w:rFonts w:asciiTheme="majorHAnsi" w:hAnsiTheme="majorHAnsi"/&gt;&lt;w:b/&gt;&lt;w:color w:val="FFFFFF" w:themeColor="background1"/&gt;&lt;/w:rPr&gt;&lt;w:tblPr/&gt;&lt;w:tcPr&gt;&lt;w:shd w:val="clear" w:color="auto" w:fill="407077" w:themeFill="accent1"/&gt;&lt;w:vAlign w:val="bottom"/&gt;&lt;/w:tcPr&gt;&lt;/w:tblStylePr&gt;&lt;w:tblStylePr w:type="lastRow"&gt;&lt;w:rPr&gt;&lt;w:rFonts w:asciiTheme="majorHAnsi" w:hAnsiTheme="majorHAnsi"/&gt;&lt;w:b/&gt;&lt;/w:rPr&gt;&lt;w:tblPr/&gt;&lt;w:tcPr&gt;&lt;w:tcBorders&gt;&lt;w:top w:val="double" w:sz="4" w:space="0" w:color="407077" w:themeColor="accent1"/&gt;&lt;/w:tcBorders&gt;&lt;w:shd w:val="clear" w:color="auto" w:fill="auto"/&gt;&lt;/w:tcPr&gt;&lt;/w:tblStylePr&gt;&lt;w:tblStylePr w:type="firstCol"&gt;&lt;w:pPr&gt;&lt;w:jc w:val="left"/&gt;&lt;/w:pPr&gt;&lt;/w:tblStylePr&gt;&lt;w:tblStylePr w:type="lastCol"&gt;&lt;w:pPr&gt;&lt;w:jc w:val="right"/&gt;&lt;/w:pPr&gt;&lt;w:rPr&gt;&lt;w:rFonts w:asciiTheme="majorHAnsi" w:hAnsiTheme="majorHAnsi"/&gt;&lt;w:b/&gt;&lt;/w:rPr&gt;&lt;/w:tblStylePr&gt;&lt;w:tblStylePr w:type="nwCell"&gt;&lt;w:pPr&gt;&lt;w:jc w:val="left"/&gt;&lt;/w:pPr&gt;&lt;w:tblPr/&gt;&lt;w:tcPr&gt;&lt;w:vAlign w:val="bottom"/&gt;&lt;/w:tcPr&gt;&lt;/w:tblStylePr&gt;&lt;/w:style&gt;&lt;w:style w:type="paragraph" w:customStyle="1" w:styleId="Tabletext"&gt;&lt;w:name w:val="Table text"/&gt;&lt;w:basedOn w:val="Normal"/&gt;&lt;w:uiPriority w:val="15"/&gt;&lt;w:rsid w:val="005F186C"/&gt;&lt;w:pPr&gt;&lt;w:spacing w:after="0" w:line="240" w:lineRule="auto"/&gt;&lt;/w:pPr&gt;&lt;w:rPr&gt;&lt;w:sz w:val="16"/&gt;&lt;/w:rPr&gt;&lt;/w:style&gt;&lt;w:style w:type="paragraph" w:customStyle="1" w:styleId="Tabletitle"&gt;&lt;w:name w:val="Table title"/&gt;&lt;w:basedOn w:val="Tabletext"/&gt;&lt;w:uiPriority w:val="15"/&gt;&lt;w:rsid w:val="00C5110E"/&gt;&lt;w:pPr&gt;&lt;w:framePr w:wrap="around" w:vAnchor="page" w:hAnchor="page" w:x="852" w:y="14176"/&gt;&lt;w:spacing w:before="40" w:after="40"/&gt;&lt;/w:pPr&gt;&lt;w:rPr&gt;&lt;w:b/&gt;&lt;w:color w:val="407077" w:themeColor="accent1"/&gt;&lt;/w:rPr&gt;&lt;/w:style&gt;&lt;w:style w:type="paragraph" w:customStyle="1" w:styleId="FootertitleWhite"&gt;&lt;w:name w:val="Footer title White"/&gt;&lt;w:basedOn w:val="Footertitle"/&gt;&lt;w:semiHidden/&gt;&lt;w:rsid w:val="000049A5"/&gt;&lt;w:pPr&gt;&lt;w:framePr w:wrap="around"/&gt;&lt;/w:pPr&gt;&lt;w:rPr&gt;&lt;w:bCs/&gt;&lt;w:color w:val="FFFFFF" w:themeColor="background1"/&gt;&lt;/w:rPr&gt;&lt;/w:style&gt;&lt;w:style w:type="paragraph" w:styleId="DocumentMap"&gt;&lt;w:name w:val="Document Map"/&gt;&lt;w:basedOn w:val="Normal"/&gt;&lt;w:link w:val="DocumentMapChar"/&gt;&lt;w:uiPriority w:val="99"/&gt;&lt;w:semiHidden/&gt;&lt;w:rsid w:val="00421476"/&gt;&lt;w:pPr&gt;&lt;w:spacing w:after="0"/&gt;&lt;/w:pPr&gt;&lt;w:rPr&gt;&lt;w:rFonts w:cs="Segoe UI"/&gt;&lt;w:sz w:val="16"/&gt;&lt;w:szCs w:val="16"/&gt;&lt;/w:rPr&gt;&lt;/w:style&gt;&lt;w:style w:type="character" w:customStyle="1" w:styleId="DocumentMapChar"&gt;&lt;w:name w:val="Document Map Char"/&gt;&lt;w:basedOn w:val="DefaultParagraphFont"/&gt;&lt;w:link w:val="DocumentMap"/&gt;&lt;w:uiPriority w:val="99"/&gt;&lt;w:semiHidden/&gt;&lt;w:rsid w:val="00421476"/&gt;&lt;w:rPr&gt;&lt;w:rFonts w:cs="Segoe UI"/&gt;&lt;w:sz w:val="16"/&gt;&lt;w:szCs w:val="16"/&gt;&lt;w:lang w:val="en-GB"/&gt;&lt;/w:rPr&gt;&lt;/w:style&gt;&lt;w:style w:type="character" w:styleId="HTMLSample"&gt;&lt;w:name w:val="HTML Sample"/&gt;&lt;w:basedOn w:val="DefaultParagraphFont"/&gt;&lt;w:uiPriority w:val="99"/&gt;&lt;w:semiHidden/&gt;&lt;w:unhideWhenUsed/&gt;&lt;w:rsid w:val="00421476"/&gt;&lt;w:rPr&gt;&lt;w:rFonts w:asciiTheme="minorHAnsi" w:hAnsiTheme="minorHAnsi"/&gt;&lt;w:sz w:val="24"/&gt;&lt;w:szCs w:val="24"/&gt;&lt;/w:rPr&gt;&lt;/w:style&gt;&lt;w:style w:type="paragraph" w:styleId="HTMLPreformatted"&gt;&lt;w:name w:val="HTML Preformatted"/&gt;&lt;w:basedOn w:val="Normal"/&gt;&lt;w:link w:val="HTMLPreformattedChar"/&gt;&lt;w:uiPriority w:val="99"/&gt;&lt;w:semiHidden/&gt;&lt;w:rsid w:val="00421476"/&gt;&lt;w:pPr&gt;&lt;w:spacing w:after="0"/&gt;&lt;/w:pPr&gt;&lt;w:rPr&gt;&lt;w:szCs w:val="20"/&gt;&lt;/w:rPr&gt;&lt;/w:style&gt;&lt;w:style w:type="character" w:customStyle="1" w:styleId="HTMLPreformattedChar"&gt;&lt;w:name w:val="HTML Preformatted Char"/&gt;&lt;w:basedOn w:val="DefaultParagraphFont"/&gt;&lt;w:link w:val="HTMLPreformatted"/&gt;&lt;w:uiPriority w:val="99"/&gt;&lt;w:semiHidden/&gt;&lt;w:rsid w:val="00421476"/&gt;&lt;w:rPr&gt;&lt;w:sz w:val="20"/&gt;&lt;w:szCs w:val="20"/&gt;&lt;w:lang w:val="en-GB"/&gt;&lt;/w:rPr&gt;&lt;/w:style&gt;&lt;w:style w:type="character" w:styleId="HTMLCode"&gt;&lt;w:name w:val="HTML Code"/&gt;&lt;w:basedOn w:val="DefaultParagraphFont"/&gt;&lt;w:uiPriority w:val="99"/&gt;&lt;w:semiHidden/&gt;&lt;w:rsid w:val="00421476"/&gt;&lt;w:rPr&gt;&lt;w:rFonts w:asciiTheme="minorHAnsi" w:hAnsiTheme="minorHAnsi"/&gt;&lt;w:sz w:val="20"/&gt;&lt;w:szCs w:val="20"/&gt;&lt;/w:rPr&gt;&lt;/w:style&gt;&lt;w:style w:type="character" w:styleId="HTMLTypewriter"&gt;&lt;w:name w:val="HTML Typewriter"/&gt;&lt;w:basedOn w:val="DefaultParagraphFont"/&gt;&lt;w:uiPriority w:val="99"/&gt;&lt;w:semiHidden/&gt;&lt;w:rsid w:val="00421476"/&gt;&lt;w:rPr&gt;&lt;w:rFonts w:asciiTheme="minorHAnsi" w:hAnsiTheme="minorHAnsi"/&gt;&lt;w:sz w:val="20"/&gt;&lt;w:szCs w:val="20"/&gt;&lt;/w:rPr&gt;&lt;/w:style&gt;&lt;w:style w:type="character" w:styleId="HTMLKeyboard"&gt;&lt;w:name w:val="HTML Keyboard"/&gt;&lt;w:basedOn w:val="DefaultParagraphFont"/&gt;&lt;w:uiPriority w:val="99"/&gt;&lt;w:semiHidden/&gt;&lt;w:rsid w:val="00421476"/&gt;&lt;w:rPr&gt;&lt;w:rFonts w:asciiTheme="minorHAnsi" w:hAnsiTheme="minorHAnsi"/&gt;&lt;w:sz w:val="20"/&gt;&lt;w:szCs w:val="20"/&gt;&lt;/w:rPr&gt;&lt;/w:style&gt;&lt;w:style w:type="paragraph" w:styleId="MacroText"&gt;&lt;w:name w:val="macro"/&gt;&lt;w:link w:val="MacroTextChar"/&gt;&lt;w:uiPriority w:val="99"/&gt;&lt;w:semiHidden/&gt;&lt;w:rsid w:val="00421476"/&gt;&lt;w:pPr&gt;&lt;w:tabs&gt;&lt;w:tab w:val="left" w:pos="480"/&gt;&lt;w:tab w:val="left" w:pos="960"/&gt;&lt;w:tab w:val="left" w:pos="1440"/&gt;&lt;w:tab w:val="left" w:pos="1920"/&gt;&lt;w:tab w:val="left" w:pos="2400"/&gt;&lt;w:tab w:val="left" w:pos="2880"/&gt;&lt;w:tab w:val="left" w:pos="3360"/&gt;&lt;w:tab w:val="left" w:pos="3840"/&gt;&lt;w:tab w:val="left" w:pos="4320"/&gt;&lt;/w:tabs&gt;&lt;w:spacing w:after="0" w:line="240" w:lineRule="auto"/&gt;&lt;/w:pPr&gt;&lt;w:rPr&gt;&lt;w:sz w:val="20"/&gt;&lt;w:szCs w:val="20"/&gt;&lt;w:lang w:val="en-GB"/&gt;&lt;/w:rPr&gt;&lt;/w:style&gt;&lt;w:style w:type="character" w:customStyle="1" w:styleId="MacroTextChar"&gt;&lt;w:name w:val="Macro Text Char"/&gt;&lt;w:basedOn w:val="DefaultParagraphFont"/&gt;&lt;w:link w:val="MacroText"/&gt;&lt;w:uiPriority w:val="99"/&gt;&lt;w:semiHidden/&gt;&lt;w:rsid w:val="00421476"/&gt;&lt;w:rPr&gt;&lt;w:sz w:val="20"/&gt;&lt;w:szCs w:val="20"/&gt;&lt;w:lang w:val="en-GB"/&gt;&lt;/w:rPr&gt;&lt;/w:style&gt;&lt;w:style w:type="paragraph" w:styleId="NormalWeb"&gt;&lt;w:name w:val="Normal (Web)"/&gt;&lt;w:basedOn w:val="Normal"/&gt;&lt;w:uiPriority w:val="99"/&gt;&lt;w:semiHidden/&gt;&lt;w:rsid w:val="00421476"/&gt;&lt;w:rPr&gt;&lt;w:rFonts w:cs="Times New Roman"/&gt;&lt;w:sz w:val="24"/&gt;&lt;w:szCs w:val="24"/&gt;&lt;/w:rPr&gt;&lt;/w:style&gt;&lt;w:style w:type="paragraph" w:styleId="PlainText"&gt;&lt;w:name w:val="Plain Text"/&gt;&lt;w:basedOn w:val="Normal"/&gt;&lt;w:link w:val="PlainTextChar"/&gt;&lt;w:uiPriority w:val="99"/&gt;&lt;w:semiHidden/&gt;&lt;w:rsid w:val="00421476"/&gt;&lt;w:pPr&gt;&lt;w:spacing w:after="0"/&gt;&lt;/w:pPr&gt;&lt;w:rPr&gt;&lt;w:sz w:val="21"/&gt;&lt;w:szCs w:val="21"/&gt;&lt;/w:rPr&gt;&lt;/w:style&gt;&lt;w:style w:type="character" w:customStyle="1" w:styleId="PlainTextChar"&gt;&lt;w:name w:val="Plain Text Char"/&gt;&lt;w:basedOn w:val="DefaultParagraphFont"/&gt;&lt;w:link w:val="PlainText"/&gt;&lt;w:uiPriority w:val="99"/&gt;&lt;w:semiHidden/&gt;&lt;w:rsid w:val="00421476"/&gt;&lt;w:rPr&gt;&lt;w:sz w:val="21"/&gt;&lt;w:szCs w:val="21"/&gt;&lt;w:lang w:val="en-GB"/&gt;&lt;/w:rPr&gt;&lt;/w:style&gt;&lt;w:style w:type="paragraph" w:customStyle="1" w:styleId="Name"&gt;&lt;w:name w:val="Name"/&gt;&lt;w:basedOn w:val="Normal"/&gt;&lt;w:next w:val="Normal"/&gt;&lt;w:uiPriority w:val="10"/&gt;&lt;w:rsid w:val="00C17BB4"/&gt;&lt;w:pPr&gt;&lt;w:spacing w:after="0" w:line="240" w:lineRule="auto"/&gt;&lt;/w:pPr&gt;&lt;w:rPr&gt;&lt;w:rFonts w:asciiTheme="majorHAnsi" w:hAnsiTheme="majorHAnsi"/&gt;&lt;/w:rPr&gt;&lt;/w:style&gt;&lt;w:style w:type="paragraph" w:customStyle="1" w:styleId="Info"&gt;&lt;w:name w:val="Info"/&gt;&lt;w:basedOn w:val="Normal"/&gt;&lt;w:uiPriority w:val="10"/&gt;&lt;w:rsid w:val="008B734D"/&gt;&lt;w:pPr&gt;&lt;w:spacing w:after="0" w:line="240" w:lineRule="auto"/&gt;&lt;/w:pPr&gt;&lt;/w:style&gt;&lt;/w:styles&gt;&lt;/pkg:xmlData&gt;&lt;/pkg:part&gt;&lt;pkg:part pkg:name="/word/glossary/fontTable.xml" pkg:contentType="application/vnd.openxmlformats-officedocument.wordprocessingml.fontTable+xml"&gt;&lt;pkg:xmlData&gt;&lt;w:fonts xmlns:mc="http://schemas.openxmlformats.org/markup-compatibility/2006" xmlns:r="http://schemas.openxmlformats.org/officeDocument/2006/relationships" xmlns:w="http://schemas.openxmlformats.org/wordprocessingml/2006/main" xmlns:w14="http://schemas.microsoft.com/office/word/2010/wordml" xmlns:w15="http://schemas.microsoft.com/office/word/2012/wordml" xmlns:w16se="http://schemas.microsoft.com/office/word/2015/wordml/symex" mc:Ignorable="w14 w15 w16se"/&gt;&lt;/pkg:xmlData&gt;&lt;/pkg:part&gt;&lt;pkg:part pkg:name="/word/glossary/webSettings.xml" pkg:contentType="application/vnd.openxmlformats-officedocument.wordprocessingml.webSettings+xml"&gt;&lt;pkg:xmlData&gt;&lt;w:webSettings xmlns:mc="http://schemas.openxmlformats.org/markup-compatibility/2006" xmlns:r="http://schemas.openxmlformats.org/officeDocument/2006/relationships" xmlns:w="http://schemas.openxmlformats.org/wordprocessingml/2006/main" xmlns:w14="http://schemas.microsoft.com/office/word/2010/wordml" xmlns:w15="http://schemas.microsoft.com/office/word/2012/wordml" xmlns:w16se="http://schemas.microsoft.com/office/word/2015/wordml/symex" mc:Ignorable="w14 w15 w16se"&gt;&lt;w:optimizeForBrowser/&gt;&lt;w:allowPNG/&gt;&lt;/w:webSettings&gt;&lt;/pkg:xmlData&gt;&lt;/pkg:part&gt;&lt;pkg:part pkg:name="/word/numbering.xml" pkg:contentType="application/vnd.openxmlformats-officedocument.wordprocessingml.numbering+xml"&gt;&lt;pkg:xmlData&gt;&lt;w:numbering xmlns:wpc="http://schemas.microsoft.com/office/word/2010/wordprocessingCanvas" xmlns:cx="http://schemas.microsoft.com/office/drawing/2014/chartex" xmlns:cx1="http://schemas.microsoft.com/office/drawing/2015/9/8/chartex" xmlns:cx2="http://schemas.microsoft.com/office/drawing/2015/10/21/chartex" xmlns:cx3="http://schemas.microsoft.com/office/drawing/2016/5/9/chartex" xmlns:cx4="http://schemas.microsoft.com/office/drawing/2016/5/10/chartex" xmlns:cx5="http://schemas.microsoft.com/office/drawing/2016/5/11/chartex" xmlns:cx6="http://schemas.microsoft.com/office/drawing/2016/5/12/chartex" xmlns:cx7="http://schemas.microsoft.com/office/drawing/2016/5/13/chartex" xmlns:cx8="http://schemas.microsoft.com/office/drawing/2016/5/14/chartex" xmlns:mc="http://schemas.openxmlformats.org/markup-compatibility/2006" xmlns:o="urn:schemas-microsoft-com:office:office" xmlns:r="http://schemas.openxmlformats.org/officeDocument/2006/relationships" xmlns:m="http://schemas.openxmlformats.org/officeDocument/2006/math" xmlns:v="urn:schemas-microsoft-com:vml" xmlns:wp14="http://schemas.microsoft.com/office/word/2010/wordprocessingDrawing" xmlns:wp="http://schemas.openxmlformats.org/drawingml/2006/wordprocessingDrawing" xmlns:w10="urn:schemas-microsoft-com:office:word" xmlns:w="http://schemas.openxmlformats.org/wordprocessingml/2006/main" xmlns:w14="http://schemas.microsoft.com/office/word/2010/wordml" xmlns:w15="http://schemas.microsoft.com/office/word/2012/wordml" xmlns:w16se="http://schemas.microsoft.com/office/word/2015/wordml/symex" xmlns:wpg="http://schemas.microsoft.com/office/word/2010/wordprocessingGroup" xmlns:wpi="http://schemas.microsoft.com/office/word/2010/wordprocessingInk" xmlns:wne="http://schemas.microsoft.com/office/word/2006/wordml" xmlns:wps="http://schemas.microsoft.com/office/word/2010/wordprocessingShape" mc:Ignorable="w14 w15 w16se wp14"&gt;&lt;w:abstractNum w:abstractNumId="0" w15:restartNumberingAfterBreak="0"&gt;&lt;w:nsid w:val="FFFFFF7C"/&gt;&lt;w:multiLevelType w:val="singleLevel"/&gt;&lt;w:tmpl w:val="1D6AD0EC"/&gt;&lt;w:lvl w:ilvl="0"&gt;&lt;w:start w:val="1"/&gt;&lt;w:numFmt w:val="decimal"/&gt;&lt;w:lvlText w:val="%1."/&gt;&lt;w:lvlJc w:val="left"/&gt;&lt;w:pPr&gt;&lt;w:tabs&gt;&lt;w:tab w:val="num" w:pos="1492"/&gt;&lt;/w:tabs&gt;&lt;w:ind w:left="1492" w:hanging="360"/&gt;&lt;/w:pPr&gt;&lt;/w:lvl&gt;&lt;/w:abstractNum&gt;&lt;w:abstractNum w:abstractNumId="1" w15:restartNumberingAfterBreak="0"&gt;&lt;w:nsid w:val="FFFFFF7D"/&gt;&lt;w:multiLevelType w:val="singleLevel"/&gt;&lt;w:tmpl w:val="6C44DE1A"/&gt;&lt;w:lvl w:ilvl="0"&gt;&lt;w:start w:val="1"/&gt;&lt;w:numFmt w:val="decimal"/&gt;&lt;w:lvlText w:val="%1."/&gt;&lt;w:lvlJc w:val="left"/&gt;&lt;w:pPr&gt;&lt;w:tabs&gt;&lt;w:tab w:val="num" w:pos="1209"/&gt;&lt;/w:tabs&gt;&lt;w:ind w:left="1209" w:hanging="360"/&gt;&lt;/w:pPr&gt;&lt;/w:lvl&gt;&lt;/w:abstractNum&gt;&lt;w:abstractNum w:abstractNumId="2" w15:restartNumberingAfterBreak="0"&gt;&lt;w:nsid w:val="FFFFFF7E"/&gt;&lt;w:multiLevelType w:val="singleLevel"/&gt;&lt;w:tmpl w:val="83748C94"/&gt;&lt;w:lvl w:ilvl="0"&gt;&lt;w:start w:val="1"/&gt;&lt;w:numFmt w:val="decimal"/&gt;&lt;w:lvlText w:val="%1."/&gt;&lt;w:lvlJc w:val="left"/&gt;&lt;w:pPr&gt;&lt;w:tabs&gt;&lt;w:tab w:val="num" w:pos="926"/&gt;&lt;/w:tabs&gt;&lt;w:ind w:left="926" w:hanging="360"/&gt;&lt;/w:pPr&gt;&lt;/w:lvl&gt;&lt;/w:abstractNum&gt;&lt;w:abstractNum w:abstractNumId="3" w15:restartNumberingAfterBreak="0"&gt;&lt;w:nsid w:val="FFFFFF7F"/&gt;&lt;w:multiLevelType w:val="singleLevel"/&gt;&lt;w:tmpl w:val="871A6F0C"/&gt;&lt;w:lvl w:ilvl="0"&gt;&lt;w:start w:val="1"/&gt;&lt;w:numFmt w:val="decimal"/&gt;&lt;w:lvlText w:val="%1."/&gt;&lt;w:lvlJc w:val="left"/&gt;&lt;w:pPr&gt;&lt;w:tabs&gt;&lt;w:tab w:val="num" w:pos="643"/&gt;&lt;/w:tabs&gt;&lt;w:ind w:left="643" w:hanging="360"/&gt;&lt;/w:pPr&gt;&lt;/w:lvl&gt;&lt;/w:abstractNum&gt;&lt;w:abstractNum w:abstractNumId="4" w15:restartNumberingAfterBreak="0"&gt;&lt;w:nsid w:val="FFFFFF80"/&gt;&lt;w:multiLevelType w:val="singleLevel"/&gt;&lt;w:tmpl w:val="ED1CE676"/&gt;&lt;w:lvl w:ilvl="0"&gt;&lt;w:start w:val="1"/&gt;&lt;w:numFmt w:val="bullet"/&gt;&lt;w:lvlText w:val=""/&gt;&lt;w:lvlJc w:val="left"/&gt;&lt;w:pPr&gt;&lt;w:tabs&gt;&lt;w:tab w:val="num" w:pos="1492"/&gt;&lt;/w:tabs&gt;&lt;w:ind w:left="1492" w:hanging="360"/&gt;&lt;/w:pPr&gt;&lt;w:rPr&gt;&lt;w:rFonts w:ascii="Symbol" w:hAnsi="Symbol" w:hint="default"/&gt;&lt;/w:rPr&gt;&lt;/w:lvl&gt;&lt;/w:abstractNum&gt;&lt;w:abstractNum w:abstractNumId="5" w15:restartNumberingAfterBreak="0"&gt;&lt;w:nsid w:val="FFFFFF81"/&gt;&lt;w:multiLevelType w:val="singleLevel"/&gt;&lt;w:tmpl w:val="DEF60714"/&gt;&lt;w:lvl w:ilvl="0"&gt;&lt;w:start w:val="1"/&gt;&lt;w:numFmt w:val="bullet"/&gt;&lt;w:lvlText w:val=""/&gt;&lt;w:lvlJc w:val="left"/&gt;&lt;w:pPr&gt;&lt;w:tabs&gt;&lt;w:tab w:val="num" w:pos="1209"/&gt;&lt;/w:tabs&gt;&lt;w:ind w:left="1209" w:hanging="360"/&gt;&lt;/w:pPr&gt;&lt;w:rPr&gt;&lt;w:rFonts w:ascii="Symbol" w:hAnsi="Symbol" w:hint="default"/&gt;&lt;/w:rPr&gt;&lt;/w:lvl&gt;&lt;/w:abstractNum&gt;&lt;w:abstractNum w:abstractNumId="6" w15:restartNumberingAfterBreak="0"&gt;&lt;w:nsid w:val="FFFFFF82"/&gt;&lt;w:multiLevelType w:val="singleLevel"/&gt;&lt;w:tmpl w:val="91EA47E8"/&gt;&lt;w:lvl w:ilvl="0"&gt;&lt;w:start w:val="1"/&gt;&lt;w:numFmt w:val="bullet"/&gt;&lt;w:lvlText w:val=""/&gt;&lt;w:lvlJc w:val="left"/&gt;&lt;w:pPr&gt;&lt;w:tabs&gt;&lt;w:tab w:val="num" w:pos="926"/&gt;&lt;/w:tabs&gt;&lt;w:ind w:left="926" w:hanging="360"/&gt;&lt;/w:pPr&gt;&lt;w:rPr&gt;&lt;w:rFonts w:ascii="Symbol" w:hAnsi="Symbol" w:hint="default"/&gt;&lt;/w:rPr&gt;&lt;/w:lvl&gt;&lt;/w:abstractNum&gt;&lt;w:abstractNum w:abstractNumId="7" w15:restartNumberingAfterBreak="0"&gt;&lt;w:nsid w:val="FFFFFF83"/&gt;&lt;w:multiLevelType w:val="singleLevel"/&gt;&lt;w:tmpl w:val="9278B09A"/&gt;&lt;w:lvl w:ilvl="0"&gt;&lt;w:start w:val="1"/&gt;&lt;w:numFmt w:val="bullet"/&gt;&lt;w:lvlText w:val=""/&gt;&lt;w:lvlJc w:val="left"/&gt;&lt;w:pPr&gt;&lt;w:tabs&gt;&lt;w:tab w:val="num" w:pos="643"/&gt;&lt;/w:tabs&gt;&lt;w:ind w:left="643" w:hanging="360"/&gt;&lt;/w:pPr&gt;&lt;w:rPr&gt;&lt;w:rFonts w:ascii="Symbol" w:hAnsi="Symbol" w:hint="default"/&gt;&lt;/w:rPr&gt;&lt;/w:lvl&gt;&lt;/w:abstractNum&gt;&lt;w:abstractNum w:abstractNumId="8" w15:restartNumberingAfterBreak="0"&gt;&lt;w:nsid w:val="17071BBC"/&gt;&lt;w:multiLevelType w:val="multilevel"/&gt;&lt;w:tmpl w:val="B512299C"/&gt;&lt;w:lvl w:ilvl="0"&gt;&lt;w:start w:val="1"/&gt;&lt;w:numFmt w:val="decimal"/&gt;&lt;w:pStyle w:val="ListNumber"/&gt;&lt;w:lvlText w:val="%1."/&gt;&lt;w:lvlJc w:val="left"/&gt;&lt;w:pPr&gt;&lt;w:ind w:left="360" w:hanging="360"/&gt;&lt;/w:pPr&gt;&lt;w:rPr&gt;&lt;w:rFonts w:hint="default"/&gt;&lt;/w:rPr&gt;&lt;/w:lvl&gt;&lt;w:lvl w:ilvl="1"&gt;&lt;w:start w:val="1"/&gt;&lt;w:numFmt w:val="lowerLetter"/&gt;&lt;w:pStyle w:val="ListNumber2"/&gt;&lt;w:lvlText w:val="%2."/&gt;&lt;w:lvlJc w:val="left"/&gt;&lt;w:pPr&gt;&lt;w:ind w:left="720" w:hanging="360"/&gt;&lt;/w:pPr&gt;&lt;w:rPr&gt;&lt;w:rFonts w:hint="default"/&gt;&lt;/w:rPr&gt;&lt;/w:lvl&gt;&lt;w:lvl w:ilvl="2"&gt;&lt;w:start w:val="1"/&gt;&lt;w:numFmt w:val="lowerRoman"/&gt;&lt;w:pStyle w:val="ListNumber3"/&gt;&lt;w:lvlText w:val="%3)"/&gt;&lt;w:lvlJc w:val="left"/&gt;&lt;w:pPr&gt;&lt;w:ind w:left="1080" w:hanging="360"/&gt;&lt;/w:pPr&gt;&lt;w:rPr&gt;&lt;w:rFonts w:hint="default"/&gt;&lt;/w:rPr&gt;&lt;/w:lvl&gt;&lt;w:lvl w:ilvl="3"&gt;&lt;w:start w:val="1"/&gt;&lt;w:numFmt w:val="decimal"/&gt;&lt;w:pStyle w:val="ListNumber4"/&gt;&lt;w:lvlText w:val="%4)"/&gt;&lt;w:lvlJc w:val="left"/&gt;&lt;w:pPr&gt;&lt;w:ind w:left="1440" w:hanging="360"/&gt;&lt;/w:pPr&gt;&lt;w:rPr&gt;&lt;w:rFonts w:hint="default"/&gt;&lt;/w:rPr&gt;&lt;/w:lvl&gt;&lt;w:lvl w:ilvl="4"&gt;&lt;w:start w:val="1"/&gt;&lt;w:numFmt w:val="lowerLetter"/&gt;&lt;w:pStyle w:val="ListNumber5"/&gt;&lt;w:lvlText w:val="%5)"/&gt;&lt;w:lvlJc w:val="left"/&gt;&lt;w:pPr&gt;&lt;w:ind w:left="1800" w:hanging="360"/&gt;&lt;/w:pPr&gt;&lt;w:rPr&gt;&lt;w:rFonts w:hint="default"/&gt;&lt;/w:rPr&gt;&lt;/w:lvl&gt;&lt;w:lvl w:ilvl="5"&gt;&lt;w:start w:val="1"/&gt;&lt;w:numFmt w:val="lowerRoman"/&gt;&lt;w:lvlText w:val="%6)"/&gt;&lt;w:lvlJc w:val="left"/&gt;&lt;w:pPr&gt;&lt;w:ind w:left="2160" w:hanging="360"/&gt;&lt;/w:pPr&gt;&lt;w:rPr&gt;&lt;w:rFonts w:hint="default"/&gt;&lt;/w:rPr&gt;&lt;/w:lvl&gt;&lt;w:lvl w:ilvl="6"&gt;&lt;w:start w:val="1"/&gt;&lt;w:numFmt w:val="decimal"/&gt;&lt;w:lvlText w:val="(%7)"/&gt;&lt;w:lvlJc w:val="left"/&gt;&lt;w:pPr&gt;&lt;w:ind w:left="2520" w:hanging="360"/&gt;&lt;/w:pPr&gt;&lt;w:rPr&gt;&lt;w:rFonts w:hint="default"/&gt;&lt;/w:rPr&gt;&lt;/w:lvl&gt;&lt;w:lvl w:ilvl="7"&gt;&lt;w:start w:val="1"/&gt;&lt;w:numFmt w:val="lowerLetter"/&gt;&lt;w:lvlText w:val="(%8)"/&gt;&lt;w:lvlJc w:val="left"/&gt;&lt;w:pPr&gt;&lt;w:ind w:left="2880" w:hanging="360"/&gt;&lt;/w:pPr&gt;&lt;w:rPr&gt;&lt;w:rFonts w:hint="default"/&gt;&lt;/w:rPr&gt;&lt;/w:lvl&gt;&lt;w:lvl w:ilvl="8"&gt;&lt;w:start w:val="1"/&gt;&lt;w:numFmt w:val="lowerRoman"/&gt;&lt;w:lvlText w:val="(%9)"/&gt;&lt;w:lvlJc w:val="left"/&gt;&lt;w:pPr&gt;&lt;w:ind w:left="3240" w:hanging="360"/&gt;&lt;/w:pPr&gt;&lt;w:rPr&gt;&lt;w:rFonts w:hint="default"/&gt;&lt;/w:rPr&gt;&lt;/w:lvl&gt;&lt;/w:abstractNum&gt;&lt;w:abstractNum w:abstractNumId="9" w15:restartNumberingAfterBreak="0"&gt;&lt;w:nsid w:val="3CE155D5"/&gt;&lt;w:multiLevelType w:val="multilevel"/&gt;&lt;w:tmpl w:val="041D001D"/&gt;&lt;w:lvl w:ilvl="0"&gt;&lt;w:start w:val="1"/&gt;&lt;w:numFmt w:val="decimal"/&gt;&lt;w:lvlText w:val="%1)"/&gt;&lt;w:lvlJc w:val="left"/&gt;&lt;w:pPr&gt;&lt;w:ind w:left="360" w:hanging="360"/&gt;&lt;/w:pPr&gt;&lt;/w:lvl&gt;&lt;w:lvl w:ilvl="1"&gt;&lt;w:start w:val="1"/&gt;&lt;w:numFmt w:val="lowerLetter"/&gt;&lt;w:lvlText w:val="%2)"/&gt;&lt;w:lvlJc w:val="left"/&gt;&lt;w:pPr&gt;&lt;w:ind w:left="720" w:hanging="360"/&gt;&lt;/w:pPr&gt;&lt;/w:lvl&gt;&lt;w:lvl w:ilvl="2"&gt;&lt;w:start w:val="1"/&gt;&lt;w:numFmt w:val="lowerRoman"/&gt;&lt;w:lvlText w:val="%3)"/&gt;&lt;w:lvlJc w:val="left"/&gt;&lt;w:pPr&gt;&lt;w:ind w:left="1080" w:hanging="360"/&gt;&lt;/w:pPr&gt;&lt;/w:lvl&gt;&lt;w:lvl w:ilvl="3"&gt;&lt;w:start w:val="1"/&gt;&lt;w:numFmt w:val="decimal"/&gt;&lt;w:lvlText w:val="(%4)"/&gt;&lt;w:lvlJc w:val="left"/&gt;&lt;w:pPr&gt;&lt;w:ind w:left="1440" w:hanging="360"/&gt;&lt;/w:pPr&gt;&lt;/w:lvl&gt;&lt;w:lvl w:ilvl="4"&gt;&lt;w:start w:val="1"/&gt;&lt;w:numFmt w:val="lowerLetter"/&gt;&lt;w:lvlText w:val="(%5)"/&gt;&lt;w:lvlJc w:val="left"/&gt;&lt;w:pPr&gt;&lt;w:ind w:left="1800" w:hanging="360"/&gt;&lt;/w:pPr&gt;&lt;/w:lvl&gt;&lt;w:lvl w:ilvl="5"&gt;&lt;w:start w:val="1"/&gt;&lt;w:numFmt w:val="lowerRoman"/&gt;&lt;w:lvlText w:val="(%6)"/&gt;&lt;w:lvlJc w:val="left"/&gt;&lt;w:pPr&gt;&lt;w:ind w:left="2160" w:hanging="360"/&gt;&lt;/w:pPr&gt;&lt;/w:lvl&gt;&lt;w:lvl w:ilvl="6"&gt;&lt;w:start w:val="1"/&gt;&lt;w:numFmt w:val="decimal"/&gt;&lt;w:lvlText w:val="%7."/&gt;&lt;w:lvlJc w:val="left"/&gt;&lt;w:pPr&gt;&lt;w:ind w:left="2520" w:hanging="360"/&gt;&lt;/w:pPr&gt;&lt;/w:lvl&gt;&lt;w:lvl w:ilvl="7"&gt;&lt;w:start w:val="1"/&gt;&lt;w:numFmt w:val="lowerLetter"/&gt;&lt;w:lvlText w:val="%8."/&gt;&lt;w:lvlJc w:val="left"/&gt;&lt;w:pPr&gt;&lt;w:ind w:left="2880" w:hanging="360"/&gt;&lt;/w:pPr&gt;&lt;/w:lvl&gt;&lt;w:lvl w:ilvl="8"&gt;&lt;w:start w:val="1"/&gt;&lt;w:numFmt w:val="lowerRoman"/&gt;&lt;w:lvlText w:val="%9."/&gt;&lt;w:lvlJc w:val="left"/&gt;&lt;w:pPr&gt;&lt;w:ind w:left="3240" w:hanging="360"/&gt;&lt;/w:pPr&gt;&lt;/w:lvl&gt;&lt;/w:abstractNum&gt;&lt;w:abstractNum w:abstractNumId="10" w15:restartNumberingAfterBreak="0"&gt;&lt;w:nsid w:val="3D727479"/&gt;&lt;w:multiLevelType w:val="multilevel"/&gt;&lt;w:tmpl w:val="041D0023"/&gt;&lt;w:lvl w:ilvl="0"&gt;&lt;w:start w:val="1"/&gt;&lt;w:numFmt w:val="upperRoman"/&gt;&lt;w:lvlText w:val="Artikel %1."/&gt;&lt;w:lvlJc w:val="left"/&gt;&lt;w:pPr&gt;&lt;w:ind w:left="0" w:firstLine="0"/&gt;&lt;/w:pPr&gt;&lt;/w:lvl&gt;&lt;w:lvl w:ilvl="1"&gt;&lt;w:start w:val="1"/&gt;&lt;w:numFmt w:val="decimalZero"/&gt;&lt;w:isLgl/&gt;&lt;w:lvlText w:val="Avsnitt %1.%2"/&gt;&lt;w:lvlJc w:val="left"/&gt;&lt;w:pPr&gt;&lt;w:ind w:left="0" w:firstLine="0"/&gt;&lt;/w:pPr&gt;&lt;/w:lvl&gt;&lt;w:lvl w:ilvl="2"&gt;&lt;w:start w:val="1"/&gt;&lt;w:numFmt w:val="lowerLetter"/&gt;&lt;w:lvlText w:val="(%3)"/&gt;&lt;w:lvlJc w:val="left"/&gt;&lt;w:pPr&gt;&lt;w:ind w:left="720" w:hanging="432"/&gt;&lt;/w:pPr&gt;&lt;/w:lvl&gt;&lt;w:lvl w:ilvl="3"&gt;&lt;w:start w:val="1"/&gt;&lt;w:numFmt w:val="lowerRoman"/&gt;&lt;w:lvlText w:val="(%4)"/&gt;&lt;w:lvlJc w:val="right"/&gt;&lt;w:pPr&gt;&lt;w:ind w:left="864" w:hanging="144"/&gt;&lt;/w:pPr&gt;&lt;/w:lvl&gt;&lt;w:lvl w:ilvl="4"&gt;&lt;w:start w:val="1"/&gt;&lt;w:numFmt w:val="decimal"/&gt;&lt;w:pStyle w:val="Heading5"/&gt;&lt;w:lvlText w:val="%5)"/&gt;&lt;w:lvlJc w:val="left"/&gt;&lt;w:pPr&gt;&lt;w:ind w:left="1008" w:hanging="432"/&gt;&lt;/w:pPr&gt;&lt;/w:lvl&gt;&lt;w:lvl w:ilvl="5"&gt;&lt;w:start w:val="1"/&gt;&lt;w:numFmt w:val="lowerLetter"/&gt;&lt;w:pStyle w:val="Heading6"/&gt;&lt;w:lvlText w:val="%6)"/&gt;&lt;w:lvlJc w:val="left"/&gt;&lt;w:pPr&gt;&lt;w:ind w:left="1152" w:hanging="432"/&gt;&lt;/w:pPr&gt;&lt;/w:lvl&gt;&lt;w:lvl w:ilvl="6"&gt;&lt;w:start w:val="1"/&gt;&lt;w:numFmt w:val="lowerRoman"/&gt;&lt;w:pStyle w:val="Heading7"/&gt;&lt;w:lvlText w:val="%7)"/&gt;&lt;w:lvlJc w:val="right"/&gt;&lt;w:pPr&gt;&lt;w:ind w:left="1296" w:hanging="288"/&gt;&lt;/w:pPr&gt;&lt;/w:lvl&gt;&lt;w:lvl w:ilvl="7"&gt;&lt;w:start w:val="1"/&gt;&lt;w:numFmt w:val="lowerLetter"/&gt;&lt;w:pStyle w:val="Heading8"/&gt;&lt;w:lvlText w:val="%8."/&gt;&lt;w:lvlJc w:val="left"/&gt;&lt;w:pPr&gt;&lt;w:ind w:left="1440" w:hanging="432"/&gt;&lt;/w:pPr&gt;&lt;/w:lvl&gt;&lt;w:lvl w:ilvl="8"&gt;&lt;w:start w:val="1"/&gt;&lt;w:numFmt w:val="lowerRoman"/&gt;&lt;w:pStyle w:val="Heading9"/&gt;&lt;w:lvlText w:val="%9."/&gt;&lt;w:lvlJc w:val="right"/&gt;&lt;w:pPr&gt;&lt;w:ind w:left="1584" w:hanging="144"/&gt;&lt;/w:pPr&gt;&lt;/w:lvl&gt;&lt;/w:abstractNum&gt;&lt;w:abstractNum w:abstractNumId="11" w15:restartNumberingAfterBreak="0"&gt;&lt;w:nsid w:val="43F95E9C"/&gt;&lt;w:multiLevelType w:val="multilevel"/&gt;&lt;w:tmpl w:val="5FAE225A"/&gt;&lt;w:lvl w:ilvl="0"&gt;&lt;w:start w:val="1"/&gt;&lt;w:numFmt w:val="decimal"/&gt;&lt;w:pStyle w:val="NumberedHeading1"/&gt;&lt;w:lvlText w:val="%1."/&gt;&lt;w:lvlJc w:val="left"/&gt;&lt;w:pPr&gt;&lt;w:ind w:left="907" w:hanging="907"/&gt;&lt;/w:pPr&gt;&lt;w:rPr&gt;&lt;w:rFonts w:hint="default"/&gt;&lt;/w:rPr&gt;&lt;/w:lvl&gt;&lt;w:lvl w:ilvl="1"&gt;&lt;w:start w:val="1"/&gt;&lt;w:numFmt w:val="decimal"/&gt;&lt;w:pStyle w:val="NumberedHeading2"/&gt;&lt;w:lvlText w:val="%1.%2"/&gt;&lt;w:lvlJc w:val="left"/&gt;&lt;w:pPr&gt;&lt;w:ind w:left="907" w:hanging="907"/&gt;&lt;/w:pPr&gt;&lt;w:rPr&gt;&lt;w:rFonts w:hint="default"/&gt;&lt;/w:rPr&gt;&lt;/w:lvl&gt;&lt;w:lvl w:ilvl="2"&gt;&lt;w:start w:val="1"/&gt;&lt;w:numFmt w:val="decimal"/&gt;&lt;w:pStyle w:val="NumberedHeading3"/&gt;&lt;w:lvlText w:val="%1.%2.%3"/&gt;&lt;w:lvlJc w:val="left"/&gt;&lt;w:pPr&gt;&lt;w:ind w:left="907" w:hanging="907"/&gt;&lt;/w:pPr&gt;&lt;w:rPr&gt;&lt;w:rFonts w:hint="default"/&gt;&lt;/w:rPr&gt;&lt;/w:lvl&gt;&lt;w:lvl w:ilvl="3"&gt;&lt;w:start w:val="1"/&gt;&lt;w:numFmt w:val="decimal"/&gt;&lt;w:pStyle w:val="NumberedHeading4"/&gt;&lt;w:lvlText w:val="%1.%2.%3.%4"/&gt;&lt;w:lvlJc w:val="left"/&gt;&lt;w:pPr&gt;&lt;w:ind w:left="907" w:hanging="907"/&gt;&lt;/w:pPr&gt;&lt;w:rPr&gt;&lt;w:rFonts w:hint="default"/&gt;&lt;/w:rPr&gt;&lt;/w:lvl&gt;&lt;w:lvl w:ilvl="4"&gt;&lt;w:start w:val="1"/&gt;&lt;w:numFmt w:val="lowerLetter"/&gt;&lt;w:lvlText w:val="(%5)"/&gt;&lt;w:lvlJc w:val="left"/&gt;&lt;w:pPr&gt;&lt;w:ind w:left="907" w:hanging="907"/&gt;&lt;/w:pPr&gt;&lt;w:rPr&gt;&lt;w:rFonts w:hint="default"/&gt;&lt;/w:rPr&gt;&lt;/w:lvl&gt;&lt;w:lvl w:ilvl="5"&gt;&lt;w:start w:val="1"/&gt;&lt;w:numFmt w:val="lowerRoman"/&gt;&lt;w:lvlText w:val="(%6)"/&gt;&lt;w:lvlJc w:val="left"/&gt;&lt;w:pPr&gt;&lt;w:ind w:left="907" w:hanging="907"/&gt;&lt;/w:pPr&gt;&lt;w:rPr&gt;&lt;w:rFonts w:hint="default"/&gt;&lt;/w:rPr&gt;&lt;/w:lvl&gt;&lt;w:lvl w:ilvl="6"&gt;&lt;w:start w:val="1"/&gt;&lt;w:numFmt w:val="decimal"/&gt;&lt;w:lvlText w:val="%7."/&gt;&lt;w:lvlJc w:val="left"/&gt;&lt;w:pPr&gt;&lt;w:ind w:left="907" w:hanging="907"/&gt;&lt;/w:pPr&gt;&lt;w:rPr&gt;&lt;w:rFonts w:hint="default"/&gt;&lt;/w:rPr&gt;&lt;/w:lvl&gt;&lt;w:lvl w:ilvl="7"&gt;&lt;w:start w:val="1"/&gt;&lt;w:numFmt w:val="lowerLetter"/&gt;&lt;w:lvlText w:val="%8."/&gt;&lt;w:lvlJc w:val="left"/&gt;&lt;w:pPr&gt;&lt;w:ind w:left="907" w:hanging="907"/&gt;&lt;/w:pPr&gt;&lt;w:rPr&gt;&lt;w:rFonts w:hint="default"/&gt;&lt;/w:rPr&gt;&lt;/w:lvl&gt;&lt;w:lvl w:ilvl="8"&gt;&lt;w:start w:val="1"/&gt;&lt;w:numFmt w:val="lowerRoman"/&gt;&lt;w:lvlText w:val="%9."/&gt;&lt;w:lvlJc w:val="left"/&gt;&lt;w:pPr&gt;&lt;w:ind w:left="907" w:hanging="907"/&gt;&lt;/w:pPr&gt;&lt;w:rPr&gt;&lt;w:rFonts w:hint="default"/&gt;&lt;/w:rPr&gt;&lt;/w:lvl&gt;&lt;/w:abstractNum&gt;&lt;w:abstractNum w:abstractNumId="12" w15:restartNumberingAfterBreak="0"&gt;&lt;w:nsid w:val="4CEF34F7"/&gt;&lt;w:multiLevelType w:val="multilevel"/&gt;&lt;w:tmpl w:val="041D001F"/&gt;&lt;w:lvl w:ilvl="0"&gt;&lt;w:start w:val="1"/&gt;&lt;w:numFmt w:val="decimal"/&gt;&lt;w:lvlText w:val="%1."/&gt;&lt;w:lvlJc w:val="left"/&gt;&lt;w:pPr&gt;&lt;w:ind w:left="360" w:hanging="360"/&gt;&lt;/w:pPr&gt;&lt;/w:lvl&gt;&lt;w:lvl w:ilvl="1"&gt;&lt;w:start w:val="1"/&gt;&lt;w:numFmt w:val="decimal"/&gt;&lt;w:lvlText w:val="%1.%2."/&gt;&lt;w:lvlJc w:val="left"/&gt;&lt;w:pPr&gt;&lt;w:ind w:left="792" w:hanging="432"/&gt;&lt;/w:pPr&gt;&lt;/w:lvl&gt;&lt;w:lvl w:ilvl="2"&gt;&lt;w:start w:val="1"/&gt;&lt;w:numFmt w:val="decimal"/&gt;&lt;w:lvlText w:val="%1.%2.%3."/&gt;&lt;w:lvlJc w:val="left"/&gt;&lt;w:pPr&gt;&lt;w:ind w:left="1224" w:hanging="504"/&gt;&lt;/w:pPr&gt;&lt;/w:lvl&gt;&lt;w:lvl w:ilvl="3"&gt;&lt;w:start w:val="1"/&gt;&lt;w:numFmt w:val="decimal"/&gt;&lt;w:lvlText w:val="%1.%2.%3.%4."/&gt;&lt;w:lvlJc w:val="left"/&gt;&lt;w:pPr&gt;&lt;w:ind w:left="1728" w:hanging="648"/&gt;&lt;/w:pPr&gt;&lt;/w:lvl&gt;&lt;w:lvl w:ilvl="4"&gt;&lt;w:start w:val="1"/&gt;&lt;w:numFmt w:val="decimal"/&gt;&lt;w:lvlText w:val="%1.%2.%3.%4.%5."/&gt;&lt;w:lvlJc w:val="left"/&gt;&lt;w:pPr&gt;&lt;w:ind w:left="2232" w:hanging="792"/&gt;&lt;/w:pPr&gt;&lt;/w:lvl&gt;&lt;w:lvl w:ilvl="5"&gt;&lt;w:start w:val="1"/&gt;&lt;w:numFmt w:val="decimal"/&gt;&lt;w:lvlText w:val="%1.%2.%3.%4.%5.%6."/&gt;&lt;w:lvlJc w:val="left"/&gt;&lt;w:pPr&gt;&lt;w:ind w:left="2736" w:hanging="936"/&gt;&lt;/w:pPr&gt;&lt;/w:lvl&gt;&lt;w:lvl w:ilvl="6"&gt;&lt;w:start w:val="1"/&gt;&lt;w:numFmt w:val="decimal"/&gt;&lt;w:lvlText w:val="%1.%2.%3.%4.%5.%6.%7."/&gt;&lt;w:lvlJc w:val="left"/&gt;&lt;w:pPr&gt;&lt;w:ind w:left="3240" w:hanging="1080"/&gt;&lt;/w:pPr&gt;&lt;/w:lvl&gt;&lt;w:lvl w:ilvl="7"&gt;&lt;w:start w:val="1"/&gt;&lt;w:numFmt w:val="decimal"/&gt;&lt;w:lvlText w:val="%1.%2.%3.%4.%5.%6.%7.%8."/&gt;&lt;w:lvlJc w:val="left"/&gt;&lt;w:pPr&gt;&lt;w:ind w:left="3744" w:hanging="1224"/&gt;&lt;/w:pPr&gt;&lt;/w:lvl&gt;&lt;w:lvl w:ilvl="8"&gt;&lt;w:start w:val="1"/&gt;&lt;w:numFmt w:val="decimal"/&gt;&lt;w:lvlText w:val="%1.%2.%3.%4.%5.%6.%7.%8.%9."/&gt;&lt;w:lvlJc w:val="left"/&gt;&lt;w:pPr&gt;&lt;w:ind w:left="4320" w:hanging="1440"/&gt;&lt;/w:pPr&gt;&lt;/w:lvl&gt;&lt;/w:abstractNum&gt;&lt;w:abstractNum w:abstractNumId="13" w15:restartNumberingAfterBreak="0"&gt;&lt;w:nsid w:val="566F2E6D"/&gt;&lt;w:multiLevelType w:val="multilevel"/&gt;&lt;w:tmpl w:val="6FD4AAFC"/&gt;&lt;w:lvl w:ilvl="0"&gt;&lt;w:start w:val="1"/&gt;&lt;w:numFmt w:val="bullet"/&gt;&lt;w:pStyle w:val="ListBullet"/&gt;&lt;w:lvlText w:val="—"/&gt;&lt;w:lvlJc w:val="left"/&gt;&lt;w:pPr&gt;&lt;w:ind w:left="360" w:hanging="360"/&gt;&lt;/w:pPr&gt;&lt;w:rPr&gt;&lt;w:rFonts w:ascii="Calibri" w:hAnsi="Calibri" w:hint="default"/&gt;&lt;w:color w:val="auto"/&gt;&lt;/w:rPr&gt;&lt;/w:lvl&gt;&lt;w:lvl w:ilvl="1"&gt;&lt;w:start w:val="1"/&gt;&lt;w:numFmt w:val="bullet"/&gt;&lt;w:pStyle w:val="ListBullet2"/&gt;&lt;w:lvlText w:val="—"/&gt;&lt;w:lvlJc w:val="left"/&gt;&lt;w:pPr&gt;&lt;w:ind w:left="720" w:hanging="360"/&gt;&lt;/w:pPr&gt;&lt;w:rPr&gt;&lt;w:rFonts w:ascii="Calibri" w:hAnsi="Calibri" w:hint="default"/&gt;&lt;w:color w:val="auto"/&gt;&lt;/w:rPr&gt;&lt;/w:lvl&gt;&lt;w:lvl w:ilvl="2"&gt;&lt;w:start w:val="1"/&gt;&lt;w:numFmt w:val="bullet"/&gt;&lt;w:pStyle w:val="ListBullet3"/&gt;&lt;w:lvlText w:val="—"/&gt;&lt;w:lvlJc w:val="left"/&gt;&lt;w:pPr&gt;&lt;w:ind w:left="1080" w:hanging="360"/&gt;&lt;/w:pPr&gt;&lt;w:rPr&gt;&lt;w:rFonts w:ascii="Calibri" w:hAnsi="Calibri" w:hint="default"/&gt;&lt;w:color w:val="auto"/&gt;&lt;/w:rPr&gt;&lt;/w:lvl&gt;&lt;w:lvl w:ilvl="3"&gt;&lt;w:start w:val="1"/&gt;&lt;w:numFmt w:val="bullet"/&gt;&lt;w:pStyle w:val="ListBullet4"/&gt;&lt;w:lvlText w:val="—"/&gt;&lt;w:lvlJc w:val="left"/&gt;&lt;w:pPr&gt;&lt;w:ind w:left="1440" w:hanging="360"/&gt;&lt;/w:pPr&gt;&lt;w:rPr&gt;&lt;w:rFonts w:ascii="Calibri" w:hAnsi="Calibri" w:hint="default"/&gt;&lt;w:color w:val="auto"/&gt;&lt;/w:rPr&gt;&lt;/w:lvl&gt;&lt;w:lvl w:ilvl="4"&gt;&lt;w:start w:val="1"/&gt;&lt;w:numFmt w:val="bullet"/&gt;&lt;w:pStyle w:val="ListBullet5"/&gt;&lt;w:lvlText w:val="—"/&gt;&lt;w:lvlJc w:val="left"/&gt;&lt;w:pPr&gt;&lt;w:ind w:left="1800" w:hanging="360"/&gt;&lt;/w:pPr&gt;&lt;w:rPr&gt;&lt;w:rFonts w:ascii="Calibri" w:hAnsi="Calibri" w:hint="default"/&gt;&lt;w:color w:val="auto"/&gt;&lt;/w:rPr&gt;&lt;/w:lvl&gt;&lt;w:lvl w:ilvl="5"&gt;&lt;w:start w:val="1"/&gt;&lt;w:numFmt w:val="bullet"/&gt;&lt;w:lvlText w:val="»"/&gt;&lt;w:lvlJc w:val="left"/&gt;&lt;w:pPr&gt;&lt;w:ind w:left="2160" w:hanging="360"/&gt;&lt;/w:pPr&gt;&lt;w:rPr&gt;&lt;w:rFonts w:ascii="Calibri" w:hAnsi="Calibri" w:hint="default"/&gt;&lt;w:color w:val="auto"/&gt;&lt;/w:rPr&gt;&lt;/w:lvl&gt;&lt;w:lvl w:ilvl="6"&gt;&lt;w:start w:val="1"/&gt;&lt;w:numFmt w:val="bullet"/&gt;&lt;w:lvlText w:val="•"/&gt;&lt;w:lvlJc w:val="left"/&gt;&lt;w:pPr&gt;&lt;w:ind w:left="2520" w:hanging="360"/&gt;&lt;/w:pPr&gt;&lt;w:rPr&gt;&lt;w:rFonts w:ascii="Calibri" w:hAnsi="Calibri" w:hint="default"/&gt;&lt;w:color w:val="auto"/&gt;&lt;/w:rPr&gt;&lt;/w:lvl&gt;&lt;w:lvl w:ilvl="7"&gt;&lt;w:start w:val="1"/&gt;&lt;w:numFmt w:val="bullet"/&gt;&lt;w:lvlText w:val="–"/&gt;&lt;w:lvlJc w:val="left"/&gt;&lt;w:pPr&gt;&lt;w:ind w:left="2880" w:hanging="360"/&gt;&lt;/w:pPr&gt;&lt;w:rPr&gt;&lt;w:rFonts w:ascii="Calibri" w:hAnsi="Calibri" w:hint="default"/&gt;&lt;w:color w:val="auto"/&gt;&lt;/w:rPr&gt;&lt;/w:lvl&gt;&lt;w:lvl w:ilvl="8"&gt;&lt;w:start w:val="1"/&gt;&lt;w:numFmt w:val="bullet"/&gt;&lt;w:lvlText w:val="»"/&gt;&lt;w:lvlJc w:val="left"/&gt;&lt;w:pPr&gt;&lt;w:ind w:left="3240" w:hanging="360"/&gt;&lt;/w:pPr&gt;&lt;w:rPr&gt;&lt;w:rFonts w:ascii="Calibri" w:hAnsi="Calibri" w:hint="default"/&gt;&lt;w:color w:val="auto"/&gt;&lt;/w:rPr&gt;&lt;/w:lvl&gt;&lt;/w:abstractNum&gt;&lt;w:num w:numId="1"&gt;&lt;w:abstractNumId w:val="13"/&gt;&lt;/w:num&gt;&lt;w:num w:numId="2"&gt;&lt;w:abstractNumId w:val="7"/&gt;&lt;/w:num&gt;&lt;w:num w:numId="3"&gt;&lt;w:abstractNumId w:val="6"/&gt;&lt;/w:num&gt;&lt;w:num w:numId="4"&gt;&lt;w:abstractNumId w:val="5"/&gt;&lt;/w:num&gt;&lt;w:num w:numId="5"&gt;&lt;w:abstractNumId w:val="4"/&gt;&lt;/w:num&gt;&lt;w:num w:numId="6"&gt;&lt;w:abstractNumId w:val="8"/&gt;&lt;/w:num&gt;&lt;w:num w:numId="7"&gt;&lt;w:abstractNumId w:val="3"/&gt;&lt;/w:num&gt;&lt;w:num w:numId="8"&gt;&lt;w:abstractNumId w:val="2"/&gt;&lt;/w:num&gt;&lt;w:num w:numId="9"&gt;&lt;w:abstractNumId w:val="1"/&gt;&lt;/w:num&gt;&lt;w:num w:numId="10"&gt;&lt;w:abstractNumId w:val="0"/&gt;&lt;/w:num&gt;&lt;w:num w:numId="11"&gt;&lt;w:abstractNumId w:val="13"/&gt;&lt;w:lvlOverride w:ilvl="0"&gt;&lt;w:startOverride w:val="1"/&gt;&lt;/w:lvlOverride&gt;&lt;w:lvlOverride w:ilvl="1"&gt;&lt;w:startOverride w:val="1"/&gt;&lt;/w:lvlOverride&gt;&lt;w:lvlOverride w:ilvl="2"&gt;&lt;w:startOverride w:val="1"/&gt;&lt;/w:lvlOverride&gt;&lt;w:lvlOverride w:ilvl="3"&gt;&lt;w:startOverride w:val="1"/&gt;&lt;/w:lvlOverride&gt;&lt;w:lvlOverride w:ilvl="4"&gt;&lt;w:startOverride w:val="1"/&gt;&lt;/w:lvlOverride&gt;&lt;w:lvlOverride w:ilvl="5"&gt;&lt;w:startOverride w:val="1"/&gt;&lt;/w:lvlOverride&gt;&lt;w:lvlOverride w:ilvl="6"&gt;&lt;w:startOverride w:val="1"/&gt;&lt;/w:lvlOverride&gt;&lt;w:lvlOverride w:ilvl="7"&gt;&lt;w:startOverride w:val="1"/&gt;&lt;/w:lvlOverride&gt;&lt;w:lvlOverride w:ilvl="8"&gt;&lt;w:startOverride w:val="1"/&gt;&lt;/w:lvlOverride&gt;&lt;/w:num&gt;&lt;w:num w:numId="12"&gt;&lt;w:abstractNumId w:val="11"/&gt;&lt;/w:num&gt;&lt;w:num w:numId="13"&gt;&lt;w:abstractNumId w:val="12"/&gt;&lt;/w:num&gt;&lt;w:num w:numId="14"&gt;&lt;w:abstractNumId w:val="9"/&gt;&lt;/w:num&gt;&lt;w:num w:numId="15"&gt;&lt;w:abstractNumId w:val="10"/&gt;&lt;/w:num&gt;&lt;/w:numbering&gt;&lt;/pkg:xmlData&gt;&lt;/pkg:part&gt;&lt;/pkg:package&gt;
+</Titel>
+      <TelefonPersonlig>
+			</TelefonPersonlig>
+      <EmailPersonlig>
+			</EmailPersonlig>
+    </Personinfo>
+  </KontaktuppgifterForetag>
+  <KontaktuppgifterKund>
+    <ForetagKund>
+		</ForetagKund>
+    <OrgnrKund>
+		</OrgnrKund>
+    <TelefonKund>
+		</TelefonKund>
+    <EmailKund>
+		</EmailKund>
+    <BesoksadressKund>
+		</BesoksadressKund>
+    <PostAdressKund>
+		</PostAdressKund>
+    <GataKund>
+		</GataKund>
+    <PostnummerKund>
+		</PostnummerKund>
+    <OrtKund>
+		</OrtKund>
+    <PersoninfoKund>
+      <NamnKund>
+			</NamnKund>
+      <TitelKund>
+			</TitelKund>
+      <TelefonPersonligKund>
+			</TelefonPersonligKund>
+      <EmailPersonligKund>
+			</EmailPersonligKund>
+    </PersoninfoKund>
+  </KontaktuppgifterKund>
+  <Rapportinfo>
+    <Ar>
+		</Ar>
+    <Kvartal>
+		</Kvartal>
+    <Period>
+		</Period>
+    <Manad>
+		</Manad>
+    <Nuvarandemanad>
+		</Nuvarandemanad>
+    <Foregaendemanad>
+		</Foregaendemanad>
+    <Rapportdatum>
+		</Rapportdatum>
+  </Rapportinfo>
+  <Ekonomiinfo>
+    <Belopp>
+		</Belopp>
+    <Summa>
+		</Summa>
+  </Ekonomiinfo>
+</Rehngruppen10>
 </file>
 
 <file path=customXml/item2.xml><?xml version="1.0" encoding="utf-8"?>
+<b:Sources xmlns:b="http://schemas.openxmlformats.org/officeDocument/2006/bibliography" xmlns="http://schemas.openxmlformats.org/officeDocument/2006/bibliography" SelectedStyle="\APASixthEditionOfficeOnline.xsl" StyleName="APA" Version="6"/>
+</file>
+
+<file path=customXml/item3.xml><?xml version="1.0" encoding="utf-8"?>
 <ct:contentTypeSchema xmlns:ct="http://schemas.microsoft.com/office/2006/metadata/contentType" xmlns:ma="http://schemas.microsoft.com/office/2006/metadata/properties/metaAttributes" ct:_="" ma:_="" ma:contentTypeName="dokument" ma:contentTypeID="0x010100129BBCBF21362E4099AE6C2F27C58737" ma:contentTypeVersion="16" ma:contentTypeDescription="Skapa ett nytt dokument." ma:contentTypeScope="" ma:versionID="0d7d7d75af5cc18099c16a95b367d914">
   <xsd:schema xmlns:xsd="http://www.w3.org/2001/XMLSchema" xmlns:xs="http://www.w3.org/2001/XMLSchema" xmlns:p="http://schemas.microsoft.com/office/2006/metadata/properties" xmlns:ns2="10c3a147-0d64-46aa-a281-dc97358e8373" xmlns:ns3="d7532cd0-e888-47d6-8f58-db0210f25002" targetNamespace="http://schemas.microsoft.com/office/2006/metadata/properties" ma:root="true" ma:fieldsID="200b5d1f0c33c4436e6ab0a9b524dcd2" ns2:_="" ns3:_="">
     <xsd:import namespace="10c3a147-0d64-46aa-a281-dc97358e8373"/>
@@ -5478,113 +5656,13 @@
 </ct:contentTypeSchema>
 </file>
 
-<file path=customXml/item3.xml><?xml version="1.0" encoding="utf-8"?>
-<b:Sources xmlns:b="http://schemas.openxmlformats.org/officeDocument/2006/bibliography" xmlns="http://schemas.openxmlformats.org/officeDocument/2006/bibliography" SelectedStyle="\APASixthEditionOfficeOnline.xsl" StyleName="APA" Version="6"/>
-</file>
-
 <file path=customXml/item4.xml><?xml version="1.0" encoding="utf-8"?>
-<Rehngruppen10>
-  <Dokumentinfo>
-    <Rubrik>
-		</Rubrik>
-    <Underrubrik>
-		</Underrubrik>
-    <Disclaimer>
-		</Disclaimer>
-    <Version>
-		</Version>
-    <Dokumenttyp>
-		</Dokumenttyp>
-    <Informationsklassificering>
-		</Informationsklassificering>
-    <Datum/>
-  </Dokumentinfo>
-  <KontaktuppgifterForetag>
-    <Foretag>
-		</Foretag>
-    <Orgnr>
-		</Orgnr>
-    <TelefonForetag>
-		</TelefonForetag>
-    <EmailForetag>
-		</EmailForetag>
-    <Besoksadress>
-		</Besoksadress>
-    <PostAdress>
-		</PostAdress>
-    <Gata>
-		</Gata>
-    <Postnummer>
-		</Postnummer>
-    <Ort/>
-    <Personinfo>
-      <Namn>&lt;?xml version="1.0" standalone="yes"?&gt;
-&lt;?mso-application progid="Word.Document"?&gt;
-&lt;pkg:package xmlns:pkg="http://schemas.microsoft.com/office/2006/xmlPackage"&gt;&lt;pkg:part pkg:name="/_rels/.rels" pkg:contentType="application/vnd.openxmlformats-package.relationships+xml" pkg:padding="512"&gt;&lt;pkg:xmlData&gt;&lt;Relationships xmlns="http://schemas.openxmlformats.org/package/2006/relationships"&gt;&lt;Relationship Id="rId1" Type="http://schemas.openxmlformats.org/officeDocument/2006/relationships/officeDocument" Target="word/document.xml"/&gt;&lt;/Relationships&gt;&lt;/pkg:xmlData&gt;&lt;/pkg:part&gt;&lt;pkg:part pkg:name="/word/_rels/document.xml.rels" pkg:contentType="application/vnd.openxmlformats-package.relationships+xml" pkg:padding="256"&gt;&lt;pkg:xmlData&gt;&lt;Relationships xmlns="http://schemas.openxmlformats.org/package/2006/relationships"&gt;&lt;Relationship Id="rId3" Type="http://schemas.openxmlformats.org/officeDocument/2006/relationships/glossaryDocument" Target="glossary/document.xml"/&gt;&lt;Relationship Id="rId2" Type="http://schemas.openxmlformats.org/officeDocument/2006/relationships/styles" Target="styles.xml"/&gt;&lt;Relationship Id="rId1" Type="http://schemas.openxmlformats.org/officeDocument/2006/relationships/numbering" Target="numbering.xml"/&gt;&lt;/Relationships&gt;&lt;/pkg:xmlData&gt;&lt;/pkg:part&gt;&lt;pkg:part pkg:name="/word/document.xml" pkg:contentType="application/vnd.openxmlformats-officedocument.wordprocessingml.document.main+xml"&gt;&lt;pkg:xmlData&gt;&lt;w:document xmlns:wpc="http://schemas.microsoft.com/office/word/2010/wordprocessingCanvas" xmlns:cx="http://schemas.microsoft.com/office/drawing/2014/chartex" xmlns:cx1="http://schemas.microsoft.com/office/drawing/2015/9/8/chartex" xmlns:cx2="http://schemas.microsoft.com/office/drawing/2015/10/21/chartex" xmlns:cx3="http://schemas.microsoft.com/office/drawing/2016/5/9/chartex" xmlns:cx4="http://schemas.microsoft.com/office/drawing/2016/5/10/chartex" xmlns:cx5="http://schemas.microsoft.com/office/drawing/2016/5/11/chartex" xmlns:cx6="http://schemas.microsoft.com/office/drawing/2016/5/12/chartex" xmlns:cx7="http://schemas.microsoft.com/office/drawing/2016/5/13/chartex" xmlns:cx8="http://schemas.microsoft.com/office/drawing/2016/5/14/chartex" xmlns:mc="http://schemas.openxmlformats.org/markup-compatibility/2006" xmlns:o="urn:schemas-microsoft-com:office:office" xmlns:r="http://schemas.openxmlformats.org/officeDocument/2006/relationships" xmlns:m="http://schemas.openxmlformats.org/officeDocument/2006/math" xmlns:v="urn:schemas-microsoft-com:vml" xmlns:wp14="http://schemas.microsoft.com/office/word/2010/wordprocessingDrawing" xmlns:wp="http://schemas.openxmlformats.org/drawingml/2006/wordprocessingDrawing" xmlns:w10="urn:schemas-microsoft-com:office:word" xmlns:w="http://schemas.openxmlformats.org/wordprocessingml/2006/main" xmlns:w14="http://schemas.microsoft.com/office/word/2010/wordml" xmlns:w15="http://schemas.microsoft.com/office/word/2012/wordml" xmlns:w16se="http://schemas.microsoft.com/office/word/2015/wordml/symex" xmlns:wpg="http://schemas.microsoft.com/office/word/2010/wordprocessingGroup" xmlns:wpi="http://schemas.microsoft.com/office/word/2010/wordprocessingInk" xmlns:wne="http://schemas.microsoft.com/office/word/2006/wordml" xmlns:wps="http://schemas.microsoft.com/office/word/2010/wordprocessingShape" mc:Ignorable="w14 w15 w16se wp14"&gt;&lt;w:body&gt;&lt;w:sdt&gt;&lt;w:sdtPr&gt;&lt;w:tag w:val="regName"/&gt;&lt;w:id w:val="-1755663995"/&gt;&lt;w:placeholder&gt;&lt;w:docPart w:val="B7CF53EBD28C4270BBC51AAB20A1C895"/&gt;&lt;/w:placeholder&gt;&lt;/w:sdtPr&gt;&lt;w:sdtContent&gt;&lt;w:p&gt;&lt;w:pPr&gt;&lt;w:pStyle w:val="Name"/&gt;&lt;w:cnfStyle w:val="001000000000" w:firstRow="0" w:lastRow="0" w:firstColumn="1" w:lastColumn="0" w:oddVBand="0" w:evenVBand="0" w:oddHBand="0" w:evenHBand="0" w:firstRowFirstColumn="0" w:firstRowLastColumn="0" w:lastRowFirstColumn="0" w:lastRowLastColumn="0"/&gt;&lt;/w:pPr&gt;&lt;w:r&gt;&lt;w:t&gt;Maria Dahlstrand&lt;/w:t&gt;&lt;/w:r&gt;&lt;/w:p&gt;&lt;/w:sdtContent&gt;&lt;/w:sdt&gt;&lt;w:p/&gt;&lt;w:sectPr&gt;&lt;w:pgSz w:w="12240" w:h="15840"/&gt;&lt;w:pgMar w:top="1417" w:right="1417" w:bottom="1417" w:left="1417" w:header="720" w:footer="720" w:gutter="0"/&gt;&lt;w:cols w:space="720"/&gt;&lt;/w:sectPr&gt;&lt;/w:body&gt;&lt;/w:document&gt;&lt;/pkg:xmlData&gt;&lt;/pkg:part&gt;&lt;pkg:part pkg:name="/word/glossary/settings.xml" pkg:contentType="application/vnd.openxmlformats-officedocument.wordprocessingml.settings+xml"&gt;&lt;pkg:xmlData&gt;&lt;w:settings xmlns:mc="http://schemas.openxmlformats.org/markup-compatibility/2006" xmlns:o="urn:schemas-microsoft-com:office:office" xmlns:r="http://schemas.openxmlformats.org/officeDocument/2006/relationships" xmlns:m="http://schemas.openxmlformats.org/officeDocument/2006/math" xmlns:v="urn:schemas-microsoft-com:vml" xmlns:w10="urn:schemas-microsoft-com:office:word" xmlns:w="http://schemas.openxmlformats.org/wordprocessingml/2006/main" xmlns:w14="http://schemas.microsoft.com/office/word/2010/wordml" xmlns:w15="http://schemas.microsoft.com/office/word/2012/wordml" xmlns:w16se="http://schemas.microsoft.com/office/word/2015/wordml/symex" xmlns:sl="http://schemas.openxmlformats.org/schemaLibrary/2006/main" mc:Ignorable="w14 w15 w16se"&gt;&lt;w:view w:val="normal"/&gt;&lt;w:defaultTabStop w:val="720"/&gt;&lt;w:characterSpacingControl w:val="doNotCompress"/&gt;&lt;w:compat&gt;&lt;w:useFELayout/&gt;&lt;w:compatSetting w:name="compatibilityMode" w:uri="http://schemas.microsoft.com/office/word" w:val="15"/&gt;&lt;w:compatSetting w:name="overrideTableStyleFontSizeAndJustification" w:uri="http://schemas.microsoft.com/office/word" w:val="1"/&gt;&lt;w:compatSetting w:name="enableOpenTypeFeatures" w:uri="http://schemas.microsoft.com/office/word" w:val="1"/&gt;&lt;w:compatSetting w:name="doNotFlipMirrorIndents" w:uri="http://schemas.microsoft.com/office/word" w:val="1"/&gt;&lt;w:compatSetting w:name="differentiateMultirowTableHeaders" w:uri="http://schemas.microsoft.com/office/word" w:val="1"/&gt;&lt;/w:compat&gt;&lt;m:mathPr&gt;&lt;m:mathFont m:val="Cambria Math"/&gt;&lt;m:brkBin m:val="before"/&gt;&lt;m:brkBinSub m:val="--"/&gt;&lt;m:smallFrac m:val="0"/&gt;&lt;m:dispDef/&gt;&lt;m:lMargin m:val="0"/&gt;&lt;m:rMargin m:val="0"/&gt;&lt;m:defJc m:val="centerGroup"/&gt;&lt;m:wrapIndent m:val="1440"/&gt;&lt;m:intLim m:val="subSup"/&gt;&lt;m:naryLim m:val="undOvr"/&gt;&lt;/m:mathPr&gt;&lt;w:themeFontLang w:val="en-GB"/&gt;&lt;w:clrSchemeMapping w:bg1="light1" w:t1="dark1" w:bg2="light2" w:t2="dark2" w:accent1="accent1" w:accent2="accent2" w:accent3="accent3" w:accent4="accent4" w:accent5="accent5" w:accent6="accent6" w:hyperlink="hyperlink" w:followedHyperlink="followedHyperlink"/&gt;&lt;w:decimalSymbol w:val=","/&gt;&lt;w:listSeparator w:val=";"/&gt;&lt;w15:chartTrackingRefBased/&gt;&lt;/w:settings&gt;&lt;/pkg:xmlData&gt;&lt;/pkg:part&gt;&lt;pkg:part pkg:name="/word/glossary/_rels/document.xml.rels" pkg:contentType="application/vnd.openxmlformats-package.relationships+xml"&gt;&lt;pkg:xmlData&gt;&lt;Relationships xmlns="http://schemas.openxmlformats.org/package/2006/relationships"&gt;&lt;Relationship Id="rId3" Type="http://schemas.openxmlformats.org/officeDocument/2006/relationships/webSettings" Target="webSettings.xml"/&gt;&lt;Relationship Id="rId2" Type="http://schemas.openxmlformats.org/officeDocument/2006/relationships/settings" Target="settings.xml"/&gt;&lt;Relationship Id="rId1" Type="http://schemas.openxmlformats.org/officeDocument/2006/relationships/styles" Target="styles.xml"/&gt;&lt;Relationship Id="rId4" Type="http://schemas.openxmlformats.org/officeDocument/2006/relationships/fontTable" Target="fontTable.xml"/&gt;&lt;/Relationships&gt;&lt;/pkg:xmlData&gt;&lt;/pkg:part&gt;&lt;pkg:part pkg:name="/word/glossary/document.xml" pkg:contentType="application/vnd.openxmlformats-officedocument.wordprocessingml.document.glossary+xml"&gt;&lt;pkg:xmlData&gt;&lt;w:glossaryDocument xmlns:wpc="http://schemas.microsoft.com/office/word/2010/wordprocessingCanvas" xmlns:cx="http://schemas.microsoft.com/office/drawing/2014/chartex" xmlns:cx1="http://schemas.microsoft.com/office/drawing/2015/9/8/chartex" xmlns:cx2="http://schemas.microsoft.com/office/drawing/2015/10/21/chartex" xmlns:cx3="http://schemas.microsoft.com/office/drawing/2016/5/9/chartex" xmlns:cx4="http://schemas.microsoft.com/office/drawing/2016/5/10/chartex" xmlns:cx5="http://schemas.microsoft.com/office/drawing/2016/5/11/chartex" xmlns:cx6="http://schemas.microsoft.com/office/drawing/2016/5/12/chartex" xmlns:cx7="http://schemas.microsoft.com/office/drawing/2016/5/13/chartex" xmlns:cx8="http://schemas.microsoft.com/office/drawing/2016/5/14/chartex" xmlns:mc="http://schemas.openxmlformats.org/markup-compatibility/2006" xmlns:o="urn:schemas-microsoft-com:office:office" xmlns:r="http://schemas.openxmlformats.org/officeDocument/2006/relationships" xmlns:m="http://schemas.openxmlformats.org/officeDocument/2006/math" xmlns:v="urn:schemas-microsoft-com:vml" xmlns:wp14="http://schemas.microsoft.com/office/word/2010/wordprocessingDrawing" xmlns:wp="http://schemas.openxmlformats.org/drawingml/2006/wordprocessingDrawing" xmlns:w10="urn:schemas-microsoft-com:office:word" xmlns:w="http://schemas.openxmlformats.org/wordprocessingml/2006/main" xmlns:w14="http://schemas.microsoft.com/office/word/2010/wordml" xmlns:w15="http://schemas.microsoft.com/office/word/2012/wordml" xmlns:w16se="http://schemas.microsoft.com/office/word/2015/wordml/symex" xmlns:wpg="http://schemas.microsoft.com/office/word/2010/wordprocessingGroup" xmlns:wpi="http://schemas.microsoft.com/office/word/2010/wordprocessingInk" xmlns:wne="http://schemas.microsoft.com/office/word/2006/wordml" xmlns:wps="http://schemas.microsoft.com/office/word/2010/wordprocessingShape" mc:Ignorable="w14 w15 w16se wp14"&gt;&lt;w:docParts&gt;&lt;w:docPart&gt;&lt;w:docPartPr&gt;&lt;w:name w:val="B7CF53EBD28C4270BBC51AAB20A1C895"/&gt;&lt;w:category&gt;&lt;w:name w:val="General"/&gt;&lt;w:gallery w:val="placeholder"/&gt;&lt;/w:category&gt;&lt;w:types&gt;&lt;w:type w:val="bbPlcHdr"/&gt;&lt;/w:types&gt;&lt;w:behaviors&gt;&lt;w:behavior w:val="content"/&gt;&lt;/w:behaviors&gt;&lt;w:guid w:val="{F7D69E8F-087E-454A-99F4-5E3C0519DD23}"/&gt;&lt;/w:docPartPr&gt;&lt;w:docPartBody&gt;&lt;w:p&gt;&lt;w:pPr&gt;&lt;w:pStyle w:val="B7CF53EBD28C4270BBC51AAB20A1C895"/&gt;&lt;/w:pPr&gt;&lt;w:r&gt;&lt;w:rPr&gt;&lt;w:rStyle w:val="PlaceholderText"/&gt;&lt;/w:rPr&gt;&lt;w:t&gt;Click or tap here to enter text.&lt;/w:t&gt;&lt;/w:r&gt;&lt;/w:p&gt;&lt;/w:docPartBody&gt;&lt;/w:docPart&gt;&lt;/w:docParts&gt;&lt;/w:glossaryDocument&gt;&lt;/pkg:xmlData&gt;&lt;/pkg:part&gt;&lt;pkg:part pkg:name="/word/glossary/styles.xml" pkg:contentType="application/vnd.openxmlformats-officedocument.wordprocessingml.styles+xml"&gt;&lt;pkg:xmlData&gt;&lt;w:styles xmlns:mc="http://schemas.openxmlformats.org/markup-compatibility/2006" xmlns:r="http://schemas.openxmlformats.org/officeDocument/2006/relationships" xmlns:w="http://schemas.openxmlformats.org/wordprocessingml/2006/main" xmlns:w14="http://schemas.microsoft.com/office/word/2010/wordml" xmlns:w15="http://schemas.microsoft.com/office/word/2012/wordml" xmlns:w16se="http://schemas.microsoft.com/office/word/2015/wordml/symex" mc:Ignorable="w14 w15 w16se"&gt;&lt;w:docDefaults&gt;&lt;w:rPrDefault&gt;&lt;w:rPr&gt;&lt;w:rFonts w:asciiTheme="minorHAnsi" w:eastAsiaTheme="minorEastAsia" w:hAnsiTheme="minorHAnsi" w:cstheme="minorBidi"/&gt;&lt;w:sz w:val="22"/&gt;&lt;w:szCs w:val="22"/&gt;&lt;w:lang w:val="en-GB" w:eastAsia="en-GB" w:bidi="ar-SA"/&gt;&lt;/w:rPr&gt;&lt;/w:rPrDefault&gt;&lt;w:pPrDefault&gt;&lt;w:pPr&gt;&lt;w:spacing w:after="160" w:line="259" w:lineRule="auto"/&gt;&lt;/w:pPr&gt;&lt;/w:pPrDefault&gt;&lt;/w:docDefaults&gt;&lt;w:latentStyles w:defLockedState="0" w:defUIPriority="99" w:defSemiHidden="0" w:defUnhideWhenUsed="0" w:defQFormat="0" w:count="374"&gt;&lt;w:lsdException w:name="Normal" w:uiPriority="0" w:qFormat="1"/&gt;&lt;w:lsdException w:name="heading 1" w:uiPriority="9" w:qFormat="1"/&gt;&lt;w:lsdException w:name="heading 2" w:semiHidden="1" w:uiPriority="9" w:unhideWhenUsed="1" w:qFormat="1"/&gt;&lt;w:lsdException w:name="heading 3" w:semiHidden="1" w:uiPriority="9" w:unhideWhenUsed="1" w:qFormat="1"/&gt;&lt;w:lsdException w:name="heading 4" w:semiHidden="1" w:uiPriority="9" w:unhideWhenUsed="1" w:qFormat="1"/&gt;&lt;w:lsdException w:name="heading 5" w:semiHidden="1" w:uiPriority="9" w:unhideWhenUsed="1" w:qFormat="1"/&gt;&lt;w:lsdException w:name="heading 6" w:semiHidden="1" w:uiPriority="9" w:unhideWhenUsed="1" w:qFormat="1"/&gt;&lt;w:lsdException w:name="heading 7" w:semiHidden="1" w:uiPriority="9" w:unhideWhenUsed="1" w:qFormat="1"/&gt;&lt;w:lsdException w:name="heading 8" w:semiHidden="1" w:uiPriority="9" w:unhideWhenUsed="1" w:qFormat="1"/&gt;&lt;w:lsdException w:name="heading 9" w:semiHidden="1" w:uiPriority="9" w:unhideWhenUsed="1" w:qFormat="1"/&gt;&lt;w:lsdException w:name="index 1" w:semiHidden="1" w:unhideWhenUsed="1"/&gt;&lt;w:lsdException w:name="index 2" w:semiHidden="1" w:unhideWhenUsed="1"/&gt;&lt;w:lsdException w:name="index 3" w:semiHidden="1" w:unhideWhenUsed="1"/&gt;&lt;w:lsdException w:name="index 4" w:semiHidden="1" w:unhideWhenUsed="1"/&gt;&lt;w:lsdException w:name="index 5" w:semiHidden="1" w:unhideWhenUsed="1"/&gt;&lt;w:lsdException w:name="index 6" w:semiHidden="1" w:unhideWhenUsed="1"/&gt;&lt;w:lsdException w:name="index 7" w:semiHidden="1" w:unhideWhenUsed="1"/&gt;&lt;w:lsdException w:name="index 8" w:semiHidden="1" w:unhideWhenUsed="1"/&gt;&lt;w:lsdException w:name="index 9" w:semiHidden="1" w:unhideWhenUsed="1"/&gt;&lt;w:lsdException w:name="toc 1" w:semiHidden="1" w:uiPriority="39" w:unhideWhenUsed="1"/&gt;&lt;w:lsdException w:name="toc 2" w:semiHidden="1" w:uiPriority="39" w:unhideWhenUsed="1"/&gt;&lt;w:lsdException w:name="toc 3" w:semiHidden="1" w:uiPriority="39" w:unhideWhenUsed="1"/&gt;&lt;w:lsdException w:name="toc 4" w:semiHidden="1" w:uiPriority="39" w:unhideWhenUsed="1"/&gt;&lt;w:lsdException w:name="toc 5" w:semiHidden="1" w:uiPriority="39" w:unhideWhenUsed="1"/&gt;&lt;w:lsdException w:name="toc 6" w:semiHidden="1" w:uiPriority="39" w:unhideWhenUsed="1"/&gt;&lt;w:lsdException w:name="toc 7" w:semiHidden="1" w:uiPriority="39" w:unhideWhenUsed="1"/&gt;&lt;w:lsdException w:name="toc 8" w:semiHidden="1" w:uiPriority="39" w:unhideWhenUsed="1"/&gt;&lt;w:lsdException w:name="toc 9" w:semiHidden="1" w:uiPriority="39" w:unhideWhenUsed="1"/&gt;&lt;w:lsdException w:name="Normal Indent" w:semiHidden="1" w:unhideWhenUsed="1"/&gt;&lt;w:lsdException w:name="footnote text" w:semiHidden="1" w:unhideWhenUsed="1"/&gt;&lt;w:lsdException w:name="annotation text" w:semiHidden="1" w:unhideWhenUsed="1"/&gt;&lt;w:lsdException w:name="header" w:semiHidden="1" w:unhideWhenUsed="1"/&gt;&lt;w:lsdException w:name="footer" w:semiHidden="1" w:unhideWhenUsed="1"/&gt;&lt;w:lsdException w:name="index heading" w:semiHidden="1" w:unhideWhenUsed="1"/&gt;&lt;w:lsdException w:name="caption" w:semiHidden="1" w:uiPriority="35" w:unhideWhenUsed="1" w:qFormat="1"/&gt;&lt;w:lsdException w:name="table of figures" w:semiHidden="1" w:unhideWhenUsed="1"/&gt;&lt;w:lsdException w:name="envelope address" w:semiHidden="1" w:unhideWhenUsed="1"/&gt;&lt;w:lsdException w:name="envelope return" w:semiHidden="1" w:unhideWhenUsed="1"/&gt;&lt;w:lsdException w:name="footnote reference" w:semiHidden="1" w:unhideWhenUsed="1"/&gt;&lt;w:lsdException w:name="annotation reference" w:semiHidden="1" w:unhideWhenUsed="1"/&gt;&lt;w:lsdException w:name="line number" w:semiHidden="1" w:unhideWhenUsed="1"/&gt;&lt;w:lsdException w:name="page number" w:semiHidden="1" w:unhideWhenUsed="1"/&gt;&lt;w:lsdException w:name="endnote reference" w:semiHidden="1" w:unhideWhenUsed="1"/&gt;&lt;w:lsdException w:name="endnote text" w:semiHidden="1" w:unhideWhenUsed="1"/&gt;&lt;w:lsdException w:name="table of authorities" w:semiHidden="1" w:unhideWhenUsed="1"/&gt;&lt;w:lsdException w:name="macro" w:semiHidden="1" w:unhideWhenUsed="1"/&gt;&lt;w:lsdException w:name="toa heading" w:semiHidden="1" w:unhideWhenUsed="1"/&gt;&lt;w:lsdException w:name="List" w:semiHidden="1" w:unhideWhenUsed="1"/&gt;&lt;w:lsdException w:name="List Bullet" w:semiHidden="1" w:unhideWhenUsed="1"/&gt;&lt;w:lsdException w:name="List Number" w:semiHidden="1" w:unhideWhenUsed="1"/&gt;&lt;w:lsdException w:name="List 2" w:semiHidden="1" w:unhideWhenUsed="1"/&gt;&lt;w:lsdException w:name="List 3" w:semiHidden="1" w:unhideWhenUsed="1"/&gt;&lt;w:lsdException w:name="List 4" w:semiHidden="1" w:unhideWhenUsed="1"/&gt;&lt;w:lsdException w:name="List 5" w:semiHidden="1" w:unhideWhenUsed="1"/&gt;&lt;w:lsdException w:name="List Bullet 2" w:semiHidden="1" w:unhideWhenUsed="1"/&gt;&lt;w:lsdException w:name="List Bullet 3" w:semiHidden="1" w:unhideWhenUsed="1"/&gt;&lt;w:lsdException w:name="List Bullet 4" w:semiHidden="1" w:unhideWhenUsed="1"/&gt;&lt;w:lsdException w:name="List Bullet 5" w:semiHidden="1" w:unhideWhenUsed="1"/&gt;&lt;w:lsdException w:name="List Number 2" w:semiHidden="1" w:unhideWhenUsed="1"/&gt;&lt;w:lsdException w:name="List Number 3" w:semiHidden="1" w:unhideWhenUsed="1"/&gt;&lt;w:lsdException w:name="List Number 4" w:semiHidden="1" w:unhideWhenUsed="1"/&gt;&lt;w:lsdException w:name="List Number 5" w:semiHidden="1" w:unhideWhenUsed="1"/&gt;&lt;w:lsdException w:name="Title" w:uiPriority="10" w:qFormat="1"/&gt;&lt;w:lsdException w:name="Closing" w:semiHidden="1" w:unhideWhenUsed="1"/&gt;&lt;w:lsdException w:name="Signature" w:semiHidden="1" w:unhideWhenUsed="1"/&gt;&lt;w:lsdException w:name="Default Paragraph Font" w:semiHidden="1" w:uiPriority="1" w:unhideWhenUsed="1"/&gt;&lt;w:lsdException w:name="Body Text" w:semiHidden="1" w:unhideWhenUsed="1"/&gt;&lt;w:lsdException w:name="Body Text Indent" w:semiHidden="1" w:unhideWhenUsed="1"/&gt;&lt;w:lsdException w:name="List Continue" w:semiHidden="1" w:unhideWhenUsed="1"/&gt;&lt;w:lsdException w:name="List Continue 2" w:semiHidden="1" w:unhideWhenUsed="1"/&gt;&lt;w:lsdException w:name="List Continue 3" w:semiHidden="1" w:unhideWhenUsed="1"/&gt;&lt;w:lsdException w:name="List Continue 4" w:semiHidden="1" w:unhideWhenUsed="1"/&gt;&lt;w:lsdException w:name="List Continue 5" w:semiHidden="1" w:unhideWhenUsed="1"/&gt;&lt;w:lsdException w:name="Message Header" w:semiHidden="1" w:unhideWhenUsed="1"/&gt;&lt;w:lsdException w:name="Subtitle" w:uiPriority="11" w:qFormat="1"/&gt;&lt;w:lsdException w:name="Salutation" w:semiHidden="1" w:unhideWhenUsed="1"/&gt;&lt;w:lsdException w:name="Date" w:semiHidden="1" w:unhideWhenUsed="1"/&gt;&lt;w:lsdException w:name="Body Text First Indent" w:semiHidden="1" w:unhideWhenUsed="1"/&gt;&lt;w:lsdException w:name="Body Text First Indent 2" w:semiHidden="1" w:unhideWhenUsed="1"/&gt;&lt;w:lsdException w:name="Note Heading" w:semiHidden="1" w:unhideWhenUsed="1"/&gt;&lt;w:lsdException w:name="Body Text 2" w:semiHidden="1" w:unhideWhenUsed="1"/&gt;&lt;w:lsdException w:name="Body Text 3" w:semiHidden="1" w:unhideWhenUsed="1"/&gt;&lt;w:lsdException w:name="Body Text Indent 2" w:semiHidden="1" w:unhideWhenUsed="1"/&gt;&lt;w:lsdException w:name="Body Text Indent 3" w:semiHidden="1" w:unhideWhenUsed="1"/&gt;&lt;w:lsdException w:name="Block Text" w:semiHidden="1" w:unhideWhenUsed="1"/&gt;&lt;w:lsdException w:name="Hyperlink" w:semiHidden="1" w:unhideWhenUsed="1"/&gt;&lt;w:lsdException w:name="FollowedHyperlink" w:semiHidden="1" w:unhideWhenUsed="1"/&gt;&lt;w:lsdException w:name="Strong" w:uiPriority="22" w:qFormat="1"/&gt;&lt;w:lsdException w:name="Emphasis" w:uiPriority="20" w:qFormat="1"/&gt;&lt;w:lsdException w:name="Document Map" w:semiHidden="1" w:unhideWhenUsed="1"/&gt;&lt;w:lsdException w:name="Plain Text" w:semiHidden="1" w:unhideWhenUsed="1"/&gt;&lt;w:lsdException w:name="E-mail Signature" w:semiHidden="1" w:unhideWhenUsed="1"/&gt;&lt;w:lsdException w:name="HTML Top of Form" w:semiHidden="1" w:unhideWhenUsed="1"/&gt;&lt;w:lsdException w:name="HTML Bottom of Form" w:semiHidden="1" w:unhideWhenUsed="1"/&gt;&lt;w:lsdException w:name="Normal (Web)" w:semiHidden="1" w:unhideWhenUsed="1"/&gt;&lt;w:lsdException w:name="HTML Acronym" w:semiHidden="1" w:unhideWhenUsed="1"/&gt;&lt;w:lsdException w:name="HTML Address" w:semiHidden="1" w:unhideWhenUsed="1"/&gt;&lt;w:lsdException w:name="HTML Cite" w:semiHidden="1" w:unhideWhenUsed="1"/&gt;&lt;w:lsdException w:name="HTML Code" w:semiHidden="1" w:unhideWhenUsed="1"/&gt;&lt;w:lsdException w:name="HTML Definition" w:semiHidden="1" w:unhideWhenUsed="1"/&gt;&lt;w:lsdException w:name="HTML Keyboard" w:semiHidden="1" w:unhideWhenUsed="1"/&gt;&lt;w:lsdException w:name="HTML Preformatted" w:semiHidden="1" w:unhideWhenUsed="1"/&gt;&lt;w:lsdException w:name="HTML Sample" w:semiHidden="1" w:unhideWhenUsed="1"/&gt;&lt;w:lsdException w:name="HTML Typewriter" w:semiHidden="1" w:unhideWhenUsed="1"/&gt;&lt;w:lsdException w:name="HTML Variable" w:semiHidden="1" w:unhideWhenUsed="1"/&gt;&lt;w:lsdException w:name="Normal Table" w:semiHidden="1" w:unhideWhenUsed="1"/&gt;&lt;w:lsdException w:name="annotation subject" w:semiHidden="1" w:unhideWhenUsed="1"/&gt;&lt;w:lsdException w:name="No List" w:semiHidden="1" w:unhideWhenUsed="1"/&gt;&lt;w:lsdException w:name="Outline List 1" w:semiHidden="1" w:unhideWhenUsed="1"/&gt;&lt;w:lsdException w:name="Outline List 2" w:semiHidden="1" w:unhideWhenUsed="1"/&gt;&lt;w:lsdException w:name="Outline List 3" w:semiHidden="1" w:unhideWhenUsed="1"/&gt;&lt;w:lsdException w:name="Table Simple 1" w:semiHidden="1" w:unhideWhenUsed="1"/&gt;&lt;w:lsdException w:name="Table Simple 2" w:semiHidden="1" w:unhideWhenUsed="1"/&gt;&lt;w:lsdException w:name="Table Simple 3" w:semiHidden="1" w:unhideWhenUsed="1"/&gt;&lt;w:lsdException w:name="Table Classic 1" w:semiHidden="1" w:unhideWhenUsed="1"/&gt;&lt;w:lsdException w:name="Table Classic 2" w:semiHidden="1" w:unhideWhenUsed="1"/&gt;&lt;w:lsdException w:name="Table Classic 3" w:semiHidden="1" w:unhideWhenUsed="1"/&gt;&lt;w:lsdException w:name="Table Classic 4" w:semiHidden="1" w:unhideWhenUsed="1"/&gt;&lt;w:lsdException w:name="Table Colorful 1" w:semiHidden="1" w:unhideWhenUsed="1"/&gt;&lt;w:lsdException w:name="Table Colorful 2" w:semiHidden="1" w:unhideWhenUsed="1"/&gt;&lt;w:lsdException w:name="Table Colorful 3" w:semiHidden="1" w:unhideWhenUsed="1"/&gt;&lt;w:lsdException w:name="Table Columns 1" w:semiHidden="1" w:unhideWhenUsed="1"/&gt;&lt;w:lsdException w:name="Table Columns 2" w:semiHidden="1" w:unhideWhenUsed="1"/&gt;&lt;w:lsdException w:name="Table Columns 3" w:semiHidden="1" w:unhideWhenUsed="1"/&gt;&lt;w:lsdException w:name="Table Columns 4" w:semiHidden="1" w:unhideWhenUsed="1"/&gt;&lt;w:lsdException w:name="Table Columns 5" w:semiHidden="1" w:unhideWhenUsed="1"/&gt;&lt;w:lsdException w:name="Table Grid 1" w:semiHidden="1" w:unhideWhenUsed="1"/&gt;&lt;w:lsdException w:name="Table Grid 2" w:semiHidden="1" w:unhideWhenUsed="1"/&gt;&lt;w:lsdException w:name="Table Grid 3" w:semiHidden="1" w:unhideWhenUsed="1"/&gt;&lt;w:lsdException w:name="Table Grid 4" w:semiHidden="1" w:unhideWhenUsed="1"/&gt;&lt;w:lsdException w:name="Table Grid 5" w:semiHidden="1" w:unhideWhenUsed="1"/&gt;&lt;w:lsdException w:name="Table Grid 6" w:semiHidden="1" w:unhideWhenUsed="1"/&gt;&lt;w:lsdException w:name="Table Grid 7" w:semiHidden="1" w:unhideWhenUsed="1"/&gt;&lt;w:lsdException w:name="Table Grid 8" w:semiHidden="1" w:unhideWhenUsed="1"/&gt;&lt;w:lsdException w:name="Table List 1" w:semiHidden="1" w:unhideWhenUsed="1"/&gt;&lt;w:lsdException w:name="Table List 2" w:semiHidden="1" w:unhideWhenUsed="1"/&gt;&lt;w:lsdException w:name="Table List 3" w:semiHidden="1" w:unhideWhenUsed="1"/&gt;&lt;w:lsdException w:name="Table List 4" w:semiHidden="1" w:unhideWhenUsed="1"/&gt;&lt;w:lsdException w:name="Table List 5" w:semiHidden="1" w:unhideWhenUsed="1"/&gt;&lt;w:lsdException w:name="Table List 6" w:semiHidden="1" w:unhideWhenUsed="1"/&gt;&lt;w:lsdException w:name="Table List 7" w:semiHidden="1" w:unhideWhenUsed="1"/&gt;&lt;w:lsdException w:name="Table List 8" w:semiHidden="1" w:unhideWhenUsed="1"/&gt;&lt;w:lsdException w:name="Table 3D effects 1" w:semiHidden="1" w:unhideWhenUsed="1"/&gt;&lt;w:lsdException w:name="Table 3D effects 2" w:semiHidden="1" w:unhideWhenUsed="1"/&gt;&lt;w:lsdException w:name="Table 3D effects 3" w:semiHidden="1" w:unhideWhenUsed="1"/&gt;&lt;w:lsdException w:name="Table Contemporary" w:semiHidden="1" w:unhideWhenUsed="1"/&gt;&lt;w:lsdException w:name="Table Elegant" w:semiHidden="1" w:unhideWhenUsed="1"/&gt;&lt;w:lsdException w:name="Table Professional" w:semiHidden="1" w:unhideWhenUsed="1"/&gt;&lt;w:lsdException w:name="Table Subtle 1" w:semiHidden="1" w:unhideWhenUsed="1"/&gt;&lt;w:lsdException w:name="Table Subtle 2" w:semiHidden="1" w:unhideWhenUsed="1"/&gt;&lt;w:lsdException w:name="Table Web 1" w:semiHidden="1" w:unhideWhenUsed="1"/&gt;&lt;w:lsdException w:name="Table Web 2" w:semiHidden="1" w:unhideWhenUsed="1"/&gt;&lt;w:lsdException w:name="Table Web 3" w:semiHidden="1" w:unhideWhenUsed="1"/&gt;&lt;w:lsdException w:name="Balloon Text" w:semiHidden="1" w:unhideWhenUsed="1"/&gt;&lt;w:lsdException w:name="Table Grid" w:uiPriority="39"/&gt;&lt;w:lsdException w:name="Table Theme" w:semiHidden="1" w:unhideWhenUsed="1"/&gt;&lt;w:lsdException w:name="Placeholder Text" w:semiHidden="1"/&gt;&lt;w:lsdException w:name="No Spacing" w:uiPriority="1" w:qFormat="1"/&gt;&lt;w:lsdException w:name="Light Shading" w:uiPriority="60"/&gt;&lt;w:lsdException w:name="Light List" w:uiPriority="61"/&gt;&lt;w:lsdException w:name="Light Grid" w:uiPriority="62"/&gt;&lt;w:lsdException w:name="Medium Shading 1" w:uiPriority="63"/&gt;&lt;w:lsdException w:name="Medium Shading 2" w:uiPriority="64"/&gt;&lt;w:lsdException w:name="Medium List 1" w:uiPriority="65"/&gt;&lt;w:lsdException w:name="Medium List 2" w:uiPriority="66"/&gt;&lt;w:lsdException w:name="Medium Grid 1" w:uiPriority="67"/&gt;&lt;w:lsdException w:name="Medium Grid 2" w:uiPriority="68"/&gt;&lt;w:lsdException w:name="Medium Grid 3" w:uiPriority="69"/&gt;&lt;w:lsdException w:name="Dark List" w:uiPriority="70"/&gt;&lt;w:lsdException w:name="Colorful Shading" w:uiPriority="71"/&gt;&lt;w:lsdException w:name="Colorful List" w:uiPriority="72"/&gt;&lt;w:lsdException w:name="Colorful Grid" w:uiPriority="73"/&gt;&lt;w:lsdException w:name="Light Shading Accent 1" w:uiPriority="60"/&gt;&lt;w:lsdException w:name="Light List Accent 1" w:uiPriority="61"/&gt;&lt;w:lsdException w:name="Light Grid Accent 1" w:uiPriority="62"/&gt;&lt;w:lsdException w:name="Medium Shading 1 Accent 1" w:uiPriority="63"/&gt;&lt;w:lsdException w:name="Medium Shading 2 Accent 1" w:uiPriority="64"/&gt;&lt;w:lsdException w:name="Medium List 1 Accent 1" w:uiPriority="65"/&gt;&lt;w:lsdException w:name="Revision" w:semiHidden="1"/&gt;&lt;w:lsdException w:name="List Paragraph" w:uiPriority="34" w:qFormat="1"/&gt;&lt;w:lsdException w:name="Quote" w:uiPriority="29" w:qFormat="1"/&gt;&lt;w:lsdException w:name="Intense Quote" w:uiPriority="30" w:qFormat="1"/&gt;&lt;w:lsdException w:name="Medium List 2 Accent 1" w:uiPriority="66"/&gt;&lt;w:lsdException w:name="Medium Grid 1 Accent 1" w:uiPriority="67"/&gt;&lt;w:lsdException w:name="Medium Grid 2 Accent 1" w:uiPriority="68"/&gt;&lt;w:lsdException w:name="Medium Grid 3 Accent 1" w:uiPriority="69"/&gt;&lt;w:lsdException w:name="Dark List Accent 1" w:uiPriority="70"/&gt;&lt;w:lsdException w:name="Colorful Shading Accent 1" w:uiPriority="71"/&gt;&lt;w:lsdException w:name="Colorful List Accent 1" w:uiPriority="72"/&gt;&lt;w:lsdException w:name="Colorful Grid Accent 1" w:uiPriority="73"/&gt;&lt;w:lsdException w:name="Light Shading Accent 2" w:uiPriority="60"/&gt;&lt;w:lsdException w:name="Light List Accent 2" w:uiPriority="61"/&gt;&lt;w:lsdException w:name="Light Grid Accent 2" w:uiPriority="62"/&gt;&lt;w:lsdException w:name="Medium Shading 1 Accent 2" w:uiPriority="63"/&gt;&lt;w:lsdException w:name="Medium Shading 2 Accent 2" w:uiPriority="64"/&gt;&lt;w:lsdException w:name="Medium List 1 Accent 2" w:uiPriority="65"/&gt;&lt;w:lsdException w:name="Medium List 2 Accent 2" w:uiPriority="66"/&gt;&lt;w:lsdException w:name="Medium Grid 1 Accent 2" w:uiPriority="67"/&gt;&lt;w:lsdException w:name="Medium Grid 2 Accent 2" w:uiPriority="68"/&gt;&lt;w:lsdException w:name="Medium Grid 3 Accent 2" w:uiPriority="69"/&gt;&lt;w:lsdException w:name="Dark List Accent 2" w:uiPriority="70"/&gt;&lt;w:lsdException w:name="Colorful Shading Accent 2" w:uiPriority="71"/&gt;&lt;w:lsdException w:name="Colorful List Accent 2" w:uiPriority="72"/&gt;&lt;w:lsdException w:name="Colorful Grid Accent 2" w:uiPriority="73"/&gt;&lt;w:lsdException w:name="Light Shading Accent 3" w:uiPriority="60"/&gt;&lt;w:lsdException w:name="Light List Accent 3" w:uiPriority="61"/&gt;&lt;w:lsdException w:name="Light Grid Accent 3" w:uiPriority="62"/&gt;&lt;w:lsdException w:name="Medium Shading 1 Accent 3" w:uiPriority="63"/&gt;&lt;w:lsdException w:name="Medium Shading 2 Accent 3" w:uiPriority="64"/&gt;&lt;w:lsdException w:name="Medium List 1 Accent 3" w:uiPriority="65"/&gt;&lt;w:lsdException w:name="Medium List 2 Accent 3" w:uiPriority="66"/&gt;&lt;w:lsdException w:name="Medium Grid 1 Accent 3" w:uiPriority="67"/&gt;&lt;w:lsdException w:name="Medium Grid 2 Accent 3" w:uiPriority="68"/&gt;&lt;w:lsdException w:name="Medium Grid 3 Accent 3" w:uiPriority="69"/&gt;&lt;w:lsdException w:name="Dark List Accent 3" w:uiPriority="70"/&gt;&lt;w:lsdException w:name="Colorful Shading Accent 3" w:uiPriority="71"/&gt;&lt;w:lsdException w:name="Colorful List Accent 3" w:uiPriority="72"/&gt;&lt;w:lsdException w:name="Colorful Grid Accent 3" w:uiPriority="73"/&gt;&lt;w:lsdException w:name="Light Shading Accent 4" w:uiPriority="60"/&gt;&lt;w:lsdException w:name="Light List Accent 4" w:uiPriority="61"/&gt;&lt;w:lsdException w:name="Light Grid Accent 4" w:uiPriority="62"/&gt;&lt;w:lsdException w:name="Medium Shading 1 Accent 4" w:uiPriority="63"/&gt;&lt;w:lsdException w:name="Medium Shading 2 Accent 4" w:uiPriority="64"/&gt;&lt;w:lsdException w:name="Medium List 1 Accent 4" w:uiPriority="65"/&gt;&lt;w:lsdException w:name="Medium List 2 Accent 4" w:uiPriority="66"/&gt;&lt;w:lsdException w:name="Medium Grid 1 Accent 4" w:uiPriority="67"/&gt;&lt;w:lsdException w:name="Medium Grid 2 Accent 4" w:uiPriority="68"/&gt;&lt;w:lsdException w:name="Medium Grid 3 Accent 4" w:uiPriority="69"/&gt;&lt;w:lsdException w:name="Dark List Accent 4" w:uiPriority="70"/&gt;&lt;w:lsdException w:name="Colorful Shading Accent 4" w:uiPriority="71"/&gt;&lt;w:lsdException w:name="Colorful List Accent 4" w:uiPriority="72"/&gt;&lt;w:lsdException w:name="Colorful Grid Accent 4" w:uiPriority="73"/&gt;&lt;w:lsdException w:name="Light Shading Accent 5" w:uiPriority="60"/&gt;&lt;w:lsdException w:name="Light List Accent 5" w:uiPriority="61"/&gt;&lt;w:lsdException w:name="Light Grid Accent 5" w:uiPriority="62"/&gt;&lt;w:lsdException w:name="Medium Shading 1 Accent 5" w:uiPriority="63"/&gt;&lt;w:lsdException w:name="Medium Shading 2 Accent 5" w:uiPriority="64"/&gt;&lt;w:lsdException w:name="Medium List 1 Accent 5" w:uiPriority="65"/&gt;&lt;w:lsdException w:name="Medium List 2 Accent 5" w:uiPriority="66"/&gt;&lt;w:lsdException w:name="Medium Grid 1 Accent 5" w:uiPriority="67"/&gt;&lt;w:lsdException w:name="Medium Grid 2 Accent 5" w:uiPriority="68"/&gt;&lt;w:lsdException w:name="Medium Grid 3 Accent 5" w:uiPriority="69"/&gt;&lt;w:lsdException w:name="Dark List Accent 5" w:uiPriority="70"/&gt;&lt;w:lsdException w:name="Colorful Shading Accent 5" w:uiPriority="71"/&gt;&lt;w:lsdException w:name="Colorful List Accent 5" w:uiPriority="72"/&gt;&lt;w:lsdException w:name="Colorful Grid Accent 5" w:uiPriority="73"/&gt;&lt;w:lsdException w:name="Light Shading Accent 6" w:uiPriority="60"/&gt;&lt;w:lsdException w:name="Light List Accent 6" w:uiPriority="61"/&gt;&lt;w:lsdException w:name="Light Grid Accent 6" w:uiPriority="62"/&gt;&lt;w:lsdException w:name="Medium Shading 1 Accent 6" w:uiPriority="63"/&gt;&lt;w:lsdException w:name="Medium Shading 2 Accent 6" w:uiPriority="64"/&gt;&lt;w:lsdException w:name="Medium List 1 Accent 6" w:uiPriority="65"/&gt;&lt;w:lsdException w:name="Medium List 2 Accent 6" w:uiPriority="66"/&gt;&lt;w:lsdException w:name="Medium Grid 1 Accent 6" w:uiPriority="67"/&gt;&lt;w:lsdException w:name="Medium Grid 2 Accent 6" w:uiPriority="68"/&gt;&lt;w:lsdException w:name="Medium Grid 3 Accent 6" w:uiPriority="69"/&gt;&lt;w:lsdException w:name="Dark List Accent 6" w:uiPriority="70"/&gt;&lt;w:lsdException w:name="Colorful Shading Accent 6" w:uiPriority="71"/&gt;&lt;w:lsdException w:name="Colorful List Accent 6" w:uiPriority="72"/&gt;&lt;w:lsdException w:name="Colorful Grid Accent 6" w:uiPriority="73"/&gt;&lt;w:lsdException w:name="Subtle Emphasis" w:uiPriority="19" w:qFormat="1"/&gt;&lt;w:lsdException w:name="Intense Emphasis" w:uiPriority="21" w:qFormat="1"/&gt;&lt;w:lsdException w:name="Subtle Reference" w:uiPriority="31" w:qFormat="1"/&gt;&lt;w:lsdException w:name="Intense Reference" w:uiPriority="32" w:qFormat="1"/&gt;&lt;w:lsdException w:name="Book Title" w:uiPriority="33" w:qFormat="1"/&gt;&lt;w:lsdException w:name="Bibliography" w:semiHidden="1" w:uiPriority="37" w:unhideWhenUsed="1"/&gt;&lt;w:lsdException w:name="TOC Heading" w:semiHidden="1" w:uiPriority="39" w:unhideWhenUsed="1" w:qFormat="1"/&gt;&lt;w:lsdException w:name="Plain Table 1" w:uiPriority="41"/&gt;&lt;w:lsdException w:name="Plain Table 2" w:uiPriority="42"/&gt;&lt;w:lsdException w:name="Plain Table 3" w:uiPriority="43"/&gt;&lt;w:lsdException w:name="Plain Table 4" w:uiPriority="44"/&gt;&lt;w:lsdException w:name="Plain Table 5" w:uiPriority="45"/&gt;&lt;w:lsdException w:name="Grid Table Light" w:uiPriority="40"/&gt;&lt;w:lsdException w:name="Grid Table 1 Light" w:uiPriority="46"/&gt;&lt;w:lsdException w:name="Grid Table 2" w:uiPriority="47"/&gt;&lt;w:lsdException w:name="Grid Table 3" w:uiPriority="48"/&gt;&lt;w:lsdException w:name="Grid Table 4" w:uiPriority="49"/&gt;&lt;w:lsdException w:name="Grid Table 5 Dark" w:uiPriority="50"/&gt;&lt;w:lsdException w:name="Grid Table 6 Colorful" w:uiPriority="51"/&gt;&lt;w:lsdException w:name="Grid Table 7 Colorful" w:uiPriority="52"/&gt;&lt;w:lsdException w:name="Grid Table 1 Light Accent 1" w:uiPriority="46"/&gt;&lt;w:lsdException w:name="Grid Table 2 Accent 1" w:uiPriority="47"/&gt;&lt;w:lsdException w:name="Grid Table 3 Accent 1" w:uiPriority="48"/&gt;&lt;w:lsdException w:name="Grid Table 4 Accent 1" w:uiPriority="49"/&gt;&lt;w:lsdException w:name="Grid Table 5 Dark Accent 1" w:uiPriority="50"/&gt;&lt;w:lsdException w:name="Grid Table 6 Colorful Accent 1" w:uiPriority="51"/&gt;&lt;w:lsdException w:name="Grid Table 7 Colorful Accent 1" w:uiPriority="52"/&gt;&lt;w:lsdException w:name="Grid Table 1 Light Accent 2" w:uiPriority="46"/&gt;&lt;w:lsdException w:name="Grid Table 2 Accent 2" w:uiPriority="47"/&gt;&lt;w:lsdException w:name="Grid Table 3 Accent 2" w:uiPriority="48"/&gt;&lt;w:lsdException w:name="Grid Table 4 Accent 2" w:uiPriority="49"/&gt;&lt;w:lsdException w:name="Grid Table 5 Dark Accent 2" w:uiPriority="50"/&gt;&lt;w:lsdException w:name="Grid Table 6 Colorful Accent 2" w:uiPriority="51"/&gt;&lt;w:lsdException w:name="Grid Table 7 Colorful Accent 2" w:uiPriority="52"/&gt;&lt;w:lsdException w:name="Grid Table 1 Light Accent 3" w:uiPriority="46"/&gt;&lt;w:lsdException w:name="Grid Table 2 Accent 3" w:uiPriority="47"/&gt;&lt;w:lsdException w:name="Grid Table 3 Accent 3" w:uiPriority="48"/&gt;&lt;w:lsdException w:name="Grid Table 4 Accent 3" w:uiPriority="49"/&gt;&lt;w:lsdException w:name="Grid Table 5 Dark Accent 3" w:uiPriority="50"/&gt;&lt;w:lsdException w:name="Grid Table 6 Colorful Accent 3" w:uiPriority="51"/&gt;&lt;w:lsdException w:name="Grid Table 7 Colorful Accent 3" w:uiPriority="52"/&gt;&lt;w:lsdException w:name="Grid Table 1 Light Accent 4" w:uiPriority="46"/&gt;&lt;w:lsdException w:name="Grid Table 2 Accent 4" w:uiPriority="47"/&gt;&lt;w:lsdException w:name="Grid Table 3 Accent 4" w:uiPriority="48"/&gt;&lt;w:lsdException w:name="Grid Table 4 Accent 4" w:uiPriority="49"/&gt;&lt;w:lsdException w:name="Grid Table 5 Dark Accent 4" w:uiPriority="50"/&gt;&lt;w:lsdException w:name="Grid Table 6 Colorful Accent 4" w:uiPriority="51"/&gt;&lt;w:lsdException w:name="Grid Table 7 Colorful Accent 4" w:uiPriority="52"/&gt;&lt;w:lsdException w:name="Grid Table 1 Light Accent 5" w:uiPriority="46"/&gt;&lt;w:lsdException w:name="Grid Table 2 Accent 5" w:uiPriority="47"/&gt;&lt;w:lsdException w:name="Grid Table 3 Accent 5" w:uiPriority="48"/&gt;&lt;w:lsdException w:name="Grid Table 4 Accent 5" w:uiPriority="49"/&gt;&lt;w:lsdException w:name="Grid Table 5 Dark Accent 5" w:uiPriority="50"/&gt;&lt;w:lsdException w:name="Grid Table 6 Colorful Accent 5" w:uiPriority="51"/&gt;&lt;w:lsdException w:name="Grid Table 7 Colorful Accent 5" w:uiPriority="52"/&gt;&lt;w:lsdException w:name="Grid Table 1 Light Accent 6" w:uiPriority="46"/&gt;&lt;w:lsdException w:name="Grid Table 2 Accent 6" w:uiPriority="47"/&gt;&lt;w:lsdException w:name="Grid Table 3 Accent 6" w:uiPriority="48"/&gt;&lt;w:lsdException w:name="Grid Table 4 Accent 6" w:uiPriority="49"/&gt;&lt;w:lsdException w:name="Grid Table 5 Dark Accent 6" w:uiPriority="50"/&gt;&lt;w:lsdException w:name="Grid Table 6 Colorful Accent 6" w:uiPriority="51"/&gt;&lt;w:lsdException w:name="Grid Table 7 Colorful Accent 6" w:uiPriority="52"/&gt;&lt;w:lsdException w:name="List Table 1 Light" w:uiPriority="46"/&gt;&lt;w:lsdException w:name="List Table 2" w:uiPriority="47"/&gt;&lt;w:lsdException w:name="List Table 3" w:uiPriority="48"/&gt;&lt;w:lsdException w:name="List Table 4" w:uiPriority="49"/&gt;&lt;w:lsdException w:name="List Table 5 Dark" w:uiPriority="50"/&gt;&lt;w:lsdException w:name="List Table 6 Colorful" w:uiPriority="51"/&gt;&lt;w:lsdException w:name="List Table 7 Colorful" w:uiPriority="52"/&gt;&lt;w:lsdException w:name="List Table 1 Light Accent 1" w:uiPriority="46"/&gt;&lt;w:lsdException w:name="List Table 2 Accent 1" w:uiPriority="47"/&gt;&lt;w:lsdException w:name="List Table 3 Accent 1" w:uiPriority="48"/&gt;&lt;w:lsdException w:name="List Table 4 Accent 1" w:uiPriority="49"/&gt;&lt;w:lsdException w:name="List Table 5 Dark Accent 1" w:uiPriority="50"/&gt;&lt;w:lsdException w:name="List Table 6 Colorful Accent 1" w:uiPriority="51"/&gt;&lt;w:lsdException w:name="List Table 7 Colorful Accent 1" w:uiPriority="52"/&gt;&lt;w:lsdException w:name="List Table 1 Light Accent 2" w:uiPriority="46"/&gt;&lt;w:lsdException w:name="List Table 2 Accent 2" w:uiPriority="47"/&gt;&lt;w:lsdException w:name="List Table 3 Accent 2" w:uiPriority="48"/&gt;&lt;w:lsdException w:name="List Table 4 Accent 2" w:uiPriority="49"/&gt;&lt;w:lsdException w:name="List Table 5 Dark Accent 2" w:uiPriority="50"/&gt;&lt;w:lsdException w:name="List Table 6 Colorful Accent 2" w:uiPriority="51"/&gt;&lt;w:lsdException w:name="List Table 7 Colorful Accent 2" w:uiPriority="52"/&gt;&lt;w:lsdException w:name="List Table 1 Light Accent 3" w:uiPriority="46"/&gt;&lt;w:lsdException w:name="List Table 2 Accent 3" w:uiPriority="47"/&gt;&lt;w:lsdException w:name="List Table 3 Accent 3" w:uiPriority="48"/&gt;&lt;w:lsdException w:name="List Table 4 Accent 3" w:uiPriority="49"/&gt;&lt;w:lsdException w:name="List Table 5 Dark Accent 3" w:uiPriority="50"/&gt;&lt;w:lsdException w:name="List Table 6 Colorful Accent 3" w:uiPriority="51"/&gt;&lt;w:lsdException w:name="List Table 7 Colorful Accent 3" w:uiPriority="52"/&gt;&lt;w:lsdException w:name="List Table 1 Light Accent 4" w:uiPriority="46"/&gt;&lt;w:lsdException w:name="List Table 2 Accent 4" w:uiPriority="47"/&gt;&lt;w:lsdException w:name="List Table 3 Accent 4" w:uiPriority="48"/&gt;&lt;w:lsdException w:name="List Table 4 Accent 4" w:uiPriority="49"/&gt;&lt;w:lsdException w:name="List Table 5 Dark Accent 4" w:uiPriority="50"/&gt;&lt;w:lsdException w:name="List Table 6 Colorful Accent 4" w:uiPriority="51"/&gt;&lt;w:lsdException w:name="List Table 7 Colorful Accent 4" w:uiPriority="52"/&gt;&lt;w:lsdException w:name="List Table 1 Light Accent 5" w:uiPriority="46"/&gt;&lt;w:lsdException w:name="List Table 2 Accent 5" w:uiPriority="47"/&gt;&lt;w:lsdException w:name="List Table 3 Accent 5" w:uiPriority="48"/&gt;&lt;w:lsdException w:name="List Table 4 Accent 5" w:uiPriority="49"/&gt;&lt;w:lsdException w:name="List Table 5 Dark Accent 5" w:uiPriority="50"/&gt;&lt;w:lsdException w:name="List Table 6 Colorful Accent 5" w:uiPriority="51"/&gt;&lt;w:lsdException w:name="List Table 7 Colorful Accent 5" w:uiPriority="52"/&gt;&lt;w:lsdException w:name="List Table 1 Light Accent 6" w:uiPriority="46"/&gt;&lt;w:lsdException w:name="List Table 2 Accent 6" w:uiPriority="47"/&gt;&lt;w:lsdException w:name="List Table 3 Accent 6" w:uiPriority="48"/&gt;&lt;w:lsdException w:name="List Table 4 Accent 6" w:uiPriority="49"/&gt;&lt;w:lsdException w:name="List Table 5 Dark Accent 6" w:uiPriority="50"/&gt;&lt;w:lsdException w:name="List Table 6 Colorful Accent 6" w:uiPriority="51"/&gt;&lt;w:lsdException w:name="List Table 7 Colorful Accent 6" w:uiPriority="52"/&gt;&lt;w:lsdException w:name="Mention" w:semiHidden="1" w:unhideWhenUsed="1"/&gt;&lt;w:lsdException w:name="Smart Hyperlink" w:semiHidden="1" w:unhideWhenUsed="1"/&gt;&lt;w:lsdException w:name="Hashtag" w:semiHidden="1" w:unhideWhenUsed="1"/&gt;&lt;/w:latentStyles&gt;&lt;w:style w:type="paragraph" w:default="1" w:styleId="Normal"&gt;&lt;w:name w:val="Normal"/&gt;&lt;w:qFormat/&gt;&lt;/w:style&gt;&lt;w:style w:type="character" w:default="1" w:styleId="DefaultParagraphFont"&gt;&lt;w:name w:val="Default Paragraph Font"/&gt;&lt;w:uiPriority w:val="1"/&gt;&lt;w:semiHidden/&gt;&lt;w:unhideWhenUsed/&gt;&lt;/w:style&gt;&lt;w:style w:type="table" w:default="1" w:styleId="TableNormal"&gt;&lt;w:name w:val="Normal Table"/&gt;&lt;w:uiPriority w:val="99"/&gt;&lt;w:semiHidden/&gt;&lt;w:unhideWhenUsed/&gt;&lt;w:tblPr&gt;&lt;w:tblInd w:w="0" w:type="dxa"/&gt;&lt;w:tblCellMar&gt;&lt;w:top w:w="0" w:type="dxa"/&gt;&lt;w:left w:w="108" w:type="dxa"/&gt;&lt;w:bottom w:w="0" w:type="dxa"/&gt;&lt;w:right w:w="108" w:type="dxa"/&gt;&lt;/w:tblCellMar&gt;&lt;/w:tblPr&gt;&lt;/w:style&gt;&lt;w:style w:type="numbering" w:default="1" w:styleId="NoList"&gt;&lt;w:name w:val="No List"/&gt;&lt;w:uiPriority w:val="99"/&gt;&lt;w:semiHidden/&gt;&lt;w:unhideWhenUsed/&gt;&lt;/w:style&gt;&lt;w:style w:type="character" w:styleId="PlaceholderText"&gt;&lt;w:name w:val="Placeholder Text"/&gt;&lt;w:basedOn w:val="DefaultParagraphFont"/&gt;&lt;w:uiPriority w:val="99"/&gt;&lt;w:rPr&gt;&lt;w:color w:val="7F7F7F" w:themeColor="text1" w:themeTint="80"/&gt;&lt;w:bdr w:val="none" w:sz="0" w:space="0" w:color="auto"/&gt;&lt;w:shd w:val="clear" w:color="auto" w:fill="F0F0F0"/&gt;&lt;/w:rPr&gt;&lt;/w:style&gt;&lt;w:style w:type="paragraph" w:customStyle="1" w:styleId="B7CF53EBD28C4270BBC51AAB20A1C895"&gt;&lt;w:name w:val="B7CF53EBD28C4270BBC51AAB20A1C895"/&gt;&lt;/w:style&gt;&lt;/w:styles&gt;&lt;/pkg:xmlData&gt;&lt;/pkg:part&gt;&lt;pkg:part pkg:name="/word/styles.xml" pkg:contentType="application/vnd.openxmlformats-officedocument.wordprocessingml.styles+xml"&gt;&lt;pkg:xmlData&gt;&lt;w:styles xmlns:mc="http://schemas.openxmlformats.org/markup-compatibility/2006" xmlns:r="http://schemas.openxmlformats.org/officeDocument/2006/relationships" xmlns:w="http://schemas.openxmlformats.org/wordprocessingml/2006/main" xmlns:w14="http://schemas.microsoft.com/office/word/2010/wordml" xmlns:w15="http://schemas.microsoft.com/office/word/2012/wordml" xmlns:w16se="http://schemas.microsoft.com/office/word/2015/wordml/symex" mc:Ignorable="w14 w15 w16se"&gt;&lt;w:docDefaults&gt;&lt;w:rPrDefault&gt;&lt;w:rPr&gt;&lt;w:rFonts w:asciiTheme="minorHAnsi" w:eastAsiaTheme="minorEastAsia" w:hAnsiTheme="minorHAnsi" w:cstheme="minorBidi"/&gt;&lt;w:sz w:val="19"/&gt;&lt;w:szCs w:val="19"/&gt;&lt;w:lang w:val="sv-SE" w:eastAsia="en-US" w:bidi="ar-SA"/&gt;&lt;/w:rPr&gt;&lt;/w:rPrDefault&gt;&lt;w:pPrDefault&gt;&lt;w:pPr&gt;&lt;w:spacing w:after="160" w:line="288" w:lineRule="auto"/&gt;&lt;/w:pPr&gt;&lt;/w:pPrDefault&gt;&lt;/w:docDefaults&gt;&lt;w:style w:type="paragraph" w:default="1" w:styleId="Normal"&gt;&lt;w:name w:val="Normal"/&gt;&lt;w:qFormat/&gt;&lt;w:rsid w:val="005F186C"/&gt;&lt;w:pPr&gt;&lt;w:spacing w:after="200"/&gt;&lt;/w:pPr&gt;&lt;w:rPr&gt;&lt;w:sz w:val="20"/&gt;&lt;w:lang w:val="en-GB"/&gt;&lt;/w:rPr&gt;&lt;/w:style&gt;&lt;w:style w:type="paragraph" w:styleId="Heading1"&gt;&lt;w:name w:val="heading 1"/&gt;&lt;w:basedOn w:val="Normal"/&gt;&lt;w:next w:val="Normal"/&gt;&lt;w:link w:val="Heading1Char"/&gt;&lt;w:uiPriority w:val="9"/&gt;&lt;w:qFormat/&gt;&lt;w:rsid w:val="000C3604"/&gt;&lt;w:pPr&gt;&lt;w:keepNext/&gt;&lt;w:keepLines/&gt;&lt;w:spacing w:before="240"/&gt;&lt;w:outlineLvl w:val="0"/&gt;&lt;/w:pPr&gt;&lt;w:rPr&gt;&lt;w:rFonts w:asciiTheme="majorHAnsi" w:eastAsiaTheme="majorEastAsia" w:hAnsiTheme="majorHAnsi" w:cstheme="majorBidi"/&gt;&lt;w:bCs/&gt;&lt;w:sz w:val="28"/&gt;&lt;w:szCs w:val="28"/&gt;&lt;/w:rPr&gt;&lt;/w:style&gt;&lt;w:style w:type="paragraph" w:styleId="Heading2"&gt;&lt;w:name w:val="heading 2"/&gt;&lt;w:basedOn w:val="Normal"/&gt;&lt;w:next w:val="Normal"/&gt;&lt;w:link w:val="Heading2Char"/&gt;&lt;w:uiPriority w:val="9"/&gt;&lt;w:qFormat/&gt;&lt;w:rsid w:val="000C3604"/&gt;&lt;w:pPr&gt;&lt;w:keepNext/&gt;&lt;w:keepLines/&gt;&lt;w:spacing w:before="240" w:after="80"/&gt;&lt;w:outlineLvl w:val="1"/&gt;&lt;/w:pPr&gt;&lt;w:rPr&gt;&lt;w:rFonts w:ascii="GothamMedium" w:eastAsiaTheme="majorEastAsia" w:hAnsi="GothamMedium" w:cstheme="majorBidi"/&gt;&lt;w:bCs/&gt;&lt;w:sz w:val="24"/&gt;&lt;w:szCs w:val="28"/&gt;&lt;/w:rPr&gt;&lt;/w:style&gt;&lt;w:style w:type="paragraph" w:styleId="Heading3"&gt;&lt;w:name w:val="heading 3"/&gt;&lt;w:basedOn w:val="Normal"/&gt;&lt;w:next w:val="Normal"/&gt;&lt;w:link w:val="Heading3Char"/&gt;&lt;w:uiPriority w:val="9"/&gt;&lt;w:qFormat/&gt;&lt;w:rsid w:val="00872413"/&gt;&lt;w:pPr&gt;&lt;w:keepNext/&gt;&lt;w:keepLines/&gt;&lt;w:spacing w:before="120" w:after="40"/&gt;&lt;w:outlineLvl w:val="2"/&gt;&lt;/w:pPr&gt;&lt;w:rPr&gt;&lt;w:rFonts w:ascii="GothamMedium" w:eastAsiaTheme="majorEastAsia" w:hAnsi="GothamMedium" w:cstheme="majorBidi"/&gt;&lt;w:sz w:val="22"/&gt;&lt;w:szCs w:val="24"/&gt;&lt;/w:rPr&gt;&lt;/w:style&gt;&lt;w:style w:type="paragraph" w:styleId="Heading4"&gt;&lt;w:name w:val="heading 4"/&gt;&lt;w:basedOn w:val="Normal"/&gt;&lt;w:next w:val="Normal"/&gt;&lt;w:link w:val="Heading4Char"/&gt;&lt;w:uiPriority w:val="9"/&gt;&lt;w:semiHidden/&gt;&lt;w:qFormat/&gt;&lt;w:rsid w:val="00872413"/&gt;&lt;w:pPr&gt;&lt;w:keepNext/&gt;&lt;w:keepLines/&gt;&lt;w:spacing w:before="120" w:after="40"/&gt;&lt;w:outlineLvl w:val="3"/&gt;&lt;/w:pPr&gt;&lt;w:rPr&gt;&lt;w:rFonts w:ascii="GothamMedium" w:eastAsiaTheme="majorEastAsia" w:hAnsi="GothamMedium" w:cstheme="majorBidi"/&gt;&lt;w:iCs/&gt;&lt;w:szCs w:val="24"/&gt;&lt;/w:rPr&gt;&lt;/w:style&gt;&lt;w:style w:type="paragraph" w:styleId="Heading5"&gt;&lt;w:name w:val="heading 5"/&gt;&lt;w:basedOn w:val="Normal"/&gt;&lt;w:next w:val="Normal"/&gt;&lt;w:link w:val="Heading5Char"/&gt;&lt;w:uiPriority w:val="9"/&gt;&lt;w:semiHidden/&gt;&lt;w:qFormat/&gt;&lt;w:rsid w:val="009B1B65"/&gt;&lt;w:pPr&gt;&lt;w:keepNext/&gt;&lt;w:keepLines/&gt;&lt;w:numPr&gt;&lt;w:ilvl w:val="4"/&gt;&lt;w:numId w:val="15"/&gt;&lt;/w:numPr&gt;&lt;w:spacing w:before="120" w:after="0"/&gt;&lt;w:outlineLvl w:val="4"/&gt;&lt;/w:pPr&gt;&lt;w:rPr&gt;&lt;w:rFonts w:asciiTheme="majorHAnsi" w:eastAsiaTheme="majorEastAsia" w:hAnsiTheme="majorHAnsi" w:cstheme="majorBidi"/&gt;&lt;w:b/&gt;&lt;w:bCs/&gt;&lt;/w:rPr&gt;&lt;/w:style&gt;&lt;w:style w:type="paragraph" w:styleId="Heading6"&gt;&lt;w:name w:val="heading 6"/&gt;&lt;w:basedOn w:val="Normal"/&gt;&lt;w:next w:val="Normal"/&gt;&lt;w:link w:val="Heading6Char"/&gt;&lt;w:uiPriority w:val="9"/&gt;&lt;w:semiHidden/&gt;&lt;w:rsid w:val="009B1B65"/&gt;&lt;w:pPr&gt;&lt;w:keepNext/&gt;&lt;w:keepLines/&gt;&lt;w:numPr&gt;&lt;w:ilvl w:val="5"/&gt;&lt;w:numId w:val="15"/&gt;&lt;/w:numPr&gt;&lt;w:spacing w:before="120" w:after="0"/&gt;&lt;w:outlineLvl w:val="5"/&gt;&lt;/w:pPr&gt;&lt;w:rPr&gt;&lt;w:rFonts w:asciiTheme="majorHAnsi" w:eastAsiaTheme="majorEastAsia" w:hAnsiTheme="majorHAnsi" w:cstheme="majorBidi"/&gt;&lt;w:b/&gt;&lt;w:bCs/&gt;&lt;w:i/&gt;&lt;w:iCs/&gt;&lt;/w:rPr&gt;&lt;/w:style&gt;&lt;w:style w:type="paragraph" w:styleId="Heading7"&gt;&lt;w:name w:val="heading 7"/&gt;&lt;w:basedOn w:val="Normal"/&gt;&lt;w:next w:val="Normal"/&gt;&lt;w:link w:val="Heading7Char"/&gt;&lt;w:uiPriority w:val="9"/&gt;&lt;w:semiHidden/&gt;&lt;w:rsid w:val="009B1B65"/&gt;&lt;w:pPr&gt;&lt;w:keepNext/&gt;&lt;w:keepLines/&gt;&lt;w:numPr&gt;&lt;w:ilvl w:val="6"/&gt;&lt;w:numId w:val="15"/&gt;&lt;/w:numPr&gt;&lt;w:spacing w:before="120" w:after="0"/&gt;&lt;w:outlineLvl w:val="6"/&gt;&lt;/w:pPr&gt;&lt;w:rPr&gt;&lt;w:i/&gt;&lt;w:iCs/&gt;&lt;/w:rPr&gt;&lt;/w:style&gt;&lt;w:style w:type="paragraph" w:styleId="Heading8"&gt;&lt;w:name w:val="heading 8"/&gt;&lt;w:basedOn w:val="Normal"/&gt;&lt;w:next w:val="Normal"/&gt;&lt;w:link w:val="Heading8Char"/&gt;&lt;w:uiPriority w:val="9"/&gt;&lt;w:semiHidden/&gt;&lt;w:rsid w:val="009B1B65"/&gt;&lt;w:pPr&gt;&lt;w:keepNext/&gt;&lt;w:keepLines/&gt;&lt;w:numPr&gt;&lt;w:ilvl w:val="7"/&gt;&lt;w:numId w:val="15"/&gt;&lt;/w:numPr&gt;&lt;w:spacing w:before="120" w:after="0"/&gt;&lt;w:outlineLvl w:val="7"/&gt;&lt;/w:pPr&gt;&lt;w:rPr&gt;&lt;w:b/&gt;&lt;w:bCs/&gt;&lt;/w:rPr&gt;&lt;/w:style&gt;&lt;w:style w:type="paragraph" w:styleId="Heading9"&gt;&lt;w:name w:val="heading 9"/&gt;&lt;w:basedOn w:val="Normal"/&gt;&lt;w:next w:val="Normal"/&gt;&lt;w:link w:val="Heading9Char"/&gt;&lt;w:uiPriority w:val="9"/&gt;&lt;w:semiHidden/&gt;&lt;w:rsid w:val="009B1B65"/&gt;&lt;w:pPr&gt;&lt;w:keepNext/&gt;&lt;w:keepLines/&gt;&lt;w:numPr&gt;&lt;w:ilvl w:val="8"/&gt;&lt;w:numId w:val="15"/&gt;&lt;/w:numPr&gt;&lt;w:spacing w:before="120" w:after="0"/&gt;&lt;w:outlineLvl w:val="8"/&gt;&lt;/w:pPr&gt;&lt;w:rPr&gt;&lt;w:i/&gt;&lt;w:iCs/&gt;&lt;/w:rPr&gt;&lt;/w:style&gt;&lt;w:style w:type="character" w:default="1" w:styleId="DefaultParagraphFont"&gt;&lt;w:name w:val="Default Paragraph Font"/&gt;&lt;w:uiPriority w:val="1"/&gt;&lt;w:semiHidden/&gt;&lt;w:unhideWhenUsed/&gt;&lt;/w:style&gt;&lt;w:style w:type="table" w:default="1" w:styleId="TableNormal"&gt;&lt;w:name w:val="Normal Table"/&gt;&lt;w:uiPriority w:val="99"/&gt;&lt;w:semiHidden/&gt;&lt;w:unhideWhenUsed/&gt;&lt;w:tblPr&gt;&lt;w:tblInd w:w="0" w:type="dxa"/&gt;&lt;w:tblCellMar&gt;&lt;w:top w:w="0" w:type="dxa"/&gt;&lt;w:left w:w="108" w:type="dxa"/&gt;&lt;w:bottom w:w="0" w:type="dxa"/&gt;&lt;w:right w:w="108" w:type="dxa"/&gt;&lt;/w:tblCellMar&gt;&lt;/w:tblPr&gt;&lt;/w:style&gt;&lt;w:style w:type="numbering" w:default="1" w:styleId="NoList"&gt;&lt;w:name w:val="No List"/&gt;&lt;w:uiPriority w:val="99"/&gt;&lt;w:semiHidden/&gt;&lt;w:unhideWhenUsed/&gt;&lt;/w:style&gt;&lt;w:style w:type="character" w:customStyle="1" w:styleId="Heading1Char"&gt;&lt;w:name w:val="Heading 1 Char"/&gt;&lt;w:basedOn w:val="DefaultParagraphFont"/&gt;&lt;w:link w:val="Heading1"/&gt;&lt;w:uiPriority w:val="9"/&gt;&lt;w:rsid w:val="000C3604"/&gt;&lt;w:rPr&gt;&lt;w:rFonts w:asciiTheme="majorHAnsi" w:eastAsiaTheme="majorEastAsia" w:hAnsiTheme="majorHAnsi" w:cstheme="majorBidi"/&gt;&lt;w:bCs/&gt;&lt;w:sz w:val="28"/&gt;&lt;w:szCs w:val="28"/&gt;&lt;w:lang w:val="en-GB"/&gt;&lt;/w:rPr&gt;&lt;/w:style&gt;&lt;w:style w:type="character" w:customStyle="1" w:styleId="Heading2Char"&gt;&lt;w:name w:val="Heading 2 Char"/&gt;&lt;w:basedOn w:val="DefaultParagraphFont"/&gt;&lt;w:link w:val="Heading2"/&gt;&lt;w:uiPriority w:val="9"/&gt;&lt;w:rsid w:val="000C3604"/&gt;&lt;w:rPr&gt;&lt;w:rFonts w:ascii="GothamMedium" w:eastAsiaTheme="majorEastAsia" w:hAnsi="GothamMedium" w:cstheme="majorBidi"/&gt;&lt;w:bCs/&gt;&lt;w:sz w:val="24"/&gt;&lt;w:szCs w:val="28"/&gt;&lt;w:lang w:val="en-GB"/&gt;&lt;/w:rPr&gt;&lt;/w:style&gt;&lt;w:style w:type="character" w:customStyle="1" w:styleId="Heading3Char"&gt;&lt;w:name w:val="Heading 3 Char"/&gt;&lt;w:basedOn w:val="DefaultParagraphFont"/&gt;&lt;w:link w:val="Heading3"/&gt;&lt;w:uiPriority w:val="9"/&gt;&lt;w:rsid w:val="00872413"/&gt;&lt;w:rPr&gt;&lt;w:rFonts w:ascii="GothamMedium" w:eastAsiaTheme="majorEastAsia" w:hAnsi="GothamMedium" w:cstheme="majorBidi"/&gt;&lt;w:sz w:val="22"/&gt;&lt;w:szCs w:val="24"/&gt;&lt;w:lang w:val="en-GB"/&gt;&lt;/w:rPr&gt;&lt;/w:style&gt;&lt;w:style w:type="character" w:customStyle="1" w:styleId="Heading4Char"&gt;&lt;w:name w:val="Heading 4 Char"/&gt;&lt;w:basedOn w:val="DefaultParagraphFont"/&gt;&lt;w:link w:val="Heading4"/&gt;&lt;w:uiPriority w:val="9"/&gt;&lt;w:semiHidden/&gt;&lt;w:rsid w:val="005F186C"/&gt;&lt;w:rPr&gt;&lt;w:rFonts w:ascii="GothamMedium" w:eastAsiaTheme="majorEastAsia" w:hAnsi="GothamMedium" w:cstheme="majorBidi"/&gt;&lt;w:iCs/&gt;&lt;w:sz w:val="20"/&gt;&lt;w:szCs w:val="24"/&gt;&lt;w:lang w:val="en-GB"/&gt;&lt;/w:rPr&gt;&lt;/w:style&gt;&lt;w:style w:type="character" w:customStyle="1" w:styleId="Heading5Char"&gt;&lt;w:name w:val="Heading 5 Char"/&gt;&lt;w:basedOn w:val="DefaultParagraphFont"/&gt;&lt;w:link w:val="Heading5"/&gt;&lt;w:uiPriority w:val="9"/&gt;&lt;w:semiHidden/&gt;&lt;w:rsid w:val="008E716E"/&gt;&lt;w:rPr&gt;&lt;w:rFonts w:asciiTheme="majorHAnsi" w:eastAsiaTheme="majorEastAsia" w:hAnsiTheme="majorHAnsi" w:cstheme="majorBidi"/&gt;&lt;w:b/&gt;&lt;w:bCs/&gt;&lt;w:lang w:val="en-GB"/&gt;&lt;/w:rPr&gt;&lt;/w:style&gt;&lt;w:style w:type="character" w:customStyle="1" w:styleId="Heading6Char"&gt;&lt;w:name w:val="Heading 6 Char"/&gt;&lt;w:basedOn w:val="DefaultParagraphFont"/&gt;&lt;w:link w:val="Heading6"/&gt;&lt;w:uiPriority w:val="9"/&gt;&lt;w:semiHidden/&gt;&lt;w:rsid w:val="008E716E"/&gt;&lt;w:rPr&gt;&lt;w:rFonts w:asciiTheme="majorHAnsi" w:eastAsiaTheme="majorEastAsia" w:hAnsiTheme="majorHAnsi" w:cstheme="majorBidi"/&gt;&lt;w:b/&gt;&lt;w:bCs/&gt;&lt;w:i/&gt;&lt;w:iCs/&gt;&lt;w:lang w:val="en-GB"/&gt;&lt;/w:rPr&gt;&lt;/w:style&gt;&lt;w:style w:type="character" w:customStyle="1" w:styleId="Heading7Char"&gt;&lt;w:name w:val="Heading 7 Char"/&gt;&lt;w:basedOn w:val="DefaultParagraphFont"/&gt;&lt;w:link w:val="Heading7"/&gt;&lt;w:uiPriority w:val="9"/&gt;&lt;w:semiHidden/&gt;&lt;w:rsid w:val="008E716E"/&gt;&lt;w:rPr&gt;&lt;w:i/&gt;&lt;w:iCs/&gt;&lt;w:lang w:val="en-GB"/&gt;&lt;/w:rPr&gt;&lt;/w:style&gt;&lt;w:style w:type="character" w:customStyle="1" w:styleId="Heading8Char"&gt;&lt;w:name w:val="Heading 8 Char"/&gt;&lt;w:basedOn w:val="DefaultParagraphFont"/&gt;&lt;w:link w:val="Heading8"/&gt;&lt;w:uiPriority w:val="9"/&gt;&lt;w:semiHidden/&gt;&lt;w:rsid w:val="008E716E"/&gt;&lt;w:rPr&gt;&lt;w:b/&gt;&lt;w:bCs/&gt;&lt;w:lang w:val="en-GB"/&gt;&lt;/w:rPr&gt;&lt;/w:style&gt;&lt;w:style w:type="character" w:customStyle="1" w:styleId="Heading9Char"&gt;&lt;w:name w:val="Heading 9 Char"/&gt;&lt;w:basedOn w:val="DefaultParagraphFont"/&gt;&lt;w:link w:val="Heading9"/&gt;&lt;w:uiPriority w:val="9"/&gt;&lt;w:semiHidden/&gt;&lt;w:rsid w:val="008E716E"/&gt;&lt;w:rPr&gt;&lt;w:i/&gt;&lt;w:iCs/&gt;&lt;w:lang w:val="en-GB"/&gt;&lt;/w:rPr&gt;&lt;/w:style&gt;&lt;w:style w:type="paragraph" w:styleId="Caption"&gt;&lt;w:name w:val="caption"/&gt;&lt;w:basedOn w:val="Normal"/&gt;&lt;w:next w:val="Normal"/&gt;&lt;w:uiPriority w:val="35"/&gt;&lt;w:semiHidden/&gt;&lt;w:rsid w:val="009B1B65"/&gt;&lt;w:rPr&gt;&lt;w:b/&gt;&lt;w:bCs/&gt;&lt;w:sz w:val="18"/&gt;&lt;w:szCs w:val="18"/&gt;&lt;/w:rPr&gt;&lt;/w:style&gt;&lt;w:style w:type="paragraph" w:styleId="Title"&gt;&lt;w:name w:val="Title"/&gt;&lt;w:basedOn w:val="Normal"/&gt;&lt;w:next w:val="Normal"/&gt;&lt;w:link w:val="TitleChar"/&gt;&lt;w:uiPriority w:val="10"/&gt;&lt;w:semiHidden/&gt;&lt;w:qFormat/&gt;&lt;w:rsid w:val="00872413"/&gt;&lt;w:pPr&gt;&lt;w:spacing w:after="0"/&gt;&lt;w:contextualSpacing/&gt;&lt;/w:pPr&gt;&lt;w:rPr&gt;&lt;w:rFonts w:asciiTheme="majorHAnsi" w:eastAsiaTheme="majorEastAsia" w:hAnsiTheme="majorHAnsi" w:cstheme="majorBidi"/&gt;&lt;w:bCs/&gt;&lt;w:color w:val="407077" w:themeColor="accent1"/&gt;&lt;w:sz w:val="72"/&gt;&lt;w:szCs w:val="48"/&gt;&lt;/w:rPr&gt;&lt;/w:style&gt;&lt;w:style w:type="character" w:customStyle="1" w:styleId="TitleChar"&gt;&lt;w:name w:val="Title Char"/&gt;&lt;w:basedOn w:val="DefaultParagraphFont"/&gt;&lt;w:link w:val="Title"/&gt;&lt;w:uiPriority w:val="10"/&gt;&lt;w:semiHidden/&gt;&lt;w:rsid w:val="005F186C"/&gt;&lt;w:rPr&gt;&lt;w:rFonts w:asciiTheme="majorHAnsi" w:eastAsiaTheme="majorEastAsia" w:hAnsiTheme="majorHAnsi" w:cstheme="majorBidi"/&gt;&lt;w:bCs/&gt;&lt;w:color w:val="407077" w:themeColor="accent1"/&gt;&lt;w:sz w:val="72"/&gt;&lt;w:szCs w:val="48"/&gt;&lt;w:lang w:val="en-GB"/&gt;&lt;/w:rPr&gt;&lt;/w:style&gt;&lt;w:style w:type="paragraph" w:styleId="Subtitle"&gt;&lt;w:name w:val="Subtitle"/&gt;&lt;w:basedOn w:val="Normal"/&gt;&lt;w:next w:val="Normal"/&gt;&lt;w:link w:val="SubtitleChar"/&gt;&lt;w:uiPriority w:val="11"/&gt;&lt;w:semiHidden/&gt;&lt;w:qFormat/&gt;&lt;w:rsid w:val="00872413"/&gt;&lt;w:pPr&gt;&lt;w:numPr&gt;&lt;w:ilvl w:val="1"/&gt;&lt;/w:numPr&gt;&lt;w:spacing w:before="120" w:after="240"/&gt;&lt;/w:pPr&gt;&lt;w:rPr&gt;&lt;w:rFonts w:ascii="GothamMedium" w:eastAsiaTheme="majorEastAsia" w:hAnsi="GothamMedium" w:cstheme="majorBidi"/&gt;&lt;w:color w:val="343436" w:themeColor="text2"/&gt;&lt;w:sz w:val="24"/&gt;&lt;w:szCs w:val="24"/&gt;&lt;/w:rPr&gt;&lt;/w:style&gt;&lt;w:style w:type="character" w:customStyle="1" w:styleId="SubtitleChar"&gt;&lt;w:name w:val="Subtitle Char"/&gt;&lt;w:basedOn w:val="DefaultParagraphFont"/&gt;&lt;w:link w:val="Subtitle"/&gt;&lt;w:uiPriority w:val="11"/&gt;&lt;w:semiHidden/&gt;&lt;w:rsid w:val="005F186C"/&gt;&lt;w:rPr&gt;&lt;w:rFonts w:ascii="GothamMedium" w:eastAsiaTheme="majorEastAsia" w:hAnsi="GothamMedium" w:cstheme="majorBidi"/&gt;&lt;w:color w:val="343436" w:themeColor="text2"/&gt;&lt;w:sz w:val="24"/&gt;&lt;w:szCs w:val="24"/&gt;&lt;w:lang w:val="en-GB"/&gt;&lt;/w:rPr&gt;&lt;/w:style&gt;&lt;w:style w:type="character" w:styleId="Strong"&gt;&lt;w:name w:val="Strong"/&gt;&lt;w:basedOn w:val="DefaultParagraphFont"/&gt;&lt;w:uiPriority w:val="22"/&gt;&lt;w:semiHidden/&gt;&lt;w:rsid w:val="009B1B65"/&gt;&lt;w:rPr&gt;&lt;w:b/&gt;&lt;w:bCs/&gt;&lt;w:color w:val="auto"/&gt;&lt;/w:rPr&gt;&lt;/w:style&gt;&lt;w:style w:type="character" w:styleId="Emphasis"&gt;&lt;w:name w:val="Emphasis"/&gt;&lt;w:basedOn w:val="DefaultParagraphFont"/&gt;&lt;w:uiPriority w:val="20"/&gt;&lt;w:semiHidden/&gt;&lt;w:rsid w:val="009B1B65"/&gt;&lt;w:rPr&gt;&lt;w:i/&gt;&lt;w:iCs/&gt;&lt;w:color w:val="auto"/&gt;&lt;/w:rPr&gt;&lt;/w:style&gt;&lt;w:style w:type="paragraph" w:styleId="NoSpacing"&gt;&lt;w:name w:val="No Spacing"/&gt;&lt;w:link w:val="NoSpacingChar"/&gt;&lt;w:uiPriority w:val="1"/&gt;&lt;w:qFormat/&gt;&lt;w:rsid w:val="00EA5662"/&gt;&lt;w:pPr&gt;&lt;w:spacing w:after="0"/&gt;&lt;/w:pPr&gt;&lt;/w:style&gt;&lt;w:style w:type="paragraph" w:styleId="Quote"&gt;&lt;w:name w:val="Quote"/&gt;&lt;w:basedOn w:val="Normal"/&gt;&lt;w:next w:val="Normal"/&gt;&lt;w:link w:val="QuoteChar"/&gt;&lt;w:uiPriority w:val="29"/&gt;&lt;w:semiHidden/&gt;&lt;w:rsid w:val="009B1B65"/&gt;&lt;w:pPr&gt;&lt;w:spacing w:before="200" w:line="264" w:lineRule="auto"/&gt;&lt;w:ind w:left="864" w:right="864"/&gt;&lt;w:jc w:val="center"/&gt;&lt;/w:pPr&gt;&lt;w:rPr&gt;&lt;w:rFonts w:asciiTheme="majorHAnsi" w:eastAsiaTheme="majorEastAsia" w:hAnsiTheme="majorHAnsi" w:cstheme="majorBidi"/&gt;&lt;w:i/&gt;&lt;w:iCs/&gt;&lt;w:sz w:val="24"/&gt;&lt;w:szCs w:val="24"/&gt;&lt;/w:rPr&gt;&lt;/w:style&gt;&lt;w:style w:type="character" w:customStyle="1" w:styleId="QuoteChar"&gt;&lt;w:name w:val="Quote Char"/&gt;&lt;w:basedOn w:val="DefaultParagraphFont"/&gt;&lt;w:link w:val="Quote"/&gt;&lt;w:uiPriority w:val="29"/&gt;&lt;w:semiHidden/&gt;&lt;w:rsid w:val="009B1B65"/&gt;&lt;w:rPr&gt;&lt;w:rFonts w:asciiTheme="majorHAnsi" w:eastAsiaTheme="majorEastAsia" w:hAnsiTheme="majorHAnsi" w:cstheme="majorBidi"/&gt;&lt;w:i/&gt;&lt;w:iCs/&gt;&lt;w:sz w:val="24"/&gt;&lt;w:szCs w:val="24"/&gt;&lt;/w:rPr&gt;&lt;/w:style&gt;&lt;w:style w:type="paragraph" w:styleId="IntenseQuote"&gt;&lt;w:name w:val="Intense Quote"/&gt;&lt;w:basedOn w:val="Normal"/&gt;&lt;w:next w:val="Normal"/&gt;&lt;w:link w:val="IntenseQuoteChar"/&gt;&lt;w:uiPriority w:val="30"/&gt;&lt;w:semiHidden/&gt;&lt;w:rsid w:val="009B1B65"/&gt;&lt;w:pPr&gt;&lt;w:spacing w:before="100" w:beforeAutospacing="1" w:after="240"/&gt;&lt;w:ind w:left="936" w:right="936"/&gt;&lt;w:jc w:val="center"/&gt;&lt;/w:pPr&gt;&lt;w:rPr&gt;&lt;w:rFonts w:asciiTheme="majorHAnsi" w:eastAsiaTheme="majorEastAsia" w:hAnsiTheme="majorHAnsi" w:cstheme="majorBidi"/&gt;&lt;w:sz w:val="26"/&gt;&lt;w:szCs w:val="26"/&gt;&lt;/w:rPr&gt;&lt;/w:style&gt;&lt;w:style w:type="character" w:customStyle="1" w:styleId="IntenseQuoteChar"&gt;&lt;w:name w:val="Intense Quote Char"/&gt;&lt;w:basedOn w:val="DefaultParagraphFont"/&gt;&lt;w:link w:val="IntenseQuote"/&gt;&lt;w:uiPriority w:val="30"/&gt;&lt;w:semiHidden/&gt;&lt;w:rsid w:val="009B1B65"/&gt;&lt;w:rPr&gt;&lt;w:rFonts w:asciiTheme="majorHAnsi" w:eastAsiaTheme="majorEastAsia" w:hAnsiTheme="majorHAnsi" w:cstheme="majorBidi"/&gt;&lt;w:sz w:val="26"/&gt;&lt;w:szCs w:val="26"/&gt;&lt;/w:rPr&gt;&lt;/w:style&gt;&lt;w:style w:type="character" w:styleId="SubtleEmphasis"&gt;&lt;w:name w:val="Subtle Emphasis"/&gt;&lt;w:basedOn w:val="DefaultParagraphFont"/&gt;&lt;w:uiPriority w:val="19"/&gt;&lt;w:semiHidden/&gt;&lt;w:rsid w:val="009B1B65"/&gt;&lt;w:rPr&gt;&lt;w:i/&gt;&lt;w:iCs/&gt;&lt;w:color w:val="auto"/&gt;&lt;/w:rPr&gt;&lt;/w:style&gt;&lt;w:style w:type="character" w:styleId="IntenseEmphasis"&gt;&lt;w:name w:val="Intense Emphasis"/&gt;&lt;w:basedOn w:val="DefaultParagraphFont"/&gt;&lt;w:uiPriority w:val="21"/&gt;&lt;w:semiHidden/&gt;&lt;w:rsid w:val="009B1B65"/&gt;&lt;w:rPr&gt;&lt;w:b/&gt;&lt;w:bCs/&gt;&lt;w:i/&gt;&lt;w:iCs/&gt;&lt;w:color w:val="auto"/&gt;&lt;/w:rPr&gt;&lt;/w:style&gt;&lt;w:style w:type="character" w:styleId="SubtleReference"&gt;&lt;w:name w:val="Subtle Reference"/&gt;&lt;w:basedOn w:val="DefaultParagraphFont"/&gt;&lt;w:uiPriority w:val="31"/&gt;&lt;w:semiHidden/&gt;&lt;w:rsid w:val="009B1B65"/&gt;&lt;w:rPr&gt;&lt;w:smallCaps/&gt;&lt;w:color w:val="auto"/&gt;&lt;w:u w:val="single" w:color="7F7F7F" w:themeColor="text1" w:themeTint="80"/&gt;&lt;/w:rPr&gt;&lt;/w:style&gt;&lt;w:style w:type="character" w:styleId="IntenseReference"&gt;&lt;w:name w:val="Intense Reference"/&gt;&lt;w:basedOn w:val="DefaultParagraphFont"/&gt;&lt;w:uiPriority w:val="32"/&gt;&lt;w:semiHidden/&gt;&lt;w:rsid w:val="009B1B65"/&gt;&lt;w:rPr&gt;&lt;w:b/&gt;&lt;w:bCs/&gt;&lt;w:smallCaps/&gt;&lt;w:color w:val="auto"/&gt;&lt;w:u w:val="single"/&gt;&lt;/w:rPr&gt;&lt;/w:style&gt;&lt;w:style w:type="character" w:styleId="BookTitle"&gt;&lt;w:name w:val="Book Title"/&gt;&lt;w:basedOn w:val="DefaultParagraphFont"/&gt;&lt;w:uiPriority w:val="33"/&gt;&lt;w:semiHidden/&gt;&lt;w:rsid w:val="009B1B65"/&gt;&lt;w:rPr&gt;&lt;w:b/&gt;&lt;w:bCs/&gt;&lt;w:smallCaps/&gt;&lt;w:color w:val="auto"/&gt;&lt;/w:rPr&gt;&lt;/w:style&gt;&lt;w:style w:type="paragraph" w:styleId="TOCHeading"&gt;&lt;w:name w:val="TOC Heading"/&gt;&lt;w:basedOn w:val="Normal"/&gt;&lt;w:next w:val="Normal"/&gt;&lt;w:uiPriority w:val="39"/&gt;&lt;w:semiHidden/&gt;&lt;w:rsid w:val="009F4214"/&gt;&lt;w:pPr&gt;&lt;w:keepNext/&gt;&lt;w:keepLines/&gt;&lt;w:pageBreakBefore/&gt;&lt;/w:pPr&gt;&lt;w:rPr&gt;&lt;w:rFonts w:asciiTheme="majorHAnsi" w:hAnsiTheme="majorHAnsi"/&gt;&lt;w:b/&gt;&lt;w:sz w:val="32"/&gt;&lt;/w:rPr&gt;&lt;/w:style&gt;&lt;w:style w:type="paragraph" w:styleId="ListBullet"&gt;&lt;w:name w:val="List Bullet"/&gt;&lt;w:basedOn w:val="Normal"/&gt;&lt;w:uiPriority w:val="14"/&gt;&lt;w:qFormat/&gt;&lt;w:rsid w:val="001D4B24"/&gt;&lt;w:pPr&gt;&lt;w:numPr&gt;&lt;w:numId w:val="1"/&gt;&lt;/w:numPr&gt;&lt;w:spacing w:after="80"/&gt;&lt;w:contextualSpacing/&gt;&lt;/w:pPr&gt;&lt;/w:style&gt;&lt;w:style w:type="paragraph" w:styleId="ListNumber"&gt;&lt;w:name w:val="List Number"/&gt;&lt;w:basedOn w:val="Normal"/&gt;&lt;w:uiPriority w:val="14"/&gt;&lt;w:qFormat/&gt;&lt;w:rsid w:val="00223177"/&gt;&lt;w:pPr&gt;&lt;w:numPr&gt;&lt;w:numId w:val="6"/&gt;&lt;/w:numPr&gt;&lt;w:spacing w:after="80"/&gt;&lt;w:ind w:left="357" w:hanging="357"/&gt;&lt;w:contextualSpacing/&gt;&lt;/w:pPr&gt;&lt;/w:style&gt;&lt;w:style w:type="table" w:styleId="TableGrid"&gt;&lt;w:name w:val="Table Grid"/&gt;&lt;w:basedOn w:val="TableNormal"/&gt;&lt;w:uiPriority w:val="39"/&gt;&lt;w:rsid w:val="00572408"/&gt;&lt;w:pPr&gt;&lt;w:spacing w:after="0" w:line="240" w:lineRule="auto"/&gt;&lt;/w:pPr&gt;&lt;w:tblPr/&gt;&lt;/w:style&gt;&lt;w:style w:type="paragraph" w:styleId="FootnoteText"&gt;&lt;w:name w:val="footnote text"/&gt;&lt;w:basedOn w:val="Normal"/&gt;&lt;w:link w:val="FootnoteTextChar"/&gt;&lt;w:uiPriority w:val="99"/&gt;&lt;w:semiHidden/&gt;&lt;w:rsid w:val="00872413"/&gt;&lt;w:pPr&gt;&lt;w:spacing w:after="0"/&gt;&lt;/w:pPr&gt;&lt;w:rPr&gt;&lt;w:sz w:val="14"/&gt;&lt;w:szCs w:val="20"/&gt;&lt;/w:rPr&gt;&lt;/w:style&gt;&lt;w:style w:type="character" w:customStyle="1" w:styleId="FootnoteTextChar"&gt;&lt;w:name w:val="Footnote Text Char"/&gt;&lt;w:basedOn w:val="DefaultParagraphFont"/&gt;&lt;w:link w:val="FootnoteText"/&gt;&lt;w:uiPriority w:val="99"/&gt;&lt;w:semiHidden/&gt;&lt;w:rsid w:val="005F186C"/&gt;&lt;w:rPr&gt;&lt;w:sz w:val="14"/&gt;&lt;w:szCs w:val="20"/&gt;&lt;w:lang w:val="en-GB"/&gt;&lt;/w:rPr&gt;&lt;/w:style&gt;&lt;w:style w:type="character" w:styleId="FootnoteReference"&gt;&lt;w:name w:val="footnote reference"/&gt;&lt;w:basedOn w:val="DefaultParagraphFont"/&gt;&lt;w:uiPriority w:val="99"/&gt;&lt;w:semiHidden/&gt;&lt;w:rsid w:val="00884E47"/&gt;&lt;w:rPr&gt;&lt;w:vertAlign w:val="superscript"/&gt;&lt;/w:rPr&gt;&lt;/w:style&gt;&lt;w:style w:type="paragraph" w:styleId="Header"&gt;&lt;w:name w:val="header"/&gt;&lt;w:basedOn w:val="Normal"/&gt;&lt;w:link w:val="HeaderChar"/&gt;&lt;w:uiPriority w:val="99"/&gt;&lt;w:semiHidden/&gt;&lt;w:rsid w:val="005F186C"/&gt;&lt;w:pPr&gt;&lt;w:tabs&gt;&lt;w:tab w:val="center" w:pos="4536"/&gt;&lt;w:tab w:val="right" w:pos="9072"/&gt;&lt;/w:tabs&gt;&lt;w:spacing w:after="0" w:line="240" w:lineRule="auto"/&gt;&lt;/w:pPr&gt;&lt;w:rPr&gt;&lt;w:color w:val="858585" w:themeColor="accent5"/&gt;&lt;w:sz w:val="16"/&gt;&lt;/w:rPr&gt;&lt;/w:style&gt;&lt;w:style w:type="character" w:customStyle="1" w:styleId="HeaderChar"&gt;&lt;w:name w:val="Header Char"/&gt;&lt;w:basedOn w:val="DefaultParagraphFont"/&gt;&lt;w:link w:val="Header"/&gt;&lt;w:uiPriority w:val="99"/&gt;&lt;w:semiHidden/&gt;&lt;w:rsid w:val="005F186C"/&gt;&lt;w:rPr&gt;&lt;w:color w:val="858585" w:themeColor="accent5"/&gt;&lt;w:sz w:val="16"/&gt;&lt;w:lang w:val="en-GB"/&gt;&lt;/w:rPr&gt;&lt;/w:style&gt;&lt;w:style w:type="paragraph" w:styleId="Footer"&gt;&lt;w:name w:val="footer"/&gt;&lt;w:basedOn w:val="Normal"/&gt;&lt;w:link w:val="FooterChar"/&gt;&lt;w:uiPriority w:val="99"/&gt;&lt;w:semiHidden/&gt;&lt;w:rsid w:val="005F186C"/&gt;&lt;w:pPr&gt;&lt;w:tabs&gt;&lt;w:tab w:val="center" w:pos="4536"/&gt;&lt;w:tab w:val="right" w:pos="9072"/&gt;&lt;/w:tabs&gt;&lt;w:spacing w:after="0" w:line="240" w:lineRule="auto"/&gt;&lt;/w:pPr&gt;&lt;w:rPr&gt;&lt;w:color w:val="858585" w:themeColor="accent5"/&gt;&lt;w:sz w:val="16"/&gt;&lt;/w:rPr&gt;&lt;/w:style&gt;&lt;w:style w:type="character" w:customStyle="1" w:styleId="FooterChar"&gt;&lt;w:name w:val="Footer Char"/&gt;&lt;w:basedOn w:val="DefaultParagraphFont"/&gt;&lt;w:link w:val="Footer"/&gt;&lt;w:uiPriority w:val="99"/&gt;&lt;w:semiHidden/&gt;&lt;w:rsid w:val="005F186C"/&gt;&lt;w:rPr&gt;&lt;w:color w:val="858585" w:themeColor="accent5"/&gt;&lt;w:sz w:val="16"/&gt;&lt;w:lang w:val="en-GB"/&gt;&lt;/w:rPr&gt;&lt;/w:style&gt;&lt;w:style w:type="paragraph" w:styleId="TOC1"&gt;&lt;w:name w:val="toc 1"/&gt;&lt;w:basedOn w:val="Normal"/&gt;&lt;w:next w:val="Normal"/&gt;&lt;w:uiPriority w:val="39"/&gt;&lt;w:semiHidden/&gt;&lt;w:rsid w:val="00421476"/&gt;&lt;w:pPr&gt;&lt;w:tabs&gt;&lt;w:tab w:val="right" w:leader="dot" w:pos="8210"/&gt;&lt;/w:tabs&gt;&lt;w:spacing w:after="100"/&gt;&lt;w:ind w:left="426" w:hanging="426"/&gt;&lt;/w:pPr&gt;&lt;/w:style&gt;&lt;w:style w:type="paragraph" w:styleId="TOC2"&gt;&lt;w:name w:val="toc 2"/&gt;&lt;w:basedOn w:val="Normal"/&gt;&lt;w:next w:val="Normal"/&gt;&lt;w:uiPriority w:val="39"/&gt;&lt;w:semiHidden/&gt;&lt;w:rsid w:val="00EE62A8"/&gt;&lt;w:pPr&gt;&lt;w:tabs&gt;&lt;w:tab w:val="right" w:leader="dot" w:pos="8210"/&gt;&lt;/w:tabs&gt;&lt;w:spacing w:after="100"/&gt;&lt;w:ind w:left="1134" w:hanging="708"/&gt;&lt;/w:pPr&gt;&lt;w:rPr&gt;&lt;w:noProof/&gt;&lt;/w:rPr&gt;&lt;/w:style&gt;&lt;w:style w:type="paragraph" w:styleId="TOC3"&gt;&lt;w:name w:val="toc 3"/&gt;&lt;w:basedOn w:val="Normal"/&gt;&lt;w:next w:val="Normal"/&gt;&lt;w:uiPriority w:val="39"/&gt;&lt;w:semiHidden/&gt;&lt;w:rsid w:val="00EE62A8"/&gt;&lt;w:pPr&gt;&lt;w:tabs&gt;&lt;w:tab w:val="right" w:leader="dot" w:pos="8210"/&gt;&lt;/w:tabs&gt;&lt;w:spacing w:after="100"/&gt;&lt;w:ind w:left="1134" w:hanging="694"/&gt;&lt;/w:pPr&gt;&lt;w:rPr&gt;&lt;w:noProof/&gt;&lt;/w:rPr&gt;&lt;/w:style&gt;&lt;w:style w:type="character" w:styleId="Hyperlink"&gt;&lt;w:name w:val="Hyperlink"/&gt;&lt;w:basedOn w:val="DefaultParagraphFont"/&gt;&lt;w:uiPriority w:val="99"/&gt;&lt;w:semiHidden/&gt;&lt;w:rsid w:val="008555A7"/&gt;&lt;w:rPr&gt;&lt;w:color w:val="A1BF35" w:themeColor="hyperlink"/&gt;&lt;w:u w:val="single"/&gt;&lt;/w:rPr&gt;&lt;/w:style&gt;&lt;w:style w:type="paragraph" w:styleId="TOC4"&gt;&lt;w:name w:val="toc 4"/&gt;&lt;w:basedOn w:val="Normal"/&gt;&lt;w:next w:val="Normal"/&gt;&lt;w:uiPriority w:val="39"/&gt;&lt;w:semiHidden/&gt;&lt;w:rsid w:val="00FF2698"/&gt;&lt;w:pPr&gt;&lt;w:spacing w:after="100"/&gt;&lt;w:ind w:left="660"/&gt;&lt;/w:pPr&gt;&lt;/w:style&gt;&lt;w:style w:type="paragraph" w:styleId="TOC5"&gt;&lt;w:name w:val="toc 5"/&gt;&lt;w:basedOn w:val="Normal"/&gt;&lt;w:next w:val="Normal"/&gt;&lt;w:uiPriority w:val="39"/&gt;&lt;w:semiHidden/&gt;&lt;w:rsid w:val="00FF2698"/&gt;&lt;w:pPr&gt;&lt;w:spacing w:after="100"/&gt;&lt;w:ind w:left="880"/&gt;&lt;/w:pPr&gt;&lt;/w:style&gt;&lt;w:style w:type="paragraph" w:styleId="TOC6"&gt;&lt;w:name w:val="toc 6"/&gt;&lt;w:basedOn w:val="Normal"/&gt;&lt;w:next w:val="Normal"/&gt;&lt;w:uiPriority w:val="39"/&gt;&lt;w:semiHidden/&gt;&lt;w:rsid w:val="00FF2698"/&gt;&lt;w:pPr&gt;&lt;w:spacing w:after="100"/&gt;&lt;w:ind w:left="1100"/&gt;&lt;/w:pPr&gt;&lt;/w:style&gt;&lt;w:style w:type="paragraph" w:styleId="TOC7"&gt;&lt;w:name w:val="toc 7"/&gt;&lt;w:basedOn w:val="Normal"/&gt;&lt;w:next w:val="Normal"/&gt;&lt;w:uiPriority w:val="39"/&gt;&lt;w:semiHidden/&gt;&lt;w:rsid w:val="00FF2698"/&gt;&lt;w:pPr&gt;&lt;w:spacing w:after="100"/&gt;&lt;w:ind w:left="1320"/&gt;&lt;/w:pPr&gt;&lt;/w:style&gt;&lt;w:style w:type="paragraph" w:styleId="TOC8"&gt;&lt;w:name w:val="toc 8"/&gt;&lt;w:basedOn w:val="Normal"/&gt;&lt;w:next w:val="Normal"/&gt;&lt;w:uiPriority w:val="39"/&gt;&lt;w:semiHidden/&gt;&lt;w:rsid w:val="00FF2698"/&gt;&lt;w:pPr&gt;&lt;w:spacing w:after="100"/&gt;&lt;w:ind w:left="1540"/&gt;&lt;/w:pPr&gt;&lt;/w:style&gt;&lt;w:style w:type="paragraph" w:styleId="TOC9"&gt;&lt;w:name w:val="toc 9"/&gt;&lt;w:basedOn w:val="Normal"/&gt;&lt;w:next w:val="Normal"/&gt;&lt;w:uiPriority w:val="39"/&gt;&lt;w:semiHidden/&gt;&lt;w:rsid w:val="00FF2698"/&gt;&lt;w:pPr&gt;&lt;w:spacing w:after="100"/&gt;&lt;w:ind w:left="1760"/&gt;&lt;/w:pPr&gt;&lt;/w:style&gt;&lt;w:style w:type="paragraph" w:styleId="ListNumber2"&gt;&lt;w:name w:val="List Number 2"/&gt;&lt;w:basedOn w:val="ListNumber"/&gt;&lt;w:uiPriority w:val="14"/&gt;&lt;w:rsid w:val="00130001"/&gt;&lt;w:pPr&gt;&lt;w:numPr&gt;&lt;w:ilvl w:val="1"/&gt;&lt;/w:numPr&gt;&lt;/w:pPr&gt;&lt;/w:style&gt;&lt;w:style w:type="paragraph" w:styleId="ListNumber3"&gt;&lt;w:name w:val="List Number 3"/&gt;&lt;w:basedOn w:val="ListNumber2"/&gt;&lt;w:uiPriority w:val="14"/&gt;&lt;w:rsid w:val="00130001"/&gt;&lt;w:pPr&gt;&lt;w:numPr&gt;&lt;w:ilvl w:val="2"/&gt;&lt;/w:numPr&gt;&lt;/w:pPr&gt;&lt;/w:style&gt;&lt;w:style w:type="paragraph" w:styleId="ListNumber4"&gt;&lt;w:name w:val="List Number 4"/&gt;&lt;w:basedOn w:val="ListNumber3"/&gt;&lt;w:uiPriority w:val="14"/&gt;&lt;w:semiHidden/&gt;&lt;w:rsid w:val="00130001"/&gt;&lt;w:pPr&gt;&lt;w:numPr&gt;&lt;w:ilvl w:val="3"/&gt;&lt;/w:numPr&gt;&lt;/w:pPr&gt;&lt;/w:style&gt;&lt;w:style w:type="paragraph" w:styleId="ListNumber5"&gt;&lt;w:name w:val="List Number 5"/&gt;&lt;w:basedOn w:val="ListNumber4"/&gt;&lt;w:uiPriority w:val="14"/&gt;&lt;w:semiHidden/&gt;&lt;w:rsid w:val="00130001"/&gt;&lt;w:pPr&gt;&lt;w:numPr&gt;&lt;w:ilvl w:val="4"/&gt;&lt;/w:numPr&gt;&lt;/w:pPr&gt;&lt;/w:style&gt;&lt;w:style w:type="paragraph" w:styleId="ListBullet2"&gt;&lt;w:name w:val="List Bullet 2"/&gt;&lt;w:basedOn w:val="ListBullet"/&gt;&lt;w:uiPriority w:val="14"/&gt;&lt;w:rsid w:val="00FE2BED"/&gt;&lt;w:pPr&gt;&lt;w:numPr&gt;&lt;w:ilvl w:val="1"/&gt;&lt;/w:numPr&gt;&lt;/w:pPr&gt;&lt;/w:style&gt;&lt;w:style w:type="paragraph" w:styleId="ListBullet3"&gt;&lt;w:name w:val="List Bullet 3"/&gt;&lt;w:basedOn w:val="ListBullet2"/&gt;&lt;w:uiPriority w:val="14"/&gt;&lt;w:rsid w:val="00FE2BED"/&gt;&lt;w:pPr&gt;&lt;w:numPr&gt;&lt;w:ilvl w:val="2"/&gt;&lt;/w:numPr&gt;&lt;/w:pPr&gt;&lt;/w:style&gt;&lt;w:style w:type="paragraph" w:styleId="ListBullet4"&gt;&lt;w:name w:val="List Bullet 4"/&gt;&lt;w:basedOn w:val="ListBullet3"/&gt;&lt;w:uiPriority w:val="14"/&gt;&lt;w:semiHidden/&gt;&lt;w:rsid w:val="00FE2BED"/&gt;&lt;w:pPr&gt;&lt;w:numPr&gt;&lt;w:ilvl w:val="3"/&gt;&lt;/w:numPr&gt;&lt;/w:pPr&gt;&lt;/w:style&gt;&lt;w:style w:type="paragraph" w:styleId="ListBullet5"&gt;&lt;w:name w:val="List Bullet 5"/&gt;&lt;w:basedOn w:val="ListBullet4"/&gt;&lt;w:uiPriority w:val="14"/&gt;&lt;w:semiHidden/&gt;&lt;w:rsid w:val="00FE2BED"/&gt;&lt;w:pPr&gt;&lt;w:numPr&gt;&lt;w:ilvl w:val="4"/&gt;&lt;/w:numPr&gt;&lt;/w:pPr&gt;&lt;/w:style&gt;&lt;w:style w:type="character" w:styleId="PlaceholderText"&gt;&lt;w:name w:val="Placeholder Text"/&gt;&lt;w:basedOn w:val="DefaultParagraphFont"/&gt;&lt;w:uiPriority w:val="99"/&gt;&lt;w:rsid w:val="009C6FDB"/&gt;&lt;w:rPr&gt;&lt;w:color w:val="7F7F7F" w:themeColor="text1" w:themeTint="80"/&gt;&lt;w:bdr w:val="none" w:sz="0" w:space="0" w:color="auto"/&gt;&lt;w:shd w:val="clear" w:color="auto" w:fill="F0F0F0"/&gt;&lt;/w:rPr&gt;&lt;/w:style&gt;&lt;w:style w:type="paragraph" w:customStyle="1" w:styleId="Hiddentext"&gt;&lt;w:name w:val="Hidden text"/&gt;&lt;w:basedOn w:val="Normal"/&gt;&lt;w:next w:val="Normal"/&gt;&lt;w:uiPriority w:val="24"/&gt;&lt;w:semiHidden/&gt;&lt;w:qFormat/&gt;&lt;w:rsid w:val="00D86E66"/&gt;&lt;w:rPr&gt;&lt;w:vanish/&gt;&lt;w:color w:val="C00000"/&gt;&lt;/w:rPr&gt;&lt;/w:style&gt;&lt;w:style w:type="paragraph" w:customStyle="1" w:styleId="NumberedHeading1"&gt;&lt;w:name w:val="Numbered Heading 1"/&gt;&lt;w:basedOn w:val="Heading1"/&gt;&lt;w:next w:val="Normal"/&gt;&lt;w:uiPriority w:val="10"/&gt;&lt;w:semiHidden/&gt;&lt;w:qFormat/&gt;&lt;w:rsid w:val="00494FFB"/&gt;&lt;w:pPr&gt;&lt;w:numPr&gt;&lt;w:numId w:val="12"/&gt;&lt;/w:numPr&gt;&lt;/w:pPr&gt;&lt;/w:style&gt;&lt;w:style w:type="paragraph" w:customStyle="1" w:styleId="NumberedHeading2"&gt;&lt;w:name w:val="Numbered Heading 2"/&gt;&lt;w:basedOn w:val="Heading2"/&gt;&lt;w:next w:val="Normal"/&gt;&lt;w:uiPriority w:val="10"/&gt;&lt;w:semiHidden/&gt;&lt;w:qFormat/&gt;&lt;w:rsid w:val="00DA7B63"/&gt;&lt;w:pPr&gt;&lt;w:numPr&gt;&lt;w:ilvl w:val="1"/&gt;&lt;w:numId w:val="12"/&gt;&lt;/w:numPr&gt;&lt;/w:pPr&gt;&lt;/w:style&gt;&lt;w:style w:type="paragraph" w:customStyle="1" w:styleId="NumberedHeading3"&gt;&lt;w:name w:val="Numbered Heading 3"/&gt;&lt;w:basedOn w:val="Heading3"/&gt;&lt;w:next w:val="Normal"/&gt;&lt;w:uiPriority w:val="10"/&gt;&lt;w:semiHidden/&gt;&lt;w:qFormat/&gt;&lt;w:rsid w:val="00DA7B63"/&gt;&lt;w:pPr&gt;&lt;w:numPr&gt;&lt;w:ilvl w:val="2"/&gt;&lt;w:numId w:val="12"/&gt;&lt;/w:numPr&gt;&lt;/w:pPr&gt;&lt;/w:style&gt;&lt;w:style w:type="paragraph" w:customStyle="1" w:styleId="NumberedHeading4"&gt;&lt;w:name w:val="Numbered Heading 4"/&gt;&lt;w:basedOn w:val="Heading4"/&gt;&lt;w:next w:val="Normal"/&gt;&lt;w:uiPriority w:val="10"/&gt;&lt;w:semiHidden/&gt;&lt;w:qFormat/&gt;&lt;w:rsid w:val="00DA7B63"/&gt;&lt;w:pPr&gt;&lt;w:numPr&gt;&lt;w:ilvl w:val="3"/&gt;&lt;w:numId w:val="12"/&gt;&lt;/w:numPr&gt;&lt;/w:pPr&gt;&lt;/w:style&gt;&lt;w:style w:type="character" w:customStyle="1" w:styleId="NoSpacingChar"&gt;&lt;w:name w:val="No Spacing Char"/&gt;&lt;w:basedOn w:val="DefaultParagraphFont"/&gt;&lt;w:link w:val="NoSpacing"/&gt;&lt;w:uiPriority w:val="1"/&gt;&lt;w:rsid w:val="00EE7F0A"/&gt;&lt;/w:style&gt;&lt;w:style w:type="paragraph" w:styleId="BalloonText"&gt;&lt;w:name w:val="Balloon Text"/&gt;&lt;w:basedOn w:val="Normal"/&gt;&lt;w:link w:val="BalloonTextChar"/&gt;&lt;w:uiPriority w:val="99"/&gt;&lt;w:semiHidden/&gt;&lt;w:unhideWhenUsed/&gt;&lt;w:rsid w:val="00421476"/&gt;&lt;w:pPr&gt;&lt;w:spacing w:after="0"/&gt;&lt;/w:pPr&gt;&lt;w:rPr&gt;&lt;w:rFonts w:cs="Segoe UI"/&gt;&lt;w:sz w:val="18"/&gt;&lt;w:szCs w:val="18"/&gt;&lt;/w:rPr&gt;&lt;/w:style&gt;&lt;w:style w:type="character" w:customStyle="1" w:styleId="BalloonTextChar"&gt;&lt;w:name w:val="Balloon Text Char"/&gt;&lt;w:basedOn w:val="DefaultParagraphFont"/&gt;&lt;w:link w:val="BalloonText"/&gt;&lt;w:uiPriority w:val="99"/&gt;&lt;w:semiHidden/&gt;&lt;w:rsid w:val="00421476"/&gt;&lt;w:rPr&gt;&lt;w:rFonts w:cs="Segoe UI"/&gt;&lt;w:sz w:val="18"/&gt;&lt;w:szCs w:val="18"/&gt;&lt;w:lang w:val="en-GB"/&gt;&lt;/w:rPr&gt;&lt;/w:style&gt;&lt;w:style w:type="paragraph" w:customStyle="1" w:styleId="Footertext"&gt;&lt;w:name w:val="Footer text"/&gt;&lt;w:basedOn w:val="Normal"/&gt;&lt;w:uiPriority w:val="10"/&gt;&lt;w:semiHidden/&gt;&lt;w:qFormat/&gt;&lt;w:rsid w:val="001407DF"/&gt;&lt;w:pPr&gt;&lt;w:framePr w:wrap="around" w:vAnchor="page" w:hAnchor="page" w:x="852" w:y="14176"/&gt;&lt;w:spacing w:before="40" w:after="40"/&gt;&lt;/w:pPr&gt;&lt;w:rPr&gt;&lt;w:color w:val="858585" w:themeColor="accent5"/&gt;&lt;w:sz w:val="16"/&gt;&lt;/w:rPr&gt;&lt;/w:style&gt;&lt;w:style w:type="paragraph" w:customStyle="1" w:styleId="Footertitle"&gt;&lt;w:name w:val="Footer title"/&gt;&lt;w:basedOn w:val="Footertext"/&gt;&lt;w:uiPriority w:val="10"/&gt;&lt;w:semiHidden/&gt;&lt;w:qFormat/&gt;&lt;w:rsid w:val="00E4504C"/&gt;&lt;w:pPr&gt;&lt;w:framePr w:wrap="around"/&gt;&lt;/w:pPr&gt;&lt;w:rPr&gt;&lt;w:b/&gt;&lt;w:color w:val="407077" w:themeColor="accent1"/&gt;&lt;/w:rPr&gt;&lt;/w:style&gt;&lt;w:style w:type="table" w:customStyle="1" w:styleId="BetssonTable01"&gt;&lt;w:name w:val="Betsson Table 01"/&gt;&lt;w:basedOn w:val="TableNormal"/&gt;&lt;w:uiPriority w:val="99"/&gt;&lt;w:rsid w:val="00036B11"/&gt;&lt;w:pPr&gt;&lt;w:spacing w:after="0" w:line="240" w:lineRule="auto"/&gt;&lt;w:jc w:val="right"/&gt;&lt;/w:pPr&gt;&lt;w:tblPr&gt;&lt;w:tblBorders&gt;&lt;w:bottom w:val="single" w:sz="4" w:space="0" w:color="407077" w:themeColor="accent1"/&gt;&lt;w:insideH w:val="single" w:sz="4" w:space="0" w:color="407077" w:themeColor="accent1"/&gt;&lt;/w:tblBorders&gt;&lt;w:tblCellMar&gt;&lt;w:top w:w="57" w:type="dxa"/&gt;&lt;w:left w:w="57" w:type="dxa"/&gt;&lt;w:bottom w:w="57" w:type="dxa"/&gt;&lt;w:right w:w="57" w:type="dxa"/&gt;&lt;/w:tblCellMar&gt;&lt;/w:tblPr&gt;&lt;w:tblStylePr w:type="firstRow"&gt;&lt;w:pPr&gt;&lt;w:jc w:val="right"/&gt;&lt;/w:pPr&gt;&lt;w:rPr&gt;&lt;w:rFonts w:asciiTheme="majorHAnsi" w:hAnsiTheme="majorHAnsi"/&gt;&lt;w:b/&gt;&lt;w:color w:val="407077" w:themeColor="accent1"/&gt;&lt;/w:rPr&gt;&lt;w:tblPr/&gt;&lt;w:tcPr&gt;&lt;w:tcBorders&gt;&lt;w:bottom w:val="single" w:sz="12" w:space="0" w:color="407077" w:themeColor="accent1"/&gt;&lt;/w:tcBorders&gt;&lt;w:vAlign w:val="bottom"/&gt;&lt;/w:tcPr&gt;&lt;/w:tblStylePr&gt;&lt;w:tblStylePr w:type="lastRow"&gt;&lt;w:rPr&gt;&lt;w:rFonts w:asciiTheme="majorHAnsi" w:hAnsiTheme="majorHAnsi"/&gt;&lt;w:b/&gt;&lt;/w:rPr&gt;&lt;w:tblPr/&gt;&lt;w:tcPr&gt;&lt;w:tcBorders&gt;&lt;w:top w:val="double" w:sz="4" w:space="0" w:color="407077" w:themeColor="accent1"/&gt;&lt;w:left w:val="nil"/&gt;&lt;w:bottom w:val="nil"/&gt;&lt;w:right w:val="nil"/&gt;&lt;w:insideH w:val="nil"/&gt;&lt;w:insideV w:val="nil"/&gt;&lt;w:tl2br w:val="nil"/&gt;&lt;w:tr2bl w:val="nil"/&gt;&lt;/w:tcBorders&gt;&lt;/w:tcPr&gt;&lt;/w:tblStylePr&gt;&lt;w:tblStylePr w:type="firstCol"&gt;&lt;w:pPr&gt;&lt;w:jc w:val="left"/&gt;&lt;/w:pPr&gt;&lt;/w:tblStylePr&gt;&lt;w:tblStylePr w:type="lastCol"&gt;&lt;w:rPr&gt;&lt;w:rFonts w:asciiTheme="majorHAnsi" w:hAnsiTheme="majorHAnsi"/&gt;&lt;w:b/&gt;&lt;/w:rPr&gt;&lt;/w:tblStylePr&gt;&lt;w:tblStylePr w:type="nwCell"&gt;&lt;w:pPr&gt;&lt;w:jc w:val="left"/&gt;&lt;/w:pPr&gt;&lt;w:tblPr/&gt;&lt;w:tcPr&gt;&lt;w:vAlign w:val="bottom"/&gt;&lt;/w:tcPr&gt;&lt;/w:tblStylePr&gt;&lt;/w:style&gt;&lt;w:style w:type="table" w:styleId="TableGridLight"&gt;&lt;w:name w:val="Grid Table Light"/&gt;&lt;w:aliases w:val="Betsson Table 02"/&gt;&lt;w:basedOn w:val="TableNormal"/&gt;&lt;w:uiPriority w:val="40"/&gt;&lt;w:rsid w:val="00036B11"/&gt;&lt;w:pPr&gt;&lt;w:spacing w:after="0" w:line="240" w:lineRule="auto"/&gt;&lt;w:jc w:val="right"/&gt;&lt;/w:pPr&gt;&lt;w:tblPr&gt;&lt;w:tblStyleRowBandSize w:val="1"/&gt;&lt;w:tblBorders&gt;&lt;w:insideH w:val="single" w:sz="4" w:space="0" w:color="407077" w:themeColor="accent1"/&gt;&lt;/w:tblBorders&gt;&lt;w:tblCellMar&gt;&lt;w:top w:w="57" w:type="dxa"/&gt;&lt;w:left w:w="57" w:type="dxa"/&gt;&lt;w:bottom w:w="57" w:type="dxa"/&gt;&lt;w:right w:w="57" w:type="dxa"/&gt;&lt;/w:tblCellMar&gt;&lt;/w:tblPr&gt;&lt;w:tcPr&gt;&lt;w:shd w:val="clear" w:color="auto" w:fill="auto"/&gt;&lt;/w:tcPr&gt;&lt;w:tblStylePr w:type="firstRow"&gt;&lt;w:pPr&gt;&lt;w:wordWrap/&gt;&lt;w:spacing w:beforeLines="0" w:before="80" w:beforeAutospacing="0" w:afterLines="0" w:after="0" w:afterAutospacing="0"/&gt;&lt;w:jc w:val="right"/&gt;&lt;/w:pPr&gt;&lt;w:rPr&gt;&lt;w:rFonts w:asciiTheme="majorHAnsi" w:hAnsiTheme="majorHAnsi"/&gt;&lt;w:b/&gt;&lt;w:color w:val="FFFFFF" w:themeColor="background1"/&gt;&lt;/w:rPr&gt;&lt;w:tblPr/&gt;&lt;w:tcPr&gt;&lt;w:shd w:val="clear" w:color="auto" w:fill="407077" w:themeFill="accent1"/&gt;&lt;w:vAlign w:val="bottom"/&gt;&lt;/w:tcPr&gt;&lt;/w:tblStylePr&gt;&lt;w:tblStylePr w:type="lastRow"&gt;&lt;w:rPr&gt;&lt;w:rFonts w:asciiTheme="majorHAnsi" w:hAnsiTheme="majorHAnsi"/&gt;&lt;w:b/&gt;&lt;/w:rPr&gt;&lt;w:tblPr/&gt;&lt;w:tcPr&gt;&lt;w:tcBorders&gt;&lt;w:top w:val="double" w:sz="4" w:space="0" w:color="407077" w:themeColor="accent1"/&gt;&lt;/w:tcBorders&gt;&lt;w:shd w:val="clear" w:color="auto" w:fill="auto"/&gt;&lt;/w:tcPr&gt;&lt;/w:tblStylePr&gt;&lt;w:tblStylePr w:type="firstCol"&gt;&lt;w:pPr&gt;&lt;w:jc w:val="left"/&gt;&lt;/w:pPr&gt;&lt;/w:tblStylePr&gt;&lt;w:tblStylePr w:type="lastCol"&gt;&lt;w:pPr&gt;&lt;w:jc w:val="right"/&gt;&lt;/w:pPr&gt;&lt;w:rPr&gt;&lt;w:rFonts w:asciiTheme="majorHAnsi" w:hAnsiTheme="majorHAnsi"/&gt;&lt;w:b/&gt;&lt;/w:rPr&gt;&lt;/w:tblStylePr&gt;&lt;w:tblStylePr w:type="nwCell"&gt;&lt;w:pPr&gt;&lt;w:jc w:val="left"/&gt;&lt;/w:pPr&gt;&lt;w:tblPr/&gt;&lt;w:tcPr&gt;&lt;w:vAlign w:val="bottom"/&gt;&lt;/w:tcPr&gt;&lt;/w:tblStylePr&gt;&lt;/w:style&gt;&lt;w:style w:type="paragraph" w:customStyle="1" w:styleId="Tabletext"&gt;&lt;w:name w:val="Table text"/&gt;&lt;w:basedOn w:val="Normal"/&gt;&lt;w:uiPriority w:val="15"/&gt;&lt;w:rsid w:val="005F186C"/&gt;&lt;w:pPr&gt;&lt;w:spacing w:after="0" w:line="240" w:lineRule="auto"/&gt;&lt;/w:pPr&gt;&lt;w:rPr&gt;&lt;w:sz w:val="16"/&gt;&lt;/w:rPr&gt;&lt;/w:style&gt;&lt;w:style w:type="paragraph" w:customStyle="1" w:styleId="Tabletitle"&gt;&lt;w:name w:val="Table title"/&gt;&lt;w:basedOn w:val="Tabletext"/&gt;&lt;w:uiPriority w:val="15"/&gt;&lt;w:rsid w:val="00C5110E"/&gt;&lt;w:pPr&gt;&lt;w:framePr w:wrap="around" w:vAnchor="page" w:hAnchor="page" w:x="852" w:y="14176"/&gt;&lt;w:spacing w:before="40" w:after="40"/&gt;&lt;/w:pPr&gt;&lt;w:rPr&gt;&lt;w:b/&gt;&lt;w:color w:val="407077" w:themeColor="accent1"/&gt;&lt;/w:rPr&gt;&lt;/w:style&gt;&lt;w:style w:type="paragraph" w:customStyle="1" w:styleId="FootertitleWhite"&gt;&lt;w:name w:val="Footer title White"/&gt;&lt;w:basedOn w:val="Footertitle"/&gt;&lt;w:semiHidden/&gt;&lt;w:rsid w:val="000049A5"/&gt;&lt;w:pPr&gt;&lt;w:framePr w:wrap="around"/&gt;&lt;/w:pPr&gt;&lt;w:rPr&gt;&lt;w:bCs/&gt;&lt;w:color w:val="FFFFFF" w:themeColor="background1"/&gt;&lt;/w:rPr&gt;&lt;/w:style&gt;&lt;w:style w:type="paragraph" w:styleId="DocumentMap"&gt;&lt;w:name w:val="Document Map"/&gt;&lt;w:basedOn w:val="Normal"/&gt;&lt;w:link w:val="DocumentMapChar"/&gt;&lt;w:uiPriority w:val="99"/&gt;&lt;w:semiHidden/&gt;&lt;w:rsid w:val="00421476"/&gt;&lt;w:pPr&gt;&lt;w:spacing w:after="0"/&gt;&lt;/w:pPr&gt;&lt;w:rPr&gt;&lt;w:rFonts w:cs="Segoe UI"/&gt;&lt;w:sz w:val="16"/&gt;&lt;w:szCs w:val="16"/&gt;&lt;/w:rPr&gt;&lt;/w:style&gt;&lt;w:style w:type="character" w:customStyle="1" w:styleId="DocumentMapChar"&gt;&lt;w:name w:val="Document Map Char"/&gt;&lt;w:basedOn w:val="DefaultParagraphFont"/&gt;&lt;w:link w:val="DocumentMap"/&gt;&lt;w:uiPriority w:val="99"/&gt;&lt;w:semiHidden/&gt;&lt;w:rsid w:val="00421476"/&gt;&lt;w:rPr&gt;&lt;w:rFonts w:cs="Segoe UI"/&gt;&lt;w:sz w:val="16"/&gt;&lt;w:szCs w:val="16"/&gt;&lt;w:lang w:val="en-GB"/&gt;&lt;/w:rPr&gt;&lt;/w:style&gt;&lt;w:style w:type="character" w:styleId="HTMLSample"&gt;&lt;w:name w:val="HTML Sample"/&gt;&lt;w:basedOn w:val="DefaultParagraphFont"/&gt;&lt;w:uiPriority w:val="99"/&gt;&lt;w:semiHidden/&gt;&lt;w:unhideWhenUsed/&gt;&lt;w:rsid w:val="00421476"/&gt;&lt;w:rPr&gt;&lt;w:rFonts w:asciiTheme="minorHAnsi" w:hAnsiTheme="minorHAnsi"/&gt;&lt;w:sz w:val="24"/&gt;&lt;w:szCs w:val="24"/&gt;&lt;/w:rPr&gt;&lt;/w:style&gt;&lt;w:style w:type="paragraph" w:styleId="HTMLPreformatted"&gt;&lt;w:name w:val="HTML Preformatted"/&gt;&lt;w:basedOn w:val="Normal"/&gt;&lt;w:link w:val="HTMLPreformattedChar"/&gt;&lt;w:uiPriority w:val="99"/&gt;&lt;w:semiHidden/&gt;&lt;w:rsid w:val="00421476"/&gt;&lt;w:pPr&gt;&lt;w:spacing w:after="0"/&gt;&lt;/w:pPr&gt;&lt;w:rPr&gt;&lt;w:szCs w:val="20"/&gt;&lt;/w:rPr&gt;&lt;/w:style&gt;&lt;w:style w:type="character" w:customStyle="1" w:styleId="HTMLPreformattedChar"&gt;&lt;w:name w:val="HTML Preformatted Char"/&gt;&lt;w:basedOn w:val="DefaultParagraphFont"/&gt;&lt;w:link w:val="HTMLPreformatted"/&gt;&lt;w:uiPriority w:val="99"/&gt;&lt;w:semiHidden/&gt;&lt;w:rsid w:val="00421476"/&gt;&lt;w:rPr&gt;&lt;w:sz w:val="20"/&gt;&lt;w:szCs w:val="20"/&gt;&lt;w:lang w:val="en-GB"/&gt;&lt;/w:rPr&gt;&lt;/w:style&gt;&lt;w:style w:type="character" w:styleId="HTMLCode"&gt;&lt;w:name w:val="HTML Code"/&gt;&lt;w:basedOn w:val="DefaultParagraphFont"/&gt;&lt;w:uiPriority w:val="99"/&gt;&lt;w:semiHidden/&gt;&lt;w:rsid w:val="00421476"/&gt;&lt;w:rPr&gt;&lt;w:rFonts w:asciiTheme="minorHAnsi" w:hAnsiTheme="minorHAnsi"/&gt;&lt;w:sz w:val="20"/&gt;&lt;w:szCs w:val="20"/&gt;&lt;/w:rPr&gt;&lt;/w:style&gt;&lt;w:style w:type="character" w:styleId="HTMLTypewriter"&gt;&lt;w:name w:val="HTML Typewriter"/&gt;&lt;w:basedOn w:val="DefaultParagraphFont"/&gt;&lt;w:uiPriority w:val="99"/&gt;&lt;w:semiHidden/&gt;&lt;w:rsid w:val="00421476"/&gt;&lt;w:rPr&gt;&lt;w:rFonts w:asciiTheme="minorHAnsi" w:hAnsiTheme="minorHAnsi"/&gt;&lt;w:sz w:val="20"/&gt;&lt;w:szCs w:val="20"/&gt;&lt;/w:rPr&gt;&lt;/w:style&gt;&lt;w:style w:type="character" w:styleId="HTMLKeyboard"&gt;&lt;w:name w:val="HTML Keyboard"/&gt;&lt;w:basedOn w:val="DefaultParagraphFont"/&gt;&lt;w:uiPriority w:val="99"/&gt;&lt;w:semiHidden/&gt;&lt;w:rsid w:val="00421476"/&gt;&lt;w:rPr&gt;&lt;w:rFonts w:asciiTheme="minorHAnsi" w:hAnsiTheme="minorHAnsi"/&gt;&lt;w:sz w:val="20"/&gt;&lt;w:szCs w:val="20"/&gt;&lt;/w:rPr&gt;&lt;/w:style&gt;&lt;w:style w:type="paragraph" w:styleId="MacroText"&gt;&lt;w:name w:val="macro"/&gt;&lt;w:link w:val="MacroTextChar"/&gt;&lt;w:uiPriority w:val="99"/&gt;&lt;w:semiHidden/&gt;&lt;w:rsid w:val="00421476"/&gt;&lt;w:pPr&gt;&lt;w:tabs&gt;&lt;w:tab w:val="left" w:pos="480"/&gt;&lt;w:tab w:val="left" w:pos="960"/&gt;&lt;w:tab w:val="left" w:pos="1440"/&gt;&lt;w:tab w:val="left" w:pos="1920"/&gt;&lt;w:tab w:val="left" w:pos="2400"/&gt;&lt;w:tab w:val="left" w:pos="2880"/&gt;&lt;w:tab w:val="left" w:pos="3360"/&gt;&lt;w:tab w:val="left" w:pos="3840"/&gt;&lt;w:tab w:val="left" w:pos="4320"/&gt;&lt;/w:tabs&gt;&lt;w:spacing w:after="0" w:line="240" w:lineRule="auto"/&gt;&lt;/w:pPr&gt;&lt;w:rPr&gt;&lt;w:sz w:val="20"/&gt;&lt;w:szCs w:val="20"/&gt;&lt;w:lang w:val="en-GB"/&gt;&lt;/w:rPr&gt;&lt;/w:style&gt;&lt;w:style w:type="character" w:customStyle="1" w:styleId="MacroTextChar"&gt;&lt;w:name w:val="Macro Text Char"/&gt;&lt;w:basedOn w:val="DefaultParagraphFont"/&gt;&lt;w:link w:val="MacroText"/&gt;&lt;w:uiPriority w:val="99"/&gt;&lt;w:semiHidden/&gt;&lt;w:rsid w:val="00421476"/&gt;&lt;w:rPr&gt;&lt;w:sz w:val="20"/&gt;&lt;w:szCs w:val="20"/&gt;&lt;w:lang w:val="en-GB"/&gt;&lt;/w:rPr&gt;&lt;/w:style&gt;&lt;w:style w:type="paragraph" w:styleId="NormalWeb"&gt;&lt;w:name w:val="Normal (Web)"/&gt;&lt;w:basedOn w:val="Normal"/&gt;&lt;w:uiPriority w:val="99"/&gt;&lt;w:semiHidden/&gt;&lt;w:rsid w:val="00421476"/&gt;&lt;w:rPr&gt;&lt;w:rFonts w:cs="Times New Roman"/&gt;&lt;w:sz w:val="24"/&gt;&lt;w:szCs w:val="24"/&gt;&lt;/w:rPr&gt;&lt;/w:style&gt;&lt;w:style w:type="paragraph" w:styleId="PlainText"&gt;&lt;w:name w:val="Plain Text"/&gt;&lt;w:basedOn w:val="Normal"/&gt;&lt;w:link w:val="PlainTextChar"/&gt;&lt;w:uiPriority w:val="99"/&gt;&lt;w:semiHidden/&gt;&lt;w:rsid w:val="00421476"/&gt;&lt;w:pPr&gt;&lt;w:spacing w:after="0"/&gt;&lt;/w:pPr&gt;&lt;w:rPr&gt;&lt;w:sz w:val="21"/&gt;&lt;w:szCs w:val="21"/&gt;&lt;/w:rPr&gt;&lt;/w:style&gt;&lt;w:style w:type="character" w:customStyle="1" w:styleId="PlainTextChar"&gt;&lt;w:name w:val="Plain Text Char"/&gt;&lt;w:basedOn w:val="DefaultParagraphFont"/&gt;&lt;w:link w:val="PlainText"/&gt;&lt;w:uiPriority w:val="99"/&gt;&lt;w:semiHidden/&gt;&lt;w:rsid w:val="00421476"/&gt;&lt;w:rPr&gt;&lt;w:sz w:val="21"/&gt;&lt;w:szCs w:val="21"/&gt;&lt;w:lang w:val="en-GB"/&gt;&lt;/w:rPr&gt;&lt;/w:style&gt;&lt;w:style w:type="paragraph" w:customStyle="1" w:styleId="Name"&gt;&lt;w:name w:val="Name"/&gt;&lt;w:basedOn w:val="Normal"/&gt;&lt;w:next w:val="Normal"/&gt;&lt;w:uiPriority w:val="10"/&gt;&lt;w:rsid w:val="00C17BB4"/&gt;&lt;w:pPr&gt;&lt;w:spacing w:after="0" w:line="240" w:lineRule="auto"/&gt;&lt;/w:pPr&gt;&lt;w:rPr&gt;&lt;w:rFonts w:asciiTheme="majorHAnsi" w:hAnsiTheme="majorHAnsi"/&gt;&lt;/w:rPr&gt;&lt;/w:style&gt;&lt;w:style w:type="paragraph" w:customStyle="1" w:styleId="Info"&gt;&lt;w:name w:val="Info"/&gt;&lt;w:basedOn w:val="Normal"/&gt;&lt;w:uiPriority w:val="10"/&gt;&lt;w:rsid w:val="008B734D"/&gt;&lt;w:pPr&gt;&lt;w:spacing w:after="0" w:line="240" w:lineRule="auto"/&gt;&lt;/w:pPr&gt;&lt;/w:style&gt;&lt;/w:styles&gt;&lt;/pkg:xmlData&gt;&lt;/pkg:part&gt;&lt;pkg:part pkg:name="/word/glossary/fontTable.xml" pkg:contentType="application/vnd.openxmlformats-officedocument.wordprocessingml.fontTable+xml"&gt;&lt;pkg:xmlData&gt;&lt;w:fonts xmlns:mc="http://schemas.openxmlformats.org/markup-compatibility/2006" xmlns:r="http://schemas.openxmlformats.org/officeDocument/2006/relationships" xmlns:w="http://schemas.openxmlformats.org/wordprocessingml/2006/main" xmlns:w14="http://schemas.microsoft.com/office/word/2010/wordml" xmlns:w15="http://schemas.microsoft.com/office/word/2012/wordml" xmlns:w16se="http://schemas.microsoft.com/office/word/2015/wordml/symex" mc:Ignorable="w14 w15 w16se"/&gt;&lt;/pkg:xmlData&gt;&lt;/pkg:part&gt;&lt;pkg:part pkg:name="/word/glossary/webSettings.xml" pkg:contentType="application/vnd.openxmlformats-officedocument.wordprocessingml.webSettings+xml"&gt;&lt;pkg:xmlData&gt;&lt;w:webSettings xmlns:mc="http://schemas.openxmlformats.org/markup-compatibility/2006" xmlns:r="http://schemas.openxmlformats.org/officeDocument/2006/relationships" xmlns:w="http://schemas.openxmlformats.org/wordprocessingml/2006/main" xmlns:w14="http://schemas.microsoft.com/office/word/2010/wordml" xmlns:w15="http://schemas.microsoft.com/office/word/2012/wordml" xmlns:w16se="http://schemas.microsoft.com/office/word/2015/wordml/symex" mc:Ignorable="w14 w15 w16se"&gt;&lt;w:optimizeForBrowser/&gt;&lt;w:allowPNG/&gt;&lt;/w:webSettings&gt;&lt;/pkg:xmlData&gt;&lt;/pkg:part&gt;&lt;pkg:part pkg:name="/word/numbering.xml" pkg:contentType="application/vnd.openxmlformats-officedocument.wordprocessingml.numbering+xml"&gt;&lt;pkg:xmlData&gt;&lt;w:numbering xmlns:wpc="http://schemas.microsoft.com/office/word/2010/wordprocessingCanvas" xmlns:cx="http://schemas.microsoft.com/office/drawing/2014/chartex" xmlns:cx1="http://schemas.microsoft.com/office/drawing/2015/9/8/chartex" xmlns:cx2="http://schemas.microsoft.com/office/drawing/2015/10/21/chartex" xmlns:cx3="http://schemas.microsoft.com/office/drawing/2016/5/9/chartex" xmlns:cx4="http://schemas.microsoft.com/office/drawing/2016/5/10/chartex" xmlns:cx5="http://schemas.microsoft.com/office/drawing/2016/5/11/chartex" xmlns:cx6="http://schemas.microsoft.com/office/drawing/2016/5/12/chartex" xmlns:cx7="http://schemas.microsoft.com/office/drawing/2016/5/13/chartex" xmlns:cx8="http://schemas.microsoft.com/office/drawing/2016/5/14/chartex" xmlns:mc="http://schemas.openxmlformats.org/markup-compatibility/2006" xmlns:o="urn:schemas-microsoft-com:office:office" xmlns:r="http://schemas.openxmlformats.org/officeDocument/2006/relationships" xmlns:m="http://schemas.openxmlformats.org/officeDocument/2006/math" xmlns:v="urn:schemas-microsoft-com:vml" xmlns:wp14="http://schemas.microsoft.com/office/word/2010/wordprocessingDrawing" xmlns:wp="http://schemas.openxmlformats.org/drawingml/2006/wordprocessingDrawing" xmlns:w10="urn:schemas-microsoft-com:office:word" xmlns:w="http://schemas.openxmlformats.org/wordprocessingml/2006/main" xmlns:w14="http://schemas.microsoft.com/office/word/2010/wordml" xmlns:w15="http://schemas.microsoft.com/office/word/2012/wordml" xmlns:w16se="http://schemas.microsoft.com/office/word/2015/wordml/symex" xmlns:wpg="http://schemas.microsoft.com/office/word/2010/wordprocessingGroup" xmlns:wpi="http://schemas.microsoft.com/office/word/2010/wordprocessingInk" xmlns:wne="http://schemas.microsoft.com/office/word/2006/wordml" xmlns:wps="http://schemas.microsoft.com/office/word/2010/wordprocessingShape" mc:Ignorable="w14 w15 w16se wp14"&gt;&lt;w:abstractNum w:abstractNumId="0" w15:restartNumberingAfterBreak="0"&gt;&lt;w:nsid w:val="FFFFFF7C"/&gt;&lt;w:multiLevelType w:val="singleLevel"/&gt;&lt;w:tmpl w:val="1D6AD0EC"/&gt;&lt;w:lvl w:ilvl="0"&gt;&lt;w:start w:val="1"/&gt;&lt;w:numFmt w:val="decimal"/&gt;&lt;w:lvlText w:val="%1."/&gt;&lt;w:lvlJc w:val="left"/&gt;&lt;w:pPr&gt;&lt;w:tabs&gt;&lt;w:tab w:val="num" w:pos="1492"/&gt;&lt;/w:tabs&gt;&lt;w:ind w:left="1492" w:hanging="360"/&gt;&lt;/w:pPr&gt;&lt;/w:lvl&gt;&lt;/w:abstractNum&gt;&lt;w:abstractNum w:abstractNumId="1" w15:restartNumberingAfterBreak="0"&gt;&lt;w:nsid w:val="FFFFFF7D"/&gt;&lt;w:multiLevelType w:val="singleLevel"/&gt;&lt;w:tmpl w:val="6C44DE1A"/&gt;&lt;w:lvl w:ilvl="0"&gt;&lt;w:start w:val="1"/&gt;&lt;w:numFmt w:val="decimal"/&gt;&lt;w:lvlText w:val="%1."/&gt;&lt;w:lvlJc w:val="left"/&gt;&lt;w:pPr&gt;&lt;w:tabs&gt;&lt;w:tab w:val="num" w:pos="1209"/&gt;&lt;/w:tabs&gt;&lt;w:ind w:left="1209" w:hanging="360"/&gt;&lt;/w:pPr&gt;&lt;/w:lvl&gt;&lt;/w:abstractNum&gt;&lt;w:abstractNum w:abstractNumId="2" w15:restartNumberingAfterBreak="0"&gt;&lt;w:nsid w:val="FFFFFF7E"/&gt;&lt;w:multiLevelType w:val="singleLevel"/&gt;&lt;w:tmpl w:val="83748C94"/&gt;&lt;w:lvl w:ilvl="0"&gt;&lt;w:start w:val="1"/&gt;&lt;w:numFmt w:val="decimal"/&gt;&lt;w:lvlText w:val="%1."/&gt;&lt;w:lvlJc w:val="left"/&gt;&lt;w:pPr&gt;&lt;w:tabs&gt;&lt;w:tab w:val="num" w:pos="926"/&gt;&lt;/w:tabs&gt;&lt;w:ind w:left="926" w:hanging="360"/&gt;&lt;/w:pPr&gt;&lt;/w:lvl&gt;&lt;/w:abstractNum&gt;&lt;w:abstractNum w:abstractNumId="3" w15:restartNumberingAfterBreak="0"&gt;&lt;w:nsid w:val="FFFFFF7F"/&gt;&lt;w:multiLevelType w:val="singleLevel"/&gt;&lt;w:tmpl w:val="871A6F0C"/&gt;&lt;w:lvl w:ilvl="0"&gt;&lt;w:start w:val="1"/&gt;&lt;w:numFmt w:val="decimal"/&gt;&lt;w:lvlText w:val="%1."/&gt;&lt;w:lvlJc w:val="left"/&gt;&lt;w:pPr&gt;&lt;w:tabs&gt;&lt;w:tab w:val="num" w:pos="643"/&gt;&lt;/w:tabs&gt;&lt;w:ind w:left="643" w:hanging="360"/&gt;&lt;/w:pPr&gt;&lt;/w:lvl&gt;&lt;/w:abstractNum&gt;&lt;w:abstractNum w:abstractNumId="4" w15:restartNumberingAfterBreak="0"&gt;&lt;w:nsid w:val="FFFFFF80"/&gt;&lt;w:multiLevelType w:val="singleLevel"/&gt;&lt;w:tmpl w:val="ED1CE676"/&gt;&lt;w:lvl w:ilvl="0"&gt;&lt;w:start w:val="1"/&gt;&lt;w:numFmt w:val="bullet"/&gt;&lt;w:lvlText w:val=""/&gt;&lt;w:lvlJc w:val="left"/&gt;&lt;w:pPr&gt;&lt;w:tabs&gt;&lt;w:tab w:val="num" w:pos="1492"/&gt;&lt;/w:tabs&gt;&lt;w:ind w:left="1492" w:hanging="360"/&gt;&lt;/w:pPr&gt;&lt;w:rPr&gt;&lt;w:rFonts w:ascii="Symbol" w:hAnsi="Symbol" w:hint="default"/&gt;&lt;/w:rPr&gt;&lt;/w:lvl&gt;&lt;/w:abstractNum&gt;&lt;w:abstractNum w:abstractNumId="5" w15:restartNumberingAfterBreak="0"&gt;&lt;w:nsid w:val="FFFFFF81"/&gt;&lt;w:multiLevelType w:val="singleLevel"/&gt;&lt;w:tmpl w:val="DEF60714"/&gt;&lt;w:lvl w:ilvl="0"&gt;&lt;w:start w:val="1"/&gt;&lt;w:numFmt w:val="bullet"/&gt;&lt;w:lvlText w:val=""/&gt;&lt;w:lvlJc w:val="left"/&gt;&lt;w:pPr&gt;&lt;w:tabs&gt;&lt;w:tab w:val="num" w:pos="1209"/&gt;&lt;/w:tabs&gt;&lt;w:ind w:left="1209" w:hanging="360"/&gt;&lt;/w:pPr&gt;&lt;w:rPr&gt;&lt;w:rFonts w:ascii="Symbol" w:hAnsi="Symbol" w:hint="default"/&gt;&lt;/w:rPr&gt;&lt;/w:lvl&gt;&lt;/w:abstractNum&gt;&lt;w:abstractNum w:abstractNumId="6" w15:restartNumberingAfterBreak="0"&gt;&lt;w:nsid w:val="FFFFFF82"/&gt;&lt;w:multiLevelType w:val="singleLevel"/&gt;&lt;w:tmpl w:val="91EA47E8"/&gt;&lt;w:lvl w:ilvl="0"&gt;&lt;w:start w:val="1"/&gt;&lt;w:numFmt w:val="bullet"/&gt;&lt;w:lvlText w:val=""/&gt;&lt;w:lvlJc w:val="left"/&gt;&lt;w:pPr&gt;&lt;w:tabs&gt;&lt;w:tab w:val="num" w:pos="926"/&gt;&lt;/w:tabs&gt;&lt;w:ind w:left="926" w:hanging="360"/&gt;&lt;/w:pPr&gt;&lt;w:rPr&gt;&lt;w:rFonts w:ascii="Symbol" w:hAnsi="Symbol" w:hint="default"/&gt;&lt;/w:rPr&gt;&lt;/w:lvl&gt;&lt;/w:abstractNum&gt;&lt;w:abstractNum w:abstractNumId="7" w15:restartNumberingAfterBreak="0"&gt;&lt;w:nsid w:val="FFFFFF83"/&gt;&lt;w:multiLevelType w:val="singleLevel"/&gt;&lt;w:tmpl w:val="9278B09A"/&gt;&lt;w:lvl w:ilvl="0"&gt;&lt;w:start w:val="1"/&gt;&lt;w:numFmt w:val="bullet"/&gt;&lt;w:lvlText w:val=""/&gt;&lt;w:lvlJc w:val="left"/&gt;&lt;w:pPr&gt;&lt;w:tabs&gt;&lt;w:tab w:val="num" w:pos="643"/&gt;&lt;/w:tabs&gt;&lt;w:ind w:left="643" w:hanging="360"/&gt;&lt;/w:pPr&gt;&lt;w:rPr&gt;&lt;w:rFonts w:ascii="Symbol" w:hAnsi="Symbol" w:hint="default"/&gt;&lt;/w:rPr&gt;&lt;/w:lvl&gt;&lt;/w:abstractNum&gt;&lt;w:abstractNum w:abstractNumId="8" w15:restartNumberingAfterBreak="0"&gt;&lt;w:nsid w:val="17071BBC"/&gt;&lt;w:multiLevelType w:val="multilevel"/&gt;&lt;w:tmpl w:val="B512299C"/&gt;&lt;w:lvl w:ilvl="0"&gt;&lt;w:start w:val="1"/&gt;&lt;w:numFmt w:val="decimal"/&gt;&lt;w:pStyle w:val="ListNumber"/&gt;&lt;w:lvlText w:val="%1."/&gt;&lt;w:lvlJc w:val="left"/&gt;&lt;w:pPr&gt;&lt;w:ind w:left="360" w:hanging="360"/&gt;&lt;/w:pPr&gt;&lt;w:rPr&gt;&lt;w:rFonts w:hint="default"/&gt;&lt;/w:rPr&gt;&lt;/w:lvl&gt;&lt;w:lvl w:ilvl="1"&gt;&lt;w:start w:val="1"/&gt;&lt;w:numFmt w:val="lowerLetter"/&gt;&lt;w:pStyle w:val="ListNumber2"/&gt;&lt;w:lvlText w:val="%2."/&gt;&lt;w:lvlJc w:val="left"/&gt;&lt;w:pPr&gt;&lt;w:ind w:left="720" w:hanging="360"/&gt;&lt;/w:pPr&gt;&lt;w:rPr&gt;&lt;w:rFonts w:hint="default"/&gt;&lt;/w:rPr&gt;&lt;/w:lvl&gt;&lt;w:lvl w:ilvl="2"&gt;&lt;w:start w:val="1"/&gt;&lt;w:numFmt w:val="lowerRoman"/&gt;&lt;w:pStyle w:val="ListNumber3"/&gt;&lt;w:lvlText w:val="%3)"/&gt;&lt;w:lvlJc w:val="left"/&gt;&lt;w:pPr&gt;&lt;w:ind w:left="1080" w:hanging="360"/&gt;&lt;/w:pPr&gt;&lt;w:rPr&gt;&lt;w:rFonts w:hint="default"/&gt;&lt;/w:rPr&gt;&lt;/w:lvl&gt;&lt;w:lvl w:ilvl="3"&gt;&lt;w:start w:val="1"/&gt;&lt;w:numFmt w:val="decimal"/&gt;&lt;w:pStyle w:val="ListNumber4"/&gt;&lt;w:lvlText w:val="%4)"/&gt;&lt;w:lvlJc w:val="left"/&gt;&lt;w:pPr&gt;&lt;w:ind w:left="1440" w:hanging="360"/&gt;&lt;/w:pPr&gt;&lt;w:rPr&gt;&lt;w:rFonts w:hint="default"/&gt;&lt;/w:rPr&gt;&lt;/w:lvl&gt;&lt;w:lvl w:ilvl="4"&gt;&lt;w:start w:val="1"/&gt;&lt;w:numFmt w:val="lowerLetter"/&gt;&lt;w:pStyle w:val="ListNumber5"/&gt;&lt;w:lvlText w:val="%5)"/&gt;&lt;w:lvlJc w:val="left"/&gt;&lt;w:pPr&gt;&lt;w:ind w:left="1800" w:hanging="360"/&gt;&lt;/w:pPr&gt;&lt;w:rPr&gt;&lt;w:rFonts w:hint="default"/&gt;&lt;/w:rPr&gt;&lt;/w:lvl&gt;&lt;w:lvl w:ilvl="5"&gt;&lt;w:start w:val="1"/&gt;&lt;w:numFmt w:val="lowerRoman"/&gt;&lt;w:lvlText w:val="%6)"/&gt;&lt;w:lvlJc w:val="left"/&gt;&lt;w:pPr&gt;&lt;w:ind w:left="2160" w:hanging="360"/&gt;&lt;/w:pPr&gt;&lt;w:rPr&gt;&lt;w:rFonts w:hint="default"/&gt;&lt;/w:rPr&gt;&lt;/w:lvl&gt;&lt;w:lvl w:ilvl="6"&gt;&lt;w:start w:val="1"/&gt;&lt;w:numFmt w:val="decimal"/&gt;&lt;w:lvlText w:val="(%7)"/&gt;&lt;w:lvlJc w:val="left"/&gt;&lt;w:pPr&gt;&lt;w:ind w:left="2520" w:hanging="360"/&gt;&lt;/w:pPr&gt;&lt;w:rPr&gt;&lt;w:rFonts w:hint="default"/&gt;&lt;/w:rPr&gt;&lt;/w:lvl&gt;&lt;w:lvl w:ilvl="7"&gt;&lt;w:start w:val="1"/&gt;&lt;w:numFmt w:val="lowerLetter"/&gt;&lt;w:lvlText w:val="(%8)"/&gt;&lt;w:lvlJc w:val="left"/&gt;&lt;w:pPr&gt;&lt;w:ind w:left="2880" w:hanging="360"/&gt;&lt;/w:pPr&gt;&lt;w:rPr&gt;&lt;w:rFonts w:hint="default"/&gt;&lt;/w:rPr&gt;&lt;/w:lvl&gt;&lt;w:lvl w:ilvl="8"&gt;&lt;w:start w:val="1"/&gt;&lt;w:numFmt w:val="lowerRoman"/&gt;&lt;w:lvlText w:val="(%9)"/&gt;&lt;w:lvlJc w:val="left"/&gt;&lt;w:pPr&gt;&lt;w:ind w:left="3240" w:hanging="360"/&gt;&lt;/w:pPr&gt;&lt;w:rPr&gt;&lt;w:rFonts w:hint="default"/&gt;&lt;/w:rPr&gt;&lt;/w:lvl&gt;&lt;/w:abstractNum&gt;&lt;w:abstractNum w:abstractNumId="9" w15:restartNumberingAfterBreak="0"&gt;&lt;w:nsid w:val="3CE155D5"/&gt;&lt;w:multiLevelType w:val="multilevel"/&gt;&lt;w:tmpl w:val="041D001D"/&gt;&lt;w:lvl w:ilvl="0"&gt;&lt;w:start w:val="1"/&gt;&lt;w:numFmt w:val="decimal"/&gt;&lt;w:lvlText w:val="%1)"/&gt;&lt;w:lvlJc w:val="left"/&gt;&lt;w:pPr&gt;&lt;w:ind w:left="360" w:hanging="360"/&gt;&lt;/w:pPr&gt;&lt;/w:lvl&gt;&lt;w:lvl w:ilvl="1"&gt;&lt;w:start w:val="1"/&gt;&lt;w:numFmt w:val="lowerLetter"/&gt;&lt;w:lvlText w:val="%2)"/&gt;&lt;w:lvlJc w:val="left"/&gt;&lt;w:pPr&gt;&lt;w:ind w:left="720" w:hanging="360"/&gt;&lt;/w:pPr&gt;&lt;/w:lvl&gt;&lt;w:lvl w:ilvl="2"&gt;&lt;w:start w:val="1"/&gt;&lt;w:numFmt w:val="lowerRoman"/&gt;&lt;w:lvlText w:val="%3)"/&gt;&lt;w:lvlJc w:val="left"/&gt;&lt;w:pPr&gt;&lt;w:ind w:left="1080" w:hanging="360"/&gt;&lt;/w:pPr&gt;&lt;/w:lvl&gt;&lt;w:lvl w:ilvl="3"&gt;&lt;w:start w:val="1"/&gt;&lt;w:numFmt w:val="decimal"/&gt;&lt;w:lvlText w:val="(%4)"/&gt;&lt;w:lvlJc w:val="left"/&gt;&lt;w:pPr&gt;&lt;w:ind w:left="1440" w:hanging="360"/&gt;&lt;/w:pPr&gt;&lt;/w:lvl&gt;&lt;w:lvl w:ilvl="4"&gt;&lt;w:start w:val="1"/&gt;&lt;w:numFmt w:val="lowerLetter"/&gt;&lt;w:lvlText w:val="(%5)"/&gt;&lt;w:lvlJc w:val="left"/&gt;&lt;w:pPr&gt;&lt;w:ind w:left="1800" w:hanging="360"/&gt;&lt;/w:pPr&gt;&lt;/w:lvl&gt;&lt;w:lvl w:ilvl="5"&gt;&lt;w:start w:val="1"/&gt;&lt;w:numFmt w:val="lowerRoman"/&gt;&lt;w:lvlText w:val="(%6)"/&gt;&lt;w:lvlJc w:val="left"/&gt;&lt;w:pPr&gt;&lt;w:ind w:left="2160" w:hanging="360"/&gt;&lt;/w:pPr&gt;&lt;/w:lvl&gt;&lt;w:lvl w:ilvl="6"&gt;&lt;w:start w:val="1"/&gt;&lt;w:numFmt w:val="decimal"/&gt;&lt;w:lvlText w:val="%7."/&gt;&lt;w:lvlJc w:val="left"/&gt;&lt;w:pPr&gt;&lt;w:ind w:left="2520" w:hanging="360"/&gt;&lt;/w:pPr&gt;&lt;/w:lvl&gt;&lt;w:lvl w:ilvl="7"&gt;&lt;w:start w:val="1"/&gt;&lt;w:numFmt w:val="lowerLetter"/&gt;&lt;w:lvlText w:val="%8."/&gt;&lt;w:lvlJc w:val="left"/&gt;&lt;w:pPr&gt;&lt;w:ind w:left="2880" w:hanging="360"/&gt;&lt;/w:pPr&gt;&lt;/w:lvl&gt;&lt;w:lvl w:ilvl="8"&gt;&lt;w:start w:val="1"/&gt;&lt;w:numFmt w:val="lowerRoman"/&gt;&lt;w:lvlText w:val="%9."/&gt;&lt;w:lvlJc w:val="left"/&gt;&lt;w:pPr&gt;&lt;w:ind w:left="3240" w:hanging="360"/&gt;&lt;/w:pPr&gt;&lt;/w:lvl&gt;&lt;/w:abstractNum&gt;&lt;w:abstractNum w:abstractNumId="10" w15:restartNumberingAfterBreak="0"&gt;&lt;w:nsid w:val="3D727479"/&gt;&lt;w:multiLevelType w:val="multilevel"/&gt;&lt;w:tmpl w:val="041D0023"/&gt;&lt;w:lvl w:ilvl="0"&gt;&lt;w:start w:val="1"/&gt;&lt;w:numFmt w:val="upperRoman"/&gt;&lt;w:lvlText w:val="Artikel %1."/&gt;&lt;w:lvlJc w:val="left"/&gt;&lt;w:pPr&gt;&lt;w:ind w:left="0" w:firstLine="0"/&gt;&lt;/w:pPr&gt;&lt;/w:lvl&gt;&lt;w:lvl w:ilvl="1"&gt;&lt;w:start w:val="1"/&gt;&lt;w:numFmt w:val="decimalZero"/&gt;&lt;w:isLgl/&gt;&lt;w:lvlText w:val="Avsnitt %1.%2"/&gt;&lt;w:lvlJc w:val="left"/&gt;&lt;w:pPr&gt;&lt;w:ind w:left="0" w:firstLine="0"/&gt;&lt;/w:pPr&gt;&lt;/w:lvl&gt;&lt;w:lvl w:ilvl="2"&gt;&lt;w:start w:val="1"/&gt;&lt;w:numFmt w:val="lowerLetter"/&gt;&lt;w:lvlText w:val="(%3)"/&gt;&lt;w:lvlJc w:val="left"/&gt;&lt;w:pPr&gt;&lt;w:ind w:left="720" w:hanging="432"/&gt;&lt;/w:pPr&gt;&lt;/w:lvl&gt;&lt;w:lvl w:ilvl="3"&gt;&lt;w:start w:val="1"/&gt;&lt;w:numFmt w:val="lowerRoman"/&gt;&lt;w:lvlText w:val="(%4)"/&gt;&lt;w:lvlJc w:val="right"/&gt;&lt;w:pPr&gt;&lt;w:ind w:left="864" w:hanging="144"/&gt;&lt;/w:pPr&gt;&lt;/w:lvl&gt;&lt;w:lvl w:ilvl="4"&gt;&lt;w:start w:val="1"/&gt;&lt;w:numFmt w:val="decimal"/&gt;&lt;w:pStyle w:val="Heading5"/&gt;&lt;w:lvlText w:val="%5)"/&gt;&lt;w:lvlJc w:val="left"/&gt;&lt;w:pPr&gt;&lt;w:ind w:left="1008" w:hanging="432"/&gt;&lt;/w:pPr&gt;&lt;/w:lvl&gt;&lt;w:lvl w:ilvl="5"&gt;&lt;w:start w:val="1"/&gt;&lt;w:numFmt w:val="lowerLetter"/&gt;&lt;w:pStyle w:val="Heading6"/&gt;&lt;w:lvlText w:val="%6)"/&gt;&lt;w:lvlJc w:val="left"/&gt;&lt;w:pPr&gt;&lt;w:ind w:left="1152" w:hanging="432"/&gt;&lt;/w:pPr&gt;&lt;/w:lvl&gt;&lt;w:lvl w:ilvl="6"&gt;&lt;w:start w:val="1"/&gt;&lt;w:numFmt w:val="lowerRoman"/&gt;&lt;w:pStyle w:val="Heading7"/&gt;&lt;w:lvlText w:val="%7)"/&gt;&lt;w:lvlJc w:val="right"/&gt;&lt;w:pPr&gt;&lt;w:ind w:left="1296" w:hanging="288"/&gt;&lt;/w:pPr&gt;&lt;/w:lvl&gt;&lt;w:lvl w:ilvl="7"&gt;&lt;w:start w:val="1"/&gt;&lt;w:numFmt w:val="lowerLetter"/&gt;&lt;w:pStyle w:val="Heading8"/&gt;&lt;w:lvlText w:val="%8."/&gt;&lt;w:lvlJc w:val="left"/&gt;&lt;w:pPr&gt;&lt;w:ind w:left="1440" w:hanging="432"/&gt;&lt;/w:pPr&gt;&lt;/w:lvl&gt;&lt;w:lvl w:ilvl="8"&gt;&lt;w:start w:val="1"/&gt;&lt;w:numFmt w:val="lowerRoman"/&gt;&lt;w:pStyle w:val="Heading9"/&gt;&lt;w:lvlText w:val="%9."/&gt;&lt;w:lvlJc w:val="right"/&gt;&lt;w:pPr&gt;&lt;w:ind w:left="1584" w:hanging="144"/&gt;&lt;/w:pPr&gt;&lt;/w:lvl&gt;&lt;/w:abstractNum&gt;&lt;w:abstractNum w:abstractNumId="11" w15:restartNumberingAfterBreak="0"&gt;&lt;w:nsid w:val="43F95E9C"/&gt;&lt;w:multiLevelType w:val="multilevel"/&gt;&lt;w:tmpl w:val="5FAE225A"/&gt;&lt;w:lvl w:ilvl="0"&gt;&lt;w:start w:val="1"/&gt;&lt;w:numFmt w:val="decimal"/&gt;&lt;w:pStyle w:val="NumberedHeading1"/&gt;&lt;w:lvlText w:val="%1."/&gt;&lt;w:lvlJc w:val="left"/&gt;&lt;w:pPr&gt;&lt;w:ind w:left="907" w:hanging="907"/&gt;&lt;/w:pPr&gt;&lt;w:rPr&gt;&lt;w:rFonts w:hint="default"/&gt;&lt;/w:rPr&gt;&lt;/w:lvl&gt;&lt;w:lvl w:ilvl="1"&gt;&lt;w:start w:val="1"/&gt;&lt;w:numFmt w:val="decimal"/&gt;&lt;w:pStyle w:val="NumberedHeading2"/&gt;&lt;w:lvlText w:val="%1.%2"/&gt;&lt;w:lvlJc w:val="left"/&gt;&lt;w:pPr&gt;&lt;w:ind w:left="907" w:hanging="907"/&gt;&lt;/w:pPr&gt;&lt;w:rPr&gt;&lt;w:rFonts w:hint="default"/&gt;&lt;/w:rPr&gt;&lt;/w:lvl&gt;&lt;w:lvl w:ilvl="2"&gt;&lt;w:start w:val="1"/&gt;&lt;w:numFmt w:val="decimal"/&gt;&lt;w:pStyle w:val="NumberedHeading3"/&gt;&lt;w:lvlText w:val="%1.%2.%3"/&gt;&lt;w:lvlJc w:val="left"/&gt;&lt;w:pPr&gt;&lt;w:ind w:left="907" w:hanging="907"/&gt;&lt;/w:pPr&gt;&lt;w:rPr&gt;&lt;w:rFonts w:hint="default"/&gt;&lt;/w:rPr&gt;&lt;/w:lvl&gt;&lt;w:lvl w:ilvl="3"&gt;&lt;w:start w:val="1"/&gt;&lt;w:numFmt w:val="decimal"/&gt;&lt;w:pStyle w:val="NumberedHeading4"/&gt;&lt;w:lvlText w:val="%1.%2.%3.%4"/&gt;&lt;w:lvlJc w:val="left"/&gt;&lt;w:pPr&gt;&lt;w:ind w:left="907" w:hanging="907"/&gt;&lt;/w:pPr&gt;&lt;w:rPr&gt;&lt;w:rFonts w:hint="default"/&gt;&lt;/w:rPr&gt;&lt;/w:lvl&gt;&lt;w:lvl w:ilvl="4"&gt;&lt;w:start w:val="1"/&gt;&lt;w:numFmt w:val="lowerLetter"/&gt;&lt;w:lvlText w:val="(%5)"/&gt;&lt;w:lvlJc w:val="left"/&gt;&lt;w:pPr&gt;&lt;w:ind w:left="907" w:hanging="907"/&gt;&lt;/w:pPr&gt;&lt;w:rPr&gt;&lt;w:rFonts w:hint="default"/&gt;&lt;/w:rPr&gt;&lt;/w:lvl&gt;&lt;w:lvl w:ilvl="5"&gt;&lt;w:start w:val="1"/&gt;&lt;w:numFmt w:val="lowerRoman"/&gt;&lt;w:lvlText w:val="(%6)"/&gt;&lt;w:lvlJc w:val="left"/&gt;&lt;w:pPr&gt;&lt;w:ind w:left="907" w:hanging="907"/&gt;&lt;/w:pPr&gt;&lt;w:rPr&gt;&lt;w:rFonts w:hint="default"/&gt;&lt;/w:rPr&gt;&lt;/w:lvl&gt;&lt;w:lvl w:ilvl="6"&gt;&lt;w:start w:val="1"/&gt;&lt;w:numFmt w:val="decimal"/&gt;&lt;w:lvlText w:val="%7."/&gt;&lt;w:lvlJc w:val="left"/&gt;&lt;w:pPr&gt;&lt;w:ind w:left="907" w:hanging="907"/&gt;&lt;/w:pPr&gt;&lt;w:rPr&gt;&lt;w:rFonts w:hint="default"/&gt;&lt;/w:rPr&gt;&lt;/w:lvl&gt;&lt;w:lvl w:ilvl="7"&gt;&lt;w:start w:val="1"/&gt;&lt;w:numFmt w:val="lowerLetter"/&gt;&lt;w:lvlText w:val="%8."/&gt;&lt;w:lvlJc w:val="left"/&gt;&lt;w:pPr&gt;&lt;w:ind w:left="907" w:hanging="907"/&gt;&lt;/w:pPr&gt;&lt;w:rPr&gt;&lt;w:rFonts w:hint="default"/&gt;&lt;/w:rPr&gt;&lt;/w:lvl&gt;&lt;w:lvl w:ilvl="8"&gt;&lt;w:start w:val="1"/&gt;&lt;w:numFmt w:val="lowerRoman"/&gt;&lt;w:lvlText w:val="%9."/&gt;&lt;w:lvlJc w:val="left"/&gt;&lt;w:pPr&gt;&lt;w:ind w:left="907" w:hanging="907"/&gt;&lt;/w:pPr&gt;&lt;w:rPr&gt;&lt;w:rFonts w:hint="default"/&gt;&lt;/w:rPr&gt;&lt;/w:lvl&gt;&lt;/w:abstractNum&gt;&lt;w:abstractNum w:abstractNumId="12" w15:restartNumberingAfterBreak="0"&gt;&lt;w:nsid w:val="4CEF34F7"/&gt;&lt;w:multiLevelType w:val="multilevel"/&gt;&lt;w:tmpl w:val="041D001F"/&gt;&lt;w:lvl w:ilvl="0"&gt;&lt;w:start w:val="1"/&gt;&lt;w:numFmt w:val="decimal"/&gt;&lt;w:lvlText w:val="%1."/&gt;&lt;w:lvlJc w:val="left"/&gt;&lt;w:pPr&gt;&lt;w:ind w:left="360" w:hanging="360"/&gt;&lt;/w:pPr&gt;&lt;/w:lvl&gt;&lt;w:lvl w:ilvl="1"&gt;&lt;w:start w:val="1"/&gt;&lt;w:numFmt w:val="decimal"/&gt;&lt;w:lvlText w:val="%1.%2."/&gt;&lt;w:lvlJc w:val="left"/&gt;&lt;w:pPr&gt;&lt;w:ind w:left="792" w:hanging="432"/&gt;&lt;/w:pPr&gt;&lt;/w:lvl&gt;&lt;w:lvl w:ilvl="2"&gt;&lt;w:start w:val="1"/&gt;&lt;w:numFmt w:val="decimal"/&gt;&lt;w:lvlText w:val="%1.%2.%3."/&gt;&lt;w:lvlJc w:val="left"/&gt;&lt;w:pPr&gt;&lt;w:ind w:left="1224" w:hanging="504"/&gt;&lt;/w:pPr&gt;&lt;/w:lvl&gt;&lt;w:lvl w:ilvl="3"&gt;&lt;w:start w:val="1"/&gt;&lt;w:numFmt w:val="decimal"/&gt;&lt;w:lvlText w:val="%1.%2.%3.%4."/&gt;&lt;w:lvlJc w:val="left"/&gt;&lt;w:pPr&gt;&lt;w:ind w:left="1728" w:hanging="648"/&gt;&lt;/w:pPr&gt;&lt;/w:lvl&gt;&lt;w:lvl w:ilvl="4"&gt;&lt;w:start w:val="1"/&gt;&lt;w:numFmt w:val="decimal"/&gt;&lt;w:lvlText w:val="%1.%2.%3.%4.%5."/&gt;&lt;w:lvlJc w:val="left"/&gt;&lt;w:pPr&gt;&lt;w:ind w:left="2232" w:hanging="792"/&gt;&lt;/w:pPr&gt;&lt;/w:lvl&gt;&lt;w:lvl w:ilvl="5"&gt;&lt;w:start w:val="1"/&gt;&lt;w:numFmt w:val="decimal"/&gt;&lt;w:lvlText w:val="%1.%2.%3.%4.%5.%6."/&gt;&lt;w:lvlJc w:val="left"/&gt;&lt;w:pPr&gt;&lt;w:ind w:left="2736" w:hanging="936"/&gt;&lt;/w:pPr&gt;&lt;/w:lvl&gt;&lt;w:lvl w:ilvl="6"&gt;&lt;w:start w:val="1"/&gt;&lt;w:numFmt w:val="decimal"/&gt;&lt;w:lvlText w:val="%1.%2.%3.%4.%5.%6.%7."/&gt;&lt;w:lvlJc w:val="left"/&gt;&lt;w:pPr&gt;&lt;w:ind w:left="3240" w:hanging="1080"/&gt;&lt;/w:pPr&gt;&lt;/w:lvl&gt;&lt;w:lvl w:ilvl="7"&gt;&lt;w:start w:val="1"/&gt;&lt;w:numFmt w:val="decimal"/&gt;&lt;w:lvlText w:val="%1.%2.%3.%4.%5.%6.%7.%8."/&gt;&lt;w:lvlJc w:val="left"/&gt;&lt;w:pPr&gt;&lt;w:ind w:left="3744" w:hanging="1224"/&gt;&lt;/w:pPr&gt;&lt;/w:lvl&gt;&lt;w:lvl w:ilvl="8"&gt;&lt;w:start w:val="1"/&gt;&lt;w:numFmt w:val="decimal"/&gt;&lt;w:lvlText w:val="%1.%2.%3.%4.%5.%6.%7.%8.%9."/&gt;&lt;w:lvlJc w:val="left"/&gt;&lt;w:pPr&gt;&lt;w:ind w:left="4320" w:hanging="1440"/&gt;&lt;/w:pPr&gt;&lt;/w:lvl&gt;&lt;/w:abstractNum&gt;&lt;w:abstractNum w:abstractNumId="13" w15:restartNumberingAfterBreak="0"&gt;&lt;w:nsid w:val="566F2E6D"/&gt;&lt;w:multiLevelType w:val="multilevel"/&gt;&lt;w:tmpl w:val="6FD4AAFC"/&gt;&lt;w:lvl w:ilvl="0"&gt;&lt;w:start w:val="1"/&gt;&lt;w:numFmt w:val="bullet"/&gt;&lt;w:pStyle w:val="ListBullet"/&gt;&lt;w:lvlText w:val="—"/&gt;&lt;w:lvlJc w:val="left"/&gt;&lt;w:pPr&gt;&lt;w:ind w:left="360" w:hanging="360"/&gt;&lt;/w:pPr&gt;&lt;w:rPr&gt;&lt;w:rFonts w:ascii="Calibri" w:hAnsi="Calibri" w:hint="default"/&gt;&lt;w:color w:val="auto"/&gt;&lt;/w:rPr&gt;&lt;/w:lvl&gt;&lt;w:lvl w:ilvl="1"&gt;&lt;w:start w:val="1"/&gt;&lt;w:numFmt w:val="bullet"/&gt;&lt;w:pStyle w:val="ListBullet2"/&gt;&lt;w:lvlText w:val="—"/&gt;&lt;w:lvlJc w:val="left"/&gt;&lt;w:pPr&gt;&lt;w:ind w:left="720" w:hanging="360"/&gt;&lt;/w:pPr&gt;&lt;w:rPr&gt;&lt;w:rFonts w:ascii="Calibri" w:hAnsi="Calibri" w:hint="default"/&gt;&lt;w:color w:val="auto"/&gt;&lt;/w:rPr&gt;&lt;/w:lvl&gt;&lt;w:lvl w:ilvl="2"&gt;&lt;w:start w:val="1"/&gt;&lt;w:numFmt w:val="bullet"/&gt;&lt;w:pStyle w:val="ListBullet3"/&gt;&lt;w:lvlText w:val="—"/&gt;&lt;w:lvlJc w:val="left"/&gt;&lt;w:pPr&gt;&lt;w:ind w:left="1080" w:hanging="360"/&gt;&lt;/w:pPr&gt;&lt;w:rPr&gt;&lt;w:rFonts w:ascii="Calibri" w:hAnsi="Calibri" w:hint="default"/&gt;&lt;w:color w:val="auto"/&gt;&lt;/w:rPr&gt;&lt;/w:lvl&gt;&lt;w:lvl w:ilvl="3"&gt;&lt;w:start w:val="1"/&gt;&lt;w:numFmt w:val="bullet"/&gt;&lt;w:pStyle w:val="ListBullet4"/&gt;&lt;w:lvlText w:val="—"/&gt;&lt;w:lvlJc w:val="left"/&gt;&lt;w:pPr&gt;&lt;w:ind w:left="1440" w:hanging="360"/&gt;&lt;/w:pPr&gt;&lt;w:rPr&gt;&lt;w:rFonts w:ascii="Calibri" w:hAnsi="Calibri" w:hint="default"/&gt;&lt;w:color w:val="auto"/&gt;&lt;/w:rPr&gt;&lt;/w:lvl&gt;&lt;w:lvl w:ilvl="4"&gt;&lt;w:start w:val="1"/&gt;&lt;w:numFmt w:val="bullet"/&gt;&lt;w:pStyle w:val="ListBullet5"/&gt;&lt;w:lvlText w:val="—"/&gt;&lt;w:lvlJc w:val="left"/&gt;&lt;w:pPr&gt;&lt;w:ind w:left="1800" w:hanging="360"/&gt;&lt;/w:pPr&gt;&lt;w:rPr&gt;&lt;w:rFonts w:ascii="Calibri" w:hAnsi="Calibri" w:hint="default"/&gt;&lt;w:color w:val="auto"/&gt;&lt;/w:rPr&gt;&lt;/w:lvl&gt;&lt;w:lvl w:ilvl="5"&gt;&lt;w:start w:val="1"/&gt;&lt;w:numFmt w:val="bullet"/&gt;&lt;w:lvlText w:val="»"/&gt;&lt;w:lvlJc w:val="left"/&gt;&lt;w:pPr&gt;&lt;w:ind w:left="2160" w:hanging="360"/&gt;&lt;/w:pPr&gt;&lt;w:rPr&gt;&lt;w:rFonts w:ascii="Calibri" w:hAnsi="Calibri" w:hint="default"/&gt;&lt;w:color w:val="auto"/&gt;&lt;/w:rPr&gt;&lt;/w:lvl&gt;&lt;w:lvl w:ilvl="6"&gt;&lt;w:start w:val="1"/&gt;&lt;w:numFmt w:val="bullet"/&gt;&lt;w:lvlText w:val="•"/&gt;&lt;w:lvlJc w:val="left"/&gt;&lt;w:pPr&gt;&lt;w:ind w:left="2520" w:hanging="360"/&gt;&lt;/w:pPr&gt;&lt;w:rPr&gt;&lt;w:rFonts w:ascii="Calibri" w:hAnsi="Calibri" w:hint="default"/&gt;&lt;w:color w:val="auto"/&gt;&lt;/w:rPr&gt;&lt;/w:lvl&gt;&lt;w:lvl w:ilvl="7"&gt;&lt;w:start w:val="1"/&gt;&lt;w:numFmt w:val="bullet"/&gt;&lt;w:lvlText w:val="–"/&gt;&lt;w:lvlJc w:val="left"/&gt;&lt;w:pPr&gt;&lt;w:ind w:left="2880" w:hanging="360"/&gt;&lt;/w:pPr&gt;&lt;w:rPr&gt;&lt;w:rFonts w:ascii="Calibri" w:hAnsi="Calibri" w:hint="default"/&gt;&lt;w:color w:val="auto"/&gt;&lt;/w:rPr&gt;&lt;/w:lvl&gt;&lt;w:lvl w:ilvl="8"&gt;&lt;w:start w:val="1"/&gt;&lt;w:numFmt w:val="bullet"/&gt;&lt;w:lvlText w:val="»"/&gt;&lt;w:lvlJc w:val="left"/&gt;&lt;w:pPr&gt;&lt;w:ind w:left="3240" w:hanging="360"/&gt;&lt;/w:pPr&gt;&lt;w:rPr&gt;&lt;w:rFonts w:ascii="Calibri" w:hAnsi="Calibri" w:hint="default"/&gt;&lt;w:color w:val="auto"/&gt;&lt;/w:rPr&gt;&lt;/w:lvl&gt;&lt;/w:abstractNum&gt;&lt;w:num w:numId="1"&gt;&lt;w:abstractNumId w:val="13"/&gt;&lt;/w:num&gt;&lt;w:num w:numId="2"&gt;&lt;w:abstractNumId w:val="7"/&gt;&lt;/w:num&gt;&lt;w:num w:numId="3"&gt;&lt;w:abstractNumId w:val="6"/&gt;&lt;/w:num&gt;&lt;w:num w:numId="4"&gt;&lt;w:abstractNumId w:val="5"/&gt;&lt;/w:num&gt;&lt;w:num w:numId="5"&gt;&lt;w:abstractNumId w:val="4"/&gt;&lt;/w:num&gt;&lt;w:num w:numId="6"&gt;&lt;w:abstractNumId w:val="8"/&gt;&lt;/w:num&gt;&lt;w:num w:numId="7"&gt;&lt;w:abstractNumId w:val="3"/&gt;&lt;/w:num&gt;&lt;w:num w:numId="8"&gt;&lt;w:abstractNumId w:val="2"/&gt;&lt;/w:num&gt;&lt;w:num w:numId="9"&gt;&lt;w:abstractNumId w:val="1"/&gt;&lt;/w:num&gt;&lt;w:num w:numId="10"&gt;&lt;w:abstractNumId w:val="0"/&gt;&lt;/w:num&gt;&lt;w:num w:numId="11"&gt;&lt;w:abstractNumId w:val="13"/&gt;&lt;w:lvlOverride w:ilvl="0"&gt;&lt;w:startOverride w:val="1"/&gt;&lt;/w:lvlOverride&gt;&lt;w:lvlOverride w:ilvl="1"&gt;&lt;w:startOverride w:val="1"/&gt;&lt;/w:lvlOverride&gt;&lt;w:lvlOverride w:ilvl="2"&gt;&lt;w:startOverride w:val="1"/&gt;&lt;/w:lvlOverride&gt;&lt;w:lvlOverride w:ilvl="3"&gt;&lt;w:startOverride w:val="1"/&gt;&lt;/w:lvlOverride&gt;&lt;w:lvlOverride w:ilvl="4"&gt;&lt;w:startOverride w:val="1"/&gt;&lt;/w:lvlOverride&gt;&lt;w:lvlOverride w:ilvl="5"&gt;&lt;w:startOverride w:val="1"/&gt;&lt;/w:lvlOverride&gt;&lt;w:lvlOverride w:ilvl="6"&gt;&lt;w:startOverride w:val="1"/&gt;&lt;/w:lvlOverride&gt;&lt;w:lvlOverride w:ilvl="7"&gt;&lt;w:startOverride w:val="1"/&gt;&lt;/w:lvlOverride&gt;&lt;w:lvlOverride w:ilvl="8"&gt;&lt;w:startOverride w:val="1"/&gt;&lt;/w:lvlOverride&gt;&lt;/w:num&gt;&lt;w:num w:numId="12"&gt;&lt;w:abstractNumId w:val="11"/&gt;&lt;/w:num&gt;&lt;w:num w:numId="13"&gt;&lt;w:abstractNumId w:val="12"/&gt;&lt;/w:num&gt;&lt;w:num w:numId="14"&gt;&lt;w:abstractNumId w:val="9"/&gt;&lt;/w:num&gt;&lt;w:num w:numId="15"&gt;&lt;w:abstractNumId w:val="10"/&gt;&lt;/w:num&gt;&lt;/w:numbering&gt;&lt;/pkg:xmlData&gt;&lt;/pkg:part&gt;&lt;/pkg:package&gt;
-</Namn>
-      <Titel>&lt;?xml version="1.0" standalone="yes"?&gt;
-&lt;?mso-application progid="Word.Document"?&gt;
-&lt;pkg:package xmlns:pkg="http://schemas.microsoft.com/office/2006/xmlPackage"&gt;&lt;pkg:part pkg:name="/_rels/.rels" pkg:contentType="application/vnd.openxmlformats-package.relationships+xml" pkg:padding="512"&gt;&lt;pkg:xmlData&gt;&lt;Relationships xmlns="http://schemas.openxmlformats.org/package/2006/relationships"&gt;&lt;Relationship Id="rId1" Type="http://schemas.openxmlformats.org/officeDocument/2006/relationships/officeDocument" Target="word/document.xml"/&gt;&lt;/Relationships&gt;&lt;/pkg:xmlData&gt;&lt;/pkg:part&gt;&lt;pkg:part pkg:name="/word/_rels/document.xml.rels" pkg:contentType="application/vnd.openxmlformats-package.relationships+xml" pkg:padding="256"&gt;&lt;pkg:xmlData&gt;&lt;Relationships xmlns="http://schemas.openxmlformats.org/package/2006/relationships"&gt;&lt;Relationship Id="rId3" Type="http://schemas.openxmlformats.org/officeDocument/2006/relationships/glossaryDocument" Target="glossary/document.xml"/&gt;&lt;Relationship Id="rId2" Type="http://schemas.openxmlformats.org/officeDocument/2006/relationships/styles" Target="styles.xml"/&gt;&lt;Relationship Id="rId1" Type="http://schemas.openxmlformats.org/officeDocument/2006/relationships/numbering" Target="numbering.xml"/&gt;&lt;/Relationships&gt;&lt;/pkg:xmlData&gt;&lt;/pkg:part&gt;&lt;pkg:part pkg:name="/word/document.xml" pkg:contentType="application/vnd.openxmlformats-officedocument.wordprocessingml.document.main+xml"&gt;&lt;pkg:xmlData&gt;&lt;w:document xmlns:wpc="http://schemas.microsoft.com/office/word/2010/wordprocessingCanvas" xmlns:cx="http://schemas.microsoft.com/office/drawing/2014/chartex" xmlns:cx1="http://schemas.microsoft.com/office/drawing/2015/9/8/chartex" xmlns:cx2="http://schemas.microsoft.com/office/drawing/2015/10/21/chartex" xmlns:cx3="http://schemas.microsoft.com/office/drawing/2016/5/9/chartex" xmlns:cx4="http://schemas.microsoft.com/office/drawing/2016/5/10/chartex" xmlns:cx5="http://schemas.microsoft.com/office/drawing/2016/5/11/chartex" xmlns:cx6="http://schemas.microsoft.com/office/drawing/2016/5/12/chartex" xmlns:cx7="http://schemas.microsoft.com/office/drawing/2016/5/13/chartex" xmlns:cx8="http://schemas.microsoft.com/office/drawing/2016/5/14/chartex" xmlns:mc="http://schemas.openxmlformats.org/markup-compatibility/2006" xmlns:o="urn:schemas-microsoft-com:office:office" xmlns:r="http://schemas.openxmlformats.org/officeDocument/2006/relationships" xmlns:m="http://schemas.openxmlformats.org/officeDocument/2006/math" xmlns:v="urn:schemas-microsoft-com:vml" xmlns:wp14="http://schemas.microsoft.com/office/word/2010/wordprocessingDrawing" xmlns:wp="http://schemas.openxmlformats.org/drawingml/2006/wordprocessingDrawing" xmlns:w10="urn:schemas-microsoft-com:office:word" xmlns:w="http://schemas.openxmlformats.org/wordprocessingml/2006/main" xmlns:w14="http://schemas.microsoft.com/office/word/2010/wordml" xmlns:w15="http://schemas.microsoft.com/office/word/2012/wordml" xmlns:w16se="http://schemas.microsoft.com/office/word/2015/wordml/symex" xmlns:wpg="http://schemas.microsoft.com/office/word/2010/wordprocessingGroup" xmlns:wpi="http://schemas.microsoft.com/office/word/2010/wordprocessingInk" xmlns:wne="http://schemas.microsoft.com/office/word/2006/wordml" xmlns:wps="http://schemas.microsoft.com/office/word/2010/wordprocessingShape" mc:Ignorable="w14 w15 w16se wp14"&gt;&lt;w:body&gt;&lt;w:sdt&gt;&lt;w:sdtPr&gt;&lt;w:tag w:val="regTitle"/&gt;&lt;w:id w:val="2084647071"/&gt;&lt;w:placeholder&gt;&lt;w:docPart w:val="F25D791C5B2F4E19930DB86356413466"/&gt;&lt;/w:placeholder&gt;&lt;/w:sdtPr&gt;&lt;w:sdtContent&gt;&lt;w:p&gt;&lt;w:r&gt;&lt;w:t&gt;Consultant&lt;/w:t&gt;&lt;/w:r&gt;&lt;/w:p&gt;&lt;/w:sdtContent&gt;&lt;/w:sdt&gt;&lt;w:sectPr&gt;&lt;w:pgSz w:w="12240" w:h="15840"/&gt;&lt;w:pgMar w:top="1417" w:right="1417" w:bottom="1417" w:left="1417" w:header="720" w:footer="720" w:gutter="0"/&gt;&lt;w:cols w:space="720"/&gt;&lt;/w:sectPr&gt;&lt;/w:body&gt;&lt;/w:document&gt;&lt;/pkg:xmlData&gt;&lt;/pkg:part&gt;&lt;pkg:part pkg:name="/word/glossary/settings.xml" pkg:contentType="application/vnd.openxmlformats-officedocument.wordprocessingml.settings+xml"&gt;&lt;pkg:xmlData&gt;&lt;w:settings xmlns:mc="http://schemas.openxmlformats.org/markup-compatibility/2006" xmlns:o="urn:schemas-microsoft-com:office:office" xmlns:r="http://schemas.openxmlformats.org/officeDocument/2006/relationships" xmlns:m="http://schemas.openxmlformats.org/officeDocument/2006/math" xmlns:v="urn:schemas-microsoft-com:vml" xmlns:w10="urn:schemas-microsoft-com:office:word" xmlns:w="http://schemas.openxmlformats.org/wordprocessingml/2006/main" xmlns:w14="http://schemas.microsoft.com/office/word/2010/wordml" xmlns:w15="http://schemas.microsoft.com/office/word/2012/wordml" xmlns:w16se="http://schemas.microsoft.com/office/word/2015/wordml/symex" xmlns:sl="http://schemas.openxmlformats.org/schemaLibrary/2006/main" mc:Ignorable="w14 w15 w16se"&gt;&lt;w:view w:val="normal"/&gt;&lt;w:defaultTabStop w:val="720"/&gt;&lt;w:characterSpacingControl w:val="doNotCompress"/&gt;&lt;w:compat&gt;&lt;w:useFELayout/&gt;&lt;w:compatSetting w:name="compatibilityMode" w:uri="http://schemas.microsoft.com/office/word" w:val="15"/&gt;&lt;w:compatSetting w:name="overrideTableStyleFontSizeAndJustification" w:uri="http://schemas.microsoft.com/office/word" w:val="1"/&gt;&lt;w:compatSetting w:name="enableOpenTypeFeatures" w:uri="http://schemas.microsoft.com/office/word" w:val="1"/&gt;&lt;w:compatSetting w:name="doNotFlipMirrorIndents" w:uri="http://schemas.microsoft.com/office/word" w:val="1"/&gt;&lt;w:compatSetting w:name="differentiateMultirowTableHeaders" w:uri="http://schemas.microsoft.com/office/word" w:val="1"/&gt;&lt;/w:compat&gt;&lt;m:mathPr&gt;&lt;m:mathFont m:val="Cambria Math"/&gt;&lt;m:brkBin m:val="before"/&gt;&lt;m:brkBinSub m:val="--"/&gt;&lt;m:smallFrac m:val="0"/&gt;&lt;m:dispDef/&gt;&lt;m:lMargin m:val="0"/&gt;&lt;m:rMargin m:val="0"/&gt;&lt;m:defJc m:val="centerGroup"/&gt;&lt;m:wrapIndent m:val="1440"/&gt;&lt;m:intLim m:val="subSup"/&gt;&lt;m:naryLim m:val="undOvr"/&gt;&lt;/m:mathPr&gt;&lt;w:themeFontLang w:val="en-GB"/&gt;&lt;w:clrSchemeMapping w:bg1="light1" w:t1="dark1" w:bg2="light2" w:t2="dark2" w:accent1="accent1" w:accent2="accent2" w:accent3="accent3" w:accent4="accent4" w:accent5="accent5" w:accent6="accent6" w:hyperlink="hyperlink" w:followedHyperlink="followedHyperlink"/&gt;&lt;w:decimalSymbol w:val=","/&gt;&lt;w:listSeparator w:val=";"/&gt;&lt;w15:chartTrackingRefBased/&gt;&lt;/w:settings&gt;&lt;/pkg:xmlData&gt;&lt;/pkg:part&gt;&lt;pkg:part pkg:name="/word/glossary/_rels/document.xml.rels" pkg:contentType="application/vnd.openxmlformats-package.relationships+xml"&gt;&lt;pkg:xmlData&gt;&lt;Relationships xmlns="http://schemas.openxmlformats.org/package/2006/relationships"&gt;&lt;Relationship Id="rId3" Type="http://schemas.openxmlformats.org/officeDocument/2006/relationships/webSettings" Target="webSettings.xml"/&gt;&lt;Relationship Id="rId2" Type="http://schemas.openxmlformats.org/officeDocument/2006/relationships/settings" Target="settings.xml"/&gt;&lt;Relationship Id="rId1" Type="http://schemas.openxmlformats.org/officeDocument/2006/relationships/styles" Target="styles.xml"/&gt;&lt;Relationship Id="rId4" Type="http://schemas.openxmlformats.org/officeDocument/2006/relationships/fontTable" Target="fontTable.xml"/&gt;&lt;/Relationships&gt;&lt;/pkg:xmlData&gt;&lt;/pkg:part&gt;&lt;pkg:part pkg:name="/word/glossary/document.xml" pkg:contentType="application/vnd.openxmlformats-officedocument.wordprocessingml.document.glossary+xml"&gt;&lt;pkg:xmlData&gt;&lt;w:glossaryDocument xmlns:wpc="http://schemas.microsoft.com/office/word/2010/wordprocessingCanvas" xmlns:cx="http://schemas.microsoft.com/office/drawing/2014/chartex" xmlns:cx1="http://schemas.microsoft.com/office/drawing/2015/9/8/chartex" xmlns:cx2="http://schemas.microsoft.com/office/drawing/2015/10/21/chartex" xmlns:cx3="http://schemas.microsoft.com/office/drawing/2016/5/9/chartex" xmlns:cx4="http://schemas.microsoft.com/office/drawing/2016/5/10/chartex" xmlns:cx5="http://schemas.microsoft.com/office/drawing/2016/5/11/chartex" xmlns:cx6="http://schemas.microsoft.com/office/drawing/2016/5/12/chartex" xmlns:cx7="http://schemas.microsoft.com/office/drawing/2016/5/13/chartex" xmlns:cx8="http://schemas.microsoft.com/office/drawing/2016/5/14/chartex" xmlns:mc="http://schemas.openxmlformats.org/markup-compatibility/2006" xmlns:o="urn:schemas-microsoft-com:office:office" xmlns:r="http://schemas.openxmlformats.org/officeDocument/2006/relationships" xmlns:m="http://schemas.openxmlformats.org/officeDocument/2006/math" xmlns:v="urn:schemas-microsoft-com:vml" xmlns:wp14="http://schemas.microsoft.com/office/word/2010/wordprocessingDrawing" xmlns:wp="http://schemas.openxmlformats.org/drawingml/2006/wordprocessingDrawing" xmlns:w10="urn:schemas-microsoft-com:office:word" xmlns:w="http://schemas.openxmlformats.org/wordprocessingml/2006/main" xmlns:w14="http://schemas.microsoft.com/office/word/2010/wordml" xmlns:w15="http://schemas.microsoft.com/office/word/2012/wordml" xmlns:w16se="http://schemas.microsoft.com/office/word/2015/wordml/symex" xmlns:wpg="http://schemas.microsoft.com/office/word/2010/wordprocessingGroup" xmlns:wpi="http://schemas.microsoft.com/office/word/2010/wordprocessingInk" xmlns:wne="http://schemas.microsoft.com/office/word/2006/wordml" xmlns:wps="http://schemas.microsoft.com/office/word/2010/wordprocessingShape" mc:Ignorable="w14 w15 w16se wp14"&gt;&lt;w:docParts&gt;&lt;w:docPart&gt;&lt;w:docPartPr&gt;&lt;w:name w:val="F25D791C5B2F4E19930DB86356413466"/&gt;&lt;w:category&gt;&lt;w:name w:val="General"/&gt;&lt;w:gallery w:val="placeholder"/&gt;&lt;/w:category&gt;&lt;w:types&gt;&lt;w:type w:val="bbPlcHdr"/&gt;&lt;/w:types&gt;&lt;w:behaviors&gt;&lt;w:behavior w:val="content"/&gt;&lt;/w:behaviors&gt;&lt;w:guid w:val="{D7CC999A-6FA2-4301-AF13-D17E1333918F}"/&gt;&lt;/w:docPartPr&gt;&lt;w:docPartBody&gt;&lt;w:p&gt;&lt;w:pPr&gt;&lt;w:pStyle w:val="F25D791C5B2F4E19930DB86356413466"/&gt;&lt;/w:pPr&gt;&lt;w:r&gt;&lt;w:rPr&gt;&lt;w:rStyle w:val="PlaceholderText"/&gt;&lt;/w:rPr&gt;&lt;w:t&gt;Click or tap here to enter text.&lt;/w:t&gt;&lt;/w:r&gt;&lt;/w:p&gt;&lt;/w:docPartBody&gt;&lt;/w:docPart&gt;&lt;/w:docParts&gt;&lt;/w:glossaryDocument&gt;&lt;/pkg:xmlData&gt;&lt;/pkg:part&gt;&lt;pkg:part pkg:name="/word/glossary/styles.xml" pkg:contentType="application/vnd.openxmlformats-officedocument.wordprocessingml.styles+xml"&gt;&lt;pkg:xmlData&gt;&lt;w:styles xmlns:mc="http://schemas.openxmlformats.org/markup-compatibility/2006" xmlns:r="http://schemas.openxmlformats.org/officeDocument/2006/relationships" xmlns:w="http://schemas.openxmlformats.org/wordprocessingml/2006/main" xmlns:w14="http://schemas.microsoft.com/office/word/2010/wordml" xmlns:w15="http://schemas.microsoft.com/office/word/2012/wordml" xmlns:w16se="http://schemas.microsoft.com/office/word/2015/wordml/symex" mc:Ignorable="w14 w15 w16se"&gt;&lt;w:docDefaults&gt;&lt;w:rPrDefault&gt;&lt;w:rPr&gt;&lt;w:rFonts w:asciiTheme="minorHAnsi" w:eastAsiaTheme="minorEastAsia" w:hAnsiTheme="minorHAnsi" w:cstheme="minorBidi"/&gt;&lt;w:sz w:val="22"/&gt;&lt;w:szCs w:val="22"/&gt;&lt;w:lang w:val="en-GB" w:eastAsia="en-GB" w:bidi="ar-SA"/&gt;&lt;/w:rPr&gt;&lt;/w:rPrDefault&gt;&lt;w:pPrDefault&gt;&lt;w:pPr&gt;&lt;w:spacing w:after="160" w:line="259" w:lineRule="auto"/&gt;&lt;/w:pPr&gt;&lt;/w:pPrDefault&gt;&lt;/w:docDefaults&gt;&lt;w:latentStyles w:defLockedState="0" w:defUIPriority="99" w:defSemiHidden="0" w:defUnhideWhenUsed="0" w:defQFormat="0" w:count="374"&gt;&lt;w:lsdException w:name="Normal" w:uiPriority="0" w:qFormat="1"/&gt;&lt;w:lsdException w:name="heading 1" w:uiPriority="9" w:qFormat="1"/&gt;&lt;w:lsdException w:name="heading 2" w:semiHidden="1" w:uiPriority="9" w:unhideWhenUsed="1" w:qFormat="1"/&gt;&lt;w:lsdException w:name="heading 3" w:semiHidden="1" w:uiPriority="9" w:unhideWhenUsed="1" w:qFormat="1"/&gt;&lt;w:lsdException w:name="heading 4" w:semiHidden="1" w:uiPriority="9" w:unhideWhenUsed="1" w:qFormat="1"/&gt;&lt;w:lsdException w:name="heading 5" w:semiHidden="1" w:uiPriority="9" w:unhideWhenUsed="1" w:qFormat="1"/&gt;&lt;w:lsdException w:name="heading 6" w:semiHidden="1" w:uiPriority="9" w:unhideWhenUsed="1" w:qFormat="1"/&gt;&lt;w:lsdException w:name="heading 7" w:semiHidden="1" w:uiPriority="9" w:unhideWhenUsed="1" w:qFormat="1"/&gt;&lt;w:lsdException w:name="heading 8" w:semiHidden="1" w:uiPriority="9" w:unhideWhenUsed="1" w:qFormat="1"/&gt;&lt;w:lsdException w:name="heading 9" w:semiHidden="1" w:uiPriority="9" w:unhideWhenUsed="1" w:qFormat="1"/&gt;&lt;w:lsdException w:name="index 1" w:semiHidden="1" w:unhideWhenUsed="1"/&gt;&lt;w:lsdException w:name="index 2" w:semiHidden="1" w:unhideWhenUsed="1"/&gt;&lt;w:lsdException w:name="index 3" w:semiHidden="1" w:unhideWhenUsed="1"/&gt;&lt;w:lsdException w:name="index 4" w:semiHidden="1" w:unhideWhenUsed="1"/&gt;&lt;w:lsdException w:name="index 5" w:semiHidden="1" w:unhideWhenUsed="1"/&gt;&lt;w:lsdException w:name="index 6" w:semiHidden="1" w:unhideWhenUsed="1"/&gt;&lt;w:lsdException w:name="index 7" w:semiHidden="1" w:unhideWhenUsed="1"/&gt;&lt;w:lsdException w:name="index 8" w:semiHidden="1" w:unhideWhenUsed="1"/&gt;&lt;w:lsdException w:name="index 9" w:semiHidden="1" w:unhideWhenUsed="1"/&gt;&lt;w:lsdException w:name="toc 1" w:semiHidden="1" w:uiPriority="39" w:unhideWhenUsed="1"/&gt;&lt;w:lsdException w:name="toc 2" w:semiHidden="1" w:uiPriority="39" w:unhideWhenUsed="1"/&gt;&lt;w:lsdException w:name="toc 3" w:semiHidden="1" w:uiPriority="39" w:unhideWhenUsed="1"/&gt;&lt;w:lsdException w:name="toc 4" w:semiHidden="1" w:uiPriority="39" w:unhideWhenUsed="1"/&gt;&lt;w:lsdException w:name="toc 5" w:semiHidden="1" w:uiPriority="39" w:unhideWhenUsed="1"/&gt;&lt;w:lsdException w:name="toc 6" w:semiHidden="1" w:uiPriority="39" w:unhideWhenUsed="1"/&gt;&lt;w:lsdException w:name="toc 7" w:semiHidden="1" w:uiPriority="39" w:unhideWhenUsed="1"/&gt;&lt;w:lsdException w:name="toc 8" w:semiHidden="1" w:uiPriority="39" w:unhideWhenUsed="1"/&gt;&lt;w:lsdException w:name="toc 9" w:semiHidden="1" w:uiPriority="39" w:unhideWhenUsed="1"/&gt;&lt;w:lsdException w:name="Normal Indent" w:semiHidden="1" w:unhideWhenUsed="1"/&gt;&lt;w:lsdException w:name="footnote text" w:semiHidden="1" w:unhideWhenUsed="1"/&gt;&lt;w:lsdException w:name="annotation text" w:semiHidden="1" w:unhideWhenUsed="1"/&gt;&lt;w:lsdException w:name="header" w:semiHidden="1" w:unhideWhenUsed="1"/&gt;&lt;w:lsdException w:name="footer" w:semiHidden="1" w:unhideWhenUsed="1"/&gt;&lt;w:lsdException w:name="index heading" w:semiHidden="1" w:unhideWhenUsed="1"/&gt;&lt;w:lsdException w:name="caption" w:semiHidden="1" w:uiPriority="35" w:unhideWhenUsed="1" w:qFormat="1"/&gt;&lt;w:lsdException w:name="table of figures" w:semiHidden="1" w:unhideWhenUsed="1"/&gt;&lt;w:lsdException w:name="envelope address" w:semiHidden="1" w:unhideWhenUsed="1"/&gt;&lt;w:lsdException w:name="envelope return" w:semiHidden="1" w:unhideWhenUsed="1"/&gt;&lt;w:lsdException w:name="footnote reference" w:semiHidden="1" w:unhideWhenUsed="1"/&gt;&lt;w:lsdException w:name="annotation reference" w:semiHidden="1" w:unhideWhenUsed="1"/&gt;&lt;w:lsdException w:name="line number" w:semiHidden="1" w:unhideWhenUsed="1"/&gt;&lt;w:lsdException w:name="page number" w:semiHidden="1" w:unhideWhenUsed="1"/&gt;&lt;w:lsdException w:name="endnote reference" w:semiHidden="1" w:unhideWhenUsed="1"/&gt;&lt;w:lsdException w:name="endnote text" w:semiHidden="1" w:unhideWhenUsed="1"/&gt;&lt;w:lsdException w:name="table of authorities" w:semiHidden="1" w:unhideWhenUsed="1"/&gt;&lt;w:lsdException w:name="macro" w:semiHidden="1" w:unhideWhenUsed="1"/&gt;&lt;w:lsdException w:name="toa heading" w:semiHidden="1" w:unhideWhenUsed="1"/&gt;&lt;w:lsdException w:name="List" w:semiHidden="1" w:unhideWhenUsed="1"/&gt;&lt;w:lsdException w:name="List Bullet" w:semiHidden="1" w:unhideWhenUsed="1"/&gt;&lt;w:lsdException w:name="List Number" w:semiHidden="1" w:unhideWhenUsed="1"/&gt;&lt;w:lsdException w:name="List 2" w:semiHidden="1" w:unhideWhenUsed="1"/&gt;&lt;w:lsdException w:name="List 3" w:semiHidden="1" w:unhideWhenUsed="1"/&gt;&lt;w:lsdException w:name="List 4" w:semiHidden="1" w:unhideWhenUsed="1"/&gt;&lt;w:lsdException w:name="List 5" w:semiHidden="1" w:unhideWhenUsed="1"/&gt;&lt;w:lsdException w:name="List Bullet 2" w:semiHidden="1" w:unhideWhenUsed="1"/&gt;&lt;w:lsdException w:name="List Bullet 3" w:semiHidden="1" w:unhideWhenUsed="1"/&gt;&lt;w:lsdException w:name="List Bullet 4" w:semiHidden="1" w:unhideWhenUsed="1"/&gt;&lt;w:lsdException w:name="List Bullet 5" w:semiHidden="1" w:unhideWhenUsed="1"/&gt;&lt;w:lsdException w:name="List Number 2" w:semiHidden="1" w:unhideWhenUsed="1"/&gt;&lt;w:lsdException w:name="List Number 3" w:semiHidden="1" w:unhideWhenUsed="1"/&gt;&lt;w:lsdException w:name="List Number 4" w:semiHidden="1" w:unhideWhenUsed="1"/&gt;&lt;w:lsdException w:name="List Number 5" w:semiHidden="1" w:unhideWhenUsed="1"/&gt;&lt;w:lsdException w:name="Title" w:uiPriority="10" w:qFormat="1"/&gt;&lt;w:lsdException w:name="Closing" w:semiHidden="1" w:unhideWhenUsed="1"/&gt;&lt;w:lsdException w:name="Signature" w:semiHidden="1" w:unhideWhenUsed="1"/&gt;&lt;w:lsdException w:name="Default Paragraph Font" w:semiHidden="1" w:uiPriority="1" w:unhideWhenUsed="1"/&gt;&lt;w:lsdException w:name="Body Text" w:semiHidden="1" w:unhideWhenUsed="1"/&gt;&lt;w:lsdException w:name="Body Text Indent" w:semiHidden="1" w:unhideWhenUsed="1"/&gt;&lt;w:lsdException w:name="List Continue" w:semiHidden="1" w:unhideWhenUsed="1"/&gt;&lt;w:lsdException w:name="List Continue 2" w:semiHidden="1" w:unhideWhenUsed="1"/&gt;&lt;w:lsdException w:name="List Continue 3" w:semiHidden="1" w:unhideWhenUsed="1"/&gt;&lt;w:lsdException w:name="List Continue 4" w:semiHidden="1" w:unhideWhenUsed="1"/&gt;&lt;w:lsdException w:name="List Continue 5" w:semiHidden="1" w:unhideWhenUsed="1"/&gt;&lt;w:lsdException w:name="Message Header" w:semiHidden="1" w:unhideWhenUsed="1"/&gt;&lt;w:lsdException w:name="Subtitle" w:uiPriority="11" w:qFormat="1"/&gt;&lt;w:lsdException w:name="Salutation" w:semiHidden="1" w:unhideWhenUsed="1"/&gt;&lt;w:lsdException w:name="Date" w:semiHidden="1" w:unhideWhenUsed="1"/&gt;&lt;w:lsdException w:name="Body Text First Indent" w:semiHidden="1" w:unhideWhenUsed="1"/&gt;&lt;w:lsdException w:name="Body Text First Indent 2" w:semiHidden="1" w:unhideWhenUsed="1"/&gt;&lt;w:lsdException w:name="Note Heading" w:semiHidden="1" w:unhideWhenUsed="1"/&gt;&lt;w:lsdException w:name="Body Text 2" w:semiHidden="1" w:unhideWhenUsed="1"/&gt;&lt;w:lsdException w:name="Body Text 3" w:semiHidden="1" w:unhideWhenUsed="1"/&gt;&lt;w:lsdException w:name="Body Text Indent 2" w:semiHidden="1" w:unhideWhenUsed="1"/&gt;&lt;w:lsdException w:name="Body Text Indent 3" w:semiHidden="1" w:unhideWhenUsed="1"/&gt;&lt;w:lsdException w:name="Block Text" w:semiHidden="1" w:unhideWhenUsed="1"/&gt;&lt;w:lsdException w:name="Hyperlink" w:semiHidden="1" w:unhideWhenUsed="1"/&gt;&lt;w:lsdException w:name="FollowedHyperlink" w:semiHidden="1" w:unhideWhenUsed="1"/&gt;&lt;w:lsdException w:name="Strong" w:uiPriority="22" w:qFormat="1"/&gt;&lt;w:lsdException w:name="Emphasis" w:uiPriority="20" w:qFormat="1"/&gt;&lt;w:lsdException w:name="Document Map" w:semiHidden="1" w:unhideWhenUsed="1"/&gt;&lt;w:lsdException w:name="Plain Text" w:semiHidden="1" w:unhideWhenUsed="1"/&gt;&lt;w:lsdException w:name="E-mail Signature" w:semiHidden="1" w:unhideWhenUsed="1"/&gt;&lt;w:lsdException w:name="HTML Top of Form" w:semiHidden="1" w:unhideWhenUsed="1"/&gt;&lt;w:lsdException w:name="HTML Bottom of Form" w:semiHidden="1" w:unhideWhenUsed="1"/&gt;&lt;w:lsdException w:name="Normal (Web)" w:semiHidden="1" w:unhideWhenUsed="1"/&gt;&lt;w:lsdException w:name="HTML Acronym" w:semiHidden="1" w:unhideWhenUsed="1"/&gt;&lt;w:lsdException w:name="HTML Address" w:semiHidden="1" w:unhideWhenUsed="1"/&gt;&lt;w:lsdException w:name="HTML Cite" w:semiHidden="1" w:unhideWhenUsed="1"/&gt;&lt;w:lsdException w:name="HTML Code" w:semiHidden="1" w:unhideWhenUsed="1"/&gt;&lt;w:lsdException w:name="HTML Definition" w:semiHidden="1" w:unhideWhenUsed="1"/&gt;&lt;w:lsdException w:name="HTML Keyboard" w:semiHidden="1" w:unhideWhenUsed="1"/&gt;&lt;w:lsdException w:name="HTML Preformatted" w:semiHidden="1" w:unhideWhenUsed="1"/&gt;&lt;w:lsdException w:name="HTML Sample" w:semiHidden="1" w:unhideWhenUsed="1"/&gt;&lt;w:lsdException w:name="HTML Typewriter" w:semiHidden="1" w:unhideWhenUsed="1"/&gt;&lt;w:lsdException w:name="HTML Variable" w:semiHidden="1" w:unhideWhenUsed="1"/&gt;&lt;w:lsdException w:name="Normal Table" w:semiHidden="1" w:unhideWhenUsed="1"/&gt;&lt;w:lsdException w:name="annotation subject" w:semiHidden="1" w:unhideWhenUsed="1"/&gt;&lt;w:lsdException w:name="No List" w:semiHidden="1" w:unhideWhenUsed="1"/&gt;&lt;w:lsdException w:name="Outline List 1" w:semiHidden="1" w:unhideWhenUsed="1"/&gt;&lt;w:lsdException w:name="Outline List 2" w:semiHidden="1" w:unhideWhenUsed="1"/&gt;&lt;w:lsdException w:name="Outline List 3" w:semiHidden="1" w:unhideWhenUsed="1"/&gt;&lt;w:lsdException w:name="Table Simple 1" w:semiHidden="1" w:unhideWhenUsed="1"/&gt;&lt;w:lsdException w:name="Table Simple 2" w:semiHidden="1" w:unhideWhenUsed="1"/&gt;&lt;w:lsdException w:name="Table Simple 3" w:semiHidden="1" w:unhideWhenUsed="1"/&gt;&lt;w:lsdException w:name="Table Classic 1" w:semiHidden="1" w:unhideWhenUsed="1"/&gt;&lt;w:lsdException w:name="Table Classic 2" w:semiHidden="1" w:unhideWhenUsed="1"/&gt;&lt;w:lsdException w:name="Table Classic 3" w:semiHidden="1" w:unhideWhenUsed="1"/&gt;&lt;w:lsdException w:name="Table Classic 4" w:semiHidden="1" w:unhideWhenUsed="1"/&gt;&lt;w:lsdException w:name="Table Colorful 1" w:semiHidden="1" w:unhideWhenUsed="1"/&gt;&lt;w:lsdException w:name="Table Colorful 2" w:semiHidden="1" w:unhideWhenUsed="1"/&gt;&lt;w:lsdException w:name="Table Colorful 3" w:semiHidden="1" w:unhideWhenUsed="1"/&gt;&lt;w:lsdException w:name="Table Columns 1" w:semiHidden="1" w:unhideWhenUsed="1"/&gt;&lt;w:lsdException w:name="Table Columns 2" w:semiHidden="1" w:unhideWhenUsed="1"/&gt;&lt;w:lsdException w:name="Table Columns 3" w:semiHidden="1" w:unhideWhenUsed="1"/&gt;&lt;w:lsdException w:name="Table Columns 4" w:semiHidden="1" w:unhideWhenUsed="1"/&gt;&lt;w:lsdException w:name="Table Columns 5" w:semiHidden="1" w:unhideWhenUsed="1"/&gt;&lt;w:lsdException w:name="Table Grid 1" w:semiHidden="1" w:unhideWhenUsed="1"/&gt;&lt;w:lsdException w:name="Table Grid 2" w:semiHidden="1" w:unhideWhenUsed="1"/&gt;&lt;w:lsdException w:name="Table Grid 3" w:semiHidden="1" w:unhideWhenUsed="1"/&gt;&lt;w:lsdException w:name="Table Grid 4" w:semiHidden="1" w:unhideWhenUsed="1"/&gt;&lt;w:lsdException w:name="Table Grid 5" w:semiHidden="1" w:unhideWhenUsed="1"/&gt;&lt;w:lsdException w:name="Table Grid 6" w:semiHidden="1" w:unhideWhenUsed="1"/&gt;&lt;w:lsdException w:name="Table Grid 7" w:semiHidden="1" w:unhideWhenUsed="1"/&gt;&lt;w:lsdException w:name="Table Grid 8" w:semiHidden="1" w:unhideWhenUsed="1"/&gt;&lt;w:lsdException w:name="Table List 1" w:semiHidden="1" w:unhideWhenUsed="1"/&gt;&lt;w:lsdException w:name="Table List 2" w:semiHidden="1" w:unhideWhenUsed="1"/&gt;&lt;w:lsdException w:name="Table List 3" w:semiHidden="1" w:unhideWhenUsed="1"/&gt;&lt;w:lsdException w:name="Table List 4" w:semiHidden="1" w:unhideWhenUsed="1"/&gt;&lt;w:lsdException w:name="Table List 5" w:semiHidden="1" w:unhideWhenUsed="1"/&gt;&lt;w:lsdException w:name="Table List 6" w:semiHidden="1" w:unhideWhenUsed="1"/&gt;&lt;w:lsdException w:name="Table List 7" w:semiHidden="1" w:unhideWhenUsed="1"/&gt;&lt;w:lsdException w:name="Table List 8" w:semiHidden="1" w:unhideWhenUsed="1"/&gt;&lt;w:lsdException w:name="Table 3D effects 1" w:semiHidden="1" w:unhideWhenUsed="1"/&gt;&lt;w:lsdException w:name="Table 3D effects 2" w:semiHidden="1" w:unhideWhenUsed="1"/&gt;&lt;w:lsdException w:name="Table 3D effects 3" w:semiHidden="1" w:unhideWhenUsed="1"/&gt;&lt;w:lsdException w:name="Table Contemporary" w:semiHidden="1" w:unhideWhenUsed="1"/&gt;&lt;w:lsdException w:name="Table Elegant" w:semiHidden="1" w:unhideWhenUsed="1"/&gt;&lt;w:lsdException w:name="Table Professional" w:semiHidden="1" w:unhideWhenUsed="1"/&gt;&lt;w:lsdException w:name="Table Subtle 1" w:semiHidden="1" w:unhideWhenUsed="1"/&gt;&lt;w:lsdException w:name="Table Subtle 2" w:semiHidden="1" w:unhideWhenUsed="1"/&gt;&lt;w:lsdException w:name="Table Web 1" w:semiHidden="1" w:unhideWhenUsed="1"/&gt;&lt;w:lsdException w:name="Table Web 2" w:semiHidden="1" w:unhideWhenUsed="1"/&gt;&lt;w:lsdException w:name="Table Web 3" w:semiHidden="1" w:unhideWhenUsed="1"/&gt;&lt;w:lsdException w:name="Balloon Text" w:semiHidden="1" w:unhideWhenUsed="1"/&gt;&lt;w:lsdException w:name="Table Grid" w:uiPriority="39"/&gt;&lt;w:lsdException w:name="Table Theme" w:semiHidden="1" w:unhideWhenUsed="1"/&gt;&lt;w:lsdException w:name="Placeholder Text" w:semiHidden="1"/&gt;&lt;w:lsdException w:name="No Spacing" w:uiPriority="1" w:qFormat="1"/&gt;&lt;w:lsdException w:name="Light Shading" w:uiPriority="60"/&gt;&lt;w:lsdException w:name="Light List" w:uiPriority="61"/&gt;&lt;w:lsdException w:name="Light Grid" w:uiPriority="62"/&gt;&lt;w:lsdException w:name="Medium Shading 1" w:uiPriority="63"/&gt;&lt;w:lsdException w:name="Medium Shading 2" w:uiPriority="64"/&gt;&lt;w:lsdException w:name="Medium List 1" w:uiPriority="65"/&gt;&lt;w:lsdException w:name="Medium List 2" w:uiPriority="66"/&gt;&lt;w:lsdException w:name="Medium Grid 1" w:uiPriority="67"/&gt;&lt;w:lsdException w:name="Medium Grid 2" w:uiPriority="68"/&gt;&lt;w:lsdException w:name="Medium Grid 3" w:uiPriority="69"/&gt;&lt;w:lsdException w:name="Dark List" w:uiPriority="70"/&gt;&lt;w:lsdException w:name="Colorful Shading" w:uiPriority="71"/&gt;&lt;w:lsdException w:name="Colorful List" w:uiPriority="72"/&gt;&lt;w:lsdException w:name="Colorful Grid" w:uiPriority="73"/&gt;&lt;w:lsdException w:name="Light Shading Accent 1" w:uiPriority="60"/&gt;&lt;w:lsdException w:name="Light List Accent 1" w:uiPriority="61"/&gt;&lt;w:lsdException w:name="Light Grid Accent 1" w:uiPriority="62"/&gt;&lt;w:lsdException w:name="Medium Shading 1 Accent 1" w:uiPriority="63"/&gt;&lt;w:lsdException w:name="Medium Shading 2 Accent 1" w:uiPriority="64"/&gt;&lt;w:lsdException w:name="Medium List 1 Accent 1" w:uiPriority="65"/&gt;&lt;w:lsdException w:name="Revision" w:semiHidden="1"/&gt;&lt;w:lsdException w:name="List Paragraph" w:uiPriority="34" w:qFormat="1"/&gt;&lt;w:lsdException w:name="Quote" w:uiPriority="29" w:qFormat="1"/&gt;&lt;w:lsdException w:name="Intense Quote" w:uiPriority="30" w:qFormat="1"/&gt;&lt;w:lsdException w:name="Medium List 2 Accent 1" w:uiPriority="66"/&gt;&lt;w:lsdException w:name="Medium Grid 1 Accent 1" w:uiPriority="67"/&gt;&lt;w:lsdException w:name="Medium Grid 2 Accent 1" w:uiPriority="68"/&gt;&lt;w:lsdException w:name="Medium Grid 3 Accent 1" w:uiPriority="69"/&gt;&lt;w:lsdException w:name="Dark List Accent 1" w:uiPriority="70"/&gt;&lt;w:lsdException w:name="Colorful Shading Accent 1" w:uiPriority="71"/&gt;&lt;w:lsdException w:name="Colorful List Accent 1" w:uiPriority="72"/&gt;&lt;w:lsdException w:name="Colorful Grid Accent 1" w:uiPriority="73"/&gt;&lt;w:lsdException w:name="Light Shading Accent 2" w:uiPriority="60"/&gt;&lt;w:lsdException w:name="Light List Accent 2" w:uiPriority="61"/&gt;&lt;w:lsdException w:name="Light Grid Accent 2" w:uiPriority="62"/&gt;&lt;w:lsdException w:name="Medium Shading 1 Accent 2" w:uiPriority="63"/&gt;&lt;w:lsdException w:name="Medium Shading 2 Accent 2" w:uiPriority="64"/&gt;&lt;w:lsdException w:name="Medium List 1 Accent 2" w:uiPriority="65"/&gt;&lt;w:lsdException w:name="Medium List 2 Accent 2" w:uiPriority="66"/&gt;&lt;w:lsdException w:name="Medium Grid 1 Accent 2" w:uiPriority="67"/&gt;&lt;w:lsdException w:name="Medium Grid 2 Accent 2" w:uiPriority="68"/&gt;&lt;w:lsdException w:name="Medium Grid 3 Accent 2" w:uiPriority="69"/&gt;&lt;w:lsdException w:name="Dark List Accent 2" w:uiPriority="70"/&gt;&lt;w:lsdException w:name="Colorful Shading Accent 2" w:uiPriority="71"/&gt;&lt;w:lsdException w:name="Colorful List Accent 2" w:uiPriority="72"/&gt;&lt;w:lsdException w:name="Colorful Grid Accent 2" w:uiPriority="73"/&gt;&lt;w:lsdException w:name="Light Shading Accent 3" w:uiPriority="60"/&gt;&lt;w:lsdException w:name="Light List Accent 3" w:uiPriority="61"/&gt;&lt;w:lsdException w:name="Light Grid Accent 3" w:uiPriority="62"/&gt;&lt;w:lsdException w:name="Medium Shading 1 Accent 3" w:uiPriority="63"/&gt;&lt;w:lsdException w:name="Medium Shading 2 Accent 3" w:uiPriority="64"/&gt;&lt;w:lsdException w:name="Medium List 1 Accent 3" w:uiPriority="65"/&gt;&lt;w:lsdException w:name="Medium List 2 Accent 3" w:uiPriority="66"/&gt;&lt;w:lsdException w:name="Medium Grid 1 Accent 3" w:uiPriority="67"/&gt;&lt;w:lsdException w:name="Medium Grid 2 Accent 3" w:uiPriority="68"/&gt;&lt;w:lsdException w:name="Medium Grid 3 Accent 3" w:uiPriority="69"/&gt;&lt;w:lsdException w:name="Dark List Accent 3" w:uiPriority="70"/&gt;&lt;w:lsdException w:name="Colorful Shading Accent 3" w:uiPriority="71"/&gt;&lt;w:lsdException w:name="Colorful List Accent 3" w:uiPriority="72"/&gt;&lt;w:lsdException w:name="Colorful Grid Accent 3" w:uiPriority="73"/&gt;&lt;w:lsdException w:name="Light Shading Accent 4" w:uiPriority="60"/&gt;&lt;w:lsdException w:name="Light List Accent 4" w:uiPriority="61"/&gt;&lt;w:lsdException w:name="Light Grid Accent 4" w:uiPriority="62"/&gt;&lt;w:lsdException w:name="Medium Shading 1 Accent 4" w:uiPriority="63"/&gt;&lt;w:lsdException w:name="Medium Shading 2 Accent 4" w:uiPriority="64"/&gt;&lt;w:lsdException w:name="Medium List 1 Accent 4" w:uiPriority="65"/&gt;&lt;w:lsdException w:name="Medium List 2 Accent 4" w:uiPriority="66"/&gt;&lt;w:lsdException w:name="Medium Grid 1 Accent 4" w:uiPriority="67"/&gt;&lt;w:lsdException w:name="Medium Grid 2 Accent 4" w:uiPriority="68"/&gt;&lt;w:lsdException w:name="Medium Grid 3 Accent 4" w:uiPriority="69"/&gt;&lt;w:lsdException w:name="Dark List Accent 4" w:uiPriority="70"/&gt;&lt;w:lsdException w:name="Colorful Shading Accent 4" w:uiPriority="71"/&gt;&lt;w:lsdException w:name="Colorful List Accent 4" w:uiPriority="72"/&gt;&lt;w:lsdException w:name="Colorful Grid Accent 4" w:uiPriority="73"/&gt;&lt;w:lsdException w:name="Light Shading Accent 5" w:uiPriority="60"/&gt;&lt;w:lsdException w:name="Light List Accent 5" w:uiPriority="61"/&gt;&lt;w:lsdException w:name="Light Grid Accent 5" w:uiPriority="62"/&gt;&lt;w:lsdException w:name="Medium Shading 1 Accent 5" w:uiPriority="63"/&gt;&lt;w:lsdException w:name="Medium Shading 2 Accent 5" w:uiPriority="64"/&gt;&lt;w:lsdException w:name="Medium List 1 Accent 5" w:uiPriority="65"/&gt;&lt;w:lsdException w:name="Medium List 2 Accent 5" w:uiPriority="66"/&gt;&lt;w:lsdException w:name="Medium Grid 1 Accent 5" w:uiPriority="67"/&gt;&lt;w:lsdException w:name="Medium Grid 2 Accent 5" w:uiPriority="68"/&gt;&lt;w:lsdException w:name="Medium Grid 3 Accent 5" w:uiPriority="69"/&gt;&lt;w:lsdException w:name="Dark List Accent 5" w:uiPriority="70"/&gt;&lt;w:lsdException w:name="Colorful Shading Accent 5" w:uiPriority="71"/&gt;&lt;w:lsdException w:name="Colorful List Accent 5" w:uiPriority="72"/&gt;&lt;w:lsdException w:name="Colorful Grid Accent 5" w:uiPriority="73"/&gt;&lt;w:lsdException w:name="Light Shading Accent 6" w:uiPriority="60"/&gt;&lt;w:lsdException w:name="Light List Accent 6" w:uiPriority="61"/&gt;&lt;w:lsdException w:name="Light Grid Accent 6" w:uiPriority="62"/&gt;&lt;w:lsdException w:name="Medium Shading 1 Accent 6" w:uiPriority="63"/&gt;&lt;w:lsdException w:name="Medium Shading 2 Accent 6" w:uiPriority="64"/&gt;&lt;w:lsdException w:name="Medium List 1 Accent 6" w:uiPriority="65"/&gt;&lt;w:lsdException w:name="Medium List 2 Accent 6" w:uiPriority="66"/&gt;&lt;w:lsdException w:name="Medium Grid 1 Accent 6" w:uiPriority="67"/&gt;&lt;w:lsdException w:name="Medium Grid 2 Accent 6" w:uiPriority="68"/&gt;&lt;w:lsdException w:name="Medium Grid 3 Accent 6" w:uiPriority="69"/&gt;&lt;w:lsdException w:name="Dark List Accent 6" w:uiPriority="70"/&gt;&lt;w:lsdException w:name="Colorful Shading Accent 6" w:uiPriority="71"/&gt;&lt;w:lsdException w:name="Colorful List Accent 6" w:uiPriority="72"/&gt;&lt;w:lsdException w:name="Colorful Grid Accent 6" w:uiPriority="73"/&gt;&lt;w:lsdException w:name="Subtle Emphasis" w:uiPriority="19" w:qFormat="1"/&gt;&lt;w:lsdException w:name="Intense Emphasis" w:uiPriority="21" w:qFormat="1"/&gt;&lt;w:lsdException w:name="Subtle Reference" w:uiPriority="31" w:qFormat="1"/&gt;&lt;w:lsdException w:name="Intense Reference" w:uiPriority="32" w:qFormat="1"/&gt;&lt;w:lsdException w:name="Book Title" w:uiPriority="33" w:qFormat="1"/&gt;&lt;w:lsdException w:name="Bibliography" w:semiHidden="1" w:uiPriority="37" w:unhideWhenUsed="1"/&gt;&lt;w:lsdException w:name="TOC Heading" w:semiHidden="1" w:uiPriority="39" w:unhideWhenUsed="1" w:qFormat="1"/&gt;&lt;w:lsdException w:name="Plain Table 1" w:uiPriority="41"/&gt;&lt;w:lsdException w:name="Plain Table 2" w:uiPriority="42"/&gt;&lt;w:lsdException w:name="Plain Table 3" w:uiPriority="43"/&gt;&lt;w:lsdException w:name="Plain Table 4" w:uiPriority="44"/&gt;&lt;w:lsdException w:name="Plain Table 5" w:uiPriority="45"/&gt;&lt;w:lsdException w:name="Grid Table Light" w:uiPriority="40"/&gt;&lt;w:lsdException w:name="Grid Table 1 Light" w:uiPriority="46"/&gt;&lt;w:lsdException w:name="Grid Table 2" w:uiPriority="47"/&gt;&lt;w:lsdException w:name="Grid Table 3" w:uiPriority="48"/&gt;&lt;w:lsdException w:name="Grid Table 4" w:uiPriority="49"/&gt;&lt;w:lsdException w:name="Grid Table 5 Dark" w:uiPriority="50"/&gt;&lt;w:lsdException w:name="Grid Table 6 Colorful" w:uiPriority="51"/&gt;&lt;w:lsdException w:name="Grid Table 7 Colorful" w:uiPriority="52"/&gt;&lt;w:lsdException w:name="Grid Table 1 Light Accent 1" w:uiPriority="46"/&gt;&lt;w:lsdException w:name="Grid Table 2 Accent 1" w:uiPriority="47"/&gt;&lt;w:lsdException w:name="Grid Table 3 Accent 1" w:uiPriority="48"/&gt;&lt;w:lsdException w:name="Grid Table 4 Accent 1" w:uiPriority="49"/&gt;&lt;w:lsdException w:name="Grid Table 5 Dark Accent 1" w:uiPriority="50"/&gt;&lt;w:lsdException w:name="Grid Table 6 Colorful Accent 1" w:uiPriority="51"/&gt;&lt;w:lsdException w:name="Grid Table 7 Colorful Accent 1" w:uiPriority="52"/&gt;&lt;w:lsdException w:name="Grid Table 1 Light Accent 2" w:uiPriority="46"/&gt;&lt;w:lsdException w:name="Grid Table 2 Accent 2" w:uiPriority="47"/&gt;&lt;w:lsdException w:name="Grid Table 3 Accent 2" w:uiPriority="48"/&gt;&lt;w:lsdException w:name="Grid Table 4 Accent 2" w:uiPriority="49"/&gt;&lt;w:lsdException w:name="Grid Table 5 Dark Accent 2" w:uiPriority="50"/&gt;&lt;w:lsdException w:name="Grid Table 6 Colorful Accent 2" w:uiPriority="51"/&gt;&lt;w:lsdException w:name="Grid Table 7 Colorful Accent 2" w:uiPriority="52"/&gt;&lt;w:lsdException w:name="Grid Table 1 Light Accent 3" w:uiPriority="46"/&gt;&lt;w:lsdException w:name="Grid Table 2 Accent 3" w:uiPriority="47"/&gt;&lt;w:lsdException w:name="Grid Table 3 Accent 3" w:uiPriority="48"/&gt;&lt;w:lsdException w:name="Grid Table 4 Accent 3" w:uiPriority="49"/&gt;&lt;w:lsdException w:name="Grid Table 5 Dark Accent 3" w:uiPriority="50"/&gt;&lt;w:lsdException w:name="Grid Table 6 Colorful Accent 3" w:uiPriority="51"/&gt;&lt;w:lsdException w:name="Grid Table 7 Colorful Accent 3" w:uiPriority="52"/&gt;&lt;w:lsdException w:name="Grid Table 1 Light Accent 4" w:uiPriority="46"/&gt;&lt;w:lsdException w:name="Grid Table 2 Accent 4" w:uiPriority="47"/&gt;&lt;w:lsdException w:name="Grid Table 3 Accent 4" w:uiPriority="48"/&gt;&lt;w:lsdException w:name="Grid Table 4 Accent 4" w:uiPriority="49"/&gt;&lt;w:lsdException w:name="Grid Table 5 Dark Accent 4" w:uiPriority="50"/&gt;&lt;w:lsdException w:name="Grid Table 6 Colorful Accent 4" w:uiPriority="51"/&gt;&lt;w:lsdException w:name="Grid Table 7 Colorful Accent 4" w:uiPriority="52"/&gt;&lt;w:lsdException w:name="Grid Table 1 Light Accent 5" w:uiPriority="46"/&gt;&lt;w:lsdException w:name="Grid Table 2 Accent 5" w:uiPriority="47"/&gt;&lt;w:lsdException w:name="Grid Table 3 Accent 5" w:uiPriority="48"/&gt;&lt;w:lsdException w:name="Grid Table 4 Accent 5" w:uiPriority="49"/&gt;&lt;w:lsdException w:name="Grid Table 5 Dark Accent 5" w:uiPriority="50"/&gt;&lt;w:lsdException w:name="Grid Table 6 Colorful Accent 5" w:uiPriority="51"/&gt;&lt;w:lsdException w:name="Grid Table 7 Colorful Accent 5" w:uiPriority="52"/&gt;&lt;w:lsdException w:name="Grid Table 1 Light Accent 6" w:uiPriority="46"/&gt;&lt;w:lsdException w:name="Grid Table 2 Accent 6" w:uiPriority="47"/&gt;&lt;w:lsdException w:name="Grid Table 3 Accent 6" w:uiPriority="48"/&gt;&lt;w:lsdException w:name="Grid Table 4 Accent 6" w:uiPriority="49"/&gt;&lt;w:lsdException w:name="Grid Table 5 Dark Accent 6" w:uiPriority="50"/&gt;&lt;w:lsdException w:name="Grid Table 6 Colorful Accent 6" w:uiPriority="51"/&gt;&lt;w:lsdException w:name="Grid Table 7 Colorful Accent 6" w:uiPriority="52"/&gt;&lt;w:lsdException w:name="List Table 1 Light" w:uiPriority="46"/&gt;&lt;w:lsdException w:name="List Table 2" w:uiPriority="47"/&gt;&lt;w:lsdException w:name="List Table 3" w:uiPriority="48"/&gt;&lt;w:lsdException w:name="List Table 4" w:uiPriority="49"/&gt;&lt;w:lsdException w:name="List Table 5 Dark" w:uiPriority="50"/&gt;&lt;w:lsdException w:name="List Table 6 Colorful" w:uiPriority="51"/&gt;&lt;w:lsdException w:name="List Table 7 Colorful" w:uiPriority="52"/&gt;&lt;w:lsdException w:name="List Table 1 Light Accent 1" w:uiPriority="46"/&gt;&lt;w:lsdException w:name="List Table 2 Accent 1" w:uiPriority="47"/&gt;&lt;w:lsdException w:name="List Table 3 Accent 1" w:uiPriority="48"/&gt;&lt;w:lsdException w:name="List Table 4 Accent 1" w:uiPriority="49"/&gt;&lt;w:lsdException w:name="List Table 5 Dark Accent 1" w:uiPriority="50"/&gt;&lt;w:lsdException w:name="List Table 6 Colorful Accent 1" w:uiPriority="51"/&gt;&lt;w:lsdException w:name="List Table 7 Colorful Accent 1" w:uiPriority="52"/&gt;&lt;w:lsdException w:name="List Table 1 Light Accent 2" w:uiPriority="46"/&gt;&lt;w:lsdException w:name="List Table 2 Accent 2" w:uiPriority="47"/&gt;&lt;w:lsdException w:name="List Table 3 Accent 2" w:uiPriority="48"/&gt;&lt;w:lsdException w:name="List Table 4 Accent 2" w:uiPriority="49"/&gt;&lt;w:lsdException w:name="List Table 5 Dark Accent 2" w:uiPriority="50"/&gt;&lt;w:lsdException w:name="List Table 6 Colorful Accent 2" w:uiPriority="51"/&gt;&lt;w:lsdException w:name="List Table 7 Colorful Accent 2" w:uiPriority="52"/&gt;&lt;w:lsdException w:name="List Table 1 Light Accent 3" w:uiPriority="46"/&gt;&lt;w:lsdException w:name="List Table 2 Accent 3" w:uiPriority="47"/&gt;&lt;w:lsdException w:name="List Table 3 Accent 3" w:uiPriority="48"/&gt;&lt;w:lsdException w:name="List Table 4 Accent 3" w:uiPriority="49"/&gt;&lt;w:lsdException w:name="List Table 5 Dark Accent 3" w:uiPriority="50"/&gt;&lt;w:lsdException w:name="List Table 6 Colorful Accent 3" w:uiPriority="51"/&gt;&lt;w:lsdException w:name="List Table 7 Colorful Accent 3" w:uiPriority="52"/&gt;&lt;w:lsdException w:name="List Table 1 Light Accent 4" w:uiPriority="46"/&gt;&lt;w:lsdException w:name="List Table 2 Accent 4" w:uiPriority="47"/&gt;&lt;w:lsdException w:name="List Table 3 Accent 4" w:uiPriority="48"/&gt;&lt;w:lsdException w:name="List Table 4 Accent 4" w:uiPriority="49"/&gt;&lt;w:lsdException w:name="List Table 5 Dark Accent 4" w:uiPriority="50"/&gt;&lt;w:lsdException w:name="List Table 6 Colorful Accent 4" w:uiPriority="51"/&gt;&lt;w:lsdException w:name="List Table 7 Colorful Accent 4" w:uiPriority="52"/&gt;&lt;w:lsdException w:name="List Table 1 Light Accent 5" w:uiPriority="46"/&gt;&lt;w:lsdException w:name="List Table 2 Accent 5" w:uiPriority="47"/&gt;&lt;w:lsdException w:name="List Table 3 Accent 5" w:uiPriority="48"/&gt;&lt;w:lsdException w:name="List Table 4 Accent 5" w:uiPriority="49"/&gt;&lt;w:lsdException w:name="List Table 5 Dark Accent 5" w:uiPriority="50"/&gt;&lt;w:lsdException w:name="List Table 6 Colorful Accent 5" w:uiPriority="51"/&gt;&lt;w:lsdException w:name="List Table 7 Colorful Accent 5" w:uiPriority="52"/&gt;&lt;w:lsdException w:name="List Table 1 Light Accent 6" w:uiPriority="46"/&gt;&lt;w:lsdException w:name="List Table 2 Accent 6" w:uiPriority="47"/&gt;&lt;w:lsdException w:name="List Table 3 Accent 6" w:uiPriority="48"/&gt;&lt;w:lsdException w:name="List Table 4 Accent 6" w:uiPriority="49"/&gt;&lt;w:lsdException w:name="List Table 5 Dark Accent 6" w:uiPriority="50"/&gt;&lt;w:lsdException w:name="List Table 6 Colorful Accent 6" w:uiPriority="51"/&gt;&lt;w:lsdException w:name="List Table 7 Colorful Accent 6" w:uiPriority="52"/&gt;&lt;w:lsdException w:name="Mention" w:semiHidden="1" w:unhideWhenUsed="1"/&gt;&lt;w:lsdException w:name="Smart Hyperlink" w:semiHidden="1" w:unhideWhenUsed="1"/&gt;&lt;w:lsdException w:name="Hashtag" w:semiHidden="1" w:unhideWhenUsed="1"/&gt;&lt;/w:latentStyles&gt;&lt;w:style w:type="paragraph" w:default="1" w:styleId="Normal"&gt;&lt;w:name w:val="Normal"/&gt;&lt;w:qFormat/&gt;&lt;/w:style&gt;&lt;w:style w:type="character" w:default="1" w:styleId="DefaultParagraphFont"&gt;&lt;w:name w:val="Default Paragraph Font"/&gt;&lt;w:uiPriority w:val="1"/&gt;&lt;w:semiHidden/&gt;&lt;w:unhideWhenUsed/&gt;&lt;/w:style&gt;&lt;w:style w:type="table" w:default="1" w:styleId="TableNormal"&gt;&lt;w:name w:val="Normal Table"/&gt;&lt;w:uiPriority w:val="99"/&gt;&lt;w:semiHidden/&gt;&lt;w:unhideWhenUsed/&gt;&lt;w:tblPr&gt;&lt;w:tblInd w:w="0" w:type="dxa"/&gt;&lt;w:tblCellMar&gt;&lt;w:top w:w="0" w:type="dxa"/&gt;&lt;w:left w:w="108" w:type="dxa"/&gt;&lt;w:bottom w:w="0" w:type="dxa"/&gt;&lt;w:right w:w="108" w:type="dxa"/&gt;&lt;/w:tblCellMar&gt;&lt;/w:tblPr&gt;&lt;/w:style&gt;&lt;w:style w:type="numbering" w:default="1" w:styleId="NoList"&gt;&lt;w:name w:val="No List"/&gt;&lt;w:uiPriority w:val="99"/&gt;&lt;w:semiHidden/&gt;&lt;w:unhideWhenUsed/&gt;&lt;/w:style&gt;&lt;w:style w:type="character" w:styleId="PlaceholderText"&gt;&lt;w:name w:val="Placeholder Text"/&gt;&lt;w:basedOn w:val="DefaultParagraphFont"/&gt;&lt;w:uiPriority w:val="99"/&gt;&lt;w:rPr&gt;&lt;w:color w:val="7F7F7F" w:themeColor="text1" w:themeTint="80"/&gt;&lt;w:bdr w:val="none" w:sz="0" w:space="0" w:color="auto"/&gt;&lt;w:shd w:val="clear" w:color="auto" w:fill="F0F0F0"/&gt;&lt;/w:rPr&gt;&lt;/w:style&gt;&lt;w:style w:type="paragraph" w:customStyle="1" w:styleId="F25D791C5B2F4E19930DB86356413466"&gt;&lt;w:name w:val="F25D791C5B2F4E19930DB86356413466"/&gt;&lt;/w:style&gt;&lt;/w:styles&gt;&lt;/pkg:xmlData&gt;&lt;/pkg:part&gt;&lt;pkg:part pkg:name="/word/styles.xml" pkg:contentType="application/vnd.openxmlformats-officedocument.wordprocessingml.styles+xml"&gt;&lt;pkg:xmlData&gt;&lt;w:styles xmlns:mc="http://schemas.openxmlformats.org/markup-compatibility/2006" xmlns:r="http://schemas.openxmlformats.org/officeDocument/2006/relationships" xmlns:w="http://schemas.openxmlformats.org/wordprocessingml/2006/main" xmlns:w14="http://schemas.microsoft.com/office/word/2010/wordml" xmlns:w15="http://schemas.microsoft.com/office/word/2012/wordml" xmlns:w16se="http://schemas.microsoft.com/office/word/2015/wordml/symex" mc:Ignorable="w14 w15 w16se"&gt;&lt;w:docDefaults&gt;&lt;w:rPrDefault&gt;&lt;w:rPr&gt;&lt;w:rFonts w:asciiTheme="minorHAnsi" w:eastAsiaTheme="minorEastAsia" w:hAnsiTheme="minorHAnsi" w:cstheme="minorBidi"/&gt;&lt;w:sz w:val="19"/&gt;&lt;w:szCs w:val="19"/&gt;&lt;w:lang w:val="sv-SE" w:eastAsia="en-US" w:bidi="ar-SA"/&gt;&lt;/w:rPr&gt;&lt;/w:rPrDefault&gt;&lt;w:pPrDefault&gt;&lt;w:pPr&gt;&lt;w:spacing w:after="160" w:line="288" w:lineRule="auto"/&gt;&lt;/w:pPr&gt;&lt;/w:pPrDefault&gt;&lt;/w:docDefaults&gt;&lt;w:style w:type="paragraph" w:default="1" w:styleId="Normal"&gt;&lt;w:name w:val="Normal"/&gt;&lt;w:qFormat/&gt;&lt;w:rsid w:val="005F186C"/&gt;&lt;w:pPr&gt;&lt;w:spacing w:after="200"/&gt;&lt;/w:pPr&gt;&lt;w:rPr&gt;&lt;w:sz w:val="20"/&gt;&lt;w:lang w:val="en-GB"/&gt;&lt;/w:rPr&gt;&lt;/w:style&gt;&lt;w:style w:type="paragraph" w:styleId="Heading1"&gt;&lt;w:name w:val="heading 1"/&gt;&lt;w:basedOn w:val="Normal"/&gt;&lt;w:next w:val="Normal"/&gt;&lt;w:link w:val="Heading1Char"/&gt;&lt;w:uiPriority w:val="9"/&gt;&lt;w:qFormat/&gt;&lt;w:rsid w:val="000C3604"/&gt;&lt;w:pPr&gt;&lt;w:keepNext/&gt;&lt;w:keepLines/&gt;&lt;w:spacing w:before="240"/&gt;&lt;w:outlineLvl w:val="0"/&gt;&lt;/w:pPr&gt;&lt;w:rPr&gt;&lt;w:rFonts w:asciiTheme="majorHAnsi" w:eastAsiaTheme="majorEastAsia" w:hAnsiTheme="majorHAnsi" w:cstheme="majorBidi"/&gt;&lt;w:bCs/&gt;&lt;w:sz w:val="28"/&gt;&lt;w:szCs w:val="28"/&gt;&lt;/w:rPr&gt;&lt;/w:style&gt;&lt;w:style w:type="paragraph" w:styleId="Heading2"&gt;&lt;w:name w:val="heading 2"/&gt;&lt;w:basedOn w:val="Normal"/&gt;&lt;w:next w:val="Normal"/&gt;&lt;w:link w:val="Heading2Char"/&gt;&lt;w:uiPriority w:val="9"/&gt;&lt;w:qFormat/&gt;&lt;w:rsid w:val="000C3604"/&gt;&lt;w:pPr&gt;&lt;w:keepNext/&gt;&lt;w:keepLines/&gt;&lt;w:spacing w:before="240" w:after="80"/&gt;&lt;w:outlineLvl w:val="1"/&gt;&lt;/w:pPr&gt;&lt;w:rPr&gt;&lt;w:rFonts w:ascii="GothamMedium" w:eastAsiaTheme="majorEastAsia" w:hAnsi="GothamMedium" w:cstheme="majorBidi"/&gt;&lt;w:bCs/&gt;&lt;w:sz w:val="24"/&gt;&lt;w:szCs w:val="28"/&gt;&lt;/w:rPr&gt;&lt;/w:style&gt;&lt;w:style w:type="paragraph" w:styleId="Heading3"&gt;&lt;w:name w:val="heading 3"/&gt;&lt;w:basedOn w:val="Normal"/&gt;&lt;w:next w:val="Normal"/&gt;&lt;w:link w:val="Heading3Char"/&gt;&lt;w:uiPriority w:val="9"/&gt;&lt;w:qFormat/&gt;&lt;w:rsid w:val="00872413"/&gt;&lt;w:pPr&gt;&lt;w:keepNext/&gt;&lt;w:keepLines/&gt;&lt;w:spacing w:before="120" w:after="40"/&gt;&lt;w:outlineLvl w:val="2"/&gt;&lt;/w:pPr&gt;&lt;w:rPr&gt;&lt;w:rFonts w:ascii="GothamMedium" w:eastAsiaTheme="majorEastAsia" w:hAnsi="GothamMedium" w:cstheme="majorBidi"/&gt;&lt;w:sz w:val="22"/&gt;&lt;w:szCs w:val="24"/&gt;&lt;/w:rPr&gt;&lt;/w:style&gt;&lt;w:style w:type="paragraph" w:styleId="Heading4"&gt;&lt;w:name w:val="heading 4"/&gt;&lt;w:basedOn w:val="Normal"/&gt;&lt;w:next w:val="Normal"/&gt;&lt;w:link w:val="Heading4Char"/&gt;&lt;w:uiPriority w:val="9"/&gt;&lt;w:semiHidden/&gt;&lt;w:qFormat/&gt;&lt;w:rsid w:val="00872413"/&gt;&lt;w:pPr&gt;&lt;w:keepNext/&gt;&lt;w:keepLines/&gt;&lt;w:spacing w:before="120" w:after="40"/&gt;&lt;w:outlineLvl w:val="3"/&gt;&lt;/w:pPr&gt;&lt;w:rPr&gt;&lt;w:rFonts w:ascii="GothamMedium" w:eastAsiaTheme="majorEastAsia" w:hAnsi="GothamMedium" w:cstheme="majorBidi"/&gt;&lt;w:iCs/&gt;&lt;w:szCs w:val="24"/&gt;&lt;/w:rPr&gt;&lt;/w:style&gt;&lt;w:style w:type="paragraph" w:styleId="Heading5"&gt;&lt;w:name w:val="heading 5"/&gt;&lt;w:basedOn w:val="Normal"/&gt;&lt;w:next w:val="Normal"/&gt;&lt;w:link w:val="Heading5Char"/&gt;&lt;w:uiPriority w:val="9"/&gt;&lt;w:semiHidden/&gt;&lt;w:qFormat/&gt;&lt;w:rsid w:val="009B1B65"/&gt;&lt;w:pPr&gt;&lt;w:keepNext/&gt;&lt;w:keepLines/&gt;&lt;w:numPr&gt;&lt;w:ilvl w:val="4"/&gt;&lt;w:numId w:val="15"/&gt;&lt;/w:numPr&gt;&lt;w:spacing w:before="120" w:after="0"/&gt;&lt;w:outlineLvl w:val="4"/&gt;&lt;/w:pPr&gt;&lt;w:rPr&gt;&lt;w:rFonts w:asciiTheme="majorHAnsi" w:eastAsiaTheme="majorEastAsia" w:hAnsiTheme="majorHAnsi" w:cstheme="majorBidi"/&gt;&lt;w:b/&gt;&lt;w:bCs/&gt;&lt;/w:rPr&gt;&lt;/w:style&gt;&lt;w:style w:type="paragraph" w:styleId="Heading6"&gt;&lt;w:name w:val="heading 6"/&gt;&lt;w:basedOn w:val="Normal"/&gt;&lt;w:next w:val="Normal"/&gt;&lt;w:link w:val="Heading6Char"/&gt;&lt;w:uiPriority w:val="9"/&gt;&lt;w:semiHidden/&gt;&lt;w:rsid w:val="009B1B65"/&gt;&lt;w:pPr&gt;&lt;w:keepNext/&gt;&lt;w:keepLines/&gt;&lt;w:numPr&gt;&lt;w:ilvl w:val="5"/&gt;&lt;w:numId w:val="15"/&gt;&lt;/w:numPr&gt;&lt;w:spacing w:before="120" w:after="0"/&gt;&lt;w:outlineLvl w:val="5"/&gt;&lt;/w:pPr&gt;&lt;w:rPr&gt;&lt;w:rFonts w:asciiTheme="majorHAnsi" w:eastAsiaTheme="majorEastAsia" w:hAnsiTheme="majorHAnsi" w:cstheme="majorBidi"/&gt;&lt;w:b/&gt;&lt;w:bCs/&gt;&lt;w:i/&gt;&lt;w:iCs/&gt;&lt;/w:rPr&gt;&lt;/w:style&gt;&lt;w:style w:type="paragraph" w:styleId="Heading7"&gt;&lt;w:name w:val="heading 7"/&gt;&lt;w:basedOn w:val="Normal"/&gt;&lt;w:next w:val="Normal"/&gt;&lt;w:link w:val="Heading7Char"/&gt;&lt;w:uiPriority w:val="9"/&gt;&lt;w:semiHidden/&gt;&lt;w:rsid w:val="009B1B65"/&gt;&lt;w:pPr&gt;&lt;w:keepNext/&gt;&lt;w:keepLines/&gt;&lt;w:numPr&gt;&lt;w:ilvl w:val="6"/&gt;&lt;w:numId w:val="15"/&gt;&lt;/w:numPr&gt;&lt;w:spacing w:before="120" w:after="0"/&gt;&lt;w:outlineLvl w:val="6"/&gt;&lt;/w:pPr&gt;&lt;w:rPr&gt;&lt;w:i/&gt;&lt;w:iCs/&gt;&lt;/w:rPr&gt;&lt;/w:style&gt;&lt;w:style w:type="paragraph" w:styleId="Heading8"&gt;&lt;w:name w:val="heading 8"/&gt;&lt;w:basedOn w:val="Normal"/&gt;&lt;w:next w:val="Normal"/&gt;&lt;w:link w:val="Heading8Char"/&gt;&lt;w:uiPriority w:val="9"/&gt;&lt;w:semiHidden/&gt;&lt;w:rsid w:val="009B1B65"/&gt;&lt;w:pPr&gt;&lt;w:keepNext/&gt;&lt;w:keepLines/&gt;&lt;w:numPr&gt;&lt;w:ilvl w:val="7"/&gt;&lt;w:numId w:val="15"/&gt;&lt;/w:numPr&gt;&lt;w:spacing w:before="120" w:after="0"/&gt;&lt;w:outlineLvl w:val="7"/&gt;&lt;/w:pPr&gt;&lt;w:rPr&gt;&lt;w:b/&gt;&lt;w:bCs/&gt;&lt;/w:rPr&gt;&lt;/w:style&gt;&lt;w:style w:type="paragraph" w:styleId="Heading9"&gt;&lt;w:name w:val="heading 9"/&gt;&lt;w:basedOn w:val="Normal"/&gt;&lt;w:next w:val="Normal"/&gt;&lt;w:link w:val="Heading9Char"/&gt;&lt;w:uiPriority w:val="9"/&gt;&lt;w:semiHidden/&gt;&lt;w:rsid w:val="009B1B65"/&gt;&lt;w:pPr&gt;&lt;w:keepNext/&gt;&lt;w:keepLines/&gt;&lt;w:numPr&gt;&lt;w:ilvl w:val="8"/&gt;&lt;w:numId w:val="15"/&gt;&lt;/w:numPr&gt;&lt;w:spacing w:before="120" w:after="0"/&gt;&lt;w:outlineLvl w:val="8"/&gt;&lt;/w:pPr&gt;&lt;w:rPr&gt;&lt;w:i/&gt;&lt;w:iCs/&gt;&lt;/w:rPr&gt;&lt;/w:style&gt;&lt;w:style w:type="character" w:default="1" w:styleId="DefaultParagraphFont"&gt;&lt;w:name w:val="Default Paragraph Font"/&gt;&lt;w:uiPriority w:val="1"/&gt;&lt;w:semiHidden/&gt;&lt;w:unhideWhenUsed/&gt;&lt;/w:style&gt;&lt;w:style w:type="table" w:default="1" w:styleId="TableNormal"&gt;&lt;w:name w:val="Normal Table"/&gt;&lt;w:uiPriority w:val="99"/&gt;&lt;w:semiHidden/&gt;&lt;w:unhideWhenUsed/&gt;&lt;w:tblPr&gt;&lt;w:tblInd w:w="0" w:type="dxa"/&gt;&lt;w:tblCellMar&gt;&lt;w:top w:w="0" w:type="dxa"/&gt;&lt;w:left w:w="108" w:type="dxa"/&gt;&lt;w:bottom w:w="0" w:type="dxa"/&gt;&lt;w:right w:w="108" w:type="dxa"/&gt;&lt;/w:tblCellMar&gt;&lt;/w:tblPr&gt;&lt;/w:style&gt;&lt;w:style w:type="numbering" w:default="1" w:styleId="NoList"&gt;&lt;w:name w:val="No List"/&gt;&lt;w:uiPriority w:val="99"/&gt;&lt;w:semiHidden/&gt;&lt;w:unhideWhenUsed/&gt;&lt;/w:style&gt;&lt;w:style w:type="character" w:customStyle="1" w:styleId="Heading1Char"&gt;&lt;w:name w:val="Heading 1 Char"/&gt;&lt;w:basedOn w:val="DefaultParagraphFont"/&gt;&lt;w:link w:val="Heading1"/&gt;&lt;w:uiPriority w:val="9"/&gt;&lt;w:rsid w:val="000C3604"/&gt;&lt;w:rPr&gt;&lt;w:rFonts w:asciiTheme="majorHAnsi" w:eastAsiaTheme="majorEastAsia" w:hAnsiTheme="majorHAnsi" w:cstheme="majorBidi"/&gt;&lt;w:bCs/&gt;&lt;w:sz w:val="28"/&gt;&lt;w:szCs w:val="28"/&gt;&lt;w:lang w:val="en-GB"/&gt;&lt;/w:rPr&gt;&lt;/w:style&gt;&lt;w:style w:type="character" w:customStyle="1" w:styleId="Heading2Char"&gt;&lt;w:name w:val="Heading 2 Char"/&gt;&lt;w:basedOn w:val="DefaultParagraphFont"/&gt;&lt;w:link w:val="Heading2"/&gt;&lt;w:uiPriority w:val="9"/&gt;&lt;w:rsid w:val="000C3604"/&gt;&lt;w:rPr&gt;&lt;w:rFonts w:ascii="GothamMedium" w:eastAsiaTheme="majorEastAsia" w:hAnsi="GothamMedium" w:cstheme="majorBidi"/&gt;&lt;w:bCs/&gt;&lt;w:sz w:val="24"/&gt;&lt;w:szCs w:val="28"/&gt;&lt;w:lang w:val="en-GB"/&gt;&lt;/w:rPr&gt;&lt;/w:style&gt;&lt;w:style w:type="character" w:customStyle="1" w:styleId="Heading3Char"&gt;&lt;w:name w:val="Heading 3 Char"/&gt;&lt;w:basedOn w:val="DefaultParagraphFont"/&gt;&lt;w:link w:val="Heading3"/&gt;&lt;w:uiPriority w:val="9"/&gt;&lt;w:rsid w:val="00872413"/&gt;&lt;w:rPr&gt;&lt;w:rFonts w:ascii="GothamMedium" w:eastAsiaTheme="majorEastAsia" w:hAnsi="GothamMedium" w:cstheme="majorBidi"/&gt;&lt;w:sz w:val="22"/&gt;&lt;w:szCs w:val="24"/&gt;&lt;w:lang w:val="en-GB"/&gt;&lt;/w:rPr&gt;&lt;/w:style&gt;&lt;w:style w:type="character" w:customStyle="1" w:styleId="Heading4Char"&gt;&lt;w:name w:val="Heading 4 Char"/&gt;&lt;w:basedOn w:val="DefaultParagraphFont"/&gt;&lt;w:link w:val="Heading4"/&gt;&lt;w:uiPriority w:val="9"/&gt;&lt;w:semiHidden/&gt;&lt;w:rsid w:val="005F186C"/&gt;&lt;w:rPr&gt;&lt;w:rFonts w:ascii="GothamMedium" w:eastAsiaTheme="majorEastAsia" w:hAnsi="GothamMedium" w:cstheme="majorBidi"/&gt;&lt;w:iCs/&gt;&lt;w:sz w:val="20"/&gt;&lt;w:szCs w:val="24"/&gt;&lt;w:lang w:val="en-GB"/&gt;&lt;/w:rPr&gt;&lt;/w:style&gt;&lt;w:style w:type="character" w:customStyle="1" w:styleId="Heading5Char"&gt;&lt;w:name w:val="Heading 5 Char"/&gt;&lt;w:basedOn w:val="DefaultParagraphFont"/&gt;&lt;w:link w:val="Heading5"/&gt;&lt;w:uiPriority w:val="9"/&gt;&lt;w:semiHidden/&gt;&lt;w:rsid w:val="008E716E"/&gt;&lt;w:rPr&gt;&lt;w:rFonts w:asciiTheme="majorHAnsi" w:eastAsiaTheme="majorEastAsia" w:hAnsiTheme="majorHAnsi" w:cstheme="majorBidi"/&gt;&lt;w:b/&gt;&lt;w:bCs/&gt;&lt;w:lang w:val="en-GB"/&gt;&lt;/w:rPr&gt;&lt;/w:style&gt;&lt;w:style w:type="character" w:customStyle="1" w:styleId="Heading6Char"&gt;&lt;w:name w:val="Heading 6 Char"/&gt;&lt;w:basedOn w:val="DefaultParagraphFont"/&gt;&lt;w:link w:val="Heading6"/&gt;&lt;w:uiPriority w:val="9"/&gt;&lt;w:semiHidden/&gt;&lt;w:rsid w:val="008E716E"/&gt;&lt;w:rPr&gt;&lt;w:rFonts w:asciiTheme="majorHAnsi" w:eastAsiaTheme="majorEastAsia" w:hAnsiTheme="majorHAnsi" w:cstheme="majorBidi"/&gt;&lt;w:b/&gt;&lt;w:bCs/&gt;&lt;w:i/&gt;&lt;w:iCs/&gt;&lt;w:lang w:val="en-GB"/&gt;&lt;/w:rPr&gt;&lt;/w:style&gt;&lt;w:style w:type="character" w:customStyle="1" w:styleId="Heading7Char"&gt;&lt;w:name w:val="Heading 7 Char"/&gt;&lt;w:basedOn w:val="DefaultParagraphFont"/&gt;&lt;w:link w:val="Heading7"/&gt;&lt;w:uiPriority w:val="9"/&gt;&lt;w:semiHidden/&gt;&lt;w:rsid w:val="008E716E"/&gt;&lt;w:rPr&gt;&lt;w:i/&gt;&lt;w:iCs/&gt;&lt;w:lang w:val="en-GB"/&gt;&lt;/w:rPr&gt;&lt;/w:style&gt;&lt;w:style w:type="character" w:customStyle="1" w:styleId="Heading8Char"&gt;&lt;w:name w:val="Heading 8 Char"/&gt;&lt;w:basedOn w:val="DefaultParagraphFont"/&gt;&lt;w:link w:val="Heading8"/&gt;&lt;w:uiPriority w:val="9"/&gt;&lt;w:semiHidden/&gt;&lt;w:rsid w:val="008E716E"/&gt;&lt;w:rPr&gt;&lt;w:b/&gt;&lt;w:bCs/&gt;&lt;w:lang w:val="en-GB"/&gt;&lt;/w:rPr&gt;&lt;/w:style&gt;&lt;w:style w:type="character" w:customStyle="1" w:styleId="Heading9Char"&gt;&lt;w:name w:val="Heading 9 Char"/&gt;&lt;w:basedOn w:val="DefaultParagraphFont"/&gt;&lt;w:link w:val="Heading9"/&gt;&lt;w:uiPriority w:val="9"/&gt;&lt;w:semiHidden/&gt;&lt;w:rsid w:val="008E716E"/&gt;&lt;w:rPr&gt;&lt;w:i/&gt;&lt;w:iCs/&gt;&lt;w:lang w:val="en-GB"/&gt;&lt;/w:rPr&gt;&lt;/w:style&gt;&lt;w:style w:type="paragraph" w:styleId="Caption"&gt;&lt;w:name w:val="caption"/&gt;&lt;w:basedOn w:val="Normal"/&gt;&lt;w:next w:val="Normal"/&gt;&lt;w:uiPriority w:val="35"/&gt;&lt;w:semiHidden/&gt;&lt;w:rsid w:val="009B1B65"/&gt;&lt;w:rPr&gt;&lt;w:b/&gt;&lt;w:bCs/&gt;&lt;w:sz w:val="18"/&gt;&lt;w:szCs w:val="18"/&gt;&lt;/w:rPr&gt;&lt;/w:style&gt;&lt;w:style w:type="paragraph" w:styleId="Title"&gt;&lt;w:name w:val="Title"/&gt;&lt;w:basedOn w:val="Normal"/&gt;&lt;w:next w:val="Normal"/&gt;&lt;w:link w:val="TitleChar"/&gt;&lt;w:uiPriority w:val="10"/&gt;&lt;w:semiHidden/&gt;&lt;w:qFormat/&gt;&lt;w:rsid w:val="00872413"/&gt;&lt;w:pPr&gt;&lt;w:spacing w:after="0"/&gt;&lt;w:contextualSpacing/&gt;&lt;/w:pPr&gt;&lt;w:rPr&gt;&lt;w:rFonts w:asciiTheme="majorHAnsi" w:eastAsiaTheme="majorEastAsia" w:hAnsiTheme="majorHAnsi" w:cstheme="majorBidi"/&gt;&lt;w:bCs/&gt;&lt;w:color w:val="407077" w:themeColor="accent1"/&gt;&lt;w:sz w:val="72"/&gt;&lt;w:szCs w:val="48"/&gt;&lt;/w:rPr&gt;&lt;/w:style&gt;&lt;w:style w:type="character" w:customStyle="1" w:styleId="TitleChar"&gt;&lt;w:name w:val="Title Char"/&gt;&lt;w:basedOn w:val="DefaultParagraphFont"/&gt;&lt;w:link w:val="Title"/&gt;&lt;w:uiPriority w:val="10"/&gt;&lt;w:semiHidden/&gt;&lt;w:rsid w:val="005F186C"/&gt;&lt;w:rPr&gt;&lt;w:rFonts w:asciiTheme="majorHAnsi" w:eastAsiaTheme="majorEastAsia" w:hAnsiTheme="majorHAnsi" w:cstheme="majorBidi"/&gt;&lt;w:bCs/&gt;&lt;w:color w:val="407077" w:themeColor="accent1"/&gt;&lt;w:sz w:val="72"/&gt;&lt;w:szCs w:val="48"/&gt;&lt;w:lang w:val="en-GB"/&gt;&lt;/w:rPr&gt;&lt;/w:style&gt;&lt;w:style w:type="paragraph" w:styleId="Subtitle"&gt;&lt;w:name w:val="Subtitle"/&gt;&lt;w:basedOn w:val="Normal"/&gt;&lt;w:next w:val="Normal"/&gt;&lt;w:link w:val="SubtitleChar"/&gt;&lt;w:uiPriority w:val="11"/&gt;&lt;w:semiHidden/&gt;&lt;w:qFormat/&gt;&lt;w:rsid w:val="00872413"/&gt;&lt;w:pPr&gt;&lt;w:numPr&gt;&lt;w:ilvl w:val="1"/&gt;&lt;/w:numPr&gt;&lt;w:spacing w:before="120" w:after="240"/&gt;&lt;/w:pPr&gt;&lt;w:rPr&gt;&lt;w:rFonts w:ascii="GothamMedium" w:eastAsiaTheme="majorEastAsia" w:hAnsi="GothamMedium" w:cstheme="majorBidi"/&gt;&lt;w:color w:val="343436" w:themeColor="text2"/&gt;&lt;w:sz w:val="24"/&gt;&lt;w:szCs w:val="24"/&gt;&lt;/w:rPr&gt;&lt;/w:style&gt;&lt;w:style w:type="character" w:customStyle="1" w:styleId="SubtitleChar"&gt;&lt;w:name w:val="Subtitle Char"/&gt;&lt;w:basedOn w:val="DefaultParagraphFont"/&gt;&lt;w:link w:val="Subtitle"/&gt;&lt;w:uiPriority w:val="11"/&gt;&lt;w:semiHidden/&gt;&lt;w:rsid w:val="005F186C"/&gt;&lt;w:rPr&gt;&lt;w:rFonts w:ascii="GothamMedium" w:eastAsiaTheme="majorEastAsia" w:hAnsi="GothamMedium" w:cstheme="majorBidi"/&gt;&lt;w:color w:val="343436" w:themeColor="text2"/&gt;&lt;w:sz w:val="24"/&gt;&lt;w:szCs w:val="24"/&gt;&lt;w:lang w:val="en-GB"/&gt;&lt;/w:rPr&gt;&lt;/w:style&gt;&lt;w:style w:type="character" w:styleId="Strong"&gt;&lt;w:name w:val="Strong"/&gt;&lt;w:basedOn w:val="DefaultParagraphFont"/&gt;&lt;w:uiPriority w:val="22"/&gt;&lt;w:semiHidden/&gt;&lt;w:rsid w:val="009B1B65"/&gt;&lt;w:rPr&gt;&lt;w:b/&gt;&lt;w:bCs/&gt;&lt;w:color w:val="auto"/&gt;&lt;/w:rPr&gt;&lt;/w:style&gt;&lt;w:style w:type="character" w:styleId="Emphasis"&gt;&lt;w:name w:val="Emphasis"/&gt;&lt;w:basedOn w:val="DefaultParagraphFont"/&gt;&lt;w:uiPriority w:val="20"/&gt;&lt;w:semiHidden/&gt;&lt;w:rsid w:val="009B1B65"/&gt;&lt;w:rPr&gt;&lt;w:i/&gt;&lt;w:iCs/&gt;&lt;w:color w:val="auto"/&gt;&lt;/w:rPr&gt;&lt;/w:style&gt;&lt;w:style w:type="paragraph" w:styleId="NoSpacing"&gt;&lt;w:name w:val="No Spacing"/&gt;&lt;w:link w:val="NoSpacingChar"/&gt;&lt;w:uiPriority w:val="1"/&gt;&lt;w:qFormat/&gt;&lt;w:rsid w:val="00EA5662"/&gt;&lt;w:pPr&gt;&lt;w:spacing w:after="0"/&gt;&lt;/w:pPr&gt;&lt;/w:style&gt;&lt;w:style w:type="paragraph" w:styleId="Quote"&gt;&lt;w:name w:val="Quote"/&gt;&lt;w:basedOn w:val="Normal"/&gt;&lt;w:next w:val="Normal"/&gt;&lt;w:link w:val="QuoteChar"/&gt;&lt;w:uiPriority w:val="29"/&gt;&lt;w:semiHidden/&gt;&lt;w:rsid w:val="009B1B65"/&gt;&lt;w:pPr&gt;&lt;w:spacing w:before="200" w:line="264" w:lineRule="auto"/&gt;&lt;w:ind w:left="864" w:right="864"/&gt;&lt;w:jc w:val="center"/&gt;&lt;/w:pPr&gt;&lt;w:rPr&gt;&lt;w:rFonts w:asciiTheme="majorHAnsi" w:eastAsiaTheme="majorEastAsia" w:hAnsiTheme="majorHAnsi" w:cstheme="majorBidi"/&gt;&lt;w:i/&gt;&lt;w:iCs/&gt;&lt;w:sz w:val="24"/&gt;&lt;w:szCs w:val="24"/&gt;&lt;/w:rPr&gt;&lt;/w:style&gt;&lt;w:style w:type="character" w:customStyle="1" w:styleId="QuoteChar"&gt;&lt;w:name w:val="Quote Char"/&gt;&lt;w:basedOn w:val="DefaultParagraphFont"/&gt;&lt;w:link w:val="Quote"/&gt;&lt;w:uiPriority w:val="29"/&gt;&lt;w:semiHidden/&gt;&lt;w:rsid w:val="009B1B65"/&gt;&lt;w:rPr&gt;&lt;w:rFonts w:asciiTheme="majorHAnsi" w:eastAsiaTheme="majorEastAsia" w:hAnsiTheme="majorHAnsi" w:cstheme="majorBidi"/&gt;&lt;w:i/&gt;&lt;w:iCs/&gt;&lt;w:sz w:val="24"/&gt;&lt;w:szCs w:val="24"/&gt;&lt;/w:rPr&gt;&lt;/w:style&gt;&lt;w:style w:type="paragraph" w:styleId="IntenseQuote"&gt;&lt;w:name w:val="Intense Quote"/&gt;&lt;w:basedOn w:val="Normal"/&gt;&lt;w:next w:val="Normal"/&gt;&lt;w:link w:val="IntenseQuoteChar"/&gt;&lt;w:uiPriority w:val="30"/&gt;&lt;w:semiHidden/&gt;&lt;w:rsid w:val="009B1B65"/&gt;&lt;w:pPr&gt;&lt;w:spacing w:before="100" w:beforeAutospacing="1" w:after="240"/&gt;&lt;w:ind w:left="936" w:right="936"/&gt;&lt;w:jc w:val="center"/&gt;&lt;/w:pPr&gt;&lt;w:rPr&gt;&lt;w:rFonts w:asciiTheme="majorHAnsi" w:eastAsiaTheme="majorEastAsia" w:hAnsiTheme="majorHAnsi" w:cstheme="majorBidi"/&gt;&lt;w:sz w:val="26"/&gt;&lt;w:szCs w:val="26"/&gt;&lt;/w:rPr&gt;&lt;/w:style&gt;&lt;w:style w:type="character" w:customStyle="1" w:styleId="IntenseQuoteChar"&gt;&lt;w:name w:val="Intense Quote Char"/&gt;&lt;w:basedOn w:val="DefaultParagraphFont"/&gt;&lt;w:link w:val="IntenseQuote"/&gt;&lt;w:uiPriority w:val="30"/&gt;&lt;w:semiHidden/&gt;&lt;w:rsid w:val="009B1B65"/&gt;&lt;w:rPr&gt;&lt;w:rFonts w:asciiTheme="majorHAnsi" w:eastAsiaTheme="majorEastAsia" w:hAnsiTheme="majorHAnsi" w:cstheme="majorBidi"/&gt;&lt;w:sz w:val="26"/&gt;&lt;w:szCs w:val="26"/&gt;&lt;/w:rPr&gt;&lt;/w:style&gt;&lt;w:style w:type="character" w:styleId="SubtleEmphasis"&gt;&lt;w:name w:val="Subtle Emphasis"/&gt;&lt;w:basedOn w:val="DefaultParagraphFont"/&gt;&lt;w:uiPriority w:val="19"/&gt;&lt;w:semiHidden/&gt;&lt;w:rsid w:val="009B1B65"/&gt;&lt;w:rPr&gt;&lt;w:i/&gt;&lt;w:iCs/&gt;&lt;w:color w:val="auto"/&gt;&lt;/w:rPr&gt;&lt;/w:style&gt;&lt;w:style w:type="character" w:styleId="IntenseEmphasis"&gt;&lt;w:name w:val="Intense Emphasis"/&gt;&lt;w:basedOn w:val="DefaultParagraphFont"/&gt;&lt;w:uiPriority w:val="21"/&gt;&lt;w:semiHidden/&gt;&lt;w:rsid w:val="009B1B65"/&gt;&lt;w:rPr&gt;&lt;w:b/&gt;&lt;w:bCs/&gt;&lt;w:i/&gt;&lt;w:iCs/&gt;&lt;w:color w:val="auto"/&gt;&lt;/w:rPr&gt;&lt;/w:style&gt;&lt;w:style w:type="character" w:styleId="SubtleReference"&gt;&lt;w:name w:val="Subtle Reference"/&gt;&lt;w:basedOn w:val="DefaultParagraphFont"/&gt;&lt;w:uiPriority w:val="31"/&gt;&lt;w:semiHidden/&gt;&lt;w:rsid w:val="009B1B65"/&gt;&lt;w:rPr&gt;&lt;w:smallCaps/&gt;&lt;w:color w:val="auto"/&gt;&lt;w:u w:val="single" w:color="7F7F7F" w:themeColor="text1" w:themeTint="80"/&gt;&lt;/w:rPr&gt;&lt;/w:style&gt;&lt;w:style w:type="character" w:styleId="IntenseReference"&gt;&lt;w:name w:val="Intense Reference"/&gt;&lt;w:basedOn w:val="DefaultParagraphFont"/&gt;&lt;w:uiPriority w:val="32"/&gt;&lt;w:semiHidden/&gt;&lt;w:rsid w:val="009B1B65"/&gt;&lt;w:rPr&gt;&lt;w:b/&gt;&lt;w:bCs/&gt;&lt;w:smallCaps/&gt;&lt;w:color w:val="auto"/&gt;&lt;w:u w:val="single"/&gt;&lt;/w:rPr&gt;&lt;/w:style&gt;&lt;w:style w:type="character" w:styleId="BookTitle"&gt;&lt;w:name w:val="Book Title"/&gt;&lt;w:basedOn w:val="DefaultParagraphFont"/&gt;&lt;w:uiPriority w:val="33"/&gt;&lt;w:semiHidden/&gt;&lt;w:rsid w:val="009B1B65"/&gt;&lt;w:rPr&gt;&lt;w:b/&gt;&lt;w:bCs/&gt;&lt;w:smallCaps/&gt;&lt;w:color w:val="auto"/&gt;&lt;/w:rPr&gt;&lt;/w:style&gt;&lt;w:style w:type="paragraph" w:styleId="TOCHeading"&gt;&lt;w:name w:val="TOC Heading"/&gt;&lt;w:basedOn w:val="Normal"/&gt;&lt;w:next w:val="Normal"/&gt;&lt;w:uiPriority w:val="39"/&gt;&lt;w:semiHidden/&gt;&lt;w:rsid w:val="009F4214"/&gt;&lt;w:pPr&gt;&lt;w:keepNext/&gt;&lt;w:keepLines/&gt;&lt;w:pageBreakBefore/&gt;&lt;/w:pPr&gt;&lt;w:rPr&gt;&lt;w:rFonts w:asciiTheme="majorHAnsi" w:hAnsiTheme="majorHAnsi"/&gt;&lt;w:b/&gt;&lt;w:sz w:val="32"/&gt;&lt;/w:rPr&gt;&lt;/w:style&gt;&lt;w:style w:type="paragraph" w:styleId="ListBullet"&gt;&lt;w:name w:val="List Bullet"/&gt;&lt;w:basedOn w:val="Normal"/&gt;&lt;w:uiPriority w:val="14"/&gt;&lt;w:qFormat/&gt;&lt;w:rsid w:val="001D4B24"/&gt;&lt;w:pPr&gt;&lt;w:numPr&gt;&lt;w:numId w:val="1"/&gt;&lt;/w:numPr&gt;&lt;w:spacing w:after="80"/&gt;&lt;w:contextualSpacing/&gt;&lt;/w:pPr&gt;&lt;/w:style&gt;&lt;w:style w:type="paragraph" w:styleId="ListNumber"&gt;&lt;w:name w:val="List Number"/&gt;&lt;w:basedOn w:val="Normal"/&gt;&lt;w:uiPriority w:val="14"/&gt;&lt;w:qFormat/&gt;&lt;w:rsid w:val="00223177"/&gt;&lt;w:pPr&gt;&lt;w:numPr&gt;&lt;w:numId w:val="6"/&gt;&lt;/w:numPr&gt;&lt;w:spacing w:after="80"/&gt;&lt;w:ind w:left="357" w:hanging="357"/&gt;&lt;w:contextualSpacing/&gt;&lt;/w:pPr&gt;&lt;/w:style&gt;&lt;w:style w:type="table" w:styleId="TableGrid"&gt;&lt;w:name w:val="Table Grid"/&gt;&lt;w:basedOn w:val="TableNormal"/&gt;&lt;w:uiPriority w:val="39"/&gt;&lt;w:rsid w:val="00572408"/&gt;&lt;w:pPr&gt;&lt;w:spacing w:after="0" w:line="240" w:lineRule="auto"/&gt;&lt;/w:pPr&gt;&lt;w:tblPr/&gt;&lt;/w:style&gt;&lt;w:style w:type="paragraph" w:styleId="FootnoteText"&gt;&lt;w:name w:val="footnote text"/&gt;&lt;w:basedOn w:val="Normal"/&gt;&lt;w:link w:val="FootnoteTextChar"/&gt;&lt;w:uiPriority w:val="99"/&gt;&lt;w:semiHidden/&gt;&lt;w:rsid w:val="00872413"/&gt;&lt;w:pPr&gt;&lt;w:spacing w:after="0"/&gt;&lt;/w:pPr&gt;&lt;w:rPr&gt;&lt;w:sz w:val="14"/&gt;&lt;w:szCs w:val="20"/&gt;&lt;/w:rPr&gt;&lt;/w:style&gt;&lt;w:style w:type="character" w:customStyle="1" w:styleId="FootnoteTextChar"&gt;&lt;w:name w:val="Footnote Text Char"/&gt;&lt;w:basedOn w:val="DefaultParagraphFont"/&gt;&lt;w:link w:val="FootnoteText"/&gt;&lt;w:uiPriority w:val="99"/&gt;&lt;w:semiHidden/&gt;&lt;w:rsid w:val="005F186C"/&gt;&lt;w:rPr&gt;&lt;w:sz w:val="14"/&gt;&lt;w:szCs w:val="20"/&gt;&lt;w:lang w:val="en-GB"/&gt;&lt;/w:rPr&gt;&lt;/w:style&gt;&lt;w:style w:type="character" w:styleId="FootnoteReference"&gt;&lt;w:name w:val="footnote reference"/&gt;&lt;w:basedOn w:val="DefaultParagraphFont"/&gt;&lt;w:uiPriority w:val="99"/&gt;&lt;w:semiHidden/&gt;&lt;w:rsid w:val="00884E47"/&gt;&lt;w:rPr&gt;&lt;w:vertAlign w:val="superscript"/&gt;&lt;/w:rPr&gt;&lt;/w:style&gt;&lt;w:style w:type="paragraph" w:styleId="Header"&gt;&lt;w:name w:val="header"/&gt;&lt;w:basedOn w:val="Normal"/&gt;&lt;w:link w:val="HeaderChar"/&gt;&lt;w:uiPriority w:val="99"/&gt;&lt;w:semiHidden/&gt;&lt;w:rsid w:val="005F186C"/&gt;&lt;w:pPr&gt;&lt;w:tabs&gt;&lt;w:tab w:val="center" w:pos="4536"/&gt;&lt;w:tab w:val="right" w:pos="9072"/&gt;&lt;/w:tabs&gt;&lt;w:spacing w:after="0" w:line="240" w:lineRule="auto"/&gt;&lt;/w:pPr&gt;&lt;w:rPr&gt;&lt;w:color w:val="858585" w:themeColor="accent5"/&gt;&lt;w:sz w:val="16"/&gt;&lt;/w:rPr&gt;&lt;/w:style&gt;&lt;w:style w:type="character" w:customStyle="1" w:styleId="HeaderChar"&gt;&lt;w:name w:val="Header Char"/&gt;&lt;w:basedOn w:val="DefaultParagraphFont"/&gt;&lt;w:link w:val="Header"/&gt;&lt;w:uiPriority w:val="99"/&gt;&lt;w:semiHidden/&gt;&lt;w:rsid w:val="005F186C"/&gt;&lt;w:rPr&gt;&lt;w:color w:val="858585" w:themeColor="accent5"/&gt;&lt;w:sz w:val="16"/&gt;&lt;w:lang w:val="en-GB"/&gt;&lt;/w:rPr&gt;&lt;/w:style&gt;&lt;w:style w:type="paragraph" w:styleId="Footer"&gt;&lt;w:name w:val="footer"/&gt;&lt;w:basedOn w:val="Normal"/&gt;&lt;w:link w:val="FooterChar"/&gt;&lt;w:uiPriority w:val="99"/&gt;&lt;w:semiHidden/&gt;&lt;w:rsid w:val="005F186C"/&gt;&lt;w:pPr&gt;&lt;w:tabs&gt;&lt;w:tab w:val="center" w:pos="4536"/&gt;&lt;w:tab w:val="right" w:pos="9072"/&gt;&lt;/w:tabs&gt;&lt;w:spacing w:after="0" w:line="240" w:lineRule="auto"/&gt;&lt;/w:pPr&gt;&lt;w:rPr&gt;&lt;w:color w:val="858585" w:themeColor="accent5"/&gt;&lt;w:sz w:val="16"/&gt;&lt;/w:rPr&gt;&lt;/w:style&gt;&lt;w:style w:type="character" w:customStyle="1" w:styleId="FooterChar"&gt;&lt;w:name w:val="Footer Char"/&gt;&lt;w:basedOn w:val="DefaultParagraphFont"/&gt;&lt;w:link w:val="Footer"/&gt;&lt;w:uiPriority w:val="99"/&gt;&lt;w:semiHidden/&gt;&lt;w:rsid w:val="005F186C"/&gt;&lt;w:rPr&gt;&lt;w:color w:val="858585" w:themeColor="accent5"/&gt;&lt;w:sz w:val="16"/&gt;&lt;w:lang w:val="en-GB"/&gt;&lt;/w:rPr&gt;&lt;/w:style&gt;&lt;w:style w:type="paragraph" w:styleId="TOC1"&gt;&lt;w:name w:val="toc 1"/&gt;&lt;w:basedOn w:val="Normal"/&gt;&lt;w:next w:val="Normal"/&gt;&lt;w:uiPriority w:val="39"/&gt;&lt;w:semiHidden/&gt;&lt;w:rsid w:val="00421476"/&gt;&lt;w:pPr&gt;&lt;w:tabs&gt;&lt;w:tab w:val="right" w:leader="dot" w:pos="8210"/&gt;&lt;/w:tabs&gt;&lt;w:spacing w:after="100"/&gt;&lt;w:ind w:left="426" w:hanging="426"/&gt;&lt;/w:pPr&gt;&lt;/w:style&gt;&lt;w:style w:type="paragraph" w:styleId="TOC2"&gt;&lt;w:name w:val="toc 2"/&gt;&lt;w:basedOn w:val="Normal"/&gt;&lt;w:next w:val="Normal"/&gt;&lt;w:uiPriority w:val="39"/&gt;&lt;w:semiHidden/&gt;&lt;w:rsid w:val="00EE62A8"/&gt;&lt;w:pPr&gt;&lt;w:tabs&gt;&lt;w:tab w:val="right" w:leader="dot" w:pos="8210"/&gt;&lt;/w:tabs&gt;&lt;w:spacing w:after="100"/&gt;&lt;w:ind w:left="1134" w:hanging="708"/&gt;&lt;/w:pPr&gt;&lt;w:rPr&gt;&lt;w:noProof/&gt;&lt;/w:rPr&gt;&lt;/w:style&gt;&lt;w:style w:type="paragraph" w:styleId="TOC3"&gt;&lt;w:name w:val="toc 3"/&gt;&lt;w:basedOn w:val="Normal"/&gt;&lt;w:next w:val="Normal"/&gt;&lt;w:uiPriority w:val="39"/&gt;&lt;w:semiHidden/&gt;&lt;w:rsid w:val="00EE62A8"/&gt;&lt;w:pPr&gt;&lt;w:tabs&gt;&lt;w:tab w:val="right" w:leader="dot" w:pos="8210"/&gt;&lt;/w:tabs&gt;&lt;w:spacing w:after="100"/&gt;&lt;w:ind w:left="1134" w:hanging="694"/&gt;&lt;/w:pPr&gt;&lt;w:rPr&gt;&lt;w:noProof/&gt;&lt;/w:rPr&gt;&lt;/w:style&gt;&lt;w:style w:type="character" w:styleId="Hyperlink"&gt;&lt;w:name w:val="Hyperlink"/&gt;&lt;w:basedOn w:val="DefaultParagraphFont"/&gt;&lt;w:uiPriority w:val="99"/&gt;&lt;w:semiHidden/&gt;&lt;w:rsid w:val="008555A7"/&gt;&lt;w:rPr&gt;&lt;w:color w:val="A1BF35" w:themeColor="hyperlink"/&gt;&lt;w:u w:val="single"/&gt;&lt;/w:rPr&gt;&lt;/w:style&gt;&lt;w:style w:type="paragraph" w:styleId="TOC4"&gt;&lt;w:name w:val="toc 4"/&gt;&lt;w:basedOn w:val="Normal"/&gt;&lt;w:next w:val="Normal"/&gt;&lt;w:uiPriority w:val="39"/&gt;&lt;w:semiHidden/&gt;&lt;w:rsid w:val="00FF2698"/&gt;&lt;w:pPr&gt;&lt;w:spacing w:after="100"/&gt;&lt;w:ind w:left="660"/&gt;&lt;/w:pPr&gt;&lt;/w:style&gt;&lt;w:style w:type="paragraph" w:styleId="TOC5"&gt;&lt;w:name w:val="toc 5"/&gt;&lt;w:basedOn w:val="Normal"/&gt;&lt;w:next w:val="Normal"/&gt;&lt;w:uiPriority w:val="39"/&gt;&lt;w:semiHidden/&gt;&lt;w:rsid w:val="00FF2698"/&gt;&lt;w:pPr&gt;&lt;w:spacing w:after="100"/&gt;&lt;w:ind w:left="880"/&gt;&lt;/w:pPr&gt;&lt;/w:style&gt;&lt;w:style w:type="paragraph" w:styleId="TOC6"&gt;&lt;w:name w:val="toc 6"/&gt;&lt;w:basedOn w:val="Normal"/&gt;&lt;w:next w:val="Normal"/&gt;&lt;w:uiPriority w:val="39"/&gt;&lt;w:semiHidden/&gt;&lt;w:rsid w:val="00FF2698"/&gt;&lt;w:pPr&gt;&lt;w:spacing w:after="100"/&gt;&lt;w:ind w:left="1100"/&gt;&lt;/w:pPr&gt;&lt;/w:style&gt;&lt;w:style w:type="paragraph" w:styleId="TOC7"&gt;&lt;w:name w:val="toc 7"/&gt;&lt;w:basedOn w:val="Normal"/&gt;&lt;w:next w:val="Normal"/&gt;&lt;w:uiPriority w:val="39"/&gt;&lt;w:semiHidden/&gt;&lt;w:rsid w:val="00FF2698"/&gt;&lt;w:pPr&gt;&lt;w:spacing w:after="100"/&gt;&lt;w:ind w:left="1320"/&gt;&lt;/w:pPr&gt;&lt;/w:style&gt;&lt;w:style w:type="paragraph" w:styleId="TOC8"&gt;&lt;w:name w:val="toc 8"/&gt;&lt;w:basedOn w:val="Normal"/&gt;&lt;w:next w:val="Normal"/&gt;&lt;w:uiPriority w:val="39"/&gt;&lt;w:semiHidden/&gt;&lt;w:rsid w:val="00FF2698"/&gt;&lt;w:pPr&gt;&lt;w:spacing w:after="100"/&gt;&lt;w:ind w:left="1540"/&gt;&lt;/w:pPr&gt;&lt;/w:style&gt;&lt;w:style w:type="paragraph" w:styleId="TOC9"&gt;&lt;w:name w:val="toc 9"/&gt;&lt;w:basedOn w:val="Normal"/&gt;&lt;w:next w:val="Normal"/&gt;&lt;w:uiPriority w:val="39"/&gt;&lt;w:semiHidden/&gt;&lt;w:rsid w:val="00FF2698"/&gt;&lt;w:pPr&gt;&lt;w:spacing w:after="100"/&gt;&lt;w:ind w:left="1760"/&gt;&lt;/w:pPr&gt;&lt;/w:style&gt;&lt;w:style w:type="paragraph" w:styleId="ListNumber2"&gt;&lt;w:name w:val="List Number 2"/&gt;&lt;w:basedOn w:val="ListNumber"/&gt;&lt;w:uiPriority w:val="14"/&gt;&lt;w:rsid w:val="00130001"/&gt;&lt;w:pPr&gt;&lt;w:numPr&gt;&lt;w:ilvl w:val="1"/&gt;&lt;/w:numPr&gt;&lt;/w:pPr&gt;&lt;/w:style&gt;&lt;w:style w:type="paragraph" w:styleId="ListNumber3"&gt;&lt;w:name w:val="List Number 3"/&gt;&lt;w:basedOn w:val="ListNumber2"/&gt;&lt;w:uiPriority w:val="14"/&gt;&lt;w:rsid w:val="00130001"/&gt;&lt;w:pPr&gt;&lt;w:numPr&gt;&lt;w:ilvl w:val="2"/&gt;&lt;/w:numPr&gt;&lt;/w:pPr&gt;&lt;/w:style&gt;&lt;w:style w:type="paragraph" w:styleId="ListNumber4"&gt;&lt;w:name w:val="List Number 4"/&gt;&lt;w:basedOn w:val="ListNumber3"/&gt;&lt;w:uiPriority w:val="14"/&gt;&lt;w:semiHidden/&gt;&lt;w:rsid w:val="00130001"/&gt;&lt;w:pPr&gt;&lt;w:numPr&gt;&lt;w:ilvl w:val="3"/&gt;&lt;/w:numPr&gt;&lt;/w:pPr&gt;&lt;/w:style&gt;&lt;w:style w:type="paragraph" w:styleId="ListNumber5"&gt;&lt;w:name w:val="List Number 5"/&gt;&lt;w:basedOn w:val="ListNumber4"/&gt;&lt;w:uiPriority w:val="14"/&gt;&lt;w:semiHidden/&gt;&lt;w:rsid w:val="00130001"/&gt;&lt;w:pPr&gt;&lt;w:numPr&gt;&lt;w:ilvl w:val="4"/&gt;&lt;/w:numPr&gt;&lt;/w:pPr&gt;&lt;/w:style&gt;&lt;w:style w:type="paragraph" w:styleId="ListBullet2"&gt;&lt;w:name w:val="List Bullet 2"/&gt;&lt;w:basedOn w:val="ListBullet"/&gt;&lt;w:uiPriority w:val="14"/&gt;&lt;w:rsid w:val="00FE2BED"/&gt;&lt;w:pPr&gt;&lt;w:numPr&gt;&lt;w:ilvl w:val="1"/&gt;&lt;/w:numPr&gt;&lt;/w:pPr&gt;&lt;/w:style&gt;&lt;w:style w:type="paragraph" w:styleId="ListBullet3"&gt;&lt;w:name w:val="List Bullet 3"/&gt;&lt;w:basedOn w:val="ListBullet2"/&gt;&lt;w:uiPriority w:val="14"/&gt;&lt;w:rsid w:val="00FE2BED"/&gt;&lt;w:pPr&gt;&lt;w:numPr&gt;&lt;w:ilvl w:val="2"/&gt;&lt;/w:numPr&gt;&lt;/w:pPr&gt;&lt;/w:style&gt;&lt;w:style w:type="paragraph" w:styleId="ListBullet4"&gt;&lt;w:name w:val="List Bullet 4"/&gt;&lt;w:basedOn w:val="ListBullet3"/&gt;&lt;w:uiPriority w:val="14"/&gt;&lt;w:semiHidden/&gt;&lt;w:rsid w:val="00FE2BED"/&gt;&lt;w:pPr&gt;&lt;w:numPr&gt;&lt;w:ilvl w:val="3"/&gt;&lt;/w:numPr&gt;&lt;/w:pPr&gt;&lt;/w:style&gt;&lt;w:style w:type="paragraph" w:styleId="ListBullet5"&gt;&lt;w:name w:val="List Bullet 5"/&gt;&lt;w:basedOn w:val="ListBullet4"/&gt;&lt;w:uiPriority w:val="14"/&gt;&lt;w:semiHidden/&gt;&lt;w:rsid w:val="00FE2BED"/&gt;&lt;w:pPr&gt;&lt;w:numPr&gt;&lt;w:ilvl w:val="4"/&gt;&lt;/w:numPr&gt;&lt;/w:pPr&gt;&lt;/w:style&gt;&lt;w:style w:type="character" w:styleId="PlaceholderText"&gt;&lt;w:name w:val="Placeholder Text"/&gt;&lt;w:basedOn w:val="DefaultParagraphFont"/&gt;&lt;w:uiPriority w:val="99"/&gt;&lt;w:rsid w:val="009C6FDB"/&gt;&lt;w:rPr&gt;&lt;w:color w:val="7F7F7F" w:themeColor="text1" w:themeTint="80"/&gt;&lt;w:bdr w:val="none" w:sz="0" w:space="0" w:color="auto"/&gt;&lt;w:shd w:val="clear" w:color="auto" w:fill="F0F0F0"/&gt;&lt;/w:rPr&gt;&lt;/w:style&gt;&lt;w:style w:type="paragraph" w:customStyle="1" w:styleId="Hiddentext"&gt;&lt;w:name w:val="Hidden text"/&gt;&lt;w:basedOn w:val="Normal"/&gt;&lt;w:next w:val="Normal"/&gt;&lt;w:uiPriority w:val="24"/&gt;&lt;w:semiHidden/&gt;&lt;w:qFormat/&gt;&lt;w:rsid w:val="00D86E66"/&gt;&lt;w:rPr&gt;&lt;w:vanish/&gt;&lt;w:color w:val="C00000"/&gt;&lt;/w:rPr&gt;&lt;/w:style&gt;&lt;w:style w:type="paragraph" w:customStyle="1" w:styleId="NumberedHeading1"&gt;&lt;w:name w:val="Numbered Heading 1"/&gt;&lt;w:basedOn w:val="Heading1"/&gt;&lt;w:next w:val="Normal"/&gt;&lt;w:uiPriority w:val="10"/&gt;&lt;w:semiHidden/&gt;&lt;w:qFormat/&gt;&lt;w:rsid w:val="00494FFB"/&gt;&lt;w:pPr&gt;&lt;w:numPr&gt;&lt;w:numId w:val="12"/&gt;&lt;/w:numPr&gt;&lt;/w:pPr&gt;&lt;/w:style&gt;&lt;w:style w:type="paragraph" w:customStyle="1" w:styleId="NumberedHeading2"&gt;&lt;w:name w:val="Numbered Heading 2"/&gt;&lt;w:basedOn w:val="Heading2"/&gt;&lt;w:next w:val="Normal"/&gt;&lt;w:uiPriority w:val="10"/&gt;&lt;w:semiHidden/&gt;&lt;w:qFormat/&gt;&lt;w:rsid w:val="00DA7B63"/&gt;&lt;w:pPr&gt;&lt;w:numPr&gt;&lt;w:ilvl w:val="1"/&gt;&lt;w:numId w:val="12"/&gt;&lt;/w:numPr&gt;&lt;/w:pPr&gt;&lt;/w:style&gt;&lt;w:style w:type="paragraph" w:customStyle="1" w:styleId="NumberedHeading3"&gt;&lt;w:name w:val="Numbered Heading 3"/&gt;&lt;w:basedOn w:val="Heading3"/&gt;&lt;w:next w:val="Normal"/&gt;&lt;w:uiPriority w:val="10"/&gt;&lt;w:semiHidden/&gt;&lt;w:qFormat/&gt;&lt;w:rsid w:val="00DA7B63"/&gt;&lt;w:pPr&gt;&lt;w:numPr&gt;&lt;w:ilvl w:val="2"/&gt;&lt;w:numId w:val="12"/&gt;&lt;/w:numPr&gt;&lt;/w:pPr&gt;&lt;/w:style&gt;&lt;w:style w:type="paragraph" w:customStyle="1" w:styleId="NumberedHeading4"&gt;&lt;w:name w:val="Numbered Heading 4"/&gt;&lt;w:basedOn w:val="Heading4"/&gt;&lt;w:next w:val="Normal"/&gt;&lt;w:uiPriority w:val="10"/&gt;&lt;w:semiHidden/&gt;&lt;w:qFormat/&gt;&lt;w:rsid w:val="00DA7B63"/&gt;&lt;w:pPr&gt;&lt;w:numPr&gt;&lt;w:ilvl w:val="3"/&gt;&lt;w:numId w:val="12"/&gt;&lt;/w:numPr&gt;&lt;/w:pPr&gt;&lt;/w:style&gt;&lt;w:style w:type="character" w:customStyle="1" w:styleId="NoSpacingChar"&gt;&lt;w:name w:val="No Spacing Char"/&gt;&lt;w:basedOn w:val="DefaultParagraphFont"/&gt;&lt;w:link w:val="NoSpacing"/&gt;&lt;w:uiPriority w:val="1"/&gt;&lt;w:rsid w:val="00EE7F0A"/&gt;&lt;/w:style&gt;&lt;w:style w:type="paragraph" w:styleId="BalloonText"&gt;&lt;w:name w:val="Balloon Text"/&gt;&lt;w:basedOn w:val="Normal"/&gt;&lt;w:link w:val="BalloonTextChar"/&gt;&lt;w:uiPriority w:val="99"/&gt;&lt;w:semiHidden/&gt;&lt;w:unhideWhenUsed/&gt;&lt;w:rsid w:val="00421476"/&gt;&lt;w:pPr&gt;&lt;w:spacing w:after="0"/&gt;&lt;/w:pPr&gt;&lt;w:rPr&gt;&lt;w:rFonts w:cs="Segoe UI"/&gt;&lt;w:sz w:val="18"/&gt;&lt;w:szCs w:val="18"/&gt;&lt;/w:rPr&gt;&lt;/w:style&gt;&lt;w:style w:type="character" w:customStyle="1" w:styleId="BalloonTextChar"&gt;&lt;w:name w:val="Balloon Text Char"/&gt;&lt;w:basedOn w:val="DefaultParagraphFont"/&gt;&lt;w:link w:val="BalloonText"/&gt;&lt;w:uiPriority w:val="99"/&gt;&lt;w:semiHidden/&gt;&lt;w:rsid w:val="00421476"/&gt;&lt;w:rPr&gt;&lt;w:rFonts w:cs="Segoe UI"/&gt;&lt;w:sz w:val="18"/&gt;&lt;w:szCs w:val="18"/&gt;&lt;w:lang w:val="en-GB"/&gt;&lt;/w:rPr&gt;&lt;/w:style&gt;&lt;w:style w:type="paragraph" w:customStyle="1" w:styleId="Footertext"&gt;&lt;w:name w:val="Footer text"/&gt;&lt;w:basedOn w:val="Normal"/&gt;&lt;w:uiPriority w:val="10"/&gt;&lt;w:semiHidden/&gt;&lt;w:qFormat/&gt;&lt;w:rsid w:val="001407DF"/&gt;&lt;w:pPr&gt;&lt;w:framePr w:wrap="around" w:vAnchor="page" w:hAnchor="page" w:x="852" w:y="14176"/&gt;&lt;w:spacing w:before="40" w:after="40"/&gt;&lt;/w:pPr&gt;&lt;w:rPr&gt;&lt;w:color w:val="858585" w:themeColor="accent5"/&gt;&lt;w:sz w:val="16"/&gt;&lt;/w:rPr&gt;&lt;/w:style&gt;&lt;w:style w:type="paragraph" w:customStyle="1" w:styleId="Footertitle"&gt;&lt;w:name w:val="Footer title"/&gt;&lt;w:basedOn w:val="Footertext"/&gt;&lt;w:uiPriority w:val="10"/&gt;&lt;w:semiHidden/&gt;&lt;w:qFormat/&gt;&lt;w:rsid w:val="00E4504C"/&gt;&lt;w:pPr&gt;&lt;w:framePr w:wrap="around"/&gt;&lt;/w:pPr&gt;&lt;w:rPr&gt;&lt;w:b/&gt;&lt;w:color w:val="407077" w:themeColor="accent1"/&gt;&lt;/w:rPr&gt;&lt;/w:style&gt;&lt;w:style w:type="table" w:customStyle="1" w:styleId="BetssonTable01"&gt;&lt;w:name w:val="Betsson Table 01"/&gt;&lt;w:basedOn w:val="TableNormal"/&gt;&lt;w:uiPriority w:val="99"/&gt;&lt;w:rsid w:val="00036B11"/&gt;&lt;w:pPr&gt;&lt;w:spacing w:after="0" w:line="240" w:lineRule="auto"/&gt;&lt;w:jc w:val="right"/&gt;&lt;/w:pPr&gt;&lt;w:tblPr&gt;&lt;w:tblBorders&gt;&lt;w:bottom w:val="single" w:sz="4" w:space="0" w:color="407077" w:themeColor="accent1"/&gt;&lt;w:insideH w:val="single" w:sz="4" w:space="0" w:color="407077" w:themeColor="accent1"/&gt;&lt;/w:tblBorders&gt;&lt;w:tblCellMar&gt;&lt;w:top w:w="57" w:type="dxa"/&gt;&lt;w:left w:w="57" w:type="dxa"/&gt;&lt;w:bottom w:w="57" w:type="dxa"/&gt;&lt;w:right w:w="57" w:type="dxa"/&gt;&lt;/w:tblCellMar&gt;&lt;/w:tblPr&gt;&lt;w:tblStylePr w:type="firstRow"&gt;&lt;w:pPr&gt;&lt;w:jc w:val="right"/&gt;&lt;/w:pPr&gt;&lt;w:rPr&gt;&lt;w:rFonts w:asciiTheme="majorHAnsi" w:hAnsiTheme="majorHAnsi"/&gt;&lt;w:b/&gt;&lt;w:color w:val="407077" w:themeColor="accent1"/&gt;&lt;/w:rPr&gt;&lt;w:tblPr/&gt;&lt;w:tcPr&gt;&lt;w:tcBorders&gt;&lt;w:bottom w:val="single" w:sz="12" w:space="0" w:color="407077" w:themeColor="accent1"/&gt;&lt;/w:tcBorders&gt;&lt;w:vAlign w:val="bottom"/&gt;&lt;/w:tcPr&gt;&lt;/w:tblStylePr&gt;&lt;w:tblStylePr w:type="lastRow"&gt;&lt;w:rPr&gt;&lt;w:rFonts w:asciiTheme="majorHAnsi" w:hAnsiTheme="majorHAnsi"/&gt;&lt;w:b/&gt;&lt;/w:rPr&gt;&lt;w:tblPr/&gt;&lt;w:tcPr&gt;&lt;w:tcBorders&gt;&lt;w:top w:val="double" w:sz="4" w:space="0" w:color="407077" w:themeColor="accent1"/&gt;&lt;w:left w:val="nil"/&gt;&lt;w:bottom w:val="nil"/&gt;&lt;w:right w:val="nil"/&gt;&lt;w:insideH w:val="nil"/&gt;&lt;w:insideV w:val="nil"/&gt;&lt;w:tl2br w:val="nil"/&gt;&lt;w:tr2bl w:val="nil"/&gt;&lt;/w:tcBorders&gt;&lt;/w:tcPr&gt;&lt;/w:tblStylePr&gt;&lt;w:tblStylePr w:type="firstCol"&gt;&lt;w:pPr&gt;&lt;w:jc w:val="left"/&gt;&lt;/w:pPr&gt;&lt;/w:tblStylePr&gt;&lt;w:tblStylePr w:type="lastCol"&gt;&lt;w:rPr&gt;&lt;w:rFonts w:asciiTheme="majorHAnsi" w:hAnsiTheme="majorHAnsi"/&gt;&lt;w:b/&gt;&lt;/w:rPr&gt;&lt;/w:tblStylePr&gt;&lt;w:tblStylePr w:type="nwCell"&gt;&lt;w:pPr&gt;&lt;w:jc w:val="left"/&gt;&lt;/w:pPr&gt;&lt;w:tblPr/&gt;&lt;w:tcPr&gt;&lt;w:vAlign w:val="bottom"/&gt;&lt;/w:tcPr&gt;&lt;/w:tblStylePr&gt;&lt;/w:style&gt;&lt;w:style w:type="table" w:styleId="TableGridLight"&gt;&lt;w:name w:val="Grid Table Light"/&gt;&lt;w:aliases w:val="Betsson Table 02"/&gt;&lt;w:basedOn w:val="TableNormal"/&gt;&lt;w:uiPriority w:val="40"/&gt;&lt;w:rsid w:val="00036B11"/&gt;&lt;w:pPr&gt;&lt;w:spacing w:after="0" w:line="240" w:lineRule="auto"/&gt;&lt;w:jc w:val="right"/&gt;&lt;/w:pPr&gt;&lt;w:tblPr&gt;&lt;w:tblStyleRowBandSize w:val="1"/&gt;&lt;w:tblBorders&gt;&lt;w:insideH w:val="single" w:sz="4" w:space="0" w:color="407077" w:themeColor="accent1"/&gt;&lt;/w:tblBorders&gt;&lt;w:tblCellMar&gt;&lt;w:top w:w="57" w:type="dxa"/&gt;&lt;w:left w:w="57" w:type="dxa"/&gt;&lt;w:bottom w:w="57" w:type="dxa"/&gt;&lt;w:right w:w="57" w:type="dxa"/&gt;&lt;/w:tblCellMar&gt;&lt;/w:tblPr&gt;&lt;w:tcPr&gt;&lt;w:shd w:val="clear" w:color="auto" w:fill="auto"/&gt;&lt;/w:tcPr&gt;&lt;w:tblStylePr w:type="firstRow"&gt;&lt;w:pPr&gt;&lt;w:wordWrap/&gt;&lt;w:spacing w:beforeLines="0" w:before="80" w:beforeAutospacing="0" w:afterLines="0" w:after="0" w:afterAutospacing="0"/&gt;&lt;w:jc w:val="right"/&gt;&lt;/w:pPr&gt;&lt;w:rPr&gt;&lt;w:rFonts w:asciiTheme="majorHAnsi" w:hAnsiTheme="majorHAnsi"/&gt;&lt;w:b/&gt;&lt;w:color w:val="FFFFFF" w:themeColor="background1"/&gt;&lt;/w:rPr&gt;&lt;w:tblPr/&gt;&lt;w:tcPr&gt;&lt;w:shd w:val="clear" w:color="auto" w:fill="407077" w:themeFill="accent1"/&gt;&lt;w:vAlign w:val="bottom"/&gt;&lt;/w:tcPr&gt;&lt;/w:tblStylePr&gt;&lt;w:tblStylePr w:type="lastRow"&gt;&lt;w:rPr&gt;&lt;w:rFonts w:asciiTheme="majorHAnsi" w:hAnsiTheme="majorHAnsi"/&gt;&lt;w:b/&gt;&lt;/w:rPr&gt;&lt;w:tblPr/&gt;&lt;w:tcPr&gt;&lt;w:tcBorders&gt;&lt;w:top w:val="double" w:sz="4" w:space="0" w:color="407077" w:themeColor="accent1"/&gt;&lt;/w:tcBorders&gt;&lt;w:shd w:val="clear" w:color="auto" w:fill="auto"/&gt;&lt;/w:tcPr&gt;&lt;/w:tblStylePr&gt;&lt;w:tblStylePr w:type="firstCol"&gt;&lt;w:pPr&gt;&lt;w:jc w:val="left"/&gt;&lt;/w:pPr&gt;&lt;/w:tblStylePr&gt;&lt;w:tblStylePr w:type="lastCol"&gt;&lt;w:pPr&gt;&lt;w:jc w:val="right"/&gt;&lt;/w:pPr&gt;&lt;w:rPr&gt;&lt;w:rFonts w:asciiTheme="majorHAnsi" w:hAnsiTheme="majorHAnsi"/&gt;&lt;w:b/&gt;&lt;/w:rPr&gt;&lt;/w:tblStylePr&gt;&lt;w:tblStylePr w:type="nwCell"&gt;&lt;w:pPr&gt;&lt;w:jc w:val="left"/&gt;&lt;/w:pPr&gt;&lt;w:tblPr/&gt;&lt;w:tcPr&gt;&lt;w:vAlign w:val="bottom"/&gt;&lt;/w:tcPr&gt;&lt;/w:tblStylePr&gt;&lt;/w:style&gt;&lt;w:style w:type="paragraph" w:customStyle="1" w:styleId="Tabletext"&gt;&lt;w:name w:val="Table text"/&gt;&lt;w:basedOn w:val="Normal"/&gt;&lt;w:uiPriority w:val="15"/&gt;&lt;w:rsid w:val="005F186C"/&gt;&lt;w:pPr&gt;&lt;w:spacing w:after="0" w:line="240" w:lineRule="auto"/&gt;&lt;/w:pPr&gt;&lt;w:rPr&gt;&lt;w:sz w:val="16"/&gt;&lt;/w:rPr&gt;&lt;/w:style&gt;&lt;w:style w:type="paragraph" w:customStyle="1" w:styleId="Tabletitle"&gt;&lt;w:name w:val="Table title"/&gt;&lt;w:basedOn w:val="Tabletext"/&gt;&lt;w:uiPriority w:val="15"/&gt;&lt;w:rsid w:val="00C5110E"/&gt;&lt;w:pPr&gt;&lt;w:framePr w:wrap="around" w:vAnchor="page" w:hAnchor="page" w:x="852" w:y="14176"/&gt;&lt;w:spacing w:before="40" w:after="40"/&gt;&lt;/w:pPr&gt;&lt;w:rPr&gt;&lt;w:b/&gt;&lt;w:color w:val="407077" w:themeColor="accent1"/&gt;&lt;/w:rPr&gt;&lt;/w:style&gt;&lt;w:style w:type="paragraph" w:customStyle="1" w:styleId="FootertitleWhite"&gt;&lt;w:name w:val="Footer title White"/&gt;&lt;w:basedOn w:val="Footertitle"/&gt;&lt;w:semiHidden/&gt;&lt;w:rsid w:val="000049A5"/&gt;&lt;w:pPr&gt;&lt;w:framePr w:wrap="around"/&gt;&lt;/w:pPr&gt;&lt;w:rPr&gt;&lt;w:bCs/&gt;&lt;w:color w:val="FFFFFF" w:themeColor="background1"/&gt;&lt;/w:rPr&gt;&lt;/w:style&gt;&lt;w:style w:type="paragraph" w:styleId="DocumentMap"&gt;&lt;w:name w:val="Document Map"/&gt;&lt;w:basedOn w:val="Normal"/&gt;&lt;w:link w:val="DocumentMapChar"/&gt;&lt;w:uiPriority w:val="99"/&gt;&lt;w:semiHidden/&gt;&lt;w:rsid w:val="00421476"/&gt;&lt;w:pPr&gt;&lt;w:spacing w:after="0"/&gt;&lt;/w:pPr&gt;&lt;w:rPr&gt;&lt;w:rFonts w:cs="Segoe UI"/&gt;&lt;w:sz w:val="16"/&gt;&lt;w:szCs w:val="16"/&gt;&lt;/w:rPr&gt;&lt;/w:style&gt;&lt;w:style w:type="character" w:customStyle="1" w:styleId="DocumentMapChar"&gt;&lt;w:name w:val="Document Map Char"/&gt;&lt;w:basedOn w:val="DefaultParagraphFont"/&gt;&lt;w:link w:val="DocumentMap"/&gt;&lt;w:uiPriority w:val="99"/&gt;&lt;w:semiHidden/&gt;&lt;w:rsid w:val="00421476"/&gt;&lt;w:rPr&gt;&lt;w:rFonts w:cs="Segoe UI"/&gt;&lt;w:sz w:val="16"/&gt;&lt;w:szCs w:val="16"/&gt;&lt;w:lang w:val="en-GB"/&gt;&lt;/w:rPr&gt;&lt;/w:style&gt;&lt;w:style w:type="character" w:styleId="HTMLSample"&gt;&lt;w:name w:val="HTML Sample"/&gt;&lt;w:basedOn w:val="DefaultParagraphFont"/&gt;&lt;w:uiPriority w:val="99"/&gt;&lt;w:semiHidden/&gt;&lt;w:unhideWhenUsed/&gt;&lt;w:rsid w:val="00421476"/&gt;&lt;w:rPr&gt;&lt;w:rFonts w:asciiTheme="minorHAnsi" w:hAnsiTheme="minorHAnsi"/&gt;&lt;w:sz w:val="24"/&gt;&lt;w:szCs w:val="24"/&gt;&lt;/w:rPr&gt;&lt;/w:style&gt;&lt;w:style w:type="paragraph" w:styleId="HTMLPreformatted"&gt;&lt;w:name w:val="HTML Preformatted"/&gt;&lt;w:basedOn w:val="Normal"/&gt;&lt;w:link w:val="HTMLPreformattedChar"/&gt;&lt;w:uiPriority w:val="99"/&gt;&lt;w:semiHidden/&gt;&lt;w:rsid w:val="00421476"/&gt;&lt;w:pPr&gt;&lt;w:spacing w:after="0"/&gt;&lt;/w:pPr&gt;&lt;w:rPr&gt;&lt;w:szCs w:val="20"/&gt;&lt;/w:rPr&gt;&lt;/w:style&gt;&lt;w:style w:type="character" w:customStyle="1" w:styleId="HTMLPreformattedChar"&gt;&lt;w:name w:val="HTML Preformatted Char"/&gt;&lt;w:basedOn w:val="DefaultParagraphFont"/&gt;&lt;w:link w:val="HTMLPreformatted"/&gt;&lt;w:uiPriority w:val="99"/&gt;&lt;w:semiHidden/&gt;&lt;w:rsid w:val="00421476"/&gt;&lt;w:rPr&gt;&lt;w:sz w:val="20"/&gt;&lt;w:szCs w:val="20"/&gt;&lt;w:lang w:val="en-GB"/&gt;&lt;/w:rPr&gt;&lt;/w:style&gt;&lt;w:style w:type="character" w:styleId="HTMLCode"&gt;&lt;w:name w:val="HTML Code"/&gt;&lt;w:basedOn w:val="DefaultParagraphFont"/&gt;&lt;w:uiPriority w:val="99"/&gt;&lt;w:semiHidden/&gt;&lt;w:rsid w:val="00421476"/&gt;&lt;w:rPr&gt;&lt;w:rFonts w:asciiTheme="minorHAnsi" w:hAnsiTheme="minorHAnsi"/&gt;&lt;w:sz w:val="20"/&gt;&lt;w:szCs w:val="20"/&gt;&lt;/w:rPr&gt;&lt;/w:style&gt;&lt;w:style w:type="character" w:styleId="HTMLTypewriter"&gt;&lt;w:name w:val="HTML Typewriter"/&gt;&lt;w:basedOn w:val="DefaultParagraphFont"/&gt;&lt;w:uiPriority w:val="99"/&gt;&lt;w:semiHidden/&gt;&lt;w:rsid w:val="00421476"/&gt;&lt;w:rPr&gt;&lt;w:rFonts w:asciiTheme="minorHAnsi" w:hAnsiTheme="minorHAnsi"/&gt;&lt;w:sz w:val="20"/&gt;&lt;w:szCs w:val="20"/&gt;&lt;/w:rPr&gt;&lt;/w:style&gt;&lt;w:style w:type="character" w:styleId="HTMLKeyboard"&gt;&lt;w:name w:val="HTML Keyboard"/&gt;&lt;w:basedOn w:val="DefaultParagraphFont"/&gt;&lt;w:uiPriority w:val="99"/&gt;&lt;w:semiHidden/&gt;&lt;w:rsid w:val="00421476"/&gt;&lt;w:rPr&gt;&lt;w:rFonts w:asciiTheme="minorHAnsi" w:hAnsiTheme="minorHAnsi"/&gt;&lt;w:sz w:val="20"/&gt;&lt;w:szCs w:val="20"/&gt;&lt;/w:rPr&gt;&lt;/w:style&gt;&lt;w:style w:type="paragraph" w:styleId="MacroText"&gt;&lt;w:name w:val="macro"/&gt;&lt;w:link w:val="MacroTextChar"/&gt;&lt;w:uiPriority w:val="99"/&gt;&lt;w:semiHidden/&gt;&lt;w:rsid w:val="00421476"/&gt;&lt;w:pPr&gt;&lt;w:tabs&gt;&lt;w:tab w:val="left" w:pos="480"/&gt;&lt;w:tab w:val="left" w:pos="960"/&gt;&lt;w:tab w:val="left" w:pos="1440"/&gt;&lt;w:tab w:val="left" w:pos="1920"/&gt;&lt;w:tab w:val="left" w:pos="2400"/&gt;&lt;w:tab w:val="left" w:pos="2880"/&gt;&lt;w:tab w:val="left" w:pos="3360"/&gt;&lt;w:tab w:val="left" w:pos="3840"/&gt;&lt;w:tab w:val="left" w:pos="4320"/&gt;&lt;/w:tabs&gt;&lt;w:spacing w:after="0" w:line="240" w:lineRule="auto"/&gt;&lt;/w:pPr&gt;&lt;w:rPr&gt;&lt;w:sz w:val="20"/&gt;&lt;w:szCs w:val="20"/&gt;&lt;w:lang w:val="en-GB"/&gt;&lt;/w:rPr&gt;&lt;/w:style&gt;&lt;w:style w:type="character" w:customStyle="1" w:styleId="MacroTextChar"&gt;&lt;w:name w:val="Macro Text Char"/&gt;&lt;w:basedOn w:val="DefaultParagraphFont"/&gt;&lt;w:link w:val="MacroText"/&gt;&lt;w:uiPriority w:val="99"/&gt;&lt;w:semiHidden/&gt;&lt;w:rsid w:val="00421476"/&gt;&lt;w:rPr&gt;&lt;w:sz w:val="20"/&gt;&lt;w:szCs w:val="20"/&gt;&lt;w:lang w:val="en-GB"/&gt;&lt;/w:rPr&gt;&lt;/w:style&gt;&lt;w:style w:type="paragraph" w:styleId="NormalWeb"&gt;&lt;w:name w:val="Normal (Web)"/&gt;&lt;w:basedOn w:val="Normal"/&gt;&lt;w:uiPriority w:val="99"/&gt;&lt;w:semiHidden/&gt;&lt;w:rsid w:val="00421476"/&gt;&lt;w:rPr&gt;&lt;w:rFonts w:cs="Times New Roman"/&gt;&lt;w:sz w:val="24"/&gt;&lt;w:szCs w:val="24"/&gt;&lt;/w:rPr&gt;&lt;/w:style&gt;&lt;w:style w:type="paragraph" w:styleId="PlainText"&gt;&lt;w:name w:val="Plain Text"/&gt;&lt;w:basedOn w:val="Normal"/&gt;&lt;w:link w:val="PlainTextChar"/&gt;&lt;w:uiPriority w:val="99"/&gt;&lt;w:semiHidden/&gt;&lt;w:rsid w:val="00421476"/&gt;&lt;w:pPr&gt;&lt;w:spacing w:after="0"/&gt;&lt;/w:pPr&gt;&lt;w:rPr&gt;&lt;w:sz w:val="21"/&gt;&lt;w:szCs w:val="21"/&gt;&lt;/w:rPr&gt;&lt;/w:style&gt;&lt;w:style w:type="character" w:customStyle="1" w:styleId="PlainTextChar"&gt;&lt;w:name w:val="Plain Text Char"/&gt;&lt;w:basedOn w:val="DefaultParagraphFont"/&gt;&lt;w:link w:val="PlainText"/&gt;&lt;w:uiPriority w:val="99"/&gt;&lt;w:semiHidden/&gt;&lt;w:rsid w:val="00421476"/&gt;&lt;w:rPr&gt;&lt;w:sz w:val="21"/&gt;&lt;w:szCs w:val="21"/&gt;&lt;w:lang w:val="en-GB"/&gt;&lt;/w:rPr&gt;&lt;/w:style&gt;&lt;w:style w:type="paragraph" w:customStyle="1" w:styleId="Name"&gt;&lt;w:name w:val="Name"/&gt;&lt;w:basedOn w:val="Normal"/&gt;&lt;w:next w:val="Normal"/&gt;&lt;w:uiPriority w:val="10"/&gt;&lt;w:rsid w:val="00C17BB4"/&gt;&lt;w:pPr&gt;&lt;w:spacing w:after="0" w:line="240" w:lineRule="auto"/&gt;&lt;/w:pPr&gt;&lt;w:rPr&gt;&lt;w:rFonts w:asciiTheme="majorHAnsi" w:hAnsiTheme="majorHAnsi"/&gt;&lt;/w:rPr&gt;&lt;/w:style&gt;&lt;w:style w:type="paragraph" w:customStyle="1" w:styleId="Info"&gt;&lt;w:name w:val="Info"/&gt;&lt;w:basedOn w:val="Normal"/&gt;&lt;w:uiPriority w:val="10"/&gt;&lt;w:rsid w:val="008B734D"/&gt;&lt;w:pPr&gt;&lt;w:spacing w:after="0" w:line="240" w:lineRule="auto"/&gt;&lt;/w:pPr&gt;&lt;/w:style&gt;&lt;/w:styles&gt;&lt;/pkg:xmlData&gt;&lt;/pkg:part&gt;&lt;pkg:part pkg:name="/word/glossary/fontTable.xml" pkg:contentType="application/vnd.openxmlformats-officedocument.wordprocessingml.fontTable+xml"&gt;&lt;pkg:xmlData&gt;&lt;w:fonts xmlns:mc="http://schemas.openxmlformats.org/markup-compatibility/2006" xmlns:r="http://schemas.openxmlformats.org/officeDocument/2006/relationships" xmlns:w="http://schemas.openxmlformats.org/wordprocessingml/2006/main" xmlns:w14="http://schemas.microsoft.com/office/word/2010/wordml" xmlns:w15="http://schemas.microsoft.com/office/word/2012/wordml" xmlns:w16se="http://schemas.microsoft.com/office/word/2015/wordml/symex" mc:Ignorable="w14 w15 w16se"/&gt;&lt;/pkg:xmlData&gt;&lt;/pkg:part&gt;&lt;pkg:part pkg:name="/word/glossary/webSettings.xml" pkg:contentType="application/vnd.openxmlformats-officedocument.wordprocessingml.webSettings+xml"&gt;&lt;pkg:xmlData&gt;&lt;w:webSettings xmlns:mc="http://schemas.openxmlformats.org/markup-compatibility/2006" xmlns:r="http://schemas.openxmlformats.org/officeDocument/2006/relationships" xmlns:w="http://schemas.openxmlformats.org/wordprocessingml/2006/main" xmlns:w14="http://schemas.microsoft.com/office/word/2010/wordml" xmlns:w15="http://schemas.microsoft.com/office/word/2012/wordml" xmlns:w16se="http://schemas.microsoft.com/office/word/2015/wordml/symex" mc:Ignorable="w14 w15 w16se"&gt;&lt;w:optimizeForBrowser/&gt;&lt;w:allowPNG/&gt;&lt;/w:webSettings&gt;&lt;/pkg:xmlData&gt;&lt;/pkg:part&gt;&lt;pkg:part pkg:name="/word/numbering.xml" pkg:contentType="application/vnd.openxmlformats-officedocument.wordprocessingml.numbering+xml"&gt;&lt;pkg:xmlData&gt;&lt;w:numbering xmlns:wpc="http://schemas.microsoft.com/office/word/2010/wordprocessingCanvas" xmlns:cx="http://schemas.microsoft.com/office/drawing/2014/chartex" xmlns:cx1="http://schemas.microsoft.com/office/drawing/2015/9/8/chartex" xmlns:cx2="http://schemas.microsoft.com/office/drawing/2015/10/21/chartex" xmlns:cx3="http://schemas.microsoft.com/office/drawing/2016/5/9/chartex" xmlns:cx4="http://schemas.microsoft.com/office/drawing/2016/5/10/chartex" xmlns:cx5="http://schemas.microsoft.com/office/drawing/2016/5/11/chartex" xmlns:cx6="http://schemas.microsoft.com/office/drawing/2016/5/12/chartex" xmlns:cx7="http://schemas.microsoft.com/office/drawing/2016/5/13/chartex" xmlns:cx8="http://schemas.microsoft.com/office/drawing/2016/5/14/chartex" xmlns:mc="http://schemas.openxmlformats.org/markup-compatibility/2006" xmlns:o="urn:schemas-microsoft-com:office:office" xmlns:r="http://schemas.openxmlformats.org/officeDocument/2006/relationships" xmlns:m="http://schemas.openxmlformats.org/officeDocument/2006/math" xmlns:v="urn:schemas-microsoft-com:vml" xmlns:wp14="http://schemas.microsoft.com/office/word/2010/wordprocessingDrawing" xmlns:wp="http://schemas.openxmlformats.org/drawingml/2006/wordprocessingDrawing" xmlns:w10="urn:schemas-microsoft-com:office:word" xmlns:w="http://schemas.openxmlformats.org/wordprocessingml/2006/main" xmlns:w14="http://schemas.microsoft.com/office/word/2010/wordml" xmlns:w15="http://schemas.microsoft.com/office/word/2012/wordml" xmlns:w16se="http://schemas.microsoft.com/office/word/2015/wordml/symex" xmlns:wpg="http://schemas.microsoft.com/office/word/2010/wordprocessingGroup" xmlns:wpi="http://schemas.microsoft.com/office/word/2010/wordprocessingInk" xmlns:wne="http://schemas.microsoft.com/office/word/2006/wordml" xmlns:wps="http://schemas.microsoft.com/office/word/2010/wordprocessingShape" mc:Ignorable="w14 w15 w16se wp14"&gt;&lt;w:abstractNum w:abstractNumId="0" w15:restartNumberingAfterBreak="0"&gt;&lt;w:nsid w:val="FFFFFF7C"/&gt;&lt;w:multiLevelType w:val="singleLevel"/&gt;&lt;w:tmpl w:val="1D6AD0EC"/&gt;&lt;w:lvl w:ilvl="0"&gt;&lt;w:start w:val="1"/&gt;&lt;w:numFmt w:val="decimal"/&gt;&lt;w:lvlText w:val="%1."/&gt;&lt;w:lvlJc w:val="left"/&gt;&lt;w:pPr&gt;&lt;w:tabs&gt;&lt;w:tab w:val="num" w:pos="1492"/&gt;&lt;/w:tabs&gt;&lt;w:ind w:left="1492" w:hanging="360"/&gt;&lt;/w:pPr&gt;&lt;/w:lvl&gt;&lt;/w:abstractNum&gt;&lt;w:abstractNum w:abstractNumId="1" w15:restartNumberingAfterBreak="0"&gt;&lt;w:nsid w:val="FFFFFF7D"/&gt;&lt;w:multiLevelType w:val="singleLevel"/&gt;&lt;w:tmpl w:val="6C44DE1A"/&gt;&lt;w:lvl w:ilvl="0"&gt;&lt;w:start w:val="1"/&gt;&lt;w:numFmt w:val="decimal"/&gt;&lt;w:lvlText w:val="%1."/&gt;&lt;w:lvlJc w:val="left"/&gt;&lt;w:pPr&gt;&lt;w:tabs&gt;&lt;w:tab w:val="num" w:pos="1209"/&gt;&lt;/w:tabs&gt;&lt;w:ind w:left="1209" w:hanging="360"/&gt;&lt;/w:pPr&gt;&lt;/w:lvl&gt;&lt;/w:abstractNum&gt;&lt;w:abstractNum w:abstractNumId="2" w15:restartNumberingAfterBreak="0"&gt;&lt;w:nsid w:val="FFFFFF7E"/&gt;&lt;w:multiLevelType w:val="singleLevel"/&gt;&lt;w:tmpl w:val="83748C94"/&gt;&lt;w:lvl w:ilvl="0"&gt;&lt;w:start w:val="1"/&gt;&lt;w:numFmt w:val="decimal"/&gt;&lt;w:lvlText w:val="%1."/&gt;&lt;w:lvlJc w:val="left"/&gt;&lt;w:pPr&gt;&lt;w:tabs&gt;&lt;w:tab w:val="num" w:pos="926"/&gt;&lt;/w:tabs&gt;&lt;w:ind w:left="926" w:hanging="360"/&gt;&lt;/w:pPr&gt;&lt;/w:lvl&gt;&lt;/w:abstractNum&gt;&lt;w:abstractNum w:abstractNumId="3" w15:restartNumberingAfterBreak="0"&gt;&lt;w:nsid w:val="FFFFFF7F"/&gt;&lt;w:multiLevelType w:val="singleLevel"/&gt;&lt;w:tmpl w:val="871A6F0C"/&gt;&lt;w:lvl w:ilvl="0"&gt;&lt;w:start w:val="1"/&gt;&lt;w:numFmt w:val="decimal"/&gt;&lt;w:lvlText w:val="%1."/&gt;&lt;w:lvlJc w:val="left"/&gt;&lt;w:pPr&gt;&lt;w:tabs&gt;&lt;w:tab w:val="num" w:pos="643"/&gt;&lt;/w:tabs&gt;&lt;w:ind w:left="643" w:hanging="360"/&gt;&lt;/w:pPr&gt;&lt;/w:lvl&gt;&lt;/w:abstractNum&gt;&lt;w:abstractNum w:abstractNumId="4" w15:restartNumberingAfterBreak="0"&gt;&lt;w:nsid w:val="FFFFFF80"/&gt;&lt;w:multiLevelType w:val="singleLevel"/&gt;&lt;w:tmpl w:val="ED1CE676"/&gt;&lt;w:lvl w:ilvl="0"&gt;&lt;w:start w:val="1"/&gt;&lt;w:numFmt w:val="bullet"/&gt;&lt;w:lvlText w:val=""/&gt;&lt;w:lvlJc w:val="left"/&gt;&lt;w:pPr&gt;&lt;w:tabs&gt;&lt;w:tab w:val="num" w:pos="1492"/&gt;&lt;/w:tabs&gt;&lt;w:ind w:left="1492" w:hanging="360"/&gt;&lt;/w:pPr&gt;&lt;w:rPr&gt;&lt;w:rFonts w:ascii="Symbol" w:hAnsi="Symbol" w:hint="default"/&gt;&lt;/w:rPr&gt;&lt;/w:lvl&gt;&lt;/w:abstractNum&gt;&lt;w:abstractNum w:abstractNumId="5" w15:restartNumberingAfterBreak="0"&gt;&lt;w:nsid w:val="FFFFFF81"/&gt;&lt;w:multiLevelType w:val="singleLevel"/&gt;&lt;w:tmpl w:val="DEF60714"/&gt;&lt;w:lvl w:ilvl="0"&gt;&lt;w:start w:val="1"/&gt;&lt;w:numFmt w:val="bullet"/&gt;&lt;w:lvlText w:val=""/&gt;&lt;w:lvlJc w:val="left"/&gt;&lt;w:pPr&gt;&lt;w:tabs&gt;&lt;w:tab w:val="num" w:pos="1209"/&gt;&lt;/w:tabs&gt;&lt;w:ind w:left="1209" w:hanging="360"/&gt;&lt;/w:pPr&gt;&lt;w:rPr&gt;&lt;w:rFonts w:ascii="Symbol" w:hAnsi="Symbol" w:hint="default"/&gt;&lt;/w:rPr&gt;&lt;/w:lvl&gt;&lt;/w:abstractNum&gt;&lt;w:abstractNum w:abstractNumId="6" w15:restartNumberingAfterBreak="0"&gt;&lt;w:nsid w:val="FFFFFF82"/&gt;&lt;w:multiLevelType w:val="singleLevel"/&gt;&lt;w:tmpl w:val="91EA47E8"/&gt;&lt;w:lvl w:ilvl="0"&gt;&lt;w:start w:val="1"/&gt;&lt;w:numFmt w:val="bullet"/&gt;&lt;w:lvlText w:val=""/&gt;&lt;w:lvlJc w:val="left"/&gt;&lt;w:pPr&gt;&lt;w:tabs&gt;&lt;w:tab w:val="num" w:pos="926"/&gt;&lt;/w:tabs&gt;&lt;w:ind w:left="926" w:hanging="360"/&gt;&lt;/w:pPr&gt;&lt;w:rPr&gt;&lt;w:rFonts w:ascii="Symbol" w:hAnsi="Symbol" w:hint="default"/&gt;&lt;/w:rPr&gt;&lt;/w:lvl&gt;&lt;/w:abstractNum&gt;&lt;w:abstractNum w:abstractNumId="7" w15:restartNumberingAfterBreak="0"&gt;&lt;w:nsid w:val="FFFFFF83"/&gt;&lt;w:multiLevelType w:val="singleLevel"/&gt;&lt;w:tmpl w:val="9278B09A"/&gt;&lt;w:lvl w:ilvl="0"&gt;&lt;w:start w:val="1"/&gt;&lt;w:numFmt w:val="bullet"/&gt;&lt;w:lvlText w:val=""/&gt;&lt;w:lvlJc w:val="left"/&gt;&lt;w:pPr&gt;&lt;w:tabs&gt;&lt;w:tab w:val="num" w:pos="643"/&gt;&lt;/w:tabs&gt;&lt;w:ind w:left="643" w:hanging="360"/&gt;&lt;/w:pPr&gt;&lt;w:rPr&gt;&lt;w:rFonts w:ascii="Symbol" w:hAnsi="Symbol" w:hint="default"/&gt;&lt;/w:rPr&gt;&lt;/w:lvl&gt;&lt;/w:abstractNum&gt;&lt;w:abstractNum w:abstractNumId="8" w15:restartNumberingAfterBreak="0"&gt;&lt;w:nsid w:val="17071BBC"/&gt;&lt;w:multiLevelType w:val="multilevel"/&gt;&lt;w:tmpl w:val="B512299C"/&gt;&lt;w:lvl w:ilvl="0"&gt;&lt;w:start w:val="1"/&gt;&lt;w:numFmt w:val="decimal"/&gt;&lt;w:pStyle w:val="ListNumber"/&gt;&lt;w:lvlText w:val="%1."/&gt;&lt;w:lvlJc w:val="left"/&gt;&lt;w:pPr&gt;&lt;w:ind w:left="360" w:hanging="360"/&gt;&lt;/w:pPr&gt;&lt;w:rPr&gt;&lt;w:rFonts w:hint="default"/&gt;&lt;/w:rPr&gt;&lt;/w:lvl&gt;&lt;w:lvl w:ilvl="1"&gt;&lt;w:start w:val="1"/&gt;&lt;w:numFmt w:val="lowerLetter"/&gt;&lt;w:pStyle w:val="ListNumber2"/&gt;&lt;w:lvlText w:val="%2."/&gt;&lt;w:lvlJc w:val="left"/&gt;&lt;w:pPr&gt;&lt;w:ind w:left="720" w:hanging="360"/&gt;&lt;/w:pPr&gt;&lt;w:rPr&gt;&lt;w:rFonts w:hint="default"/&gt;&lt;/w:rPr&gt;&lt;/w:lvl&gt;&lt;w:lvl w:ilvl="2"&gt;&lt;w:start w:val="1"/&gt;&lt;w:numFmt w:val="lowerRoman"/&gt;&lt;w:pStyle w:val="ListNumber3"/&gt;&lt;w:lvlText w:val="%3)"/&gt;&lt;w:lvlJc w:val="left"/&gt;&lt;w:pPr&gt;&lt;w:ind w:left="1080" w:hanging="360"/&gt;&lt;/w:pPr&gt;&lt;w:rPr&gt;&lt;w:rFonts w:hint="default"/&gt;&lt;/w:rPr&gt;&lt;/w:lvl&gt;&lt;w:lvl w:ilvl="3"&gt;&lt;w:start w:val="1"/&gt;&lt;w:numFmt w:val="decimal"/&gt;&lt;w:pStyle w:val="ListNumber4"/&gt;&lt;w:lvlText w:val="%4)"/&gt;&lt;w:lvlJc w:val="left"/&gt;&lt;w:pPr&gt;&lt;w:ind w:left="1440" w:hanging="360"/&gt;&lt;/w:pPr&gt;&lt;w:rPr&gt;&lt;w:rFonts w:hint="default"/&gt;&lt;/w:rPr&gt;&lt;/w:lvl&gt;&lt;w:lvl w:ilvl="4"&gt;&lt;w:start w:val="1"/&gt;&lt;w:numFmt w:val="lowerLetter"/&gt;&lt;w:pStyle w:val="ListNumber5"/&gt;&lt;w:lvlText w:val="%5)"/&gt;&lt;w:lvlJc w:val="left"/&gt;&lt;w:pPr&gt;&lt;w:ind w:left="1800" w:hanging="360"/&gt;&lt;/w:pPr&gt;&lt;w:rPr&gt;&lt;w:rFonts w:hint="default"/&gt;&lt;/w:rPr&gt;&lt;/w:lvl&gt;&lt;w:lvl w:ilvl="5"&gt;&lt;w:start w:val="1"/&gt;&lt;w:numFmt w:val="lowerRoman"/&gt;&lt;w:lvlText w:val="%6)"/&gt;&lt;w:lvlJc w:val="left"/&gt;&lt;w:pPr&gt;&lt;w:ind w:left="2160" w:hanging="360"/&gt;&lt;/w:pPr&gt;&lt;w:rPr&gt;&lt;w:rFonts w:hint="default"/&gt;&lt;/w:rPr&gt;&lt;/w:lvl&gt;&lt;w:lvl w:ilvl="6"&gt;&lt;w:start w:val="1"/&gt;&lt;w:numFmt w:val="decimal"/&gt;&lt;w:lvlText w:val="(%7)"/&gt;&lt;w:lvlJc w:val="left"/&gt;&lt;w:pPr&gt;&lt;w:ind w:left="2520" w:hanging="360"/&gt;&lt;/w:pPr&gt;&lt;w:rPr&gt;&lt;w:rFonts w:hint="default"/&gt;&lt;/w:rPr&gt;&lt;/w:lvl&gt;&lt;w:lvl w:ilvl="7"&gt;&lt;w:start w:val="1"/&gt;&lt;w:numFmt w:val="lowerLetter"/&gt;&lt;w:lvlText w:val="(%8)"/&gt;&lt;w:lvlJc w:val="left"/&gt;&lt;w:pPr&gt;&lt;w:ind w:left="2880" w:hanging="360"/&gt;&lt;/w:pPr&gt;&lt;w:rPr&gt;&lt;w:rFonts w:hint="default"/&gt;&lt;/w:rPr&gt;&lt;/w:lvl&gt;&lt;w:lvl w:ilvl="8"&gt;&lt;w:start w:val="1"/&gt;&lt;w:numFmt w:val="lowerRoman"/&gt;&lt;w:lvlText w:val="(%9)"/&gt;&lt;w:lvlJc w:val="left"/&gt;&lt;w:pPr&gt;&lt;w:ind w:left="3240" w:hanging="360"/&gt;&lt;/w:pPr&gt;&lt;w:rPr&gt;&lt;w:rFonts w:hint="default"/&gt;&lt;/w:rPr&gt;&lt;/w:lvl&gt;&lt;/w:abstractNum&gt;&lt;w:abstractNum w:abstractNumId="9" w15:restartNumberingAfterBreak="0"&gt;&lt;w:nsid w:val="3CE155D5"/&gt;&lt;w:multiLevelType w:val="multilevel"/&gt;&lt;w:tmpl w:val="041D001D"/&gt;&lt;w:lvl w:ilvl="0"&gt;&lt;w:start w:val="1"/&gt;&lt;w:numFmt w:val="decimal"/&gt;&lt;w:lvlText w:val="%1)"/&gt;&lt;w:lvlJc w:val="left"/&gt;&lt;w:pPr&gt;&lt;w:ind w:left="360" w:hanging="360"/&gt;&lt;/w:pPr&gt;&lt;/w:lvl&gt;&lt;w:lvl w:ilvl="1"&gt;&lt;w:start w:val="1"/&gt;&lt;w:numFmt w:val="lowerLetter"/&gt;&lt;w:lvlText w:val="%2)"/&gt;&lt;w:lvlJc w:val="left"/&gt;&lt;w:pPr&gt;&lt;w:ind w:left="720" w:hanging="360"/&gt;&lt;/w:pPr&gt;&lt;/w:lvl&gt;&lt;w:lvl w:ilvl="2"&gt;&lt;w:start w:val="1"/&gt;&lt;w:numFmt w:val="lowerRoman"/&gt;&lt;w:lvlText w:val="%3)"/&gt;&lt;w:lvlJc w:val="left"/&gt;&lt;w:pPr&gt;&lt;w:ind w:left="1080" w:hanging="360"/&gt;&lt;/w:pPr&gt;&lt;/w:lvl&gt;&lt;w:lvl w:ilvl="3"&gt;&lt;w:start w:val="1"/&gt;&lt;w:numFmt w:val="decimal"/&gt;&lt;w:lvlText w:val="(%4)"/&gt;&lt;w:lvlJc w:val="left"/&gt;&lt;w:pPr&gt;&lt;w:ind w:left="1440" w:hanging="360"/&gt;&lt;/w:pPr&gt;&lt;/w:lvl&gt;&lt;w:lvl w:ilvl="4"&gt;&lt;w:start w:val="1"/&gt;&lt;w:numFmt w:val="lowerLetter"/&gt;&lt;w:lvlText w:val="(%5)"/&gt;&lt;w:lvlJc w:val="left"/&gt;&lt;w:pPr&gt;&lt;w:ind w:left="1800" w:hanging="360"/&gt;&lt;/w:pPr&gt;&lt;/w:lvl&gt;&lt;w:lvl w:ilvl="5"&gt;&lt;w:start w:val="1"/&gt;&lt;w:numFmt w:val="lowerRoman"/&gt;&lt;w:lvlText w:val="(%6)"/&gt;&lt;w:lvlJc w:val="left"/&gt;&lt;w:pPr&gt;&lt;w:ind w:left="2160" w:hanging="360"/&gt;&lt;/w:pPr&gt;&lt;/w:lvl&gt;&lt;w:lvl w:ilvl="6"&gt;&lt;w:start w:val="1"/&gt;&lt;w:numFmt w:val="decimal"/&gt;&lt;w:lvlText w:val="%7."/&gt;&lt;w:lvlJc w:val="left"/&gt;&lt;w:pPr&gt;&lt;w:ind w:left="2520" w:hanging="360"/&gt;&lt;/w:pPr&gt;&lt;/w:lvl&gt;&lt;w:lvl w:ilvl="7"&gt;&lt;w:start w:val="1"/&gt;&lt;w:numFmt w:val="lowerLetter"/&gt;&lt;w:lvlText w:val="%8."/&gt;&lt;w:lvlJc w:val="left"/&gt;&lt;w:pPr&gt;&lt;w:ind w:left="2880" w:hanging="360"/&gt;&lt;/w:pPr&gt;&lt;/w:lvl&gt;&lt;w:lvl w:ilvl="8"&gt;&lt;w:start w:val="1"/&gt;&lt;w:numFmt w:val="lowerRoman"/&gt;&lt;w:lvlText w:val="%9."/&gt;&lt;w:lvlJc w:val="left"/&gt;&lt;w:pPr&gt;&lt;w:ind w:left="3240" w:hanging="360"/&gt;&lt;/w:pPr&gt;&lt;/w:lvl&gt;&lt;/w:abstractNum&gt;&lt;w:abstractNum w:abstractNumId="10" w15:restartNumberingAfterBreak="0"&gt;&lt;w:nsid w:val="3D727479"/&gt;&lt;w:multiLevelType w:val="multilevel"/&gt;&lt;w:tmpl w:val="041D0023"/&gt;&lt;w:lvl w:ilvl="0"&gt;&lt;w:start w:val="1"/&gt;&lt;w:numFmt w:val="upperRoman"/&gt;&lt;w:lvlText w:val="Artikel %1."/&gt;&lt;w:lvlJc w:val="left"/&gt;&lt;w:pPr&gt;&lt;w:ind w:left="0" w:firstLine="0"/&gt;&lt;/w:pPr&gt;&lt;/w:lvl&gt;&lt;w:lvl w:ilvl="1"&gt;&lt;w:start w:val="1"/&gt;&lt;w:numFmt w:val="decimalZero"/&gt;&lt;w:isLgl/&gt;&lt;w:lvlText w:val="Avsnitt %1.%2"/&gt;&lt;w:lvlJc w:val="left"/&gt;&lt;w:pPr&gt;&lt;w:ind w:left="0" w:firstLine="0"/&gt;&lt;/w:pPr&gt;&lt;/w:lvl&gt;&lt;w:lvl w:ilvl="2"&gt;&lt;w:start w:val="1"/&gt;&lt;w:numFmt w:val="lowerLetter"/&gt;&lt;w:lvlText w:val="(%3)"/&gt;&lt;w:lvlJc w:val="left"/&gt;&lt;w:pPr&gt;&lt;w:ind w:left="720" w:hanging="432"/&gt;&lt;/w:pPr&gt;&lt;/w:lvl&gt;&lt;w:lvl w:ilvl="3"&gt;&lt;w:start w:val="1"/&gt;&lt;w:numFmt w:val="lowerRoman"/&gt;&lt;w:lvlText w:val="(%4)"/&gt;&lt;w:lvlJc w:val="right"/&gt;&lt;w:pPr&gt;&lt;w:ind w:left="864" w:hanging="144"/&gt;&lt;/w:pPr&gt;&lt;/w:lvl&gt;&lt;w:lvl w:ilvl="4"&gt;&lt;w:start w:val="1"/&gt;&lt;w:numFmt w:val="decimal"/&gt;&lt;w:pStyle w:val="Heading5"/&gt;&lt;w:lvlText w:val="%5)"/&gt;&lt;w:lvlJc w:val="left"/&gt;&lt;w:pPr&gt;&lt;w:ind w:left="1008" w:hanging="432"/&gt;&lt;/w:pPr&gt;&lt;/w:lvl&gt;&lt;w:lvl w:ilvl="5"&gt;&lt;w:start w:val="1"/&gt;&lt;w:numFmt w:val="lowerLetter"/&gt;&lt;w:pStyle w:val="Heading6"/&gt;&lt;w:lvlText w:val="%6)"/&gt;&lt;w:lvlJc w:val="left"/&gt;&lt;w:pPr&gt;&lt;w:ind w:left="1152" w:hanging="432"/&gt;&lt;/w:pPr&gt;&lt;/w:lvl&gt;&lt;w:lvl w:ilvl="6"&gt;&lt;w:start w:val="1"/&gt;&lt;w:numFmt w:val="lowerRoman"/&gt;&lt;w:pStyle w:val="Heading7"/&gt;&lt;w:lvlText w:val="%7)"/&gt;&lt;w:lvlJc w:val="right"/&gt;&lt;w:pPr&gt;&lt;w:ind w:left="1296" w:hanging="288"/&gt;&lt;/w:pPr&gt;&lt;/w:lvl&gt;&lt;w:lvl w:ilvl="7"&gt;&lt;w:start w:val="1"/&gt;&lt;w:numFmt w:val="lowerLetter"/&gt;&lt;w:pStyle w:val="Heading8"/&gt;&lt;w:lvlText w:val="%8."/&gt;&lt;w:lvlJc w:val="left"/&gt;&lt;w:pPr&gt;&lt;w:ind w:left="1440" w:hanging="432"/&gt;&lt;/w:pPr&gt;&lt;/w:lvl&gt;&lt;w:lvl w:ilvl="8"&gt;&lt;w:start w:val="1"/&gt;&lt;w:numFmt w:val="lowerRoman"/&gt;&lt;w:pStyle w:val="Heading9"/&gt;&lt;w:lvlText w:val="%9."/&gt;&lt;w:lvlJc w:val="right"/&gt;&lt;w:pPr&gt;&lt;w:ind w:left="1584" w:hanging="144"/&gt;&lt;/w:pPr&gt;&lt;/w:lvl&gt;&lt;/w:abstractNum&gt;&lt;w:abstractNum w:abstractNumId="11" w15:restartNumberingAfterBreak="0"&gt;&lt;w:nsid w:val="43F95E9C"/&gt;&lt;w:multiLevelType w:val="multilevel"/&gt;&lt;w:tmpl w:val="5FAE225A"/&gt;&lt;w:lvl w:ilvl="0"&gt;&lt;w:start w:val="1"/&gt;&lt;w:numFmt w:val="decimal"/&gt;&lt;w:pStyle w:val="NumberedHeading1"/&gt;&lt;w:lvlText w:val="%1."/&gt;&lt;w:lvlJc w:val="left"/&gt;&lt;w:pPr&gt;&lt;w:ind w:left="907" w:hanging="907"/&gt;&lt;/w:pPr&gt;&lt;w:rPr&gt;&lt;w:rFonts w:hint="default"/&gt;&lt;/w:rPr&gt;&lt;/w:lvl&gt;&lt;w:lvl w:ilvl="1"&gt;&lt;w:start w:val="1"/&gt;&lt;w:numFmt w:val="decimal"/&gt;&lt;w:pStyle w:val="NumberedHeading2"/&gt;&lt;w:lvlText w:val="%1.%2"/&gt;&lt;w:lvlJc w:val="left"/&gt;&lt;w:pPr&gt;&lt;w:ind w:left="907" w:hanging="907"/&gt;&lt;/w:pPr&gt;&lt;w:rPr&gt;&lt;w:rFonts w:hint="default"/&gt;&lt;/w:rPr&gt;&lt;/w:lvl&gt;&lt;w:lvl w:ilvl="2"&gt;&lt;w:start w:val="1"/&gt;&lt;w:numFmt w:val="decimal"/&gt;&lt;w:pStyle w:val="NumberedHeading3"/&gt;&lt;w:lvlText w:val="%1.%2.%3"/&gt;&lt;w:lvlJc w:val="left"/&gt;&lt;w:pPr&gt;&lt;w:ind w:left="907" w:hanging="907"/&gt;&lt;/w:pPr&gt;&lt;w:rPr&gt;&lt;w:rFonts w:hint="default"/&gt;&lt;/w:rPr&gt;&lt;/w:lvl&gt;&lt;w:lvl w:ilvl="3"&gt;&lt;w:start w:val="1"/&gt;&lt;w:numFmt w:val="decimal"/&gt;&lt;w:pStyle w:val="NumberedHeading4"/&gt;&lt;w:lvlText w:val="%1.%2.%3.%4"/&gt;&lt;w:lvlJc w:val="left"/&gt;&lt;w:pPr&gt;&lt;w:ind w:left="907" w:hanging="907"/&gt;&lt;/w:pPr&gt;&lt;w:rPr&gt;&lt;w:rFonts w:hint="default"/&gt;&lt;/w:rPr&gt;&lt;/w:lvl&gt;&lt;w:lvl w:ilvl="4"&gt;&lt;w:start w:val="1"/&gt;&lt;w:numFmt w:val="lowerLetter"/&gt;&lt;w:lvlText w:val="(%5)"/&gt;&lt;w:lvlJc w:val="left"/&gt;&lt;w:pPr&gt;&lt;w:ind w:left="907" w:hanging="907"/&gt;&lt;/w:pPr&gt;&lt;w:rPr&gt;&lt;w:rFonts w:hint="default"/&gt;&lt;/w:rPr&gt;&lt;/w:lvl&gt;&lt;w:lvl w:ilvl="5"&gt;&lt;w:start w:val="1"/&gt;&lt;w:numFmt w:val="lowerRoman"/&gt;&lt;w:lvlText w:val="(%6)"/&gt;&lt;w:lvlJc w:val="left"/&gt;&lt;w:pPr&gt;&lt;w:ind w:left="907" w:hanging="907"/&gt;&lt;/w:pPr&gt;&lt;w:rPr&gt;&lt;w:rFonts w:hint="default"/&gt;&lt;/w:rPr&gt;&lt;/w:lvl&gt;&lt;w:lvl w:ilvl="6"&gt;&lt;w:start w:val="1"/&gt;&lt;w:numFmt w:val="decimal"/&gt;&lt;w:lvlText w:val="%7."/&gt;&lt;w:lvlJc w:val="left"/&gt;&lt;w:pPr&gt;&lt;w:ind w:left="907" w:hanging="907"/&gt;&lt;/w:pPr&gt;&lt;w:rPr&gt;&lt;w:rFonts w:hint="default"/&gt;&lt;/w:rPr&gt;&lt;/w:lvl&gt;&lt;w:lvl w:ilvl="7"&gt;&lt;w:start w:val="1"/&gt;&lt;w:numFmt w:val="lowerLetter"/&gt;&lt;w:lvlText w:val="%8."/&gt;&lt;w:lvlJc w:val="left"/&gt;&lt;w:pPr&gt;&lt;w:ind w:left="907" w:hanging="907"/&gt;&lt;/w:pPr&gt;&lt;w:rPr&gt;&lt;w:rFonts w:hint="default"/&gt;&lt;/w:rPr&gt;&lt;/w:lvl&gt;&lt;w:lvl w:ilvl="8"&gt;&lt;w:start w:val="1"/&gt;&lt;w:numFmt w:val="lowerRoman"/&gt;&lt;w:lvlText w:val="%9."/&gt;&lt;w:lvlJc w:val="left"/&gt;&lt;w:pPr&gt;&lt;w:ind w:left="907" w:hanging="907"/&gt;&lt;/w:pPr&gt;&lt;w:rPr&gt;&lt;w:rFonts w:hint="default"/&gt;&lt;/w:rPr&gt;&lt;/w:lvl&gt;&lt;/w:abstractNum&gt;&lt;w:abstractNum w:abstractNumId="12" w15:restartNumberingAfterBreak="0"&gt;&lt;w:nsid w:val="4CEF34F7"/&gt;&lt;w:multiLevelType w:val="multilevel"/&gt;&lt;w:tmpl w:val="041D001F"/&gt;&lt;w:lvl w:ilvl="0"&gt;&lt;w:start w:val="1"/&gt;&lt;w:numFmt w:val="decimal"/&gt;&lt;w:lvlText w:val="%1."/&gt;&lt;w:lvlJc w:val="left"/&gt;&lt;w:pPr&gt;&lt;w:ind w:left="360" w:hanging="360"/&gt;&lt;/w:pPr&gt;&lt;/w:lvl&gt;&lt;w:lvl w:ilvl="1"&gt;&lt;w:start w:val="1"/&gt;&lt;w:numFmt w:val="decimal"/&gt;&lt;w:lvlText w:val="%1.%2."/&gt;&lt;w:lvlJc w:val="left"/&gt;&lt;w:pPr&gt;&lt;w:ind w:left="792" w:hanging="432"/&gt;&lt;/w:pPr&gt;&lt;/w:lvl&gt;&lt;w:lvl w:ilvl="2"&gt;&lt;w:start w:val="1"/&gt;&lt;w:numFmt w:val="decimal"/&gt;&lt;w:lvlText w:val="%1.%2.%3."/&gt;&lt;w:lvlJc w:val="left"/&gt;&lt;w:pPr&gt;&lt;w:ind w:left="1224" w:hanging="504"/&gt;&lt;/w:pPr&gt;&lt;/w:lvl&gt;&lt;w:lvl w:ilvl="3"&gt;&lt;w:start w:val="1"/&gt;&lt;w:numFmt w:val="decimal"/&gt;&lt;w:lvlText w:val="%1.%2.%3.%4."/&gt;&lt;w:lvlJc w:val="left"/&gt;&lt;w:pPr&gt;&lt;w:ind w:left="1728" w:hanging="648"/&gt;&lt;/w:pPr&gt;&lt;/w:lvl&gt;&lt;w:lvl w:ilvl="4"&gt;&lt;w:start w:val="1"/&gt;&lt;w:numFmt w:val="decimal"/&gt;&lt;w:lvlText w:val="%1.%2.%3.%4.%5."/&gt;&lt;w:lvlJc w:val="left"/&gt;&lt;w:pPr&gt;&lt;w:ind w:left="2232" w:hanging="792"/&gt;&lt;/w:pPr&gt;&lt;/w:lvl&gt;&lt;w:lvl w:ilvl="5"&gt;&lt;w:start w:val="1"/&gt;&lt;w:numFmt w:val="decimal"/&gt;&lt;w:lvlText w:val="%1.%2.%3.%4.%5.%6."/&gt;&lt;w:lvlJc w:val="left"/&gt;&lt;w:pPr&gt;&lt;w:ind w:left="2736" w:hanging="936"/&gt;&lt;/w:pPr&gt;&lt;/w:lvl&gt;&lt;w:lvl w:ilvl="6"&gt;&lt;w:start w:val="1"/&gt;&lt;w:numFmt w:val="decimal"/&gt;&lt;w:lvlText w:val="%1.%2.%3.%4.%5.%6.%7."/&gt;&lt;w:lvlJc w:val="left"/&gt;&lt;w:pPr&gt;&lt;w:ind w:left="3240" w:hanging="1080"/&gt;&lt;/w:pPr&gt;&lt;/w:lvl&gt;&lt;w:lvl w:ilvl="7"&gt;&lt;w:start w:val="1"/&gt;&lt;w:numFmt w:val="decimal"/&gt;&lt;w:lvlText w:val="%1.%2.%3.%4.%5.%6.%7.%8."/&gt;&lt;w:lvlJc w:val="left"/&gt;&lt;w:pPr&gt;&lt;w:ind w:left="3744" w:hanging="1224"/&gt;&lt;/w:pPr&gt;&lt;/w:lvl&gt;&lt;w:lvl w:ilvl="8"&gt;&lt;w:start w:val="1"/&gt;&lt;w:numFmt w:val="decimal"/&gt;&lt;w:lvlText w:val="%1.%2.%3.%4.%5.%6.%7.%8.%9."/&gt;&lt;w:lvlJc w:val="left"/&gt;&lt;w:pPr&gt;&lt;w:ind w:left="4320" w:hanging="1440"/&gt;&lt;/w:pPr&gt;&lt;/w:lvl&gt;&lt;/w:abstractNum&gt;&lt;w:abstractNum w:abstractNumId="13" w15:restartNumberingAfterBreak="0"&gt;&lt;w:nsid w:val="566F2E6D"/&gt;&lt;w:multiLevelType w:val="multilevel"/&gt;&lt;w:tmpl w:val="6FD4AAFC"/&gt;&lt;w:lvl w:ilvl="0"&gt;&lt;w:start w:val="1"/&gt;&lt;w:numFmt w:val="bullet"/&gt;&lt;w:pStyle w:val="ListBullet"/&gt;&lt;w:lvlText w:val="—"/&gt;&lt;w:lvlJc w:val="left"/&gt;&lt;w:pPr&gt;&lt;w:ind w:left="360" w:hanging="360"/&gt;&lt;/w:pPr&gt;&lt;w:rPr&gt;&lt;w:rFonts w:ascii="Calibri" w:hAnsi="Calibri" w:hint="default"/&gt;&lt;w:color w:val="auto"/&gt;&lt;/w:rPr&gt;&lt;/w:lvl&gt;&lt;w:lvl w:ilvl="1"&gt;&lt;w:start w:val="1"/&gt;&lt;w:numFmt w:val="bullet"/&gt;&lt;w:pStyle w:val="ListBullet2"/&gt;&lt;w:lvlText w:val="—"/&gt;&lt;w:lvlJc w:val="left"/&gt;&lt;w:pPr&gt;&lt;w:ind w:left="720" w:hanging="360"/&gt;&lt;/w:pPr&gt;&lt;w:rPr&gt;&lt;w:rFonts w:ascii="Calibri" w:hAnsi="Calibri" w:hint="default"/&gt;&lt;w:color w:val="auto"/&gt;&lt;/w:rPr&gt;&lt;/w:lvl&gt;&lt;w:lvl w:ilvl="2"&gt;&lt;w:start w:val="1"/&gt;&lt;w:numFmt w:val="bullet"/&gt;&lt;w:pStyle w:val="ListBullet3"/&gt;&lt;w:lvlText w:val="—"/&gt;&lt;w:lvlJc w:val="left"/&gt;&lt;w:pPr&gt;&lt;w:ind w:left="1080" w:hanging="360"/&gt;&lt;/w:pPr&gt;&lt;w:rPr&gt;&lt;w:rFonts w:ascii="Calibri" w:hAnsi="Calibri" w:hint="default"/&gt;&lt;w:color w:val="auto"/&gt;&lt;/w:rPr&gt;&lt;/w:lvl&gt;&lt;w:lvl w:ilvl="3"&gt;&lt;w:start w:val="1"/&gt;&lt;w:numFmt w:val="bullet"/&gt;&lt;w:pStyle w:val="ListBullet4"/&gt;&lt;w:lvlText w:val="—"/&gt;&lt;w:lvlJc w:val="left"/&gt;&lt;w:pPr&gt;&lt;w:ind w:left="1440" w:hanging="360"/&gt;&lt;/w:pPr&gt;&lt;w:rPr&gt;&lt;w:rFonts w:ascii="Calibri" w:hAnsi="Calibri" w:hint="default"/&gt;&lt;w:color w:val="auto"/&gt;&lt;/w:rPr&gt;&lt;/w:lvl&gt;&lt;w:lvl w:ilvl="4"&gt;&lt;w:start w:val="1"/&gt;&lt;w:numFmt w:val="bullet"/&gt;&lt;w:pStyle w:val="ListBullet5"/&gt;&lt;w:lvlText w:val="—"/&gt;&lt;w:lvlJc w:val="left"/&gt;&lt;w:pPr&gt;&lt;w:ind w:left="1800" w:hanging="360"/&gt;&lt;/w:pPr&gt;&lt;w:rPr&gt;&lt;w:rFonts w:ascii="Calibri" w:hAnsi="Calibri" w:hint="default"/&gt;&lt;w:color w:val="auto"/&gt;&lt;/w:rPr&gt;&lt;/w:lvl&gt;&lt;w:lvl w:ilvl="5"&gt;&lt;w:start w:val="1"/&gt;&lt;w:numFmt w:val="bullet"/&gt;&lt;w:lvlText w:val="»"/&gt;&lt;w:lvlJc w:val="left"/&gt;&lt;w:pPr&gt;&lt;w:ind w:left="2160" w:hanging="360"/&gt;&lt;/w:pPr&gt;&lt;w:rPr&gt;&lt;w:rFonts w:ascii="Calibri" w:hAnsi="Calibri" w:hint="default"/&gt;&lt;w:color w:val="auto"/&gt;&lt;/w:rPr&gt;&lt;/w:lvl&gt;&lt;w:lvl w:ilvl="6"&gt;&lt;w:start w:val="1"/&gt;&lt;w:numFmt w:val="bullet"/&gt;&lt;w:lvlText w:val="•"/&gt;&lt;w:lvlJc w:val="left"/&gt;&lt;w:pPr&gt;&lt;w:ind w:left="2520" w:hanging="360"/&gt;&lt;/w:pPr&gt;&lt;w:rPr&gt;&lt;w:rFonts w:ascii="Calibri" w:hAnsi="Calibri" w:hint="default"/&gt;&lt;w:color w:val="auto"/&gt;&lt;/w:rPr&gt;&lt;/w:lvl&gt;&lt;w:lvl w:ilvl="7"&gt;&lt;w:start w:val="1"/&gt;&lt;w:numFmt w:val="bullet"/&gt;&lt;w:lvlText w:val="–"/&gt;&lt;w:lvlJc w:val="left"/&gt;&lt;w:pPr&gt;&lt;w:ind w:left="2880" w:hanging="360"/&gt;&lt;/w:pPr&gt;&lt;w:rPr&gt;&lt;w:rFonts w:ascii="Calibri" w:hAnsi="Calibri" w:hint="default"/&gt;&lt;w:color w:val="auto"/&gt;&lt;/w:rPr&gt;&lt;/w:lvl&gt;&lt;w:lvl w:ilvl="8"&gt;&lt;w:start w:val="1"/&gt;&lt;w:numFmt w:val="bullet"/&gt;&lt;w:lvlText w:val="»"/&gt;&lt;w:lvlJc w:val="left"/&gt;&lt;w:pPr&gt;&lt;w:ind w:left="3240" w:hanging="360"/&gt;&lt;/w:pPr&gt;&lt;w:rPr&gt;&lt;w:rFonts w:ascii="Calibri" w:hAnsi="Calibri" w:hint="default"/&gt;&lt;w:color w:val="auto"/&gt;&lt;/w:rPr&gt;&lt;/w:lvl&gt;&lt;/w:abstractNum&gt;&lt;w:num w:numId="1"&gt;&lt;w:abstractNumId w:val="13"/&gt;&lt;/w:num&gt;&lt;w:num w:numId="2"&gt;&lt;w:abstractNumId w:val="7"/&gt;&lt;/w:num&gt;&lt;w:num w:numId="3"&gt;&lt;w:abstractNumId w:val="6"/&gt;&lt;/w:num&gt;&lt;w:num w:numId="4"&gt;&lt;w:abstractNumId w:val="5"/&gt;&lt;/w:num&gt;&lt;w:num w:numId="5"&gt;&lt;w:abstractNumId w:val="4"/&gt;&lt;/w:num&gt;&lt;w:num w:numId="6"&gt;&lt;w:abstractNumId w:val="8"/&gt;&lt;/w:num&gt;&lt;w:num w:numId="7"&gt;&lt;w:abstractNumId w:val="3"/&gt;&lt;/w:num&gt;&lt;w:num w:numId="8"&gt;&lt;w:abstractNumId w:val="2"/&gt;&lt;/w:num&gt;&lt;w:num w:numId="9"&gt;&lt;w:abstractNumId w:val="1"/&gt;&lt;/w:num&gt;&lt;w:num w:numId="10"&gt;&lt;w:abstractNumId w:val="0"/&gt;&lt;/w:num&gt;&lt;w:num w:numId="11"&gt;&lt;w:abstractNumId w:val="13"/&gt;&lt;w:lvlOverride w:ilvl="0"&gt;&lt;w:startOverride w:val="1"/&gt;&lt;/w:lvlOverride&gt;&lt;w:lvlOverride w:ilvl="1"&gt;&lt;w:startOverride w:val="1"/&gt;&lt;/w:lvlOverride&gt;&lt;w:lvlOverride w:ilvl="2"&gt;&lt;w:startOverride w:val="1"/&gt;&lt;/w:lvlOverride&gt;&lt;w:lvlOverride w:ilvl="3"&gt;&lt;w:startOverride w:val="1"/&gt;&lt;/w:lvlOverride&gt;&lt;w:lvlOverride w:ilvl="4"&gt;&lt;w:startOverride w:val="1"/&gt;&lt;/w:lvlOverride&gt;&lt;w:lvlOverride w:ilvl="5"&gt;&lt;w:startOverride w:val="1"/&gt;&lt;/w:lvlOverride&gt;&lt;w:lvlOverride w:ilvl="6"&gt;&lt;w:startOverride w:val="1"/&gt;&lt;/w:lvlOverride&gt;&lt;w:lvlOverride w:ilvl="7"&gt;&lt;w:startOverride w:val="1"/&gt;&lt;/w:lvlOverride&gt;&lt;w:lvlOverride w:ilvl="8"&gt;&lt;w:startOverride w:val="1"/&gt;&lt;/w:lvlOverride&gt;&lt;/w:num&gt;&lt;w:num w:numId="12"&gt;&lt;w:abstractNumId w:val="11"/&gt;&lt;/w:num&gt;&lt;w:num w:numId="13"&gt;&lt;w:abstractNumId w:val="12"/&gt;&lt;/w:num&gt;&lt;w:num w:numId="14"&gt;&lt;w:abstractNumId w:val="9"/&gt;&lt;/w:num&gt;&lt;w:num w:numId="15"&gt;&lt;w:abstractNumId w:val="10"/&gt;&lt;/w:num&gt;&lt;/w:numbering&gt;&lt;/pkg:xmlData&gt;&lt;/pkg:part&gt;&lt;/pkg:package&gt;
-</Titel>
-      <TelefonPersonlig>
-			</TelefonPersonlig>
-      <EmailPersonlig>
-			</EmailPersonlig>
-    </Personinfo>
-  </KontaktuppgifterForetag>
-  <KontaktuppgifterKund>
-    <ForetagKund>
-		</ForetagKund>
-    <OrgnrKund>
-		</OrgnrKund>
-    <TelefonKund>
-		</TelefonKund>
-    <EmailKund>
-		</EmailKund>
-    <BesoksadressKund>
-		</BesoksadressKund>
-    <PostAdressKund>
-		</PostAdressKund>
-    <GataKund>
-		</GataKund>
-    <PostnummerKund>
-		</PostnummerKund>
-    <OrtKund>
-		</OrtKund>
-    <PersoninfoKund>
-      <NamnKund>
-			</NamnKund>
-      <TitelKund>
-			</TitelKund>
-      <TelefonPersonligKund>
-			</TelefonPersonligKund>
-      <EmailPersonligKund>
-			</EmailPersonligKund>
-    </PersoninfoKund>
-  </KontaktuppgifterKund>
-  <Rapportinfo>
-    <Ar>
-		</Ar>
-    <Kvartal>
-		</Kvartal>
-    <Period>
-		</Period>
-    <Manad>
-		</Manad>
-    <Nuvarandemanad>
-		</Nuvarandemanad>
-    <Foregaendemanad>
-		</Foregaendemanad>
-    <Rapportdatum>
-		</Rapportdatum>
-  </Rapportinfo>
-  <Ekonomiinfo>
-    <Belopp>
-		</Belopp>
-    <Summa>
-		</Summa>
-  </Ekonomiinfo>
-</Rehngruppen10>
+<?mso-contentType ?>
+<FormTemplates xmlns="http://schemas.microsoft.com/sharepoint/v3/contenttype/forms">
+  <Display>DocumentLibraryForm</Display>
+  <Edit>DocumentLibraryForm</Edit>
+  <New>DocumentLibraryForm</New>
+</FormTemplates>
 </file>
 
 <file path=customXml/item5.xml><?xml version="1.0" encoding="utf-8"?>
@@ -5599,14 +5677,20 @@
 </file>
 
 <file path=customXml/itemProps1.xml><?xml version="1.0" encoding="utf-8"?>
-<ds:datastoreItem xmlns:ds="http://schemas.openxmlformats.org/officeDocument/2006/customXml" ds:itemID="{B27EFCFB-0056-415F-B00A-D74C21B6EF32}">
+<ds:datastoreItem xmlns:ds="http://schemas.openxmlformats.org/officeDocument/2006/customXml" ds:itemID="{DC7B2992-90CA-4E95-80E1-2EC82D6CF75B}">
+  <ds:schemaRefs/>
+</ds:datastoreItem>
+</file>
+
+<file path=customXml/itemProps2.xml><?xml version="1.0" encoding="utf-8"?>
+<ds:datastoreItem xmlns:ds="http://schemas.openxmlformats.org/officeDocument/2006/customXml" ds:itemID="{54068D82-7AFB-438D-9B71-7781E6651574}">
   <ds:schemaRefs>
-    <ds:schemaRef ds:uri="http://schemas.microsoft.com/sharepoint/v3/contenttype/forms"/>
+    <ds:schemaRef ds:uri="http://schemas.openxmlformats.org/officeDocument/2006/bibliography"/>
   </ds:schemaRefs>
 </ds:datastoreItem>
 </file>
 
-<file path=customXml/itemProps2.xml><?xml version="1.0" encoding="utf-8"?>
+<file path=customXml/itemProps3.xml><?xml version="1.0" encoding="utf-8"?>
 <ds:datastoreItem xmlns:ds="http://schemas.openxmlformats.org/officeDocument/2006/customXml" ds:itemID="{6DE2568F-F1C0-4003-AA94-181BEEC2A763}">
   <ds:schemaRefs>
     <ds:schemaRef ds:uri="http://schemas.microsoft.com/office/2006/metadata/contentType"/>
@@ -5625,17 +5709,11 @@
 </ds:datastoreItem>
 </file>
 
-<file path=customXml/itemProps3.xml><?xml version="1.0" encoding="utf-8"?>
-<ds:datastoreItem xmlns:ds="http://schemas.openxmlformats.org/officeDocument/2006/customXml" ds:itemID="{54068D82-7AFB-438D-9B71-7781E6651574}">
+<file path=customXml/itemProps4.xml><?xml version="1.0" encoding="utf-8"?>
+<ds:datastoreItem xmlns:ds="http://schemas.openxmlformats.org/officeDocument/2006/customXml" ds:itemID="{B27EFCFB-0056-415F-B00A-D74C21B6EF32}">
   <ds:schemaRefs>
-    <ds:schemaRef ds:uri="http://schemas.openxmlformats.org/officeDocument/2006/bibliography"/>
+    <ds:schemaRef ds:uri="http://schemas.microsoft.com/sharepoint/v3/contenttype/forms"/>
   </ds:schemaRefs>
-</ds:datastoreItem>
-</file>
-
-<file path=customXml/itemProps4.xml><?xml version="1.0" encoding="utf-8"?>
-<ds:datastoreItem xmlns:ds="http://schemas.openxmlformats.org/officeDocument/2006/customXml" ds:itemID="{DC7B2992-90CA-4E95-80E1-2EC82D6CF75B}">
-  <ds:schemaRefs/>
 </ds:datastoreItem>
 </file>
 

</xml_diff>